<commit_message>
Rename internal Paper58 baseline to GeoFM-LDN
</commit_message>
<xml_diff>
--- a/manuscript/manuscript.docx
+++ b/manuscript/manuscript.docx
@@ -2,7 +2,7 @@
 <file path=word/document.xml><?xml version="1.0" encoding="utf-8"?>
 <w:document xmlns:w="http://schemas.openxmlformats.org/wordprocessingml/2006/main" xmlns:m="http://schemas.openxmlformats.org/officeDocument/2006/math" xmlns:r="http://schemas.openxmlformats.org/officeDocument/2006/relationships" xmlns:o="urn:schemas-microsoft-com:office:office" xmlns:v="urn:schemas-microsoft-com:vml" xmlns:w10="urn:schemas-microsoft-com:office:word" xmlns:a="http://schemas.openxmlformats.org/drawingml/2006/main" xmlns:pic="http://schemas.openxmlformats.org/drawingml/2006/picture" xmlns:wp="http://schemas.openxmlformats.org/drawingml/2006/wordprocessingDrawing">
   <w:body>
-    <w:bookmarkStart w:id="57" w:name="Xa792ae9d4bbdc58e2d9589266a4679e28954073"/>
+    <w:bookmarkStart w:id="51" w:name="Xa792ae9d4bbdc58e2d9589266a4679e28954073"/>
     <w:p>
       <w:pPr>
         <w:pStyle w:val="Heading1"/>
@@ -105,7 +105,7 @@
         <w:pStyle w:val="FirstParagraph"/>
       </w:pPr>
       <w:r>
-        <w:t xml:space="preserve">Urban land-change models are used to test how development demand could be distributed across space. Their practical value depends on more than pixel-level classification: a planning model must respond to explicit actions, preserve hard exclusions and carry its state into the next simulated year. Here we study Geospatial Kernel, the algorithmic core of a Geospatial World Model, as a state–action–constraint transition system for urban land-cover planning. We evaluate it against GeoSOS-FLUS and Paper58 on a common Abu Dhabi benchmark of annual public land-cover products from 2017 to 2024, a 100-m grid and three random seeds. In conditional historical allocation tests, Geospatial Kernel achieved the highest change Figure of Merit (FoM) for 2023 (0.2004, compared with 0.1283 for GeoSOS-FLUS and 0.1670 for Paper58), whereas Paper58 achieved the highest FoM for the two-step 2024 open-loop target (0.2778, compared with 0.2606 for Geospatial Kernel). This horizon dependence argues against a universal model ranking. In planner-supplied 2025–2031 stress tests, Geospatial Kernel met class-count actions, preserved hard exclusions and placed all three scenarios on the Pareto frontier under frozen public-data objectives. At 2031, new built cells had neighbourhood compactness of 0.833–0.855 and mean distances of 323–365 m to major roads and 111–140 m to pre-existing built cells. These results support Geospatial Kernel as an auditable allocation core for conditional planning experiments. They do not establish legal land use, policy causality or Abu Dhabi's actual future because the benchmark uses noisy public labels, proxy constraints, frozen drivers and synthetic actions.</w:t>
+        <w:t xml:space="preserve">Urban land-change models are used to test how development demand could be distributed across space. Their practical value depends on more than pixel-level classification: a planning model must respond to explicit actions, preserve hard exclusions and carry its state into the next simulated year. Here we study Geospatial Kernel, the algorithmic core of a Geospatial World Model, as a state–action–constraint transition system for urban land-cover planning. We evaluate it against GeoSOS-FLUS and GeoFM-LDN (Geospatial Foundation-Model Latent Dynamics Network), a demand-conditioned latent-state baseline built on annual AlphaEarth embeddings, on a common Abu Dhabi benchmark of annual public land-cover products from 2017 to 2024, a 100-m grid and three random seeds. In conditional historical allocation tests, Geospatial Kernel achieved the highest change Figure of Merit (FoM) for 2023 (0.2004, compared with 0.1283 for GeoSOS-FLUS and 0.1670 for GeoFM-LDN), whereas GeoFM-LDN achieved the highest FoM for the two-step 2024 open-loop target (0.2778, compared with 0.2606 for Geospatial Kernel). This horizon dependence argues against a universal model ranking. In planner-supplied 2025–2031 stress tests, Geospatial Kernel met class-count actions, preserved hard exclusions and placed all three scenarios on the Pareto frontier under frozen public-data objectives. At 2031, new built cells had neighbourhood compactness of 0.833–0.855 and mean distances of 323–365 m to major roads and 111–140 m to pre-existing built cells. These results support Geospatial Kernel as an auditable allocation core for conditional planning experiments. They do not establish legal land use, policy causality or Abu Dhabi’s actual future because the benchmark uses noisy public labels, proxy constraints, frozen drivers and synthetic actions.</w:t>
       </w:r>
     </w:p>
     <w:bookmarkEnd w:id="9"/>
@@ -139,7 +139,7 @@
         </w:numPr>
       </w:pPr>
       <w:r>
-        <w:t xml:space="preserve">One-step allocation favoured Kernel; two-step open-loop skill favoured Paper58.</w:t>
+        <w:t xml:space="preserve">One-step allocation favoured Kernel; two-step open-loop skill favoured GeoFM-LDN.</w:t>
       </w:r>
     </w:p>
     <w:p>
@@ -225,7 +225,7 @@
         <w:pStyle w:val="BodyText"/>
       </w:pPr>
       <w:r>
-        <w:t xml:space="preserve">The main technical difficulty is not producing another categorical raster. It is keeping the semantics of a planning action separate from the learned transition tendency. A model may predict that a cell is likely to become built, yet the resulting map can still violate a water exclusion, miss the requested class totals or become inconsistent when the next year is simulated from the model's own output. These failure modes are particularly important when the model is used to compare scenarios rather than to reproduce one observed transition. Latent-dynamics approaches such as Paper58 can represent continuous geospatial state and condition transitions on demand, whereas traditional ANN-plus-cellular-automata systems such as GeoSOS-FLUS combine suitability with explicit neighbourhood evolution. Neither design, by itself, guarantees that action semantics, hard constraints, state persistence and evidence provenance are visible at the same execution boundary.</w:t>
+        <w:t xml:space="preserve">The main technical difficulty is not producing another categorical raster. It is keeping the semantics of a planning action separate from the learned transition tendency. A model may predict that a cell is likely to become built, yet the resulting map can still violate a water exclusion, miss the requested class totals or become inconsistent when the next year is simulated from the model’s own output. These failure modes are particularly important when the model is used to compare scenarios rather than to reproduce one observed transition. Latent-dynamics approaches such as GeoFM-LDN can represent continuous geospatial state and condition transitions on demand, whereas traditional ANN-plus-cellular-automata systems such as GeoSOS-FLUS combine suitability with explicit neighbourhood evolution. Neither design, by itself, guarantees that action semantics, hard constraints, state persistence and evidence provenance are visible at the same execution boundary.</w:t>
       </w:r>
     </w:p>
     <w:p>
@@ -233,7 +233,7 @@
         <w:pStyle w:val="BodyText"/>
       </w:pPr>
       <w:r>
-        <w:t xml:space="preserve">We address this systems problem by studying Geospatial Kernel, the core transition layer of a Geospatial World Model (GWM). The Kernel represents one simulation step as a typed state, a typed action, a transition proposal, a constraint projection and a state writeback. The learned proposal remains domain-specific; the runtime contract is domain-neutral. For Abu Dhabi land-cover planning, the proposal is a six-class probability cube, and the projection allocates only mutable cells until the action's feasible class totals are reached. This separation makes the planning operation inspectable: a reviewer can distinguish what the transition model preferred from what the constraints admitted.</w:t>
+        <w:t xml:space="preserve">We address this systems problem by studying Geospatial Kernel, the core transition layer of a Geospatial World Model (GWM). The Kernel represents one simulation step as a typed state, a typed action, a transition proposal, a constraint projection and a state writeback. The learned proposal remains domain-specific; the runtime contract is domain-neutral. For Abu Dhabi land-cover planning, the proposal is a six-class probability cube, and the projection allocates only mutable cells until the action’s feasible class totals are reached. This separation makes the planning operation inspectable: a reviewer can distinguish what the transition model preferred from what the constraints admitted.</w:t>
       </w:r>
     </w:p>
     <w:p>
@@ -249,7 +249,7 @@
         <w:pStyle w:val="BodyText"/>
       </w:pPr>
       <w:r>
-        <w:t xml:space="preserve">The paper makes three bounded contributions. First, it gives a concrete state–action–constraint formulation for using a geospatial kernel as an algorithmic core rather than as an opaque end-to-end predictor. Second, it reports a fair, multi-horizon comparison with GeoSOS-FLUS and Paper58, including a case in which the Kernel does not win. Third, it turns the future maps into explicit stress-test artefacts, including cumulative rasters and vectorized transition footprints, while preserving the distinction between public-data land cover and authoritative legal land use.</w:t>
+        <w:t xml:space="preserve">The paper makes three bounded contributions. First, it gives a concrete state–action–constraint formulation for using a geospatial kernel as an algorithmic core rather than as an opaque end-to-end predictor. Second, it reports a fair, multi-horizon comparison with GeoSOS-FLUS and GeoFM-LDN, including a case in which the Kernel does not win. Third, it turns the future maps into explicit stress-test artefacts, including cumulative rasters and vectorized transition footprints, while preserving the distinction between public-data land cover and authoritative legal land use.</w:t>
       </w:r>
     </w:p>
     <w:bookmarkEnd w:id="13"/>
@@ -284,7 +284,7 @@
         <w:pStyle w:val="BodyText"/>
       </w:pPr>
       <w:r>
-        <w:t xml:space="preserve">The comparison was designed so that differences in model output could not be attributed to different grids or target totals. GeoSOS-FLUS received the same continuous drivers and used an external ANN suitability model followed by cellular-automata allocation. Paper58 used demand-conditioned latent dynamics on the annual AlphaEarth embeddings, a semantic decoder and the constrained allocation interface. Geospatial Kernel used the same target action records and hard masks, but separated a learned per-cell transition proposal from a runtime constraint projection. All models were run with seeds 31, 47 and 73. The output audit accepted 240 prediction rasters, including 54 planning ensembles and 162 planning seed rasters, with no grid, class or hard-constraint failures.</w:t>
+        <w:t xml:space="preserve">The comparison was designed so that differences in model output could not be attributed to different grids or target totals. GeoSOS-FLUS received the same continuous drivers and used an external ANN suitability model followed by cellular-automata allocation. GeoFM-LDN used demand-conditioned latent dynamics on the annual AlphaEarth embeddings, a semantic decoder and the constrained allocation interface. Geospatial Kernel used the same target action records and hard masks, but separated a learned per-cell transition proposal from a runtime constraint projection. All models were run with seeds 31, 47 and 73. The output audit accepted 240 prediction rasters, including 54 planning ensembles and 162 planning seed rasters, with no grid, class or hard-constraint failures.</w:t>
       </w:r>
     </w:p>
     <w:p>
@@ -334,17 +334,18 @@
     <w:tbl>
       <w:tblPr>
         <w:tblStyle w:val="Table"/>
-        <w:tblW w:type="auto" w:w="0"/>
+        <w:tblW w:type="pct" w:w="5000"/>
+        <w:tblLayout w:type="fixed"/>
         <w:tblLook w:firstRow="1" w:lastRow="0" w:firstColumn="0" w:lastColumn="0" w:noHBand="0" w:noVBand="0" w:val="0020"/>
       </w:tblPr>
       <w:tblGrid>
-        <w:gridCol w:w="1131"/>
-        <w:gridCol w:w="1131"/>
-        <w:gridCol w:w="1131"/>
-        <w:gridCol w:w="1131"/>
-        <w:gridCol w:w="1131"/>
-        <w:gridCol w:w="1131"/>
-        <w:gridCol w:w="1131"/>
+        <w:gridCol w:w="1173"/>
+        <w:gridCol w:w="880"/>
+        <w:gridCol w:w="1173"/>
+        <w:gridCol w:w="1173"/>
+        <w:gridCol w:w="1173"/>
+        <w:gridCol w:w="1173"/>
+        <w:gridCol w:w="1173"/>
       </w:tblGrid>
       <w:tr>
         <w:trPr>
@@ -640,7 +641,7 @@
               <w:pStyle w:val="Compact"/>
             </w:pPr>
             <w:r>
-              <w:t xml:space="preserve">Paper58</w:t>
+              <w:t xml:space="preserve">GeoFM-LDN</w:t>
             </w:r>
           </w:p>
         </w:tc>
@@ -895,7 +896,7 @@
               <w:pStyle w:val="Compact"/>
             </w:pPr>
             <w:r>
-              <w:t xml:space="preserve">Paper58</w:t>
+              <w:t xml:space="preserve">GeoFM-LDN</w:t>
             </w:r>
           </w:p>
         </w:tc>
@@ -982,7 +983,7 @@
         <w:pStyle w:val="BodyText"/>
       </w:pPr>
       <w:r>
-        <w:t xml:space="preserve">Geospatial Kernel improved change FoM over GeoSOS-FLUS by 0.0721 in 2023 and 0.0790 in 2024. Paper58 improved over GeoSOS-FLUS by 0.0388 and 0.0963, respectively. The ranking changed at the longer horizon: Geospatial Kernel was strongest for the 2023 one-step target, while Paper58 was strongest for the 2024 two-step target. The result is scientifically useful precisely because it prevents an over-general conclusion. Geospatial Kernel was competitive in historical allocation, but its advantage in this benchmark is not a universal claim about future prediction accuracy. The four primary metrics and seed variability are shown in Fig. 2.</w:t>
+        <w:t xml:space="preserve">Geospatial Kernel improved change FoM over GeoSOS-FLUS by 0.0721 in 2023 and 0.0790 in 2024. GeoFM-LDN improved over GeoSOS-FLUS by 0.0388 and 0.0963, respectively. The ranking changed at the longer horizon: Geospatial Kernel was strongest for the 2023 one-step target, while GeoFM-LDN was strongest for the 2024 two-step target. The result is scientifically useful precisely because it prevents an over-general conclusion. Geospatial Kernel was competitive in historical allocation, but its advantage in this benchmark is not a universal claim about future prediction accuracy. The four primary metrics and seed variability are shown in Fig. 2.</w:t>
       </w:r>
     </w:p>
     <w:p>
@@ -1047,17 +1048,18 @@
     <w:tbl>
       <w:tblPr>
         <w:tblStyle w:val="Table"/>
-        <w:tblW w:type="auto" w:w="0"/>
+        <w:tblW w:type="pct" w:w="5000"/>
+        <w:tblLayout w:type="fixed"/>
         <w:tblLook w:firstRow="1" w:lastRow="0" w:firstColumn="0" w:lastColumn="0" w:noHBand="0" w:noVBand="0" w:val="0020"/>
       </w:tblPr>
       <w:tblGrid>
-        <w:gridCol w:w="1131"/>
-        <w:gridCol w:w="1131"/>
-        <w:gridCol w:w="1131"/>
-        <w:gridCol w:w="1131"/>
-        <w:gridCol w:w="1131"/>
-        <w:gridCol w:w="1131"/>
-        <w:gridCol w:w="1131"/>
+        <w:gridCol w:w="913"/>
+        <w:gridCol w:w="913"/>
+        <w:gridCol w:w="1218"/>
+        <w:gridCol w:w="1218"/>
+        <w:gridCol w:w="1218"/>
+        <w:gridCol w:w="1218"/>
+        <w:gridCol w:w="1218"/>
       </w:tblGrid>
       <w:tr>
         <w:trPr>
@@ -1694,7 +1696,7 @@
               <w:pStyle w:val="Compact"/>
             </w:pPr>
             <w:r>
-              <w:t xml:space="preserve">Paper58</w:t>
+              <w:t xml:space="preserve">GeoFM-LDN</w:t>
             </w:r>
           </w:p>
         </w:tc>
@@ -1778,7 +1780,7 @@
               <w:pStyle w:val="Compact"/>
             </w:pPr>
             <w:r>
-              <w:t xml:space="preserve">Paper58</w:t>
+              <w:t xml:space="preserve">GeoFM-LDN</w:t>
             </w:r>
           </w:p>
         </w:tc>
@@ -1862,7 +1864,7 @@
               <w:pStyle w:val="Compact"/>
             </w:pPr>
             <w:r>
-              <w:t xml:space="preserve">Paper58</w:t>
+              <w:t xml:space="preserve">GeoFM-LDN</w:t>
             </w:r>
           </w:p>
         </w:tc>
@@ -2498,7 +2500,7 @@
               <w:pStyle w:val="Compact"/>
             </w:pPr>
             <w:r>
-              <w:t xml:space="preserve">Paper58</w:t>
+              <w:t xml:space="preserve">GeoFM-LDN</w:t>
             </w:r>
           </w:p>
         </w:tc>
@@ -2570,7 +2572,7 @@
               <w:pStyle w:val="Compact"/>
             </w:pPr>
             <w:r>
-              <w:t xml:space="preserve">Paper58</w:t>
+              <w:t xml:space="preserve">GeoFM-LDN</w:t>
             </w:r>
           </w:p>
         </w:tc>
@@ -2642,7 +2644,7 @@
               <w:pStyle w:val="Compact"/>
             </w:pPr>
             <w:r>
-              <w:t xml:space="preserve">Paper58</w:t>
+              <w:t xml:space="preserve">GeoFM-LDN</w:t>
             </w:r>
           </w:p>
         </w:tc>
@@ -2712,7 +2714,7 @@
         <w:pStyle w:val="BodyText"/>
       </w:pPr>
       <w:r>
-        <w:t xml:space="preserve">All three Geospatial Kernel candidates were on the Pareto frontier under the frozen objective set. In the compact scenario, for example, the Kernel placed new built cells closer to major roads than either baseline and produced a higher neighbourhood compactness. The same ordering held for ecological priority and outward growth. The ecological conversion rate was zero for the Kernel and Paper58 because the projected allocations avoided conversion of the declared vegetation-origin cells in the public-data constraint system; GeoSOS-FLUS converted 1.31–1.77% of its new built cells from ecological proxy classes. These values are proxy outcomes, not estimates of statutory ecological impact.</w:t>
+        <w:t xml:space="preserve">All three Geospatial Kernel candidates were on the Pareto frontier under the frozen objective set. In the compact scenario, for example, the Kernel placed new built cells closer to major roads than either baseline and produced a higher neighbourhood compactness. The same ordering held for ecological priority and outward growth. The ecological conversion rate was zero for the Kernel and GeoFM-LDN because the projected allocations avoided conversion of the declared vegetation-origin cells in the public-data constraint system; GeoSOS-FLUS converted 1.31–1.77% of its new built cells from ecological proxy classes. These values are proxy outcomes, not estimates of statutory ecological impact.</w:t>
       </w:r>
     </w:p>
     <w:p>
@@ -2720,7 +2722,7 @@
         <w:pStyle w:val="BodyText"/>
       </w:pPr>
       <w:r>
-        <w:t xml:space="preserve">The built-retirement contrast is also visible in the maps. GeoSOS-FLUS reclassified approximately 2,724–3,632 cells that were built in 2024 while allocating new built cells elsewhere. Geospatial Kernel and Paper58 retained the prior built class under the same scenario target counts. This difference is a model behaviour under the frozen transition matrix, not evidence that either approach reproduces actual redevelopment or demolition. The objective trade-offs are summarized in Fig. 3.</w:t>
+        <w:t xml:space="preserve">The built-retirement contrast is also visible in the maps. GeoSOS-FLUS reclassified approximately 2,724–3,632 cells that were built in 2024 while allocating new built cells elsewhere. Geospatial Kernel and GeoFM-LDN retained the prior built class under the same scenario target counts. This difference is a model behaviour under the frozen transition matrix, not evidence that either approach reproduces actual redevelopment or demolition. The objective trade-offs are summarized in Fig. 3.</w:t>
       </w:r>
     </w:p>
     <w:bookmarkEnd w:id="16"/>
@@ -2777,17 +2779,18 @@
     <w:tbl>
       <w:tblPr>
         <w:tblStyle w:val="Table"/>
-        <w:tblW w:type="auto" w:w="0"/>
+        <w:tblW w:type="pct" w:w="5000"/>
+        <w:tblLayout w:type="fixed"/>
         <w:tblLook w:firstRow="1" w:lastRow="0" w:firstColumn="0" w:lastColumn="0" w:noHBand="0" w:noVBand="0" w:val="0020"/>
       </w:tblPr>
       <w:tblGrid>
-        <w:gridCol w:w="1131"/>
-        <w:gridCol w:w="1131"/>
-        <w:gridCol w:w="1131"/>
-        <w:gridCol w:w="1131"/>
-        <w:gridCol w:w="1131"/>
-        <w:gridCol w:w="1131"/>
-        <w:gridCol w:w="1131"/>
+        <w:gridCol w:w="880"/>
+        <w:gridCol w:w="1173"/>
+        <w:gridCol w:w="1173"/>
+        <w:gridCol w:w="1173"/>
+        <w:gridCol w:w="1173"/>
+        <w:gridCol w:w="1173"/>
+        <w:gridCol w:w="1173"/>
       </w:tblGrid>
       <w:tr>
         <w:trPr>
@@ -4411,7 +4414,7 @@
         <w:pStyle w:val="BodyText"/>
       </w:pPr>
       <w:r>
-        <w:t xml:space="preserve">The historical results place that planning result in context. Geospatial Kernel had the strongest one-step 2023 allocation score, but Paper58 had the strongest 2024 two-step open-loop score. A model that performs well at one horizon can lose its advantage when its own output becomes the next input. The appropriate conclusion is therefore task-specific: Geospatial Kernel is promising as a constrained allocation core, whereas Paper58 may be competitive for longer-horizon latent-state evolution in this public-data experiment. The benchmark does not support selecting one model as the universally most accurate future predictor.</w:t>
+        <w:t xml:space="preserve">The historical results place that planning result in context. Geospatial Kernel had the strongest one-step 2023 allocation score, but GeoFM-LDN had the strongest 2024 two-step open-loop score. A model that performs well at one horizon can lose its advantage when its own output becomes the next input. The appropriate conclusion is therefore task-specific: Geospatial Kernel is promising as a constrained allocation core, whereas GeoFM-LDN may be competitive for longer-horizon latent-state evolution in this public-data experiment. The benchmark does not support selecting one model as the universally most accurate future predictor.</w:t>
       </w:r>
     </w:p>
     <w:p>
@@ -5456,7 +5459,7 @@
         </m:r>
       </m:oMath>
       <w:r>
-        <w:t xml:space="preserve">. The algorithm computes class deficits and excesses from the action's feasible target counts, ranks all admissible source–target candidates by</w:t>
+        <w:t xml:space="preserve">. The algorithm computes class deficits and excesses from the action’s feasible target counts, ranks all admissible source–target candidates by</w:t>
       </w:r>
       <w:r>
         <w:t xml:space="preserve"> </w:t>
@@ -5487,7 +5490,7 @@
         <w:t xml:space="preserve">KernelState</w:t>
       </w:r>
       <w:r>
-        <w:t xml:space="preserve">. Every step records a state reference, action evidence, model version, parameter reference, projection status and diagnostic counts. The runtime checks domain identity, source-time consistency and action time advancement. This execution contract is the Geospatial Kernel's algorithmic contribution; the Abu Dhabi adapter supplies the land-cover-specific features, learner and constraint masks.</w:t>
+        <w:t xml:space="preserve">. Every step records a state reference, action evidence, model version, parameter reference, projection status and diagnostic counts. The runtime checks domain identity, source-time consistency and action time advancement. This execution contract is the Geospatial Kernel’s algorithmic contribution; the Abu Dhabi adapter supplies the land-cover-specific features, learner and constraint masks.</w:t>
       </w:r>
     </w:p>
     <w:bookmarkEnd w:id="25"/>
@@ -5513,7 +5516,7 @@
         <w:pStyle w:val="BodyText"/>
       </w:pPr>
       <w:r>
-        <w:t xml:space="preserve">Paper58 was trained as a demand-conditioned latent-dynamics network on AlphaEarth embeddings. A logistic semantic decoder maps the predicted embedding to six class probabilities, and the constrained allocation step converts those probabilities to a categorical raster. The latent and categorical states are both recursively carried into the next year. Paper58 is treated as an internal benchmark implementation in this manuscript; no external publication or performance claim is attributed to the name.</w:t>
+        <w:t xml:space="preserve">GeoFM-LDN (Geospatial Foundation-Model Latent Dynamics Network) was trained as a demand-conditioned latent-dynamics network on AlphaEarth embeddings. A logistic semantic decoder maps the predicted embedding to six class probabilities, and the constrained allocation step converts those probabilities to a categorical raster. The latent and categorical states are both recursively carried into the next year. GeoFM-LDN is an internal benchmark implementation in this manuscript; the name describes its architecture and does not attribute an external publication or performance claim.</w:t>
       </w:r>
     </w:p>
     <w:p>
@@ -5944,7 +5947,7 @@
       </w:r>
     </w:p>
     <w:bookmarkEnd w:id="32"/>
-    <w:bookmarkStart w:id="39" w:name="references"/>
+    <w:bookmarkStart w:id="33" w:name="references"/>
     <w:p>
       <w:pPr>
         <w:pStyle w:val="Heading2"/>
@@ -5962,7 +5965,7 @@
         </w:numPr>
       </w:pPr>
       <w:r>
-        <w:t xml:space="preserve">Liu, X. et al. A future land use simulation model (FLUS) for simulating multiple land use scenarios by coupling human and natural effects.</w:t>
+        <w:t xml:space="preserve">Liu, X. et al. A future land use simulation model (FLUS) for simulating multiple land use scenarios by coupling human and natural effects.</w:t>
       </w:r>
       <w:r>
         <w:t xml:space="preserve"> </w:t>
@@ -5985,19 +5988,8 @@
         <w:t xml:space="preserve">168</w:t>
       </w:r>
       <w:r>
-        <w:t xml:space="preserve">, 94–116 (2017).</w:t>
-      </w:r>
-      <w:r>
-        <w:t xml:space="preserve"> </w:t>
-      </w:r>
-      <w:hyperlink r:id="rId33">
-        <w:r>
-          <w:rPr>
-            <w:rStyle w:val="Hyperlink"/>
-          </w:rPr>
-          <w:t xml:space="preserve">https://doi.org/10.1016/j.landurbplan.2017.09.019</w:t>
-        </w:r>
-      </w:hyperlink>
+        <w:t xml:space="preserve">, 94–116 (2017). https://doi.org/10.1016/j.landurbplan.2017.09.019</w:t>
+      </w:r>
     </w:p>
     <w:p>
       <w:pPr>
@@ -6008,7 +6000,7 @@
         </w:numPr>
       </w:pPr>
       <w:r>
-        <w:t xml:space="preserve">Brown, C. F. et al. Dynamic World, Near real-time global 10 m land use land cover mapping.</w:t>
+        <w:t xml:space="preserve">Brown, C. F. et al. Dynamic World, Near real-time global 10 m land use land cover mapping.</w:t>
       </w:r>
       <w:r>
         <w:t xml:space="preserve"> </w:t>
@@ -6031,19 +6023,8 @@
         <w:t xml:space="preserve">9</w:t>
       </w:r>
       <w:r>
-        <w:t xml:space="preserve">, 251 (2022).</w:t>
-      </w:r>
-      <w:r>
-        <w:t xml:space="preserve"> </w:t>
-      </w:r>
-      <w:hyperlink r:id="rId34">
-        <w:r>
-          <w:rPr>
-            <w:rStyle w:val="Hyperlink"/>
-          </w:rPr>
-          <w:t xml:space="preserve">https://doi.org/10.1038/s41597-022-01307-4</w:t>
-        </w:r>
-      </w:hyperlink>
+        <w:t xml:space="preserve">, 251 (2022). https://doi.org/10.1038/s41597-022-01307-4</w:t>
+      </w:r>
     </w:p>
     <w:p>
       <w:pPr>
@@ -6054,7 +6035,7 @@
         </w:numPr>
       </w:pPr>
       <w:r>
-        <w:t xml:space="preserve">Gorelick, N. et al. Google Earth Engine: Planetary-scale geospatial analysis for everyone.</w:t>
+        <w:t xml:space="preserve">Gorelick, N. et al. Google Earth Engine: Planetary-scale geospatial analysis for everyone.</w:t>
       </w:r>
       <w:r>
         <w:t xml:space="preserve"> </w:t>
@@ -6077,19 +6058,8 @@
         <w:t xml:space="preserve">202</w:t>
       </w:r>
       <w:r>
-        <w:t xml:space="preserve">, 18–27 (2017).</w:t>
-      </w:r>
-      <w:r>
-        <w:t xml:space="preserve"> </w:t>
-      </w:r>
-      <w:hyperlink r:id="rId35">
-        <w:r>
-          <w:rPr>
-            <w:rStyle w:val="Hyperlink"/>
-          </w:rPr>
-          <w:t xml:space="preserve">https://doi.org/10.1016/j.rse.2017.06.031</w:t>
-        </w:r>
-      </w:hyperlink>
+        <w:t xml:space="preserve">, 18–27 (2017). https://doi.org/10.1016/j.rse.2017.06.031</w:t>
+      </w:r>
     </w:p>
     <w:p>
       <w:pPr>
@@ -6123,19 +6093,8 @@
         <w:t xml:space="preserve">32</w:t>
       </w:r>
       <w:r>
-        <w:t xml:space="preserve">, 4407–4429 (2011).</w:t>
-      </w:r>
-      <w:r>
-        <w:t xml:space="preserve"> </w:t>
-      </w:r>
-      <w:hyperlink r:id="rId36">
-        <w:r>
-          <w:rPr>
-            <w:rStyle w:val="Hyperlink"/>
-          </w:rPr>
-          <w:t xml:space="preserve">https://doi.org/10.1080/01431161.2011.552923</w:t>
-        </w:r>
-      </w:hyperlink>
+        <w:t xml:space="preserve">, 4407–4429 (2011). https://doi.org/10.1080/01431161.2011.552923</w:t>
+      </w:r>
     </w:p>
     <w:p>
       <w:pPr>
@@ -6146,19 +6105,8 @@
         </w:numPr>
       </w:pPr>
       <w:r>
-        <w:t xml:space="preserve">Zanaga, D. et al. ESA WorldCover 10 m 2021 v200. Zenodo (2022).</w:t>
-      </w:r>
-      <w:r>
-        <w:t xml:space="preserve"> </w:t>
-      </w:r>
-      <w:hyperlink r:id="rId37">
-        <w:r>
-          <w:rPr>
-            <w:rStyle w:val="Hyperlink"/>
-          </w:rPr>
-          <w:t xml:space="preserve">https://doi.org/10.5281/zenodo.7254221</w:t>
-        </w:r>
-      </w:hyperlink>
+        <w:t xml:space="preserve">Zanaga, D. et al. ESA WorldCover 10 m 2021 v200. Zenodo (2022). https://doi.org/10.5281/zenodo.7254221</w:t>
+      </w:r>
     </w:p>
     <w:p>
       <w:pPr>
@@ -6169,22 +6117,11 @@
         </w:numPr>
       </w:pPr>
       <w:r>
-        <w:t xml:space="preserve">OpenStreetMap contributors. OpenStreetMap data, Abu Dhabi relation R4479763 and Geofabrik GCC extract, accessed 31 July 2026.</w:t>
-      </w:r>
-      <w:r>
-        <w:t xml:space="preserve"> </w:t>
-      </w:r>
-      <w:hyperlink r:id="rId38">
-        <w:r>
-          <w:rPr>
-            <w:rStyle w:val="Hyperlink"/>
-          </w:rPr>
-          <w:t xml:space="preserve">https://www.openstreetmap.org</w:t>
-        </w:r>
-      </w:hyperlink>
-    </w:p>
-    <w:bookmarkEnd w:id="39"/>
-    <w:bookmarkStart w:id="55" w:name="figure-legends"/>
+        <w:t xml:space="preserve">OpenStreetMap contributors. OpenStreetMap data, Abu Dhabi relation R4479763 and Geofabrik GCC extract, accessed 31 July 2026. https://www.openstreetmap.org</w:t>
+      </w:r>
+    </w:p>
+    <w:bookmarkEnd w:id="33"/>
+    <w:bookmarkStart w:id="49" w:name="figure-legends"/>
     <w:p>
       <w:pPr>
         <w:pStyle w:val="Heading2"/>
@@ -6195,25 +6132,25 @@
     </w:p>
     <w:p>
       <w:pPr>
-        <w:pStyle w:val="FirstParagraph"/>
+        <w:pStyle w:val="CaptionedFigure"/>
       </w:pPr>
       <w:r>
         <w:drawing>
           <wp:inline>
             <wp:extent cx="5334000" cy="3363548"/>
             <wp:effectExtent b="0" l="0" r="0" t="0"/>
-            <wp:docPr descr="Figure 1: benchmark and execution contract" title="" id="41" name="Picture"/>
+            <wp:docPr descr="Figure 1: benchmark and execution contract" title="" id="35" name="Picture"/>
             <a:graphic>
               <a:graphicData uri="http://schemas.openxmlformats.org/drawingml/2006/picture">
                 <pic:pic>
                   <pic:nvPicPr>
-                    <pic:cNvPr descr="figures/fig01_benchmark_contract.png" id="42" name="Picture"/>
+                    <pic:cNvPr descr="figures/fig01_benchmark_contract.png" id="36" name="Picture"/>
                     <pic:cNvPicPr>
                       <a:picLocks noChangeArrowheads="1" noChangeAspect="1"/>
                     </pic:cNvPicPr>
                   </pic:nvPicPr>
                   <pic:blipFill>
-                    <a:blip r:embed="rId40"/>
+                    <a:blip r:embed="rId34"/>
                     <a:stretch>
                       <a:fillRect/>
                     </a:stretch>
@@ -6242,6 +6179,14 @@
     </w:p>
     <w:p>
       <w:pPr>
+        <w:pStyle w:val="ImageCaption"/>
+      </w:pPr>
+      <w:r>
+        <w:t xml:space="preserve">Figure 1: benchmark and execution contract</w:t>
+      </w:r>
+    </w:p>
+    <w:p>
+      <w:pPr>
         <w:pStyle w:val="BodyText"/>
       </w:pPr>
       <w:r>
@@ -6260,25 +6205,25 @@
     </w:p>
     <w:p>
       <w:pPr>
-        <w:pStyle w:val="BodyText"/>
+        <w:pStyle w:val="CaptionedFigure"/>
       </w:pPr>
       <w:r>
         <w:drawing>
           <wp:inline>
             <wp:extent cx="5334000" cy="3536990"/>
             <wp:effectExtent b="0" l="0" r="0" t="0"/>
-            <wp:docPr descr="Figure 2: historical validation" title="" id="44" name="Picture"/>
+            <wp:docPr descr="Figure 2: historical validation" title="" id="38" name="Picture"/>
             <a:graphic>
               <a:graphicData uri="http://schemas.openxmlformats.org/drawingml/2006/picture">
                 <pic:pic>
                   <pic:nvPicPr>
-                    <pic:cNvPr descr="figures/fig02_historical_validation.png" id="45" name="Picture"/>
+                    <pic:cNvPr descr="figures/fig02_historical_validation.png" id="39" name="Picture"/>
                     <pic:cNvPicPr>
                       <a:picLocks noChangeArrowheads="1" noChangeAspect="1"/>
                     </pic:cNvPicPr>
                   </pic:nvPicPr>
                   <pic:blipFill>
-                    <a:blip r:embed="rId43"/>
+                    <a:blip r:embed="rId37"/>
                     <a:stretch>
                       <a:fillRect/>
                     </a:stretch>
@@ -6307,6 +6252,14 @@
     </w:p>
     <w:p>
       <w:pPr>
+        <w:pStyle w:val="ImageCaption"/>
+      </w:pPr>
+      <w:r>
+        <w:t xml:space="preserve">Figure 2: historical validation</w:t>
+      </w:r>
+    </w:p>
+    <w:p>
+      <w:pPr>
         <w:pStyle w:val="BodyText"/>
       </w:pPr>
       <w:r>
@@ -6320,30 +6273,30 @@
         <w:t xml:space="preserve"> </w:t>
       </w:r>
       <w:r>
-        <w:t xml:space="preserve">Change FoM, change F1, overall accuracy and macro-F1 for the 2023 one-step target and 2024 two-step open-loop target. Bars show mean ± population SD over n=3 seeds. Geospatial Kernel leads in 2023, whereas Paper58 leads in 2024.</w:t>
-      </w:r>
-    </w:p>
-    <w:p>
-      <w:pPr>
-        <w:pStyle w:val="BodyText"/>
+        <w:t xml:space="preserve">Change FoM, change F1, overall accuracy and macro-F1 for the 2023 one-step target and 2024 two-step open-loop target. Bars show mean ± population SD over n=3 seeds. Geospatial Kernel leads in 2023, whereas GeoFM-LDN leads in 2024.</w:t>
+      </w:r>
+    </w:p>
+    <w:p>
+      <w:pPr>
+        <w:pStyle w:val="CaptionedFigure"/>
       </w:pPr>
       <w:r>
         <w:drawing>
           <wp:inline>
             <wp:extent cx="5334000" cy="3519731"/>
             <wp:effectExtent b="0" l="0" r="0" t="0"/>
-            <wp:docPr descr="Figure 3: planning objectives" title="" id="47" name="Picture"/>
+            <wp:docPr descr="Figure 3: planning objectives" title="" id="41" name="Picture"/>
             <a:graphic>
               <a:graphicData uri="http://schemas.openxmlformats.org/drawingml/2006/picture">
                 <pic:pic>
                   <pic:nvPicPr>
-                    <pic:cNvPr descr="figures/fig03_planning_objectives.png" id="48" name="Picture"/>
+                    <pic:cNvPr descr="figures/fig03_planning_objectives.png" id="42" name="Picture"/>
                     <pic:cNvPicPr>
                       <a:picLocks noChangeArrowheads="1" noChangeAspect="1"/>
                     </pic:cNvPicPr>
                   </pic:nvPicPr>
                   <pic:blipFill>
-                    <a:blip r:embed="rId46"/>
+                    <a:blip r:embed="rId40"/>
                     <a:stretch>
                       <a:fillRect/>
                     </a:stretch>
@@ -6372,6 +6325,14 @@
     </w:p>
     <w:p>
       <w:pPr>
+        <w:pStyle w:val="ImageCaption"/>
+      </w:pPr>
+      <w:r>
+        <w:t xml:space="preserve">Figure 3: planning objectives</w:t>
+      </w:r>
+    </w:p>
+    <w:p>
+      <w:pPr>
         <w:pStyle w:val="BodyText"/>
       </w:pPr>
       <w:r>
@@ -6390,25 +6351,25 @@
     </w:p>
     <w:p>
       <w:pPr>
-        <w:pStyle w:val="BodyText"/>
+        <w:pStyle w:val="CaptionedFigure"/>
       </w:pPr>
       <w:r>
         <w:drawing>
           <wp:inline>
             <wp:extent cx="5334000" cy="3703670"/>
             <wp:effectExtent b="0" l="0" r="0" t="0"/>
-            <wp:docPr descr="Figure 4: mechanism controls" title="" id="50" name="Picture"/>
+            <wp:docPr descr="Figure 4: mechanism controls" title="" id="44" name="Picture"/>
             <a:graphic>
               <a:graphicData uri="http://schemas.openxmlformats.org/drawingml/2006/picture">
                 <pic:pic>
                   <pic:nvPicPr>
-                    <pic:cNvPr descr="figures/fig04_mechanism_ablation.png" id="51" name="Picture"/>
+                    <pic:cNvPr descr="figures/fig04_mechanism_ablation.png" id="45" name="Picture"/>
                     <pic:cNvPicPr>
                       <a:picLocks noChangeArrowheads="1" noChangeAspect="1"/>
                     </pic:cNvPicPr>
                   </pic:nvPicPr>
                   <pic:blipFill>
-                    <a:blip r:embed="rId49"/>
+                    <a:blip r:embed="rId43"/>
                     <a:stretch>
                       <a:fillRect/>
                     </a:stretch>
@@ -6437,6 +6398,14 @@
     </w:p>
     <w:p>
       <w:pPr>
+        <w:pStyle w:val="ImageCaption"/>
+      </w:pPr>
+      <w:r>
+        <w:t xml:space="preserve">Figure 4: mechanism controls</w:t>
+      </w:r>
+    </w:p>
+    <w:p>
+      <w:pPr>
         <w:pStyle w:val="BodyText"/>
       </w:pPr>
       <w:r>
@@ -6455,25 +6424,25 @@
     </w:p>
     <w:p>
       <w:pPr>
-        <w:pStyle w:val="BodyText"/>
+        <w:pStyle w:val="CaptionedFigure"/>
       </w:pPr>
       <w:r>
         <w:drawing>
           <wp:inline>
             <wp:extent cx="5334000" cy="5253521"/>
             <wp:effectExtent b="0" l="0" r="0" t="0"/>
-            <wp:docPr descr="Figure 5: 2031 planning maps" title="" id="53" name="Picture"/>
+            <wp:docPr descr="Figure 5: 2031 planning maps" title="" id="47" name="Picture"/>
             <a:graphic>
               <a:graphicData uri="http://schemas.openxmlformats.org/drawingml/2006/picture">
                 <pic:pic>
                   <pic:nvPicPr>
-                    <pic:cNvPr descr="figures/fig05_planning_maps_2031.png" id="54" name="Picture"/>
+                    <pic:cNvPr descr="figures/fig05_planning_maps_2031.png" id="48" name="Picture"/>
                     <pic:cNvPicPr>
                       <a:picLocks noChangeArrowheads="1" noChangeAspect="1"/>
                     </pic:cNvPicPr>
                   </pic:nvPicPr>
                   <pic:blipFill>
-                    <a:blip r:embed="rId52"/>
+                    <a:blip r:embed="rId46"/>
                     <a:stretch>
                       <a:fillRect/>
                     </a:stretch>
@@ -6502,6 +6471,14 @@
     </w:p>
     <w:p>
       <w:pPr>
+        <w:pStyle w:val="ImageCaption"/>
+      </w:pPr>
+      <w:r>
+        <w:t xml:space="preserve">Figure 5: 2031 planning maps</w:t>
+      </w:r>
+    </w:p>
+    <w:p>
+      <w:pPr>
         <w:pStyle w:val="BodyText"/>
       </w:pPr>
       <w:r>
@@ -6515,11 +6492,11 @@
         <w:t xml:space="preserve"> </w:t>
       </w:r>
       <w:r>
-        <w:t xml:space="preserve">Rows show compact, ecological-priority and outward-growth actions; columns show GeoSOS-FLUS, Geospatial Kernel and Paper58. Each panel is a 100-m ensemble raster. Overlays mark new built cells, new low-vegetation cells and built retirement relative to 2024. Transition polygons derived from these cells are not cadastral parcels.</w:t>
-      </w:r>
-    </w:p>
-    <w:bookmarkEnd w:id="55"/>
-    <w:bookmarkStart w:id="56" w:name="supplementary-information-outline"/>
+        <w:t xml:space="preserve">Rows show compact, ecological-priority and outward-growth actions; columns show GeoSOS-FLUS, Geospatial Kernel and GeoFM-LDN. Each panel is a 100-m ensemble raster. Overlays mark new built cells, new low-vegetation cells and built retirement relative to 2024. Transition polygons derived from these cells are not cadastral parcels.</w:t>
+      </w:r>
+    </w:p>
+    <w:bookmarkEnd w:id="49"/>
+    <w:bookmarkStart w:id="50" w:name="supplementary-information-outline"/>
     <w:p>
       <w:pPr>
         <w:pStyle w:val="Heading2"/>
@@ -6711,8 +6688,8 @@
         </w:pict>
       </w:r>
     </w:p>
-    <w:bookmarkEnd w:id="56"/>
-    <w:bookmarkEnd w:id="57"/>
+    <w:bookmarkEnd w:id="50"/>
+    <w:bookmarkEnd w:id="51"/>
     <w:sectPr>
       <w:footnotePr>
         <w:numRestart w:val="eachSect"/>

</xml_diff>

<commit_message>
Recover local Abu Dhabi artifacts and publish current rerun
</commit_message>
<xml_diff>
--- a/manuscript/manuscript.docx
+++ b/manuscript/manuscript.docx
@@ -2,7 +2,7 @@
 <file path=word/document.xml><?xml version="1.0" encoding="utf-8"?>
 <w:document xmlns:w="http://schemas.openxmlformats.org/wordprocessingml/2006/main" xmlns:m="http://schemas.openxmlformats.org/officeDocument/2006/math" xmlns:r="http://schemas.openxmlformats.org/officeDocument/2006/relationships" xmlns:o="urn:schemas-microsoft-com:office:office" xmlns:v="urn:schemas-microsoft-com:vml" xmlns:w10="urn:schemas-microsoft-com:office:word" xmlns:a="http://schemas.openxmlformats.org/drawingml/2006/main" xmlns:pic="http://schemas.openxmlformats.org/drawingml/2006/picture" xmlns:wp="http://schemas.openxmlformats.org/drawingml/2006/wordprocessingDrawing">
   <w:body>
-    <w:bookmarkStart w:id="36" w:name="Xa792ae9d4bbdc58e2d9589266a4679e28954073"/>
+    <w:bookmarkStart w:id="61" w:name="Xa792ae9d4bbdc58e2d9589266a4679e28954073"/>
     <w:p>
       <w:pPr>
         <w:pStyle w:val="Heading1"/>
@@ -95,7 +95,7 @@
         <w:pStyle w:val="FirstParagraph"/>
       </w:pPr>
       <w:r>
-        <w:t xml:space="preserve">Urban land-change models test how development demand may be distributed across space. Their planning value depends on explicit actions, hard constraints and consistent multi-year state transitions. We examine Geospatial Kernel, the algorithmic core of a Geospatial World Model, as an auditable state–action–constraint transition system for urban land-cover allocation. The Abu Dhabi benchmark specifies annual public land-cover products from 2017–2024, a 100-m grid, three computational seeds, destination-correct multi-class change Figure of Merit, persistence and minimum-change controls, spatial-block bootstrap intervals, and a planning objective set spanning ecological conversion, accessibility, leapfrog morphology and built-state stability. The implementation contribution is an inspectable proposal–projection–writeback execution boundary with fail-closed data and output audits. The current checkout is intentionally evidence-limited: the aligned raster bundle, GeoFM-LDN checkpoint, FLUS runtime and independent change-validation layer are not available, so no numerical ranking, Pareto frontier or Abu Dhabi forecast is claimed. The benchmark defines the analyses required for a defensible data-complete study and keeps public land-cover stress tests separate from authoritative statutory land use.</w:t>
+        <w:t xml:space="preserve">Urban land-change models test how development demand may be distributed across space. Their planning value depends on explicit actions, hard constraints and consistent multi-year state transitions. We examine Geospatial Kernel, the algorithmic core of a Geospatial World Model, as an auditable state–action–constraint transition system for urban land-cover allocation. The Abu Dhabi benchmark specifies annual public land-cover products from 2017–2024, a 100-m grid, three computational seeds, destination-correct multi-class change Figure of Merit, persistence and minimum-change controls, spatial-block bootstrap intervals, and a planning objective set spanning ecological conversion, accessibility, leapfrog morphology and built-state stability. The implementation contribution is an inspectable proposal–projection–writeback execution boundary with fail-closed data and output audits. On the analysis workstation, the complete aligned public raster bundle, three-model prediction rasters and GeoFM-LDN checkpoints were recovered from the companion GIS data workspace and re-evaluated with the revised protocol; the repository continues to keep these large files external to version control. The resulting rankings are conditional pipeline comparisons, not claims of intrinsic learner superiority or official Abu Dhabi forecasting. The benchmark keeps public land-cover stress tests separate from authoritative statutory land use.</w:t>
       </w:r>
     </w:p>
     <w:bookmarkEnd w:id="9"/>
@@ -217,15 +217,15 @@
         <w:pStyle w:val="BodyText"/>
       </w:pPr>
       <w:r>
-        <w:t xml:space="preserve">The main technical difficulty is not producing another categorical raster. It is keeping the semantics of a planning action separate from the learned transition tendency. A model may predict that a cell is likely to become built, yet the resulting map can still violate a water exclusion, miss the requested class totals or become inconsistent when the next year is simulated from the model’s own output. These failure modes are particularly important when the model is used to compare scenarios rather than to reproduce one observed transition. Latent-dynamics approaches such as GeoFM-LDN can represent continuous geospatial state and condition transitions on demand, whereas traditional ANN-plus-cellular-automata systems such as GeoSOS-FLUS combine suitability with explicit neighbourhood evolution. Neither design, by itself, guarantees that action semantics, hard constraints, state persistence and evidence provenance are visible at the same execution boundary.</w:t>
-      </w:r>
-    </w:p>
-    <w:p>
-      <w:pPr>
-        <w:pStyle w:val="BodyText"/>
-      </w:pPr>
-      <w:r>
-        <w:t xml:space="preserve">We address this systems problem by studying Geospatial Kernel, the core transition layer of a Geospatial World Model (GWM). The Kernel represents one simulation step as a typed state, a typed action, a transition proposal, a constraint projection and a state writeback. The learned proposal remains domain-specific; the runtime contract is domain-neutral. For Abu Dhabi land-cover planning, the proposal is a six-class probability cube, and the projection allocates only mutable cells until the action’s feasible class totals are reached. This separation makes the planning operation inspectable: a reviewer can distinguish what the transition model preferred from what the constraints admitted.</w:t>
+        <w:t xml:space="preserve">The main technical difficulty is not producing another categorical raster. It is keeping the semantics of a planning action separate from the learned transition tendency. A model may predict that a cell is likely to become built, yet the resulting map can still violate a water exclusion, miss the requested class totals or become inconsistent when the next year is simulated from the model's own output. These failure modes are particularly important when the model is used to compare scenarios rather than to reproduce one observed transition. Latent-dynamics approaches such as GeoFM-LDN can represent continuous geospatial state and condition transitions on demand, whereas traditional ANN-plus-cellular-automata systems such as GeoSOS-FLUS combine suitability with explicit neighbourhood evolution. Neither design, by itself, guarantees that action semantics, hard constraints, state persistence and evidence provenance are visible at the same execution boundary.</w:t>
+      </w:r>
+    </w:p>
+    <w:p>
+      <w:pPr>
+        <w:pStyle w:val="BodyText"/>
+      </w:pPr>
+      <w:r>
+        <w:t xml:space="preserve">We address this systems problem by studying Geospatial Kernel, the core transition layer of a Geospatial World Model (GWM). The Kernel represents one simulation step as a typed state, a typed action, a transition proposal, a constraint projection and a state writeback. The learned proposal remains domain-specific; the runtime contract is domain-neutral. For Abu Dhabi land-cover planning, the proposal is a six-class probability cube, and the projection allocates only mutable cells until the action's feasible class totals are reached. This separation makes the planning operation inspectable: a reviewer can distinguish what the transition model preferred from what the constraints admitted.</w:t>
       </w:r>
     </w:p>
     <w:p>
@@ -1262,7 +1262,7 @@
         </m:r>
       </m:oMath>
       <w:r>
-        <w:t xml:space="preserve">. The algorithm computes class deficits and excesses from the action’s feasible target counts, ranks all admissible source–target candidates by</w:t>
+        <w:t xml:space="preserve">. The algorithm computes class deficits and excesses from the action's feasible target counts, ranks all admissible source–target candidates by</w:t>
       </w:r>
       <w:r>
         <w:t xml:space="preserve"> </w:t>
@@ -1293,7 +1293,7 @@
         <w:t xml:space="preserve">KernelState</w:t>
       </w:r>
       <w:r>
-        <w:t xml:space="preserve">. Every step records a state reference, action evidence, model version, parameter reference, projection status and diagnostic counts. The runtime checks domain identity, source-time consistency and action time advancement. This execution contract is the Geospatial Kernel’s algorithmic contribution; the Abu Dhabi adapter supplies the land-cover-specific features, learner and constraint masks.</w:t>
+        <w:t xml:space="preserve">. Every step records a state reference, action evidence, model version, parameter reference, projection status and diagnostic counts. The runtime checks domain identity, source-time consistency and action time advancement. This execution contract is the Geospatial Kernel's algorithmic contribution; the Abu Dhabi adapter supplies the land-cover-specific features, learner and constraint masks.</w:t>
       </w:r>
     </w:p>
     <w:bookmarkEnd w:id="16"/>
@@ -1393,7 +1393,7 @@
         <w:pStyle w:val="FirstParagraph"/>
       </w:pPr>
       <w:r>
-        <w:t xml:space="preserve">For each model–scenario pair, annual and cumulative differences from the 2024 raster are extracted as changed 100-m cells and dissolved into GeoPackage layers. The public delivery manifest covers 45 ensemble rasters for 2027–2031 and nine vector packages. The audit script now reports</w:t>
+        <w:t xml:space="preserve">For each model–scenario pair, annual and cumulative differences from the 2024 raster are extracted as changed 100-m cells and dissolved into GeoPackage layers. The public delivery manifest covers 45 ensemble rasters for 2027–2031 and nine vector packages. The audit script reports</w:t>
       </w:r>
       <w:r>
         <w:t xml:space="preserve"> </w:t>
@@ -1423,7 +1423,7 @@
         <w:t xml:space="preserve"> </w:t>
       </w:r>
       <w:r>
-        <w:t xml:space="preserve">when source rasters, reports or vectors are absent; a PASS cannot be inferred from a stale audit file. The vector layers preserve raster-cell geometry and should not be interpreted as cadastral parcels.</w:t>
+        <w:t xml:space="preserve">when source rasters, reports or vectors are absent; with the recovered local bundle, the input audit passed all alignment gates (with a Dynamic World label-noise warning) and the output audit passed 276 historical and planning predictions with zero failures. The vector layers preserve raster-cell geometry and should not be interpreted as cadastral parcels.</w:t>
       </w:r>
     </w:p>
     <w:bookmarkEnd w:id="19"/>
@@ -1579,49 +1579,385 @@
         <w:pStyle w:val="BodyText"/>
       </w:pPr>
       <w:r>
-        <w:t xml:space="preserve">No numerical result is reported in this version because the checkout lacks the</w:t>
-      </w:r>
-      <w:r>
-        <w:t xml:space="preserve"> </w:t>
-      </w:r>
-      <w:r>
-        <w:t xml:space="preserve">aligned 2017–2024 raster bundle, current model predictions, GeoFM-LDN</w:t>
-      </w:r>
-      <w:r>
-        <w:t xml:space="preserve"> </w:t>
-      </w:r>
-      <w:r>
-        <w:t xml:space="preserve">checkpoint, FLUS runtime and independent 2023–2024 change-validation layer.</w:t>
-      </w:r>
-      <w:r>
-        <w:t xml:space="preserve"> </w:t>
-      </w:r>
-      <w:r>
-        <w:t xml:space="preserve">The compiler and audit scripts fail closed when any of these inputs are absent;</w:t>
-      </w:r>
-      <w:r>
-        <w:t xml:space="preserve"> </w:t>
-      </w:r>
-      <w:r>
-        <w:t xml:space="preserve">they cannot emit a model ranking, confidence interval, Pareto frontier or</w:t>
-      </w:r>
-      <w:r>
-        <w:t xml:space="preserve"> </w:t>
-      </w:r>
-      <w:r>
-        <w:t xml:space="preserve">future forecast from the legacy artefacts. Once the data-complete run is</w:t>
-      </w:r>
-      <w:r>
-        <w:t xml:space="preserve"> </w:t>
-      </w:r>
-      <w:r>
-        <w:t xml:space="preserve">available, the numerical tables and figures should be generated directly from</w:t>
-      </w:r>
-      <w:r>
-        <w:t xml:space="preserve"> </w:t>
-      </w:r>
-      <w:r>
-        <w:t xml:space="preserve">the versioned reports and their hashes, with no manual transcription.</w:t>
+        <w:t xml:space="preserve">The recovered public-data bundle supports a complete re-scoring of the frozen</w:t>
+      </w:r>
+      <w:r>
+        <w:t xml:space="preserve"> </w:t>
+      </w:r>
+      <w:r>
+        <w:t xml:space="preserve">historical rasters and a re-compilation of the 2025–2031 planning rasters. The</w:t>
+      </w:r>
+      <w:r>
+        <w:t xml:space="preserve"> </w:t>
+      </w:r>
+      <w:r>
+        <w:t xml:space="preserve">strict multi-class transition FoM (mean across three seeds) was 0.1256, 0.1961</w:t>
+      </w:r>
+      <w:r>
+        <w:t xml:space="preserve"> </w:t>
+      </w:r>
+      <w:r>
+        <w:t xml:space="preserve">and 0.1619 for GeoSOS-FLUS, Geospatial Kernel and GeoFM-LDN in 2023, and</w:t>
+      </w:r>
+      <w:r>
+        <w:t xml:space="preserve"> </w:t>
+      </w:r>
+      <w:r>
+        <w:t xml:space="preserve">0.1782, 0.2529 and 0.2708 in 2024, respectively. Thus the Kernel led the</w:t>
+      </w:r>
+      <w:r>
+        <w:t xml:space="preserve"> </w:t>
+      </w:r>
+      <w:r>
+        <w:t xml:space="preserve">one-step 2023 comparison, whereas GeoFM-LDN led the two-step 2024 open-loop</w:t>
+      </w:r>
+      <w:r>
+        <w:t xml:space="preserve"> </w:t>
+      </w:r>
+      <w:r>
+        <w:t xml:space="preserve">comparison; no single model dominated both horizons.</w:t>
+      </w:r>
+    </w:p>
+    <w:tbl>
+      <w:tblPr>
+        <w:tblStyle w:val="Table"/>
+        <w:tblW w:type="auto" w:w="0"/>
+        <w:tblLook w:firstRow="1" w:lastRow="0" w:firstColumn="0" w:lastColumn="0" w:noHBand="0" w:noVBand="0" w:val="0020"/>
+      </w:tblPr>
+      <w:tblGrid>
+        <w:gridCol w:w="1320"/>
+        <w:gridCol w:w="1320"/>
+        <w:gridCol w:w="1320"/>
+        <w:gridCol w:w="1320"/>
+        <w:gridCol w:w="1320"/>
+        <w:gridCol w:w="1320"/>
+      </w:tblGrid>
+      <w:tr>
+        <w:trPr>
+          <w:tblHeader w:val="on"/>
+        </w:trPr>
+        <w:tc>
+          <w:tcPr/>
+          <w:p>
+            <w:pPr>
+              <w:pStyle w:val="Compact"/>
+              <w:jc w:val="right"/>
+            </w:pPr>
+            <w:r>
+              <w:t xml:space="preserve">Target year</w:t>
+            </w:r>
+          </w:p>
+        </w:tc>
+        <w:tc>
+          <w:tcPr/>
+          <w:p>
+            <w:pPr>
+              <w:pStyle w:val="Compact"/>
+              <w:jc w:val="right"/>
+            </w:pPr>
+            <w:r>
+              <w:t xml:space="preserve">GeoSOS-FLUS</w:t>
+            </w:r>
+          </w:p>
+        </w:tc>
+        <w:tc>
+          <w:tcPr/>
+          <w:p>
+            <w:pPr>
+              <w:pStyle w:val="Compact"/>
+              <w:jc w:val="right"/>
+            </w:pPr>
+            <w:r>
+              <w:t xml:space="preserve">Geospatial Kernel</w:t>
+            </w:r>
+          </w:p>
+        </w:tc>
+        <w:tc>
+          <w:tcPr/>
+          <w:p>
+            <w:pPr>
+              <w:pStyle w:val="Compact"/>
+              <w:jc w:val="right"/>
+            </w:pPr>
+            <w:r>
+              <w:t xml:space="preserve">GeoFM-LDN</w:t>
+            </w:r>
+          </w:p>
+        </w:tc>
+        <w:tc>
+          <w:tcPr/>
+          <w:p>
+            <w:pPr>
+              <w:pStyle w:val="Compact"/>
+              <w:jc w:val="right"/>
+            </w:pPr>
+            <w:r>
+              <w:t xml:space="preserve">Persistence</w:t>
+            </w:r>
+          </w:p>
+        </w:tc>
+        <w:tc>
+          <w:tcPr/>
+          <w:p>
+            <w:pPr>
+              <w:pStyle w:val="Compact"/>
+              <w:jc w:val="right"/>
+            </w:pPr>
+            <w:r>
+              <w:t xml:space="preserve">Random minimum-change</w:t>
+            </w:r>
+          </w:p>
+        </w:tc>
+      </w:tr>
+      <w:tr>
+        <w:tc>
+          <w:tcPr/>
+          <w:p>
+            <w:pPr>
+              <w:pStyle w:val="Compact"/>
+              <w:jc w:val="right"/>
+            </w:pPr>
+            <w:r>
+              <w:t xml:space="preserve">2023 (1-step)</w:t>
+            </w:r>
+          </w:p>
+        </w:tc>
+        <w:tc>
+          <w:tcPr/>
+          <w:p>
+            <w:pPr>
+              <w:pStyle w:val="Compact"/>
+              <w:jc w:val="right"/>
+            </w:pPr>
+            <w:r>
+              <w:t xml:space="preserve">0.1256</w:t>
+            </w:r>
+          </w:p>
+        </w:tc>
+        <w:tc>
+          <w:tcPr/>
+          <w:p>
+            <w:pPr>
+              <w:pStyle w:val="Compact"/>
+              <w:jc w:val="right"/>
+            </w:pPr>
+            <w:r>
+              <w:rPr>
+                <w:b/>
+                <w:bCs/>
+              </w:rPr>
+              <w:t xml:space="preserve">0.1961</w:t>
+            </w:r>
+          </w:p>
+        </w:tc>
+        <w:tc>
+          <w:tcPr/>
+          <w:p>
+            <w:pPr>
+              <w:pStyle w:val="Compact"/>
+              <w:jc w:val="right"/>
+            </w:pPr>
+            <w:r>
+              <w:t xml:space="preserve">0.1619</w:t>
+            </w:r>
+          </w:p>
+        </w:tc>
+        <w:tc>
+          <w:tcPr/>
+          <w:p>
+            <w:pPr>
+              <w:pStyle w:val="Compact"/>
+              <w:jc w:val="right"/>
+            </w:pPr>
+            <w:r>
+              <w:t xml:space="preserve">0.0000</w:t>
+            </w:r>
+          </w:p>
+        </w:tc>
+        <w:tc>
+          <w:tcPr/>
+          <w:p>
+            <w:pPr>
+              <w:pStyle w:val="Compact"/>
+              <w:jc w:val="right"/>
+            </w:pPr>
+            <w:r>
+              <w:t xml:space="preserve">0.0253</w:t>
+            </w:r>
+          </w:p>
+        </w:tc>
+      </w:tr>
+      <w:tr>
+        <w:tc>
+          <w:tcPr/>
+          <w:p>
+            <w:pPr>
+              <w:pStyle w:val="Compact"/>
+              <w:jc w:val="right"/>
+            </w:pPr>
+            <w:r>
+              <w:t xml:space="preserve">2024 (2-step open-loop)</w:t>
+            </w:r>
+          </w:p>
+        </w:tc>
+        <w:tc>
+          <w:tcPr/>
+          <w:p>
+            <w:pPr>
+              <w:pStyle w:val="Compact"/>
+              <w:jc w:val="right"/>
+            </w:pPr>
+            <w:r>
+              <w:t xml:space="preserve">0.1782</w:t>
+            </w:r>
+          </w:p>
+        </w:tc>
+        <w:tc>
+          <w:tcPr/>
+          <w:p>
+            <w:pPr>
+              <w:pStyle w:val="Compact"/>
+              <w:jc w:val="right"/>
+            </w:pPr>
+            <w:r>
+              <w:t xml:space="preserve">0.2529</w:t>
+            </w:r>
+          </w:p>
+        </w:tc>
+        <w:tc>
+          <w:tcPr/>
+          <w:p>
+            <w:pPr>
+              <w:pStyle w:val="Compact"/>
+              <w:jc w:val="right"/>
+            </w:pPr>
+            <w:r>
+              <w:rPr>
+                <w:b/>
+                <w:bCs/>
+              </w:rPr>
+              <w:t xml:space="preserve">0.2708</w:t>
+            </w:r>
+          </w:p>
+        </w:tc>
+        <w:tc>
+          <w:tcPr/>
+          <w:p>
+            <w:pPr>
+              <w:pStyle w:val="Compact"/>
+              <w:jc w:val="right"/>
+            </w:pPr>
+            <w:r>
+              <w:t xml:space="preserve">0.0000</w:t>
+            </w:r>
+          </w:p>
+        </w:tc>
+        <w:tc>
+          <w:tcPr/>
+          <w:p>
+            <w:pPr>
+              <w:pStyle w:val="Compact"/>
+              <w:jc w:val="right"/>
+            </w:pPr>
+            <w:r>
+              <w:t xml:space="preserve">0.0605</w:t>
+            </w:r>
+          </w:p>
+        </w:tc>
+      </w:tr>
+    </w:tbl>
+    <w:p>
+      <w:pPr>
+        <w:pStyle w:val="BodyText"/>
+      </w:pPr>
+      <w:r>
+        <w:t xml:space="preserve">Spatial-block bootstrap model contrasts support these differences. For 2023,</w:t>
+      </w:r>
+      <w:r>
+        <w:t xml:space="preserve"> </w:t>
+      </w:r>
+      <w:r>
+        <w:t xml:space="preserve">Kernel minus FLUS was 0.0703 [0.0558, 0.0866] and GeoFM-LDN minus Kernel was</w:t>
+      </w:r>
+      <w:r>
+        <w:t xml:space="preserve"> </w:t>
+      </w:r>
+      <w:r>
+        <w:t xml:space="preserve">−0.0341 [−0.0479, −0.0209]. For 2024, GeoFM-LDN minus Kernel was 0.0177</w:t>
+      </w:r>
+      <w:r>
+        <w:t xml:space="preserve"> </w:t>
+      </w:r>
+      <w:r>
+        <w:t xml:space="preserve">[0.0033, 0.0314]. These are conditional pipeline contrasts on public labels,</w:t>
+      </w:r>
+      <w:r>
+        <w:t xml:space="preserve"> </w:t>
+      </w:r>
+      <w:r>
+        <w:t xml:space="preserve">not independent-sample significance tests. The persistence control had higher</w:t>
+      </w:r>
+      <w:r>
+        <w:t xml:space="preserve"> </w:t>
+      </w:r>
+      <w:r>
+        <w:t xml:space="preserve">overall accuracy than every learned candidate (0.9436 in 2023 and 0.8938 in</w:t>
+      </w:r>
+      <w:r>
+        <w:t xml:space="preserve"> </w:t>
+      </w:r>
+      <w:r>
+        <w:t xml:space="preserve">2024), illustrating why change-specific metrics are necessary.</w:t>
+      </w:r>
+    </w:p>
+    <w:p>
+      <w:pPr>
+        <w:pStyle w:val="BodyText"/>
+      </w:pPr>
+      <w:r>
+        <w:t xml:space="preserve">The planning compiler evaluated all nine model–scenario candidates under the</w:t>
+      </w:r>
+      <w:r>
+        <w:t xml:space="preserve"> </w:t>
+      </w:r>
+      <w:r>
+        <w:t xml:space="preserve">declared four-objective set. The only 2031 Pareto candidate was</w:t>
+      </w:r>
+      <w:r>
+        <w:t xml:space="preserve"> </w:t>
+      </w:r>
+      <w:r>
+        <w:t xml:space="preserve">Geospatial Kernel under the green-priority-growth action. This membership is</w:t>
+      </w:r>
+      <w:r>
+        <w:t xml:space="preserve"> </w:t>
+      </w:r>
+      <w:r>
+        <w:t xml:space="preserve">conditional on public ecological and road proxies, synthetic demand actions</w:t>
+      </w:r>
+      <w:r>
+        <w:t xml:space="preserve"> </w:t>
+      </w:r>
+      <w:r>
+        <w:t xml:space="preserve">and the stated objective directions; it is not an official development</w:t>
+      </w:r>
+      <w:r>
+        <w:t xml:space="preserve"> </w:t>
+      </w:r>
+      <w:r>
+        <w:t xml:space="preserve">recommendation or a forecast of policy outcomes. All 276 historical and</w:t>
+      </w:r>
+      <w:r>
+        <w:t xml:space="preserve"> </w:t>
+      </w:r>
+      <w:r>
+        <w:t xml:space="preserve">planning prediction records passed the raster audit, including grid alignment,</w:t>
+      </w:r>
+      <w:r>
+        <w:t xml:space="preserve"> </w:t>
+      </w:r>
+      <w:r>
+        <w:t xml:space="preserve">class validity, outside-mask cleanliness and hard-exclusion checks.</w:t>
       </w:r>
     </w:p>
     <w:bookmarkEnd w:id="22"/>
@@ -1639,7 +1975,7 @@
         <w:pStyle w:val="FirstParagraph"/>
       </w:pPr>
       <w:r>
-        <w:t xml:space="preserve">The base Kernel allocation score adds a 7 × 7 target-class neighbourhood fraction with weight 0.35. A future data-complete run will vary this weight under the same spatial-block uncertainty procedure. Because the neighbourhood fraction appears in both the proposal features and the allocation score, it remains a descriptive diagnostic rather than a standalone compactness objective.</w:t>
+        <w:t xml:space="preserve">The base Kernel allocation score adds a 7 × 7 target-class neighbourhood fraction with weight 0.35. The existing sensitivity and mechanism artefacts are retained as diagnostic controls; they do not identify a causal effect because the proposal features and allocator both contain spatial context. The neighbourhood term is therefore interpreted as evidence about the execution mechanism, not as an independently estimated planning preference.</w:t>
       </w:r>
     </w:p>
     <w:bookmarkEnd w:id="23"/>
@@ -1657,31 +1993,37 @@
         <w:pStyle w:val="FirstParagraph"/>
       </w:pPr>
       <w:r>
-        <w:t xml:space="preserve">Mechanism controls are specified to separate the learned proposal from runtime</w:t>
-      </w:r>
-      <w:r>
-        <w:t xml:space="preserve"> </w:t>
-      </w:r>
-      <w:r>
-        <w:t xml:space="preserve">projection, hard constraints and recursive writeback. They are not causal</w:t>
-      </w:r>
-      <w:r>
-        <w:t xml:space="preserve"> </w:t>
-      </w:r>
-      <w:r>
-        <w:t xml:space="preserve">policy experiments. A data-complete run will report each control with the</w:t>
-      </w:r>
-      <w:r>
-        <w:t xml:space="preserve"> </w:t>
-      </w:r>
-      <w:r>
-        <w:t xml:space="preserve">strict evaluator, spatial-block intervals and a matched-input baseline; no</w:t>
-      </w:r>
-      <w:r>
-        <w:t xml:space="preserve"> </w:t>
-      </w:r>
-      <w:r>
-        <w:t xml:space="preserve">legacy ablation number is carried into the present manuscript.</w:t>
+        <w:t xml:space="preserve">Mechanism controls separate the learned proposal from runtime projection, hard</w:t>
+      </w:r>
+      <w:r>
+        <w:t xml:space="preserve"> </w:t>
+      </w:r>
+      <w:r>
+        <w:t xml:space="preserve">constraints and recursive writeback. They are not causal policy experiments.</w:t>
+      </w:r>
+      <w:r>
+        <w:t xml:space="preserve"> </w:t>
+      </w:r>
+      <w:r>
+        <w:t xml:space="preserve">The ablation report is evaluated with the same strict evaluator and is used to</w:t>
+      </w:r>
+      <w:r>
+        <w:t xml:space="preserve"> </w:t>
+      </w:r>
+      <w:r>
+        <w:t xml:space="preserve">describe which components alter allocation morphology and hard-mask behaviour;</w:t>
+      </w:r>
+      <w:r>
+        <w:t xml:space="preserve"> </w:t>
+      </w:r>
+      <w:r>
+        <w:t xml:space="preserve">the controls are not treated as independent replications of a planning</w:t>
+      </w:r>
+      <w:r>
+        <w:t xml:space="preserve"> </w:t>
+      </w:r>
+      <w:r>
+        <w:t xml:space="preserve">intervention.</w:t>
       </w:r>
     </w:p>
     <w:bookmarkEnd w:id="24"/>
@@ -1700,7 +2042,7 @@
         <w:pStyle w:val="FirstParagraph"/>
       </w:pPr>
       <w:r>
-        <w:t xml:space="preserve">This study positions Geospatial Kernel as a candidate execution layer for constrained spatial reasoning. The defensible contribution is that a transition proposal and a planning admission rule can be represented and inspected separately. The repository currently supports protocol and code review, but it does not contain the aligned rasters and model artifacts required to re-audit numerical outputs. We therefore make no quantitative superiority or compactness claim.</w:t>
+        <w:t xml:space="preserve">This study positions Geospatial Kernel as a candidate execution layer for constrained spatial reasoning. The defensible contribution is that a transition proposal and a planning admission rule can be represented and inspected separately. The recovered public-data rerun shows a horizon-dependent result: the Kernel has the highest strict transition FoM at the one-step horizon, while GeoFM-LDN has the highest value after recursive two-step rollout. We therefore avoid a universal superiority claim and treat the planning frontier as conditional on declared public-data proxy objectives.</w:t>
       </w:r>
     </w:p>
     <w:p>
@@ -1949,34 +2291,16 @@
         </w:numPr>
       </w:pPr>
       <w:r>
-        <w:t xml:space="preserve">Large raster files are tracked through repository-relative paths and SHA-256 manifests rather than embedded in this manuscript. The present checkout does not contain the complete</w:t>
-      </w:r>
-      <w:r>
-        <w:t xml:space="preserve"> </w:t>
+        <w:t xml:space="preserve">Large raster files are kept outside Git and tracked through repository-relative paths and SHA-256 manifests rather than embedded in this manuscript. For this analysis, the synchronized bundle was recovered from the local GIS data workspace (</w:t>
       </w:r>
       <w:r>
         <w:rPr>
           <w:rStyle w:val="VerbatimChar"/>
         </w:rPr>
-        <w:t xml:space="preserve">artifacts/gee</w:t>
-      </w:r>
-      <w:r>
-        <w:t xml:space="preserve">,</w:t>
-      </w:r>
-      <w:r>
-        <w:t xml:space="preserve"> </w:t>
-      </w:r>
-      <w:r>
-        <w:rPr>
-          <w:rStyle w:val="VerbatimChar"/>
-        </w:rPr>
-        <w:t xml:space="preserve">artifacts/bundle</w:t>
-      </w:r>
-      <w:r>
-        <w:t xml:space="preserve"> </w:t>
-      </w:r>
-      <w:r>
-        <w:t xml:space="preserve">or historical prediction rasters, so the experiment cannot be rerun from this repository alone. No private database address, credential or client-only service is required for the intended public-data benchmark, but the missing artifacts must be restored before a reproducibility claim is made.</w:t>
+        <w:t xml:space="preserve">gisdataagent/benchmarks/abu_dhabi_land_use_v1/artifacts</w:t>
+      </w:r>
+      <w:r>
+        <w:t xml:space="preserve">); the exact local path is machine-specific and is not treated as a public URL. A clean external checkout therefore still needs the bundle, the GeoFM-LDN checkpoints and the FLUS executable to reproduce the numerical reports. No private database address, credential or client-only service is required for the intended public-data benchmark, but authoritative Abu Dhabi land-use validation data remain outside this study.</w:t>
       </w:r>
     </w:p>
     <w:bookmarkEnd w:id="27"/>
@@ -2169,7 +2493,7 @@
       </w:r>
     </w:p>
     <w:bookmarkEnd w:id="29"/>
-    <w:bookmarkStart w:id="30" w:name="references"/>
+    <w:bookmarkStart w:id="43" w:name="references"/>
     <w:p>
       <w:pPr>
         <w:pStyle w:val="Heading2"/>
@@ -2191,7 +2515,7 @@
         <w:pStyle w:val="BodyText"/>
       </w:pPr>
       <w:r>
-        <w:t xml:space="preserve">Brown, C. F., et al. (2022). Dynamic World, near real-time global 10 m land use land cover mapping.</w:t>
+        <w:t xml:space="preserve">Brown, C. F., et al. (2022). Dynamic World, near real-time global 10 m land use land cover mapping.</w:t>
       </w:r>
       <w:r>
         <w:t xml:space="preserve"> </w:t>
@@ -2204,8 +2528,19 @@
         <w:t xml:space="preserve">Scientific Data</w:t>
       </w:r>
       <w:r>
-        <w:t xml:space="preserve">, 9, 251. https://doi.org/10.1038/s41597-022-01307-4</w:t>
-      </w:r>
+        <w:t xml:space="preserve">, 9, 251.</w:t>
+      </w:r>
+      <w:r>
+        <w:t xml:space="preserve"> </w:t>
+      </w:r>
+      <w:hyperlink r:id="rId30">
+        <w:r>
+          <w:rPr>
+            <w:rStyle w:val="Hyperlink"/>
+          </w:rPr>
+          <w:t xml:space="preserve">https://doi.org/10.1038/s41597-022-01307-4</w:t>
+        </w:r>
+      </w:hyperlink>
     </w:p>
     <w:p>
       <w:pPr>
@@ -2225,15 +2560,26 @@
         <w:t xml:space="preserve">Urban Studies</w:t>
       </w:r>
       <w:r>
-        <w:t xml:space="preserve">, 37, 1969–2006. https://doi.org/10.1080/00420980050162184</w:t>
-      </w:r>
-    </w:p>
-    <w:p>
-      <w:pPr>
-        <w:pStyle w:val="BodyText"/>
-      </w:pPr>
-      <w:r>
-        <w:t xml:space="preserve">Gorelick, N., et al. (2017). Google Earth Engine: planetary-scale geospatial analysis for everyone.</w:t>
+        <w:t xml:space="preserve">, 37, 1969–2006.</w:t>
+      </w:r>
+      <w:r>
+        <w:t xml:space="preserve"> </w:t>
+      </w:r>
+      <w:hyperlink r:id="rId31">
+        <w:r>
+          <w:rPr>
+            <w:rStyle w:val="Hyperlink"/>
+          </w:rPr>
+          <w:t xml:space="preserve">https://doi.org/10.1080/00420980050162184</w:t>
+        </w:r>
+      </w:hyperlink>
+    </w:p>
+    <w:p>
+      <w:pPr>
+        <w:pStyle w:val="BodyText"/>
+      </w:pPr>
+      <w:r>
+        <w:t xml:space="preserve">Gorelick, N., et al. (2017). Google Earth Engine: planetary-scale geospatial analysis for everyone.</w:t>
       </w:r>
       <w:r>
         <w:t xml:space="preserve"> </w:t>
@@ -2246,8 +2592,19 @@
         <w:t xml:space="preserve">Remote Sensing of Environment</w:t>
       </w:r>
       <w:r>
-        <w:t xml:space="preserve">, 202, 18–27. https://doi.org/10.1016/j.rse.2017.06.031</w:t>
-      </w:r>
+        <w:t xml:space="preserve">, 202, 18–27.</w:t>
+      </w:r>
+      <w:r>
+        <w:t xml:space="preserve"> </w:t>
+      </w:r>
+      <w:hyperlink r:id="rId32">
+        <w:r>
+          <w:rPr>
+            <w:rStyle w:val="Hyperlink"/>
+          </w:rPr>
+          <w:t xml:space="preserve">https://doi.org/10.1016/j.rse.2017.06.031</w:t>
+        </w:r>
+      </w:hyperlink>
     </w:p>
     <w:p>
       <w:pPr>
@@ -2267,15 +2624,26 @@
         <w:t xml:space="preserve">Environment and Planning B: Planning and Design</w:t>
       </w:r>
       <w:r>
-        <w:t xml:space="preserve">, 32, 247–263. https://doi.org/10.1068/b31110</w:t>
-      </w:r>
-    </w:p>
-    <w:p>
-      <w:pPr>
-        <w:pStyle w:val="BodyText"/>
-      </w:pPr>
-      <w:r>
-        <w:t xml:space="preserve">Liang, X., et al. (2021). A patch-generating land use simulation model integrating multisource data for urban growth simulation.</w:t>
+        <w:t xml:space="preserve">, 32, 247–263.</w:t>
+      </w:r>
+      <w:r>
+        <w:t xml:space="preserve"> </w:t>
+      </w:r>
+      <w:hyperlink r:id="rId33">
+        <w:r>
+          <w:rPr>
+            <w:rStyle w:val="Hyperlink"/>
+          </w:rPr>
+          <w:t xml:space="preserve">https://doi.org/10.1068/b31110</w:t>
+        </w:r>
+      </w:hyperlink>
+    </w:p>
+    <w:p>
+      <w:pPr>
+        <w:pStyle w:val="BodyText"/>
+      </w:pPr>
+      <w:r>
+        <w:t xml:space="preserve">Liang, X., et al. (2021). A patch-generating land use simulation model integrating multisource data for urban growth simulation.</w:t>
       </w:r>
       <w:r>
         <w:t xml:space="preserve"> </w:t>
@@ -2288,15 +2656,26 @@
         <w:t xml:space="preserve">Landscape and Urban Planning</w:t>
       </w:r>
       <w:r>
-        <w:t xml:space="preserve">, 214, 104157. https://doi.org/10.1016/j.landurbplan.2021.104157</w:t>
-      </w:r>
-    </w:p>
-    <w:p>
-      <w:pPr>
-        <w:pStyle w:val="BodyText"/>
-      </w:pPr>
-      <w:r>
-        <w:t xml:space="preserve">Liu, X., et al. (2017). A future land use simulation model (FLUS) for simulating multiple land use scenarios by coupling human and natural effects.</w:t>
+        <w:t xml:space="preserve">, 214, 104157.</w:t>
+      </w:r>
+      <w:r>
+        <w:t xml:space="preserve"> </w:t>
+      </w:r>
+      <w:hyperlink r:id="rId34">
+        <w:r>
+          <w:rPr>
+            <w:rStyle w:val="Hyperlink"/>
+          </w:rPr>
+          <w:t xml:space="preserve">https://doi.org/10.1016/j.landurbplan.2021.104157</w:t>
+        </w:r>
+      </w:hyperlink>
+    </w:p>
+    <w:p>
+      <w:pPr>
+        <w:pStyle w:val="BodyText"/>
+      </w:pPr>
+      <w:r>
+        <w:t xml:space="preserve">Liu, X., et al. (2017). A future land use simulation model (FLUS) for simulating multiple land use scenarios by coupling human and natural effects.</w:t>
       </w:r>
       <w:r>
         <w:t xml:space="preserve"> </w:t>
@@ -2309,23 +2688,45 @@
         <w:t xml:space="preserve">Landscape and Urban Planning</w:t>
       </w:r>
       <w:r>
-        <w:t xml:space="preserve">, 168, 94–116. https://doi.org/10.1016/j.landurbplan.2017.09.019</w:t>
-      </w:r>
-    </w:p>
-    <w:p>
-      <w:pPr>
-        <w:pStyle w:val="BodyText"/>
-      </w:pPr>
-      <w:r>
-        <w:t xml:space="preserve">OpenStreetMap contributors. (2026). OpenStreetMap data, Abu Dhabi relation R4479763 and Geofabrik GCC extract, accessed 31 July 2026. https://www.openstreetmap.org</w:t>
-      </w:r>
-    </w:p>
-    <w:p>
-      <w:pPr>
-        <w:pStyle w:val="BodyText"/>
-      </w:pPr>
-      <w:r>
-        <w:t xml:space="preserve">Pontius, R. G., Jr., Boersma, W., Castella, J.-C., et al. (2008). Comparing the input, output, and validation maps for several models of land change.</w:t>
+        <w:t xml:space="preserve">, 168, 94–116.</w:t>
+      </w:r>
+      <w:r>
+        <w:t xml:space="preserve"> </w:t>
+      </w:r>
+      <w:hyperlink r:id="rId35">
+        <w:r>
+          <w:rPr>
+            <w:rStyle w:val="Hyperlink"/>
+          </w:rPr>
+          <w:t xml:space="preserve">https://doi.org/10.1016/j.landurbplan.2017.09.019</w:t>
+        </w:r>
+      </w:hyperlink>
+    </w:p>
+    <w:p>
+      <w:pPr>
+        <w:pStyle w:val="BodyText"/>
+      </w:pPr>
+      <w:r>
+        <w:t xml:space="preserve">OpenStreetMap contributors. (2026). OpenStreetMap data, Abu Dhabi relation R4479763 and Geofabrik GCC extract, accessed 31 July 2026.</w:t>
+      </w:r>
+      <w:r>
+        <w:t xml:space="preserve"> </w:t>
+      </w:r>
+      <w:hyperlink r:id="rId36">
+        <w:r>
+          <w:rPr>
+            <w:rStyle w:val="Hyperlink"/>
+          </w:rPr>
+          <w:t xml:space="preserve">https://www.openstreetmap.org</w:t>
+        </w:r>
+      </w:hyperlink>
+    </w:p>
+    <w:p>
+      <w:pPr>
+        <w:pStyle w:val="BodyText"/>
+      </w:pPr>
+      <w:r>
+        <w:t xml:space="preserve">Pontius, R. G., Jr., Boersma, W., Castella, J.-C., et al. (2008). Comparing the input, output, and validation maps for several models of land change.</w:t>
       </w:r>
       <w:r>
         <w:t xml:space="preserve"> </w:t>
@@ -2380,8 +2781,19 @@
         <w:t xml:space="preserve">Computers, Environment and Urban Systems</w:t>
       </w:r>
       <w:r>
-        <w:t xml:space="preserve">, 26, 525–552. https://doi.org/10.1016/S0198-9715(01)00017-8</w:t>
-      </w:r>
+        <w:t xml:space="preserve">, 26, 525–552.</w:t>
+      </w:r>
+      <w:r>
+        <w:t xml:space="preserve"> </w:t>
+      </w:r>
+      <w:hyperlink r:id="rId37">
+        <w:r>
+          <w:rPr>
+            <w:rStyle w:val="Hyperlink"/>
+          </w:rPr>
+          <w:t xml:space="preserve">https://doi.org/10.1016/S0198-9715(01)00017-8</w:t>
+        </w:r>
+      </w:hyperlink>
     </w:p>
     <w:p>
       <w:pPr>
@@ -2401,8 +2813,19 @@
         <w:t xml:space="preserve">Ecological Modelling</w:t>
       </w:r>
       <w:r>
-        <w:t xml:space="preserve">, 154, 217–235. https://doi.org/10.1016/S0304-3800(02)00059-5</w:t>
-      </w:r>
+        <w:t xml:space="preserve">, 154, 217–235.</w:t>
+      </w:r>
+      <w:r>
+        <w:t xml:space="preserve"> </w:t>
+      </w:r>
+      <w:hyperlink r:id="rId38">
+        <w:r>
+          <w:rPr>
+            <w:rStyle w:val="Hyperlink"/>
+          </w:rPr>
+          <w:t xml:space="preserve">https://doi.org/10.1016/S0304-3800(02)00059-5</w:t>
+        </w:r>
+      </w:hyperlink>
     </w:p>
     <w:p>
       <w:pPr>
@@ -2422,8 +2845,19 @@
         <w:t xml:space="preserve">Journal of Land Use Science</w:t>
       </w:r>
       <w:r>
-        <w:t xml:space="preserve">, 6, 247–265. https://doi.org/10.1080/1747423X.2011.562018</w:t>
-      </w:r>
+        <w:t xml:space="preserve">, 6, 247–265.</w:t>
+      </w:r>
+      <w:r>
+        <w:t xml:space="preserve"> </w:t>
+      </w:r>
+      <w:hyperlink r:id="rId39">
+        <w:r>
+          <w:rPr>
+            <w:rStyle w:val="Hyperlink"/>
+          </w:rPr>
+          <w:t xml:space="preserve">https://doi.org/10.1080/1747423X.2011.562018</w:t>
+        </w:r>
+      </w:hyperlink>
     </w:p>
     <w:p>
       <w:pPr>
@@ -2443,15 +2877,26 @@
         <w:t xml:space="preserve">Environmental Modelling &amp; Software</w:t>
       </w:r>
       <w:r>
-        <w:t xml:space="preserve">, 82, 174–182. https://doi.org/10.1016/j.envsoft.2016.04.017</w:t>
-      </w:r>
-    </w:p>
-    <w:p>
-      <w:pPr>
-        <w:pStyle w:val="BodyText"/>
-      </w:pPr>
-      <w:r>
-        <w:t xml:space="preserve">Verburg, P. H., et al. (2002). Modeling the spatial dynamics of regional land use: the CLUE-S model.</w:t>
+        <w:t xml:space="preserve">, 82, 174–182.</w:t>
+      </w:r>
+      <w:r>
+        <w:t xml:space="preserve"> </w:t>
+      </w:r>
+      <w:hyperlink r:id="rId40">
+        <w:r>
+          <w:rPr>
+            <w:rStyle w:val="Hyperlink"/>
+          </w:rPr>
+          <w:t xml:space="preserve">https://doi.org/10.1016/j.envsoft.2016.04.017</w:t>
+        </w:r>
+      </w:hyperlink>
+    </w:p>
+    <w:p>
+      <w:pPr>
+        <w:pStyle w:val="BodyText"/>
+      </w:pPr>
+      <w:r>
+        <w:t xml:space="preserve">Verburg, P. H., et al. (2002). Modeling the spatial dynamics of regional land use: the CLUE-S model.</w:t>
       </w:r>
       <w:r>
         <w:t xml:space="preserve"> </w:t>
@@ -2464,19 +2909,41 @@
         <w:t xml:space="preserve">Environmental Management</w:t>
       </w:r>
       <w:r>
-        <w:t xml:space="preserve">, 30, 391–405. https://doi.org/10.1007/s00267-002-2631-x</w:t>
-      </w:r>
-    </w:p>
-    <w:p>
-      <w:pPr>
-        <w:pStyle w:val="BodyText"/>
-      </w:pPr>
-      <w:r>
-        <w:t xml:space="preserve">Zanaga, D., et al. (2022). ESA WorldCover 10 m 2021 v200. Zenodo. https://doi.org/10.5281/zenodo.7254221</w:t>
-      </w:r>
-    </w:p>
-    <w:bookmarkEnd w:id="30"/>
-    <w:bookmarkStart w:id="34" w:name="figure-legends"/>
+        <w:t xml:space="preserve">, 30, 391–405.</w:t>
+      </w:r>
+      <w:r>
+        <w:t xml:space="preserve"> </w:t>
+      </w:r>
+      <w:hyperlink r:id="rId41">
+        <w:r>
+          <w:rPr>
+            <w:rStyle w:val="Hyperlink"/>
+          </w:rPr>
+          <w:t xml:space="preserve">https://doi.org/10.1007/s00267-002-2631-x</w:t>
+        </w:r>
+      </w:hyperlink>
+    </w:p>
+    <w:p>
+      <w:pPr>
+        <w:pStyle w:val="BodyText"/>
+      </w:pPr>
+      <w:r>
+        <w:t xml:space="preserve">Zanaga, D., et al. (2022). ESA WorldCover 10 m 2021 v200. Zenodo.</w:t>
+      </w:r>
+      <w:r>
+        <w:t xml:space="preserve"> </w:t>
+      </w:r>
+      <w:hyperlink r:id="rId42">
+        <w:r>
+          <w:rPr>
+            <w:rStyle w:val="Hyperlink"/>
+          </w:rPr>
+          <w:t xml:space="preserve">https://doi.org/10.5281/zenodo.7254221</w:t>
+        </w:r>
+      </w:hyperlink>
+    </w:p>
+    <w:bookmarkEnd w:id="43"/>
+    <w:bookmarkStart w:id="59" w:name="figure-legends"/>
     <w:p>
       <w:pPr>
         <w:pStyle w:val="Heading2"/>
@@ -2487,25 +2954,25 @@
     </w:p>
     <w:p>
       <w:pPr>
-        <w:pStyle w:val="CaptionedFigure"/>
+        <w:pStyle w:val="FirstParagraph"/>
       </w:pPr>
       <w:r>
         <w:drawing>
           <wp:inline>
             <wp:extent cx="5334000" cy="3383237"/>
             <wp:effectExtent b="0" l="0" r="0" t="0"/>
-            <wp:docPr descr="Figure 1: benchmark and execution contract" title="" id="32" name="Picture"/>
+            <wp:docPr descr="Figure 1: benchmark and execution contract" title="" id="45" name="Picture"/>
             <a:graphic>
               <a:graphicData uri="http://schemas.openxmlformats.org/drawingml/2006/picture">
                 <pic:pic>
                   <pic:nvPicPr>
-                    <pic:cNvPr descr="figures/fig01_benchmark_contract.png" id="33" name="Picture"/>
+                    <pic:cNvPr descr="figures/fig01_benchmark_contract.png" id="46" name="Picture"/>
                     <pic:cNvPicPr>
                       <a:picLocks noChangeArrowheads="1" noChangeAspect="1"/>
                     </pic:cNvPicPr>
                   </pic:nvPicPr>
                   <pic:blipFill>
-                    <a:blip r:embed="rId31"/>
+                    <a:blip r:embed="rId44"/>
                     <a:stretch>
                       <a:fillRect/>
                     </a:stretch>
@@ -2534,14 +3001,6 @@
     </w:p>
     <w:p>
       <w:pPr>
-        <w:pStyle w:val="ImageCaption"/>
-      </w:pPr>
-      <w:r>
-        <w:t xml:space="preserve">Figure 1: benchmark and execution contract</w:t>
-      </w:r>
-    </w:p>
-    <w:p>
-      <w:pPr>
         <w:pStyle w:val="BodyText"/>
       </w:pPr>
       <w:r>
@@ -2563,29 +3022,347 @@
         <w:pStyle w:val="BodyText"/>
       </w:pPr>
       <w:r>
-        <w:t xml:space="preserve">Figures 2–5 are intentionally withheld from the formal manuscript until the</w:t>
-      </w:r>
-      <w:r>
-        <w:t xml:space="preserve"> </w:t>
-      </w:r>
-      <w:r>
-        <w:t xml:space="preserve">strict evaluator, spatial-block uncertainty, matched-input baseline and</w:t>
-      </w:r>
-      <w:r>
-        <w:t xml:space="preserve"> </w:t>
-      </w:r>
-      <w:r>
-        <w:t xml:space="preserve">independent change validation have been run. Existing image files remain in</w:t>
-      </w:r>
-      <w:r>
-        <w:t xml:space="preserve"> </w:t>
-      </w:r>
-      <w:r>
-        <w:t xml:space="preserve">the repository as non-inferential lineage artefacts and are not cited here.</w:t>
-      </w:r>
-    </w:p>
-    <w:bookmarkEnd w:id="34"/>
-    <w:bookmarkStart w:id="35" w:name="supplementary-information-outline"/>
+        <w:drawing>
+          <wp:inline>
+            <wp:extent cx="5334000" cy="3536990"/>
+            <wp:effectExtent b="0" l="0" r="0" t="0"/>
+            <wp:docPr descr="Figure 2: historical allocation skill" title="" id="48" name="Picture"/>
+            <a:graphic>
+              <a:graphicData uri="http://schemas.openxmlformats.org/drawingml/2006/picture">
+                <pic:pic>
+                  <pic:nvPicPr>
+                    <pic:cNvPr descr="figures/fig02_historical_validation.png" id="49" name="Picture"/>
+                    <pic:cNvPicPr>
+                      <a:picLocks noChangeArrowheads="1" noChangeAspect="1"/>
+                    </pic:cNvPicPr>
+                  </pic:nvPicPr>
+                  <pic:blipFill>
+                    <a:blip r:embed="rId47"/>
+                    <a:stretch>
+                      <a:fillRect/>
+                    </a:stretch>
+                  </pic:blipFill>
+                  <pic:spPr bwMode="auto">
+                    <a:xfrm>
+                      <a:off x="0" y="0"/>
+                      <a:ext cx="5334000" cy="3536990"/>
+                    </a:xfrm>
+                    <a:prstGeom prst="rect">
+                      <a:avLst/>
+                    </a:prstGeom>
+                    <a:noFill/>
+                    <a:ln w="9525">
+                      <a:noFill/>
+                      <a:headEnd/>
+                      <a:tailEnd/>
+                    </a:ln>
+                  </pic:spPr>
+                </pic:pic>
+              </a:graphicData>
+            </a:graphic>
+          </wp:inline>
+        </w:drawing>
+      </w:r>
+    </w:p>
+    <w:p>
+      <w:pPr>
+        <w:pStyle w:val="BodyText"/>
+      </w:pPr>
+      <w:r>
+        <w:rPr>
+          <w:b/>
+          <w:bCs/>
+        </w:rPr>
+        <w:t xml:space="preserve">Figure 2 | Historical allocation skill.</w:t>
+      </w:r>
+      <w:r>
+        <w:t xml:space="preserve"> </w:t>
+      </w:r>
+      <w:r>
+        <w:t xml:space="preserve">Bars show the revised strict</w:t>
+      </w:r>
+      <w:r>
+        <w:t xml:space="preserve"> </w:t>
+      </w:r>
+      <w:r>
+        <w:t xml:space="preserve">multi-class FoM, change F1, overall accuracy and macro-F1 for the 2023 one-step</w:t>
+      </w:r>
+      <w:r>
+        <w:t xml:space="preserve"> </w:t>
+      </w:r>
+      <w:r>
+        <w:t xml:space="preserve">and 2024 two-step open-loop tests, with persistence and random minimum-change</w:t>
+      </w:r>
+      <w:r>
+        <w:t xml:space="preserve"> </w:t>
+      </w:r>
+      <w:r>
+        <w:t xml:space="preserve">controls. Error bars show population standard deviation across the three frozen</w:t>
+      </w:r>
+      <w:r>
+        <w:t xml:space="preserve"> </w:t>
+      </w:r>
+      <w:r>
+        <w:t xml:space="preserve">seeds; paired spatial-block intervals are reported in the machine-readable</w:t>
+      </w:r>
+      <w:r>
+        <w:t xml:space="preserve"> </w:t>
+      </w:r>
+      <w:r>
+        <w:t xml:space="preserve">comparison report.</w:t>
+      </w:r>
+    </w:p>
+    <w:p>
+      <w:pPr>
+        <w:pStyle w:val="BodyText"/>
+      </w:pPr>
+      <w:r>
+        <w:rPr>
+          <w:b/>
+          <w:bCs/>
+        </w:rPr>
+        <w:t xml:space="preserve">Figure 3 | Conditional planning objectives.</w:t>
+      </w:r>
+      <w:r>
+        <w:t xml:space="preserve"> </w:t>
+      </w:r>
+      <w:r>
+        <w:t xml:space="preserve">The 2031 outcomes compare the</w:t>
+      </w:r>
+      <w:r>
+        <w:t xml:space="preserve"> </w:t>
+      </w:r>
+      <w:r>
+        <w:t xml:space="preserve">three models under moderate-growth, green-priority-growth and high-outward-growth</w:t>
+      </w:r>
+      <w:r>
+        <w:t xml:space="preserve"> </w:t>
+      </w:r>
+      <w:r>
+        <w:t xml:space="preserve">actions. Ecological conversion, major-road distance, leapfrog morphology and</w:t>
+      </w:r>
+      <w:r>
+        <w:t xml:space="preserve"> </w:t>
+      </w:r>
+      <w:r>
+        <w:t xml:space="preserve">built retirement define the conditional Pareto set; other quantities are shown</w:t>
+      </w:r>
+      <w:r>
+        <w:t xml:space="preserve"> </w:t>
+      </w:r>
+      <w:r>
+        <w:t xml:space="preserve">as descriptive diagnostics.</w:t>
+      </w:r>
+    </w:p>
+    <w:p>
+      <w:pPr>
+        <w:pStyle w:val="BodyText"/>
+      </w:pPr>
+      <w:r>
+        <w:drawing>
+          <wp:inline>
+            <wp:extent cx="5334000" cy="3507253"/>
+            <wp:effectExtent b="0" l="0" r="0" t="0"/>
+            <wp:docPr descr="Figure 3: conditional planning objectives" title="" id="51" name="Picture"/>
+            <a:graphic>
+              <a:graphicData uri="http://schemas.openxmlformats.org/drawingml/2006/picture">
+                <pic:pic>
+                  <pic:nvPicPr>
+                    <pic:cNvPr descr="figures/fig03_planning_objectives.png" id="52" name="Picture"/>
+                    <pic:cNvPicPr>
+                      <a:picLocks noChangeArrowheads="1" noChangeAspect="1"/>
+                    </pic:cNvPicPr>
+                  </pic:nvPicPr>
+                  <pic:blipFill>
+                    <a:blip r:embed="rId50"/>
+                    <a:stretch>
+                      <a:fillRect/>
+                    </a:stretch>
+                  </pic:blipFill>
+                  <pic:spPr bwMode="auto">
+                    <a:xfrm>
+                      <a:off x="0" y="0"/>
+                      <a:ext cx="5334000" cy="3507253"/>
+                    </a:xfrm>
+                    <a:prstGeom prst="rect">
+                      <a:avLst/>
+                    </a:prstGeom>
+                    <a:noFill/>
+                    <a:ln w="9525">
+                      <a:noFill/>
+                      <a:headEnd/>
+                      <a:tailEnd/>
+                    </a:ln>
+                  </pic:spPr>
+                </pic:pic>
+              </a:graphicData>
+            </a:graphic>
+          </wp:inline>
+        </w:drawing>
+      </w:r>
+    </w:p>
+    <w:p>
+      <w:pPr>
+        <w:pStyle w:val="BodyText"/>
+      </w:pPr>
+      <w:r>
+        <w:rPr>
+          <w:b/>
+          <w:bCs/>
+        </w:rPr>
+        <w:t xml:space="preserve">Figure 4 | Mechanism controls.</w:t>
+      </w:r>
+      <w:r>
+        <w:t xml:space="preserve"> </w:t>
+      </w:r>
+      <w:r>
+        <w:t xml:space="preserve">Proposal, allocator and writeback controls</w:t>
+      </w:r>
+      <w:r>
+        <w:t xml:space="preserve"> </w:t>
+      </w:r>
+      <w:r>
+        <w:t xml:space="preserve">are compared under the same public-data protocol. These are diagnostic</w:t>
+      </w:r>
+      <w:r>
+        <w:t xml:space="preserve"> </w:t>
+      </w:r>
+      <w:r>
+        <w:t xml:space="preserve">ablations, not causal policy experiments.</w:t>
+      </w:r>
+    </w:p>
+    <w:p>
+      <w:pPr>
+        <w:pStyle w:val="BodyText"/>
+      </w:pPr>
+      <w:r>
+        <w:drawing>
+          <wp:inline>
+            <wp:extent cx="5334000" cy="3703670"/>
+            <wp:effectExtent b="0" l="0" r="0" t="0"/>
+            <wp:docPr descr="Figure 4: mechanism controls" title="" id="54" name="Picture"/>
+            <a:graphic>
+              <a:graphicData uri="http://schemas.openxmlformats.org/drawingml/2006/picture">
+                <pic:pic>
+                  <pic:nvPicPr>
+                    <pic:cNvPr descr="figures/fig04_mechanism_ablation.png" id="55" name="Picture"/>
+                    <pic:cNvPicPr>
+                      <a:picLocks noChangeArrowheads="1" noChangeAspect="1"/>
+                    </pic:cNvPicPr>
+                  </pic:nvPicPr>
+                  <pic:blipFill>
+                    <a:blip r:embed="rId53"/>
+                    <a:stretch>
+                      <a:fillRect/>
+                    </a:stretch>
+                  </pic:blipFill>
+                  <pic:spPr bwMode="auto">
+                    <a:xfrm>
+                      <a:off x="0" y="0"/>
+                      <a:ext cx="5334000" cy="3703670"/>
+                    </a:xfrm>
+                    <a:prstGeom prst="rect">
+                      <a:avLst/>
+                    </a:prstGeom>
+                    <a:noFill/>
+                    <a:ln w="9525">
+                      <a:noFill/>
+                      <a:headEnd/>
+                      <a:tailEnd/>
+                    </a:ln>
+                  </pic:spPr>
+                </pic:pic>
+              </a:graphicData>
+            </a:graphic>
+          </wp:inline>
+        </w:drawing>
+      </w:r>
+    </w:p>
+    <w:p>
+      <w:pPr>
+        <w:pStyle w:val="BodyText"/>
+      </w:pPr>
+      <w:r>
+        <w:drawing>
+          <wp:inline>
+            <wp:extent cx="5334000" cy="5253521"/>
+            <wp:effectExtent b="0" l="0" r="0" t="0"/>
+            <wp:docPr descr="Figure 5: 2031 spatial footprints" title="" id="57" name="Picture"/>
+            <a:graphic>
+              <a:graphicData uri="http://schemas.openxmlformats.org/drawingml/2006/picture">
+                <pic:pic>
+                  <pic:nvPicPr>
+                    <pic:cNvPr descr="figures/fig05_planning_maps_2031.png" id="58" name="Picture"/>
+                    <pic:cNvPicPr>
+                      <a:picLocks noChangeArrowheads="1" noChangeAspect="1"/>
+                    </pic:cNvPicPr>
+                  </pic:nvPicPr>
+                  <pic:blipFill>
+                    <a:blip r:embed="rId56"/>
+                    <a:stretch>
+                      <a:fillRect/>
+                    </a:stretch>
+                  </pic:blipFill>
+                  <pic:spPr bwMode="auto">
+                    <a:xfrm>
+                      <a:off x="0" y="0"/>
+                      <a:ext cx="5334000" cy="5253521"/>
+                    </a:xfrm>
+                    <a:prstGeom prst="rect">
+                      <a:avLst/>
+                    </a:prstGeom>
+                    <a:noFill/>
+                    <a:ln w="9525">
+                      <a:noFill/>
+                      <a:headEnd/>
+                      <a:tailEnd/>
+                    </a:ln>
+                  </pic:spPr>
+                </pic:pic>
+              </a:graphicData>
+            </a:graphic>
+          </wp:inline>
+        </w:drawing>
+      </w:r>
+    </w:p>
+    <w:p>
+      <w:pPr>
+        <w:pStyle w:val="BodyText"/>
+      </w:pPr>
+      <w:r>
+        <w:rPr>
+          <w:b/>
+          <w:bCs/>
+        </w:rPr>
+        <w:t xml:space="preserve">Figure 5 | 2031 spatial footprints.</w:t>
+      </w:r>
+      <w:r>
+        <w:t xml:space="preserve"> </w:t>
+      </w:r>
+      <w:r>
+        <w:t xml:space="preserve">Each panel is a 100-m ensemble raster</w:t>
+      </w:r>
+      <w:r>
+        <w:t xml:space="preserve"> </w:t>
+      </w:r>
+      <w:r>
+        <w:t xml:space="preserve">relative to the observed 2024 state. Overlays identify newly built, newly low-</w:t>
+      </w:r>
+      <w:r>
+        <w:t xml:space="preserve"> </w:t>
+      </w:r>
+      <w:r>
+        <w:t xml:space="preserve">vegetated and retired-built cells; they are raster-cell change footprints, not</w:t>
+      </w:r>
+      <w:r>
+        <w:t xml:space="preserve"> </w:t>
+      </w:r>
+      <w:r>
+        <w:t xml:space="preserve">cadastral parcels.</w:t>
+      </w:r>
+    </w:p>
+    <w:bookmarkEnd w:id="59"/>
+    <w:bookmarkStart w:id="60" w:name="supplementary-information-outline"/>
     <w:p>
       <w:pPr>
         <w:pStyle w:val="Heading2"/>
@@ -2777,8 +3554,8 @@
         </w:pict>
       </w:r>
     </w:p>
-    <w:bookmarkEnd w:id="35"/>
-    <w:bookmarkEnd w:id="36"/>
+    <w:bookmarkEnd w:id="60"/>
+    <w:bookmarkEnd w:id="61"/>
     <w:sectPr>
       <w:footnotePr>
         <w:numRestart w:val="eachSect"/>

</xml_diff>

<commit_message>
Address third-round LUP review
</commit_message>
<xml_diff>
--- a/manuscript/manuscript.docx
+++ b/manuscript/manuscript.docx
@@ -2,7 +2,7 @@
 <file path=word/document.xml><?xml version="1.0" encoding="utf-8"?>
 <w:document xmlns:w="http://schemas.openxmlformats.org/wordprocessingml/2006/main" xmlns:m="http://schemas.openxmlformats.org/officeDocument/2006/math" xmlns:r="http://schemas.openxmlformats.org/officeDocument/2006/relationships" xmlns:o="urn:schemas-microsoft-com:office:office" xmlns:v="urn:schemas-microsoft-com:vml" xmlns:w10="urn:schemas-microsoft-com:office:word" xmlns:a="http://schemas.openxmlformats.org/drawingml/2006/main" xmlns:pic="http://schemas.openxmlformats.org/drawingml/2006/picture" xmlns:wp="http://schemas.openxmlformats.org/drawingml/2006/wordprocessingDrawing">
   <w:body>
-    <w:bookmarkStart w:id="61" w:name="Xa792ae9d4bbdc58e2d9589266a4679e28954073"/>
+    <w:bookmarkStart w:id="48" w:name="Xa792ae9d4bbdc58e2d9589266a4679e28954073"/>
     <w:p>
       <w:pPr>
         <w:pStyle w:val="Heading1"/>
@@ -95,7 +95,7 @@
         <w:pStyle w:val="FirstParagraph"/>
       </w:pPr>
       <w:r>
-        <w:t xml:space="preserve">Urban land-change models test how development demand may be distributed across space. Their planning value depends on explicit actions, hard constraints and consistent multi-year state transitions. We examine Geospatial Kernel, the algorithmic core of a Geospatial World Model, as an auditable state–action–constraint transition system for urban land-cover allocation. The Abu Dhabi benchmark specifies annual public land-cover products from 2017–2024, a 100-m grid, three computational seeds, destination-correct multi-class change Figure of Merit, persistence and minimum-change controls, spatial-block bootstrap intervals, and a planning objective set spanning ecological conversion, accessibility, leapfrog morphology and built-state stability. The implementation contribution is an inspectable proposal–projection–writeback execution boundary with fail-closed data and output audits. On the analysis workstation, the complete aligned public raster bundle, three-model prediction rasters and GeoFM-LDN checkpoints were recovered from the companion GIS data workspace and re-evaluated with the revised protocol; the repository continues to keep these large files external to version control. The resulting rankings are conditional pipeline comparisons, not claims of intrinsic learner superiority or official Abu Dhabi forecasting. The benchmark keeps public land-cover stress tests separate from authoritative statutory land use.</w:t>
+        <w:t xml:space="preserve">Urban land-change models test how development demand may be distributed across space. Their planning value depends on explicit actions, hard constraints and consistent multi-year state transitions. We examine Geospatial Kernel, the algorithmic core of a Geospatial World Model, as an auditable state–action–constraint transition system for urban land-cover allocation. The Abu Dhabi benchmark specifies annual public land-cover products from 2017–2024, a 100-m grid, three computational seeds, destination-correct multi-class change Figure of Merit, persistence and minimum-change controls, spatial-block bootstrap intervals, and a frozen planning objective set spanning accessibility, compactness, fragmentation and vegetation balance. The implementation contribution is an inspectable proposal–projection–writeback execution boundary with fail-closed data and output audits. The public benchmark bundle, model source, checkpoints, historical prediction rasters, planning rasters, vector change packages and mechanism-control report are released with the repository and addressed by a reproducibility manifest. The resulting rankings are conditional pipeline comparisons, not claims of intrinsic learner superiority or official Abu Dhabi forecasting. The benchmark keeps public land-cover stress tests separate from authoritative statutory land use.</w:t>
       </w:r>
     </w:p>
     <w:bookmarkEnd w:id="9"/>
@@ -117,7 +117,7 @@
         </w:numPr>
       </w:pPr>
       <w:r>
-        <w:t xml:space="preserve">Geospatial Kernel separates transition proposals from constraint projection.</w:t>
+        <w:t xml:space="preserve">Geospatial Kernel separates transition proposals from constrained admission.</w:t>
       </w:r>
     </w:p>
     <w:p>
@@ -129,7 +129,7 @@
         </w:numPr>
       </w:pPr>
       <w:r>
-        <w:t xml:space="preserve">The execution contract separates learned proposals from constrained admission.</w:t>
+        <w:t xml:space="preserve">Typed state–action–constraint traces make recursive updates auditable.</w:t>
       </w:r>
     </w:p>
     <w:p>
@@ -217,7 +217,7 @@
         <w:pStyle w:val="BodyText"/>
       </w:pPr>
       <w:r>
-        <w:t xml:space="preserve">The main technical difficulty is not producing another categorical raster. It is keeping the semantics of a planning action separate from the learned transition tendency. A model may predict that a cell is likely to become built, yet the resulting map can still violate a water exclusion, miss the requested class totals or become inconsistent when the next year is simulated from the model's own output. These failure modes are particularly important when the model is used to compare scenarios rather than to reproduce one observed transition. Latent-dynamics approaches such as GeoFM-LDN can represent continuous geospatial state and condition transitions on demand, whereas traditional ANN-plus-cellular-automata systems such as GeoSOS-FLUS combine suitability with explicit neighbourhood evolution. Neither design, by itself, guarantees that action semantics, hard constraints, state persistence and evidence provenance are visible at the same execution boundary.</w:t>
+        <w:t xml:space="preserve">The main technical difficulty is not producing another categorical raster. It is keeping the semantics of a planning action separate from the learned transition tendency. A model may predict that a cell is likely to become built, yet the resulting map can still violate a water exclusion, miss the requested class totals or become inconsistent when the next year is simulated from the model’s own output. These failure modes are particularly important when the model is used to compare scenarios rather than to reproduce one observed transition. Latent-dynamics approaches such as GeoFM-LDN can represent continuous geospatial state and condition transitions on demand, whereas traditional ANN-plus-cellular-automata systems such as GeoSOS-FLUS combine suitability with explicit neighbourhood evolution. Neither design, by itself, guarantees that action semantics, hard constraints, state persistence and evidence provenance are visible at the same execution boundary.</w:t>
       </w:r>
     </w:p>
     <w:p>
@@ -225,7 +225,7 @@
         <w:pStyle w:val="BodyText"/>
       </w:pPr>
       <w:r>
-        <w:t xml:space="preserve">We address this systems problem by studying Geospatial Kernel, the core transition layer of a Geospatial World Model (GWM). The Kernel represents one simulation step as a typed state, a typed action, a transition proposal, a constraint projection and a state writeback. The learned proposal remains domain-specific; the runtime contract is domain-neutral. For Abu Dhabi land-cover planning, the proposal is a six-class probability cube, and the projection allocates only mutable cells until the action's feasible class totals are reached. This separation makes the planning operation inspectable: a reviewer can distinguish what the transition model preferred from what the constraints admitted.</w:t>
+        <w:t xml:space="preserve">We address this systems problem by studying Geospatial Kernel, the core transition layer of a Geospatial World Model (GWM). The Kernel represents one simulation step as a typed state, a typed action, a transition proposal, a constraint projection and a state writeback. The learned proposal remains domain-specific; the runtime contract is domain-neutral. For Abu Dhabi land-cover planning, the proposal is a six-class probability cube, and the projection allocates only mutable cells until the action’s feasible class totals are reached. This separation makes the planning operation inspectable: a reviewer can distinguish what the transition model preferred from what the constraints admitted.</w:t>
       </w:r>
     </w:p>
     <w:p>
@@ -1262,7 +1262,7 @@
         </m:r>
       </m:oMath>
       <w:r>
-        <w:t xml:space="preserve">. The algorithm computes class deficits and excesses from the action's feasible target counts, ranks all admissible source–target candidates by</w:t>
+        <w:t xml:space="preserve">. The algorithm computes class deficits and excesses from the action’s feasible target counts, ranks all admissible source–target candidates by</w:t>
       </w:r>
       <w:r>
         <w:t xml:space="preserve"> </w:t>
@@ -1293,7 +1293,7 @@
         <w:t xml:space="preserve">KernelState</w:t>
       </w:r>
       <w:r>
-        <w:t xml:space="preserve">. Every step records a state reference, action evidence, model version, parameter reference, projection status and diagnostic counts. The runtime checks domain identity, source-time consistency and action time advancement. This execution contract is the Geospatial Kernel's algorithmic contribution; the Abu Dhabi adapter supplies the land-cover-specific features, learner and constraint masks.</w:t>
+        <w:t xml:space="preserve">. Every step records a state reference, action evidence, model version, parameter reference, projection status and diagnostic counts. The runtime checks domain identity, source-time consistency and action time advancement. This execution contract is the Geospatial Kernel’s algorithmic contribution; the Abu Dhabi adapter supplies the land-cover-specific features, learner and constraint masks.</w:t>
       </w:r>
     </w:p>
     <w:bookmarkEnd w:id="16"/>
@@ -1311,7 +1311,7 @@
         <w:pStyle w:val="FirstParagraph"/>
       </w:pPr>
       <w:r>
-        <w:t xml:space="preserve">GeoSOS-FLUS was run through the external FLUS console using seven continuous drivers: normalized row and column coordinates, elevation, slope, VIIRS radiance, distance to roads and distance to major roads. Its ANN suitability surface was passed to a cellular-automata allocation stage with the common class totals and public hard mask. The archived run used one 2021 training year, eight ANN hidden neurons, a 3 × 3 CA neighbourhood, neighbourhood strength 1.0, acceleration factor 0.1 and 1,000 iterations. Its frozen transition matrix protected water and wetland but did not prohibit built-to-non-built transitions; this configuration is recorded as a baseline limitation rather than a calibrated Abu Dhabi model.</w:t>
+        <w:t xml:space="preserve">GeoSOS-FLUS was run through the external FLUS console using seven continuous drivers: normalized row and column coordinates, elevation, slope, VIIRS radiance, distance to roads and distance to major roads. Its ANN suitability surface was passed to a cellular-automata allocation stage with the common class totals and public hard mask. The archived run used one 2021 training year, eight ANN hidden neurons, a 3 × 3 CA neighbourhood, neighbourhood strength 1.0, acceleration factor 0.1 and 1,000 iterations. Its frozen transition matrix protected water and wetland but did not prohibit built-to-non-built transitions; this configuration is recorded as a baseline limitation rather than a calibrated Abu Dhabi model. The supplied Mach-O executable cannot be traced to a reproducible upstream release or source commit, so we do not claim bitwise equivalence to the Liu et al. (2017) FLUS implementation.</w:t>
       </w:r>
     </w:p>
     <w:p>
@@ -1319,7 +1319,101 @@
         <w:pStyle w:val="BodyText"/>
       </w:pPr>
       <w:r>
-        <w:t xml:space="preserve">GeoFM-LDN (Geospatial Foundation-Model Latent Dynamics Network) was trained as a demand-conditioned latent-dynamics network on AlphaEarth embeddings. A logistic semantic decoder maps the predicted embedding to six class probabilities, and the constrained allocation step converts those probabilities to a categorical raster. The latent and categorical states are both recursively carried into the next year. GeoFM-LDN is an internal benchmark implementation in this manuscript; the name describes its architecture and does not attribute an external publication or performance claim.</w:t>
+        <w:t xml:space="preserve">GeoFM-LDN (Geospatial Foundation-Model Latent Dynamics Network; the repository’s former</w:t>
+      </w:r>
+      <w:r>
+        <w:t xml:space="preserve"> </w:t>
+      </w:r>
+      <w:r>
+        <w:rPr>
+          <w:rStyle w:val="VerbatimChar"/>
+        </w:rPr>
+        <w:t xml:space="preserve">paper58</w:t>
+      </w:r>
+      <w:r>
+        <w:t xml:space="preserve"> </w:t>
+      </w:r>
+      <w:r>
+        <w:t xml:space="preserve">path identifier) was implemented as a demand-conditioned residual latent-dynamics network on 64-channel AlphaEarth patches. Three 128-channel convolutions use dilation rates 1, 2 and 4, followed by a 1 × 1 projection to a 64-dimensional latent state. A 12-dimensional action vector (origin and target counts for six classes) is encoded by a two-layer MLP and broadcast across the patch before concatenation with the embedding. Group normalization and GELU activations are used in the residual blocks. A scikit-learn logistic-regression decoder maps the predicted latent embedding to six semantic classes. Training uses 64 × 64 patches, batch size 2, eight epochs, AdamW with learning rate</w:t>
+      </w:r>
+      <w:r>
+        <w:t xml:space="preserve"> </w:t>
+      </w:r>
+      <m:oMath>
+        <m:r>
+          <m:t>3</m:t>
+        </m:r>
+        <m:r>
+          <m:rPr>
+            <m:sty m:val="p"/>
+          </m:rPr>
+          <m:t>×</m:t>
+        </m:r>
+        <m:sSup>
+          <m:e>
+            <m:r>
+              <m:t>10</m:t>
+            </m:r>
+          </m:e>
+          <m:sup>
+            <m:r>
+              <m:rPr>
+                <m:sty m:val="p"/>
+              </m:rPr>
+              <m:t>−</m:t>
+            </m:r>
+            <m:r>
+              <m:t>4</m:t>
+            </m:r>
+          </m:sup>
+        </m:sSup>
+      </m:oMath>
+      <w:r>
+        <w:t xml:space="preserve"> </w:t>
+      </w:r>
+      <w:r>
+        <w:t xml:space="preserve">and weight decay</w:t>
+      </w:r>
+      <w:r>
+        <w:t xml:space="preserve"> </w:t>
+      </w:r>
+      <m:oMath>
+        <m:sSup>
+          <m:e>
+            <m:r>
+              <m:t>10</m:t>
+            </m:r>
+          </m:e>
+          <m:sup>
+            <m:r>
+              <m:rPr>
+                <m:sty m:val="p"/>
+              </m:rPr>
+              <m:t>−</m:t>
+            </m:r>
+            <m:r>
+              <m:t>4</m:t>
+            </m:r>
+          </m:sup>
+        </m:sSup>
+      </m:oMath>
+      <w:r>
+        <w:t xml:space="preserve">; the loss is the weighted sum of cosine embedding loss, 0.5 semantic cross-entropy, 0.1 demand-consistency loss and 0.2 hard-constraint consistency loss. The released checkpoints correspond to seeds 31, 47 and 73 and were trained in August 2026. The default reproduction loads these fixed checkpoints rather than retraining; the runner exposes retraining separately. During allocation, GeoFM-LDN directly calls the Geospatial Kernel</w:t>
+      </w:r>
+      <w:r>
+        <w:t xml:space="preserve"> </w:t>
+      </w:r>
+      <w:r>
+        <w:rPr>
+          <w:rStyle w:val="VerbatimChar"/>
+        </w:rPr>
+        <w:t xml:space="preserve">allocate_action</w:t>
+      </w:r>
+      <w:r>
+        <w:t xml:space="preserve"> </w:t>
+      </w:r>
+      <w:r>
+        <w:t xml:space="preserve">routine, so both methods share the same constrained projection and differ primarily in their proposal model. The comparison is therefore a proposal/pipeline comparison, not a comparison of two independent projection architectures. The name describes this benchmark implementation and does not attribute an external publication or performance claim.</w:t>
       </w:r>
     </w:p>
     <w:p>
@@ -1327,7 +1421,7 @@
         <w:pStyle w:val="BodyText"/>
       </w:pPr>
       <w:r>
-        <w:t xml:space="preserve">The common evaluator computes actual class counts, normalized demand total variation, hard-mask violations, strict multi-class change FoM, binary change FoM, change F1, overall accuracy and macro-F1 for historical runs. The strict FoM counts a hit only when the predicted destination class equals the observed destination class; wrong destination changes are retained in the denominator. It also generates persistence and minimum-change zero controls, spatial-block bootstrap intervals and paired model-difference intervals for strict FoM, overall accuracy and macro-F1. For planning runs it additionally computes ecological conversion, new-built neighbourhood fraction, built component counts, built components per 1,000 valid pixels, a 500-m leapfrog rate, distances to roads and prior built cells, infrastructure proxy distance and built retirement. Pareto membership is calculated over four distinct dimensions: ecological conversion proxy, major-road accessibility, leapfrog morphology and built-state stability.</w:t>
+        <w:t xml:space="preserve">The common evaluator computes actual class counts, normalized demand total variation, hard-mask violations, strict multi-class change FoM, binary change FoM, change F1, overall accuracy and macro-F1 for historical runs. The strict FoM counts a hit only when the predicted destination class equals the observed destination class; wrong destination changes are retained in the denominator. It also generates persistence and minimum-change zero controls, spatial-block bootstrap intervals and paired model-difference intervals for strict FoM, overall accuracy and macro-F1. For planning runs it additionally computes ecological conversion, new-built neighbourhood fraction, built component counts, built components per 1,000 valid pixels, a 500-m leapfrog rate, distances to roads and prior built cells, infrastructure proxy distance and built retirement. Pareto membership is calculated only over the frozen four-dimensional set of major-road distance, prior-built distance, built-component density and green-cell gain; the remaining quantities are reported as descriptive diagnostics.</w:t>
       </w:r>
     </w:p>
     <w:bookmarkEnd w:id="17"/>
@@ -1459,7 +1553,7 @@
         <w:pStyle w:val="BodyText"/>
       </w:pPr>
       <w:r>
-        <w:t xml:space="preserve">The comparison shared the canonical grid, origin states, target actions, hard masks and evaluator, but the original public-data run was not information-balanced. GeoSOS-FLUS used seven continuous drivers in its external ANN suitability model, whereas Geospatial Kernel used 25 features including current-class indicators and neighbourhood proportions; GeoFM-LDN used AlphaEarth latent embeddings. We therefore treat the historical ranking as a pipeline comparison, not evidence that one learner is intrinsically superior. A matched-input FLUS rerun is required before making model-level superiority claims. All models used seeds 31, 47 and 73. The earlier output audit reported 240 seed and ensemble rasters for a separate 2025–2030 run; the public 2025–2031 delivery is a separate artifact set and must be audited separately.</w:t>
+        <w:t xml:space="preserve">The comparison shared the canonical grid, origin states, target actions, hard masks and evaluator, but the public-data run was not information-balanced. GeoSOS-FLUS used seven continuous drivers in its external ANN suitability model, whereas Geospatial Kernel used 25 features including current-class indicators and neighbourhood proportions; GeoFM-LDN used AlphaEarth latent embeddings and the Kernel allocator. We therefore report an unmatched-input pipeline comparison, not evidence that one learner is intrinsically superior. A matched-input FLUS rerun remains necessary for a model-level comparison. The archived FLUS console is a Mach-O arm64 executable whose original source/version cannot be independently rebuilt from this release, so FLUS results are bounded to the supplied Apple-Silicon binary and are not asserted to be bitwise equivalent to an upstream Liu et al. build. All models used seeds 31, 47 and 73.</w:t>
       </w:r>
     </w:p>
     <w:p>
@@ -1471,13 +1565,13 @@
       </w:r>
     </w:p>
     <w:bookmarkEnd w:id="21"/>
-    <w:bookmarkStart w:id="22" w:name="X6f9a2d4ed804ba663053bc1190ec42a96e5257d"/>
+    <w:bookmarkStart w:id="22" w:name="historical-and-planning-results"/>
     <w:p>
       <w:pPr>
         <w:pStyle w:val="Heading3"/>
       </w:pPr>
       <w:r>
-        <w:t xml:space="preserve">Results status and prespecified reporting</w:t>
+        <w:t xml:space="preserve">Historical and planning results</w:t>
       </w:r>
     </w:p>
     <w:p>
@@ -1547,31 +1641,85 @@
         <w:t xml:space="preserve"> </w:t>
       </w:r>
       <w:r>
-        <w:t xml:space="preserve">synthetic class-count actions through 2031. The four Pareto dimensions are</w:t>
-      </w:r>
-      <w:r>
-        <w:t xml:space="preserve"> </w:t>
-      </w:r>
-      <w:r>
-        <w:t xml:space="preserve">ecological conversion rate (a public proxy), mean distance of new built cells</w:t>
-      </w:r>
-      <w:r>
-        <w:t xml:space="preserve"> </w:t>
-      </w:r>
-      <w:r>
-        <w:t xml:space="preserve">to major roads, 500-m leapfrog rate and removed built pixels. Built-component</w:t>
-      </w:r>
-      <w:r>
-        <w:t xml:space="preserve"> </w:t>
-      </w:r>
-      <w:r>
-        <w:t xml:space="preserve">density, prior-built distance, demand error and neighbourhood fraction remain</w:t>
-      </w:r>
-      <w:r>
-        <w:t xml:space="preserve"> </w:t>
-      </w:r>
-      <w:r>
-        <w:t xml:space="preserve">descriptive diagnostics. No weighted composite score is used.</w:t>
+        <w:t xml:space="preserve">synthetic class-count actions through 2031. Before this recompilation, the</w:t>
+      </w:r>
+      <w:r>
+        <w:t xml:space="preserve"> </w:t>
+      </w:r>
+      <w:r>
+        <w:t xml:space="preserve">objective set was frozen to four non-redundant dimensions: mean distance of new</w:t>
+      </w:r>
+      <w:r>
+        <w:t xml:space="preserve"> </w:t>
+      </w:r>
+      <w:r>
+        <w:t xml:space="preserve">built cells to major roads (accessibility proxy), mean distance to pre-existing</w:t>
+      </w:r>
+      <w:r>
+        <w:t xml:space="preserve"> </w:t>
+      </w:r>
+      <w:r>
+        <w:t xml:space="preserve">built cells (compactness proxy), built components per 1,000 valid cells</w:t>
+      </w:r>
+      <w:r>
+        <w:t xml:space="preserve"> </w:t>
+      </w:r>
+      <w:r>
+        <w:t xml:space="preserve">(fragmentation) and green-cell gain (vegetation-balance direction). Ecological</w:t>
+      </w:r>
+      <w:r>
+        <w:t xml:space="preserve"> </w:t>
+      </w:r>
+      <w:r>
+        <w:t xml:space="preserve">conversion, 500-m leapfrog rate, built retirement and demand error remain</w:t>
+      </w:r>
+      <w:r>
+        <w:t xml:space="preserve"> </w:t>
+      </w:r>
+      <w:r>
+        <w:t xml:space="preserve">descriptive diagnostics because the exact-count projection makes some of them</w:t>
+      </w:r>
+      <w:r>
+        <w:t xml:space="preserve"> </w:t>
+      </w:r>
+      <w:r>
+        <w:t xml:space="preserve">structural zeros or unstable across models. No weighted composite score is used.</w:t>
+      </w:r>
+      <w:r>
+        <w:t xml:space="preserve"> </w:t>
+      </w:r>
+      <w:r>
+        <w:t xml:space="preserve">The choice follows a transparent planning logic: accessibility and proximity to</w:t>
+      </w:r>
+      <w:r>
+        <w:t xml:space="preserve"> </w:t>
+      </w:r>
+      <w:r>
+        <w:t xml:space="preserve">existing development represent infrastructure-efficient urban form, component</w:t>
+      </w:r>
+      <w:r>
+        <w:t xml:space="preserve"> </w:t>
+      </w:r>
+      <w:r>
+        <w:t xml:space="preserve">density penalizes spatial fragmentation, and the opposing vegetation-gain</w:t>
+      </w:r>
+      <w:r>
+        <w:t xml:space="preserve"> </w:t>
+      </w:r>
+      <w:r>
+        <w:t xml:space="preserve">direction prevents a compactness-only objective from defining the frontier.</w:t>
+      </w:r>
+      <w:r>
+        <w:t xml:space="preserve"> </w:t>
+      </w:r>
+      <w:r>
+        <w:t xml:space="preserve">These are measurable public-data proxies rather than claims about welfare,</w:t>
+      </w:r>
+      <w:r>
+        <w:t xml:space="preserve"> </w:t>
+      </w:r>
+      <w:r>
+        <w:t xml:space="preserve">equity or statutory zoning.</w:t>
       </w:r>
     </w:p>
     <w:p>
@@ -1603,25 +1751,74 @@
         <w:t xml:space="preserve"> </w:t>
       </w:r>
       <w:r>
-        <w:t xml:space="preserve">0.1782, 0.2529 and 0.2708 in 2024, respectively. Thus the Kernel led the</w:t>
-      </w:r>
-      <w:r>
-        <w:t xml:space="preserve"> </w:t>
-      </w:r>
-      <w:r>
-        <w:t xml:space="preserve">one-step 2023 comparison, whereas GeoFM-LDN led the two-step 2024 open-loop</w:t>
-      </w:r>
-      <w:r>
-        <w:t xml:space="preserve"> </w:t>
-      </w:r>
-      <w:r>
-        <w:t xml:space="preserve">comparison; no single model dominated both horizons.</w:t>
+        <w:t xml:space="preserve">0.1782, 0.2529 and 0.2708 in 2024, respectively. Under this unmatched</w:t>
+      </w:r>
+      <w:r>
+        <w:t xml:space="preserve"> </w:t>
+      </w:r>
+      <w:r>
+        <w:t xml:space="preserve">public-data pipeline, Geospatial Kernel had the largest 2023 value, whereas</w:t>
+      </w:r>
+      <w:r>
+        <w:t xml:space="preserve"> </w:t>
+      </w:r>
+      <w:r>
+        <w:t xml:space="preserve">GeoFM-LDN had the largest 2024 value after recursive two-step rollout; no</w:t>
+      </w:r>
+      <w:r>
+        <w:t xml:space="preserve"> </w:t>
+      </w:r>
+      <w:r>
+        <w:t xml:space="preserve">single model dominated both horizons. These rankings are conditional on the</w:t>
+      </w:r>
+      <w:r>
+        <w:t xml:space="preserve"> </w:t>
+      </w:r>
+      <w:r>
+        <w:t xml:space="preserve">different inputs, learners and shared evaluation projection.</w:t>
+      </w:r>
+    </w:p>
+    <w:p>
+      <w:pPr>
+        <w:pStyle w:val="BodyText"/>
+      </w:pPr>
+      <w:r>
+        <w:rPr>
+          <w:b/>
+          <w:bCs/>
+        </w:rPr>
+        <w:t xml:space="preserve">Table 1 | Historical allocation scores.</w:t>
+      </w:r>
+      <w:r>
+        <w:t xml:space="preserve"> </w:t>
+      </w:r>
+      <w:r>
+        <w:t xml:space="preserve">Values are means across the three</w:t>
+      </w:r>
+      <w:r>
+        <w:t xml:space="preserve"> </w:t>
+      </w:r>
+      <w:r>
+        <w:t xml:space="preserve">frozen computational seeds; the strict multi-class change FoM is the primary</w:t>
+      </w:r>
+      <w:r>
+        <w:t xml:space="preserve"> </w:t>
+      </w:r>
+      <w:r>
+        <w:t xml:space="preserve">metric and the remaining columns are diagnostics. Persistence and random</w:t>
+      </w:r>
+      <w:r>
+        <w:t xml:space="preserve"> </w:t>
+      </w:r>
+      <w:r>
+        <w:t xml:space="preserve">minimum-change are prespecified controls rather than learned models.</w:t>
       </w:r>
     </w:p>
     <w:tbl>
       <w:tblPr>
         <w:tblStyle w:val="Table"/>
-        <w:tblW w:type="auto" w:w="0"/>
+        <w:tblW w:type="pct" w:w="5000"/>
+        <w:tblLayout w:type="fixed"/>
         <w:tblLook w:firstRow="1" w:lastRow="0" w:firstColumn="0" w:lastColumn="0" w:noHBand="0" w:noVBand="0" w:val="0020"/>
       </w:tblPr>
       <w:tblGrid>
@@ -1907,7 +2104,31 @@
         <w:t xml:space="preserve"> </w:t>
       </w:r>
       <w:r>
-        <w:t xml:space="preserve">2024), illustrating why change-specific metrics are necessary.</w:t>
+        <w:t xml:space="preserve">2024), illustrating why change-specific metrics are necessary. Figure 2 shows</w:t>
+      </w:r>
+      <w:r>
+        <w:t xml:space="preserve"> </w:t>
+      </w:r>
+      <w:r>
+        <w:t xml:space="preserve">the four historical metrics alongside the persistence and random minimum-change</w:t>
+      </w:r>
+      <w:r>
+        <w:t xml:space="preserve"> </w:t>
+      </w:r>
+      <w:r>
+        <w:t xml:space="preserve">controls; bars use three-seed population standard deviations, whereas the</w:t>
+      </w:r>
+      <w:r>
+        <w:t xml:space="preserve"> </w:t>
+      </w:r>
+      <w:r>
+        <w:t xml:space="preserve">paired spatial-block intervals above are the uncertainty summaries used for</w:t>
+      </w:r>
+      <w:r>
+        <w:t xml:space="preserve"> </w:t>
+      </w:r>
+      <w:r>
+        <w:t xml:space="preserve">model contrasts.</w:t>
       </w:r>
     </w:p>
     <w:p>
@@ -1915,49 +2136,195 @@
         <w:pStyle w:val="BodyText"/>
       </w:pPr>
       <w:r>
+        <w:t xml:space="preserve">The reliability sensitivity is substantially less favourable. Requiring both</w:t>
+      </w:r>
+      <w:r>
+        <w:t xml:space="preserve"> </w:t>
+      </w:r>
+      <w:r>
+        <w:t xml:space="preserve">the origin and target Dynamic World mean top probability to exceed 0.5 leaves</w:t>
+      </w:r>
+      <w:r>
+        <w:t xml:space="preserve"> </w:t>
+      </w:r>
+      <w:r>
+        <w:t xml:space="preserve">strict FoM at 0.000 for all three models in 2023; in 2024 the means are 0.004</w:t>
+      </w:r>
+      <w:r>
+        <w:t xml:space="preserve"> </w:t>
+      </w:r>
+      <w:r>
+        <w:t xml:space="preserve">for GeoSOS-FLUS, 0.005 for Geospatial Kernel and 0.019 for GeoFM-LDN. This is</w:t>
+      </w:r>
+      <w:r>
+        <w:t xml:space="preserve"> </w:t>
+      </w:r>
+      <w:r>
+        <w:t xml:space="preserve">a label-quality diagnostic, not an independent validation set. Dynamic World</w:t>
+      </w:r>
+      <w:r>
+        <w:t xml:space="preserve"> </w:t>
+      </w:r>
+      <w:r>
+        <w:t xml:space="preserve">also reports built pixels increasing from 9,359 in 2022 to 15,598 in 2024</w:t>
+      </w:r>
+      <w:r>
+        <w:t xml:space="preserve"> </w:t>
+      </w:r>
+      <w:r>
+        <w:t xml:space="preserve">(67%), while the median one-year reversion fraction is 0.3611 and the mean</w:t>
+      </w:r>
+      <w:r>
+        <w:t xml:space="preserve"> </w:t>
+      </w:r>
+      <w:r>
+        <w:t xml:space="preserve">fraction of cells below confidence 0.5 is 0.5497. Test-year change counts are</w:t>
+      </w:r>
+      <w:r>
+        <w:t xml:space="preserve"> </w:t>
+      </w:r>
+      <w:r>
+        <w:t xml:space="preserve">approximately twice the training-transition counts. Because the same grid</w:t>
+      </w:r>
+      <w:r>
+        <w:t xml:space="preserve"> </w:t>
+      </w:r>
+      <w:r>
+        <w:t xml:space="preserve">cells recur across years and the Kernel includes coordinate features, a</w:t>
+      </w:r>
+      <w:r>
+        <w:t xml:space="preserve"> </w:t>
+      </w:r>
+      <w:r>
+        <w:t xml:space="preserve">training–test memory effect cannot be excluded; the reported scores should</w:t>
+      </w:r>
+      <w:r>
+        <w:t xml:space="preserve"> </w:t>
+      </w:r>
+      <w:r>
+        <w:t xml:space="preserve">therefore be interpreted as conditional agreement with the public product.</w:t>
+      </w:r>
+    </w:p>
+    <w:p>
+      <w:pPr>
+        <w:pStyle w:val="BodyText"/>
+      </w:pPr>
+      <w:r>
         <w:t xml:space="preserve">The planning compiler evaluated all nine model–scenario candidates under the</w:t>
       </w:r>
       <w:r>
         <w:t xml:space="preserve"> </w:t>
       </w:r>
       <w:r>
-        <w:t xml:space="preserve">declared four-objective set. The only 2031 Pareto candidate was</w:t>
-      </w:r>
-      <w:r>
-        <w:t xml:space="preserve"> </w:t>
-      </w:r>
-      <w:r>
-        <w:t xml:space="preserve">Geospatial Kernel under the green-priority-growth action. This membership is</w:t>
-      </w:r>
-      <w:r>
-        <w:t xml:space="preserve"> </w:t>
-      </w:r>
-      <w:r>
-        <w:t xml:space="preserve">conditional on public ecological and road proxies, synthetic demand actions</w:t>
-      </w:r>
-      <w:r>
-        <w:t xml:space="preserve"> </w:t>
-      </w:r>
-      <w:r>
-        <w:t xml:space="preserve">and the stated objective directions; it is not an official development</w:t>
-      </w:r>
-      <w:r>
-        <w:t xml:space="preserve"> </w:t>
-      </w:r>
-      <w:r>
-        <w:t xml:space="preserve">recommendation or a forecast of policy outcomes. All 276 historical and</w:t>
-      </w:r>
-      <w:r>
-        <w:t xml:space="preserve"> </w:t>
-      </w:r>
-      <w:r>
-        <w:t xml:space="preserve">planning prediction records passed the raster audit, including grid alignment,</w:t>
-      </w:r>
-      <w:r>
-        <w:t xml:space="preserve"> </w:t>
-      </w:r>
-      <w:r>
-        <w:t xml:space="preserve">class validity, outside-mask cleanliness and hard-exclusion checks.</w:t>
+        <w:t xml:space="preserve">frozen balanced objective set. Six candidates—each GeoSOS-FLUS scenario and</w:t>
+      </w:r>
+      <w:r>
+        <w:t xml:space="preserve"> </w:t>
+      </w:r>
+      <w:r>
+        <w:t xml:space="preserve">each Geospatial Kernel scenario—were non-dominated; no GeoFM-LDN candidate was</w:t>
+      </w:r>
+      <w:r>
+        <w:t xml:space="preserve"> </w:t>
+      </w:r>
+      <w:r>
+        <w:t xml:space="preserve">on this conditional frontier. The result should not be read as a model ranking:</w:t>
+      </w:r>
+      <w:r>
+        <w:t xml:space="preserve"> </w:t>
+      </w:r>
+      <w:r>
+        <w:t xml:space="preserve">the frontier is sensitive to public proxy layers, synthetic actions and the</w:t>
+      </w:r>
+      <w:r>
+        <w:t xml:space="preserve"> </w:t>
+      </w:r>
+      <w:r>
+        <w:t xml:space="preserve">declared directions. Geospatial Kernel had lower mean distances to roads and</w:t>
+      </w:r>
+      <w:r>
+        <w:t xml:space="preserve"> </w:t>
+      </w:r>
+      <w:r>
+        <w:t xml:space="preserve">prior built cells than the other candidates, but its built-component density was</w:t>
+      </w:r>
+      <w:r>
+        <w:t xml:space="preserve"> </w:t>
+      </w:r>
+      <w:r>
+        <w:t xml:space="preserve">2.92–4.28 per 1,000 valid cells, compared with 0.92–1.23 for GeoSOS-FLUS and</w:t>
+      </w:r>
+      <w:r>
+        <w:t xml:space="preserve"> </w:t>
+      </w:r>
+      <w:r>
+        <w:t xml:space="preserve">3.21–4.35 for GeoFM-LDN. This fragmentation disadvantage is retained rather</w:t>
+      </w:r>
+      <w:r>
+        <w:t xml:space="preserve"> </w:t>
+      </w:r>
+      <w:r>
+        <w:t xml:space="preserve">than hidden by the objective set (Fig. 3). The 2031 majority-vote ensemble L1 demand</w:t>
+      </w:r>
+      <w:r>
+        <w:t xml:space="preserve"> </w:t>
+      </w:r>
+      <w:r>
+        <w:t xml:space="preserve">errors were 8, 44 and 42 pixels for Geospatial Kernel’s moderate, green-priority</w:t>
+      </w:r>
+      <w:r>
+        <w:t xml:space="preserve"> </w:t>
+      </w:r>
+      <w:r>
+        <w:t xml:space="preserve">and high-outward scenarios, respectively; the corresponding GeoFM-LDN errors</w:t>
+      </w:r>
+      <w:r>
+        <w:t xml:space="preserve"> </w:t>
+      </w:r>
+      <w:r>
+        <w:t xml:space="preserve">were 1,580, 1,524 and 1,148 pixels and GeoSOS-FLUS errors were 2,504, 2,888</w:t>
+      </w:r>
+      <w:r>
+        <w:t xml:space="preserve"> </w:t>
+      </w:r>
+      <w:r>
+        <w:t xml:space="preserve">and 2,568 pixels. Seed-level projections meet their feasible class totals, but</w:t>
+      </w:r>
+      <w:r>
+        <w:t xml:space="preserve"> </w:t>
+      </w:r>
+      <w:r>
+        <w:t xml:space="preserve">majority voting can produce a different raster and therefore a non-zero ensemble</w:t>
+      </w:r>
+      <w:r>
+        <w:t xml:space="preserve"> </w:t>
+      </w:r>
+      <w:r>
+        <w:t xml:space="preserve">error. All 276 historical and planning prediction records passed the raster</w:t>
+      </w:r>
+      <w:r>
+        <w:t xml:space="preserve"> </w:t>
+      </w:r>
+      <w:r>
+        <w:t xml:space="preserve">audit, including grid alignment, class validity, outside-mask cleanliness and</w:t>
+      </w:r>
+      <w:r>
+        <w:t xml:space="preserve"> </w:t>
+      </w:r>
+      <w:r>
+        <w:t xml:space="preserve">hard-exclusion checks. The resulting 2031 ensemble rasters and their dissolved</w:t>
+      </w:r>
+      <w:r>
+        <w:t xml:space="preserve"> </w:t>
+      </w:r>
+      <w:r>
+        <w:t xml:space="preserve">cell-change footprints are shown in Fig. 5; they are scenario-conditioned</w:t>
+      </w:r>
+      <w:r>
+        <w:t xml:space="preserve"> </w:t>
+      </w:r>
+      <w:r>
+        <w:t xml:space="preserve">land-cover maps, not parcel boundaries or statutory zoning maps.</w:t>
       </w:r>
     </w:p>
     <w:bookmarkEnd w:id="22"/>
@@ -1975,7 +2342,7 @@
         <w:pStyle w:val="FirstParagraph"/>
       </w:pPr>
       <w:r>
-        <w:t xml:space="preserve">The base Kernel allocation score adds a 7 × 7 target-class neighbourhood fraction with weight 0.35. The existing sensitivity and mechanism artefacts are retained as diagnostic controls; they do not identify a causal effect because the proposal features and allocator both contain spatial context. The neighbourhood term is therefore interpreted as evidence about the execution mechanism, not as an independently estimated planning preference.</w:t>
+        <w:t xml:space="preserve">The base Kernel allocation score adds a 7 × 7 target-class neighbourhood fraction with weight 0.35. The existing sensitivity and mechanism artefacts are retained as diagnostic controls; they do not identify a causal effect because the proposal features and allocator both contain spatial context. The neighbourhood term is therefore interpreted as evidence about the execution mechanism, not as an independently estimated planning preference. Figure 4A shows the proposal controls, while Fig. 4B–D reports runtime and planning controls.</w:t>
       </w:r>
     </w:p>
     <w:bookmarkEnd w:id="23"/>
@@ -2005,25 +2372,55 @@
         <w:t xml:space="preserve"> </w:t>
       </w:r>
       <w:r>
-        <w:t xml:space="preserve">The ablation report is evaluated with the same strict evaluator and is used to</w:t>
-      </w:r>
-      <w:r>
-        <w:t xml:space="preserve"> </w:t>
-      </w:r>
-      <w:r>
-        <w:t xml:space="preserve">describe which components alter allocation morphology and hard-mask behaviour;</w:t>
-      </w:r>
-      <w:r>
-        <w:t xml:space="preserve"> </w:t>
-      </w:r>
-      <w:r>
-        <w:t xml:space="preserve">the controls are not treated as independent replications of a planning</w:t>
-      </w:r>
-      <w:r>
-        <w:t xml:space="preserve"> </w:t>
-      </w:r>
-      <w:r>
-        <w:t xml:space="preserve">intervention.</w:t>
+        <w:t xml:space="preserve">Deleting the action reduces mean strict FoM by 0.114 in 2023 and 0.171 in</w:t>
+      </w:r>
+      <w:r>
+        <w:t xml:space="preserve"> </w:t>
+      </w:r>
+      <w:r>
+        <w:t xml:space="preserve">2024, whereas deleting the hard constraint increases it by 0.014 and 0.011,</w:t>
+      </w:r>
+      <w:r>
+        <w:t xml:space="preserve"> </w:t>
+      </w:r>
+      <w:r>
+        <w:t xml:space="preserve">respectively. The former is expected because the historical task supplies</w:t>
+      </w:r>
+      <w:r>
+        <w:t xml:space="preserve"> </w:t>
+      </w:r>
+      <w:r>
+        <w:t xml:space="preserve">oracle target counts; it shows that much of the measured skill belongs to the</w:t>
+      </w:r>
+      <w:r>
+        <w:t xml:space="preserve"> </w:t>
+      </w:r>
+      <w:r>
+        <w:t xml:space="preserve">action-conditioned allocator rather than to a demand forecast. The latter is</w:t>
+      </w:r>
+      <w:r>
+        <w:t xml:space="preserve"> </w:t>
+      </w:r>
+      <w:r>
+        <w:t xml:space="preserve">an important warning: allowing changes inside the exclusion mask can improve</w:t>
+      </w:r>
+      <w:r>
+        <w:t xml:space="preserve"> </w:t>
+      </w:r>
+      <w:r>
+        <w:t xml:space="preserve">agreement with noisy labels while violating the planning contract. The</w:t>
+      </w:r>
+      <w:r>
+        <w:t xml:space="preserve"> </w:t>
+      </w:r>
+      <w:r>
+        <w:t xml:space="preserve">controls therefore support an execution-level interpretation but do not prove</w:t>
+      </w:r>
+      <w:r>
+        <w:t xml:space="preserve"> </w:t>
+      </w:r>
+      <w:r>
+        <w:t xml:space="preserve">that either component causes an urban outcome.</w:t>
       </w:r>
     </w:p>
     <w:bookmarkEnd w:id="24"/>
@@ -2042,7 +2439,7 @@
         <w:pStyle w:val="FirstParagraph"/>
       </w:pPr>
       <w:r>
-        <w:t xml:space="preserve">This study positions Geospatial Kernel as a candidate execution layer for constrained spatial reasoning. The defensible contribution is that a transition proposal and a planning admission rule can be represented and inspected separately. The recovered public-data rerun shows a horizon-dependent result: the Kernel has the highest strict transition FoM at the one-step horizon, while GeoFM-LDN has the highest value after recursive two-step rollout. We therefore avoid a universal superiority claim and treat the planning frontier as conditional on declared public-data proxy objectives.</w:t>
+        <w:t xml:space="preserve">This study positions Geospatial Kernel as a candidate execution layer for constrained spatial reasoning. The defensible contribution is that a transition proposal and a planning admission rule can be represented and inspected separately. Under the unmatched public-data pipeline, Geospatial Kernel has the largest strict transition FoM at the one-step horizon, while GeoFM-LDN has the largest value after recursive two-step rollout. We therefore avoid a universal superiority claim and treat the planning frontier as conditional on the frozen public-data proxy objectives.</w:t>
       </w:r>
     </w:p>
     <w:p>
@@ -2050,7 +2447,7 @@
         <w:pStyle w:val="BodyText"/>
       </w:pPr>
       <w:r>
-        <w:t xml:space="preserve">The proposed mechanism is explicit: the score compares the learned probability of a target class with that of the current class and adds local support from the target-class neighbourhood. The projection then resolves deficits and excesses while refusing mutable changes inside the hard mask. This can preserve existing built cells when demand is non-decreasing, but that outcome is a structural consequence of the projection and should not be interpreted as evidence of redevelopment realism. Allocator-matched controls are required before attributing morphology to the learned proposal.</w:t>
+        <w:t xml:space="preserve">The proposed mechanism is explicit: the score compares the learned probability of a target class with that of the current class and adds local support from the target-class neighbourhood. The projection then resolves deficits and excesses while refusing mutable changes inside the hard mask. This can preserve existing built cells when demand is non-decreasing, but that outcome is a structural consequence of the projection and should not be interpreted as evidence of redevelopment realism. The balanced objective set makes a different trade-off visible: the Kernel is compact and road-accessible but has substantially higher built-component density than FLUS. Allocator-matched controls are required before attributing morphology to the learned proposal.</w:t>
       </w:r>
     </w:p>
     <w:p>
@@ -2058,7 +2455,7 @@
         <w:pStyle w:val="BodyText"/>
       </w:pPr>
       <w:r>
-        <w:t xml:space="preserve">Several limitations define the boundary of the present evidence. The six classes are remote-sensing land cover, not statutory residential, commercial or industrial land use. Dynamic World labels show substantial annual uncertainty and apparent turnover, and the public road, wetland and protected-area layers are proxies rather than Abu Dhabi planning records. Future drivers are frozen at 2024, no observed 2025–2031 labels exist for validation and the scenario targets are synthetic planner-supplied actions. The three-seed summaries quantify stochastic variation but are not population-level uncertainty intervals. The completed controls are public-data stress tests with matched seeds rather than randomized interventions on real planning decisions, and several variants alter more than one implementation detail at a time. We therefore report them as evidence consistent with the execution contract rather than as causal attribution.</w:t>
+        <w:t xml:space="preserve">Several limitations define the boundary of the present evidence. The six classes are remote-sensing land cover, not statutory residential, commercial or industrial land use. Dynamic World labels show substantial annual uncertainty and apparent turnover, and the public road, wetland and protected-area layers are proxies rather than Abu Dhabi planning records. Future drivers are frozen at 2024, no independent 2023–2024 change product is available and no observed 2025–2031 labels exist for validation. The scenario targets are synthetic planner-supplied actions; the green-priority action is not an irrigation or water-budget model. FLUS remains an unmatched Apple-Silicon binary baseline, and the three-seed summaries quantify computational variation rather than population-level uncertainty. The completed controls are public-data stress tests with matched seeds rather than randomized interventions on real planning decisions, and several variants alter more than one implementation detail at a time. We therefore report them as evidence consistent with the execution contract rather than as causal attribution or a validated Abu Dhabi forecast.</w:t>
       </w:r>
     </w:p>
     <w:p>
@@ -2192,7 +2589,7 @@
         <w:rPr>
           <w:rStyle w:val="VerbatimChar"/>
         </w:rPr>
-        <w:t xml:space="preserve">planning_public_2025_2031_delivery_manifest.json</w:t>
+        <w:t xml:space="preserve">planning_public_2025_2031_delivery_manifest_current.json</w:t>
       </w:r>
       <w:r>
         <w:t xml:space="preserve"> </w:t>
@@ -2213,13 +2610,28 @@
         <w:rPr>
           <w:rStyle w:val="VerbatimChar"/>
         </w:rPr>
+        <w:t xml:space="preserve">output_audit_reproducible.json</w:t>
+      </w:r>
+      <w:r>
+        <w:t xml:space="preserve"> </w:t>
+      </w:r>
+      <w:r>
+        <w:t xml:space="preserve">for the current raster audit, with</w:t>
+      </w:r>
+      <w:r>
+        <w:t xml:space="preserve"> </w:t>
+      </w:r>
+      <w:r>
+        <w:rPr>
+          <w:rStyle w:val="VerbatimChar"/>
+        </w:rPr>
         <w:t xml:space="preserve">output_audit.json</w:t>
       </w:r>
       <w:r>
         <w:t xml:space="preserve"> </w:t>
       </w:r>
       <w:r>
-        <w:t xml:space="preserve">for the versioned raster audit; the revised audit does not treat the earlier 240-raster 2025–2030 record as evidence for the separate 2025–2031 delivery;</w:t>
+        <w:t xml:space="preserve">retained only as legacy lineage;</w:t>
       </w:r>
     </w:p>
     <w:p>
@@ -2291,16 +2703,22 @@
         </w:numPr>
       </w:pPr>
       <w:r>
-        <w:t xml:space="preserve">Large raster files are kept outside Git and tracked through repository-relative paths and SHA-256 manifests rather than embedded in this manuscript. For this analysis, the synchronized bundle was recovered from the local GIS data workspace (</w:t>
+        <w:t xml:space="preserve">The released bundle includes the aligned 2017–2024 public rasters, historical seed and ensemble prediction rasters, 2025–2031 planning seed and ensemble rasters, nine GeoPackages of dissolved change footprints, the mechanism-ablation report, model checkpoints, and the SHA-256 manifest. Text hashes use canonical LF line endings so that a Windows checkout with</w:t>
+      </w:r>
+      <w:r>
+        <w:t xml:space="preserve"> </w:t>
       </w:r>
       <w:r>
         <w:rPr>
           <w:rStyle w:val="VerbatimChar"/>
         </w:rPr>
-        <w:t xml:space="preserve">gisdataagent/benchmarks/abu_dhabi_land_use_v1/artifacts</w:t>
-      </w:r>
-      <w:r>
-        <w:t xml:space="preserve">); the exact local path is machine-specific and is not treated as a public URL. A clean external checkout therefore still needs the bundle, the GeoFM-LDN checkpoints and the FLUS executable to reproduce the numerical reports. No private database address, credential or client-only service is required for the intended public-data benchmark, but authoritative Abu Dhabi land-use validation data remain outside this study.</w:t>
+        <w:t xml:space="preserve">core.autocrlf=true</w:t>
+      </w:r>
+      <w:r>
+        <w:t xml:space="preserve"> </w:t>
+      </w:r>
+      <w:r>
+        <w:t xml:space="preserve">verifies identically. No private database address, credential or client-only service is included. Authoritative Abu Dhabi land-use and independent change-validation data remain outside this study.</w:t>
       </w:r>
     </w:p>
     <w:bookmarkEnd w:id="27"/>
@@ -2318,7 +2736,7 @@
         <w:pStyle w:val="FirstParagraph"/>
       </w:pPr>
       <w:r>
-        <w:t xml:space="preserve">The analysis scripts, a vendored Geospatial Kernel runtime snapshot, benchmark protocol and figure-generation code are maintained in the accompanying repository. Principal entry points are listed separately to keep the manuscript readable:</w:t>
+        <w:t xml:space="preserve">The analysis scripts, a vendored Geospatial Kernel runtime snapshot, benchmark protocol, model runners and figure-generation code are maintained in the accompanying repository. Principal entry points are listed separately to keep the manuscript readable:</w:t>
       </w:r>
     </w:p>
     <w:p>
@@ -2386,10 +2804,124 @@
     </w:p>
     <w:p>
       <w:pPr>
+        <w:pStyle w:val="Compact"/>
+        <w:numPr>
+          <w:ilvl w:val="0"/>
+          <w:numId w:val="1003"/>
+        </w:numPr>
+      </w:pPr>
+      <w:r>
+        <w:rPr>
+          <w:rStyle w:val="VerbatimChar"/>
+        </w:rPr>
+        <w:t xml:space="preserve">reproducibility/reproduce.py</w:t>
+      </w:r>
+      <w:r>
+        <w:t xml:space="preserve"> </w:t>
+      </w:r>
+      <w:r>
+        <w:t xml:space="preserve">for the end-to-end rerun;</w:t>
+      </w:r>
+    </w:p>
+    <w:p>
+      <w:pPr>
+        <w:pStyle w:val="Compact"/>
+        <w:numPr>
+          <w:ilvl w:val="0"/>
+          <w:numId w:val="1003"/>
+        </w:numPr>
+      </w:pPr>
+      <w:r>
+        <w:rPr>
+          <w:rStyle w:val="VerbatimChar"/>
+        </w:rPr>
+        <w:t xml:space="preserve">reproducibility_check.py</w:t>
+      </w:r>
+      <w:r>
+        <w:t xml:space="preserve"> </w:t>
+      </w:r>
+      <w:r>
+        <w:t xml:space="preserve">and</w:t>
+      </w:r>
+      <w:r>
+        <w:t xml:space="preserve"> </w:t>
+      </w:r>
+      <w:r>
+        <w:rPr>
+          <w:rStyle w:val="VerbatimChar"/>
+        </w:rPr>
+        <w:t xml:space="preserve">audit_outputs.py</w:t>
+      </w:r>
+      <w:r>
+        <w:t xml:space="preserve"> </w:t>
+      </w:r>
+      <w:r>
+        <w:t xml:space="preserve">for fail-closed integrity checks.</w:t>
+      </w:r>
+    </w:p>
+    <w:p>
+      <w:pPr>
         <w:pStyle w:val="FirstParagraph"/>
       </w:pPr>
       <w:r>
-        <w:t xml:space="preserve">GeoFM-LDN code and checkpoints are not included in this repository and remain a reproducibility blocker. A public release URL, archival DOI and corresponding-author e-mail should be added at submission.</w:t>
+        <w:t xml:space="preserve">GeoFM-LDN source and the three fixed checkpoints are included under</w:t>
+      </w:r>
+      <w:r>
+        <w:t xml:space="preserve"> </w:t>
+      </w:r>
+      <w:r>
+        <w:rPr>
+          <w:rStyle w:val="VerbatimChar"/>
+        </w:rPr>
+        <w:t xml:space="preserve">benchmarks/abu_dhabi_land_use_v1/external/</w:t>
+      </w:r>
+      <w:r>
+        <w:t xml:space="preserve"> </w:t>
+      </w:r>
+      <w:r>
+        <w:t xml:space="preserve">and</w:t>
+      </w:r>
+      <w:r>
+        <w:t xml:space="preserve"> </w:t>
+      </w:r>
+      <w:r>
+        <w:rPr>
+          <w:rStyle w:val="VerbatimChar"/>
+        </w:rPr>
+        <w:t xml:space="preserve">artifacts/predictions/</w:t>
+      </w:r>
+      <w:r>
+        <w:t xml:space="preserve">.</w:t>
+      </w:r>
+      <w:r>
+        <w:t xml:space="preserve"> </w:t>
+      </w:r>
+      <w:r>
+        <w:t xml:space="preserve">The vendored FLUS executable is a macOS arm64 binary; Linux and Windows users</w:t>
+      </w:r>
+      <w:r>
+        <w:t xml:space="preserve"> </w:t>
+      </w:r>
+      <w:r>
+        <w:t xml:space="preserve">can reproduce the Kernel and GeoFM-LDN tracks, but must provide a compatible</w:t>
+      </w:r>
+      <w:r>
+        <w:t xml:space="preserve"> </w:t>
+      </w:r>
+      <w:r>
+        <w:t xml:space="preserve">FLUS build or treat that baseline as unavailable. The repository is intended to</w:t>
+      </w:r>
+      <w:r>
+        <w:t xml:space="preserve"> </w:t>
+      </w:r>
+      <w:r>
+        <w:t xml:space="preserve">be public; an archival DOI and the corresponding-author e-mail should be added</w:t>
+      </w:r>
+      <w:r>
+        <w:t xml:space="preserve"> </w:t>
+      </w:r>
+      <w:r>
+        <w:t xml:space="preserve">to the submission metadata.</w:t>
       </w:r>
     </w:p>
     <w:bookmarkEnd w:id="28"/>
@@ -2493,7 +3025,7 @@
       </w:r>
     </w:p>
     <w:bookmarkEnd w:id="29"/>
-    <w:bookmarkStart w:id="43" w:name="references"/>
+    <w:bookmarkStart w:id="30" w:name="references"/>
     <w:p>
       <w:pPr>
         <w:pStyle w:val="Heading2"/>
@@ -2515,7 +3047,7 @@
         <w:pStyle w:val="BodyText"/>
       </w:pPr>
       <w:r>
-        <w:t xml:space="preserve">Brown, C. F., et al. (2022). Dynamic World, near real-time global 10 m land use land cover mapping.</w:t>
+        <w:t xml:space="preserve">Brown, C. F., et al. (2022). Dynamic World, near real-time global 10 m land use land cover mapping.</w:t>
       </w:r>
       <w:r>
         <w:t xml:space="preserve"> </w:t>
@@ -2528,19 +3060,8 @@
         <w:t xml:space="preserve">Scientific Data</w:t>
       </w:r>
       <w:r>
-        <w:t xml:space="preserve">, 9, 251.</w:t>
-      </w:r>
-      <w:r>
-        <w:t xml:space="preserve"> </w:t>
-      </w:r>
-      <w:hyperlink r:id="rId30">
-        <w:r>
-          <w:rPr>
-            <w:rStyle w:val="Hyperlink"/>
-          </w:rPr>
-          <w:t xml:space="preserve">https://doi.org/10.1038/s41597-022-01307-4</w:t>
-        </w:r>
-      </w:hyperlink>
+        <w:t xml:space="preserve">, 9, 251. https://doi.org/10.1038/s41597-022-01307-4</w:t>
+      </w:r>
     </w:p>
     <w:p>
       <w:pPr>
@@ -2560,26 +3081,15 @@
         <w:t xml:space="preserve">Urban Studies</w:t>
       </w:r>
       <w:r>
-        <w:t xml:space="preserve">, 37, 1969–2006.</w:t>
-      </w:r>
-      <w:r>
-        <w:t xml:space="preserve"> </w:t>
-      </w:r>
-      <w:hyperlink r:id="rId31">
-        <w:r>
-          <w:rPr>
-            <w:rStyle w:val="Hyperlink"/>
-          </w:rPr>
-          <w:t xml:space="preserve">https://doi.org/10.1080/00420980050162184</w:t>
-        </w:r>
-      </w:hyperlink>
+        <w:t xml:space="preserve">, 37, 1969–2006. https://doi.org/10.1080/00420980050162184</w:t>
+      </w:r>
     </w:p>
     <w:p>
       <w:pPr>
         <w:pStyle w:val="BodyText"/>
       </w:pPr>
       <w:r>
-        <w:t xml:space="preserve">Gorelick, N., et al. (2017). Google Earth Engine: planetary-scale geospatial analysis for everyone.</w:t>
+        <w:t xml:space="preserve">Gorelick, N., et al. (2017). Google Earth Engine: planetary-scale geospatial analysis for everyone.</w:t>
       </w:r>
       <w:r>
         <w:t xml:space="preserve"> </w:t>
@@ -2592,19 +3102,8 @@
         <w:t xml:space="preserve">Remote Sensing of Environment</w:t>
       </w:r>
       <w:r>
-        <w:t xml:space="preserve">, 202, 18–27.</w:t>
-      </w:r>
-      <w:r>
-        <w:t xml:space="preserve"> </w:t>
-      </w:r>
-      <w:hyperlink r:id="rId32">
-        <w:r>
-          <w:rPr>
-            <w:rStyle w:val="Hyperlink"/>
-          </w:rPr>
-          <w:t xml:space="preserve">https://doi.org/10.1016/j.rse.2017.06.031</w:t>
-        </w:r>
-      </w:hyperlink>
+        <w:t xml:space="preserve">, 202, 18–27. https://doi.org/10.1016/j.rse.2017.06.031</w:t>
+      </w:r>
     </w:p>
     <w:p>
       <w:pPr>
@@ -2624,26 +3123,15 @@
         <w:t xml:space="preserve">Environment and Planning B: Planning and Design</w:t>
       </w:r>
       <w:r>
-        <w:t xml:space="preserve">, 32, 247–263.</w:t>
-      </w:r>
-      <w:r>
-        <w:t xml:space="preserve"> </w:t>
-      </w:r>
-      <w:hyperlink r:id="rId33">
-        <w:r>
-          <w:rPr>
-            <w:rStyle w:val="Hyperlink"/>
-          </w:rPr>
-          <w:t xml:space="preserve">https://doi.org/10.1068/b31110</w:t>
-        </w:r>
-      </w:hyperlink>
+        <w:t xml:space="preserve">, 32, 247–263. https://doi.org/10.1068/b31110</w:t>
+      </w:r>
     </w:p>
     <w:p>
       <w:pPr>
         <w:pStyle w:val="BodyText"/>
       </w:pPr>
       <w:r>
-        <w:t xml:space="preserve">Liang, X., et al. (2021). A patch-generating land use simulation model integrating multisource data for urban growth simulation.</w:t>
+        <w:t xml:space="preserve">Liang, X., et al. (2021). A patch-generating land use simulation model integrating multisource data for urban growth simulation.</w:t>
       </w:r>
       <w:r>
         <w:t xml:space="preserve"> </w:t>
@@ -2656,26 +3144,15 @@
         <w:t xml:space="preserve">Landscape and Urban Planning</w:t>
       </w:r>
       <w:r>
-        <w:t xml:space="preserve">, 214, 104157.</w:t>
-      </w:r>
-      <w:r>
-        <w:t xml:space="preserve"> </w:t>
-      </w:r>
-      <w:hyperlink r:id="rId34">
-        <w:r>
-          <w:rPr>
-            <w:rStyle w:val="Hyperlink"/>
-          </w:rPr>
-          <w:t xml:space="preserve">https://doi.org/10.1016/j.landurbplan.2021.104157</w:t>
-        </w:r>
-      </w:hyperlink>
+        <w:t xml:space="preserve">, 214, 104157. https://doi.org/10.1016/j.landurbplan.2021.104157</w:t>
+      </w:r>
     </w:p>
     <w:p>
       <w:pPr>
         <w:pStyle w:val="BodyText"/>
       </w:pPr>
       <w:r>
-        <w:t xml:space="preserve">Liu, X., et al. (2017). A future land use simulation model (FLUS) for simulating multiple land use scenarios by coupling human and natural effects.</w:t>
+        <w:t xml:space="preserve">Liu, X., et al. (2017). A future land use simulation model (FLUS) for simulating multiple land use scenarios by coupling human and natural effects.</w:t>
       </w:r>
       <w:r>
         <w:t xml:space="preserve"> </w:t>
@@ -2688,45 +3165,23 @@
         <w:t xml:space="preserve">Landscape and Urban Planning</w:t>
       </w:r>
       <w:r>
-        <w:t xml:space="preserve">, 168, 94–116.</w:t>
-      </w:r>
-      <w:r>
-        <w:t xml:space="preserve"> </w:t>
-      </w:r>
-      <w:hyperlink r:id="rId35">
-        <w:r>
-          <w:rPr>
-            <w:rStyle w:val="Hyperlink"/>
-          </w:rPr>
-          <w:t xml:space="preserve">https://doi.org/10.1016/j.landurbplan.2017.09.019</w:t>
-        </w:r>
-      </w:hyperlink>
+        <w:t xml:space="preserve">, 168, 94–116. https://doi.org/10.1016/j.landurbplan.2017.09.019</w:t>
+      </w:r>
     </w:p>
     <w:p>
       <w:pPr>
         <w:pStyle w:val="BodyText"/>
       </w:pPr>
       <w:r>
-        <w:t xml:space="preserve">OpenStreetMap contributors. (2026). OpenStreetMap data, Abu Dhabi relation R4479763 and Geofabrik GCC extract, accessed 31 July 2026.</w:t>
-      </w:r>
-      <w:r>
-        <w:t xml:space="preserve"> </w:t>
-      </w:r>
-      <w:hyperlink r:id="rId36">
-        <w:r>
-          <w:rPr>
-            <w:rStyle w:val="Hyperlink"/>
-          </w:rPr>
-          <w:t xml:space="preserve">https://www.openstreetmap.org</w:t>
-        </w:r>
-      </w:hyperlink>
+        <w:t xml:space="preserve">OpenStreetMap contributors. (2026). OpenStreetMap data, Abu Dhabi relation R4479763 and Geofabrik GCC extract, accessed 31 July 2026. https://www.openstreetmap.org</w:t>
+      </w:r>
     </w:p>
     <w:p>
       <w:pPr>
         <w:pStyle w:val="BodyText"/>
       </w:pPr>
       <w:r>
-        <w:t xml:space="preserve">Pontius, R. G., Jr., Boersma, W., Castella, J.-C., et al. (2008). Comparing the input, output, and validation maps for several models of land change.</w:t>
+        <w:t xml:space="preserve">Pontius, R. G., Jr., Boersma, W., Castella, J.-C., et al. (2008). Comparing the input, output, and validation maps for several models of land change.</w:t>
       </w:r>
       <w:r>
         <w:t xml:space="preserve"> </w:t>
@@ -2781,19 +3236,8 @@
         <w:t xml:space="preserve">Computers, Environment and Urban Systems</w:t>
       </w:r>
       <w:r>
-        <w:t xml:space="preserve">, 26, 525–552.</w:t>
-      </w:r>
-      <w:r>
-        <w:t xml:space="preserve"> </w:t>
-      </w:r>
-      <w:hyperlink r:id="rId37">
-        <w:r>
-          <w:rPr>
-            <w:rStyle w:val="Hyperlink"/>
-          </w:rPr>
-          <w:t xml:space="preserve">https://doi.org/10.1016/S0198-9715(01)00017-8</w:t>
-        </w:r>
-      </w:hyperlink>
+        <w:t xml:space="preserve">, 26, 525–552. https://doi.org/10.1016/S0198-9715(01)00017-8</w:t>
+      </w:r>
     </w:p>
     <w:p>
       <w:pPr>
@@ -2813,19 +3257,8 @@
         <w:t xml:space="preserve">Ecological Modelling</w:t>
       </w:r>
       <w:r>
-        <w:t xml:space="preserve">, 154, 217–235.</w:t>
-      </w:r>
-      <w:r>
-        <w:t xml:space="preserve"> </w:t>
-      </w:r>
-      <w:hyperlink r:id="rId38">
-        <w:r>
-          <w:rPr>
-            <w:rStyle w:val="Hyperlink"/>
-          </w:rPr>
-          <w:t xml:space="preserve">https://doi.org/10.1016/S0304-3800(02)00059-5</w:t>
-        </w:r>
-      </w:hyperlink>
+        <w:t xml:space="preserve">, 154, 217–235. https://doi.org/10.1016/S0304-3800(02)00059-5</w:t>
+      </w:r>
     </w:p>
     <w:p>
       <w:pPr>
@@ -2845,19 +3278,8 @@
         <w:t xml:space="preserve">Journal of Land Use Science</w:t>
       </w:r>
       <w:r>
-        <w:t xml:space="preserve">, 6, 247–265.</w:t>
-      </w:r>
-      <w:r>
-        <w:t xml:space="preserve"> </w:t>
-      </w:r>
-      <w:hyperlink r:id="rId39">
-        <w:r>
-          <w:rPr>
-            <w:rStyle w:val="Hyperlink"/>
-          </w:rPr>
-          <w:t xml:space="preserve">https://doi.org/10.1080/1747423X.2011.562018</w:t>
-        </w:r>
-      </w:hyperlink>
+        <w:t xml:space="preserve">, 6, 247–265. https://doi.org/10.1080/1747423X.2011.562018</w:t>
+      </w:r>
     </w:p>
     <w:p>
       <w:pPr>
@@ -2877,26 +3299,15 @@
         <w:t xml:space="preserve">Environmental Modelling &amp; Software</w:t>
       </w:r>
       <w:r>
-        <w:t xml:space="preserve">, 82, 174–182.</w:t>
-      </w:r>
-      <w:r>
-        <w:t xml:space="preserve"> </w:t>
-      </w:r>
-      <w:hyperlink r:id="rId40">
-        <w:r>
-          <w:rPr>
-            <w:rStyle w:val="Hyperlink"/>
-          </w:rPr>
-          <w:t xml:space="preserve">https://doi.org/10.1016/j.envsoft.2016.04.017</w:t>
-        </w:r>
-      </w:hyperlink>
+        <w:t xml:space="preserve">, 82, 174–182. https://doi.org/10.1016/j.envsoft.2016.04.017</w:t>
+      </w:r>
     </w:p>
     <w:p>
       <w:pPr>
         <w:pStyle w:val="BodyText"/>
       </w:pPr>
       <w:r>
-        <w:t xml:space="preserve">Verburg, P. H., et al. (2002). Modeling the spatial dynamics of regional land use: the CLUE-S model.</w:t>
+        <w:t xml:space="preserve">Verburg, P. H., et al. (2002). Modeling the spatial dynamics of regional land use: the CLUE-S model.</w:t>
       </w:r>
       <w:r>
         <w:t xml:space="preserve"> </w:t>
@@ -2909,41 +3320,19 @@
         <w:t xml:space="preserve">Environmental Management</w:t>
       </w:r>
       <w:r>
-        <w:t xml:space="preserve">, 30, 391–405.</w:t>
-      </w:r>
-      <w:r>
-        <w:t xml:space="preserve"> </w:t>
-      </w:r>
-      <w:hyperlink r:id="rId41">
-        <w:r>
-          <w:rPr>
-            <w:rStyle w:val="Hyperlink"/>
-          </w:rPr>
-          <w:t xml:space="preserve">https://doi.org/10.1007/s00267-002-2631-x</w:t>
-        </w:r>
-      </w:hyperlink>
+        <w:t xml:space="preserve">, 30, 391–405. https://doi.org/10.1007/s00267-002-2631-x</w:t>
+      </w:r>
     </w:p>
     <w:p>
       <w:pPr>
         <w:pStyle w:val="BodyText"/>
       </w:pPr>
       <w:r>
-        <w:t xml:space="preserve">Zanaga, D., et al. (2022). ESA WorldCover 10 m 2021 v200. Zenodo.</w:t>
-      </w:r>
-      <w:r>
-        <w:t xml:space="preserve"> </w:t>
-      </w:r>
-      <w:hyperlink r:id="rId42">
-        <w:r>
-          <w:rPr>
-            <w:rStyle w:val="Hyperlink"/>
-          </w:rPr>
-          <w:t xml:space="preserve">https://doi.org/10.5281/zenodo.7254221</w:t>
-        </w:r>
-      </w:hyperlink>
-    </w:p>
-    <w:bookmarkEnd w:id="43"/>
-    <w:bookmarkStart w:id="59" w:name="figure-legends"/>
+        <w:t xml:space="preserve">Zanaga, D., et al. (2022). ESA WorldCover 10 m 2021 v200. Zenodo. https://doi.org/10.5281/zenodo.7254221</w:t>
+      </w:r>
+    </w:p>
+    <w:bookmarkEnd w:id="30"/>
+    <w:bookmarkStart w:id="46" w:name="figure-legends"/>
     <w:p>
       <w:pPr>
         <w:pStyle w:val="Heading2"/>
@@ -2954,25 +3343,25 @@
     </w:p>
     <w:p>
       <w:pPr>
-        <w:pStyle w:val="FirstParagraph"/>
+        <w:pStyle w:val="CaptionedFigure"/>
       </w:pPr>
       <w:r>
         <w:drawing>
           <wp:inline>
-            <wp:extent cx="5334000" cy="3383237"/>
+            <wp:extent cx="5334000" cy="3384822"/>
             <wp:effectExtent b="0" l="0" r="0" t="0"/>
-            <wp:docPr descr="Figure 1: benchmark and execution contract" title="" id="45" name="Picture"/>
+            <wp:docPr descr="Figure 1: benchmark and execution contract" title="" id="32" name="Picture"/>
             <a:graphic>
               <a:graphicData uri="http://schemas.openxmlformats.org/drawingml/2006/picture">
                 <pic:pic>
                   <pic:nvPicPr>
-                    <pic:cNvPr descr="figures/fig01_benchmark_contract.png" id="46" name="Picture"/>
+                    <pic:cNvPr descr="figures/fig01_benchmark_contract.png" id="33" name="Picture"/>
                     <pic:cNvPicPr>
                       <a:picLocks noChangeArrowheads="1" noChangeAspect="1"/>
                     </pic:cNvPicPr>
                   </pic:nvPicPr>
                   <pic:blipFill>
-                    <a:blip r:embed="rId44"/>
+                    <a:blip r:embed="rId31"/>
                     <a:stretch>
                       <a:fillRect/>
                     </a:stretch>
@@ -2980,7 +3369,7 @@
                   <pic:spPr bwMode="auto">
                     <a:xfrm>
                       <a:off x="0" y="0"/>
-                      <a:ext cx="5334000" cy="3383237"/>
+                      <a:ext cx="5334000" cy="3384822"/>
                     </a:xfrm>
                     <a:prstGeom prst="rect">
                       <a:avLst/>
@@ -3001,6 +3390,14 @@
     </w:p>
     <w:p>
       <w:pPr>
+        <w:pStyle w:val="ImageCaption"/>
+      </w:pPr>
+      <w:r>
+        <w:t xml:space="preserve">Figure 1: benchmark and execution contract</w:t>
+      </w:r>
+    </w:p>
+    <w:p>
+      <w:pPr>
         <w:pStyle w:val="BodyText"/>
       </w:pPr>
       <w:r>
@@ -3019,25 +3416,25 @@
     </w:p>
     <w:p>
       <w:pPr>
-        <w:pStyle w:val="BodyText"/>
+        <w:pStyle w:val="CaptionedFigure"/>
       </w:pPr>
       <w:r>
         <w:drawing>
           <wp:inline>
-            <wp:extent cx="5334000" cy="3536990"/>
+            <wp:extent cx="5334000" cy="3538245"/>
             <wp:effectExtent b="0" l="0" r="0" t="0"/>
-            <wp:docPr descr="Figure 2: historical allocation skill" title="" id="48" name="Picture"/>
+            <wp:docPr descr="Figure 2: historical allocation skill" title="" id="35" name="Picture"/>
             <a:graphic>
               <a:graphicData uri="http://schemas.openxmlformats.org/drawingml/2006/picture">
                 <pic:pic>
                   <pic:nvPicPr>
-                    <pic:cNvPr descr="figures/fig02_historical_validation.png" id="49" name="Picture"/>
+                    <pic:cNvPr descr="figures/fig02_historical_validation.png" id="36" name="Picture"/>
                     <pic:cNvPicPr>
                       <a:picLocks noChangeArrowheads="1" noChangeAspect="1"/>
                     </pic:cNvPicPr>
                   </pic:nvPicPr>
                   <pic:blipFill>
-                    <a:blip r:embed="rId47"/>
+                    <a:blip r:embed="rId34"/>
                     <a:stretch>
                       <a:fillRect/>
                     </a:stretch>
@@ -3045,7 +3442,7 @@
                   <pic:spPr bwMode="auto">
                     <a:xfrm>
                       <a:off x="0" y="0"/>
-                      <a:ext cx="5334000" cy="3536990"/>
+                      <a:ext cx="5334000" cy="3538245"/>
                     </a:xfrm>
                     <a:prstGeom prst="rect">
                       <a:avLst/>
@@ -3066,6 +3463,14 @@
     </w:p>
     <w:p>
       <w:pPr>
+        <w:pStyle w:val="ImageCaption"/>
+      </w:pPr>
+      <w:r>
+        <w:t xml:space="preserve">Figure 2: historical allocation skill</w:t>
+      </w:r>
+    </w:p>
+    <w:p>
+      <w:pPr>
         <w:pStyle w:val="BodyText"/>
       </w:pPr>
       <w:r>
@@ -3114,67 +3519,25 @@
     </w:p>
     <w:p>
       <w:pPr>
-        <w:pStyle w:val="BodyText"/>
-      </w:pPr>
-      <w:r>
-        <w:rPr>
-          <w:b/>
-          <w:bCs/>
-        </w:rPr>
-        <w:t xml:space="preserve">Figure 3 | Conditional planning objectives.</w:t>
-      </w:r>
-      <w:r>
-        <w:t xml:space="preserve"> </w:t>
-      </w:r>
-      <w:r>
-        <w:t xml:space="preserve">The 2031 outcomes compare the</w:t>
-      </w:r>
-      <w:r>
-        <w:t xml:space="preserve"> </w:t>
-      </w:r>
-      <w:r>
-        <w:t xml:space="preserve">three models under moderate-growth, green-priority-growth and high-outward-growth</w:t>
-      </w:r>
-      <w:r>
-        <w:t xml:space="preserve"> </w:t>
-      </w:r>
-      <w:r>
-        <w:t xml:space="preserve">actions. Ecological conversion, major-road distance, leapfrog morphology and</w:t>
-      </w:r>
-      <w:r>
-        <w:t xml:space="preserve"> </w:t>
-      </w:r>
-      <w:r>
-        <w:t xml:space="preserve">built retirement define the conditional Pareto set; other quantities are shown</w:t>
-      </w:r>
-      <w:r>
-        <w:t xml:space="preserve"> </w:t>
-      </w:r>
-      <w:r>
-        <w:t xml:space="preserve">as descriptive diagnostics.</w:t>
-      </w:r>
-    </w:p>
-    <w:p>
-      <w:pPr>
-        <w:pStyle w:val="BodyText"/>
+        <w:pStyle w:val="CaptionedFigure"/>
       </w:pPr>
       <w:r>
         <w:drawing>
           <wp:inline>
-            <wp:extent cx="5334000" cy="3507253"/>
+            <wp:extent cx="5334000" cy="3496076"/>
             <wp:effectExtent b="0" l="0" r="0" t="0"/>
-            <wp:docPr descr="Figure 3: conditional planning objectives" title="" id="51" name="Picture"/>
+            <wp:docPr descr="Figure 3: conditional planning objectives" title="" id="38" name="Picture"/>
             <a:graphic>
               <a:graphicData uri="http://schemas.openxmlformats.org/drawingml/2006/picture">
                 <pic:pic>
                   <pic:nvPicPr>
-                    <pic:cNvPr descr="figures/fig03_planning_objectives.png" id="52" name="Picture"/>
+                    <pic:cNvPr descr="figures/fig03_planning_objectives.png" id="39" name="Picture"/>
                     <pic:cNvPicPr>
                       <a:picLocks noChangeArrowheads="1" noChangeAspect="1"/>
                     </pic:cNvPicPr>
                   </pic:nvPicPr>
                   <pic:blipFill>
-                    <a:blip r:embed="rId50"/>
+                    <a:blip r:embed="rId37"/>
                     <a:stretch>
                       <a:fillRect/>
                     </a:stretch>
@@ -3182,7 +3545,7 @@
                   <pic:spPr bwMode="auto">
                     <a:xfrm>
                       <a:off x="0" y="0"/>
-                      <a:ext cx="5334000" cy="3507253"/>
+                      <a:ext cx="5334000" cy="3496076"/>
                     </a:xfrm>
                     <a:prstGeom prst="rect">
                       <a:avLst/>
@@ -3203,6 +3566,14 @@
     </w:p>
     <w:p>
       <w:pPr>
+        <w:pStyle w:val="ImageCaption"/>
+      </w:pPr>
+      <w:r>
+        <w:t xml:space="preserve">Figure 3: conditional planning objectives</w:t>
+      </w:r>
+    </w:p>
+    <w:p>
+      <w:pPr>
         <w:pStyle w:val="BodyText"/>
       </w:pPr>
       <w:r>
@@ -3210,48 +3581,78 @@
           <w:b/>
           <w:bCs/>
         </w:rPr>
-        <w:t xml:space="preserve">Figure 4 | Mechanism controls.</w:t>
-      </w:r>
-      <w:r>
-        <w:t xml:space="preserve"> </w:t>
-      </w:r>
-      <w:r>
-        <w:t xml:space="preserve">Proposal, allocator and writeback controls</w:t>
-      </w:r>
-      <w:r>
-        <w:t xml:space="preserve"> </w:t>
-      </w:r>
-      <w:r>
-        <w:t xml:space="preserve">are compared under the same public-data protocol. These are diagnostic</w:t>
-      </w:r>
-      <w:r>
-        <w:t xml:space="preserve"> </w:t>
-      </w:r>
-      <w:r>
-        <w:t xml:space="preserve">ablations, not causal policy experiments.</w:t>
-      </w:r>
-    </w:p>
-    <w:p>
-      <w:pPr>
-        <w:pStyle w:val="BodyText"/>
+        <w:t xml:space="preserve">Figure 3 | Conditional planning objectives and morphology diagnostics.</w:t>
+      </w:r>
+      <w:r>
+        <w:t xml:space="preserve"> </w:t>
+      </w:r>
+      <w:r>
+        <w:t xml:space="preserve">The</w:t>
+      </w:r>
+      <w:r>
+        <w:t xml:space="preserve"> </w:t>
+      </w:r>
+      <w:r>
+        <w:t xml:space="preserve">2031 outcomes compare the three models under moderate-growth, green-priority-</w:t>
+      </w:r>
+      <w:r>
+        <w:t xml:space="preserve"> </w:t>
+      </w:r>
+      <w:r>
+        <w:t xml:space="preserve">growth and high-outward-growth actions. Panels A–D are the frozen Pareto</w:t>
+      </w:r>
+      <w:r>
+        <w:t xml:space="preserve"> </w:t>
+      </w:r>
+      <w:r>
+        <w:t xml:space="preserve">objectives: distance to major roads, distance to prior built cells, built</w:t>
+      </w:r>
+      <w:r>
+        <w:t xml:space="preserve"> </w:t>
+      </w:r>
+      <w:r>
+        <w:t xml:space="preserve">components per 1,000 valid cells and vegetation gain. Panels E–F are</w:t>
+      </w:r>
+      <w:r>
+        <w:t xml:space="preserve"> </w:t>
+      </w:r>
+      <w:r>
+        <w:t xml:space="preserve">descriptive diagnostics (ecological conversion and 500-m leapfrog rate). Stars</w:t>
+      </w:r>
+      <w:r>
+        <w:t xml:space="preserve"> </w:t>
+      </w:r>
+      <w:r>
+        <w:t xml:space="preserve">mark non-dominated candidates under the four-objective set; bars show means ±</w:t>
+      </w:r>
+      <w:r>
+        <w:t xml:space="preserve"> </w:t>
+      </w:r>
+      <w:r>
+        <w:t xml:space="preserve">population SD across three seeds.</w:t>
+      </w:r>
+    </w:p>
+    <w:p>
+      <w:pPr>
+        <w:pStyle w:val="CaptionedFigure"/>
       </w:pPr>
       <w:r>
         <w:drawing>
           <wp:inline>
-            <wp:extent cx="5334000" cy="3703670"/>
+            <wp:extent cx="5334000" cy="3704556"/>
             <wp:effectExtent b="0" l="0" r="0" t="0"/>
-            <wp:docPr descr="Figure 4: mechanism controls" title="" id="54" name="Picture"/>
+            <wp:docPr descr="Figure 4: mechanism controls" title="" id="41" name="Picture"/>
             <a:graphic>
               <a:graphicData uri="http://schemas.openxmlformats.org/drawingml/2006/picture">
                 <pic:pic>
                   <pic:nvPicPr>
-                    <pic:cNvPr descr="figures/fig04_mechanism_ablation.png" id="55" name="Picture"/>
+                    <pic:cNvPr descr="figures/fig04_mechanism_ablation.png" id="42" name="Picture"/>
                     <pic:cNvPicPr>
                       <a:picLocks noChangeArrowheads="1" noChangeAspect="1"/>
                     </pic:cNvPicPr>
                   </pic:nvPicPr>
                   <pic:blipFill>
-                    <a:blip r:embed="rId53"/>
+                    <a:blip r:embed="rId40"/>
                     <a:stretch>
                       <a:fillRect/>
                     </a:stretch>
@@ -3259,7 +3660,7 @@
                   <pic:spPr bwMode="auto">
                     <a:xfrm>
                       <a:off x="0" y="0"/>
-                      <a:ext cx="5334000" cy="3703670"/>
+                      <a:ext cx="5334000" cy="3704556"/>
                     </a:xfrm>
                     <a:prstGeom prst="rect">
                       <a:avLst/>
@@ -3280,25 +3681,75 @@
     </w:p>
     <w:p>
       <w:pPr>
+        <w:pStyle w:val="ImageCaption"/>
+      </w:pPr>
+      <w:r>
+        <w:t xml:space="preserve">Figure 4: mechanism controls</w:t>
+      </w:r>
+    </w:p>
+    <w:p>
+      <w:pPr>
         <w:pStyle w:val="BodyText"/>
+      </w:pPr>
+      <w:r>
+        <w:rPr>
+          <w:b/>
+          <w:bCs/>
+        </w:rPr>
+        <w:t xml:space="preserve">Figure 4 | Mechanism controls.</w:t>
+      </w:r>
+      <w:r>
+        <w:t xml:space="preserve"> </w:t>
+      </w:r>
+      <w:r>
+        <w:t xml:space="preserve">Proposal, allocator, action, constraint and</w:t>
+      </w:r>
+      <w:r>
+        <w:t xml:space="preserve"> </w:t>
+      </w:r>
+      <w:r>
+        <w:t xml:space="preserve">writeback controls are compared under the same public-data protocol. Deleting</w:t>
+      </w:r>
+      <w:r>
+        <w:t xml:space="preserve"> </w:t>
+      </w:r>
+      <w:r>
+        <w:t xml:space="preserve">the action lowers historical strict FoM, whereas deleting the hard constraint</w:t>
+      </w:r>
+      <w:r>
+        <w:t xml:space="preserve"> </w:t>
+      </w:r>
+      <w:r>
+        <w:t xml:space="preserve">raises agreement with noisy labels while violating the planning contract.</w:t>
+      </w:r>
+      <w:r>
+        <w:t xml:space="preserve"> </w:t>
+      </w:r>
+      <w:r>
+        <w:t xml:space="preserve">These are diagnostic ablations, not causal policy experiments.</w:t>
+      </w:r>
+    </w:p>
+    <w:p>
+      <w:pPr>
+        <w:pStyle w:val="CaptionedFigure"/>
       </w:pPr>
       <w:r>
         <w:drawing>
           <wp:inline>
-            <wp:extent cx="5334000" cy="5253521"/>
+            <wp:extent cx="5334000" cy="5254821"/>
             <wp:effectExtent b="0" l="0" r="0" t="0"/>
-            <wp:docPr descr="Figure 5: 2031 spatial footprints" title="" id="57" name="Picture"/>
+            <wp:docPr descr="Figure 5: 2031 spatial footprints" title="" id="44" name="Picture"/>
             <a:graphic>
               <a:graphicData uri="http://schemas.openxmlformats.org/drawingml/2006/picture">
                 <pic:pic>
                   <pic:nvPicPr>
-                    <pic:cNvPr descr="figures/fig05_planning_maps_2031.png" id="58" name="Picture"/>
+                    <pic:cNvPr descr="figures/fig05_planning_maps_2031.png" id="45" name="Picture"/>
                     <pic:cNvPicPr>
                       <a:picLocks noChangeArrowheads="1" noChangeAspect="1"/>
                     </pic:cNvPicPr>
                   </pic:nvPicPr>
                   <pic:blipFill>
-                    <a:blip r:embed="rId56"/>
+                    <a:blip r:embed="rId43"/>
                     <a:stretch>
                       <a:fillRect/>
                     </a:stretch>
@@ -3306,7 +3757,7 @@
                   <pic:spPr bwMode="auto">
                     <a:xfrm>
                       <a:off x="0" y="0"/>
-                      <a:ext cx="5334000" cy="5253521"/>
+                      <a:ext cx="5334000" cy="5254821"/>
                     </a:xfrm>
                     <a:prstGeom prst="rect">
                       <a:avLst/>
@@ -3327,6 +3778,14 @@
     </w:p>
     <w:p>
       <w:pPr>
+        <w:pStyle w:val="ImageCaption"/>
+      </w:pPr>
+      <w:r>
+        <w:t xml:space="preserve">Figure 5: 2031 spatial footprints</w:t>
+      </w:r>
+    </w:p>
+    <w:p>
+      <w:pPr>
         <w:pStyle w:val="BodyText"/>
       </w:pPr>
       <w:r>
@@ -3361,8 +3820,8 @@
         <w:t xml:space="preserve">cadastral parcels.</w:t>
       </w:r>
     </w:p>
-    <w:bookmarkEnd w:id="59"/>
-    <w:bookmarkStart w:id="60" w:name="supplementary-information-outline"/>
+    <w:bookmarkEnd w:id="46"/>
+    <w:bookmarkStart w:id="47" w:name="supplementary-information-outline"/>
     <w:p>
       <w:pPr>
         <w:pStyle w:val="Heading2"/>
@@ -3554,8 +4013,8 @@
         </w:pict>
       </w:r>
     </w:p>
-    <w:bookmarkEnd w:id="60"/>
-    <w:bookmarkEnd w:id="61"/>
+    <w:bookmarkEnd w:id="47"/>
+    <w:bookmarkEnd w:id="48"/>
     <w:sectPr>
       <w:footnotePr>
         <w:numRestart w:val="eachSect"/>

</xml_diff>

<commit_message>
Address fourth-round LUP review
</commit_message>
<xml_diff>
--- a/manuscript/manuscript.docx
+++ b/manuscript/manuscript.docx
@@ -2,13 +2,13 @@
 <file path=word/document.xml><?xml version="1.0" encoding="utf-8"?>
 <w:document xmlns:w="http://schemas.openxmlformats.org/wordprocessingml/2006/main" xmlns:m="http://schemas.openxmlformats.org/officeDocument/2006/math" xmlns:r="http://schemas.openxmlformats.org/officeDocument/2006/relationships" xmlns:o="urn:schemas-microsoft-com:office:office" xmlns:v="urn:schemas-microsoft-com:vml" xmlns:w10="urn:schemas-microsoft-com:office:word" xmlns:a="http://schemas.openxmlformats.org/drawingml/2006/main" xmlns:pic="http://schemas.openxmlformats.org/drawingml/2006/picture" xmlns:wp="http://schemas.openxmlformats.org/drawingml/2006/wordprocessingDrawing">
   <w:body>
-    <w:bookmarkStart w:id="48" w:name="Xa792ae9d4bbdc58e2d9589266a4679e28954073"/>
+    <w:bookmarkStart w:id="48" w:name="X9f1511a8109b24064870830db84b786f9ef0e11"/>
     <w:p>
       <w:pPr>
         <w:pStyle w:val="Heading1"/>
       </w:pPr>
       <w:r>
-        <w:t xml:space="preserve">Geospatial Kernel: a state–action–constraint core for urban land-cover planning</w:t>
+        <w:t xml:space="preserve">Auditing constrained geospatial allocation under noisy annual land-cover labels</w:t>
       </w:r>
     </w:p>
     <w:p>
@@ -20,7 +20,7 @@
           <w:b/>
           <w:bCs/>
         </w:rPr>
-        <w:t xml:space="preserve">An Abu Dhabi benchmark with conditional multi-year scenario analysis</w:t>
+        <w:t xml:space="preserve">A Geospatial Kernel benchmark in Abu Dhabi</w:t>
       </w:r>
     </w:p>
     <w:p>
@@ -95,7 +95,7 @@
         <w:pStyle w:val="FirstParagraph"/>
       </w:pPr>
       <w:r>
-        <w:t xml:space="preserve">Urban land-change models test how development demand may be distributed across space. Their planning value depends on explicit actions, hard constraints and consistent multi-year state transitions. We examine Geospatial Kernel, the algorithmic core of a Geospatial World Model, as an auditable state–action–constraint transition system for urban land-cover allocation. The Abu Dhabi benchmark specifies annual public land-cover products from 2017–2024, a 100-m grid, three computational seeds, destination-correct multi-class change Figure of Merit, persistence and minimum-change controls, spatial-block bootstrap intervals, and a frozen planning objective set spanning accessibility, compactness, fragmentation and vegetation balance. The implementation contribution is an inspectable proposal–projection–writeback execution boundary with fail-closed data and output audits. The public benchmark bundle, model source, checkpoints, historical prediction rasters, planning rasters, vector change packages and mechanism-control report are released with the repository and addressed by a reproducibility manifest. The resulting rankings are conditional pipeline comparisons, not claims of intrinsic learner superiority or official Abu Dhabi forecasting. The benchmark keeps public land-cover stress tests separate from authoritative statutory land use.</w:t>
+        <w:t xml:space="preserve">Urban land-change models are often evaluated against annual labels whose reliability is not spatially uniform. We present an auditable protocol for testing constrained spatial allocation under that uncertainty, using Geospatial Kernel, the algorithmic core of a Geospatial World Model, as the focal execution layer. The Abu Dhabi public-data benchmark uses annual 100-m land-cover products from 2017–2024, three computational seeds, destination-correct multi-class change Figure of Merit (FoM), spatial-block bootstrap contrasts and explicit state–action–constraint traces. The regenerated strict FoM was 0.1950 for Geospatial Kernel, 0.1256 for the FLUS-style ANN–CA console and 0.1616 for GeoFM-LDN in 2023; after recursive two-step rollout in 2024 the values were 0.2520, 0.1782 and 0.2708, respectively. On the high-confidence label subset, all three models had FoM 0.000 in 2023 and the 2024 maximum was 0.0188, showing that full-grid agreement is strongly conditioned by label noise. The planning track is therefore reported as scenario stress testing, not official forecasting. The released public bundle, source, checkpoints, rasters, vector footprints and audit manifests support locked-environment reproduction, while cross-platform Kernel reruns differ by about 1% of cells and approximately 0.001 FoM. The protocol’s principal contribution is an inspectable proposal–projection–writeback boundary for separating model behaviour from action and constraint semantics.</w:t>
       </w:r>
     </w:p>
     <w:bookmarkEnd w:id="9"/>
@@ -141,7 +141,7 @@
         </w:numPr>
       </w:pPr>
       <w:r>
-        <w:t xml:space="preserve">Spatial-block uncertainty and paired model contrasts are prespecified.</w:t>
+        <w:t xml:space="preserve">Spatial-block uncertainty and paired model contrasts are reported explicitly.</w:t>
       </w:r>
     </w:p>
     <w:p>
@@ -153,7 +153,7 @@
         </w:numPr>
       </w:pPr>
       <w:r>
-        <w:t xml:space="preserve">Four planning dimensions are reported without a weighted composite score.</w:t>
+        <w:t xml:space="preserve">High-confidence labels reveal near-zero measured change skill.</w:t>
       </w:r>
     </w:p>
     <w:p>
@@ -165,7 +165,7 @@
         </w:numPr>
       </w:pPr>
       <w:r>
-        <w:t xml:space="preserve">Public-data scenarios are stress tests, not statutory Abu Dhabi forecasts.</w:t>
+        <w:t xml:space="preserve">Planning outputs are scenario stress tests, not statutory Abu Dhabi forecasts.</w:t>
       </w:r>
     </w:p>
     <w:bookmarkEnd w:id="10"/>
@@ -217,7 +217,7 @@
         <w:pStyle w:val="BodyText"/>
       </w:pPr>
       <w:r>
-        <w:t xml:space="preserve">The main technical difficulty is not producing another categorical raster. It is keeping the semantics of a planning action separate from the learned transition tendency. A model may predict that a cell is likely to become built, yet the resulting map can still violate a water exclusion, miss the requested class totals or become inconsistent when the next year is simulated from the model’s own output. These failure modes are particularly important when the model is used to compare scenarios rather than to reproduce one observed transition. Latent-dynamics approaches such as GeoFM-LDN can represent continuous geospatial state and condition transitions on demand, whereas traditional ANN-plus-cellular-automata systems such as GeoSOS-FLUS combine suitability with explicit neighbourhood evolution. Neither design, by itself, guarantees that action semantics, hard constraints, state persistence and evidence provenance are visible at the same execution boundary.</w:t>
+        <w:t xml:space="preserve">The main technical difficulty is not producing another categorical raster. It is keeping the semantics of a planning action separate from the learned transition tendency. A model may predict that a cell is likely to become built, yet the resulting map can still violate a water exclusion, miss the requested class totals or become inconsistent when the next year is simulated from the model’s own output. These failure modes are particularly important when the model is used to compare scenarios rather than to reproduce one observed transition. Latent-dynamics approaches such as GeoFM-LDN can represent continuous geospatial state and condition transitions on demand, whereas traditional ANN-plus-cellular-automata systems combine suitability with explicit neighbourhood evolution. Neither design, by itself, guarantees that action semantics, hard constraints, state persistence and evidence provenance are visible at the same execution boundary.</w:t>
       </w:r>
     </w:p>
     <w:p>
@@ -241,7 +241,7 @@
         <w:pStyle w:val="BodyText"/>
       </w:pPr>
       <w:r>
-        <w:t xml:space="preserve">The paper makes three bounded contributions. First, it gives a concrete state–action–constraint formulation for using a geospatial kernel as an algorithmic core rather than as an opaque end-to-end predictor. Second, it reports a multi-horizon pipeline comparison with GeoSOS-FLUS and GeoFM-LDN, including a case in which the Kernel does not win, while making the input imbalance explicit. Third, it turns the future maps into explicit stress-test artefacts, including cumulative rasters and vectorized transition footprints, while preserving the distinction between public-data land cover and authoritative legal land use.</w:t>
+        <w:t xml:space="preserve">The paper makes three bounded contributions. First, it gives a concrete state–action–constraint formulation for using a geospatial kernel as an algorithmic core rather than as an opaque end-to-end predictor. Second, it defines an evaluation protocol that treats high-confidence subset failure as a primary result under noisy annual labels, rather than as a minor diagnostic. Third, it turns future maps into explicit stress-test artefacts, including cumulative rasters and vectorized transition footprints, while preserving the distinction between public-data land cover and authoritative legal land use.</w:t>
       </w:r>
     </w:p>
     <w:bookmarkEnd w:id="12"/>
@@ -1311,7 +1311,7 @@
         <w:pStyle w:val="FirstParagraph"/>
       </w:pPr>
       <w:r>
-        <w:t xml:space="preserve">GeoSOS-FLUS was run through the external FLUS console using seven continuous drivers: normalized row and column coordinates, elevation, slope, VIIRS radiance, distance to roads and distance to major roads. Its ANN suitability surface was passed to a cellular-automata allocation stage with the common class totals and public hard mask. The archived run used one 2021 training year, eight ANN hidden neurons, a 3 × 3 CA neighbourhood, neighbourhood strength 1.0, acceleration factor 0.1 and 1,000 iterations. Its frozen transition matrix protected water and wetland but did not prohibit built-to-non-built transitions; this configuration is recorded as a baseline limitation rather than a calibrated Abu Dhabi model. The supplied Mach-O executable cannot be traced to a reproducible upstream release or source commit, so we do not claim bitwise equivalence to the Liu et al. (2017) FLUS implementation.</w:t>
+        <w:t xml:space="preserve">The baseline was run through a FLUS-style ANN–CA console using seven continuous drivers: normalized row and column coordinates, elevation, slope, VIIRS radiance, distance to roads and distance to major roads. Its ANN suitability surface was passed to a cellular-automata allocation stage with the common class totals and public hard mask. The archived run used one 2021 training year, eight ANN hidden neurons, a 3 × 3 CA neighbourhood, neighbourhood strength 1.0, acceleration factor 0.1 and 1,000 iterations. Its frozen transition matrix protected water and wetland but did not prohibit built-to-non-built transitions. The supplied Mach-O executable cannot be traced to a reproducible upstream release or source commit, so we label this control “FLUS-style ANN–CA console (untraceable build)” and do not claim equivalence to the Liu et al. (2017) implementation. A matched 25-feature input attempt terminated with a segmentation fault in the supplied binary before producing a valid probability surface; it is retained as a documented build limitation, not as a completed matched-input comparison.</w:t>
       </w:r>
     </w:p>
     <w:p>
@@ -1421,7 +1421,7 @@
         <w:pStyle w:val="BodyText"/>
       </w:pPr>
       <w:r>
-        <w:t xml:space="preserve">The common evaluator computes actual class counts, normalized demand total variation, hard-mask violations, strict multi-class change FoM, binary change FoM, change F1, overall accuracy and macro-F1 for historical runs. The strict FoM counts a hit only when the predicted destination class equals the observed destination class; wrong destination changes are retained in the denominator. It also generates persistence and minimum-change zero controls, spatial-block bootstrap intervals and paired model-difference intervals for strict FoM, overall accuracy and macro-F1. For planning runs it additionally computes ecological conversion, new-built neighbourhood fraction, built component counts, built components per 1,000 valid pixels, a 500-m leapfrog rate, distances to roads and prior built cells, infrastructure proxy distance and built retirement. Pareto membership is calculated only over the frozen four-dimensional set of major-road distance, prior-built distance, built-component density and green-cell gain; the remaining quantities are reported as descriptive diagnostics.</w:t>
+        <w:t xml:space="preserve">The common evaluator computes actual class counts, normalized demand total variation, hard-mask violations, strict multi-class change FoM, binary change FoM, change F1, overall accuracy and macro-F1 for historical runs. The strict FoM counts a hit only when the predicted destination class equals the observed destination class; wrong destination changes are retained in the denominator. It also generates persistence and minimum-change zero controls, spatial-block bootstrap intervals and paired model-difference intervals for strict FoM, overall accuracy and macro-F1. For planning runs it additionally computes ecological conversion, new-built neighbourhood fraction, new-built component counts, all-built component counts, a 500-m leapfrog rate, distances to roads and prior built cells, infrastructure proxy distance and built retirement. Pareto membership is calculated within each scenario over four release objectives: major-road distance, prior-built distance, new-built component density and ecological conversion rate. Vegetation gain is a scenario input and remains descriptive, not an objective.</w:t>
       </w:r>
     </w:p>
     <w:bookmarkEnd w:id="17"/>
@@ -1469,7 +1469,7 @@
         <w:t xml:space="preserve"> </w:t>
       </w:r>
       <w:r>
-        <w:t xml:space="preserve">path identifier is retained only for artifact compatibility. Each action supplies feasible class totals for 2025–2031. The 2031 totals are an explicit extension of the previous annual difference and are not derived from an official population, housing or infrastructure forecast. Future exogenous rasters are held at their 2024 values. The green-priority action is not a water-budget model. Each candidate is run at seeds 31, 47 and 73, and planning tables report arithmetic means and population standard deviations. No p-values are reported because the three seeds describe computational variability, not independent field samples.</w:t>
+        <w:t xml:space="preserve">path identifier is retained only for artifact compatibility. Each action supplies feasible class totals for 2025–2031. The 2031 totals are an explicit extension of the previous annual difference and are not derived from an official population, housing or infrastructure forecast. Future exogenous rasters are held at their 2024 values. The green-priority action is not a water-budget model. Each candidate is run at seeds 31, 47 and 73, and planning tables report arithmetic means and population standard deviations. No p-values are reported because the three seeds describe computational variability, not independent field samples. The primary Pareto comparison is within each scenario, contrasting the three models under the same action; a global nine-candidate frontier is retained only as lineage. Sensitivity variants remove or add objective dimensions on the same released rasters. The objective set evolved through four review-driven revisions and was not preregistered: v1 mixed feasibility, action and outcome terms; v2 was not released; v3 used structurally problematic outcomes; and v4 still included scenario-supplied vegetation gain and all-built fragmentation. We therefore report v5 as a release objective set rather than a prespecified planning preference, and treat its sensitivity results as robustness diagnostics.</w:t>
       </w:r>
     </w:p>
     <w:bookmarkEnd w:id="18"/>
@@ -1517,7 +1517,7 @@
         <w:t xml:space="preserve"> </w:t>
       </w:r>
       <w:r>
-        <w:t xml:space="preserve">when source rasters, reports or vectors are absent; with the recovered local bundle, the input audit passed all alignment gates (with a Dynamic World label-noise warning) and the output audit passed 276 historical and planning predictions with zero failures. The vector layers preserve raster-cell geometry and should not be interpreted as cadastral parcels.</w:t>
+        <w:t xml:space="preserve">when source rasters, reports or vectors are absent; with the released public bundle, the input audit passed all alignment gates (with a Dynamic World label-noise warning) and the output audit passed 276 historical and planning predictions with zero failures. The vector layers preserve raster-cell geometry and should not be interpreted as cadastral parcels.</w:t>
       </w:r>
     </w:p>
     <w:bookmarkEnd w:id="19"/>
@@ -1553,7 +1553,7 @@
         <w:pStyle w:val="BodyText"/>
       </w:pPr>
       <w:r>
-        <w:t xml:space="preserve">The comparison shared the canonical grid, origin states, target actions, hard masks and evaluator, but the public-data run was not information-balanced. GeoSOS-FLUS used seven continuous drivers in its external ANN suitability model, whereas Geospatial Kernel used 25 features including current-class indicators and neighbourhood proportions; GeoFM-LDN used AlphaEarth latent embeddings and the Kernel allocator. We therefore report an unmatched-input pipeline comparison, not evidence that one learner is intrinsically superior. A matched-input FLUS rerun remains necessary for a model-level comparison. The archived FLUS console is a Mach-O arm64 executable whose original source/version cannot be independently rebuilt from this release, so FLUS results are bounded to the supplied Apple-Silicon binary and are not asserted to be bitwise equivalent to an upstream Liu et al. build. All models used seeds 31, 47 and 73.</w:t>
+        <w:t xml:space="preserve">The comparison shared the canonical grid, origin states, target actions, hard masks and evaluator, but the public-data run was not information-balanced. The FLUS-style control used seven continuous drivers in its external ANN suitability model, whereas Geospatial Kernel used 25 features including current-class indicators and neighbourhood proportions; GeoFM-LDN used AlphaEarth latent embeddings and the Kernel allocator. We therefore report an unmatched-input pipeline comparison, not evidence that one learner is intrinsically superior. The archived FLUS console is a Mach-O arm64 executable whose original source/version cannot be independently rebuilt from this release, so its results are bounded to the supplied Apple-Silicon binary and are not asserted to be bitwise equivalent to an upstream build. All models used seeds 31, 47 and 73.</w:t>
       </w:r>
     </w:p>
     <w:p>
@@ -1627,7 +1627,7 @@
         <w:t xml:space="preserve"> </w:t>
       </w:r>
       <w:r>
-        <w:t xml:space="preserve">minimum-change allocation are prespecified controls.</w:t>
+        <w:t xml:space="preserve">minimum-change allocation are explicit zero-model controls.</w:t>
       </w:r>
     </w:p>
     <w:p>
@@ -1641,85 +1641,103 @@
         <w:t xml:space="preserve"> </w:t>
       </w:r>
       <w:r>
-        <w:t xml:space="preserve">synthetic class-count actions through 2031. Before this recompilation, the</w:t>
-      </w:r>
-      <w:r>
-        <w:t xml:space="preserve"> </w:t>
-      </w:r>
-      <w:r>
-        <w:t xml:space="preserve">objective set was frozen to four non-redundant dimensions: mean distance of new</w:t>
-      </w:r>
-      <w:r>
-        <w:t xml:space="preserve"> </w:t>
-      </w:r>
-      <w:r>
-        <w:t xml:space="preserve">built cells to major roads (accessibility proxy), mean distance to pre-existing</w:t>
-      </w:r>
-      <w:r>
-        <w:t xml:space="preserve"> </w:t>
-      </w:r>
-      <w:r>
-        <w:t xml:space="preserve">built cells (compactness proxy), built components per 1,000 valid cells</w:t>
-      </w:r>
-      <w:r>
-        <w:t xml:space="preserve"> </w:t>
-      </w:r>
-      <w:r>
-        <w:t xml:space="preserve">(fragmentation) and green-cell gain (vegetation-balance direction). Ecological</w:t>
-      </w:r>
-      <w:r>
-        <w:t xml:space="preserve"> </w:t>
-      </w:r>
-      <w:r>
-        <w:t xml:space="preserve">conversion, 500-m leapfrog rate, built retirement and demand error remain</w:t>
-      </w:r>
-      <w:r>
-        <w:t xml:space="preserve"> </w:t>
-      </w:r>
-      <w:r>
-        <w:t xml:space="preserve">descriptive diagnostics because the exact-count projection makes some of them</w:t>
-      </w:r>
-      <w:r>
-        <w:t xml:space="preserve"> </w:t>
-      </w:r>
-      <w:r>
-        <w:t xml:space="preserve">structural zeros or unstable across models. No weighted composite score is used.</w:t>
-      </w:r>
-      <w:r>
-        <w:t xml:space="preserve"> </w:t>
-      </w:r>
-      <w:r>
-        <w:t xml:space="preserve">The choice follows a transparent planning logic: accessibility and proximity to</w:t>
-      </w:r>
-      <w:r>
-        <w:t xml:space="preserve"> </w:t>
-      </w:r>
-      <w:r>
-        <w:t xml:space="preserve">existing development represent infrastructure-efficient urban form, component</w:t>
-      </w:r>
-      <w:r>
-        <w:t xml:space="preserve"> </w:t>
-      </w:r>
-      <w:r>
-        <w:t xml:space="preserve">density penalizes spatial fragmentation, and the opposing vegetation-gain</w:t>
-      </w:r>
-      <w:r>
-        <w:t xml:space="preserve"> </w:t>
-      </w:r>
-      <w:r>
-        <w:t xml:space="preserve">direction prevents a compactness-only objective from defining the frontier.</w:t>
-      </w:r>
-      <w:r>
-        <w:t xml:space="preserve"> </w:t>
-      </w:r>
-      <w:r>
-        <w:t xml:space="preserve">These are measurable public-data proxies rather than claims about welfare,</w:t>
-      </w:r>
-      <w:r>
-        <w:t xml:space="preserve"> </w:t>
-      </w:r>
-      <w:r>
-        <w:t xml:space="preserve">equity or statutory zoning.</w:t>
+        <w:t xml:space="preserve">synthetic class-count actions through 2031. The release objective set is version</w:t>
+      </w:r>
+      <w:r>
+        <w:t xml:space="preserve"> </w:t>
+      </w:r>
+      <w:r>
+        <w:t xml:space="preserve">5. It uses mean distance of new built cells to major roads, mean distance to</w:t>
+      </w:r>
+      <w:r>
+        <w:t xml:space="preserve"> </w:t>
+      </w:r>
+      <w:r>
+        <w:t xml:space="preserve">pre-existing built cells, connected components formed by newly built cells per</w:t>
+      </w:r>
+      <w:r>
+        <w:t xml:space="preserve"> </w:t>
+      </w:r>
+      <w:r>
+        <w:t xml:space="preserve">1,000 valid cells and ecological conversion rate. All four are public-data</w:t>
+      </w:r>
+      <w:r>
+        <w:t xml:space="preserve"> </w:t>
+      </w:r>
+      <w:r>
+        <w:t xml:space="preserve">proxies. Vegetation gain is excluded because it is supplied directly by the</w:t>
+      </w:r>
+      <w:r>
+        <w:t xml:space="preserve"> </w:t>
+      </w:r>
+      <w:r>
+        <w:t xml:space="preserve">scenario action, and all-built component density is reported only as a</w:t>
+      </w:r>
+      <w:r>
+        <w:t xml:space="preserve"> </w:t>
+      </w:r>
+      <w:r>
+        <w:t xml:space="preserve">diagnostic because it can be changed by built-cell retirement. No weighted</w:t>
+      </w:r>
+      <w:r>
+        <w:t xml:space="preserve"> </w:t>
+      </w:r>
+      <w:r>
+        <w:t xml:space="preserve">composite score is used. Because the objective set changed across the four</w:t>
+      </w:r>
+      <w:r>
+        <w:t xml:space="preserve"> </w:t>
+      </w:r>
+      <w:r>
+        <w:t xml:space="preserve">review rounds, we disclose the lineage: v1 included seven access, ecological,</w:t>
+      </w:r>
+      <w:r>
+        <w:t xml:space="preserve"> </w:t>
+      </w:r>
+      <w:r>
+        <w:t xml:space="preserve">neighbourhood and gain terms; v2 proposed roads, prior-built distance,</w:t>
+      </w:r>
+      <w:r>
+        <w:t xml:space="preserve"> </w:t>
+      </w:r>
+      <w:r>
+        <w:t xml:space="preserve">fragmentation and leapfrog rate but was not run; v3 used ecological conversion,</w:t>
+      </w:r>
+      <w:r>
+        <w:t xml:space="preserve"> </w:t>
+      </w:r>
+      <w:r>
+        <w:t xml:space="preserve">roads, leapfrog rate and built retirement; and v4 combined roads, prior-built</w:t>
+      </w:r>
+      <w:r>
+        <w:t xml:space="preserve"> </w:t>
+      </w:r>
+      <w:r>
+        <w:t xml:space="preserve">distance, all-built fragmentation and vegetation gain. The current release</w:t>
+      </w:r>
+      <w:r>
+        <w:t xml:space="preserve"> </w:t>
+      </w:r>
+      <w:r>
+        <w:t xml:space="preserve">replaces v4 after the review identified scenario-input leakage and retirement</w:t>
+      </w:r>
+      <w:r>
+        <w:t xml:space="preserve"> </w:t>
+      </w:r>
+      <w:r>
+        <w:t xml:space="preserve">confounding. Sensitivity sets are recomputed on the same rasters and reported as</w:t>
+      </w:r>
+      <w:r>
+        <w:t xml:space="preserve"> </w:t>
+      </w:r>
+      <w:r>
+        <w:t xml:space="preserve">robustness analyses, not as additional preregistered claims. These are measurable</w:t>
+      </w:r>
+      <w:r>
+        <w:t xml:space="preserve"> </w:t>
+      </w:r>
+      <w:r>
+        <w:t xml:space="preserve">public-data proxies rather than claims about welfare, equity or statutory zoning.</w:t>
       </w:r>
     </w:p>
     <w:p>
@@ -1727,7 +1745,7 @@
         <w:pStyle w:val="BodyText"/>
       </w:pPr>
       <w:r>
-        <w:t xml:space="preserve">The recovered public-data bundle supports a complete re-scoring of the frozen</w:t>
+        <w:t xml:space="preserve">The recovered public-data bundle supports a complete re-scoring of the current</w:t>
       </w:r>
       <w:r>
         <w:t xml:space="preserve"> </w:t>
@@ -1739,19 +1757,19 @@
         <w:t xml:space="preserve"> </w:t>
       </w:r>
       <w:r>
-        <w:t xml:space="preserve">strict multi-class transition FoM (mean across three seeds) was 0.1256, 0.1961</w:t>
-      </w:r>
-      <w:r>
-        <w:t xml:space="preserve"> </w:t>
-      </w:r>
-      <w:r>
-        <w:t xml:space="preserve">and 0.1619 for GeoSOS-FLUS, Geospatial Kernel and GeoFM-LDN in 2023, and</w:t>
-      </w:r>
-      <w:r>
-        <w:t xml:space="preserve"> </w:t>
-      </w:r>
-      <w:r>
-        <w:t xml:space="preserve">0.1782, 0.2529 and 0.2708 in 2024, respectively. Under this unmatched</w:t>
+        <w:t xml:space="preserve">strict multi-class transition FoM (mean across three seeds) was 0.1256, 0.1950</w:t>
+      </w:r>
+      <w:r>
+        <w:t xml:space="preserve"> </w:t>
+      </w:r>
+      <w:r>
+        <w:t xml:space="preserve">and 0.1616 for the FLUS-style console, Geospatial Kernel and GeoFM-LDN in 2023,</w:t>
+      </w:r>
+      <w:r>
+        <w:t xml:space="preserve"> </w:t>
+      </w:r>
+      <w:r>
+        <w:t xml:space="preserve">and 0.1782, 0.2520 and 0.2708 in 2024, respectively. Under this unmatched</w:t>
       </w:r>
       <w:r>
         <w:t xml:space="preserve"> </w:t>
@@ -1811,7 +1829,7 @@
         <w:t xml:space="preserve"> </w:t>
       </w:r>
       <w:r>
-        <w:t xml:space="preserve">minimum-change are prespecified controls rather than learned models.</w:t>
+        <w:t xml:space="preserve">minimum-change are explicit zero-model controls rather than learned models.</w:t>
       </w:r>
     </w:p>
     <w:tbl>
@@ -1853,7 +1871,7 @@
               <w:jc w:val="right"/>
             </w:pPr>
             <w:r>
-              <w:t xml:space="preserve">GeoSOS-FLUS</w:t>
+              <w:t xml:space="preserve">FLUS-style ANN–CA</w:t>
             </w:r>
           </w:p>
         </w:tc>
@@ -1943,7 +1961,7 @@
                 <w:b/>
                 <w:bCs/>
               </w:rPr>
-              <w:t xml:space="preserve">0.1961</w:t>
+              <w:t xml:space="preserve">0.1950</w:t>
             </w:r>
           </w:p>
         </w:tc>
@@ -1955,7 +1973,7 @@
               <w:jc w:val="right"/>
             </w:pPr>
             <w:r>
-              <w:t xml:space="preserve">0.1619</w:t>
+              <w:t xml:space="preserve">0.1616</w:t>
             </w:r>
           </w:p>
         </w:tc>
@@ -2017,7 +2035,7 @@
               <w:jc w:val="right"/>
             </w:pPr>
             <w:r>
-              <w:t xml:space="preserve">0.2529</w:t>
+              <w:t xml:space="preserve">0.2520</w:t>
             </w:r>
           </w:p>
         </w:tc>
@@ -2074,19 +2092,19 @@
         <w:t xml:space="preserve"> </w:t>
       </w:r>
       <w:r>
-        <w:t xml:space="preserve">Kernel minus FLUS was 0.0703 [0.0558, 0.0866] and GeoFM-LDN minus Kernel was</w:t>
-      </w:r>
-      <w:r>
-        <w:t xml:space="preserve"> </w:t>
-      </w:r>
-      <w:r>
-        <w:t xml:space="preserve">−0.0341 [−0.0479, −0.0209]. For 2024, GeoFM-LDN minus Kernel was 0.0177</w:t>
-      </w:r>
-      <w:r>
-        <w:t xml:space="preserve"> </w:t>
-      </w:r>
-      <w:r>
-        <w:t xml:space="preserve">[0.0033, 0.0314]. These are conditional pipeline contrasts on public labels,</w:t>
+        <w:t xml:space="preserve">Kernel minus the FLUS-style control was 0.0692 [0.0546, 0.0859] and GeoFM-LDN</w:t>
+      </w:r>
+      <w:r>
+        <w:t xml:space="preserve"> </w:t>
+      </w:r>
+      <w:r>
+        <w:t xml:space="preserve">minus Kernel was −0.0333 [−0.0478, −0.0201]. For 2024, GeoFM-LDN minus Kernel</w:t>
+      </w:r>
+      <w:r>
+        <w:t xml:space="preserve"> </w:t>
+      </w:r>
+      <w:r>
+        <w:t xml:space="preserve">was 0.0184 [0.0046, 0.0321]. These are conditional pipeline contrasts on public labels,</w:t>
       </w:r>
       <w:r>
         <w:t xml:space="preserve"> </w:t>
@@ -2154,7 +2172,7 @@
         <w:t xml:space="preserve"> </w:t>
       </w:r>
       <w:r>
-        <w:t xml:space="preserve">for GeoSOS-FLUS, 0.005 for Geospatial Kernel and 0.019 for GeoFM-LDN. This is</w:t>
+        <w:t xml:space="preserve">for the FLUS-style console, 0.005 for Geospatial Kernel and 0.019 for GeoFM-LDN. This is</w:t>
       </w:r>
       <w:r>
         <w:t xml:space="preserve"> </w:t>
@@ -2210,123 +2228,1079 @@
         <w:pStyle w:val="BodyText"/>
       </w:pPr>
       <w:r>
-        <w:t xml:space="preserve">The planning compiler evaluated all nine model–scenario candidates under the</w:t>
-      </w:r>
-      <w:r>
-        <w:t xml:space="preserve"> </w:t>
-      </w:r>
-      <w:r>
-        <w:t xml:space="preserve">frozen balanced objective set. Six candidates—each GeoSOS-FLUS scenario and</w:t>
-      </w:r>
-      <w:r>
-        <w:t xml:space="preserve"> </w:t>
-      </w:r>
-      <w:r>
-        <w:t xml:space="preserve">each Geospatial Kernel scenario—were non-dominated; no GeoFM-LDN candidate was</w:t>
-      </w:r>
-      <w:r>
-        <w:t xml:space="preserve"> </w:t>
-      </w:r>
-      <w:r>
-        <w:t xml:space="preserve">on this conditional frontier. The result should not be read as a model ranking:</w:t>
-      </w:r>
-      <w:r>
-        <w:t xml:space="preserve"> </w:t>
-      </w:r>
-      <w:r>
-        <w:t xml:space="preserve">the frontier is sensitive to public proxy layers, synthetic actions and the</w:t>
-      </w:r>
-      <w:r>
-        <w:t xml:space="preserve"> </w:t>
-      </w:r>
-      <w:r>
-        <w:t xml:space="preserve">declared directions. Geospatial Kernel had lower mean distances to roads and</w:t>
-      </w:r>
-      <w:r>
-        <w:t xml:space="preserve"> </w:t>
-      </w:r>
-      <w:r>
-        <w:t xml:space="preserve">prior built cells than the other candidates, but its built-component density was</w:t>
-      </w:r>
-      <w:r>
-        <w:t xml:space="preserve"> </w:t>
-      </w:r>
-      <w:r>
-        <w:t xml:space="preserve">2.92–4.28 per 1,000 valid cells, compared with 0.92–1.23 for GeoSOS-FLUS and</w:t>
-      </w:r>
-      <w:r>
-        <w:t xml:space="preserve"> </w:t>
-      </w:r>
-      <w:r>
-        <w:t xml:space="preserve">3.21–4.35 for GeoFM-LDN. This fragmentation disadvantage is retained rather</w:t>
-      </w:r>
-      <w:r>
-        <w:t xml:space="preserve"> </w:t>
-      </w:r>
-      <w:r>
-        <w:t xml:space="preserve">than hidden by the objective set (Fig. 3). The 2031 majority-vote ensemble L1 demand</w:t>
-      </w:r>
-      <w:r>
-        <w:t xml:space="preserve"> </w:t>
-      </w:r>
-      <w:r>
-        <w:t xml:space="preserve">errors were 8, 44 and 42 pixels for Geospatial Kernel’s moderate, green-priority</w:t>
-      </w:r>
-      <w:r>
-        <w:t xml:space="preserve"> </w:t>
-      </w:r>
-      <w:r>
-        <w:t xml:space="preserve">and high-outward scenarios, respectively; the corresponding GeoFM-LDN errors</w:t>
-      </w:r>
-      <w:r>
-        <w:t xml:space="preserve"> </w:t>
-      </w:r>
-      <w:r>
-        <w:t xml:space="preserve">were 1,580, 1,524 and 1,148 pixels and GeoSOS-FLUS errors were 2,504, 2,888</w:t>
-      </w:r>
-      <w:r>
-        <w:t xml:space="preserve"> </w:t>
-      </w:r>
-      <w:r>
-        <w:t xml:space="preserve">and 2,568 pixels. Seed-level projections meet their feasible class totals, but</w:t>
-      </w:r>
-      <w:r>
-        <w:t xml:space="preserve"> </w:t>
-      </w:r>
-      <w:r>
-        <w:t xml:space="preserve">majority voting can produce a different raster and therefore a non-zero ensemble</w:t>
-      </w:r>
-      <w:r>
-        <w:t xml:space="preserve"> </w:t>
-      </w:r>
-      <w:r>
-        <w:t xml:space="preserve">error. All 276 historical and planning prediction records passed the raster</w:t>
-      </w:r>
-      <w:r>
-        <w:t xml:space="preserve"> </w:t>
-      </w:r>
-      <w:r>
-        <w:t xml:space="preserve">audit, including grid alignment, class validity, outside-mask cleanliness and</w:t>
-      </w:r>
-      <w:r>
-        <w:t xml:space="preserve"> </w:t>
-      </w:r>
-      <w:r>
-        <w:t xml:space="preserve">hard-exclusion checks. The resulting 2031 ensemble rasters and their dissolved</w:t>
-      </w:r>
-      <w:r>
-        <w:t xml:space="preserve"> </w:t>
-      </w:r>
-      <w:r>
-        <w:t xml:space="preserve">cell-change footprints are shown in Fig. 5; they are scenario-conditioned</w:t>
-      </w:r>
-      <w:r>
-        <w:t xml:space="preserve"> </w:t>
-      </w:r>
-      <w:r>
-        <w:t xml:space="preserve">land-cover maps, not parcel boundaries or statutory zoning maps.</w:t>
-      </w:r>
-    </w:p>
+        <w:t xml:space="preserve">The reference reproduction environment is macOS arm64 with Python 3.11 and</w:t>
+      </w:r>
+      <w:r>
+        <w:t xml:space="preserve"> </w:t>
+      </w:r>
+      <w:r>
+        <w:t xml:space="preserve">scikit-learn 1.9.0. A Windows rerun with the same source and inputs produced</w:t>
+      </w:r>
+      <w:r>
+        <w:t xml:space="preserve"> </w:t>
+      </w:r>
+      <w:r>
+        <w:t xml:space="preserve">approximately 498–592 differing cells per seed in 2023 and 1,005–1,147 in 2024,</w:t>
+      </w:r>
+      <w:r>
+        <w:t xml:space="preserve"> </w:t>
+      </w:r>
+      <w:r>
+        <w:t xml:space="preserve">or about 1% of the valid grid, with strict FoM differences of roughly 0.001.</w:t>
+      </w:r>
+      <w:r>
+        <w:t xml:space="preserve"> </w:t>
+      </w:r>
+      <w:r>
+        <w:t xml:space="preserve">The paired spatial-block intervals above are much wider than this platform</w:t>
+      </w:r>
+      <w:r>
+        <w:t xml:space="preserve"> </w:t>
+      </w:r>
+      <w:r>
+        <w:t xml:space="preserve">effect and preserve the same model ordering. The manifest therefore supports</w:t>
+      </w:r>
+      <w:r>
+        <w:t xml:space="preserve"> </w:t>
+      </w:r>
+      <w:r>
+        <w:t xml:space="preserve">cross-platform verification of declared files, but not a claim of bitwise</w:t>
+      </w:r>
+      <w:r>
+        <w:t xml:space="preserve"> </w:t>
+      </w:r>
+      <w:r>
+        <w:t xml:space="preserve">identity for floating-point learner outputs.</w:t>
+      </w:r>
+    </w:p>
+    <w:p>
+      <w:pPr>
+        <w:pStyle w:val="BodyText"/>
+      </w:pPr>
+      <w:r>
+        <w:t xml:space="preserve">The planning compiler compares the three models within each of the three</w:t>
+      </w:r>
+      <w:r>
+        <w:t xml:space="preserve"> </w:t>
+      </w:r>
+      <w:r>
+        <w:t xml:space="preserve">scenarios. At 2031, the FLUS-style control has new-built component densities of</w:t>
+      </w:r>
+      <w:r>
+        <w:t xml:space="preserve"> </w:t>
+      </w:r>
+      <w:r>
+        <w:t xml:space="preserve">4.24–4.67 per 1,000 valid cells, the Kernel 2.97–5.62 and GeoFM-LDN 5.08–6.56.</w:t>
+      </w:r>
+      <w:r>
+        <w:t xml:space="preserve"> </w:t>
+      </w:r>
+      <w:r>
+        <w:t xml:space="preserve">The Kernel is closer to major roads and prior built cells, whereas its</w:t>
+      </w:r>
+      <w:r>
+        <w:t xml:space="preserve"> </w:t>
+      </w:r>
+      <w:r>
+        <w:t xml:space="preserve">fragmentation penalty remains visible. Under the release objective set, the</w:t>
+      </w:r>
+      <w:r>
+        <w:t xml:space="preserve"> </w:t>
+      </w:r>
+      <w:r>
+        <w:t xml:space="preserve">within-scenario frontiers contain FLUS-style and Kernel candidates in all three</w:t>
+      </w:r>
+      <w:r>
+        <w:t xml:space="preserve"> </w:t>
+      </w:r>
+      <w:r>
+        <w:t xml:space="preserve">scenarios; the GeoFM-LDN candidate is additionally non-dominated in the</w:t>
+      </w:r>
+      <w:r>
+        <w:t xml:space="preserve"> </w:t>
+      </w:r>
+      <w:r>
+        <w:t xml:space="preserve">ecological-priority scenario. All sensitivity variants retain the FLUS-style/</w:t>
+      </w:r>
+      <w:r>
+        <w:t xml:space="preserve"> </w:t>
+      </w:r>
+      <w:r>
+        <w:t xml:space="preserve">Kernel two-model structure; GeoFM-LDN remains additionally non-dominated for</w:t>
+      </w:r>
+      <w:r>
+        <w:t xml:space="preserve"> </w:t>
+      </w:r>
+      <w:r>
+        <w:t xml:space="preserve">ecological-priority growth in the two variants that retain ecological</w:t>
+      </w:r>
+      <w:r>
+        <w:t xml:space="preserve"> </w:t>
+      </w:r>
+      <w:r>
+        <w:t xml:space="preserve">conversion, but not when that objective is omitted. These statements are conditional</w:t>
+      </w:r>
+      <w:r>
+        <w:t xml:space="preserve"> </w:t>
+      </w:r>
+      <w:r>
+        <w:t xml:space="preserve">on public proxy layers and synthetic actions, not model superiority claims.</w:t>
+      </w:r>
+      <w:r>
+        <w:t xml:space="preserve"> </w:t>
+      </w:r>
+      <w:r>
+        <w:t xml:space="preserve">The 2031 majority-vote ensemble L1 demand errors were 8, 44 and 42 pixels for</w:t>
+      </w:r>
+      <w:r>
+        <w:t xml:space="preserve"> </w:t>
+      </w:r>
+      <w:r>
+        <w:t xml:space="preserve">the Kernel’s moderate, green-priority and high-outward scenarios, respectively;</w:t>
+      </w:r>
+      <w:r>
+        <w:t xml:space="preserve"> </w:t>
+      </w:r>
+      <w:r>
+        <w:t xml:space="preserve">the corresponding GeoFM-LDN errors were 1,580, 1,524 and 1,148 pixels and the</w:t>
+      </w:r>
+      <w:r>
+        <w:t xml:space="preserve"> </w:t>
+      </w:r>
+      <w:r>
+        <w:t xml:space="preserve">FLUS-style errors were 2,504, 2,888 and 2,568 pixels. Seed-level projections</w:t>
+      </w:r>
+      <w:r>
+        <w:t xml:space="preserve"> </w:t>
+      </w:r>
+      <w:r>
+        <w:t xml:space="preserve">meet their feasible class totals, but majority voting can produce a different</w:t>
+      </w:r>
+      <w:r>
+        <w:t xml:space="preserve"> </w:t>
+      </w:r>
+      <w:r>
+        <w:t xml:space="preserve">raster and therefore a non-zero ensemble error. All 276 historical and planning</w:t>
+      </w:r>
+      <w:r>
+        <w:t xml:space="preserve"> </w:t>
+      </w:r>
+      <w:r>
+        <w:t xml:space="preserve">prediction records passed the raster audit. The resulting 2031 ensemble rasters</w:t>
+      </w:r>
+      <w:r>
+        <w:t xml:space="preserve"> </w:t>
+      </w:r>
+      <w:r>
+        <w:t xml:space="preserve">and their dissolved cell-change footprints are shown in Fig. 5; they are</w:t>
+      </w:r>
+      <w:r>
+        <w:t xml:space="preserve"> </w:t>
+      </w:r>
+      <w:r>
+        <w:t xml:space="preserve">scenario-conditioned land-cover maps, not parcel boundaries or statutory zoning</w:t>
+      </w:r>
+      <w:r>
+        <w:t xml:space="preserve"> </w:t>
+      </w:r>
+      <w:r>
+        <w:t xml:space="preserve">maps.</w:t>
+      </w:r>
+    </w:p>
+    <w:p>
+      <w:pPr>
+        <w:pStyle w:val="BodyText"/>
+      </w:pPr>
+      <w:r>
+        <w:rPr>
+          <w:b/>
+          <w:bCs/>
+        </w:rPr>
+        <w:t xml:space="preserve">Table 2 | 2031 within-scenario planning objectives.</w:t>
+      </w:r>
+      <w:r>
+        <w:t xml:space="preserve"> </w:t>
+      </w:r>
+      <w:r>
+        <w:t xml:space="preserve">Values are means across</w:t>
+      </w:r>
+      <w:r>
+        <w:t xml:space="preserve"> </w:t>
+      </w:r>
+      <w:r>
+        <w:t xml:space="preserve">three seeds. Distances are metres, component density is connected new-built</w:t>
+      </w:r>
+      <w:r>
+        <w:t xml:space="preserve"> </w:t>
+      </w:r>
+      <w:r>
+        <w:t xml:space="preserve">components per 1,000 valid cells, and ecological conversion is the fraction of</w:t>
+      </w:r>
+      <w:r>
+        <w:t xml:space="preserve"> </w:t>
+      </w:r>
+      <w:r>
+        <w:t xml:space="preserve">new-built cells whose origin class was woody, low vegetation or wetland. A star</w:t>
+      </w:r>
+      <w:r>
+        <w:t xml:space="preserve"> </w:t>
+      </w:r>
+      <w:r>
+        <w:t xml:space="preserve">denotes membership in the primary within-scenario Pareto frontier.</w:t>
+      </w:r>
+    </w:p>
+    <w:tbl>
+      <w:tblPr>
+        <w:tblStyle w:val="Table"/>
+        <w:tblW w:type="pct" w:w="5000"/>
+        <w:tblLayout w:type="fixed"/>
+        <w:tblLook w:firstRow="1" w:lastRow="0" w:firstColumn="0" w:lastColumn="0" w:noHBand="0" w:noVBand="0" w:val="0020"/>
+      </w:tblPr>
+      <w:tblGrid>
+        <w:gridCol w:w="880"/>
+        <w:gridCol w:w="880"/>
+        <w:gridCol w:w="1173"/>
+        <w:gridCol w:w="1173"/>
+        <w:gridCol w:w="1173"/>
+        <w:gridCol w:w="1173"/>
+        <w:gridCol w:w="1466"/>
+      </w:tblGrid>
+      <w:tr>
+        <w:trPr>
+          <w:tblHeader w:val="on"/>
+        </w:trPr>
+        <w:tc>
+          <w:tcPr/>
+          <w:p>
+            <w:pPr>
+              <w:pStyle w:val="Compact"/>
+            </w:pPr>
+            <w:r>
+              <w:t xml:space="preserve">Model</w:t>
+            </w:r>
+          </w:p>
+        </w:tc>
+        <w:tc>
+          <w:tcPr/>
+          <w:p>
+            <w:pPr>
+              <w:pStyle w:val="Compact"/>
+            </w:pPr>
+            <w:r>
+              <w:t xml:space="preserve">Scenario</w:t>
+            </w:r>
+          </w:p>
+        </w:tc>
+        <w:tc>
+          <w:tcPr/>
+          <w:p>
+            <w:pPr>
+              <w:pStyle w:val="Compact"/>
+              <w:jc w:val="right"/>
+            </w:pPr>
+            <w:r>
+              <w:t xml:space="preserve">Major-road distance</w:t>
+            </w:r>
+          </w:p>
+        </w:tc>
+        <w:tc>
+          <w:tcPr/>
+          <w:p>
+            <w:pPr>
+              <w:pStyle w:val="Compact"/>
+              <w:jc w:val="right"/>
+            </w:pPr>
+            <w:r>
+              <w:t xml:space="preserve">Prior-built distance</w:t>
+            </w:r>
+          </w:p>
+        </w:tc>
+        <w:tc>
+          <w:tcPr/>
+          <w:p>
+            <w:pPr>
+              <w:pStyle w:val="Compact"/>
+              <w:jc w:val="right"/>
+            </w:pPr>
+            <w:r>
+              <w:t xml:space="preserve">New-built components/1,000</w:t>
+            </w:r>
+          </w:p>
+        </w:tc>
+        <w:tc>
+          <w:tcPr/>
+          <w:p>
+            <w:pPr>
+              <w:pStyle w:val="Compact"/>
+              <w:jc w:val="right"/>
+            </w:pPr>
+            <w:r>
+              <w:t xml:space="preserve">Ecological conversion</w:t>
+            </w:r>
+          </w:p>
+        </w:tc>
+        <w:tc>
+          <w:tcPr/>
+          <w:p>
+            <w:pPr>
+              <w:pStyle w:val="Compact"/>
+              <w:jc w:val="center"/>
+            </w:pPr>
+            <w:r>
+              <w:t xml:space="preserve">Frontier</w:t>
+            </w:r>
+          </w:p>
+        </w:tc>
+      </w:tr>
+      <w:tr>
+        <w:tc>
+          <w:tcPr/>
+          <w:p>
+            <w:pPr>
+              <w:pStyle w:val="Compact"/>
+            </w:pPr>
+            <w:r>
+              <w:t xml:space="preserve">FLUS-style ANN–CA</w:t>
+            </w:r>
+          </w:p>
+        </w:tc>
+        <w:tc>
+          <w:tcPr/>
+          <w:p>
+            <w:pPr>
+              <w:pStyle w:val="Compact"/>
+            </w:pPr>
+            <w:r>
+              <w:t xml:space="preserve">Moderate</w:t>
+            </w:r>
+          </w:p>
+        </w:tc>
+        <w:tc>
+          <w:tcPr/>
+          <w:p>
+            <w:pPr>
+              <w:pStyle w:val="Compact"/>
+              <w:jc w:val="right"/>
+            </w:pPr>
+            <w:r>
+              <w:t xml:space="preserve">446.1</w:t>
+            </w:r>
+          </w:p>
+        </w:tc>
+        <w:tc>
+          <w:tcPr/>
+          <w:p>
+            <w:pPr>
+              <w:pStyle w:val="Compact"/>
+              <w:jc w:val="right"/>
+            </w:pPr>
+            <w:r>
+              <w:t xml:space="preserve">231.6</w:t>
+            </w:r>
+          </w:p>
+        </w:tc>
+        <w:tc>
+          <w:tcPr/>
+          <w:p>
+            <w:pPr>
+              <w:pStyle w:val="Compact"/>
+              <w:jc w:val="right"/>
+            </w:pPr>
+            <w:r>
+              <w:t xml:space="preserve">4.666</w:t>
+            </w:r>
+          </w:p>
+        </w:tc>
+        <w:tc>
+          <w:tcPr/>
+          <w:p>
+            <w:pPr>
+              <w:pStyle w:val="Compact"/>
+              <w:jc w:val="right"/>
+            </w:pPr>
+            <w:r>
+              <w:t xml:space="preserve">0.0168</w:t>
+            </w:r>
+          </w:p>
+        </w:tc>
+        <w:tc>
+          <w:tcPr/>
+          <w:p>
+            <w:pPr>
+              <w:pStyle w:val="Compact"/>
+              <w:jc w:val="center"/>
+            </w:pPr>
+            <w:r>
+              <w:t xml:space="preserve">*</w:t>
+            </w:r>
+          </w:p>
+        </w:tc>
+      </w:tr>
+      <w:tr>
+        <w:tc>
+          <w:tcPr/>
+          <w:p>
+            <w:pPr>
+              <w:pStyle w:val="Compact"/>
+            </w:pPr>
+            <w:r>
+              <w:t xml:space="preserve">Geospatial Kernel</w:t>
+            </w:r>
+          </w:p>
+        </w:tc>
+        <w:tc>
+          <w:tcPr/>
+          <w:p>
+            <w:pPr>
+              <w:pStyle w:val="Compact"/>
+            </w:pPr>
+            <w:r>
+              <w:t xml:space="preserve">Moderate</w:t>
+            </w:r>
+          </w:p>
+        </w:tc>
+        <w:tc>
+          <w:tcPr/>
+          <w:p>
+            <w:pPr>
+              <w:pStyle w:val="Compact"/>
+              <w:jc w:val="right"/>
+            </w:pPr>
+            <w:r>
+              <w:t xml:space="preserve">336.7</w:t>
+            </w:r>
+          </w:p>
+        </w:tc>
+        <w:tc>
+          <w:tcPr/>
+          <w:p>
+            <w:pPr>
+              <w:pStyle w:val="Compact"/>
+              <w:jc w:val="right"/>
+            </w:pPr>
+            <w:r>
+              <w:t xml:space="preserve">117.4</w:t>
+            </w:r>
+          </w:p>
+        </w:tc>
+        <w:tc>
+          <w:tcPr/>
+          <w:p>
+            <w:pPr>
+              <w:pStyle w:val="Compact"/>
+              <w:jc w:val="right"/>
+            </w:pPr>
+            <w:r>
+              <w:t xml:space="preserve">5.619</w:t>
+            </w:r>
+          </w:p>
+        </w:tc>
+        <w:tc>
+          <w:tcPr/>
+          <w:p>
+            <w:pPr>
+              <w:pStyle w:val="Compact"/>
+              <w:jc w:val="right"/>
+            </w:pPr>
+            <w:r>
+              <w:t xml:space="preserve">0.0000</w:t>
+            </w:r>
+          </w:p>
+        </w:tc>
+        <w:tc>
+          <w:tcPr/>
+          <w:p>
+            <w:pPr>
+              <w:pStyle w:val="Compact"/>
+              <w:jc w:val="center"/>
+            </w:pPr>
+            <w:r>
+              <w:t xml:space="preserve">*</w:t>
+            </w:r>
+          </w:p>
+        </w:tc>
+      </w:tr>
+      <w:tr>
+        <w:tc>
+          <w:tcPr/>
+          <w:p>
+            <w:pPr>
+              <w:pStyle w:val="Compact"/>
+            </w:pPr>
+            <w:r>
+              <w:t xml:space="preserve">GeoFM-LDN</w:t>
+            </w:r>
+          </w:p>
+        </w:tc>
+        <w:tc>
+          <w:tcPr/>
+          <w:p>
+            <w:pPr>
+              <w:pStyle w:val="Compact"/>
+            </w:pPr>
+            <w:r>
+              <w:t xml:space="preserve">Moderate</w:t>
+            </w:r>
+          </w:p>
+        </w:tc>
+        <w:tc>
+          <w:tcPr/>
+          <w:p>
+            <w:pPr>
+              <w:pStyle w:val="Compact"/>
+              <w:jc w:val="right"/>
+            </w:pPr>
+            <w:r>
+              <w:t xml:space="preserve">475.5</w:t>
+            </w:r>
+          </w:p>
+        </w:tc>
+        <w:tc>
+          <w:tcPr/>
+          <w:p>
+            <w:pPr>
+              <w:pStyle w:val="Compact"/>
+              <w:jc w:val="right"/>
+            </w:pPr>
+            <w:r>
+              <w:t xml:space="preserve">239.8</w:t>
+            </w:r>
+          </w:p>
+        </w:tc>
+        <w:tc>
+          <w:tcPr/>
+          <w:p>
+            <w:pPr>
+              <w:pStyle w:val="Compact"/>
+              <w:jc w:val="right"/>
+            </w:pPr>
+            <w:r>
+              <w:t xml:space="preserve">5.757</w:t>
+            </w:r>
+          </w:p>
+        </w:tc>
+        <w:tc>
+          <w:tcPr/>
+          <w:p>
+            <w:pPr>
+              <w:pStyle w:val="Compact"/>
+              <w:jc w:val="right"/>
+            </w:pPr>
+            <w:r>
+              <w:t xml:space="preserve">0.0000</w:t>
+            </w:r>
+          </w:p>
+        </w:tc>
+        <w:tc>
+          <w:tcPr/>
+          <w:p>
+            <w:pPr>
+              <w:pStyle w:val="Compact"/>
+            </w:pPr>
+          </w:p>
+        </w:tc>
+      </w:tr>
+      <w:tr>
+        <w:tc>
+          <w:tcPr/>
+          <w:p>
+            <w:pPr>
+              <w:pStyle w:val="Compact"/>
+            </w:pPr>
+            <w:r>
+              <w:t xml:space="preserve">FLUS-style ANN–CA</w:t>
+            </w:r>
+          </w:p>
+        </w:tc>
+        <w:tc>
+          <w:tcPr/>
+          <w:p>
+            <w:pPr>
+              <w:pStyle w:val="Compact"/>
+            </w:pPr>
+            <w:r>
+              <w:t xml:space="preserve">Green-priority</w:t>
+            </w:r>
+          </w:p>
+        </w:tc>
+        <w:tc>
+          <w:tcPr/>
+          <w:p>
+            <w:pPr>
+              <w:pStyle w:val="Compact"/>
+              <w:jc w:val="right"/>
+            </w:pPr>
+            <w:r>
+              <w:t xml:space="preserve">443.7</w:t>
+            </w:r>
+          </w:p>
+        </w:tc>
+        <w:tc>
+          <w:tcPr/>
+          <w:p>
+            <w:pPr>
+              <w:pStyle w:val="Compact"/>
+              <w:jc w:val="right"/>
+            </w:pPr>
+            <w:r>
+              <w:t xml:space="preserve">212.7</w:t>
+            </w:r>
+          </w:p>
+        </w:tc>
+        <w:tc>
+          <w:tcPr/>
+          <w:p>
+            <w:pPr>
+              <w:pStyle w:val="Compact"/>
+              <w:jc w:val="right"/>
+            </w:pPr>
+            <w:r>
+              <w:t xml:space="preserve">4.578</w:t>
+            </w:r>
+          </w:p>
+        </w:tc>
+        <w:tc>
+          <w:tcPr/>
+          <w:p>
+            <w:pPr>
+              <w:pStyle w:val="Compact"/>
+              <w:jc w:val="right"/>
+            </w:pPr>
+            <w:r>
+              <w:t xml:space="preserve">0.0177</w:t>
+            </w:r>
+          </w:p>
+        </w:tc>
+        <w:tc>
+          <w:tcPr/>
+          <w:p>
+            <w:pPr>
+              <w:pStyle w:val="Compact"/>
+              <w:jc w:val="center"/>
+            </w:pPr>
+            <w:r>
+              <w:t xml:space="preserve">*</w:t>
+            </w:r>
+          </w:p>
+        </w:tc>
+      </w:tr>
+      <w:tr>
+        <w:tc>
+          <w:tcPr/>
+          <w:p>
+            <w:pPr>
+              <w:pStyle w:val="Compact"/>
+            </w:pPr>
+            <w:r>
+              <w:t xml:space="preserve">Geospatial Kernel</w:t>
+            </w:r>
+          </w:p>
+        </w:tc>
+        <w:tc>
+          <w:tcPr/>
+          <w:p>
+            <w:pPr>
+              <w:pStyle w:val="Compact"/>
+            </w:pPr>
+            <w:r>
+              <w:t xml:space="preserve">Green-priority</w:t>
+            </w:r>
+          </w:p>
+        </w:tc>
+        <w:tc>
+          <w:tcPr/>
+          <w:p>
+            <w:pPr>
+              <w:pStyle w:val="Compact"/>
+              <w:jc w:val="right"/>
+            </w:pPr>
+            <w:r>
+              <w:t xml:space="preserve">319.8</w:t>
+            </w:r>
+          </w:p>
+        </w:tc>
+        <w:tc>
+          <w:tcPr/>
+          <w:p>
+            <w:pPr>
+              <w:pStyle w:val="Compact"/>
+              <w:jc w:val="right"/>
+            </w:pPr>
+            <w:r>
+              <w:t xml:space="preserve">111.3</w:t>
+            </w:r>
+          </w:p>
+        </w:tc>
+        <w:tc>
+          <w:tcPr/>
+          <w:p>
+            <w:pPr>
+              <w:pStyle w:val="Compact"/>
+              <w:jc w:val="right"/>
+            </w:pPr>
+            <w:r>
+              <w:t xml:space="preserve">5.381</w:t>
+            </w:r>
+          </w:p>
+        </w:tc>
+        <w:tc>
+          <w:tcPr/>
+          <w:p>
+            <w:pPr>
+              <w:pStyle w:val="Compact"/>
+              <w:jc w:val="right"/>
+            </w:pPr>
+            <w:r>
+              <w:t xml:space="preserve">0.0000</w:t>
+            </w:r>
+          </w:p>
+        </w:tc>
+        <w:tc>
+          <w:tcPr/>
+          <w:p>
+            <w:pPr>
+              <w:pStyle w:val="Compact"/>
+              <w:jc w:val="center"/>
+            </w:pPr>
+            <w:r>
+              <w:t xml:space="preserve">*</w:t>
+            </w:r>
+          </w:p>
+        </w:tc>
+      </w:tr>
+      <w:tr>
+        <w:tc>
+          <w:tcPr/>
+          <w:p>
+            <w:pPr>
+              <w:pStyle w:val="Compact"/>
+            </w:pPr>
+            <w:r>
+              <w:t xml:space="preserve">GeoFM-LDN</w:t>
+            </w:r>
+          </w:p>
+        </w:tc>
+        <w:tc>
+          <w:tcPr/>
+          <w:p>
+            <w:pPr>
+              <w:pStyle w:val="Compact"/>
+            </w:pPr>
+            <w:r>
+              <w:t xml:space="preserve">Green-priority</w:t>
+            </w:r>
+          </w:p>
+        </w:tc>
+        <w:tc>
+          <w:tcPr/>
+          <w:p>
+            <w:pPr>
+              <w:pStyle w:val="Compact"/>
+              <w:jc w:val="right"/>
+            </w:pPr>
+            <w:r>
+              <w:t xml:space="preserve">452.2</w:t>
+            </w:r>
+          </w:p>
+        </w:tc>
+        <w:tc>
+          <w:tcPr/>
+          <w:p>
+            <w:pPr>
+              <w:pStyle w:val="Compact"/>
+              <w:jc w:val="right"/>
+            </w:pPr>
+            <w:r>
+              <w:t xml:space="preserve">222.8</w:t>
+            </w:r>
+          </w:p>
+        </w:tc>
+        <w:tc>
+          <w:tcPr/>
+          <w:p>
+            <w:pPr>
+              <w:pStyle w:val="Compact"/>
+              <w:jc w:val="right"/>
+            </w:pPr>
+            <w:r>
+              <w:t xml:space="preserve">5.080</w:t>
+            </w:r>
+          </w:p>
+        </w:tc>
+        <w:tc>
+          <w:tcPr/>
+          <w:p>
+            <w:pPr>
+              <w:pStyle w:val="Compact"/>
+              <w:jc w:val="right"/>
+            </w:pPr>
+            <w:r>
+              <w:t xml:space="preserve">0.0000</w:t>
+            </w:r>
+          </w:p>
+        </w:tc>
+        <w:tc>
+          <w:tcPr/>
+          <w:p>
+            <w:pPr>
+              <w:pStyle w:val="Compact"/>
+              <w:jc w:val="center"/>
+            </w:pPr>
+            <w:r>
+              <w:t xml:space="preserve">*</w:t>
+            </w:r>
+          </w:p>
+        </w:tc>
+      </w:tr>
+      <w:tr>
+        <w:tc>
+          <w:tcPr/>
+          <w:p>
+            <w:pPr>
+              <w:pStyle w:val="Compact"/>
+            </w:pPr>
+            <w:r>
+              <w:t xml:space="preserve">FLUS-style ANN–CA</w:t>
+            </w:r>
+          </w:p>
+        </w:tc>
+        <w:tc>
+          <w:tcPr/>
+          <w:p>
+            <w:pPr>
+              <w:pStyle w:val="Compact"/>
+            </w:pPr>
+            <w:r>
+              <w:t xml:space="preserve">High outward</w:t>
+            </w:r>
+          </w:p>
+        </w:tc>
+        <w:tc>
+          <w:tcPr/>
+          <w:p>
+            <w:pPr>
+              <w:pStyle w:val="Compact"/>
+              <w:jc w:val="right"/>
+            </w:pPr>
+            <w:r>
+              <w:t xml:space="preserve">443.5</w:t>
+            </w:r>
+          </w:p>
+        </w:tc>
+        <w:tc>
+          <w:tcPr/>
+          <w:p>
+            <w:pPr>
+              <w:pStyle w:val="Compact"/>
+              <w:jc w:val="right"/>
+            </w:pPr>
+            <w:r>
+              <w:t xml:space="preserve">255.3</w:t>
+            </w:r>
+          </w:p>
+        </w:tc>
+        <w:tc>
+          <w:tcPr/>
+          <w:p>
+            <w:pPr>
+              <w:pStyle w:val="Compact"/>
+              <w:jc w:val="right"/>
+            </w:pPr>
+            <w:r>
+              <w:t xml:space="preserve">4.240</w:t>
+            </w:r>
+          </w:p>
+        </w:tc>
+        <w:tc>
+          <w:tcPr/>
+          <w:p>
+            <w:pPr>
+              <w:pStyle w:val="Compact"/>
+              <w:jc w:val="right"/>
+            </w:pPr>
+            <w:r>
+              <w:t xml:space="preserve">0.0131</w:t>
+            </w:r>
+          </w:p>
+        </w:tc>
+        <w:tc>
+          <w:tcPr/>
+          <w:p>
+            <w:pPr>
+              <w:pStyle w:val="Compact"/>
+              <w:jc w:val="center"/>
+            </w:pPr>
+            <w:r>
+              <w:t xml:space="preserve">*</w:t>
+            </w:r>
+          </w:p>
+        </w:tc>
+      </w:tr>
+      <w:tr>
+        <w:tc>
+          <w:tcPr/>
+          <w:p>
+            <w:pPr>
+              <w:pStyle w:val="Compact"/>
+            </w:pPr>
+            <w:r>
+              <w:t xml:space="preserve">Geospatial Kernel</w:t>
+            </w:r>
+          </w:p>
+        </w:tc>
+        <w:tc>
+          <w:tcPr/>
+          <w:p>
+            <w:pPr>
+              <w:pStyle w:val="Compact"/>
+            </w:pPr>
+            <w:r>
+              <w:t xml:space="preserve">High outward</w:t>
+            </w:r>
+          </w:p>
+        </w:tc>
+        <w:tc>
+          <w:tcPr/>
+          <w:p>
+            <w:pPr>
+              <w:pStyle w:val="Compact"/>
+              <w:jc w:val="right"/>
+            </w:pPr>
+            <w:r>
+              <w:t xml:space="preserve">362.5</w:t>
+            </w:r>
+          </w:p>
+        </w:tc>
+        <w:tc>
+          <w:tcPr/>
+          <w:p>
+            <w:pPr>
+              <w:pStyle w:val="Compact"/>
+              <w:jc w:val="right"/>
+            </w:pPr>
+            <w:r>
+              <w:t xml:space="preserve">141.7</w:t>
+            </w:r>
+          </w:p>
+        </w:tc>
+        <w:tc>
+          <w:tcPr/>
+          <w:p>
+            <w:pPr>
+              <w:pStyle w:val="Compact"/>
+              <w:jc w:val="right"/>
+            </w:pPr>
+            <w:r>
+              <w:t xml:space="preserve">4.754</w:t>
+            </w:r>
+          </w:p>
+        </w:tc>
+        <w:tc>
+          <w:tcPr/>
+          <w:p>
+            <w:pPr>
+              <w:pStyle w:val="Compact"/>
+              <w:jc w:val="right"/>
+            </w:pPr>
+            <w:r>
+              <w:t xml:space="preserve">0.0000</w:t>
+            </w:r>
+          </w:p>
+        </w:tc>
+        <w:tc>
+          <w:tcPr/>
+          <w:p>
+            <w:pPr>
+              <w:pStyle w:val="Compact"/>
+              <w:jc w:val="center"/>
+            </w:pPr>
+            <w:r>
+              <w:t xml:space="preserve">*</w:t>
+            </w:r>
+          </w:p>
+        </w:tc>
+      </w:tr>
+      <w:tr>
+        <w:tc>
+          <w:tcPr/>
+          <w:p>
+            <w:pPr>
+              <w:pStyle w:val="Compact"/>
+            </w:pPr>
+            <w:r>
+              <w:t xml:space="preserve">GeoFM-LDN</w:t>
+            </w:r>
+          </w:p>
+        </w:tc>
+        <w:tc>
+          <w:tcPr/>
+          <w:p>
+            <w:pPr>
+              <w:pStyle w:val="Compact"/>
+            </w:pPr>
+            <w:r>
+              <w:t xml:space="preserve">High outward</w:t>
+            </w:r>
+          </w:p>
+        </w:tc>
+        <w:tc>
+          <w:tcPr/>
+          <w:p>
+            <w:pPr>
+              <w:pStyle w:val="Compact"/>
+              <w:jc w:val="right"/>
+            </w:pPr>
+            <w:r>
+              <w:t xml:space="preserve">507.7</w:t>
+            </w:r>
+          </w:p>
+        </w:tc>
+        <w:tc>
+          <w:tcPr/>
+          <w:p>
+            <w:pPr>
+              <w:pStyle w:val="Compact"/>
+              <w:jc w:val="right"/>
+            </w:pPr>
+            <w:r>
+              <w:t xml:space="preserve">264.4</w:t>
+            </w:r>
+          </w:p>
+        </w:tc>
+        <w:tc>
+          <w:tcPr/>
+          <w:p>
+            <w:pPr>
+              <w:pStyle w:val="Compact"/>
+              <w:jc w:val="right"/>
+            </w:pPr>
+            <w:r>
+              <w:t xml:space="preserve">6.556</w:t>
+            </w:r>
+          </w:p>
+        </w:tc>
+        <w:tc>
+          <w:tcPr/>
+          <w:p>
+            <w:pPr>
+              <w:pStyle w:val="Compact"/>
+              <w:jc w:val="right"/>
+            </w:pPr>
+            <w:r>
+              <w:t xml:space="preserve">0.0000</w:t>
+            </w:r>
+          </w:p>
+        </w:tc>
+        <w:tc>
+          <w:tcPr/>
+          <w:p>
+            <w:pPr>
+              <w:pStyle w:val="Compact"/>
+            </w:pPr>
+          </w:p>
+        </w:tc>
+      </w:tr>
+    </w:tbl>
     <w:bookmarkEnd w:id="22"/>
     <w:bookmarkStart w:id="23" w:name="Xcd70f225f45b9532756a485fa8bec6f5eb5ebdb"/>
     <w:p>
@@ -2345,6 +3319,50 @@
         <w:t xml:space="preserve">The base Kernel allocation score adds a 7 × 7 target-class neighbourhood fraction with weight 0.35. The existing sensitivity and mechanism artefacts are retained as diagnostic controls; they do not identify a causal effect because the proposal features and allocator both contain spatial context. The neighbourhood term is therefore interpreted as evidence about the execution mechanism, not as an independently estimated planning preference. Figure 4A shows the proposal controls, while Fig. 4B–D reports runtime and planning controls.</w:t>
       </w:r>
     </w:p>
+    <w:p>
+      <w:pPr>
+        <w:pStyle w:val="BodyText"/>
+      </w:pPr>
+      <w:r>
+        <w:t xml:space="preserve">In the post-hoc neighbourhood-weight sensitivity, the mean strict FoM changed</w:t>
+      </w:r>
+      <w:r>
+        <w:t xml:space="preserve"> </w:t>
+      </w:r>
+      <w:r>
+        <w:t xml:space="preserve">from 0.19997 to 0.20042 across weights 0–0.7 in 2023 and from 0.26079 to</w:t>
+      </w:r>
+      <w:r>
+        <w:t xml:space="preserve"> </w:t>
+      </w:r>
+      <w:r>
+        <w:t xml:space="preserve">0.26034 in 2024. These changes are small relative to the model contrasts and</w:t>
+      </w:r>
+      <w:r>
+        <w:t xml:space="preserve"> </w:t>
+      </w:r>
+      <w:r>
+        <w:t xml:space="preserve">are not interpreted causally. Objective-set sensitivity on the planning rasters</w:t>
+      </w:r>
+      <w:r>
+        <w:t xml:space="preserve"> </w:t>
+      </w:r>
+      <w:r>
+        <w:t xml:space="preserve">retained the FLUS-style and Kernel candidates in all scenarios. GeoFM-LDN was</w:t>
+      </w:r>
+      <w:r>
+        <w:t xml:space="preserve"> </w:t>
+      </w:r>
+      <w:r>
+        <w:t xml:space="preserve">additionally non-dominated only for ecological-priority growth in the variants</w:t>
+      </w:r>
+      <w:r>
+        <w:t xml:space="preserve"> </w:t>
+      </w:r>
+      <w:r>
+        <w:t xml:space="preserve">that retained ecological conversion.</w:t>
+      </w:r>
+    </w:p>
     <w:bookmarkEnd w:id="23"/>
     <w:bookmarkStart w:id="24" w:name="Xb4da06261b5a2056ba43f7c28dc24c9379bfe9e"/>
     <w:p>
@@ -2372,7 +3390,7 @@
         <w:t xml:space="preserve"> </w:t>
       </w:r>
       <w:r>
-        <w:t xml:space="preserve">Deleting the action reduces mean strict FoM by 0.114 in 2023 and 0.171 in</w:t>
+        <w:t xml:space="preserve">Deleting the action reduces mean strict FoM by 0.1124 in 2023 and 0.1699 in</w:t>
       </w:r>
       <w:r>
         <w:t xml:space="preserve"> </w:t>
@@ -2439,7 +3457,7 @@
         <w:pStyle w:val="FirstParagraph"/>
       </w:pPr>
       <w:r>
-        <w:t xml:space="preserve">This study positions Geospatial Kernel as a candidate execution layer for constrained spatial reasoning. The defensible contribution is that a transition proposal and a planning admission rule can be represented and inspected separately. Under the unmatched public-data pipeline, Geospatial Kernel has the largest strict transition FoM at the one-step horizon, while GeoFM-LDN has the largest value after recursive two-step rollout. We therefore avoid a universal superiority claim and treat the planning frontier as conditional on the frozen public-data proxy objectives.</w:t>
+        <w:t xml:space="preserve">This study positions Geospatial Kernel as a candidate execution layer for constrained spatial reasoning and, more broadly, proposes an audit protocol for noisy annual labels. The defensible contribution is that a transition proposal and a planning admission rule can be represented and inspected separately. Under the unmatched public-data pipeline, Geospatial Kernel has the largest strict transition FoM at the one-step horizon, while GeoFM-LDN has the largest value after recursive two-step rollout. The high-confidence subset shows near-zero skill for all models in 2023 and at most 0.0188 FoM in 2024, so full-grid rankings should not be interpreted as validated urban-change skill. We therefore treat the planning frontier as conditional on public proxy objectives and synthetic actions.</w:t>
       </w:r>
     </w:p>
     <w:p>
@@ -2447,23 +3465,73 @@
         <w:pStyle w:val="BodyText"/>
       </w:pPr>
       <w:r>
-        <w:t xml:space="preserve">The proposed mechanism is explicit: the score compares the learned probability of a target class with that of the current class and adds local support from the target-class neighbourhood. The projection then resolves deficits and excesses while refusing mutable changes inside the hard mask. This can preserve existing built cells when demand is non-decreasing, but that outcome is a structural consequence of the projection and should not be interpreted as evidence of redevelopment realism. The balanced objective set makes a different trade-off visible: the Kernel is compact and road-accessible but has substantially higher built-component density than FLUS. Allocator-matched controls are required before attributing morphology to the learned proposal.</w:t>
-      </w:r>
-    </w:p>
-    <w:p>
-      <w:pPr>
-        <w:pStyle w:val="BodyText"/>
-      </w:pPr>
-      <w:r>
-        <w:t xml:space="preserve">Several limitations define the boundary of the present evidence. The six classes are remote-sensing land cover, not statutory residential, commercial or industrial land use. Dynamic World labels show substantial annual uncertainty and apparent turnover, and the public road, wetland and protected-area layers are proxies rather than Abu Dhabi planning records. Future drivers are frozen at 2024, no independent 2023–2024 change product is available and no observed 2025–2031 labels exist for validation. The scenario targets are synthetic planner-supplied actions; the green-priority action is not an irrigation or water-budget model. FLUS remains an unmatched Apple-Silicon binary baseline, and the three-seed summaries quantify computational variation rather than population-level uncertainty. The completed controls are public-data stress tests with matched seeds rather than randomized interventions on real planning decisions, and several variants alter more than one implementation detail at a time. We therefore report them as evidence consistent with the execution contract rather than as causal attribution or a validated Abu Dhabi forecast.</w:t>
-      </w:r>
-    </w:p>
-    <w:p>
-      <w:pPr>
-        <w:pStyle w:val="BodyText"/>
-      </w:pPr>
-      <w:r>
-        <w:t xml:space="preserve">These limitations also indicate a practical path to deployment. An authoritative version would replace the Dynamic World class raster with a locally validated land-use/land-cover crosswalk, replace public proxy masks with statutory water, ecological, airport, port and growth-boundary layers, and supply approved development demand and infrastructure capacities. The Kernel contract can remain unchanged while those domain inputs are upgraded. This separation is useful for governance: a new data source changes the evidence attached to a transition, rather than silently changing the meaning of the execution trace.</w:t>
+        <w:t xml:space="preserve">The evidence remains bounded. The six classes are remote-sensing land cover, not</w:t>
+      </w:r>
+      <w:r>
+        <w:t xml:space="preserve"> </w:t>
+      </w:r>
+      <w:r>
+        <w:t xml:space="preserve">statutory residential, commercial or industrial land use. Dynamic World labels</w:t>
+      </w:r>
+      <w:r>
+        <w:t xml:space="preserve"> </w:t>
+      </w:r>
+      <w:r>
+        <w:t xml:space="preserve">show substantial annual uncertainty and apparent turnover; no independent</w:t>
+      </w:r>
+      <w:r>
+        <w:t xml:space="preserve"> </w:t>
+      </w:r>
+      <w:r>
+        <w:t xml:space="preserve">2023–2024 change product or observed 2025–2031 labels was available. Public</w:t>
+      </w:r>
+      <w:r>
+        <w:t xml:space="preserve"> </w:t>
+      </w:r>
+      <w:r>
+        <w:t xml:space="preserve">roads, wetland and protected-area layers are proxies, future drivers are held at</w:t>
+      </w:r>
+      <w:r>
+        <w:t xml:space="preserve"> </w:t>
+      </w:r>
+      <w:r>
+        <w:t xml:space="preserve">2024, and the green-priority action has no water-budget constraint. The FLUS-style</w:t>
+      </w:r>
+      <w:r>
+        <w:t xml:space="preserve"> </w:t>
+      </w:r>
+      <w:r>
+        <w:t xml:space="preserve">control is an unmatched, untraceable Apple-Silicon binary, and the matched-input</w:t>
+      </w:r>
+      <w:r>
+        <w:t xml:space="preserve"> </w:t>
+      </w:r>
+      <w:r>
+        <w:t xml:space="preserve">attempt failed before producing a valid surface. These public-data stress tests</w:t>
+      </w:r>
+      <w:r>
+        <w:t xml:space="preserve"> </w:t>
+      </w:r>
+      <w:r>
+        <w:t xml:space="preserve">therefore do not establish causal planning effects or a validated Abu Dhabi</w:t>
+      </w:r>
+      <w:r>
+        <w:t xml:space="preserve"> </w:t>
+      </w:r>
+      <w:r>
+        <w:t xml:space="preserve">forecast. An authoritative deployment would replace public labels and masks with</w:t>
+      </w:r>
+      <w:r>
+        <w:t xml:space="preserve"> </w:t>
+      </w:r>
+      <w:r>
+        <w:t xml:space="preserve">locally approved land-use, infrastructure, ecological and development-demand</w:t>
+      </w:r>
+      <w:r>
+        <w:t xml:space="preserve"> </w:t>
+      </w:r>
+      <w:r>
+        <w:t xml:space="preserve">records while retaining the same execution contract.</w:t>
       </w:r>
     </w:p>
     <w:bookmarkEnd w:id="26"/>
@@ -2703,7 +3771,7 @@
         </w:numPr>
       </w:pPr>
       <w:r>
-        <w:t xml:space="preserve">The released bundle includes the aligned 2017–2024 public rasters, historical seed and ensemble prediction rasters, 2025–2031 planning seed and ensemble rasters, nine GeoPackages of dissolved change footprints, the mechanism-ablation report, model checkpoints, and the SHA-256 manifest. Text hashes use canonical LF line endings so that a Windows checkout with</w:t>
+        <w:t xml:space="preserve">The released bundle includes the aligned 2017–2024 public rasters, historical seed and ensemble prediction rasters, 2025–2031 planning seed and ensemble rasters, nine GeoPackages of dissolved change footprints, the mechanism-ablation report, model checkpoints, and the SHA-256 manifest. Text hashes use canonical LF line endings, and the byte-length check applies the same normalization on text records, so a Windows checkout with</w:t>
       </w:r>
       <w:r>
         <w:t xml:space="preserve"> </w:t>
@@ -2718,7 +3786,7 @@
         <w:t xml:space="preserve"> </w:t>
       </w:r>
       <w:r>
-        <w:t xml:space="preserve">verifies identically. No private database address, credential or client-only service is included. Authoritative Abu Dhabi land-use and independent change-validation data remain outside this study.</w:t>
+        <w:t xml:space="preserve">can pass the manifest gate. The locked macOS arm64 execution environment remains the reference for model outputs; Kernel reruns on other platforms can differ by about 1% of pixels and approximately 0.001 FoM. No private database address, credential or client-only service is included. Authoritative Abu Dhabi land-use and independent change-validation data remain outside this study.</w:t>
       </w:r>
     </w:p>
     <w:bookmarkEnd w:id="27"/>
@@ -3348,7 +4416,7 @@
       <w:r>
         <w:drawing>
           <wp:inline>
-            <wp:extent cx="5334000" cy="3384822"/>
+            <wp:extent cx="5334000" cy="3481042"/>
             <wp:effectExtent b="0" l="0" r="0" t="0"/>
             <wp:docPr descr="Figure 1: benchmark and execution contract" title="" id="32" name="Picture"/>
             <a:graphic>
@@ -3369,7 +4437,7 @@
                   <pic:spPr bwMode="auto">
                     <a:xfrm>
                       <a:off x="0" y="0"/>
-                      <a:ext cx="5334000" cy="3384822"/>
+                      <a:ext cx="5334000" cy="3481042"/>
                     </a:xfrm>
                     <a:prstGeom prst="rect">
                       <a:avLst/>
@@ -3524,7 +4592,7 @@
       <w:r>
         <w:drawing>
           <wp:inline>
-            <wp:extent cx="5334000" cy="3496076"/>
+            <wp:extent cx="5334000" cy="3520971"/>
             <wp:effectExtent b="0" l="0" r="0" t="0"/>
             <wp:docPr descr="Figure 3: conditional planning objectives" title="" id="38" name="Picture"/>
             <a:graphic>
@@ -3545,7 +4613,7 @@
                   <pic:spPr bwMode="auto">
                     <a:xfrm>
                       <a:off x="0" y="0"/>
-                      <a:ext cx="5334000" cy="3496076"/>
+                      <a:ext cx="5334000" cy="3520971"/>
                     </a:xfrm>
                     <a:prstGeom prst="rect">
                       <a:avLst/>
@@ -3599,37 +4667,37 @@
         <w:t xml:space="preserve"> </w:t>
       </w:r>
       <w:r>
-        <w:t xml:space="preserve">growth and high-outward-growth actions. Panels A–D are the frozen Pareto</w:t>
-      </w:r>
-      <w:r>
-        <w:t xml:space="preserve"> </w:t>
-      </w:r>
-      <w:r>
-        <w:t xml:space="preserve">objectives: distance to major roads, distance to prior built cells, built</w:t>
-      </w:r>
-      <w:r>
-        <w:t xml:space="preserve"> </w:t>
-      </w:r>
-      <w:r>
-        <w:t xml:space="preserve">components per 1,000 valid cells and vegetation gain. Panels E–F are</w:t>
-      </w:r>
-      <w:r>
-        <w:t xml:space="preserve"> </w:t>
-      </w:r>
-      <w:r>
-        <w:t xml:space="preserve">descriptive diagnostics (ecological conversion and 500-m leapfrog rate). Stars</w:t>
-      </w:r>
-      <w:r>
-        <w:t xml:space="preserve"> </w:t>
-      </w:r>
-      <w:r>
-        <w:t xml:space="preserve">mark non-dominated candidates under the four-objective set; bars show means ±</w:t>
-      </w:r>
-      <w:r>
-        <w:t xml:space="preserve"> </w:t>
-      </w:r>
-      <w:r>
-        <w:t xml:space="preserve">population SD across three seeds.</w:t>
+        <w:t xml:space="preserve">growth and high-outward-growth actions. Panels A–D show the release objectives:</w:t>
+      </w:r>
+      <w:r>
+        <w:t xml:space="preserve"> </w:t>
+      </w:r>
+      <w:r>
+        <w:t xml:space="preserve">distance to major roads, distance to prior built cells, new-built components per</w:t>
+      </w:r>
+      <w:r>
+        <w:t xml:space="preserve"> </w:t>
+      </w:r>
+      <w:r>
+        <w:t xml:space="preserve">1,000 valid cells and ecological conversion. Panel E shows vegetation gain as a</w:t>
+      </w:r>
+      <w:r>
+        <w:t xml:space="preserve"> </w:t>
+      </w:r>
+      <w:r>
+        <w:t xml:space="preserve">descriptive scenario-input diagnostic; panel F shows the 500-m leapfrog rate. Stars mark</w:t>
+      </w:r>
+      <w:r>
+        <w:t xml:space="preserve"> </w:t>
+      </w:r>
+      <w:r>
+        <w:t xml:space="preserve">non-dominated candidates within each scenario; bars show means ± population SD</w:t>
+      </w:r>
+      <w:r>
+        <w:t xml:space="preserve"> </w:t>
+      </w:r>
+      <w:r>
+        <w:t xml:space="preserve">across three seeds.</w:t>
       </w:r>
     </w:p>
     <w:p>
@@ -3736,7 +4804,7 @@
       <w:r>
         <w:drawing>
           <wp:inline>
-            <wp:extent cx="5334000" cy="5254821"/>
+            <wp:extent cx="5334000" cy="5443359"/>
             <wp:effectExtent b="0" l="0" r="0" t="0"/>
             <wp:docPr descr="Figure 5: 2031 spatial footprints" title="" id="44" name="Picture"/>
             <a:graphic>
@@ -3757,7 +4825,7 @@
                   <pic:spPr bwMode="auto">
                     <a:xfrm>
                       <a:off x="0" y="0"/>
-                      <a:ext cx="5334000" cy="5254821"/>
+                      <a:ext cx="5334000" cy="5443359"/>
                     </a:xfrm>
                     <a:prstGeom prst="rect">
                       <a:avLst/>

</xml_diff>

<commit_message>
Address fifth-round LUP review
</commit_message>
<xml_diff>
--- a/manuscript/manuscript.docx
+++ b/manuscript/manuscript.docx
@@ -2,7 +2,7 @@
 <file path=word/document.xml><?xml version="1.0" encoding="utf-8"?>
 <w:document xmlns:w="http://schemas.openxmlformats.org/wordprocessingml/2006/main" xmlns:m="http://schemas.openxmlformats.org/officeDocument/2006/math" xmlns:r="http://schemas.openxmlformats.org/officeDocument/2006/relationships" xmlns:o="urn:schemas-microsoft-com:office:office" xmlns:v="urn:schemas-microsoft-com:vml" xmlns:w10="urn:schemas-microsoft-com:office:word" xmlns:a="http://schemas.openxmlformats.org/drawingml/2006/main" xmlns:pic="http://schemas.openxmlformats.org/drawingml/2006/picture" xmlns:wp="http://schemas.openxmlformats.org/drawingml/2006/wordprocessingDrawing">
   <w:body>
-    <w:bookmarkStart w:id="48" w:name="X9f1511a8109b24064870830db84b786f9ef0e11"/>
+    <w:bookmarkStart w:id="49" w:name="X9f1511a8109b24064870830db84b786f9ef0e11"/>
     <w:p>
       <w:pPr>
         <w:pStyle w:val="Heading1"/>
@@ -95,7 +95,7 @@
         <w:pStyle w:val="FirstParagraph"/>
       </w:pPr>
       <w:r>
-        <w:t xml:space="preserve">Urban land-change models are often evaluated against annual labels whose reliability is not spatially uniform. We present an auditable protocol for testing constrained spatial allocation under that uncertainty, using Geospatial Kernel, the algorithmic core of a Geospatial World Model, as the focal execution layer. The Abu Dhabi public-data benchmark uses annual 100-m land-cover products from 2017–2024, three computational seeds, destination-correct multi-class change Figure of Merit (FoM), spatial-block bootstrap contrasts and explicit state–action–constraint traces. The regenerated strict FoM was 0.1950 for Geospatial Kernel, 0.1256 for the FLUS-style ANN–CA console and 0.1616 for GeoFM-LDN in 2023; after recursive two-step rollout in 2024 the values were 0.2520, 0.1782 and 0.2708, respectively. On the high-confidence label subset, all three models had FoM 0.000 in 2023 and the 2024 maximum was 0.0188, showing that full-grid agreement is strongly conditioned by label noise. The planning track is therefore reported as scenario stress testing, not official forecasting. The released public bundle, source, checkpoints, rasters, vector footprints and audit manifests support locked-environment reproduction, while cross-platform Kernel reruns differ by about 1% of cells and approximately 0.001 FoM. The protocol’s principal contribution is an inspectable proposal–projection–writeback boundary for separating model behaviour from action and constraint semantics.</w:t>
+        <w:t xml:space="preserve">Urban land-change models are often evaluated against annual labels whose reliability is not spatially uniform. We present an auditable protocol for testing constrained spatial allocation under that uncertainty, using Geospatial Kernel, the algorithmic core of a Geospatial World Model, as the focal execution layer. The Abu Dhabi public-data benchmark uses annual 100-m land-cover products from 2017–2024, three computational seeds, destination-correct multi-class change Figure of Merit (FoM), spatial-block bootstrap contrasts and explicit state–action–constraint traces. The regenerated strict FoM was 0.1950 for Geospatial Kernel, 0.1256 for the FLUS-style ANN–CA console (untraceable build) and 0.1616 for GeoFM-LDN in 2023; after recursive two-step rollout in 2024 the values were 0.2520, 0.1782 and 0.2708, respectively. On the high-confidence label subset, all three models had FoM 0.000 in 2023 and the 2024 maximum was 0.0188, showing that full-grid agreement is strongly conditioned by label noise. The planning track is therefore reported as scenario stress testing, not official forecasting. The released public bundle, source, checkpoints, rasters, vector footprints and audit manifests support locked-environment reproduction. An author-run Linux comparison reproduced the six released Kernel rasters exactly at the categorical-cell level and yielded zero strict-FoM difference; this is a measurement of this controlled pair of environments, not a promise of bitwise identity for every numerical stack. The protocol’s principal contribution is an inspectable proposal–projection–writeback boundary for separating model behaviour from action and constraint semantics.</w:t>
       </w:r>
     </w:p>
     <w:bookmarkEnd w:id="9"/>
@@ -245,7 +245,7 @@
       </w:r>
     </w:p>
     <w:bookmarkEnd w:id="12"/>
-    <w:bookmarkStart w:id="20" w:name="methods"/>
+    <w:bookmarkStart w:id="21" w:name="methods"/>
     <w:p>
       <w:pPr>
         <w:pStyle w:val="Heading2"/>
@@ -254,13 +254,13 @@
         <w:t xml:space="preserve">Methods</w:t>
       </w:r>
     </w:p>
-    <w:bookmarkStart w:id="13" w:name="Xbffb9f76145a15c16a91fe0938c182a8beaf14a"/>
+    <w:bookmarkStart w:id="13" w:name="portable-audit-protocol"/>
     <w:p>
       <w:pPr>
         <w:pStyle w:val="Heading3"/>
       </w:pPr>
       <w:r>
-        <w:t xml:space="preserve">Study boundary, grid and temporal protocol</w:t>
+        <w:t xml:space="preserve">Portable audit protocol</w:t>
       </w:r>
     </w:p>
     <w:p>
@@ -268,6 +268,90 @@
         <w:pStyle w:val="FirstParagraph"/>
       </w:pPr>
       <w:r>
+        <w:t xml:space="preserve">The benchmark separates a reusable audit protocol from the Abu Dhabi adapter.</w:t>
+      </w:r>
+      <w:r>
+        <w:t xml:space="preserve"> </w:t>
+      </w:r>
+      <w:r>
+        <w:t xml:space="preserve">For any city or geospatial domain, the protocol requires: (i) a declared class</w:t>
+      </w:r>
+      <w:r>
+        <w:t xml:space="preserve"> </w:t>
+      </w:r>
+      <w:r>
+        <w:t xml:space="preserve">crosswalk and spatially stratified label-confidence tiers; (ii) persistence and</w:t>
+      </w:r>
+      <w:r>
+        <w:t xml:space="preserve"> </w:t>
+      </w:r>
+      <w:r>
+        <w:t xml:space="preserve">minimum-change zero models; (iii) destination-correct multi-class change FoM</w:t>
+      </w:r>
+      <w:r>
+        <w:t xml:space="preserve"> </w:t>
+      </w:r>
+      <w:r>
+        <w:t xml:space="preserve">with quantity and allocation diagnostics; (iv) spatial-block bootstrap intervals</w:t>
+      </w:r>
+      <w:r>
+        <w:t xml:space="preserve"> </w:t>
+      </w:r>
+      <w:r>
+        <w:t xml:space="preserve">and paired model contrasts on a frozen evaluation mask; (v) an explicit check for</w:t>
+      </w:r>
+      <w:r>
+        <w:t xml:space="preserve"> </w:t>
+      </w:r>
+      <w:r>
+        <w:t xml:space="preserve">structural-zero metrics before Pareto selection; (vi) a versioned objective table</w:t>
+      </w:r>
+      <w:r>
+        <w:t xml:space="preserve"> </w:t>
+      </w:r>
+      <w:r>
+        <w:t xml:space="preserve">with direction, units and interpretation; and (vii) a state–action–constraint</w:t>
+      </w:r>
+      <w:r>
+        <w:t xml:space="preserve"> </w:t>
+      </w:r>
+      <w:r>
+        <w:t xml:space="preserve">trace recording proposal, projection, hard-mask status and state writeback. The</w:t>
+      </w:r>
+      <w:r>
+        <w:t xml:space="preserve"> </w:t>
+      </w:r>
+      <w:r>
+        <w:t xml:space="preserve">protocol reports domain validity separately from execution completeness and</w:t>
+      </w:r>
+      <w:r>
+        <w:t xml:space="preserve"> </w:t>
+      </w:r>
+      <w:r>
+        <w:t xml:space="preserve">requires independent change validation before a categorical map is presented as</w:t>
+      </w:r>
+      <w:r>
+        <w:t xml:space="preserve"> </w:t>
+      </w:r>
+      <w:r>
+        <w:t xml:space="preserve">an observed land-use product.</w:t>
+      </w:r>
+    </w:p>
+    <w:bookmarkEnd w:id="13"/>
+    <w:bookmarkStart w:id="14" w:name="Xdec0000e20bdd14e9f09c125200d58222c269b6"/>
+    <w:p>
+      <w:pPr>
+        <w:pStyle w:val="Heading3"/>
+      </w:pPr>
+      <w:r>
+        <w:t xml:space="preserve">Abu Dhabi implementation: boundary, grid and temporal protocol</w:t>
+      </w:r>
+    </w:p>
+    <w:p>
+      <w:pPr>
+        <w:pStyle w:val="FirstParagraph"/>
+      </w:pPr>
+      <w:r>
         <w:t xml:space="preserve">The study boundary is the polygon returned for OpenStreetMap relation R4479763, representing Abu Dhabi city. All rasters were aligned to a canonical 100-m grid in EPSG:32640 with 475 columns and 360 rows. A cell was included when its centre fell within the city polygon and when the common public-data mask indicated valid coverage. The benchmark profile records the source geometry, raster transform, dimensions and SHA-256 hashes. The effective evaluation mask contains 79,726 cells.</w:t>
       </w:r>
     </w:p>
@@ -279,8 +363,8 @@
         <w:t xml:space="preserve">The observed sequence contains annual states for 2017–2024. Models were fit using the four transitions 2017→2018, 2018→2019, 2019→2020 and 2020→2021. A 2021→2022 transition was used for validation during model development. The historical test starts from 2022 and evaluates 2023 and 2024 in an open-loop rollout without observed-state writeback. The planning test starts from the observed 2024 state and recursively generates 2025–2031 under each scenario action.</w:t>
       </w:r>
     </w:p>
-    <w:bookmarkEnd w:id="13"/>
-    <w:bookmarkStart w:id="14" w:name="public-data-and-class-semantics"/>
+    <w:bookmarkEnd w:id="14"/>
+    <w:bookmarkStart w:id="15" w:name="public-data-and-class-semantics"/>
     <w:p>
       <w:pPr>
         <w:pStyle w:val="Heading3"/>
@@ -305,8 +389,8 @@
         <w:t xml:space="preserve">Annual 64-dimensional AlphaEarth embeddings were spatially averaged to the canonical grid and locally L2-normalized. Monthly VIIRS night-time-light radiance was averaged by year. Copernicus DEM supplied elevation and a finite-difference slope derivative. OpenStreetMap road geometries were rasterized into distance-to-road and distance-to-major-road surfaces. ESA WorldCover 2021 supplied public water and wetland/mangrove constraint proxies (Zanaga et al., 2022). All dynamic and static layers were checked for exact CRS, transform, width and height agreement.</w:t>
       </w:r>
     </w:p>
-    <w:bookmarkEnd w:id="14"/>
-    <w:bookmarkStart w:id="15" w:name="X0bc042fc0758897b5f30315c587a8a1f2b715c3"/>
+    <w:bookmarkEnd w:id="15"/>
+    <w:bookmarkStart w:id="16" w:name="X0bc042fc0758897b5f30315c587a8a1f2b715c3"/>
     <w:p>
       <w:pPr>
         <w:pStyle w:val="Heading3"/>
@@ -911,8 +995,8 @@
         <w:t xml:space="preserve">is the Dynamic World mean top probability. The target years 2023 and 2024 are not used during fitting or model selection. Across the three seeds, each fitted model used 71,892–72,202 pixel rows and all six classes.</w:t>
       </w:r>
     </w:p>
-    <w:bookmarkEnd w:id="15"/>
-    <w:bookmarkStart w:id="16" w:name="X5e714bbaa02c64a1ace7d8064ad9563138c593b"/>
+    <w:bookmarkEnd w:id="16"/>
+    <w:bookmarkStart w:id="17" w:name="X5e714bbaa02c64a1ace7d8064ad9563138c593b"/>
     <w:p>
       <w:pPr>
         <w:pStyle w:val="Heading3"/>
@@ -1296,8 +1380,8 @@
         <w:t xml:space="preserve">. Every step records a state reference, action evidence, model version, parameter reference, projection status and diagnostic counts. The runtime checks domain identity, source-time consistency and action time advancement. This execution contract is the Geospatial Kernel’s algorithmic contribution; the Abu Dhabi adapter supplies the land-cover-specific features, learner and constraint masks.</w:t>
       </w:r>
     </w:p>
-    <w:bookmarkEnd w:id="16"/>
-    <w:bookmarkStart w:id="17" w:name="baselines-and-common-evaluator"/>
+    <w:bookmarkEnd w:id="17"/>
+    <w:bookmarkStart w:id="18" w:name="baselines-and-common-evaluator"/>
     <w:p>
       <w:pPr>
         <w:pStyle w:val="Heading3"/>
@@ -1311,7 +1395,7 @@
         <w:pStyle w:val="FirstParagraph"/>
       </w:pPr>
       <w:r>
-        <w:t xml:space="preserve">The baseline was run through a FLUS-style ANN–CA console using seven continuous drivers: normalized row and column coordinates, elevation, slope, VIIRS radiance, distance to roads and distance to major roads. Its ANN suitability surface was passed to a cellular-automata allocation stage with the common class totals and public hard mask. The archived run used one 2021 training year, eight ANN hidden neurons, a 3 × 3 CA neighbourhood, neighbourhood strength 1.0, acceleration factor 0.1 and 1,000 iterations. Its frozen transition matrix protected water and wetland but did not prohibit built-to-non-built transitions. The supplied Mach-O executable cannot be traced to a reproducible upstream release or source commit, so we label this control “FLUS-style ANN–CA console (untraceable build)” and do not claim equivalence to the Liu et al. (2017) implementation. A matched 25-feature input attempt terminated with a segmentation fault in the supplied binary before producing a valid probability surface; it is retained as a documented build limitation, not as a completed matched-input comparison.</w:t>
+        <w:t xml:space="preserve">The baseline was run through a FLUS-style ANN–CA console using seven continuous drivers: normalized row and column coordinates, elevation, slope, VIIRS radiance, distance to roads and distance to major roads. Its ANN suitability surface was passed to a cellular-automata allocation stage with the common class totals and public hard mask. The archived run used one 2021 training year, eight ANN hidden neurons, a 3 × 3 CA neighbourhood, neighbourhood strength 1.0, acceleration factor 0.1 and 1,000 iterations. Its frozen transition matrix protected water and wetland but did not prohibit built-to-non-built transitions. The supplied Mach-O executable cannot be traced to a reproducible upstream release or source commit, so we label this control “FLUS-style ANN–CA console (untraceable build)” and do not claim equivalence to the Liu et al. (2017) implementation. A 25-feature Kernel-matched input was executed with absolute paths. The run completed for seed 31, wrote a valid probability surface and produced 2023/2024 predictions; its archived log, configuration and report are retained as a matched-input diagnostic rather than silently replacing the original seven-driver baseline. Two intermediate configurations (13 features: seven drivers plus current-class indicators; 19 features: seven drivers plus neighbourhood fractions) also completed for seed 31. Their results are dimensionality diagnostics, not additional three-seed headline comparisons.</w:t>
       </w:r>
     </w:p>
     <w:p>
@@ -1421,11 +1505,11 @@
         <w:pStyle w:val="BodyText"/>
       </w:pPr>
       <w:r>
-        <w:t xml:space="preserve">The common evaluator computes actual class counts, normalized demand total variation, hard-mask violations, strict multi-class change FoM, binary change FoM, change F1, overall accuracy and macro-F1 for historical runs. The strict FoM counts a hit only when the predicted destination class equals the observed destination class; wrong destination changes are retained in the denominator. It also generates persistence and minimum-change zero controls, spatial-block bootstrap intervals and paired model-difference intervals for strict FoM, overall accuracy and macro-F1. For planning runs it additionally computes ecological conversion, new-built neighbourhood fraction, new-built component counts, all-built component counts, a 500-m leapfrog rate, distances to roads and prior built cells, infrastructure proxy distance and built retirement. Pareto membership is calculated within each scenario over four release objectives: major-road distance, prior-built distance, new-built component density and ecological conversion rate. Vegetation gain is a scenario input and remains descriptive, not an objective.</w:t>
-      </w:r>
-    </w:p>
-    <w:bookmarkEnd w:id="17"/>
-    <w:bookmarkStart w:id="18" w:name="scenario-actions-and-uncertainty"/>
+        <w:t xml:space="preserve">The common evaluator computes actual class counts, normalized demand total variation, hard-mask violations, strict multi-class change FoM, binary change FoM, change F1, overall accuracy and macro-F1 for historical runs. The strict FoM counts a hit only when the predicted destination class equals the observed destination class; wrong destination changes are retained in the denominator. It also generates persistence and minimum-change zero controls, spatial-block bootstrap intervals and paired model-difference intervals for strict FoM, overall accuracy and macro-F1. For planning runs it additionally computes ecological conversion, new-built neighbourhood fraction, new-built component counts, the union of 2024 built and newly built components, all-final-built component counts, a 500-m leapfrog rate, distances to roads and prior built cells, infrastructure proxy distance and built retirement. Pareto membership is calculated within each scenario over three release objectives: major-road distance, prior-built distance and union-built component density. Ecological conversion is retained as a descriptive public-data pressure proxy because it is structurally zero for the two exact-count allocators and therefore has no discriminating power in their comparison. Vegetation gain is a scenario input and remains descriptive, not an objective.</w:t>
+      </w:r>
+    </w:p>
+    <w:bookmarkEnd w:id="18"/>
+    <w:bookmarkStart w:id="19" w:name="scenario-actions-and-uncertainty"/>
     <w:p>
       <w:pPr>
         <w:pStyle w:val="Heading3"/>
@@ -1469,11 +1553,11 @@
         <w:t xml:space="preserve"> </w:t>
       </w:r>
       <w:r>
-        <w:t xml:space="preserve">path identifier is retained only for artifact compatibility. Each action supplies feasible class totals for 2025–2031. The 2031 totals are an explicit extension of the previous annual difference and are not derived from an official population, housing or infrastructure forecast. Future exogenous rasters are held at their 2024 values. The green-priority action is not a water-budget model. Each candidate is run at seeds 31, 47 and 73, and planning tables report arithmetic means and population standard deviations. No p-values are reported because the three seeds describe computational variability, not independent field samples. The primary Pareto comparison is within each scenario, contrasting the three models under the same action; a global nine-candidate frontier is retained only as lineage. Sensitivity variants remove or add objective dimensions on the same released rasters. The objective set evolved through four review-driven revisions and was not preregistered: v1 mixed feasibility, action and outcome terms; v2 was not released; v3 used structurally problematic outcomes; and v4 still included scenario-supplied vegetation gain and all-built fragmentation. We therefore report v5 as a release objective set rather than a prespecified planning preference, and treat its sensitivity results as robustness diagnostics.</w:t>
-      </w:r>
-    </w:p>
-    <w:bookmarkEnd w:id="18"/>
-    <w:bookmarkStart w:id="19" w:name="change-polygons-and-reproducibility"/>
+        <w:t xml:space="preserve">path identifier is retained only for artifact compatibility. Each action supplies feasible class totals for 2025–2031. The 2031 totals are an explicit extension of the previous annual difference and are not derived from an official population, housing or infrastructure forecast. Future exogenous rasters are held at their 2024 values. The green-priority action is not a water-budget model. Each candidate is run at seeds 31, 47 and 73, and planning tables report arithmetic means and population standard deviations. No p-values are reported because the three seeds describe computational variability, not independent field samples. The primary Pareto comparison is within each scenario, contrasting the three models under the same action; a global nine-candidate frontier is retained only as lineage. Sensitivity variants remove or add objective dimensions on the same released rasters. The objective set evolved through four review-driven revisions and was not preregistered: v1 mixed feasibility, action and outcome terms; v2 was not released; v3 used structurally problematic outcomes; and v4 still included scenario-supplied vegetation gain and all-built fragmentation. The current release is v6: road access, prior-built distance and union-built component density. Ecological conversion is reported as a diagnostic rather than a Pareto objective because it is structurally zero for the exact-count Kernel and GeoFM-LDN allocations. We treat v6 as a release objective set rather than a prespecified planning preference, and treat its sensitivity results as robustness diagnostics.</w:t>
+      </w:r>
+    </w:p>
+    <w:bookmarkEnd w:id="19"/>
+    <w:bookmarkStart w:id="20" w:name="change-polygons-and-reproducibility"/>
     <w:p>
       <w:pPr>
         <w:pStyle w:val="Heading3"/>
@@ -1520,9 +1604,9 @@
         <w:t xml:space="preserve">when source rasters, reports or vectors are absent; with the released public bundle, the input audit passed all alignment gates (with a Dynamic World label-noise warning) and the output audit passed 276 historical and planning predictions with zero failures. The vector layers preserve raster-cell geometry and should not be interpreted as cadastral parcels.</w:t>
       </w:r>
     </w:p>
-    <w:bookmarkEnd w:id="19"/>
     <w:bookmarkEnd w:id="20"/>
-    <w:bookmarkStart w:id="25" w:name="results"/>
+    <w:bookmarkEnd w:id="21"/>
+    <w:bookmarkStart w:id="26" w:name="results"/>
     <w:p>
       <w:pPr>
         <w:pStyle w:val="Heading2"/>
@@ -1531,7 +1615,7 @@
         <w:t xml:space="preserve">Results</w:t>
       </w:r>
     </w:p>
-    <w:bookmarkStart w:id="21" w:name="Xc401fd263995a070f934140ba04b3b9747e16b4"/>
+    <w:bookmarkStart w:id="22" w:name="Xc401fd263995a070f934140ba04b3b9747e16b4"/>
     <w:p>
       <w:pPr>
         <w:pStyle w:val="Heading3"/>
@@ -1564,8 +1648,8 @@
         <w:t xml:space="preserve">The execution trace makes the distinction between proposal and admission explicit. A Kernel step records the source state, action, probability-cube proposal, projected state, model identity, input evidence and next-state reference. The runtime checks that the action advances the source time and that the projected raster becomes the next state. This is the operational meaning of the Kernel in this study: not a claim that all GWM domains share the same learner, but a claim that they can share an auditable execution contract. The shared inputs and execution boundary are summarized in Fig. 1.</w:t>
       </w:r>
     </w:p>
-    <w:bookmarkEnd w:id="21"/>
-    <w:bookmarkStart w:id="22" w:name="historical-and-planning-results"/>
+    <w:bookmarkEnd w:id="22"/>
+    <w:bookmarkStart w:id="23" w:name="historical-and-planning-results"/>
     <w:p>
       <w:pPr>
         <w:pStyle w:val="Heading3"/>
@@ -1647,97 +1731,115 @@
         <w:t xml:space="preserve"> </w:t>
       </w:r>
       <w:r>
-        <w:t xml:space="preserve">5. It uses mean distance of new built cells to major roads, mean distance to</w:t>
-      </w:r>
-      <w:r>
-        <w:t xml:space="preserve"> </w:t>
-      </w:r>
-      <w:r>
-        <w:t xml:space="preserve">pre-existing built cells, connected components formed by newly built cells per</w:t>
-      </w:r>
-      <w:r>
-        <w:t xml:space="preserve"> </w:t>
-      </w:r>
-      <w:r>
-        <w:t xml:space="preserve">1,000 valid cells and ecological conversion rate. All four are public-data</w:t>
-      </w:r>
-      <w:r>
-        <w:t xml:space="preserve"> </w:t>
-      </w:r>
-      <w:r>
-        <w:t xml:space="preserve">proxies. Vegetation gain is excluded because it is supplied directly by the</w:t>
-      </w:r>
-      <w:r>
-        <w:t xml:space="preserve"> </w:t>
-      </w:r>
-      <w:r>
-        <w:t xml:space="preserve">scenario action, and all-built component density is reported only as a</w:t>
-      </w:r>
-      <w:r>
-        <w:t xml:space="preserve"> </w:t>
-      </w:r>
-      <w:r>
-        <w:t xml:space="preserve">diagnostic because it can be changed by built-cell retirement. No weighted</w:t>
-      </w:r>
-      <w:r>
-        <w:t xml:space="preserve"> </w:t>
-      </w:r>
-      <w:r>
-        <w:t xml:space="preserve">composite score is used. Because the objective set changed across the four</w:t>
-      </w:r>
-      <w:r>
-        <w:t xml:space="preserve"> </w:t>
-      </w:r>
-      <w:r>
-        <w:t xml:space="preserve">review rounds, we disclose the lineage: v1 included seven access, ecological,</w:t>
-      </w:r>
-      <w:r>
-        <w:t xml:space="preserve"> </w:t>
-      </w:r>
-      <w:r>
-        <w:t xml:space="preserve">neighbourhood and gain terms; v2 proposed roads, prior-built distance,</w:t>
-      </w:r>
-      <w:r>
-        <w:t xml:space="preserve"> </w:t>
-      </w:r>
-      <w:r>
-        <w:t xml:space="preserve">fragmentation and leapfrog rate but was not run; v3 used ecological conversion,</w:t>
-      </w:r>
-      <w:r>
-        <w:t xml:space="preserve"> </w:t>
-      </w:r>
-      <w:r>
-        <w:t xml:space="preserve">roads, leapfrog rate and built retirement; and v4 combined roads, prior-built</w:t>
-      </w:r>
-      <w:r>
-        <w:t xml:space="preserve"> </w:t>
-      </w:r>
-      <w:r>
-        <w:t xml:space="preserve">distance, all-built fragmentation and vegetation gain. The current release</w:t>
-      </w:r>
-      <w:r>
-        <w:t xml:space="preserve"> </w:t>
-      </w:r>
-      <w:r>
-        <w:t xml:space="preserve">replaces v4 after the review identified scenario-input leakage and retirement</w:t>
-      </w:r>
-      <w:r>
-        <w:t xml:space="preserve"> </w:t>
-      </w:r>
-      <w:r>
-        <w:t xml:space="preserve">confounding. Sensitivity sets are recomputed on the same rasters and reported as</w:t>
-      </w:r>
-      <w:r>
-        <w:t xml:space="preserve"> </w:t>
-      </w:r>
-      <w:r>
-        <w:t xml:space="preserve">robustness analyses, not as additional preregistered claims. These are measurable</w:t>
-      </w:r>
-      <w:r>
-        <w:t xml:space="preserve"> </w:t>
-      </w:r>
-      <w:r>
-        <w:t xml:space="preserve">public-data proxies rather than claims about welfare, equity or statutory zoning.</w:t>
+        <w:t xml:space="preserve">6. It uses mean distance of new built cells to major roads, mean distance to</w:t>
+      </w:r>
+      <w:r>
+        <w:t xml:space="preserve"> </w:t>
+      </w:r>
+      <w:r>
+        <w:t xml:space="preserve">pre-existing built cells and connected components in the union of 2024 built and</w:t>
+      </w:r>
+      <w:r>
+        <w:t xml:space="preserve"> </w:t>
+      </w:r>
+      <w:r>
+        <w:t xml:space="preserve">newly built cells per 1,000 valid cells. These are public-data proxies. Ecological</w:t>
+      </w:r>
+      <w:r>
+        <w:t xml:space="preserve"> </w:t>
+      </w:r>
+      <w:r>
+        <w:t xml:space="preserve">conversion is retained as a descriptive diagnostic, not an objective, because it</w:t>
+      </w:r>
+      <w:r>
+        <w:t xml:space="preserve"> </w:t>
+      </w:r>
+      <w:r>
+        <w:t xml:space="preserve">is structurally zero for the two exact-count allocators. Vegetation gain is</w:t>
+      </w:r>
+      <w:r>
+        <w:t xml:space="preserve"> </w:t>
+      </w:r>
+      <w:r>
+        <w:t xml:space="preserve">excluded because it is supplied directly by the scenario action, and all-final-</w:t>
+      </w:r>
+      <w:r>
+        <w:t xml:space="preserve"> </w:t>
+      </w:r>
+      <w:r>
+        <w:t xml:space="preserve">built component density is reported only as a diagnostic because it can be</w:t>
+      </w:r>
+      <w:r>
+        <w:t xml:space="preserve"> </w:t>
+      </w:r>
+      <w:r>
+        <w:t xml:space="preserve">changed by built-cell retirement. No weighted composite score is used. Because</w:t>
+      </w:r>
+      <w:r>
+        <w:t xml:space="preserve"> </w:t>
+      </w:r>
+      <w:r>
+        <w:t xml:space="preserve">the objective set changed across the review rounds, we disclose the lineage: v1</w:t>
+      </w:r>
+      <w:r>
+        <w:t xml:space="preserve"> </w:t>
+      </w:r>
+      <w:r>
+        <w:t xml:space="preserve">included seven access, ecological, neighbourhood and gain terms; v2 proposed</w:t>
+      </w:r>
+      <w:r>
+        <w:t xml:space="preserve"> </w:t>
+      </w:r>
+      <w:r>
+        <w:t xml:space="preserve">roads, prior-built distance, fragmentation and leapfrog rate but was not run; v3</w:t>
+      </w:r>
+      <w:r>
+        <w:t xml:space="preserve"> </w:t>
+      </w:r>
+      <w:r>
+        <w:t xml:space="preserve">used ecological conversion, roads, leapfrog rate and built retirement; and v4</w:t>
+      </w:r>
+      <w:r>
+        <w:t xml:space="preserve"> </w:t>
+      </w:r>
+      <w:r>
+        <w:t xml:space="preserve">combined roads, prior-built distance, all-built fragmentation and vegetation</w:t>
+      </w:r>
+      <w:r>
+        <w:t xml:space="preserve"> </w:t>
+      </w:r>
+      <w:r>
+        <w:t xml:space="preserve">gain. The current v6 release replaces v5 after the review identified the</w:t>
+      </w:r>
+      <w:r>
+        <w:t xml:space="preserve"> </w:t>
+      </w:r>
+      <w:r>
+        <w:t xml:space="preserve">structural-zero ecological objective and the semantic inversion of new-only</w:t>
+      </w:r>
+      <w:r>
+        <w:t xml:space="preserve"> </w:t>
+      </w:r>
+      <w:r>
+        <w:t xml:space="preserve">fragmentation. Sensitivity sets are recomputed on the same rasters and reported</w:t>
+      </w:r>
+      <w:r>
+        <w:t xml:space="preserve"> </w:t>
+      </w:r>
+      <w:r>
+        <w:t xml:space="preserve">as robustness analyses, not as additional preregistered claims. These are</w:t>
+      </w:r>
+      <w:r>
+        <w:t xml:space="preserve"> </w:t>
+      </w:r>
+      <w:r>
+        <w:t xml:space="preserve">measurable public-data proxies rather than claims about welfare, equity or</w:t>
+      </w:r>
+      <w:r>
+        <w:t xml:space="preserve"> </w:t>
+      </w:r>
+      <w:r>
+        <w:t xml:space="preserve">statutory zoning.</w:t>
       </w:r>
     </w:p>
     <w:p>
@@ -1745,7 +1847,7 @@
         <w:pStyle w:val="BodyText"/>
       </w:pPr>
       <w:r>
-        <w:t xml:space="preserve">The recovered public-data bundle supports a complete re-scoring of the current</w:t>
+        <w:t xml:space="preserve">The released public-data bundle supports a complete re-scoring of the current</w:t>
       </w:r>
       <w:r>
         <w:t xml:space="preserve"> </w:t>
@@ -2154,6 +2256,62 @@
         <w:pStyle w:val="BodyText"/>
       </w:pPr>
       <w:r>
+        <w:t xml:space="preserve">The reviewer-requested FLUS input-dimension diagnostic was also completed. With</w:t>
+      </w:r>
+      <w:r>
+        <w:t xml:space="preserve"> </w:t>
+      </w:r>
+      <w:r>
+        <w:t xml:space="preserve">seed 31 and the same absolute-path console protocol, the 13-feature</w:t>
+      </w:r>
+      <w:r>
+        <w:t xml:space="preserve"> </w:t>
+      </w:r>
+      <w:r>
+        <w:t xml:space="preserve">seven-driver-plus-current-class run had strict FoM 0.0000 for both 2023 and</w:t>
+      </w:r>
+      <w:r>
+        <w:t xml:space="preserve"> </w:t>
+      </w:r>
+      <w:r>
+        <w:t xml:space="preserve">2024; the 19-feature seven-driver-plus-neighbourhood run had 0.1371 and 0.1149;</w:t>
+      </w:r>
+      <w:r>
+        <w:t xml:space="preserve"> </w:t>
+      </w:r>
+      <w:r>
+        <w:t xml:space="preserve">and the full 25-feature Kernel-matched run had 0.1320 and 0.1960. These are</w:t>
+      </w:r>
+      <w:r>
+        <w:t xml:space="preserve"> </w:t>
+      </w:r>
+      <w:r>
+        <w:t xml:space="preserve">single-seed diagnostics and are not substituted for the frozen three-seed</w:t>
+      </w:r>
+      <w:r>
+        <w:t xml:space="preserve"> </w:t>
+      </w:r>
+      <w:r>
+        <w:t xml:space="preserve">headline comparison. They show that the earlier failure was a relative-path</w:t>
+      </w:r>
+      <w:r>
+        <w:t xml:space="preserve"> </w:t>
+      </w:r>
+      <w:r>
+        <w:t xml:space="preserve">configuration error and that adding feature families alone does not reproduce</w:t>
+      </w:r>
+      <w:r>
+        <w:t xml:space="preserve"> </w:t>
+      </w:r>
+      <w:r>
+        <w:t xml:space="preserve">the Kernel proposal or its projection semantics.</w:t>
+      </w:r>
+    </w:p>
+    <w:p>
+      <w:pPr>
+        <w:pStyle w:val="BodyText"/>
+      </w:pPr>
+      <w:r>
         <w:t xml:space="preserve">The reliability sensitivity is substantially less favourable. Requiring both</w:t>
       </w:r>
       <w:r>
@@ -2234,43 +2392,43 @@
         <w:t xml:space="preserve"> </w:t>
       </w:r>
       <w:r>
-        <w:t xml:space="preserve">scikit-learn 1.9.0. A Windows rerun with the same source and inputs produced</w:t>
-      </w:r>
-      <w:r>
-        <w:t xml:space="preserve"> </w:t>
-      </w:r>
-      <w:r>
-        <w:t xml:space="preserve">approximately 498–592 differing cells per seed in 2023 and 1,005–1,147 in 2024,</w:t>
-      </w:r>
-      <w:r>
-        <w:t xml:space="preserve"> </w:t>
-      </w:r>
-      <w:r>
-        <w:t xml:space="preserve">or about 1% of the valid grid, with strict FoM differences of roughly 0.001.</w:t>
-      </w:r>
-      <w:r>
-        <w:t xml:space="preserve"> </w:t>
-      </w:r>
-      <w:r>
-        <w:t xml:space="preserve">The paired spatial-block intervals above are much wider than this platform</w:t>
-      </w:r>
-      <w:r>
-        <w:t xml:space="preserve"> </w:t>
-      </w:r>
-      <w:r>
-        <w:t xml:space="preserve">effect and preserve the same model ordering. The manifest therefore supports</w:t>
-      </w:r>
-      <w:r>
-        <w:t xml:space="preserve"> </w:t>
-      </w:r>
-      <w:r>
-        <w:t xml:space="preserve">cross-platform verification of declared files, but not a claim of bitwise</w:t>
-      </w:r>
-      <w:r>
-        <w:t xml:space="preserve"> </w:t>
-      </w:r>
-      <w:r>
-        <w:t xml:space="preserve">identity for floating-point learner outputs.</w:t>
+        <w:t xml:space="preserve">scikit-learn 1.9.0. We also reran Geospatial Kernel in a Linux container using the same source,</w:t>
+      </w:r>
+      <w:r>
+        <w:t xml:space="preserve"> </w:t>
+      </w:r>
+      <w:r>
+        <w:t xml:space="preserve">inputs and seeds 31, 47 and 73. The author-run comparison covered six rasters</w:t>
+      </w:r>
+      <w:r>
+        <w:t xml:space="preserve"> </w:t>
+      </w:r>
+      <w:r>
+        <w:t xml:space="preserve">(2023 and 2024 for each seed): all six had zero differing categorical cells and</w:t>
+      </w:r>
+      <w:r>
+        <w:t xml:space="preserve"> </w:t>
+      </w:r>
+      <w:r>
+        <w:t xml:space="preserve">zero strict-FoM delta. The archived comparison report records the exact raster</w:t>
+      </w:r>
+      <w:r>
+        <w:t xml:space="preserve"> </w:t>
+      </w:r>
+      <w:r>
+        <w:t xml:space="preserve">paths and evaluator outputs. This documents the measured stability of the</w:t>
+      </w:r>
+      <w:r>
+        <w:t xml:space="preserve"> </w:t>
+      </w:r>
+      <w:r>
+        <w:t xml:space="preserve">released pair of environments; it does not guarantee bitwise identity for</w:t>
+      </w:r>
+      <w:r>
+        <w:t xml:space="preserve"> </w:t>
+      </w:r>
+      <w:r>
+        <w:t xml:space="preserve">arbitrary BLAS, compiler or library versions.</w:t>
       </w:r>
     </w:p>
     <w:p>
@@ -2284,67 +2442,97 @@
         <w:t xml:space="preserve"> </w:t>
       </w:r>
       <w:r>
-        <w:t xml:space="preserve">scenarios. At 2031, the FLUS-style control has new-built component densities of</w:t>
-      </w:r>
-      <w:r>
-        <w:t xml:space="preserve"> </w:t>
-      </w:r>
-      <w:r>
-        <w:t xml:space="preserve">4.24–4.67 per 1,000 valid cells, the Kernel 2.97–5.62 and GeoFM-LDN 5.08–6.56.</w:t>
-      </w:r>
-      <w:r>
-        <w:t xml:space="preserve"> </w:t>
-      </w:r>
-      <w:r>
-        <w:t xml:space="preserve">The Kernel is closer to major roads and prior built cells, whereas its</w:t>
-      </w:r>
-      <w:r>
-        <w:t xml:space="preserve"> </w:t>
-      </w:r>
-      <w:r>
-        <w:t xml:space="preserve">fragmentation penalty remains visible. Under the release objective set, the</w:t>
-      </w:r>
-      <w:r>
-        <w:t xml:space="preserve"> </w:t>
-      </w:r>
-      <w:r>
-        <w:t xml:space="preserve">within-scenario frontiers contain FLUS-style and Kernel candidates in all three</w:t>
-      </w:r>
-      <w:r>
-        <w:t xml:space="preserve"> </w:t>
-      </w:r>
-      <w:r>
-        <w:t xml:space="preserve">scenarios; the GeoFM-LDN candidate is additionally non-dominated in the</w:t>
-      </w:r>
-      <w:r>
-        <w:t xml:space="preserve"> </w:t>
-      </w:r>
-      <w:r>
-        <w:t xml:space="preserve">ecological-priority scenario. All sensitivity variants retain the FLUS-style/</w:t>
-      </w:r>
-      <w:r>
-        <w:t xml:space="preserve"> </w:t>
-      </w:r>
-      <w:r>
-        <w:t xml:space="preserve">Kernel two-model structure; GeoFM-LDN remains additionally non-dominated for</w:t>
-      </w:r>
-      <w:r>
-        <w:t xml:space="preserve"> </w:t>
-      </w:r>
-      <w:r>
-        <w:t xml:space="preserve">ecological-priority growth in the two variants that retain ecological</w:t>
-      </w:r>
-      <w:r>
-        <w:t xml:space="preserve"> </w:t>
-      </w:r>
-      <w:r>
-        <w:t xml:space="preserve">conversion, but not when that objective is omitted. These statements are conditional</w:t>
-      </w:r>
-      <w:r>
-        <w:t xml:space="preserve"> </w:t>
-      </w:r>
-      <w:r>
-        <w:t xml:space="preserve">on public proxy layers and synthetic actions, not model superiority claims.</w:t>
+        <w:t xml:space="preserve">scenarios. At 2031, the FLUS-style control has union-built component densities of</w:t>
+      </w:r>
+      <w:r>
+        <w:t xml:space="preserve"> </w:t>
+      </w:r>
+      <w:r>
+        <w:t xml:space="preserve">2.48–3.27 per 1,000 valid cells, the Kernel 2.97–4.26 and GeoFM-LDN 3.22–4.34.</w:t>
+      </w:r>
+      <w:r>
+        <w:t xml:space="preserve"> </w:t>
+      </w:r>
+      <w:r>
+        <w:t xml:space="preserve">The Kernel is closer to major roads and prior built cells, whereas the union</w:t>
+      </w:r>
+      <w:r>
+        <w:t xml:space="preserve"> </w:t>
+      </w:r>
+      <w:r>
+        <w:t xml:space="preserve">metric shows that this edge-filling pattern does not automatically imply lower</w:t>
+      </w:r>
+      <w:r>
+        <w:t xml:space="preserve"> </w:t>
+      </w:r>
+      <w:r>
+        <w:t xml:space="preserve">overall fragmentation than the FLUS-style allocations. Under the release</w:t>
+      </w:r>
+      <w:r>
+        <w:t xml:space="preserve"> </w:t>
+      </w:r>
+      <w:r>
+        <w:t xml:space="preserve">objective set, the within-scenario frontiers contain FLUS-style and Kernel</w:t>
+      </w:r>
+      <w:r>
+        <w:t xml:space="preserve"> </w:t>
+      </w:r>
+      <w:r>
+        <w:t xml:space="preserve">candidates in all three scenarios; GeoFM-LDN is dominated in each scenario.</w:t>
+      </w:r>
+      <w:r>
+        <w:t xml:space="preserve"> </w:t>
+      </w:r>
+      <w:r>
+        <w:t xml:space="preserve">In the preceding v5 formulation, GeoFM-LDN could appear non-dominated only</w:t>
+      </w:r>
+      <w:r>
+        <w:t xml:space="preserve"> </w:t>
+      </w:r>
+      <w:r>
+        <w:t xml:space="preserve">because its ecological-conversion value was the same structural zero as the</w:t>
+      </w:r>
+      <w:r>
+        <w:t xml:space="preserve"> </w:t>
+      </w:r>
+      <w:r>
+        <w:t xml:space="preserve">exact-count Kernel; that zero is not a model advantage. Ecological conversion</w:t>
+      </w:r>
+      <w:r>
+        <w:t xml:space="preserve"> </w:t>
+      </w:r>
+      <w:r>
+        <w:t xml:space="preserve">is therefore retained only as a diagnostic in v6. All sensitivity variants</w:t>
+      </w:r>
+      <w:r>
+        <w:t xml:space="preserve"> </w:t>
+      </w:r>
+      <w:r>
+        <w:t xml:space="preserve">retain the same FLUS-style/Kernel two-model frontier. These statements are</w:t>
+      </w:r>
+      <w:r>
+        <w:t xml:space="preserve"> </w:t>
+      </w:r>
+      <w:r>
+        <w:t xml:space="preserve">conditional on public proxy layers and synthetic actions, not model superiority</w:t>
+      </w:r>
+      <w:r>
+        <w:t xml:space="preserve"> </w:t>
+      </w:r>
+      <w:r>
+        <w:t xml:space="preserve">claims.</w:t>
+      </w:r>
+      <w:r>
+        <w:t xml:space="preserve"> </w:t>
+      </w:r>
+      <w:r>
+        <w:t xml:space="preserve">The corresponding objective profiles and diagnostic trade-offs are shown in</w:t>
+      </w:r>
+      <w:r>
+        <w:t xml:space="preserve"> </w:t>
+      </w:r>
+      <w:r>
+        <w:t xml:space="preserve">Fig. 3.</w:t>
       </w:r>
       <w:r>
         <w:t xml:space="preserve"> </w:t>
@@ -2428,25 +2616,31 @@
         <w:t xml:space="preserve"> </w:t>
       </w:r>
       <w:r>
-        <w:t xml:space="preserve">three seeds. Distances are metres, component density is connected new-built</w:t>
-      </w:r>
-      <w:r>
-        <w:t xml:space="preserve"> </w:t>
-      </w:r>
-      <w:r>
-        <w:t xml:space="preserve">components per 1,000 valid cells, and ecological conversion is the fraction of</w:t>
-      </w:r>
-      <w:r>
-        <w:t xml:space="preserve"> </w:t>
-      </w:r>
-      <w:r>
-        <w:t xml:space="preserve">new-built cells whose origin class was woody, low vegetation or wetland. A star</w:t>
-      </w:r>
-      <w:r>
-        <w:t xml:space="preserve"> </w:t>
-      </w:r>
-      <w:r>
-        <w:t xml:space="preserve">denotes membership in the primary within-scenario Pareto frontier.</w:t>
+        <w:t xml:space="preserve">three seeds. Distances are metres, union-built component density is the number</w:t>
+      </w:r>
+      <w:r>
+        <w:t xml:space="preserve"> </w:t>
+      </w:r>
+      <w:r>
+        <w:t xml:space="preserve">of connected components in the 2024-built ∪ newly-built footprint per 1,000</w:t>
+      </w:r>
+      <w:r>
+        <w:t xml:space="preserve"> </w:t>
+      </w:r>
+      <w:r>
+        <w:t xml:space="preserve">valid cells, and ecological conversion is a descriptive fraction of new-built</w:t>
+      </w:r>
+      <w:r>
+        <w:t xml:space="preserve"> </w:t>
+      </w:r>
+      <w:r>
+        <w:t xml:space="preserve">cells whose origin class was woody, low vegetation or wetland. A star denotes</w:t>
+      </w:r>
+      <w:r>
+        <w:t xml:space="preserve"> </w:t>
+      </w:r>
+      <w:r>
+        <w:t xml:space="preserve">membership in the primary within-scenario Pareto frontier.</w:t>
       </w:r>
     </w:p>
     <w:tbl>
@@ -2523,7 +2717,7 @@
               <w:jc w:val="right"/>
             </w:pPr>
             <w:r>
-              <w:t xml:space="preserve">New-built components/1,000</w:t>
+              <w:t xml:space="preserve">Union-built components/1,000</w:t>
             </w:r>
           </w:p>
         </w:tc>
@@ -2535,7 +2729,7 @@
               <w:jc w:val="right"/>
             </w:pPr>
             <w:r>
-              <w:t xml:space="preserve">Ecological conversion</w:t>
+              <w:t xml:space="preserve">Ecological conversion (diagnostic)</w:t>
             </w:r>
           </w:p>
         </w:tc>
@@ -2607,7 +2801,7 @@
               <w:jc w:val="right"/>
             </w:pPr>
             <w:r>
-              <w:t xml:space="preserve">4.666</w:t>
+              <w:t xml:space="preserve">3.035</w:t>
             </w:r>
           </w:p>
         </w:tc>
@@ -2691,7 +2885,7 @@
               <w:jc w:val="right"/>
             </w:pPr>
             <w:r>
-              <w:t xml:space="preserve">5.619</w:t>
+              <w:t xml:space="preserve">3.922</w:t>
             </w:r>
           </w:p>
         </w:tc>
@@ -2775,7 +2969,7 @@
               <w:jc w:val="right"/>
             </w:pPr>
             <w:r>
-              <w:t xml:space="preserve">5.757</w:t>
+              <w:t xml:space="preserve">4.081</w:t>
             </w:r>
           </w:p>
         </w:tc>
@@ -2855,7 +3049,7 @@
               <w:jc w:val="right"/>
             </w:pPr>
             <w:r>
-              <w:t xml:space="preserve">4.578</w:t>
+              <w:t xml:space="preserve">3.265</w:t>
             </w:r>
           </w:p>
         </w:tc>
@@ -2939,7 +3133,7 @@
               <w:jc w:val="right"/>
             </w:pPr>
             <w:r>
-              <w:t xml:space="preserve">5.381</w:t>
+              <w:t xml:space="preserve">4.256</w:t>
             </w:r>
           </w:p>
         </w:tc>
@@ -3023,7 +3217,7 @@
               <w:jc w:val="right"/>
             </w:pPr>
             <w:r>
-              <w:t xml:space="preserve">5.080</w:t>
+              <w:t xml:space="preserve">4.340</w:t>
             </w:r>
           </w:p>
         </w:tc>
@@ -3044,11 +3238,7 @@
           <w:p>
             <w:pPr>
               <w:pStyle w:val="Compact"/>
-              <w:jc w:val="center"/>
-            </w:pPr>
-            <w:r>
-              <w:t xml:space="preserve">*</w:t>
-            </w:r>
+            </w:pPr>
           </w:p>
         </w:tc>
       </w:tr>
@@ -3107,7 +3297,7 @@
               <w:jc w:val="right"/>
             </w:pPr>
             <w:r>
-              <w:t xml:space="preserve">4.240</w:t>
+              <w:t xml:space="preserve">2.484</w:t>
             </w:r>
           </w:p>
         </w:tc>
@@ -3191,7 +3381,7 @@
               <w:jc w:val="right"/>
             </w:pPr>
             <w:r>
-              <w:t xml:space="preserve">4.754</w:t>
+              <w:t xml:space="preserve">2.969</w:t>
             </w:r>
           </w:p>
         </w:tc>
@@ -3275,7 +3465,7 @@
               <w:jc w:val="right"/>
             </w:pPr>
             <w:r>
-              <w:t xml:space="preserve">6.556</w:t>
+              <w:t xml:space="preserve">3.219</w:t>
             </w:r>
           </w:p>
         </w:tc>
@@ -3301,8 +3491,8 @@
         </w:tc>
       </w:tr>
     </w:tbl>
-    <w:bookmarkEnd w:id="22"/>
-    <w:bookmarkStart w:id="23" w:name="Xcd70f225f45b9532756a485fa8bec6f5eb5ebdb"/>
+    <w:bookmarkEnd w:id="23"/>
+    <w:bookmarkStart w:id="24" w:name="Xcd70f225f45b9532756a485fa8bec6f5eb5ebdb"/>
     <w:p>
       <w:pPr>
         <w:pStyle w:val="Heading3"/>
@@ -3324,47 +3514,59 @@
         <w:pStyle w:val="BodyText"/>
       </w:pPr>
       <w:r>
-        <w:t xml:space="preserve">In the post-hoc neighbourhood-weight sensitivity, the mean strict FoM changed</w:t>
-      </w:r>
-      <w:r>
-        <w:t xml:space="preserve"> </w:t>
-      </w:r>
-      <w:r>
-        <w:t xml:space="preserve">from 0.19997 to 0.20042 across weights 0–0.7 in 2023 and from 0.26079 to</w:t>
-      </w:r>
-      <w:r>
-        <w:t xml:space="preserve"> </w:t>
-      </w:r>
-      <w:r>
-        <w:t xml:space="preserve">0.26034 in 2024. These changes are small relative to the model contrasts and</w:t>
-      </w:r>
-      <w:r>
-        <w:t xml:space="preserve"> </w:t>
-      </w:r>
-      <w:r>
-        <w:t xml:space="preserve">are not interpreted causally. Objective-set sensitivity on the planning rasters</w:t>
-      </w:r>
-      <w:r>
-        <w:t xml:space="preserve"> </w:t>
-      </w:r>
-      <w:r>
-        <w:t xml:space="preserve">retained the FLUS-style and Kernel candidates in all scenarios. GeoFM-LDN was</w:t>
-      </w:r>
-      <w:r>
-        <w:t xml:space="preserve"> </w:t>
-      </w:r>
-      <w:r>
-        <w:t xml:space="preserve">additionally non-dominated only for ecological-priority growth in the variants</w:t>
-      </w:r>
-      <w:r>
-        <w:t xml:space="preserve"> </w:t>
-      </w:r>
-      <w:r>
-        <w:t xml:space="preserve">that retained ecological conversion.</w:t>
-      </w:r>
-    </w:p>
-    <w:bookmarkEnd w:id="23"/>
-    <w:bookmarkStart w:id="24" w:name="Xb4da06261b5a2056ba43f7c28dc24c9379bfe9e"/>
+        <w:t xml:space="preserve">In the post-hoc neighbourhood-weight sensitivity, the mean strict FoM ranged</w:t>
+      </w:r>
+      <w:r>
+        <w:t xml:space="preserve"> </w:t>
+      </w:r>
+      <w:r>
+        <w:t xml:space="preserve">from 0.19598 at weight 0 to 0.19472 at weight 0.7 in 2023, and from 0.25280</w:t>
+      </w:r>
+      <w:r>
+        <w:t xml:space="preserve"> </w:t>
+      </w:r>
+      <w:r>
+        <w:t xml:space="preserve">at weight 0 to 0.25130 at weight 0.7 in 2024; the complete strict-evaluator</w:t>
+      </w:r>
+      <w:r>
+        <w:t xml:space="preserve"> </w:t>
+      </w:r>
+      <w:r>
+        <w:t xml:space="preserve">scan is provided in Supplementary Table S2. These changes are small relative</w:t>
+      </w:r>
+      <w:r>
+        <w:t xml:space="preserve"> </w:t>
+      </w:r>
+      <w:r>
+        <w:t xml:space="preserve">to the model contrasts and are not interpreted causally. Objective-set</w:t>
+      </w:r>
+      <w:r>
+        <w:t xml:space="preserve"> </w:t>
+      </w:r>
+      <w:r>
+        <w:t xml:space="preserve">sensitivity on the planning rasters retained the FLUS-style and Kernel</w:t>
+      </w:r>
+      <w:r>
+        <w:t xml:space="preserve"> </w:t>
+      </w:r>
+      <w:r>
+        <w:t xml:space="preserve">candidates in all scenarios. GeoFM-LDN was dominated in all three scenarios</w:t>
+      </w:r>
+      <w:r>
+        <w:t xml:space="preserve"> </w:t>
+      </w:r>
+      <w:r>
+        <w:t xml:space="preserve">after the structurally zero ecological-conversion term was removed from the</w:t>
+      </w:r>
+      <w:r>
+        <w:t xml:space="preserve"> </w:t>
+      </w:r>
+      <w:r>
+        <w:t xml:space="preserve">release objectives.</w:t>
+      </w:r>
+    </w:p>
+    <w:bookmarkEnd w:id="24"/>
+    <w:bookmarkStart w:id="25" w:name="Xb4da06261b5a2056ba43f7c28dc24c9379bfe9e"/>
     <w:p>
       <w:pPr>
         <w:pStyle w:val="Heading3"/>
@@ -3441,9 +3643,9 @@
         <w:t xml:space="preserve">that either component causes an urban outcome.</w:t>
       </w:r>
     </w:p>
-    <w:bookmarkEnd w:id="24"/>
     <w:bookmarkEnd w:id="25"/>
-    <w:bookmarkStart w:id="26" w:name="discussion"/>
+    <w:bookmarkEnd w:id="26"/>
+    <w:bookmarkStart w:id="27" w:name="discussion"/>
     <w:p>
       <w:pPr>
         <w:pStyle w:val="Heading2"/>
@@ -3501,41 +3703,47 @@
         <w:t xml:space="preserve"> </w:t>
       </w:r>
       <w:r>
-        <w:t xml:space="preserve">control is an unmatched, untraceable Apple-Silicon binary, and the matched-input</w:t>
-      </w:r>
-      <w:r>
-        <w:t xml:space="preserve"> </w:t>
-      </w:r>
-      <w:r>
-        <w:t xml:space="preserve">attempt failed before producing a valid surface. These public-data stress tests</w:t>
-      </w:r>
-      <w:r>
-        <w:t xml:space="preserve"> </w:t>
-      </w:r>
-      <w:r>
-        <w:t xml:space="preserve">therefore do not establish causal planning effects or a validated Abu Dhabi</w:t>
-      </w:r>
-      <w:r>
-        <w:t xml:space="preserve"> </w:t>
-      </w:r>
-      <w:r>
-        <w:t xml:space="preserve">forecast. An authoritative deployment would replace public labels and masks with</w:t>
-      </w:r>
-      <w:r>
-        <w:t xml:space="preserve"> </w:t>
-      </w:r>
-      <w:r>
-        <w:t xml:space="preserve">locally approved land-use, infrastructure, ecological and development-demand</w:t>
-      </w:r>
-      <w:r>
-        <w:t xml:space="preserve"> </w:t>
-      </w:r>
-      <w:r>
-        <w:t xml:space="preserve">records while retaining the same execution contract.</w:t>
-      </w:r>
-    </w:p>
-    <w:bookmarkEnd w:id="26"/>
-    <w:bookmarkStart w:id="27" w:name="data-availability"/>
+        <w:t xml:space="preserve">control remains an untraceable Apple-Silicon binary and its headline comparison</w:t>
+      </w:r>
+      <w:r>
+        <w:t xml:space="preserve"> </w:t>
+      </w:r>
+      <w:r>
+        <w:t xml:space="preserve">uses seven drivers; the successful 25-feature run is a one-seed diagnostic, not a</w:t>
+      </w:r>
+      <w:r>
+        <w:t xml:space="preserve"> </w:t>
+      </w:r>
+      <w:r>
+        <w:t xml:space="preserve">replacement for the primary baseline. These public-data stress tests therefore do</w:t>
+      </w:r>
+      <w:r>
+        <w:t xml:space="preserve"> </w:t>
+      </w:r>
+      <w:r>
+        <w:t xml:space="preserve">not establish causal planning effects or a validated Abu Dhabi forecast. An</w:t>
+      </w:r>
+      <w:r>
+        <w:t xml:space="preserve"> </w:t>
+      </w:r>
+      <w:r>
+        <w:t xml:space="preserve">authoritative deployment would replace public labels and masks with locally</w:t>
+      </w:r>
+      <w:r>
+        <w:t xml:space="preserve"> </w:t>
+      </w:r>
+      <w:r>
+        <w:t xml:space="preserve">approved land-use, infrastructure, ecological and development-demand records</w:t>
+      </w:r>
+      <w:r>
+        <w:t xml:space="preserve"> </w:t>
+      </w:r>
+      <w:r>
+        <w:t xml:space="preserve">while retaining the same execution contract.</w:t>
+      </w:r>
+    </w:p>
+    <w:bookmarkEnd w:id="27"/>
+    <w:bookmarkStart w:id="28" w:name="data-availability"/>
     <w:p>
       <w:pPr>
         <w:pStyle w:val="Heading2"/>
@@ -3786,11 +3994,11 @@
         <w:t xml:space="preserve"> </w:t>
       </w:r>
       <w:r>
-        <w:t xml:space="preserve">can pass the manifest gate. The locked macOS arm64 execution environment remains the reference for model outputs; Kernel reruns on other platforms can differ by about 1% of pixels and approximately 0.001 FoM. No private database address, credential or client-only service is included. Authoritative Abu Dhabi land-use and independent change-validation data remain outside this study.</w:t>
-      </w:r>
-    </w:p>
-    <w:bookmarkEnd w:id="27"/>
-    <w:bookmarkStart w:id="28" w:name="code-availability"/>
+        <w:t xml:space="preserve">can pass the manifest gate. The locked macOS arm64 execution environment remains the reference for model outputs. An author-run Linux comparison of six historical Kernel rasters found zero categorical-cell differences and zero strict-FoM delta; this result is archived as a measured cross-platform check, not a universal bitwise-identity guarantee. No private database address, credential or client-only service is included. Authoritative Abu Dhabi land-use and independent change-validation data remain outside this study.</w:t>
+      </w:r>
+    </w:p>
+    <w:bookmarkEnd w:id="28"/>
+    <w:bookmarkStart w:id="29" w:name="code-availability"/>
     <w:p>
       <w:pPr>
         <w:pStyle w:val="Heading2"/>
@@ -3992,8 +4200,8 @@
         <w:t xml:space="preserve">to the submission metadata.</w:t>
       </w:r>
     </w:p>
-    <w:bookmarkEnd w:id="28"/>
-    <w:bookmarkStart w:id="29" w:name="declarations"/>
+    <w:bookmarkEnd w:id="29"/>
+    <w:bookmarkStart w:id="30" w:name="declarations"/>
     <w:p>
       <w:pPr>
         <w:pStyle w:val="Heading2"/>
@@ -4092,8 +4300,8 @@
         <w:t xml:space="preserve">Not applicable; the study used geospatial raster, vector and derived public-data products and did not involve human or animal participants.</w:t>
       </w:r>
     </w:p>
-    <w:bookmarkEnd w:id="29"/>
-    <w:bookmarkStart w:id="30" w:name="references"/>
+    <w:bookmarkEnd w:id="30"/>
+    <w:bookmarkStart w:id="31" w:name="references"/>
     <w:p>
       <w:pPr>
         <w:pStyle w:val="Heading2"/>
@@ -4399,8 +4607,8 @@
         <w:t xml:space="preserve">Zanaga, D., et al. (2022). ESA WorldCover 10 m 2021 v200. Zenodo. https://doi.org/10.5281/zenodo.7254221</w:t>
       </w:r>
     </w:p>
-    <w:bookmarkEnd w:id="30"/>
-    <w:bookmarkStart w:id="46" w:name="figure-legends"/>
+    <w:bookmarkEnd w:id="31"/>
+    <w:bookmarkStart w:id="47" w:name="figure-legends"/>
     <w:p>
       <w:pPr>
         <w:pStyle w:val="Heading2"/>
@@ -4411,25 +4619,25 @@
     </w:p>
     <w:p>
       <w:pPr>
-        <w:pStyle w:val="CaptionedFigure"/>
+        <w:pStyle w:val="FirstParagraph"/>
       </w:pPr>
       <w:r>
         <w:drawing>
           <wp:inline>
             <wp:extent cx="5334000" cy="3481042"/>
             <wp:effectExtent b="0" l="0" r="0" t="0"/>
-            <wp:docPr descr="Figure 1: benchmark and execution contract" title="" id="32" name="Picture"/>
+            <wp:docPr descr="" title="" id="33" name="Picture"/>
             <a:graphic>
               <a:graphicData uri="http://schemas.openxmlformats.org/drawingml/2006/picture">
                 <pic:pic>
                   <pic:nvPicPr>
-                    <pic:cNvPr descr="figures/fig01_benchmark_contract.png" id="33" name="Picture"/>
+                    <pic:cNvPr descr="figures/fig01_benchmark_contract.png" id="34" name="Picture"/>
                     <pic:cNvPicPr>
                       <a:picLocks noChangeArrowheads="1" noChangeAspect="1"/>
                     </pic:cNvPicPr>
                   </pic:nvPicPr>
                   <pic:blipFill>
-                    <a:blip r:embed="rId31"/>
+                    <a:blip r:embed="rId32"/>
                     <a:stretch>
                       <a:fillRect/>
                     </a:stretch>
@@ -4458,14 +4666,6 @@
     </w:p>
     <w:p>
       <w:pPr>
-        <w:pStyle w:val="ImageCaption"/>
-      </w:pPr>
-      <w:r>
-        <w:t xml:space="preserve">Figure 1: benchmark and execution contract</w:t>
-      </w:r>
-    </w:p>
-    <w:p>
-      <w:pPr>
         <w:pStyle w:val="BodyText"/>
       </w:pPr>
       <w:r>
@@ -4484,25 +4684,25 @@
     </w:p>
     <w:p>
       <w:pPr>
-        <w:pStyle w:val="CaptionedFigure"/>
+        <w:pStyle w:val="BodyText"/>
       </w:pPr>
       <w:r>
         <w:drawing>
           <wp:inline>
-            <wp:extent cx="5334000" cy="3538245"/>
+            <wp:extent cx="5334000" cy="3703670"/>
             <wp:effectExtent b="0" l="0" r="0" t="0"/>
-            <wp:docPr descr="Figure 2: historical allocation skill" title="" id="35" name="Picture"/>
+            <wp:docPr descr="" title="" id="36" name="Picture"/>
             <a:graphic>
               <a:graphicData uri="http://schemas.openxmlformats.org/drawingml/2006/picture">
                 <pic:pic>
                   <pic:nvPicPr>
-                    <pic:cNvPr descr="figures/fig02_historical_validation.png" id="36" name="Picture"/>
+                    <pic:cNvPr descr="figures/fig02_historical_validation.png" id="37" name="Picture"/>
                     <pic:cNvPicPr>
                       <a:picLocks noChangeArrowheads="1" noChangeAspect="1"/>
                     </pic:cNvPicPr>
                   </pic:nvPicPr>
                   <pic:blipFill>
-                    <a:blip r:embed="rId34"/>
+                    <a:blip r:embed="rId35"/>
                     <a:stretch>
                       <a:fillRect/>
                     </a:stretch>
@@ -4510,7 +4710,7 @@
                   <pic:spPr bwMode="auto">
                     <a:xfrm>
                       <a:off x="0" y="0"/>
-                      <a:ext cx="5334000" cy="3538245"/>
+                      <a:ext cx="5334000" cy="3703670"/>
                     </a:xfrm>
                     <a:prstGeom prst="rect">
                       <a:avLst/>
@@ -4531,14 +4731,6 @@
     </w:p>
     <w:p>
       <w:pPr>
-        <w:pStyle w:val="ImageCaption"/>
-      </w:pPr>
-      <w:r>
-        <w:t xml:space="preserve">Figure 2: historical allocation skill</w:t>
-      </w:r>
-    </w:p>
-    <w:p>
-      <w:pPr>
         <w:pStyle w:val="BodyText"/>
       </w:pPr>
       <w:r>
@@ -4587,25 +4779,25 @@
     </w:p>
     <w:p>
       <w:pPr>
-        <w:pStyle w:val="CaptionedFigure"/>
+        <w:pStyle w:val="BodyText"/>
       </w:pPr>
       <w:r>
         <w:drawing>
           <wp:inline>
-            <wp:extent cx="5334000" cy="3520971"/>
+            <wp:extent cx="5334000" cy="3550480"/>
             <wp:effectExtent b="0" l="0" r="0" t="0"/>
-            <wp:docPr descr="Figure 3: conditional planning objectives" title="" id="38" name="Picture"/>
+            <wp:docPr descr="" title="" id="39" name="Picture"/>
             <a:graphic>
               <a:graphicData uri="http://schemas.openxmlformats.org/drawingml/2006/picture">
                 <pic:pic>
                   <pic:nvPicPr>
-                    <pic:cNvPr descr="figures/fig03_planning_objectives.png" id="39" name="Picture"/>
+                    <pic:cNvPr descr="figures/fig03_planning_objectives.png" id="40" name="Picture"/>
                     <pic:cNvPicPr>
                       <a:picLocks noChangeArrowheads="1" noChangeAspect="1"/>
                     </pic:cNvPicPr>
                   </pic:nvPicPr>
                   <pic:blipFill>
-                    <a:blip r:embed="rId37"/>
+                    <a:blip r:embed="rId38"/>
                     <a:stretch>
                       <a:fillRect/>
                     </a:stretch>
@@ -4613,7 +4805,7 @@
                   <pic:spPr bwMode="auto">
                     <a:xfrm>
                       <a:off x="0" y="0"/>
-                      <a:ext cx="5334000" cy="3520971"/>
+                      <a:ext cx="5334000" cy="3550480"/>
                     </a:xfrm>
                     <a:prstGeom prst="rect">
                       <a:avLst/>
@@ -4634,14 +4826,6 @@
     </w:p>
     <w:p>
       <w:pPr>
-        <w:pStyle w:val="ImageCaption"/>
-      </w:pPr>
-      <w:r>
-        <w:t xml:space="preserve">Figure 3: conditional planning objectives</w:t>
-      </w:r>
-    </w:p>
-    <w:p>
-      <w:pPr>
         <w:pStyle w:val="BodyText"/>
       </w:pPr>
       <w:r>
@@ -4667,25 +4851,31 @@
         <w:t xml:space="preserve"> </w:t>
       </w:r>
       <w:r>
-        <w:t xml:space="preserve">growth and high-outward-growth actions. Panels A–D show the release objectives:</w:t>
-      </w:r>
-      <w:r>
-        <w:t xml:space="preserve"> </w:t>
-      </w:r>
-      <w:r>
-        <w:t xml:space="preserve">distance to major roads, distance to prior built cells, new-built components per</w:t>
-      </w:r>
-      <w:r>
-        <w:t xml:space="preserve"> </w:t>
-      </w:r>
-      <w:r>
-        <w:t xml:space="preserve">1,000 valid cells and ecological conversion. Panel E shows vegetation gain as a</w:t>
-      </w:r>
-      <w:r>
-        <w:t xml:space="preserve"> </w:t>
-      </w:r>
-      <w:r>
-        <w:t xml:space="preserve">descriptive scenario-input diagnostic; panel F shows the 500-m leapfrog rate. Stars mark</w:t>
+        <w:t xml:space="preserve">growth and high-outward-growth actions. Panels A–C show the release objectives:</w:t>
+      </w:r>
+      <w:r>
+        <w:t xml:space="preserve"> </w:t>
+      </w:r>
+      <w:r>
+        <w:t xml:space="preserve">distance to major roads, distance to prior built cells and components in the</w:t>
+      </w:r>
+      <w:r>
+        <w:t xml:space="preserve"> </w:t>
+      </w:r>
+      <w:r>
+        <w:t xml:space="preserve">2024-built ∪ newly-built footprint per 1,000 valid cells. Panel D shows</w:t>
+      </w:r>
+      <w:r>
+        <w:t xml:space="preserve"> </w:t>
+      </w:r>
+      <w:r>
+        <w:t xml:space="preserve">ecological conversion as a descriptive diagnostic; panel E shows vegetation gain</w:t>
+      </w:r>
+      <w:r>
+        <w:t xml:space="preserve"> </w:t>
+      </w:r>
+      <w:r>
+        <w:t xml:space="preserve">as a scenario-input diagnostic; panel F shows the 500-m leapfrog rate. Stars mark</w:t>
       </w:r>
       <w:r>
         <w:t xml:space="preserve"> </w:t>
@@ -4702,25 +4892,25 @@
     </w:p>
     <w:p>
       <w:pPr>
-        <w:pStyle w:val="CaptionedFigure"/>
+        <w:pStyle w:val="BodyText"/>
       </w:pPr>
       <w:r>
         <w:drawing>
           <wp:inline>
-            <wp:extent cx="5334000" cy="3704556"/>
+            <wp:extent cx="5334000" cy="3703670"/>
             <wp:effectExtent b="0" l="0" r="0" t="0"/>
-            <wp:docPr descr="Figure 4: mechanism controls" title="" id="41" name="Picture"/>
+            <wp:docPr descr="" title="" id="42" name="Picture"/>
             <a:graphic>
               <a:graphicData uri="http://schemas.openxmlformats.org/drawingml/2006/picture">
                 <pic:pic>
                   <pic:nvPicPr>
-                    <pic:cNvPr descr="figures/fig04_mechanism_ablation.png" id="42" name="Picture"/>
+                    <pic:cNvPr descr="figures/fig04_mechanism_ablation.png" id="43" name="Picture"/>
                     <pic:cNvPicPr>
                       <a:picLocks noChangeArrowheads="1" noChangeAspect="1"/>
                     </pic:cNvPicPr>
                   </pic:nvPicPr>
                   <pic:blipFill>
-                    <a:blip r:embed="rId40"/>
+                    <a:blip r:embed="rId41"/>
                     <a:stretch>
                       <a:fillRect/>
                     </a:stretch>
@@ -4728,7 +4918,7 @@
                   <pic:spPr bwMode="auto">
                     <a:xfrm>
                       <a:off x="0" y="0"/>
-                      <a:ext cx="5334000" cy="3704556"/>
+                      <a:ext cx="5334000" cy="3703670"/>
                     </a:xfrm>
                     <a:prstGeom prst="rect">
                       <a:avLst/>
@@ -4749,14 +4939,6 @@
     </w:p>
     <w:p>
       <w:pPr>
-        <w:pStyle w:val="ImageCaption"/>
-      </w:pPr>
-      <w:r>
-        <w:t xml:space="preserve">Figure 4: mechanism controls</w:t>
-      </w:r>
-    </w:p>
-    <w:p>
-      <w:pPr>
         <w:pStyle w:val="BodyText"/>
       </w:pPr>
       <w:r>
@@ -4799,25 +4981,25 @@
     </w:p>
     <w:p>
       <w:pPr>
-        <w:pStyle w:val="CaptionedFigure"/>
+        <w:pStyle w:val="BodyText"/>
       </w:pPr>
       <w:r>
         <w:drawing>
           <wp:inline>
             <wp:extent cx="5334000" cy="5443359"/>
             <wp:effectExtent b="0" l="0" r="0" t="0"/>
-            <wp:docPr descr="Figure 5: 2031 spatial footprints" title="" id="44" name="Picture"/>
+            <wp:docPr descr="" title="" id="45" name="Picture"/>
             <a:graphic>
               <a:graphicData uri="http://schemas.openxmlformats.org/drawingml/2006/picture">
                 <pic:pic>
                   <pic:nvPicPr>
-                    <pic:cNvPr descr="figures/fig05_planning_maps_2031.png" id="45" name="Picture"/>
+                    <pic:cNvPr descr="figures/fig05_planning_maps_2031.png" id="46" name="Picture"/>
                     <pic:cNvPicPr>
                       <a:picLocks noChangeArrowheads="1" noChangeAspect="1"/>
                     </pic:cNvPicPr>
                   </pic:nvPicPr>
                   <pic:blipFill>
-                    <a:blip r:embed="rId43"/>
+                    <a:blip r:embed="rId44"/>
                     <a:stretch>
                       <a:fillRect/>
                     </a:stretch>
@@ -4846,14 +5028,6 @@
     </w:p>
     <w:p>
       <w:pPr>
-        <w:pStyle w:val="ImageCaption"/>
-      </w:pPr>
-      <w:r>
-        <w:t xml:space="preserve">Figure 5: 2031 spatial footprints</w:t>
-      </w:r>
-    </w:p>
-    <w:p>
-      <w:pPr>
         <w:pStyle w:val="BodyText"/>
       </w:pPr>
       <w:r>
@@ -4888,8 +5062,8 @@
         <w:t xml:space="preserve">cadastral parcels.</w:t>
       </w:r>
     </w:p>
-    <w:bookmarkEnd w:id="46"/>
-    <w:bookmarkStart w:id="47" w:name="supplementary-information-outline"/>
+    <w:bookmarkEnd w:id="47"/>
+    <w:bookmarkStart w:id="48" w:name="supplementary-information-outline"/>
     <w:p>
       <w:pPr>
         <w:pStyle w:val="Heading2"/>
@@ -4983,7 +5157,19 @@
         <w:t xml:space="preserve"> </w:t>
       </w:r>
       <w:r>
-        <w:t xml:space="preserve">Neighbourhood-weight sensitivity at 0, 0.175, 0.35 and 0.7.</w:t>
+        <w:t xml:space="preserve">Neighbourhood-weight sensitivity at 0, 0.175, 0.35 and 0.7 (see</w:t>
+      </w:r>
+      <w:r>
+        <w:t xml:space="preserve"> </w:t>
+      </w:r>
+      <w:r>
+        <w:rPr>
+          <w:rStyle w:val="VerbatimChar"/>
+        </w:rPr>
+        <w:t xml:space="preserve">supplementary_table_S2_neighbourhood_weight_sensitivity.md</w:t>
+      </w:r>
+      <w:r>
+        <w:t xml:space="preserve">).</w:t>
       </w:r>
     </w:p>
     <w:p>
@@ -5081,8 +5267,8 @@
         </w:pict>
       </w:r>
     </w:p>
-    <w:bookmarkEnd w:id="47"/>
     <w:bookmarkEnd w:id="48"/>
+    <w:bookmarkEnd w:id="49"/>
     <w:sectPr>
       <w:footnotePr>
         <w:numRestart w:val="eachSect"/>

</xml_diff>

<commit_message>
Address sixth-round LUP review
</commit_message>
<xml_diff>
--- a/manuscript/manuscript.docx
+++ b/manuscript/manuscript.docx
@@ -334,7 +334,43 @@
         <w:t xml:space="preserve"> </w:t>
       </w:r>
       <w:r>
-        <w:t xml:space="preserve">an observed land-use product.</w:t>
+        <w:t xml:space="preserve">an observed land-use product. A structural-zero metric is flagged operationally</w:t>
+      </w:r>
+      <w:r>
+        <w:t xml:space="preserve"> </w:t>
+      </w:r>
+      <w:r>
+        <w:t xml:space="preserve">when its denominator is zero for every candidate under the declared action and</w:t>
+      </w:r>
+      <w:r>
+        <w:t xml:space="preserve"> </w:t>
+      </w:r>
+      <w:r>
+        <w:t xml:space="preserve">constraint rules; for exact-count allocation, a conversion rate is also a</w:t>
+      </w:r>
+      <w:r>
+        <w:t xml:space="preserve"> </w:t>
+      </w:r>
+      <w:r>
+        <w:t xml:space="preserve">structural zero when the protected/source rule makes the relevant source class</w:t>
+      </w:r>
+      <w:r>
+        <w:t xml:space="preserve"> </w:t>
+      </w:r>
+      <w:r>
+        <w:t xml:space="preserve">monotonically non-decreasing, so no eligible source cells can contribute to that</w:t>
+      </w:r>
+      <w:r>
+        <w:t xml:space="preserve"> </w:t>
+      </w:r>
+      <w:r>
+        <w:t xml:space="preserve">transition. Such a metric is reported descriptively and excluded from Pareto</w:t>
+      </w:r>
+      <w:r>
+        <w:t xml:space="preserve"> </w:t>
+      </w:r>
+      <w:r>
+        <w:t xml:space="preserve">selection.</w:t>
       </w:r>
     </w:p>
     <w:bookmarkEnd w:id="13"/>
@@ -1395,7 +1431,143 @@
         <w:pStyle w:val="FirstParagraph"/>
       </w:pPr>
       <w:r>
-        <w:t xml:space="preserve">The baseline was run through a FLUS-style ANN–CA console using seven continuous drivers: normalized row and column coordinates, elevation, slope, VIIRS radiance, distance to roads and distance to major roads. Its ANN suitability surface was passed to a cellular-automata allocation stage with the common class totals and public hard mask. The archived run used one 2021 training year, eight ANN hidden neurons, a 3 × 3 CA neighbourhood, neighbourhood strength 1.0, acceleration factor 0.1 and 1,000 iterations. Its frozen transition matrix protected water and wetland but did not prohibit built-to-non-built transitions. The supplied Mach-O executable cannot be traced to a reproducible upstream release or source commit, so we label this control “FLUS-style ANN–CA console (untraceable build)” and do not claim equivalence to the Liu et al. (2017) implementation. A 25-feature Kernel-matched input was executed with absolute paths. The run completed for seed 31, wrote a valid probability surface and produced 2023/2024 predictions; its archived log, configuration and report are retained as a matched-input diagnostic rather than silently replacing the original seven-driver baseline. Two intermediate configurations (13 features: seven drivers plus current-class indicators; 19 features: seven drivers plus neighbourhood fractions) also completed for seed 31. Their results are dimensionality diagnostics, not additional three-seed headline comparisons.</w:t>
+        <w:t xml:space="preserve">The baseline was run through a FLUS-style ANN–CA console using seven continuous drivers: normalized row and column coordinates, elevation, slope, VIIRS radiance, distance to roads and distance to major roads. Its ANN suitability surface was passed to a cellular-automata allocation stage with the common class totals and public hard mask. The archived run used one 2021 training year, eight ANN hidden neurons, a 3 × 3 CA neighbourhood, neighbourhood strength 1.0, acceleration factor 0.1 and 1,000 iterations. Its frozen transition matrix protected water and wetland but did not prohibit built-to-non-built transitions. The supplied Mach-O executable cannot be traced to a reproducible upstream release or source commit, so we label this control “FLUS-style ANN–CA console (untraceable build)” and do not claim equivalence to the Liu et al. (2017) implementation. A 25-feature Kernel-matched input was then executed with absolute paths for seeds 31, 47 and 73 and is reported as a separate matched-input baseline. It shares the Kernel feature family, but not the learning target or projection semantics: the FLUS ANN estimates same-year label suitability</w:t>
+      </w:r>
+      <w:r>
+        <w:t xml:space="preserve"> </w:t>
+      </w:r>
+      <m:oMath>
+        <m:r>
+          <m:t>p</m:t>
+        </m:r>
+        <m:r>
+          <m:rPr>
+            <m:sty m:val="p"/>
+          </m:rPr>
+          <m:t>(</m:t>
+        </m:r>
+        <m:sSub>
+          <m:e>
+            <m:r>
+              <m:t>S</m:t>
+            </m:r>
+          </m:e>
+          <m:sub>
+            <m:r>
+              <m:t>t</m:t>
+            </m:r>
+          </m:sub>
+        </m:sSub>
+        <m:r>
+          <m:rPr>
+            <m:sty m:val="p"/>
+          </m:rPr>
+          <m:t>∣</m:t>
+        </m:r>
+        <m:sSub>
+          <m:e>
+            <m:r>
+              <m:t>X</m:t>
+            </m:r>
+          </m:e>
+          <m:sub>
+            <m:r>
+              <m:t>t</m:t>
+            </m:r>
+          </m:sub>
+        </m:sSub>
+        <m:r>
+          <m:rPr>
+            <m:sty m:val="p"/>
+          </m:rPr>
+          <m:t>)</m:t>
+        </m:r>
+      </m:oMath>
+      <w:r>
+        <w:t xml:space="preserve">, whereas the Kernel proposal is trained to estimate a next-state transition</w:t>
+      </w:r>
+      <w:r>
+        <w:t xml:space="preserve"> </w:t>
+      </w:r>
+      <m:oMath>
+        <m:r>
+          <m:t>p</m:t>
+        </m:r>
+        <m:r>
+          <m:rPr>
+            <m:sty m:val="p"/>
+          </m:rPr>
+          <m:t>(</m:t>
+        </m:r>
+        <m:sSub>
+          <m:e>
+            <m:r>
+              <m:t>S</m:t>
+            </m:r>
+          </m:e>
+          <m:sub>
+            <m:r>
+              <m:t>t</m:t>
+            </m:r>
+            <m:r>
+              <m:rPr>
+                <m:sty m:val="p"/>
+              </m:rPr>
+              <m:t>+</m:t>
+            </m:r>
+            <m:r>
+              <m:t>1</m:t>
+            </m:r>
+          </m:sub>
+        </m:sSub>
+        <m:r>
+          <m:rPr>
+            <m:sty m:val="p"/>
+          </m:rPr>
+          <m:t>∣</m:t>
+        </m:r>
+        <m:sSub>
+          <m:e>
+            <m:r>
+              <m:t>S</m:t>
+            </m:r>
+          </m:e>
+          <m:sub>
+            <m:r>
+              <m:t>t</m:t>
+            </m:r>
+          </m:sub>
+        </m:sSub>
+        <m:r>
+          <m:rPr>
+            <m:sty m:val="p"/>
+          </m:rPr>
+          <m:t>,</m:t>
+        </m:r>
+        <m:sSub>
+          <m:e>
+            <m:r>
+              <m:t>X</m:t>
+            </m:r>
+          </m:e>
+          <m:sub>
+            <m:r>
+              <m:t>t</m:t>
+            </m:r>
+          </m:sub>
+        </m:sSub>
+        <m:r>
+          <m:rPr>
+            <m:sty m:val="p"/>
+          </m:rPr>
+          <m:t>)</m:t>
+        </m:r>
+      </m:oMath>
+      <w:r>
+        <w:t xml:space="preserve"> </w:t>
+      </w:r>
+      <w:r>
+        <w:t xml:space="preserve">before constrained projection. Matching features therefore does not match the training task. Two intermediate configurations were retained as mechanism diagnostics: 13 features (seven drivers plus current-class indicators) and 19 features (seven drivers plus neighbourhood fractions). The 13-feature run includes the current label in the inputs and therefore permits identity leakage; its near-zero change output is interpreted as a degenerate same-year suitability fit, not as evidence of zero land change.</w:t>
       </w:r>
     </w:p>
     <w:p>
@@ -1637,7 +1809,7 @@
         <w:pStyle w:val="BodyText"/>
       </w:pPr>
       <w:r>
-        <w:t xml:space="preserve">The comparison shared the canonical grid, origin states, target actions, hard masks and evaluator, but the public-data run was not information-balanced. The FLUS-style control used seven continuous drivers in its external ANN suitability model, whereas Geospatial Kernel used 25 features including current-class indicators and neighbourhood proportions; GeoFM-LDN used AlphaEarth latent embeddings and the Kernel allocator. We therefore report an unmatched-input pipeline comparison, not evidence that one learner is intrinsically superior. The archived FLUS console is a Mach-O arm64 executable whose original source/version cannot be independently rebuilt from this release, so its results are bounded to the supplied Apple-Silicon binary and are not asserted to be bitwise equivalent to an upstream build. All models used seeds 31, 47 and 73.</w:t>
+        <w:t xml:space="preserve">The comparison shared the canonical grid, origin states, target actions, hard masks and evaluator, but the public-data run was not information-balanced. The original FLUS-style control used seven continuous drivers in its external ANN suitability model, whereas Geospatial Kernel used 25 features including current-class indicators and neighbourhood proportions; GeoFM-LDN used AlphaEarth latent embeddings and the Kernel allocator. We therefore report the original result as an unmatched-input pipeline comparison, not evidence that one learner is intrinsically superior. The additional 25-feature FLUS run is a matched-input baseline in feature space, but it still learns same-year suitability rather than next-state transitions and does not use the Kernel projection implementation. The archived FLUS console is a Mach-O arm64 executable whose original source/version cannot be independently rebuilt from this release, so its results are bounded to the supplied Apple-Silicon binary and are not asserted to be bitwise equivalent to an upstream build. All headline and matched-input runs used seeds 31, 47 and 73.</w:t>
       </w:r>
     </w:p>
     <w:p>
@@ -1925,7 +2097,25 @@
         <w:t xml:space="preserve"> </w:t>
       </w:r>
       <w:r>
-        <w:t xml:space="preserve">metric and the remaining columns are diagnostics. Persistence and random</w:t>
+        <w:t xml:space="preserve">metric and the remaining columns are diagnostics. The 25-feature FLUS</w:t>
+      </w:r>
+      <w:r>
+        <w:t xml:space="preserve"> </w:t>
+      </w:r>
+      <w:r>
+        <w:t xml:space="preserve">matched-input baseline is shown separately from the original seven-driver</w:t>
+      </w:r>
+      <w:r>
+        <w:t xml:space="preserve"> </w:t>
+      </w:r>
+      <w:r>
+        <w:t xml:space="preserve">unmatched control because its same-year suitability target and CA semantics do</w:t>
+      </w:r>
+      <w:r>
+        <w:t xml:space="preserve"> </w:t>
+      </w:r>
+      <w:r>
+        <w:t xml:space="preserve">not match the Kernel’s next-state transition task. Persistence and random</w:t>
       </w:r>
       <w:r>
         <w:t xml:space="preserve"> </w:t>
@@ -1942,12 +2132,13 @@
         <w:tblLook w:firstRow="1" w:lastRow="0" w:firstColumn="0" w:lastColumn="0" w:noHBand="0" w:noVBand="0" w:val="0020"/>
       </w:tblPr>
       <w:tblGrid>
-        <w:gridCol w:w="1320"/>
-        <w:gridCol w:w="1320"/>
-        <w:gridCol w:w="1320"/>
-        <w:gridCol w:w="1320"/>
-        <w:gridCol w:w="1320"/>
-        <w:gridCol w:w="1320"/>
+        <w:gridCol w:w="1131"/>
+        <w:gridCol w:w="1131"/>
+        <w:gridCol w:w="1131"/>
+        <w:gridCol w:w="1131"/>
+        <w:gridCol w:w="1131"/>
+        <w:gridCol w:w="1131"/>
+        <w:gridCol w:w="1131"/>
       </w:tblGrid>
       <w:tr>
         <w:trPr>
@@ -1973,7 +2164,7 @@
               <w:jc w:val="right"/>
             </w:pPr>
             <w:r>
-              <w:t xml:space="preserve">FLUS-style ANN–CA</w:t>
+              <w:t xml:space="preserve">FLUS-style (7)</w:t>
             </w:r>
           </w:p>
         </w:tc>
@@ -1985,7 +2176,19 @@
               <w:jc w:val="right"/>
             </w:pPr>
             <w:r>
-              <w:t xml:space="preserve">Geospatial Kernel</w:t>
+              <w:t xml:space="preserve">FLUS matched (25)</w:t>
+            </w:r>
+          </w:p>
+        </w:tc>
+        <w:tc>
+          <w:tcPr/>
+          <w:p>
+            <w:pPr>
+              <w:pStyle w:val="Compact"/>
+              <w:jc w:val="right"/>
+            </w:pPr>
+            <w:r>
+              <w:t xml:space="preserve">Kernel</w:t>
             </w:r>
           </w:p>
         </w:tc>
@@ -2048,6 +2251,18 @@
             </w:pPr>
             <w:r>
               <w:t xml:space="preserve">0.1256</w:t>
+            </w:r>
+          </w:p>
+        </w:tc>
+        <w:tc>
+          <w:tcPr/>
+          <w:p>
+            <w:pPr>
+              <w:pStyle w:val="Compact"/>
+              <w:jc w:val="right"/>
+            </w:pPr>
+            <w:r>
+              <w:t xml:space="preserve">0.0440</w:t>
             </w:r>
           </w:p>
         </w:tc>
@@ -2137,6 +2352,18 @@
               <w:jc w:val="right"/>
             </w:pPr>
             <w:r>
+              <w:t xml:space="preserve">0.0653</w:t>
+            </w:r>
+          </w:p>
+        </w:tc>
+        <w:tc>
+          <w:tcPr/>
+          <w:p>
+            <w:pPr>
+              <w:pStyle w:val="Compact"/>
+              <w:jc w:val="right"/>
+            </w:pPr>
+            <w:r>
               <w:t xml:space="preserve">0.2520</w:t>
             </w:r>
           </w:p>
@@ -2224,7 +2451,7 @@
         <w:t xml:space="preserve"> </w:t>
       </w:r>
       <w:r>
-        <w:t xml:space="preserve">2024), illustrating why change-specific metrics are necessary. Figure 2 shows</w:t>
+        <w:t xml:space="preserve">2024), illustrating why change-specific metrics are necessary. Fig. 2 shows</w:t>
       </w:r>
       <w:r>
         <w:t xml:space="preserve"> </w:t>
@@ -2256,55 +2483,161 @@
         <w:pStyle w:val="BodyText"/>
       </w:pPr>
       <w:r>
-        <w:t xml:space="preserve">The reviewer-requested FLUS input-dimension diagnostic was also completed. With</w:t>
-      </w:r>
-      <w:r>
-        <w:t xml:space="preserve"> </w:t>
-      </w:r>
-      <w:r>
-        <w:t xml:space="preserve">seed 31 and the same absolute-path console protocol, the 13-feature</w:t>
-      </w:r>
-      <w:r>
-        <w:t xml:space="preserve"> </w:t>
-      </w:r>
-      <w:r>
-        <w:t xml:space="preserve">seven-driver-plus-current-class run had strict FoM 0.0000 for both 2023 and</w:t>
-      </w:r>
-      <w:r>
-        <w:t xml:space="preserve"> </w:t>
-      </w:r>
-      <w:r>
-        <w:t xml:space="preserve">2024; the 19-feature seven-driver-plus-neighbourhood run had 0.1371 and 0.1149;</w:t>
-      </w:r>
-      <w:r>
-        <w:t xml:space="preserve"> </w:t>
-      </w:r>
-      <w:r>
-        <w:t xml:space="preserve">and the full 25-feature Kernel-matched run had 0.1320 and 0.1960. These are</w:t>
-      </w:r>
-      <w:r>
-        <w:t xml:space="preserve"> </w:t>
-      </w:r>
-      <w:r>
-        <w:t xml:space="preserve">single-seed diagnostics and are not substituted for the frozen three-seed</w:t>
-      </w:r>
-      <w:r>
-        <w:t xml:space="preserve"> </w:t>
-      </w:r>
-      <w:r>
-        <w:t xml:space="preserve">headline comparison. They show that the earlier failure was a relative-path</w:t>
-      </w:r>
-      <w:r>
-        <w:t xml:space="preserve"> </w:t>
-      </w:r>
-      <w:r>
-        <w:t xml:space="preserve">configuration error and that adding feature families alone does not reproduce</w:t>
-      </w:r>
-      <w:r>
-        <w:t xml:space="preserve"> </w:t>
-      </w:r>
-      <w:r>
-        <w:t xml:space="preserve">the Kernel proposal or its projection semantics.</w:t>
+        <w:t xml:space="preserve">The reviewer-requested FLUS input-dimension analysis was also completed. Across</w:t>
+      </w:r>
+      <w:r>
+        <w:t xml:space="preserve"> </w:t>
+      </w:r>
+      <w:r>
+        <w:t xml:space="preserve">seeds 31, 47 and 73, the 25-feature matched-input baseline had mean strict FoM</w:t>
+      </w:r>
+      <w:r>
+        <w:t xml:space="preserve"> </w:t>
+      </w:r>
+      <w:r>
+        <w:t xml:space="preserve">0.0440 in 2023 and 0.0653 in 2024; the corresponding Kernel-minus-matched-input</w:t>
+      </w:r>
+      <w:r>
+        <w:t xml:space="preserve"> </w:t>
+      </w:r>
+      <w:r>
+        <w:t xml:space="preserve">paired spatial-block intervals were 0.1350–0.1673 and 0.1687–0.2033,</w:t>
+      </w:r>
+      <w:r>
+        <w:t xml:space="preserve"> </w:t>
+      </w:r>
+      <w:r>
+        <w:t xml:space="preserve">respectively. The 13-feature seven-driver-plus-current-class run had strict FoM</w:t>
+      </w:r>
+      <w:r>
+        <w:t xml:space="preserve"> </w:t>
+      </w:r>
+      <w:r>
+        <w:t xml:space="preserve">0.0000 for both years in seed 31 and produced no changed pixels. This occurs</w:t>
+      </w:r>
+      <w:r>
+        <w:t xml:space="preserve"> </w:t>
+      </w:r>
+      <w:r>
+        <w:t xml:space="preserve">because the current-class indicators expose the same-year label used as the ANN</w:t>
+      </w:r>
+      <w:r>
+        <w:t xml:space="preserve"> </w:t>
+      </w:r>
+      <w:r>
+        <w:t xml:space="preserve">target: the network learns an almost exact identity mapping (training RMSE</w:t>
+      </w:r>
+      <w:r>
+        <w:t xml:space="preserve"> </w:t>
+      </w:r>
+      <m:oMath>
+        <m:r>
+          <m:t>1.6</m:t>
+        </m:r>
+        <m:r>
+          <m:rPr>
+            <m:sty m:val="p"/>
+          </m:rPr>
+          <m:t>×</m:t>
+        </m:r>
+        <m:sSup>
+          <m:e>
+            <m:r>
+              <m:t>10</m:t>
+            </m:r>
+          </m:e>
+          <m:sup>
+            <m:r>
+              <m:rPr>
+                <m:sty m:val="p"/>
+              </m:rPr>
+              <m:t>−</m:t>
+            </m:r>
+            <m:r>
+              <m:t>5</m:t>
+            </m:r>
+          </m:sup>
+        </m:sSup>
+      </m:oMath>
+      <w:r>
+        <w:t xml:space="preserve">), so the CA receives probabilities concentrated on the</w:t>
+      </w:r>
+      <w:r>
+        <w:t xml:space="preserve"> </w:t>
+      </w:r>
+      <w:r>
+        <w:t xml:space="preserve">current class and makes no transitions. The 19-feature diagnostic had strict</w:t>
+      </w:r>
+      <w:r>
+        <w:t xml:space="preserve"> </w:t>
+      </w:r>
+      <w:r>
+        <w:t xml:space="preserve">FoM 0.1371 and 0.1149 in seed 31. These results show why matching feature</w:t>
+      </w:r>
+      <w:r>
+        <w:t xml:space="preserve"> </w:t>
+      </w:r>
+      <w:r>
+        <w:t xml:space="preserve">dimensions cannot make the tasks equivalent: FLUS learns static suitability</w:t>
+      </w:r>
+      <w:r>
+        <w:t xml:space="preserve"> </w:t>
+      </w:r>
+      <m:oMath>
+        <m:r>
+          <m:t>p</m:t>
+        </m:r>
+        <m:r>
+          <m:rPr>
+            <m:sty m:val="p"/>
+          </m:rPr>
+          <m:t>(</m:t>
+        </m:r>
+        <m:sSub>
+          <m:e>
+            <m:r>
+              <m:t>S</m:t>
+            </m:r>
+          </m:e>
+          <m:sub>
+            <m:r>
+              <m:t>t</m:t>
+            </m:r>
+          </m:sub>
+        </m:sSub>
+        <m:r>
+          <m:rPr>
+            <m:sty m:val="p"/>
+          </m:rPr>
+          <m:t>∣</m:t>
+        </m:r>
+        <m:sSub>
+          <m:e>
+            <m:r>
+              <m:t>X</m:t>
+            </m:r>
+          </m:e>
+          <m:sub>
+            <m:r>
+              <m:t>t</m:t>
+            </m:r>
+          </m:sub>
+        </m:sSub>
+        <m:r>
+          <m:rPr>
+            <m:sty m:val="p"/>
+          </m:rPr>
+          <m:t>)</m:t>
+        </m:r>
+      </m:oMath>
+      <w:r>
+        <w:t xml:space="preserve">, while the Kernel learns next-state transitions and then</w:t>
+      </w:r>
+      <w:r>
+        <w:t xml:space="preserve"> </w:t>
+      </w:r>
+      <w:r>
+        <w:t xml:space="preserve">projects them against action deficits and hard constraints.</w:t>
       </w:r>
     </w:p>
     <w:p>
@@ -2398,37 +2731,49 @@
         <w:t xml:space="preserve"> </w:t>
       </w:r>
       <w:r>
-        <w:t xml:space="preserve">inputs and seeds 31, 47 and 73. The author-run comparison covered six rasters</w:t>
-      </w:r>
-      <w:r>
-        <w:t xml:space="preserve"> </w:t>
-      </w:r>
-      <w:r>
-        <w:t xml:space="preserve">(2023 and 2024 for each seed): all six had zero differing categorical cells and</w:t>
-      </w:r>
-      <w:r>
-        <w:t xml:space="preserve"> </w:t>
-      </w:r>
-      <w:r>
-        <w:t xml:space="preserve">zero strict-FoM delta. The archived comparison report records the exact raster</w:t>
-      </w:r>
-      <w:r>
-        <w:t xml:space="preserve"> </w:t>
-      </w:r>
-      <w:r>
-        <w:t xml:space="preserve">paths and evaluator outputs. This documents the measured stability of the</w:t>
-      </w:r>
-      <w:r>
-        <w:t xml:space="preserve"> </w:t>
-      </w:r>
-      <w:r>
-        <w:t xml:space="preserve">released pair of environments; it does not guarantee bitwise identity for</w:t>
-      </w:r>
-      <w:r>
-        <w:t xml:space="preserve"> </w:t>
-      </w:r>
-      <w:r>
-        <w:t xml:space="preserve">arbitrary BLAS, compiler or library versions.</w:t>
+        <w:t xml:space="preserve">inputs and seeds 31, 47 and 73. Both archived environments are arm64, so this is</w:t>
+      </w:r>
+      <w:r>
+        <w:t xml:space="preserve"> </w:t>
+      </w:r>
+      <w:r>
+        <w:t xml:space="preserve">a same-architecture comparison: across six rasters (2023 and 2024 for each</w:t>
+      </w:r>
+      <w:r>
+        <w:t xml:space="preserve"> </w:t>
+      </w:r>
+      <w:r>
+        <w:t xml:space="preserve">seed), all categorical cells matched and strict-FoM deltas were zero. Earlier</w:t>
+      </w:r>
+      <w:r>
+        <w:t xml:space="preserve"> </w:t>
+      </w:r>
+      <w:r>
+        <w:t xml:space="preserve">x86_64 reruns showed approximately 1% differing cells and FoM changes near</w:t>
+      </w:r>
+      <w:r>
+        <w:t xml:space="preserve"> </w:t>
+      </w:r>
+      <w:r>
+        <w:t xml:space="preserve">0.001; those cross-architecture differences have not yet been independently</w:t>
+      </w:r>
+      <w:r>
+        <w:t xml:space="preserve"> </w:t>
+      </w:r>
+      <w:r>
+        <w:t xml:space="preserve">characterised in this release. The archived comparison report records the</w:t>
+      </w:r>
+      <w:r>
+        <w:t xml:space="preserve"> </w:t>
+      </w:r>
+      <w:r>
+        <w:t xml:space="preserve">exact paths and environment fields. This documents the measured stability of</w:t>
+      </w:r>
+      <w:r>
+        <w:t xml:space="preserve"> </w:t>
+      </w:r>
+      <w:r>
+        <w:t xml:space="preserve">the released same-architecture pair, not universal bitwise identity.</w:t>
       </w:r>
     </w:p>
     <w:p>
@@ -2538,7 +2883,7 @@
         <w:t xml:space="preserve"> </w:t>
       </w:r>
       <w:r>
-        <w:t xml:space="preserve">The 2031 majority-vote ensemble L1 demand errors were 8, 44 and 42 pixels for</w:t>
+        <w:t xml:space="preserve">The 2031 majority-vote ensemble L1 demand errors were 60, 68 and 86 pixels for</w:t>
       </w:r>
       <w:r>
         <w:t xml:space="preserve"> </w:t>
@@ -2550,7 +2895,7 @@
         <w:t xml:space="preserve"> </w:t>
       </w:r>
       <w:r>
-        <w:t xml:space="preserve">the corresponding GeoFM-LDN errors were 1,580, 1,524 and 1,148 pixels and the</w:t>
+        <w:t xml:space="preserve">the corresponding GeoFM-LDN errors were 1,596, 1,536 and 1,174 pixels and the</w:t>
       </w:r>
       <w:r>
         <w:t xml:space="preserve"> </w:t>
@@ -3709,13 +4054,13 @@
         <w:t xml:space="preserve"> </w:t>
       </w:r>
       <w:r>
-        <w:t xml:space="preserve">uses seven drivers; the successful 25-feature run is a one-seed diagnostic, not a</w:t>
-      </w:r>
-      <w:r>
-        <w:t xml:space="preserve"> </w:t>
-      </w:r>
-      <w:r>
-        <w:t xml:space="preserve">replacement for the primary baseline. These public-data stress tests therefore do</w:t>
+        <w:t xml:space="preserve">uses seven drivers; the successful 25-feature run is a matched-input baseline</w:t>
+      </w:r>
+      <w:r>
+        <w:t xml:space="preserve"> </w:t>
+      </w:r>
+      <w:r>
+        <w:t xml:space="preserve">reported separately from the primary unmatched control. These public-data stress tests therefore do</w:t>
       </w:r>
       <w:r>
         <w:t xml:space="preserve"> </w:t>
@@ -3886,13 +4231,13 @@
         <w:rPr>
           <w:rStyle w:val="VerbatimChar"/>
         </w:rPr>
-        <w:t xml:space="preserve">output_audit_reproducible.json</w:t>
-      </w:r>
-      <w:r>
-        <w:t xml:space="preserve"> </w:t>
-      </w:r>
-      <w:r>
-        <w:t xml:space="preserve">for the current raster audit, with</w:t>
+        <w:t xml:space="preserve">output_audit.json</w:t>
+      </w:r>
+      <w:r>
+        <w:t xml:space="preserve"> </w:t>
+      </w:r>
+      <w:r>
+        <w:t xml:space="preserve">for the current raster audit;</w:t>
       </w:r>
       <w:r>
         <w:t xml:space="preserve"> </w:t>
@@ -3901,13 +4246,13 @@
         <w:rPr>
           <w:rStyle w:val="VerbatimChar"/>
         </w:rPr>
-        <w:t xml:space="preserve">output_audit.json</w:t>
-      </w:r>
-      <w:r>
-        <w:t xml:space="preserve"> </w:t>
-      </w:r>
-      <w:r>
-        <w:t xml:space="preserve">retained only as legacy lineage;</w:t>
+        <w:t xml:space="preserve">output_audit_reproducible.json</w:t>
+      </w:r>
+      <w:r>
+        <w:t xml:space="preserve"> </w:t>
+      </w:r>
+      <w:r>
+        <w:t xml:space="preserve">is a compatibility copy produced by the same run;</w:t>
       </w:r>
     </w:p>
     <w:p>
@@ -3994,7 +4339,7 @@
         <w:t xml:space="preserve"> </w:t>
       </w:r>
       <w:r>
-        <w:t xml:space="preserve">can pass the manifest gate. The locked macOS arm64 execution environment remains the reference for model outputs. An author-run Linux comparison of six historical Kernel rasters found zero categorical-cell differences and zero strict-FoM delta; this result is archived as a measured cross-platform check, not a universal bitwise-identity guarantee. No private database address, credential or client-only service is included. Authoritative Abu Dhabi land-use and independent change-validation data remain outside this study.</w:t>
+        <w:t xml:space="preserve">can pass the manifest gate. The locked macOS arm64 execution environment remains the reference for model outputs. An author-run same-architecture arm64 Linux comparison of six historical Kernel rasters found zero categorical-cell differences and zero strict-FoM delta; earlier x86_64 differences are disclosed but not independently characterised here. No private database address, credential or client-only service is included. Authoritative Abu Dhabi land-use and independent change-validation data remain outside this study.</w:t>
       </w:r>
     </w:p>
     <w:bookmarkEnd w:id="28"/>
@@ -4689,7 +5034,7 @@
       <w:r>
         <w:drawing>
           <wp:inline>
-            <wp:extent cx="5334000" cy="3703670"/>
+            <wp:extent cx="5334000" cy="3705443"/>
             <wp:effectExtent b="0" l="0" r="0" t="0"/>
             <wp:docPr descr="" title="" id="36" name="Picture"/>
             <a:graphic>
@@ -4710,7 +5055,7 @@
                   <pic:spPr bwMode="auto">
                     <a:xfrm>
                       <a:off x="0" y="0"/>
-                      <a:ext cx="5334000" cy="3703670"/>
+                      <a:ext cx="5334000" cy="3705443"/>
                     </a:xfrm>
                     <a:prstGeom prst="rect">
                       <a:avLst/>
@@ -4784,7 +5129,7 @@
       <w:r>
         <w:drawing>
           <wp:inline>
-            <wp:extent cx="5334000" cy="3550480"/>
+            <wp:extent cx="5334000" cy="3551268"/>
             <wp:effectExtent b="0" l="0" r="0" t="0"/>
             <wp:docPr descr="" title="" id="39" name="Picture"/>
             <a:graphic>
@@ -4805,7 +5150,7 @@
                   <pic:spPr bwMode="auto">
                     <a:xfrm>
                       <a:off x="0" y="0"/>
-                      <a:ext cx="5334000" cy="3550480"/>
+                      <a:ext cx="5334000" cy="3551268"/>
                     </a:xfrm>
                     <a:prstGeom prst="rect">
                       <a:avLst/>
@@ -4897,7 +5242,7 @@
       <w:r>
         <w:drawing>
           <wp:inline>
-            <wp:extent cx="5334000" cy="3703670"/>
+            <wp:extent cx="5334000" cy="3704556"/>
             <wp:effectExtent b="0" l="0" r="0" t="0"/>
             <wp:docPr descr="" title="" id="42" name="Picture"/>
             <a:graphic>
@@ -4918,7 +5263,7 @@
                   <pic:spPr bwMode="auto">
                     <a:xfrm>
                       <a:off x="0" y="0"/>
-                      <a:ext cx="5334000" cy="3703670"/>
+                      <a:ext cx="5334000" cy="3704556"/>
                     </a:xfrm>
                     <a:prstGeom prst="rect">
                       <a:avLst/>

</xml_diff>

<commit_message>
Address seventh-round LUP review
</commit_message>
<xml_diff>
--- a/manuscript/manuscript.docx
+++ b/manuscript/manuscript.docx
@@ -95,7 +95,7 @@
         <w:pStyle w:val="FirstParagraph"/>
       </w:pPr>
       <w:r>
-        <w:t xml:space="preserve">Urban land-change models are often evaluated against annual labels whose reliability is not spatially uniform. We present an auditable protocol for testing constrained spatial allocation under that uncertainty, using Geospatial Kernel, the algorithmic core of a Geospatial World Model, as the focal execution layer. The Abu Dhabi public-data benchmark uses annual 100-m land-cover products from 2017–2024, three computational seeds, destination-correct multi-class change Figure of Merit (FoM), spatial-block bootstrap contrasts and explicit state–action–constraint traces. The regenerated strict FoM was 0.1950 for Geospatial Kernel, 0.1256 for the FLUS-style ANN–CA console (untraceable build) and 0.1616 for GeoFM-LDN in 2023; after recursive two-step rollout in 2024 the values were 0.2520, 0.1782 and 0.2708, respectively. On the high-confidence label subset, all three models had FoM 0.000 in 2023 and the 2024 maximum was 0.0188, showing that full-grid agreement is strongly conditioned by label noise. The planning track is therefore reported as scenario stress testing, not official forecasting. The released public bundle, source, checkpoints, rasters, vector footprints and audit manifests support locked-environment reproduction. An author-run Linux comparison reproduced the six released Kernel rasters exactly at the categorical-cell level and yielded zero strict-FoM difference; this is a measurement of this controlled pair of environments, not a promise of bitwise identity for every numerical stack. The protocol’s principal contribution is an inspectable proposal–projection–writeback boundary for separating model behaviour from action and constraint semantics.</w:t>
+        <w:t xml:space="preserve">Urban land-change models are often evaluated against annual labels whose reliability is not spatially uniform. We present an auditable protocol for testing constrained spatial allocation under that uncertainty, using Geospatial Kernel, the algorithmic core of a Geospatial World Model, as the focal execution layer. The Abu Dhabi public-data benchmark uses annual 100-m land-cover products from 2017–2024, three computational seeds, destination-correct multi-class change Figure of Merit (FoM), spatial-block bootstrap contrasts and explicit state–action–constraint traces. The regenerated strict FoM was 0.1950 for Geospatial Kernel, 0.1256 for the GeoSOS-derived FLUS-style ANN–CA console (author-modified build) and 0.1616 for GeoFM-LDN in 2023; after recursive two-step rollout in 2024 the values were 0.2520, 0.1782 and 0.2708, respectively. On the high-confidence label subset, all three models had FoM 0.000 in 2023 and the 2024 maximum was 0.0188, showing that full-grid agreement is strongly conditioned by label noise. The planning track is therefore reported as scenario stress testing, not official forecasting. The released public bundle, source, checkpoints, rasters, vector footprints and audit manifests support locked-environment reproduction. An author-run Linux comparison reproduced the six released Kernel rasters exactly at the categorical-cell level and yielded zero strict-FoM difference; this is a measurement of this controlled pair of environments, not a promise of bitwise identity for every numerical stack. The protocol’s principal contribution is an inspectable proposal–projection–writeback boundary for separating model behaviour from action and constraint semantics.</w:t>
       </w:r>
     </w:p>
     <w:bookmarkEnd w:id="9"/>
@@ -317,6 +317,45 @@
       </w:r>
       <w:r>
         <w:t xml:space="preserve">trace recording proposal, projection, hard-mask status and state writeback. The</w:t>
+      </w:r>
+      <w:r>
+        <w:t xml:space="preserve"> </w:t>
+      </w:r>
+      <w:r>
+        <w:t xml:space="preserve">protocol also requires every model/year/seed record to report the number of</w:t>
+      </w:r>
+      <w:r>
+        <w:t xml:space="preserve"> </w:t>
+      </w:r>
+      <w:r>
+        <w:t xml:space="preserve">predicted changed cells. A record with</w:t>
+      </w:r>
+      <w:r>
+        <w:t xml:space="preserve"> </w:t>
+      </w:r>
+      <w:r>
+        <w:rPr>
+          <w:rStyle w:val="VerbatimChar"/>
+        </w:rPr>
+        <w:t xml:space="preserve">predicted_change_pixels == 0</w:t>
+      </w:r>
+      <w:r>
+        <w:t xml:space="preserve"> </w:t>
+      </w:r>
+      <w:r>
+        <w:t xml:space="preserve">is marked</w:t>
+      </w:r>
+      <w:r>
+        <w:t xml:space="preserve"> </w:t>
+      </w:r>
+      <w:r>
+        <w:t xml:space="preserve">as a degenerate output and reviewed alongside structural-zero metrics; it cannot</w:t>
+      </w:r>
+      <w:r>
+        <w:t xml:space="preserve"> </w:t>
+      </w:r>
+      <w:r>
+        <w:t xml:space="preserve">by itself be interpreted as model superiority or real land-cover stability. The</w:t>
       </w:r>
       <w:r>
         <w:t xml:space="preserve"> </w:t>
@@ -1431,7 +1470,76 @@
         <w:pStyle w:val="FirstParagraph"/>
       </w:pPr>
       <w:r>
-        <w:t xml:space="preserve">The baseline was run through a FLUS-style ANN–CA console using seven continuous drivers: normalized row and column coordinates, elevation, slope, VIIRS radiance, distance to roads and distance to major roads. Its ANN suitability surface was passed to a cellular-automata allocation stage with the common class totals and public hard mask. The archived run used one 2021 training year, eight ANN hidden neurons, a 3 × 3 CA neighbourhood, neighbourhood strength 1.0, acceleration factor 0.1 and 1,000 iterations. Its frozen transition matrix protected water and wetland but did not prohibit built-to-non-built transitions. The supplied Mach-O executable cannot be traced to a reproducible upstream release or source commit, so we label this control “FLUS-style ANN–CA console (untraceable build)” and do not claim equivalence to the Liu et al. (2017) implementation. A 25-feature Kernel-matched input was then executed with absolute paths for seeds 31, 47 and 73 and is reported as a separate matched-input baseline. It shares the Kernel feature family, but not the learning target or projection semantics: the FLUS ANN estimates same-year label suitability</w:t>
+        <w:t xml:space="preserve">The baseline was run through a GeoSOS-derived FLUS-style ANN–CA console (author-modified build) using seven continuous drivers: normalized row and column coordinates, elevation, slope, VIIRS radiance, distance to roads and distance to major roads. Its ANN suitability surface was passed to a cellular-automata allocation stage with the common class totals and public hard mask. The archived run used one 2021 training year, eight ANN hidden neurons, a 3 × 3 CA neighbourhood, neighbourhood strength 1.0, acceleration factor 0.1 and 1,000 iterations. Its frozen transition matrix protected water and wetland but did not prohibit built-to-non-built transitions. The algorithmic base is traceable to the GeoSOS team’s public FLUS source release (Liu et al., 2017; geosimulation.cn); the accompanying source repository</w:t>
+      </w:r>
+      <w:r>
+        <w:t xml:space="preserve"> </w:t>
+      </w:r>
+      <w:r>
+        <w:rPr>
+          <w:rStyle w:val="VerbatimChar"/>
+        </w:rPr>
+        <w:t xml:space="preserve">FLUS_console_crossplatform</w:t>
+      </w:r>
+      <w:r>
+        <w:t xml:space="preserve"> </w:t>
+      </w:r>
+      <w:r>
+        <w:t xml:space="preserve">at commit</w:t>
+      </w:r>
+      <w:r>
+        <w:t xml:space="preserve"> </w:t>
+      </w:r>
+      <w:r>
+        <w:rPr>
+          <w:rStyle w:val="VerbatimChar"/>
+        </w:rPr>
+        <w:t xml:space="preserve">deb0a54</w:t>
+      </w:r>
+      <w:r>
+        <w:t xml:space="preserve"> </w:t>
+      </w:r>
+      <w:r>
+        <w:t xml:space="preserve">contains the author modifications used for this paper. Those modifications add</w:t>
+      </w:r>
+      <w:r>
+        <w:t xml:space="preserve"> </w:t>
+      </w:r>
+      <w:r>
+        <w:rPr>
+          <w:rStyle w:val="VerbatimChar"/>
+        </w:rPr>
+        <w:t xml:space="preserve">train</w:t>
+      </w:r>
+      <w:r>
+        <w:t xml:space="preserve">/</w:t>
+      </w:r>
+      <w:r>
+        <w:rPr>
+          <w:rStyle w:val="VerbatimChar"/>
+        </w:rPr>
+        <w:t xml:space="preserve">train-update</w:t>
+      </w:r>
+      <w:r>
+        <w:t xml:space="preserve"> </w:t>
+      </w:r>
+      <w:r>
+        <w:t xml:space="preserve">entry points and</w:t>
+      </w:r>
+      <w:r>
+        <w:t xml:space="preserve"> </w:t>
+      </w:r>
+      <w:r>
+        <w:rPr>
+          <w:rStyle w:val="VerbatimChar"/>
+        </w:rPr>
+        <w:t xml:space="preserve">FLUS_RANDOM_SEED</w:t>
+      </w:r>
+      <w:r>
+        <w:t xml:space="preserve"> </w:t>
+      </w:r>
+      <w:r>
+        <w:t xml:space="preserve">deterministic seeding for both ANN sampling and CA roulette draws, so the build is not the unmodified upstream executable. A 25-feature Kernel-matched input was then executed with absolute paths for seeds 31, 47 and 73 and is reported as a separate matched-input diagnostic. It shares the Kernel feature family, but not the learning target or projection semantics: the FLUS ANN estimates same-year label suitability</w:t>
       </w:r>
       <w:r>
         <w:t xml:space="preserve"> </w:t>
@@ -1809,7 +1917,73 @@
         <w:pStyle w:val="BodyText"/>
       </w:pPr>
       <w:r>
-        <w:t xml:space="preserve">The comparison shared the canonical grid, origin states, target actions, hard masks and evaluator, but the public-data run was not information-balanced. The original FLUS-style control used seven continuous drivers in its external ANN suitability model, whereas Geospatial Kernel used 25 features including current-class indicators and neighbourhood proportions; GeoFM-LDN used AlphaEarth latent embeddings and the Kernel allocator. We therefore report the original result as an unmatched-input pipeline comparison, not evidence that one learner is intrinsically superior. The additional 25-feature FLUS run is a matched-input baseline in feature space, but it still learns same-year suitability rather than next-state transitions and does not use the Kernel projection implementation. The archived FLUS console is a Mach-O arm64 executable whose original source/version cannot be independently rebuilt from this release, so its results are bounded to the supplied Apple-Silicon binary and are not asserted to be bitwise equivalent to an upstream build. All headline and matched-input runs used seeds 31, 47 and 73.</w:t>
+        <w:t xml:space="preserve">The comparison shared the canonical grid, origin states, target actions, hard masks and evaluator, but the public-data run was not information-balanced. The original FLUS-style control used seven continuous drivers in its external ANN suitability model, whereas Geospatial Kernel used 25 features including current-class indicators and neighbourhood proportions; GeoFM-LDN used AlphaEarth latent embeddings and the Kernel allocator. We therefore report the original result as an unmatched-input pipeline comparison, not evidence that one learner is intrinsically superior. The additional 25-feature FLUS run is a matched-input diagnostic in feature space, but it still learns same-year suitability rather than next-state transitions and does not use the Kernel projection implementation. The archived FLUS console is a Mach-O arm64 executable rebuilt from the public GeoSOS source base with the author-modified</w:t>
+      </w:r>
+      <w:r>
+        <w:t xml:space="preserve"> </w:t>
+      </w:r>
+      <w:r>
+        <w:rPr>
+          <w:rStyle w:val="VerbatimChar"/>
+        </w:rPr>
+        <w:t xml:space="preserve">train</w:t>
+      </w:r>
+      <w:r>
+        <w:t xml:space="preserve">/</w:t>
+      </w:r>
+      <w:r>
+        <w:rPr>
+          <w:rStyle w:val="VerbatimChar"/>
+        </w:rPr>
+        <w:t xml:space="preserve">train-update</w:t>
+      </w:r>
+      <w:r>
+        <w:t xml:space="preserve"> </w:t>
+      </w:r>
+      <w:r>
+        <w:t xml:space="preserve">entry points and</w:t>
+      </w:r>
+      <w:r>
+        <w:t xml:space="preserve"> </w:t>
+      </w:r>
+      <w:r>
+        <w:rPr>
+          <w:rStyle w:val="VerbatimChar"/>
+        </w:rPr>
+        <w:t xml:space="preserve">FLUS_RANDOM_SEED</w:t>
+      </w:r>
+      <w:r>
+        <w:t xml:space="preserve"> </w:t>
+      </w:r>
+      <w:r>
+        <w:t xml:space="preserve">seeding patch; its exact source is archived at</w:t>
+      </w:r>
+      <w:r>
+        <w:t xml:space="preserve"> </w:t>
+      </w:r>
+      <w:r>
+        <w:rPr>
+          <w:rStyle w:val="VerbatimChar"/>
+        </w:rPr>
+        <w:t xml:space="preserve">FLUS_console_crossplatform</w:t>
+      </w:r>
+      <w:r>
+        <w:t xml:space="preserve"> </w:t>
+      </w:r>
+      <w:r>
+        <w:t xml:space="preserve">commit</w:t>
+      </w:r>
+      <w:r>
+        <w:t xml:space="preserve"> </w:t>
+      </w:r>
+      <w:r>
+        <w:rPr>
+          <w:rStyle w:val="VerbatimChar"/>
+        </w:rPr>
+        <w:t xml:space="preserve">deb0a54</w:t>
+      </w:r>
+      <w:r>
+        <w:t xml:space="preserve">. It is not asserted to be bitwise equivalent to an unmodified upstream build. All headline and matched-input runs used seeds 31, 47 and 73.</w:t>
       </w:r>
     </w:p>
     <w:p>
@@ -2085,13 +2259,19 @@
         <w:t xml:space="preserve"> </w:t>
       </w:r>
       <w:r>
-        <w:t xml:space="preserve">Values are means across the three</w:t>
-      </w:r>
-      <w:r>
-        <w:t xml:space="preserve"> </w:t>
-      </w:r>
-      <w:r>
-        <w:t xml:space="preserve">frozen computational seeds; the strict multi-class change FoM is the primary</w:t>
+        <w:t xml:space="preserve">Except for the explicitly labelled</w:t>
+      </w:r>
+      <w:r>
+        <w:t xml:space="preserve"> </w:t>
+      </w:r>
+      <w:r>
+        <w:t xml:space="preserve">matched-input column, values are means across the three frozen computational</w:t>
+      </w:r>
+      <w:r>
+        <w:t xml:space="preserve"> </w:t>
+      </w:r>
+      <w:r>
+        <w:t xml:space="preserve">seeds; the strict multi-class change FoM is the primary</w:t>
       </w:r>
       <w:r>
         <w:t xml:space="preserve"> </w:t>
@@ -2103,7 +2283,7 @@
         <w:t xml:space="preserve"> </w:t>
       </w:r>
       <w:r>
-        <w:t xml:space="preserve">matched-input baseline is shown separately from the original seven-driver</w:t>
+        <w:t xml:space="preserve">matched-input run is shown separately from the original seven-driver</w:t>
       </w:r>
       <w:r>
         <w:t xml:space="preserve"> </w:t>
@@ -2115,7 +2295,25 @@
         <w:t xml:space="preserve"> </w:t>
       </w:r>
       <w:r>
-        <w:t xml:space="preserve">not match the Kernel’s next-state transition task. Persistence and random</w:t>
+        <w:t xml:space="preserve">not match the Kernel’s next-state transition task. Three seeds were run, but</w:t>
+      </w:r>
+      <w:r>
+        <w:t xml:space="preserve"> </w:t>
+      </w:r>
+      <w:r>
+        <w:t xml:space="preserve">seeds 47 and 73 collapsed to zero-change outputs through current-class identity</w:t>
+      </w:r>
+      <w:r>
+        <w:t xml:space="preserve"> </w:t>
+      </w:r>
+      <w:r>
+        <w:t xml:space="preserve">leakage; they are retained as diagnostics rather than averaged. Seed 31 is the</w:t>
+      </w:r>
+      <w:r>
+        <w:t xml:space="preserve"> </w:t>
+      </w:r>
+      <w:r>
+        <w:t xml:space="preserve">only valid matched-input point comparison. Persistence and random</w:t>
       </w:r>
       <w:r>
         <w:t xml:space="preserve"> </w:t>
@@ -2262,7 +2460,7 @@
               <w:jc w:val="right"/>
             </w:pPr>
             <w:r>
-              <w:t xml:space="preserve">0.0440</w:t>
+              <w:t xml:space="preserve">0.1320</w:t>
             </w:r>
           </w:p>
         </w:tc>
@@ -2352,7 +2550,7 @@
               <w:jc w:val="right"/>
             </w:pPr>
             <w:r>
-              <w:t xml:space="preserve">0.0653</w:t>
+              <w:t xml:space="preserve">0.1960</w:t>
             </w:r>
           </w:p>
         </w:tc>
@@ -2463,7 +2661,7 @@
         <w:t xml:space="preserve"> </w:t>
       </w:r>
       <w:r>
-        <w:t xml:space="preserve">controls; bars use three-seed population standard deviations, whereas the</w:t>
+        <w:t xml:space="preserve">controls and the seed-31 matched-input diagnostic; main-model bars use three-seed population standard deviations, whereas the</w:t>
       </w:r>
       <w:r>
         <w:t xml:space="preserve"> </w:t>
@@ -2483,37 +2681,49 @@
         <w:pStyle w:val="BodyText"/>
       </w:pPr>
       <w:r>
-        <w:t xml:space="preserve">The reviewer-requested FLUS input-dimension analysis was also completed. Across</w:t>
-      </w:r>
-      <w:r>
-        <w:t xml:space="preserve"> </w:t>
-      </w:r>
-      <w:r>
-        <w:t xml:space="preserve">seeds 31, 47 and 73, the 25-feature matched-input baseline had mean strict FoM</w:t>
-      </w:r>
-      <w:r>
-        <w:t xml:space="preserve"> </w:t>
-      </w:r>
-      <w:r>
-        <w:t xml:space="preserve">0.0440 in 2023 and 0.0653 in 2024; the corresponding Kernel-minus-matched-input</w:t>
-      </w:r>
-      <w:r>
-        <w:t xml:space="preserve"> </w:t>
-      </w:r>
-      <w:r>
-        <w:t xml:space="preserve">paired spatial-block intervals were 0.1350–0.1673 and 0.1687–0.2033,</w:t>
-      </w:r>
-      <w:r>
-        <w:t xml:space="preserve"> </w:t>
-      </w:r>
-      <w:r>
-        <w:t xml:space="preserve">respectively. The 13-feature seven-driver-plus-current-class run had strict FoM</w:t>
-      </w:r>
-      <w:r>
-        <w:t xml:space="preserve"> </w:t>
-      </w:r>
-      <w:r>
-        <w:t xml:space="preserve">0.0000 for both years in seed 31 and produced no changed pixels. This occurs</w:t>
+        <w:t xml:space="preserve">The reviewer-requested FLUS input-dimension analysis was also completed. The</w:t>
+      </w:r>
+      <w:r>
+        <w:t xml:space="preserve"> </w:t>
+      </w:r>
+      <w:r>
+        <w:t xml:space="preserve">25-feature matched-input run gives strict FoM 0.1320 in 2023 and 0.1960 in</w:t>
+      </w:r>
+      <w:r>
+        <w:t xml:space="preserve"> </w:t>
+      </w:r>
+      <w:r>
+        <w:t xml:space="preserve">2024 for the only valid seed (31); the corresponding raw Kernel-minus-matched</w:t>
+      </w:r>
+      <w:r>
+        <w:t xml:space="preserve"> </w:t>
+      </w:r>
+      <w:r>
+        <w:t xml:space="preserve">point contrasts are 0.0599 and 0.0558, while the within-seed spatial-block</w:t>
+      </w:r>
+      <w:r>
+        <w:t xml:space="preserve"> </w:t>
+      </w:r>
+      <w:r>
+        <w:t xml:space="preserve">bootstrap medians are 0.0595 and 0.0558. No three-seed matched-input interval is</w:t>
+      </w:r>
+      <w:r>
+        <w:t xml:space="preserve"> </w:t>
+      </w:r>
+      <w:r>
+        <w:t xml:space="preserve">reported. Seeds 47 and 73 give 0.0000 FoM and zero</w:t>
+      </w:r>
+      <w:r>
+        <w:t xml:space="preserve"> </w:t>
+      </w:r>
+      <w:r>
+        <w:t xml:space="preserve">predicted changes in both years, so the former three-seed mean and paired</w:t>
+      </w:r>
+      <w:r>
+        <w:t xml:space="preserve"> </w:t>
+      </w:r>
+      <w:r>
+        <w:t xml:space="preserve">interval are withdrawn. This occurs</w:t>
       </w:r>
       <w:r>
         <w:t xml:space="preserve"> </w:t>
@@ -2532,7 +2742,7 @@
       </w:r>
       <m:oMath>
         <m:r>
-          <m:t>1.6</m:t>
+          <m:t>1.7</m:t>
         </m:r>
         <m:r>
           <m:rPr>
@@ -2560,13 +2770,16 @@
         </m:sSup>
       </m:oMath>
       <w:r>
-        <w:t xml:space="preserve">), so the CA receives probabilities concentrated on the</w:t>
-      </w:r>
-      <w:r>
-        <w:t xml:space="preserve"> </w:t>
-      </w:r>
-      <w:r>
-        <w:t xml:space="preserve">current class and makes no transitions. The 19-feature diagnostic had strict</w:t>
+        <w:t xml:space="preserve"> </w:t>
+      </w:r>
+      <w:r>
+        <w:t xml:space="preserve">for seeds 47 and 73), so the CA receives probabilities</w:t>
+      </w:r>
+      <w:r>
+        <w:t xml:space="preserve"> </w:t>
+      </w:r>
+      <w:r>
+        <w:t xml:space="preserve">concentrated on the current class and makes no transitions. The 19-feature diagnostic had strict</w:t>
       </w:r>
       <w:r>
         <w:t xml:space="preserve"> </w:t>
@@ -2967,7 +3180,7 @@
         <w:t xml:space="preserve"> </w:t>
       </w:r>
       <w:r>
-        <w:t xml:space="preserve">of connected components in the 2024-built ∪ newly-built footprint per 1,000</w:t>
+        <w:t xml:space="preserve">of connected components in the combined 2024-built and newly built footprint per 1,000</w:t>
       </w:r>
       <w:r>
         <w:t xml:space="preserve"> </w:t>
@@ -4048,19 +4261,61 @@
         <w:t xml:space="preserve"> </w:t>
       </w:r>
       <w:r>
-        <w:t xml:space="preserve">control remains an untraceable Apple-Silicon binary and its headline comparison</w:t>
-      </w:r>
-      <w:r>
-        <w:t xml:space="preserve"> </w:t>
-      </w:r>
-      <w:r>
-        <w:t xml:space="preserve">uses seven drivers; the successful 25-feature run is a matched-input baseline</w:t>
-      </w:r>
-      <w:r>
-        <w:t xml:space="preserve"> </w:t>
-      </w:r>
-      <w:r>
-        <w:t xml:space="preserve">reported separately from the primary unmatched control. These public-data stress tests therefore do</w:t>
+        <w:t xml:space="preserve">control is an Apple-Silicon binary rebuilt from the public GeoSOS source base</w:t>
+      </w:r>
+      <w:r>
+        <w:t xml:space="preserve"> </w:t>
+      </w:r>
+      <w:r>
+        <w:t xml:space="preserve">with the author’s</w:t>
+      </w:r>
+      <w:r>
+        <w:t xml:space="preserve"> </w:t>
+      </w:r>
+      <w:r>
+        <w:rPr>
+          <w:rStyle w:val="VerbatimChar"/>
+        </w:rPr>
+        <w:t xml:space="preserve">train</w:t>
+      </w:r>
+      <w:r>
+        <w:t xml:space="preserve">/</w:t>
+      </w:r>
+      <w:r>
+        <w:rPr>
+          <w:rStyle w:val="VerbatimChar"/>
+        </w:rPr>
+        <w:t xml:space="preserve">train-update</w:t>
+      </w:r>
+      <w:r>
+        <w:t xml:space="preserve"> </w:t>
+      </w:r>
+      <w:r>
+        <w:t xml:space="preserve">and deterministic-seeding patches; its</w:t>
+      </w:r>
+      <w:r>
+        <w:t xml:space="preserve"> </w:t>
+      </w:r>
+      <w:r>
+        <w:t xml:space="preserve">headline comparison uses seven drivers. The successful 25-feature run is a</w:t>
+      </w:r>
+      <w:r>
+        <w:t xml:space="preserve"> </w:t>
+      </w:r>
+      <w:r>
+        <w:t xml:space="preserve">matched-input diagnostic reported separately from the primary unmatched control,</w:t>
+      </w:r>
+      <w:r>
+        <w:t xml:space="preserve"> </w:t>
+      </w:r>
+      <w:r>
+        <w:t xml:space="preserve">with two of its three seeds explicitly flagged as zero-change degeneracies.</w:t>
+      </w:r>
+      <w:r>
+        <w:t xml:space="preserve"> </w:t>
+      </w:r>
+      <w:r>
+        <w:t xml:space="preserve">These public-data stress tests therefore do</w:t>
       </w:r>
       <w:r>
         <w:t xml:space="preserve"> </w:t>
@@ -4518,19 +4773,160 @@
         <w:t xml:space="preserve"> </w:t>
       </w:r>
       <w:r>
-        <w:t xml:space="preserve">The vendored FLUS executable is a macOS arm64 binary; Linux and Windows users</w:t>
-      </w:r>
-      <w:r>
-        <w:t xml:space="preserve"> </w:t>
-      </w:r>
-      <w:r>
-        <w:t xml:space="preserve">can reproduce the Kernel and GeoFM-LDN tracks, but must provide a compatible</w:t>
-      </w:r>
-      <w:r>
-        <w:t xml:space="preserve"> </w:t>
-      </w:r>
-      <w:r>
-        <w:t xml:space="preserve">FLUS build or treat that baseline as unavailable. The repository is intended to</w:t>
+        <w:t xml:space="preserve">The vendored FLUS executable is a macOS arm64 binary rebuilt from the GeoSOS</w:t>
+      </w:r>
+      <w:r>
+        <w:t xml:space="preserve"> </w:t>
+      </w:r>
+      <w:r>
+        <w:t xml:space="preserve">public FLUS source base. The author-modified source, including</w:t>
+      </w:r>
+      <w:r>
+        <w:t xml:space="preserve"> </w:t>
+      </w:r>
+      <w:r>
+        <w:rPr>
+          <w:rStyle w:val="VerbatimChar"/>
+        </w:rPr>
+        <w:t xml:space="preserve">train-update</w:t>
+      </w:r>
+      <w:r>
+        <w:t xml:space="preserve"> </w:t>
+      </w:r>
+      <w:r>
+        <w:t xml:space="preserve">and</w:t>
+      </w:r>
+      <w:r>
+        <w:t xml:space="preserve"> </w:t>
+      </w:r>
+      <w:r>
+        <w:rPr>
+          <w:rStyle w:val="VerbatimChar"/>
+        </w:rPr>
+        <w:t xml:space="preserve">FLUS_RANDOM_SEED</w:t>
+      </w:r>
+      <w:r>
+        <w:t xml:space="preserve">, is archived at</w:t>
+      </w:r>
+      <w:r>
+        <w:t xml:space="preserve"> </w:t>
+      </w:r>
+      <w:r>
+        <w:rPr>
+          <w:rStyle w:val="VerbatimChar"/>
+        </w:rPr>
+        <w:t xml:space="preserve">https://github.com/zhouning/FLUS_console_crossplatform</w:t>
+      </w:r>
+      <w:r>
+        <w:t xml:space="preserve">, tag</w:t>
+      </w:r>
+      <w:r>
+        <w:t xml:space="preserve"> </w:t>
+      </w:r>
+      <w:r>
+        <w:rPr>
+          <w:rStyle w:val="VerbatimChar"/>
+        </w:rPr>
+        <w:t xml:space="preserve">paper-benchmark-flus-v1</w:t>
+      </w:r>
+      <w:r>
+        <w:t xml:space="preserve"> </w:t>
+      </w:r>
+      <w:r>
+        <w:t xml:space="preserve">at commit</w:t>
+      </w:r>
+      <w:r>
+        <w:t xml:space="preserve"> </w:t>
+      </w:r>
+      <w:r>
+        <w:rPr>
+          <w:rStyle w:val="VerbatimChar"/>
+        </w:rPr>
+        <w:t xml:space="preserve">deb0a54</w:t>
+      </w:r>
+      <w:r>
+        <w:t xml:space="preserve"> </w:t>
+      </w:r>
+      <w:r>
+        <w:t xml:space="preserve">(the GeoSOS source release and Liu et al. (2017) are cited above). Rebuilding</w:t>
+      </w:r>
+      <w:r>
+        <w:t xml:space="preserve"> </w:t>
+      </w:r>
+      <w:r>
+        <w:t xml:space="preserve">that commit on macOS arm64 produced SHA-256</w:t>
+      </w:r>
+      <w:r>
+        <w:t xml:space="preserve"> </w:t>
+      </w:r>
+      <w:r>
+        <w:rPr>
+          <w:rStyle w:val="VerbatimChar"/>
+        </w:rPr>
+        <w:t xml:space="preserve">9839ce50950442d4ef49e4d2129a1ba27735e1955c2d4975ae51067c1c3c9964</w:t>
+      </w:r>
+      <w:r>
+        <w:t xml:space="preserve">,</w:t>
+      </w:r>
+      <w:r>
+        <w:t xml:space="preserve"> </w:t>
+      </w:r>
+      <w:r>
+        <w:t xml:space="preserve">identical to the vendored executable.</w:t>
+      </w:r>
+      <w:r>
+        <w:t xml:space="preserve"> </w:t>
+      </w:r>
+      <w:r>
+        <w:t xml:space="preserve">The tagged author-modified source can also be built on Linux and Windows using</w:t>
+      </w:r>
+      <w:r>
+        <w:t xml:space="preserve"> </w:t>
+      </w:r>
+      <w:r>
+        <w:t xml:space="preserve">the repository instructions, although cross-architecture categorical identity</w:t>
+      </w:r>
+      <w:r>
+        <w:t xml:space="preserve"> </w:t>
+      </w:r>
+      <w:r>
+        <w:t xml:space="preserve">is not guaranteed. As an upstream-only fallback, the public FLUS CA source can</w:t>
+      </w:r>
+      <w:r>
+        <w:t xml:space="preserve"> </w:t>
+      </w:r>
+      <w:r>
+        <w:t xml:space="preserve">be paired with an open Python ANN implementation; this reproduces the CA</w:t>
+      </w:r>
+      <w:r>
+        <w:t xml:space="preserve"> </w:t>
+      </w:r>
+      <w:r>
+        <w:t xml:space="preserve">protocol and yields a same-order baseline, but the unmodified upstream CA uses</w:t>
+      </w:r>
+      <w:r>
+        <w:t xml:space="preserve"> </w:t>
+      </w:r>
+      <w:r>
+        <w:t xml:space="preserve">time seeding rather than</w:t>
+      </w:r>
+      <w:r>
+        <w:t xml:space="preserve"> </w:t>
+      </w:r>
+      <w:r>
+        <w:rPr>
+          <w:rStyle w:val="VerbatimChar"/>
+        </w:rPr>
+        <w:t xml:space="preserve">FLUS_RANDOM_SEED</w:t>
+      </w:r>
+      <w:r>
+        <w:t xml:space="preserve">. A compatible local build is required</w:t>
+      </w:r>
+      <w:r>
+        <w:t xml:space="preserve"> </w:t>
+      </w:r>
+      <w:r>
+        <w:t xml:space="preserve">to execute the FLUS track outside macOS arm64. The repository is intended to</w:t>
       </w:r>
       <w:r>
         <w:t xml:space="preserve"> </w:t>
@@ -4787,6 +5183,14 @@
       </w:r>
       <w:r>
         <w:t xml:space="preserve">, 168, 94–116. https://doi.org/10.1016/j.landurbplan.2017.09.019</w:t>
+      </w:r>
+    </w:p>
+    <w:p>
+      <w:pPr>
+        <w:pStyle w:val="BodyText"/>
+      </w:pPr>
+      <w:r>
+        <w:t xml:space="preserve">GeoSOS team, Sun Yat-sen University. (n.d.). FLUS source code for non-commercial academic research. http://www.geosimulation.cn/FLUS-source-code.html (accessed 6 September 2026).</w:t>
       </w:r>
     </w:p>
     <w:p>
@@ -5034,7 +5438,7 @@
       <w:r>
         <w:drawing>
           <wp:inline>
-            <wp:extent cx="5334000" cy="3705443"/>
+            <wp:extent cx="5334000" cy="2869794"/>
             <wp:effectExtent b="0" l="0" r="0" t="0"/>
             <wp:docPr descr="" title="" id="36" name="Picture"/>
             <a:graphic>
@@ -5055,7 +5459,7 @@
                   <pic:spPr bwMode="auto">
                     <a:xfrm>
                       <a:off x="0" y="0"/>
-                      <a:ext cx="5334000" cy="3705443"/>
+                      <a:ext cx="5334000" cy="2869794"/>
                     </a:xfrm>
                     <a:prstGeom prst="rect">
                       <a:avLst/>
@@ -5107,19 +5511,37 @@
         <w:t xml:space="preserve"> </w:t>
       </w:r>
       <w:r>
-        <w:t xml:space="preserve">controls. Error bars show population standard deviation across the three frozen</w:t>
-      </w:r>
-      <w:r>
-        <w:t xml:space="preserve"> </w:t>
-      </w:r>
-      <w:r>
-        <w:t xml:space="preserve">seeds; paired spatial-block intervals are reported in the machine-readable</w:t>
-      </w:r>
-      <w:r>
-        <w:t xml:space="preserve"> </w:t>
-      </w:r>
-      <w:r>
-        <w:t xml:space="preserve">comparison report.</w:t>
+        <w:t xml:space="preserve">controls and the FLUS matched-input seed-31 diagnostic. Error bars show</w:t>
+      </w:r>
+      <w:r>
+        <w:t xml:space="preserve"> </w:t>
+      </w:r>
+      <w:r>
+        <w:t xml:space="preserve">population standard deviation across the three frozen seeds for the three main</w:t>
+      </w:r>
+      <w:r>
+        <w:t xml:space="preserve"> </w:t>
+      </w:r>
+      <w:r>
+        <w:t xml:space="preserve">models; the matched-input bar has no error bar because seeds 47 and 73 are</w:t>
+      </w:r>
+      <w:r>
+        <w:t xml:space="preserve"> </w:t>
+      </w:r>
+      <w:r>
+        <w:t xml:space="preserve">zero-change degeneracy diagnostics and are not averaged. Paired spatial-block</w:t>
+      </w:r>
+      <w:r>
+        <w:t xml:space="preserve"> </w:t>
+      </w:r>
+      <w:r>
+        <w:t xml:space="preserve">intervals for the main models are reported in the machine-readable comparison</w:t>
+      </w:r>
+      <w:r>
+        <w:t xml:space="preserve"> </w:t>
+      </w:r>
+      <w:r>
+        <w:t xml:space="preserve">report.</w:t>
       </w:r>
     </w:p>
     <w:p>
@@ -5208,7 +5630,7 @@
         <w:t xml:space="preserve"> </w:t>
       </w:r>
       <w:r>
-        <w:t xml:space="preserve">2024-built ∪ newly-built footprint per 1,000 valid cells. Panel D shows</w:t>
+        <w:t xml:space="preserve">combined 2024-built and newly built footprint per 1,000 valid cells. Panel D shows</w:t>
       </w:r>
       <w:r>
         <w:t xml:space="preserve"> </w:t>

</xml_diff>

<commit_message>
Address eighth-round reproducibility review
</commit_message>
<xml_diff>
--- a/manuscript/manuscript.docx
+++ b/manuscript/manuscript.docx
@@ -95,7 +95,7 @@
         <w:pStyle w:val="FirstParagraph"/>
       </w:pPr>
       <w:r>
-        <w:t xml:space="preserve">Urban land-change models are often evaluated against annual labels whose reliability is not spatially uniform. We present an auditable protocol for testing constrained spatial allocation under that uncertainty, using Geospatial Kernel, the algorithmic core of a Geospatial World Model, as the focal execution layer. The Abu Dhabi public-data benchmark uses annual 100-m land-cover products from 2017–2024, three computational seeds, destination-correct multi-class change Figure of Merit (FoM), spatial-block bootstrap contrasts and explicit state–action–constraint traces. The regenerated strict FoM was 0.1950 for Geospatial Kernel, 0.1256 for the GeoSOS-derived FLUS-style ANN–CA console (author-modified build) and 0.1616 for GeoFM-LDN in 2023; after recursive two-step rollout in 2024 the values were 0.2520, 0.1782 and 0.2708, respectively. On the high-confidence label subset, all three models had FoM 0.000 in 2023 and the 2024 maximum was 0.0188, showing that full-grid agreement is strongly conditioned by label noise. The planning track is therefore reported as scenario stress testing, not official forecasting. The released public bundle, source, checkpoints, rasters, vector footprints and audit manifests support locked-environment reproduction. An author-run Linux comparison reproduced the six released Kernel rasters exactly at the categorical-cell level and yielded zero strict-FoM difference; this is a measurement of this controlled pair of environments, not a promise of bitwise identity for every numerical stack. The protocol’s principal contribution is an inspectable proposal–projection–writeback boundary for separating model behaviour from action and constraint semantics.</w:t>
+        <w:t xml:space="preserve">Urban land-change models are often evaluated against annual labels whose reliability is not spatially uniform. We present an auditable protocol for testing constrained spatial allocation under that uncertainty, using Geospatial Kernel, the algorithmic core of a Geospatial World Model, as the focal execution layer. The Abu Dhabi public-data benchmark uses annual 100-m land-cover products from 2017–2024, three computational seeds, destination-correct multi-class change Figure of Merit (FoM), spatial-block bootstrap contrasts and explicit state–action–constraint traces. In a clean run of the fully resolved environment, strict FoM was 0.1961 for Geospatial Kernel, 0.1256 for the GeoSOS-derived FLUS-style ANN–CA console (author-modified build) and 0.1619 for GeoFM-LDN in 2023; after recursive two-step rollout in 2024 the values were 0.2529, 0.1782 and 0.2708, respectively. On the high-confidence label subset, all three models had FoM 0.000 in 2023 and the 2024 maximum was 0.0188, showing that full-grid agreement is strongly conditioned by label noise. The planning track is therefore reported as scenario stress testing, not official forecasting. The released public bundle, source, checkpoints, rasters, vector footprints and audit manifests support locked-environment reproduction; cross-stack variation is quantified rather than assumed absent. The protocol’s principal contribution is an inspectable proposal–projection–writeback boundary for separating model behaviour from action and constraint semantics.</w:t>
       </w:r>
     </w:p>
     <w:bookmarkEnd w:id="9"/>
@@ -1470,7 +1470,7 @@
         <w:pStyle w:val="FirstParagraph"/>
       </w:pPr>
       <w:r>
-        <w:t xml:space="preserve">The baseline was run through a GeoSOS-derived FLUS-style ANN–CA console (author-modified build) using seven continuous drivers: normalized row and column coordinates, elevation, slope, VIIRS radiance, distance to roads and distance to major roads. Its ANN suitability surface was passed to a cellular-automata allocation stage with the common class totals and public hard mask. The archived run used one 2021 training year, eight ANN hidden neurons, a 3 × 3 CA neighbourhood, neighbourhood strength 1.0, acceleration factor 0.1 and 1,000 iterations. Its frozen transition matrix protected water and wetland but did not prohibit built-to-non-built transitions. The algorithmic base is traceable to the GeoSOS team’s public FLUS source release (Liu et al., 2017; geosimulation.cn); the accompanying source repository</w:t>
+        <w:t xml:space="preserve">The baseline was run through a GeoSOS-derived FLUS-style ANN–CA console (author-modified build;</w:t>
       </w:r>
       <w:r>
         <w:t xml:space="preserve"> </w:t>
@@ -1479,6 +1479,18 @@
         <w:rPr>
           <w:rStyle w:val="VerbatimChar"/>
         </w:rPr>
+        <w:t xml:space="preserve">paper-benchmark-flus-v1</w:t>
+      </w:r>
+      <w:r>
+        <w:t xml:space="preserve">) using seven continuous drivers: normalized row and column coordinates, elevation, slope, VIIRS radiance, distance to roads and distance to major roads. Its ANN suitability surface was passed to a cellular-automata allocation stage with the common class totals and public hard mask. The archived run used one 2021 training year, eight ANN hidden neurons, a 3 × 3 CA neighbourhood, neighbourhood strength 1.0, acceleration factor 0.1 and 1,000 iterations. Its frozen transition matrix protected water and wetland but did not prohibit built-to-non-built transitions. The algorithmic base is traceable to the GeoSOS team’s public FLUS source release (Liu et al., 2017; geosimulation.cn); the accompanying source repository</w:t>
+      </w:r>
+      <w:r>
+        <w:t xml:space="preserve"> </w:t>
+      </w:r>
+      <w:r>
+        <w:rPr>
+          <w:rStyle w:val="VerbatimChar"/>
+        </w:rPr>
         <w:t xml:space="preserve">FLUS_console_crossplatform</w:t>
       </w:r>
       <w:r>
@@ -1539,7 +1551,7 @@
         <w:t xml:space="preserve"> </w:t>
       </w:r>
       <w:r>
-        <w:t xml:space="preserve">deterministic seeding for both ANN sampling and CA roulette draws, so the build is not the unmodified upstream executable. A 25-feature Kernel-matched input was then executed with absolute paths for seeds 31, 47 and 73 and is reported as a separate matched-input diagnostic. It shares the Kernel feature family, but not the learning target or projection semantics: the FLUS ANN estimates same-year label suitability</w:t>
+        <w:t xml:space="preserve">deterministic seeding for both ANN sampling and CA roulette draws, so the build is not the unmodified upstream executable. A 25-feature Kernel-matched input was then executed with absolute paths for seeds 31, 47 and 73 and is reported only as a platform-sensitive diagnostic. It shares the Kernel feature family, but not the learning target or projection semantics: the FLUS ANN estimates same-year label suitability</w:t>
       </w:r>
       <w:r>
         <w:t xml:space="preserve"> </w:t>
@@ -1675,7 +1687,7 @@
         <w:t xml:space="preserve"> </w:t>
       </w:r>
       <w:r>
-        <w:t xml:space="preserve">before constrained projection. Matching features therefore does not match the training task. Two intermediate configurations were retained as mechanism diagnostics: 13 features (seven drivers plus current-class indicators) and 19 features (seven drivers plus neighbourhood fractions). The 13-feature run includes the current label in the inputs and therefore permits identity leakage; its near-zero change output is interpreted as a degenerate same-year suitability fit, not as evidence of zero land change.</w:t>
+        <w:t xml:space="preserve">before constrained projection. Matching features therefore does not match the training task. Two intermediate configurations were retained as mechanism diagnostics: 13 features (seven drivers plus current-class indicators) and 19 features (seven drivers plus neighbourhood fractions). The 25-feature run collapsed to zero change for macOS seeds 47 and 73 and for all three reviewer-provided Windows x86_64 seeds; the remaining macOS seed-31 run is not used as a valid estimator. The 19-feature mode produced changes for all three macOS seeds but underfilled the observed 4,500 and 8,464 changed cells in 2023 and 2024. Both modes are therefore diagnostic-only.</w:t>
       </w:r>
     </w:p>
     <w:p>
@@ -1917,7 +1929,7 @@
         <w:pStyle w:val="BodyText"/>
       </w:pPr>
       <w:r>
-        <w:t xml:space="preserve">The comparison shared the canonical grid, origin states, target actions, hard masks and evaluator, but the public-data run was not information-balanced. The original FLUS-style control used seven continuous drivers in its external ANN suitability model, whereas Geospatial Kernel used 25 features including current-class indicators and neighbourhood proportions; GeoFM-LDN used AlphaEarth latent embeddings and the Kernel allocator. We therefore report the original result as an unmatched-input pipeline comparison, not evidence that one learner is intrinsically superior. The additional 25-feature FLUS run is a matched-input diagnostic in feature space, but it still learns same-year suitability rather than next-state transitions and does not use the Kernel projection implementation. The archived FLUS console is a Mach-O arm64 executable rebuilt from the public GeoSOS source base with the author-modified</w:t>
+        <w:t xml:space="preserve">The comparison shared the canonical grid, origin states, target actions, hard masks and evaluator, but the public-data run was not information-balanced. The original FLUS-style control used seven continuous drivers in its external ANN suitability model, whereas Geospatial Kernel used 25 features including current-class indicators and neighbourhood proportions; GeoFM-LDN used AlphaEarth latent embeddings and the Kernel allocator. We therefore report the original result as an unmatched-input pipeline comparison, not evidence that one learner is intrinsically superior. The additional 25-feature FLUS run is a feature-space diagnostic only, because it still learns same-year suitability rather than next-state transitions and does not use the Kernel projection implementation. Across six platform–seed runs, five produced zero-change outputs through current-class identity leakage. The archived FLUS console is a Mach-O arm64 executable rebuilt from the public GeoSOS source base with the author-modified</w:t>
       </w:r>
       <w:r>
         <w:t xml:space="preserve"> </w:t>
@@ -1983,7 +1995,7 @@
         <w:t xml:space="preserve">deb0a54</w:t>
       </w:r>
       <w:r>
-        <w:t xml:space="preserve">. It is not asserted to be bitwise equivalent to an unmodified upstream build. All headline and matched-input runs used seeds 31, 47 and 73.</w:t>
+        <w:t xml:space="preserve">. It is not asserted to be bitwise equivalent to an unmodified upstream build. All headline and diagnostic runs used seeds 31, 47 and 73.</w:t>
       </w:r>
     </w:p>
     <w:p>
@@ -2205,19 +2217,19 @@
         <w:t xml:space="preserve"> </w:t>
       </w:r>
       <w:r>
-        <w:t xml:space="preserve">strict multi-class transition FoM (mean across three seeds) was 0.1256, 0.1950</w:t>
-      </w:r>
-      <w:r>
-        <w:t xml:space="preserve"> </w:t>
-      </w:r>
-      <w:r>
-        <w:t xml:space="preserve">and 0.1616 for the FLUS-style console, Geospatial Kernel and GeoFM-LDN in 2023,</w:t>
-      </w:r>
-      <w:r>
-        <w:t xml:space="preserve"> </w:t>
-      </w:r>
-      <w:r>
-        <w:t xml:space="preserve">and 0.1782, 0.2520 and 0.2708 in 2024, respectively. Under this unmatched</w:t>
+        <w:t xml:space="preserve">strict multi-class transition FoM (mean across three seeds) was 0.1256, 0.1961</w:t>
+      </w:r>
+      <w:r>
+        <w:t xml:space="preserve"> </w:t>
+      </w:r>
+      <w:r>
+        <w:t xml:space="preserve">and 0.1619 for the FLUS-style console, Geospatial Kernel and GeoFM-LDN in 2023,</w:t>
+      </w:r>
+      <w:r>
+        <w:t xml:space="preserve"> </w:t>
+      </w:r>
+      <w:r>
+        <w:t xml:space="preserve">and 0.1782, 0.2529 and 0.2708 in 2024, respectively. Under this unmatched</w:t>
       </w:r>
       <w:r>
         <w:t xml:space="preserve"> </w:t>
@@ -2259,67 +2271,49 @@
         <w:t xml:space="preserve"> </w:t>
       </w:r>
       <w:r>
-        <w:t xml:space="preserve">Except for the explicitly labelled</w:t>
-      </w:r>
-      <w:r>
-        <w:t xml:space="preserve"> </w:t>
-      </w:r>
-      <w:r>
-        <w:t xml:space="preserve">matched-input column, values are means across the three frozen computational</w:t>
-      </w:r>
-      <w:r>
-        <w:t xml:space="preserve"> </w:t>
-      </w:r>
-      <w:r>
-        <w:t xml:space="preserve">seeds; the strict multi-class change FoM is the primary</w:t>
-      </w:r>
-      <w:r>
-        <w:t xml:space="preserve"> </w:t>
-      </w:r>
-      <w:r>
-        <w:t xml:space="preserve">metric and the remaining columns are diagnostics. The 25-feature FLUS</w:t>
-      </w:r>
-      <w:r>
-        <w:t xml:space="preserve"> </w:t>
-      </w:r>
-      <w:r>
-        <w:t xml:space="preserve">matched-input run is shown separately from the original seven-driver</w:t>
-      </w:r>
-      <w:r>
-        <w:t xml:space="preserve"> </w:t>
-      </w:r>
-      <w:r>
-        <w:t xml:space="preserve">unmatched control because its same-year suitability target and CA semantics do</w:t>
-      </w:r>
-      <w:r>
-        <w:t xml:space="preserve"> </w:t>
-      </w:r>
-      <w:r>
-        <w:t xml:space="preserve">not match the Kernel’s next-state transition task. Three seeds were run, but</w:t>
-      </w:r>
-      <w:r>
-        <w:t xml:space="preserve"> </w:t>
-      </w:r>
-      <w:r>
-        <w:t xml:space="preserve">seeds 47 and 73 collapsed to zero-change outputs through current-class identity</w:t>
-      </w:r>
-      <w:r>
-        <w:t xml:space="preserve"> </w:t>
-      </w:r>
-      <w:r>
-        <w:t xml:space="preserve">leakage; they are retained as diagnostics rather than averaged. Seed 31 is the</w:t>
-      </w:r>
-      <w:r>
-        <w:t xml:space="preserve"> </w:t>
-      </w:r>
-      <w:r>
-        <w:t xml:space="preserve">only valid matched-input point comparison. Persistence and random</w:t>
-      </w:r>
-      <w:r>
-        <w:t xml:space="preserve"> </w:t>
-      </w:r>
-      <w:r>
-        <w:t xml:space="preserve">minimum-change are explicit zero-model controls rather than learned models.</w:t>
+        <w:t xml:space="preserve">Values are means across the three</w:t>
+      </w:r>
+      <w:r>
+        <w:t xml:space="preserve"> </w:t>
+      </w:r>
+      <w:r>
+        <w:t xml:space="preserve">frozen computational seeds; the strict multi-class change FoM is the primary</w:t>
+      </w:r>
+      <w:r>
+        <w:t xml:space="preserve"> </w:t>
+      </w:r>
+      <w:r>
+        <w:t xml:space="preserve">metric and the remaining columns are diagnostics. The 25-feature FLUS run is</w:t>
+      </w:r>
+      <w:r>
+        <w:t xml:space="preserve"> </w:t>
+      </w:r>
+      <w:r>
+        <w:t xml:space="preserve">excluded from this table because it is not a comparable estimator. Across six</w:t>
+      </w:r>
+      <w:r>
+        <w:t xml:space="preserve"> </w:t>
+      </w:r>
+      <w:r>
+        <w:t xml:space="preserve">platform–seed runs, five collapsed to zero-change outputs through current-class</w:t>
+      </w:r>
+      <w:r>
+        <w:t xml:space="preserve"> </w:t>
+      </w:r>
+      <w:r>
+        <w:t xml:space="preserve">identity leakage, so the non-collapsed macOS seed-31 result is retained only in</w:t>
+      </w:r>
+      <w:r>
+        <w:t xml:space="preserve"> </w:t>
+      </w:r>
+      <w:r>
+        <w:t xml:space="preserve">the diagnostic archive. Persistence and random minimum-change are explicit</w:t>
+      </w:r>
+      <w:r>
+        <w:t xml:space="preserve"> </w:t>
+      </w:r>
+      <w:r>
+        <w:t xml:space="preserve">zero-model controls rather than learned models.</w:t>
       </w:r>
     </w:p>
     <w:tbl>
@@ -2330,13 +2324,12 @@
         <w:tblLook w:firstRow="1" w:lastRow="0" w:firstColumn="0" w:lastColumn="0" w:noHBand="0" w:noVBand="0" w:val="0020"/>
       </w:tblPr>
       <w:tblGrid>
-        <w:gridCol w:w="1131"/>
-        <w:gridCol w:w="1131"/>
-        <w:gridCol w:w="1131"/>
-        <w:gridCol w:w="1131"/>
-        <w:gridCol w:w="1131"/>
-        <w:gridCol w:w="1131"/>
-        <w:gridCol w:w="1131"/>
+        <w:gridCol w:w="1320"/>
+        <w:gridCol w:w="1320"/>
+        <w:gridCol w:w="1320"/>
+        <w:gridCol w:w="1320"/>
+        <w:gridCol w:w="1320"/>
+        <w:gridCol w:w="1320"/>
       </w:tblGrid>
       <w:tr>
         <w:trPr>
@@ -2374,18 +2367,6 @@
               <w:jc w:val="right"/>
             </w:pPr>
             <w:r>
-              <w:t xml:space="preserve">FLUS matched (25)</w:t>
-            </w:r>
-          </w:p>
-        </w:tc>
-        <w:tc>
-          <w:tcPr/>
-          <w:p>
-            <w:pPr>
-              <w:pStyle w:val="Compact"/>
-              <w:jc w:val="right"/>
-            </w:pPr>
-            <w:r>
               <w:t xml:space="preserve">Kernel</w:t>
             </w:r>
           </w:p>
@@ -2449,18 +2430,6 @@
             </w:pPr>
             <w:r>
               <w:t xml:space="preserve">0.1256</w:t>
-            </w:r>
-          </w:p>
-        </w:tc>
-        <w:tc>
-          <w:tcPr/>
-          <w:p>
-            <w:pPr>
-              <w:pStyle w:val="Compact"/>
-              <w:jc w:val="right"/>
-            </w:pPr>
-            <w:r>
-              <w:t xml:space="preserve">0.1320</w:t>
             </w:r>
           </w:p>
         </w:tc>
@@ -2476,7 +2445,7 @@
                 <w:b/>
                 <w:bCs/>
               </w:rPr>
-              <w:t xml:space="preserve">0.1950</w:t>
+              <w:t xml:space="preserve">0.1961</w:t>
             </w:r>
           </w:p>
         </w:tc>
@@ -2488,7 +2457,7 @@
               <w:jc w:val="right"/>
             </w:pPr>
             <w:r>
-              <w:t xml:space="preserve">0.1616</w:t>
+              <w:t xml:space="preserve">0.1619</w:t>
             </w:r>
           </w:p>
         </w:tc>
@@ -2550,19 +2519,7 @@
               <w:jc w:val="right"/>
             </w:pPr>
             <w:r>
-              <w:t xml:space="preserve">0.1960</w:t>
-            </w:r>
-          </w:p>
-        </w:tc>
-        <w:tc>
-          <w:tcPr/>
-          <w:p>
-            <w:pPr>
-              <w:pStyle w:val="Compact"/>
-              <w:jc w:val="right"/>
-            </w:pPr>
-            <w:r>
-              <w:t xml:space="preserve">0.2520</w:t>
+              <w:t xml:space="preserve">0.2529</w:t>
             </w:r>
           </w:p>
         </w:tc>
@@ -2619,19 +2576,19 @@
         <w:t xml:space="preserve"> </w:t>
       </w:r>
       <w:r>
-        <w:t xml:space="preserve">Kernel minus the FLUS-style control was 0.0692 [0.0546, 0.0859] and GeoFM-LDN</w:t>
-      </w:r>
-      <w:r>
-        <w:t xml:space="preserve"> </w:t>
-      </w:r>
-      <w:r>
-        <w:t xml:space="preserve">minus Kernel was −0.0333 [−0.0478, −0.0201]. For 2024, GeoFM-LDN minus Kernel</w:t>
-      </w:r>
-      <w:r>
-        <w:t xml:space="preserve"> </w:t>
-      </w:r>
-      <w:r>
-        <w:t xml:space="preserve">was 0.0184 [0.0046, 0.0321]. These are conditional pipeline contrasts on public labels,</w:t>
+        <w:t xml:space="preserve">Kernel minus the FLUS-style control was 0.0703 [0.0558, 0.0866] and GeoFM-LDN</w:t>
+      </w:r>
+      <w:r>
+        <w:t xml:space="preserve"> </w:t>
+      </w:r>
+      <w:r>
+        <w:t xml:space="preserve">minus Kernel was -0.0341 [-0.0479, -0.0209]. For 2024, GeoFM-LDN minus Kernel</w:t>
+      </w:r>
+      <w:r>
+        <w:t xml:space="preserve"> </w:t>
+      </w:r>
+      <w:r>
+        <w:t xml:space="preserve">was 0.0177 [0.0033, 0.0314]. These are conditional pipeline contrasts on public labels,</w:t>
       </w:r>
       <w:r>
         <w:t xml:space="preserve"> </w:t>
@@ -2661,19 +2618,25 @@
         <w:t xml:space="preserve"> </w:t>
       </w:r>
       <w:r>
-        <w:t xml:space="preserve">controls and the seed-31 matched-input diagnostic; main-model bars use three-seed population standard deviations, whereas the</w:t>
-      </w:r>
-      <w:r>
-        <w:t xml:space="preserve"> </w:t>
-      </w:r>
-      <w:r>
-        <w:t xml:space="preserve">paired spatial-block intervals above are the uncertainty summaries used for</w:t>
-      </w:r>
-      <w:r>
-        <w:t xml:space="preserve"> </w:t>
-      </w:r>
-      <w:r>
-        <w:t xml:space="preserve">model contrasts.</w:t>
+        <w:t xml:space="preserve">controls; main-model bars use three-seed population standard deviations,</w:t>
+      </w:r>
+      <w:r>
+        <w:t xml:space="preserve"> </w:t>
+      </w:r>
+      <w:r>
+        <w:t xml:space="preserve">whereas the paired spatial-block intervals above are the uncertainty summaries</w:t>
+      </w:r>
+      <w:r>
+        <w:t xml:space="preserve"> </w:t>
+      </w:r>
+      <w:r>
+        <w:t xml:space="preserve">used for model contrasts. The 25- and 19-feature FLUS diagnostics are reported</w:t>
+      </w:r>
+      <w:r>
+        <w:t xml:space="preserve"> </w:t>
+      </w:r>
+      <w:r>
+        <w:t xml:space="preserve">in the machine-readable archive and Supplementary Table S3.</w:t>
       </w:r>
     </w:p>
     <w:p>
@@ -2687,111 +2650,67 @@
         <w:t xml:space="preserve"> </w:t>
       </w:r>
       <w:r>
-        <w:t xml:space="preserve">25-feature matched-input run gives strict FoM 0.1320 in 2023 and 0.1960 in</w:t>
-      </w:r>
-      <w:r>
-        <w:t xml:space="preserve"> </w:t>
-      </w:r>
-      <w:r>
-        <w:t xml:space="preserve">2024 for the only valid seed (31); the corresponding raw Kernel-minus-matched</w:t>
-      </w:r>
-      <w:r>
-        <w:t xml:space="preserve"> </w:t>
-      </w:r>
-      <w:r>
-        <w:t xml:space="preserve">point contrasts are 0.0599 and 0.0558, while the within-seed spatial-block</w:t>
-      </w:r>
-      <w:r>
-        <w:t xml:space="preserve"> </w:t>
-      </w:r>
-      <w:r>
-        <w:t xml:space="preserve">bootstrap medians are 0.0595 and 0.0558. No three-seed matched-input interval is</w:t>
-      </w:r>
-      <w:r>
-        <w:t xml:space="preserve"> </w:t>
-      </w:r>
-      <w:r>
-        <w:t xml:space="preserve">reported. Seeds 47 and 73 give 0.0000 FoM and zero</w:t>
-      </w:r>
-      <w:r>
-        <w:t xml:space="preserve"> </w:t>
-      </w:r>
-      <w:r>
-        <w:t xml:space="preserve">predicted changes in both years, so the former three-seed mean and paired</w:t>
-      </w:r>
-      <w:r>
-        <w:t xml:space="preserve"> </w:t>
-      </w:r>
-      <w:r>
-        <w:t xml:space="preserve">interval are withdrawn. This occurs</w:t>
-      </w:r>
-      <w:r>
-        <w:t xml:space="preserve"> </w:t>
-      </w:r>
-      <w:r>
-        <w:t xml:space="preserve">because the current-class indicators expose the same-year label used as the ANN</w:t>
-      </w:r>
-      <w:r>
-        <w:t xml:space="preserve"> </w:t>
-      </w:r>
-      <w:r>
-        <w:t xml:space="preserve">target: the network learns an almost exact identity mapping (training RMSE</w:t>
-      </w:r>
-      <w:r>
-        <w:t xml:space="preserve"> </w:t>
-      </w:r>
-      <m:oMath>
-        <m:r>
-          <m:t>1.7</m:t>
-        </m:r>
-        <m:r>
-          <m:rPr>
-            <m:sty m:val="p"/>
-          </m:rPr>
-          <m:t>×</m:t>
-        </m:r>
-        <m:sSup>
-          <m:e>
-            <m:r>
-              <m:t>10</m:t>
-            </m:r>
-          </m:e>
-          <m:sup>
-            <m:r>
-              <m:rPr>
-                <m:sty m:val="p"/>
-              </m:rPr>
-              <m:t>−</m:t>
-            </m:r>
-            <m:r>
-              <m:t>5</m:t>
-            </m:r>
-          </m:sup>
-        </m:sSup>
-      </m:oMath>
-      <w:r>
-        <w:t xml:space="preserve"> </w:t>
-      </w:r>
-      <w:r>
-        <w:t xml:space="preserve">for seeds 47 and 73), so the CA receives probabilities</w:t>
-      </w:r>
-      <w:r>
-        <w:t xml:space="preserve"> </w:t>
-      </w:r>
-      <w:r>
-        <w:t xml:space="preserve">concentrated on the current class and makes no transitions. The 19-feature diagnostic had strict</w:t>
-      </w:r>
-      <w:r>
-        <w:t xml:space="preserve"> </w:t>
-      </w:r>
-      <w:r>
-        <w:t xml:space="preserve">FoM 0.1371 and 0.1149 in seed 31. These results show why matching feature</w:t>
-      </w:r>
-      <w:r>
-        <w:t xml:space="preserve"> </w:t>
-      </w:r>
-      <w:r>
-        <w:t xml:space="preserve">dimensions cannot make the tasks equivalent: FLUS learns static suitability</w:t>
+        <w:t xml:space="preserve">25-feature run is not a valid point estimator: macOS seeds 47 and 73 and all</w:t>
+      </w:r>
+      <w:r>
+        <w:t xml:space="preserve"> </w:t>
+      </w:r>
+      <w:r>
+        <w:t xml:space="preserve">three reviewer-provided Windows x86_64 seeds produced zero-change outputs,</w:t>
+      </w:r>
+      <w:r>
+        <w:t xml:space="preserve"> </w:t>
+      </w:r>
+      <w:r>
+        <w:t xml:space="preserve">whereas macOS seed 31 was the sole non-collapsed run. The six-run pattern is</w:t>
+      </w:r>
+      <w:r>
+        <w:t xml:space="preserve"> </w:t>
+      </w:r>
+      <w:r>
+        <w:t xml:space="preserve">therefore platform-sensitive and is retained as an identity-leakage diagnostic,</w:t>
+      </w:r>
+      <w:r>
+        <w:t xml:space="preserve"> </w:t>
+      </w:r>
+      <w:r>
+        <w:t xml:space="preserve">not as a Kernel contrast. The 19-feature diagnostic was run for all three macOS</w:t>
+      </w:r>
+      <w:r>
+        <w:t xml:space="preserve"> </w:t>
+      </w:r>
+      <w:r>
+        <w:t xml:space="preserve">seeds. Its strict FoM ranged from 0.1071 to 0.1617 in 2023 and from 0.0872 to</w:t>
+      </w:r>
+      <w:r>
+        <w:t xml:space="preserve"> </w:t>
+      </w:r>
+      <w:r>
+        <w:t xml:space="preserve">0.1386 in 2024; predicted changes ranged from 1,702 to 2,417 and from 1,805 to</w:t>
+      </w:r>
+      <w:r>
+        <w:t xml:space="preserve"> </w:t>
+      </w:r>
+      <w:r>
+        <w:t xml:space="preserve">2,499 cells, respectively, compared with 4,500 and 8,464 observed changes.</w:t>
+      </w:r>
+      <w:r>
+        <w:t xml:space="preserve"> </w:t>
+      </w:r>
+      <w:r>
+        <w:t xml:space="preserve">Demand total variation ranged from 0.0153 to 0.0305 in 2023 and from 0.0615 to</w:t>
+      </w:r>
+      <w:r>
+        <w:t xml:space="preserve"> </w:t>
+      </w:r>
+      <w:r>
+        <w:t xml:space="preserve">0.0767 in 2024. These results show why matching feature dimensions cannot make</w:t>
+      </w:r>
+      <w:r>
+        <w:t xml:space="preserve"> </w:t>
+      </w:r>
+      <w:r>
+        <w:t xml:space="preserve">the tasks equivalent: FLUS learns static suitability</w:t>
       </w:r>
       <w:r>
         <w:t xml:space="preserve"> </w:t>
@@ -2844,13 +2763,19 @@
         </m:r>
       </m:oMath>
       <w:r>
-        <w:t xml:space="preserve">, while the Kernel learns next-state transitions and then</w:t>
-      </w:r>
-      <w:r>
-        <w:t xml:space="preserve"> </w:t>
-      </w:r>
-      <w:r>
-        <w:t xml:space="preserve">projects them against action deficits and hard constraints.</w:t>
+        <w:t xml:space="preserve">, while</w:t>
+      </w:r>
+      <w:r>
+        <w:t xml:space="preserve"> </w:t>
+      </w:r>
+      <w:r>
+        <w:t xml:space="preserve">the Kernel learns next-state transitions and then projects them against action</w:t>
+      </w:r>
+      <w:r>
+        <w:t xml:space="preserve"> </w:t>
+      </w:r>
+      <w:r>
+        <w:t xml:space="preserve">deficits and hard constraints.</w:t>
       </w:r>
     </w:p>
     <w:p>
@@ -2938,55 +2863,91 @@
         <w:t xml:space="preserve"> </w:t>
       </w:r>
       <w:r>
-        <w:t xml:space="preserve">scikit-learn 1.9.0. We also reran Geospatial Kernel in a Linux container using the same source,</w:t>
-      </w:r>
-      <w:r>
-        <w:t xml:space="preserve"> </w:t>
-      </w:r>
-      <w:r>
-        <w:t xml:space="preserve">inputs and seeds 31, 47 and 73. Both archived environments are arm64, so this is</w:t>
-      </w:r>
-      <w:r>
-        <w:t xml:space="preserve"> </w:t>
-      </w:r>
-      <w:r>
-        <w:t xml:space="preserve">a same-architecture comparison: across six rasters (2023 and 2024 for each</w:t>
-      </w:r>
-      <w:r>
-        <w:t xml:space="preserve"> </w:t>
-      </w:r>
-      <w:r>
-        <w:t xml:space="preserve">seed), all categorical cells matched and strict-FoM deltas were zero. Earlier</w:t>
-      </w:r>
-      <w:r>
-        <w:t xml:space="preserve"> </w:t>
-      </w:r>
-      <w:r>
-        <w:t xml:space="preserve">x86_64 reruns showed approximately 1% differing cells and FoM changes near</w:t>
-      </w:r>
-      <w:r>
-        <w:t xml:space="preserve"> </w:t>
-      </w:r>
-      <w:r>
-        <w:t xml:space="preserve">0.001; those cross-architecture differences have not yet been independently</w:t>
-      </w:r>
-      <w:r>
-        <w:t xml:space="preserve"> </w:t>
-      </w:r>
-      <w:r>
-        <w:t xml:space="preserve">characterised in this release. The archived comparison report records the</w:t>
-      </w:r>
-      <w:r>
-        <w:t xml:space="preserve"> </w:t>
-      </w:r>
-      <w:r>
-        <w:t xml:space="preserve">exact paths and environment fields. This documents the measured stability of</w:t>
-      </w:r>
-      <w:r>
-        <w:t xml:space="preserve"> </w:t>
-      </w:r>
-      <w:r>
-        <w:t xml:space="preserve">the released same-architecture pair, not universal bitwise identity.</w:t>
+        <w:t xml:space="preserve">scikit-learn 1.9.0. The archived Linux arm64 rerun uses Python 3.12 and</w:t>
+      </w:r>
+      <w:r>
+        <w:t xml:space="preserve"> </w:t>
+      </w:r>
+      <w:r>
+        <w:t xml:space="preserve">scikit-learn 1.8.0, so it measures a cross-stack boundary rather than an</w:t>
+      </w:r>
+      <w:r>
+        <w:t xml:space="preserve"> </w:t>
+      </w:r>
+      <w:r>
+        <w:t xml:space="preserve">architecture-only effect. Across six rasters (2023 and 2024 for each seed), it</w:t>
+      </w:r>
+      <w:r>
+        <w:t xml:space="preserve"> </w:t>
+      </w:r>
+      <w:r>
+        <w:t xml:space="preserve">differs from the current reference by 498–1,147 cells (0.62–1.44% of valid</w:t>
+      </w:r>
+      <w:r>
+        <w:t xml:space="preserve"> </w:t>
+      </w:r>
+      <w:r>
+        <w:t xml:space="preserve">cells), with strict-FoM deltas from -0.0023 to 0.0010. The reviewer-provided</w:t>
+      </w:r>
+      <w:r>
+        <w:t xml:space="preserve"> </w:t>
+      </w:r>
+      <w:r>
+        <w:t xml:space="preserve">Windows FLUS rerun additionally showed 2–4% differing cells from the macOS</w:t>
+      </w:r>
+      <w:r>
+        <w:t xml:space="preserve"> </w:t>
+      </w:r>
+      <w:r>
+        <w:t xml:space="preserve">seven-driver outputs, consistent with the platform-dependent C</w:t>
+      </w:r>
+      <w:r>
+        <w:t xml:space="preserve"> </w:t>
+      </w:r>
+      <w:r>
+        <w:rPr>
+          <w:rStyle w:val="VerbatimChar"/>
+        </w:rPr>
+        <w:t xml:space="preserve">rand()</w:t>
+      </w:r>
+      <w:r>
+        <w:t xml:space="preserve">/</w:t>
+      </w:r>
+      <w:r>
+        <w:rPr>
+          <w:rStyle w:val="VerbatimChar"/>
+        </w:rPr>
+        <w:t xml:space="preserve">srand()</w:t>
+      </w:r>
+      <w:r>
+        <w:t xml:space="preserve"> </w:t>
+      </w:r>
+      <w:r>
+        <w:t xml:space="preserve">stream. The repository does not contain the reviewer’s</w:t>
+      </w:r>
+      <w:r>
+        <w:t xml:space="preserve"> </w:t>
+      </w:r>
+      <w:r>
+        <w:t xml:space="preserve">Windows raster files, so those values are explicitly external verification</w:t>
+      </w:r>
+      <w:r>
+        <w:t xml:space="preserve"> </w:t>
+      </w:r>
+      <w:r>
+        <w:t xml:space="preserve">rather than a local replay. The archived comparison report records the exact</w:t>
+      </w:r>
+      <w:r>
+        <w:t xml:space="preserve"> </w:t>
+      </w:r>
+      <w:r>
+        <w:t xml:space="preserve">paths and environment fields for the arm64 pair. This documents measured</w:t>
+      </w:r>
+      <w:r>
+        <w:t xml:space="preserve"> </w:t>
+      </w:r>
+      <w:r>
+        <w:t xml:space="preserve">cross-stack sensitivity, not universal bitwise identity.</w:t>
       </w:r>
     </w:p>
     <w:p>
@@ -3006,7 +2967,7 @@
         <w:t xml:space="preserve"> </w:t>
       </w:r>
       <w:r>
-        <w:t xml:space="preserve">2.48–3.27 per 1,000 valid cells, the Kernel 2.97–4.26 and GeoFM-LDN 3.22–4.34.</w:t>
+        <w:t xml:space="preserve">2.48–3.27 per 1,000 valid cells, the Kernel 2.92–4.28 and GeoFM-LDN 3.21–4.35.</w:t>
       </w:r>
       <w:r>
         <w:t xml:space="preserve"> </w:t>
@@ -3096,7 +3057,7 @@
         <w:t xml:space="preserve"> </w:t>
       </w:r>
       <w:r>
-        <w:t xml:space="preserve">The 2031 majority-vote ensemble L1 demand errors were 60, 68 and 86 pixels for</w:t>
+        <w:t xml:space="preserve">The 2031 majority-vote ensemble L1 demand errors were 8, 44 and 42 pixels for</w:t>
       </w:r>
       <w:r>
         <w:t xml:space="preserve"> </w:t>
@@ -3108,7 +3069,7 @@
         <w:t xml:space="preserve"> </w:t>
       </w:r>
       <w:r>
-        <w:t xml:space="preserve">the corresponding GeoFM-LDN errors were 1,596, 1,536 and 1,174 pixels and the</w:t>
+        <w:t xml:space="preserve">the corresponding GeoFM-LDN errors were 1,580, 1,524 and 1,148 pixels and the</w:t>
       </w:r>
       <w:r>
         <w:t xml:space="preserve"> </w:t>
@@ -3419,7 +3380,7 @@
               <w:jc w:val="right"/>
             </w:pPr>
             <w:r>
-              <w:t xml:space="preserve">336.7</w:t>
+              <w:t xml:space="preserve">334.7</w:t>
             </w:r>
           </w:p>
         </w:tc>
@@ -3431,7 +3392,7 @@
               <w:jc w:val="right"/>
             </w:pPr>
             <w:r>
-              <w:t xml:space="preserve">117.4</w:t>
+              <w:t xml:space="preserve">116.7</w:t>
             </w:r>
           </w:p>
         </w:tc>
@@ -3443,7 +3404,7 @@
               <w:jc w:val="right"/>
             </w:pPr>
             <w:r>
-              <w:t xml:space="preserve">3.922</w:t>
+              <w:t xml:space="preserve">3.943</w:t>
             </w:r>
           </w:p>
         </w:tc>
@@ -3503,7 +3464,7 @@
               <w:jc w:val="right"/>
             </w:pPr>
             <w:r>
-              <w:t xml:space="preserve">475.5</w:t>
+              <w:t xml:space="preserve">475.9</w:t>
             </w:r>
           </w:p>
         </w:tc>
@@ -3515,7 +3476,7 @@
               <w:jc w:val="right"/>
             </w:pPr>
             <w:r>
-              <w:t xml:space="preserve">239.8</w:t>
+              <w:t xml:space="preserve">239.7</w:t>
             </w:r>
           </w:p>
         </w:tc>
@@ -3527,7 +3488,7 @@
               <w:jc w:val="right"/>
             </w:pPr>
             <w:r>
-              <w:t xml:space="preserve">4.081</w:t>
+              <w:t xml:space="preserve">4.056</w:t>
             </w:r>
           </w:p>
         </w:tc>
@@ -3667,7 +3628,7 @@
               <w:jc w:val="right"/>
             </w:pPr>
             <w:r>
-              <w:t xml:space="preserve">319.8</w:t>
+              <w:t xml:space="preserve">323.1</w:t>
             </w:r>
           </w:p>
         </w:tc>
@@ -3679,7 +3640,7 @@
               <w:jc w:val="right"/>
             </w:pPr>
             <w:r>
-              <w:t xml:space="preserve">111.3</w:t>
+              <w:t xml:space="preserve">111.0</w:t>
             </w:r>
           </w:p>
         </w:tc>
@@ -3691,7 +3652,7 @@
               <w:jc w:val="right"/>
             </w:pPr>
             <w:r>
-              <w:t xml:space="preserve">4.256</w:t>
+              <w:t xml:space="preserve">4.277</w:t>
             </w:r>
           </w:p>
         </w:tc>
@@ -3751,7 +3712,7 @@
               <w:jc w:val="right"/>
             </w:pPr>
             <w:r>
-              <w:t xml:space="preserve">452.2</w:t>
+              <w:t xml:space="preserve">452.1</w:t>
             </w:r>
           </w:p>
         </w:tc>
@@ -3763,7 +3724,7 @@
               <w:jc w:val="right"/>
             </w:pPr>
             <w:r>
-              <w:t xml:space="preserve">222.8</w:t>
+              <w:t xml:space="preserve">222.3</w:t>
             </w:r>
           </w:p>
         </w:tc>
@@ -3775,7 +3736,7 @@
               <w:jc w:val="right"/>
             </w:pPr>
             <w:r>
-              <w:t xml:space="preserve">4.340</w:t>
+              <w:t xml:space="preserve">4.348</w:t>
             </w:r>
           </w:p>
         </w:tc>
@@ -3915,7 +3876,7 @@
               <w:jc w:val="right"/>
             </w:pPr>
             <w:r>
-              <w:t xml:space="preserve">362.5</w:t>
+              <w:t xml:space="preserve">365.5</w:t>
             </w:r>
           </w:p>
         </w:tc>
@@ -3927,7 +3888,7 @@
               <w:jc w:val="right"/>
             </w:pPr>
             <w:r>
-              <w:t xml:space="preserve">141.7</w:t>
+              <w:t xml:space="preserve">139.8</w:t>
             </w:r>
           </w:p>
         </w:tc>
@@ -3939,7 +3900,7 @@
               <w:jc w:val="right"/>
             </w:pPr>
             <w:r>
-              <w:t xml:space="preserve">2.969</w:t>
+              <w:t xml:space="preserve">2.923</w:t>
             </w:r>
           </w:p>
         </w:tc>
@@ -3999,7 +3960,7 @@
               <w:jc w:val="right"/>
             </w:pPr>
             <w:r>
-              <w:t xml:space="preserve">507.7</w:t>
+              <w:t xml:space="preserve">507.5</w:t>
             </w:r>
           </w:p>
         </w:tc>
@@ -4011,7 +3972,7 @@
               <w:jc w:val="right"/>
             </w:pPr>
             <w:r>
-              <w:t xml:space="preserve">264.4</w:t>
+              <w:t xml:space="preserve">263.0</w:t>
             </w:r>
           </w:p>
         </w:tc>
@@ -4023,7 +3984,7 @@
               <w:jc w:val="right"/>
             </w:pPr>
             <w:r>
-              <w:t xml:space="preserve">3.219</w:t>
+              <w:t xml:space="preserve">3.207</w:t>
             </w:r>
           </w:p>
         </w:tc>
@@ -4072,25 +4033,19 @@
         <w:pStyle w:val="BodyText"/>
       </w:pPr>
       <w:r>
-        <w:t xml:space="preserve">In the post-hoc neighbourhood-weight sensitivity, the mean strict FoM ranged</w:t>
-      </w:r>
-      <w:r>
-        <w:t xml:space="preserve"> </w:t>
-      </w:r>
-      <w:r>
-        <w:t xml:space="preserve">from 0.19598 at weight 0 to 0.19472 at weight 0.7 in 2023, and from 0.25280</w:t>
-      </w:r>
-      <w:r>
-        <w:t xml:space="preserve"> </w:t>
-      </w:r>
-      <w:r>
-        <w:t xml:space="preserve">at weight 0 to 0.25130 at weight 0.7 in 2024; the complete strict-evaluator</w:t>
-      </w:r>
-      <w:r>
-        <w:t xml:space="preserve"> </w:t>
-      </w:r>
-      <w:r>
-        <w:t xml:space="preserve">scan is provided in Supplementary Table S2. These changes are small relative</w:t>
+        <w:t xml:space="preserve">In the post-hoc neighbourhood-weight sensitivity, mean strict FoM ranged from</w:t>
+      </w:r>
+      <w:r>
+        <w:t xml:space="preserve"> </w:t>
+      </w:r>
+      <w:r>
+        <w:t xml:space="preserve">0.19570 to 0.19609 in 2023 and from 0.25273 to 0.25304 in 2024; the complete</w:t>
+      </w:r>
+      <w:r>
+        <w:t xml:space="preserve"> </w:t>
+      </w:r>
+      <w:r>
+        <w:t xml:space="preserve">strict-evaluator scan is provided in Supplementary Table S2. These changes are small relative</w:t>
       </w:r>
       <w:r>
         <w:t xml:space="preserve"> </w:t>
@@ -4297,19 +4252,25 @@
         <w:t xml:space="preserve"> </w:t>
       </w:r>
       <w:r>
-        <w:t xml:space="preserve">headline comparison uses seven drivers. The successful 25-feature run is a</w:t>
-      </w:r>
-      <w:r>
-        <w:t xml:space="preserve"> </w:t>
-      </w:r>
-      <w:r>
-        <w:t xml:space="preserve">matched-input diagnostic reported separately from the primary unmatched control,</w:t>
-      </w:r>
-      <w:r>
-        <w:t xml:space="preserve"> </w:t>
-      </w:r>
-      <w:r>
-        <w:t xml:space="preserve">with two of its three seeds explicitly flagged as zero-change degeneracies.</w:t>
+        <w:t xml:space="preserve">headline comparison uses seven drivers. The 25-feature run is a</w:t>
+      </w:r>
+      <w:r>
+        <w:t xml:space="preserve"> </w:t>
+      </w:r>
+      <w:r>
+        <w:t xml:space="preserve">platform-sensitive identity-leakage diagnostic: five of six platform–seed runs</w:t>
+      </w:r>
+      <w:r>
+        <w:t xml:space="preserve"> </w:t>
+      </w:r>
+      <w:r>
+        <w:t xml:space="preserve">collapsed to zero change, so the non-collapsed macOS seed-31 result is not used</w:t>
+      </w:r>
+      <w:r>
+        <w:t xml:space="preserve"> </w:t>
+      </w:r>
+      <w:r>
+        <w:t xml:space="preserve">as a comparative estimate.</w:t>
       </w:r>
       <w:r>
         <w:t xml:space="preserve"> </w:t>
@@ -4594,7 +4555,7 @@
         <w:t xml:space="preserve"> </w:t>
       </w:r>
       <w:r>
-        <w:t xml:space="preserve">can pass the manifest gate. The locked macOS arm64 execution environment remains the reference for model outputs. An author-run same-architecture arm64 Linux comparison of six historical Kernel rasters found zero categorical-cell differences and zero strict-FoM delta; earlier x86_64 differences are disclosed but not independently characterised here. No private database address, credential or client-only service is included. Authoritative Abu Dhabi land-use and independent change-validation data remain outside this study.</w:t>
+        <w:t xml:space="preserve">can pass the manifest gate. The locked macOS arm64 execution environment remains the reference for model outputs. An archived arm64 Linux rerun of the six historical Kernel rasters differed from the macOS reference by 498–1,147 valid cells (0.62%–1.44%), with strict-FoM deltas from -0.0023 to +0.0010; these cross-stack differences are quantified rather than treated as categorical identity. Reviewer-provided Windows x86_64 values are separately labelled as external verification because the corresponding rasters are not archived locally. No private database address, credential or client-only service is included. Authoritative Abu Dhabi land-use and independent change-validation data remain outside this study.</w:t>
       </w:r>
     </w:p>
     <w:bookmarkEnd w:id="28"/>
@@ -4884,31 +4845,7 @@
         <w:t xml:space="preserve"> </w:t>
       </w:r>
       <w:r>
-        <w:t xml:space="preserve">the repository instructions, although cross-architecture categorical identity</w:t>
-      </w:r>
-      <w:r>
-        <w:t xml:space="preserve"> </w:t>
-      </w:r>
-      <w:r>
-        <w:t xml:space="preserve">is not guaranteed. As an upstream-only fallback, the public FLUS CA source can</w:t>
-      </w:r>
-      <w:r>
-        <w:t xml:space="preserve"> </w:t>
-      </w:r>
-      <w:r>
-        <w:t xml:space="preserve">be paired with an open Python ANN implementation; this reproduces the CA</w:t>
-      </w:r>
-      <w:r>
-        <w:t xml:space="preserve"> </w:t>
-      </w:r>
-      <w:r>
-        <w:t xml:space="preserve">protocol and yields a same-order baseline, but the unmodified upstream CA uses</w:t>
-      </w:r>
-      <w:r>
-        <w:t xml:space="preserve"> </w:t>
-      </w:r>
-      <w:r>
-        <w:t xml:space="preserve">time seeding rather than</w:t>
+        <w:t xml:space="preserve">the repository instructions.</w:t>
       </w:r>
       <w:r>
         <w:t xml:space="preserve"> </w:t>
@@ -4920,25 +4857,130 @@
         <w:t xml:space="preserve">FLUS_RANDOM_SEED</w:t>
       </w:r>
       <w:r>
-        <w:t xml:space="preserve">. A compatible local build is required</w:t>
-      </w:r>
-      <w:r>
-        <w:t xml:space="preserve"> </w:t>
-      </w:r>
-      <w:r>
-        <w:t xml:space="preserve">to execute the FLUS track outside macOS arm64. The repository is intended to</w:t>
-      </w:r>
-      <w:r>
-        <w:t xml:space="preserve"> </w:t>
-      </w:r>
-      <w:r>
-        <w:t xml:space="preserve">be public; an archival DOI and the corresponding-author e-mail should be added</w:t>
-      </w:r>
-      <w:r>
-        <w:t xml:space="preserve"> </w:t>
-      </w:r>
-      <w:r>
-        <w:t xml:space="preserve">to the submission metadata.</w:t>
+        <w:t xml:space="preserve"> </w:t>
+      </w:r>
+      <w:r>
+        <w:t xml:space="preserve">guarantees determinism only</w:t>
+      </w:r>
+      <w:r>
+        <w:t xml:space="preserve"> </w:t>
+      </w:r>
+      <w:r>
+        <w:t xml:space="preserve">within a platform and build environment because ANN sampling and CA roulette</w:t>
+      </w:r>
+      <w:r>
+        <w:t xml:space="preserve"> </w:t>
+      </w:r>
+      <w:r>
+        <w:t xml:space="preserve">draws use platform-defined C</w:t>
+      </w:r>
+      <w:r>
+        <w:t xml:space="preserve"> </w:t>
+      </w:r>
+      <w:r>
+        <w:rPr>
+          <w:rStyle w:val="VerbatimChar"/>
+        </w:rPr>
+        <w:t xml:space="preserve">rand()</w:t>
+      </w:r>
+      <w:r>
+        <w:t xml:space="preserve">/</w:t>
+      </w:r>
+      <w:r>
+        <w:rPr>
+          <w:rStyle w:val="VerbatimChar"/>
+        </w:rPr>
+        <w:t xml:space="preserve">srand()</w:t>
+      </w:r>
+      <w:r>
+        <w:t xml:space="preserve"> </w:t>
+      </w:r>
+      <w:r>
+        <w:t xml:space="preserve">streams. The reviewer-provided</w:t>
+      </w:r>
+      <w:r>
+        <w:t xml:space="preserve"> </w:t>
+      </w:r>
+      <w:r>
+        <w:t xml:space="preserve">Windows rerun differed from macOS by approximately 2–4% of valid categorical</w:t>
+      </w:r>
+      <w:r>
+        <w:t xml:space="preserve"> </w:t>
+      </w:r>
+      <w:r>
+        <w:t xml:space="preserve">cells for the seven-driver control, and all three Windows 25-feature runs</w:t>
+      </w:r>
+      <w:r>
+        <w:t xml:space="preserve"> </w:t>
+      </w:r>
+      <w:r>
+        <w:t xml:space="preserve">collapsed to zero change. Windows execution requires the benchmark and working</w:t>
+      </w:r>
+      <w:r>
+        <w:t xml:space="preserve"> </w:t>
+      </w:r>
+      <w:r>
+        <w:t xml:space="preserve">directories to use pure ASCII paths; saving configuration files as UTF-8 alone</w:t>
+      </w:r>
+      <w:r>
+        <w:t xml:space="preserve"> </w:t>
+      </w:r>
+      <w:r>
+        <w:t xml:space="preserve">does not repair GDAL path decoding. A compatible local build is required to</w:t>
+      </w:r>
+      <w:r>
+        <w:t xml:space="preserve"> </w:t>
+      </w:r>
+      <w:r>
+        <w:t xml:space="preserve">execute the FLUS track outside macOS arm64 and will produce a different random</w:t>
+      </w:r>
+      <w:r>
+        <w:t xml:space="preserve"> </w:t>
+      </w:r>
+      <w:r>
+        <w:t xml:space="preserve">stream. The macOS binary SHA statement is an author self-check. As an</w:t>
+      </w:r>
+      <w:r>
+        <w:t xml:space="preserve"> </w:t>
+      </w:r>
+      <w:r>
+        <w:t xml:space="preserve">upstream-only fallback, the public FLUS CA source can be paired with an open</w:t>
+      </w:r>
+      <w:r>
+        <w:t xml:space="preserve"> </w:t>
+      </w:r>
+      <w:r>
+        <w:t xml:space="preserve">Python ANN implementation, but the unmodified upstream CA uses time seeding</w:t>
+      </w:r>
+      <w:r>
+        <w:t xml:space="preserve"> </w:t>
+      </w:r>
+      <w:r>
+        <w:t xml:space="preserve">rather than</w:t>
+      </w:r>
+      <w:r>
+        <w:t xml:space="preserve"> </w:t>
+      </w:r>
+      <w:r>
+        <w:rPr>
+          <w:rStyle w:val="VerbatimChar"/>
+        </w:rPr>
+        <w:t xml:space="preserve">FLUS_RANDOM_SEED</w:t>
+      </w:r>
+      <w:r>
+        <w:t xml:space="preserve">. The repository is intended to be public; an</w:t>
+      </w:r>
+      <w:r>
+        <w:t xml:space="preserve"> </w:t>
+      </w:r>
+      <w:r>
+        <w:t xml:space="preserve">archival DOI and the corresponding-author e-mail should be added to the</w:t>
+      </w:r>
+      <w:r>
+        <w:t xml:space="preserve"> </w:t>
+      </w:r>
+      <w:r>
+        <w:t xml:space="preserve">submission metadata.</w:t>
       </w:r>
     </w:p>
     <w:bookmarkEnd w:id="29"/>
@@ -5438,7 +5480,7 @@
       <w:r>
         <w:drawing>
           <wp:inline>
-            <wp:extent cx="5334000" cy="2869794"/>
+            <wp:extent cx="5334000" cy="2561061"/>
             <wp:effectExtent b="0" l="0" r="0" t="0"/>
             <wp:docPr descr="" title="" id="36" name="Picture"/>
             <a:graphic>
@@ -5459,7 +5501,7 @@
                   <pic:spPr bwMode="auto">
                     <a:xfrm>
                       <a:off x="0" y="0"/>
-                      <a:ext cx="5334000" cy="2869794"/>
+                      <a:ext cx="5334000" cy="2561061"/>
                     </a:xfrm>
                     <a:prstGeom prst="rect">
                       <a:avLst/>
@@ -5511,25 +5553,19 @@
         <w:t xml:space="preserve"> </w:t>
       </w:r>
       <w:r>
-        <w:t xml:space="preserve">controls and the FLUS matched-input seed-31 diagnostic. Error bars show</w:t>
-      </w:r>
-      <w:r>
-        <w:t xml:space="preserve"> </w:t>
-      </w:r>
-      <w:r>
-        <w:t xml:space="preserve">population standard deviation across the three frozen seeds for the three main</w:t>
-      </w:r>
-      <w:r>
-        <w:t xml:space="preserve"> </w:t>
-      </w:r>
-      <w:r>
-        <w:t xml:space="preserve">models; the matched-input bar has no error bar because seeds 47 and 73 are</w:t>
-      </w:r>
-      <w:r>
-        <w:t xml:space="preserve"> </w:t>
-      </w:r>
-      <w:r>
-        <w:t xml:space="preserve">zero-change degeneracy diagnostics and are not averaged. Paired spatial-block</w:t>
+        <w:t xml:space="preserve">controls. Error bars show population standard deviation across the three frozen</w:t>
+      </w:r>
+      <w:r>
+        <w:t xml:space="preserve"> </w:t>
+      </w:r>
+      <w:r>
+        <w:t xml:space="preserve">seeds for the three main models. The 13-, 19- and 25-feature FLUS diagnostics</w:t>
+      </w:r>
+      <w:r>
+        <w:t xml:space="preserve"> </w:t>
+      </w:r>
+      <w:r>
+        <w:t xml:space="preserve">are reported separately in Supplementary Table S3. Paired spatial-block</w:t>
       </w:r>
       <w:r>
         <w:t xml:space="preserve"> </w:t>
@@ -5551,7 +5587,7 @@
       <w:r>
         <w:drawing>
           <wp:inline>
-            <wp:extent cx="5334000" cy="3551268"/>
+            <wp:extent cx="5334000" cy="3550480"/>
             <wp:effectExtent b="0" l="0" r="0" t="0"/>
             <wp:docPr descr="" title="" id="39" name="Picture"/>
             <a:graphic>
@@ -5572,7 +5608,7 @@
                   <pic:spPr bwMode="auto">
                     <a:xfrm>
                       <a:off x="0" y="0"/>
-                      <a:ext cx="5334000" cy="3551268"/>
+                      <a:ext cx="5334000" cy="3550480"/>
                     </a:xfrm>
                     <a:prstGeom prst="rect">
                       <a:avLst/>
@@ -5664,7 +5700,7 @@
       <w:r>
         <w:drawing>
           <wp:inline>
-            <wp:extent cx="5334000" cy="3704556"/>
+            <wp:extent cx="5334000" cy="3703670"/>
             <wp:effectExtent b="0" l="0" r="0" t="0"/>
             <wp:docPr descr="" title="" id="42" name="Picture"/>
             <a:graphic>
@@ -5685,7 +5721,7 @@
                   <pic:spPr bwMode="auto">
                     <a:xfrm>
                       <a:off x="0" y="0"/>
-                      <a:ext cx="5334000" cy="3704556"/>
+                      <a:ext cx="5334000" cy="3703670"/>
                     </a:xfrm>
                     <a:prstGeom prst="rect">
                       <a:avLst/>
@@ -5953,6 +5989,40 @@
           <w:bCs/>
         </w:rPr>
         <w:t xml:space="preserve">Supplementary Table S3:</w:t>
+      </w:r>
+      <w:r>
+        <w:t xml:space="preserve"> </w:t>
+      </w:r>
+      <w:r>
+        <w:t xml:space="preserve">FLUS 13-, 19- and 25-feature diagnostics, platform boundary and demand-underfill evidence (see</w:t>
+      </w:r>
+      <w:r>
+        <w:t xml:space="preserve"> </w:t>
+      </w:r>
+      <w:r>
+        <w:rPr>
+          <w:rStyle w:val="VerbatimChar"/>
+        </w:rPr>
+        <w:t xml:space="preserve">supplementary_table_S3_flus_feature_diagnostics.md</w:t>
+      </w:r>
+      <w:r>
+        <w:t xml:space="preserve">).</w:t>
+      </w:r>
+    </w:p>
+    <w:p>
+      <w:pPr>
+        <w:pStyle w:val="Compact"/>
+        <w:numPr>
+          <w:ilvl w:val="0"/>
+          <w:numId w:val="1004"/>
+        </w:numPr>
+      </w:pPr>
+      <w:r>
+        <w:rPr>
+          <w:b/>
+          <w:bCs/>
+        </w:rPr>
+        <w:t xml:space="preserve">Supplementary Table S4:</w:t>
       </w:r>
       <w:r>
         <w:t xml:space="preserve"> </w:t>

</xml_diff>

<commit_message>
Add corresponding author contact email
</commit_message>
<xml_diff>
--- a/manuscript/manuscript.docx
+++ b/manuscript/manuscript.docx
@@ -70,7 +70,16 @@
         <w:t xml:space="preserve"> </w:t>
       </w:r>
       <w:r>
-        <w:t xml:space="preserve">Ning Zhou</w:t>
+        <w:t xml:space="preserve">Ning Zhou (</w:t>
+      </w:r>
+      <w:r>
+        <w:rPr>
+          <w:rStyle w:val="VerbatimChar"/>
+        </w:rPr>
+        <w:t xml:space="preserve">zhouning@freedotech.com</w:t>
+      </w:r>
+      <w:r>
+        <w:t xml:space="preserve">)</w:t>
       </w:r>
     </w:p>
     <w:p>
@@ -78,7 +87,7 @@
         <w:pStyle w:val="BodyText"/>
       </w:pPr>
       <w:r>
-        <w:t xml:space="preserve">This study is not an official Abu Dhabi planning forecast. Correspondence: Ning Zhou, Beijing Freedo Technology Co., Ltd.</w:t>
+        <w:t xml:space="preserve">This study is not an official Abu Dhabi planning forecast. Correspondence: Ning Zhou, Beijing Freedo Technology Co., Ltd.; zhouning@freedotech.com.</w:t>
       </w:r>
     </w:p>
     <w:bookmarkStart w:id="9" w:name="abstract"/>
@@ -4968,19 +4977,25 @@
         <w:t xml:space="preserve">FLUS_RANDOM_SEED</w:t>
       </w:r>
       <w:r>
-        <w:t xml:space="preserve">. The repository is intended to be public; an</w:t>
-      </w:r>
-      <w:r>
-        <w:t xml:space="preserve"> </w:t>
-      </w:r>
-      <w:r>
-        <w:t xml:space="preserve">archival DOI and the corresponding-author e-mail should be added to the</w:t>
-      </w:r>
-      <w:r>
-        <w:t xml:space="preserve"> </w:t>
-      </w:r>
-      <w:r>
-        <w:t xml:space="preserve">submission metadata.</w:t>
+        <w:t xml:space="preserve">. The corresponding-author e-mail is</w:t>
+      </w:r>
+      <w:r>
+        <w:t xml:space="preserve"> </w:t>
+      </w:r>
+      <w:r>
+        <w:rPr>
+          <w:rStyle w:val="VerbatimChar"/>
+        </w:rPr>
+        <w:t xml:space="preserve">zhouning@freedotech.com</w:t>
+      </w:r>
+      <w:r>
+        <w:t xml:space="preserve">; an archival DOI should be added after a persistent</w:t>
+      </w:r>
+      <w:r>
+        <w:t xml:space="preserve"> </w:t>
+      </w:r>
+      <w:r>
+        <w:t xml:space="preserve">public release is created.</w:t>
       </w:r>
     </w:p>
     <w:bookmarkEnd w:id="29"/>

</xml_diff>

<commit_message>
Address ninth-round LUP review
</commit_message>
<xml_diff>
--- a/manuscript/manuscript.docx
+++ b/manuscript/manuscript.docx
@@ -104,7 +104,7 @@
         <w:pStyle w:val="FirstParagraph"/>
       </w:pPr>
       <w:r>
-        <w:t xml:space="preserve">Urban land-change models are often evaluated against annual labels whose reliability is not spatially uniform. We present an auditable protocol for testing constrained spatial allocation under that uncertainty, using Geospatial Kernel, the algorithmic core of a Geospatial World Model, as the focal execution layer. The Abu Dhabi public-data benchmark uses annual 100-m land-cover products from 2017–2024, three computational seeds, destination-correct multi-class change Figure of Merit (FoM), spatial-block bootstrap contrasts and explicit state–action–constraint traces. In a clean run of the fully resolved environment, strict FoM was 0.1961 for Geospatial Kernel, 0.1256 for the GeoSOS-derived FLUS-style ANN–CA console (author-modified build) and 0.1619 for GeoFM-LDN in 2023; after recursive two-step rollout in 2024 the values were 0.2529, 0.1782 and 0.2708, respectively. On the high-confidence label subset, all three models had FoM 0.000 in 2023 and the 2024 maximum was 0.0188, showing that full-grid agreement is strongly conditioned by label noise. The planning track is therefore reported as scenario stress testing, not official forecasting. The released public bundle, source, checkpoints, rasters, vector footprints and audit manifests support locked-environment reproduction; cross-stack variation is quantified rather than assumed absent. The protocol’s principal contribution is an inspectable proposal–projection–writeback boundary for separating model behaviour from action and constraint semantics.</w:t>
+        <w:t xml:space="preserve">Urban land-change models are often evaluated against annual labels whose reliability is not spatially uniform. We present an auditable protocol for testing constrained spatial allocation under that uncertainty, using Geospatial Kernel, the algorithmic core of a Geospatial World Model, as the focal execution layer. The Abu Dhabi public-data benchmark uses annual 100-m land-cover products from 2017–2024, three computational seeds, destination-correct multi-class change Figure of Merit (FoM), spatial-block bootstrap contrasts and explicit state–action–constraint traces. In a clean run of the fully resolved environment, strict FoM was 0.1961 for Geospatial Kernel, 0.1256 for the GeoSOS-derived FLUS-style ANN–CA console (author-modified build) and 0.1619 for GeoFM-LDN in 2023; after recursive two-step rollout in 2024 the values were 0.2529, 0.1782 and 0.2708, respectively. A dual-year confidence threshold retained only 25 of 4,500 observed changes in 2023 and 56 of 8,464 in 2024; all three FoM values were 0.000 in 2023 and the 2024 maximum was 0.0188. These filtered scores are label-quality and selection-effect diagnostics, not model-skill tests. The planning track is therefore reported as scenario stress testing, not official forecasting. The released public bundle, source, checkpoints, rasters, vector footprints and audit manifests support locked-environment reproduction; cross-stack variation is quantified rather than assumed absent. The protocol’s principal contribution is an inspectable proposal–projection–writeback boundary for separating model behaviour from action and constraint semantics.</w:t>
       </w:r>
     </w:p>
     <w:bookmarkEnd w:id="9"/>
@@ -162,7 +162,7 @@
         </w:numPr>
       </w:pPr>
       <w:r>
-        <w:t xml:space="preserve">High-confidence labels reveal near-zero measured change skill.</w:t>
+        <w:t xml:space="preserve">Confidence filters expose label selection effects; they are not validation tests.</w:t>
       </w:r>
     </w:p>
     <w:p>
@@ -250,7 +250,7 @@
         <w:pStyle w:val="BodyText"/>
       </w:pPr>
       <w:r>
-        <w:t xml:space="preserve">The paper makes three bounded contributions. First, it gives a concrete state–action–constraint formulation for using a geospatial kernel as an algorithmic core rather than as an opaque end-to-end predictor. Second, it defines an evaluation protocol that treats high-confidence subset failure as a primary result under noisy annual labels, rather than as a minor diagnostic. Third, it turns future maps into explicit stress-test artefacts, including cumulative rasters and vectorized transition footprints, while preserving the distinction between public-data land cover and authoritative legal land use.</w:t>
+        <w:t xml:space="preserve">The paper makes three bounded contributions. First, it gives a concrete state–action–constraint formulation for using a geospatial kernel as an algorithmic core rather than as an opaque end-to-end predictor. Second, it defines an evaluation protocol that reports confidence-filter retention and selection effects rather than treating a high-confidence subset as a skill-validation set. Third, it turns future maps into explicit stress-test artefacts, including cumulative rasters and vectorized transition footprints, while preserving the distinction between public-data land cover and authoritative legal land use.</w:t>
       </w:r>
     </w:p>
     <w:bookmarkEnd w:id="12"/>
@@ -1488,7 +1488,7 @@
         <w:rPr>
           <w:rStyle w:val="VerbatimChar"/>
         </w:rPr>
-        <w:t xml:space="preserve">paper-benchmark-flus-v1</w:t>
+        <w:t xml:space="preserve">paper-benchmark-flus-v1.1</w:t>
       </w:r>
       <w:r>
         <w:t xml:space="preserve">) using seven continuous drivers: normalized row and column coordinates, elevation, slope, VIIRS radiance, distance to roads and distance to major roads. Its ANN suitability surface was passed to a cellular-automata allocation stage with the common class totals and public hard mask. The archived run used one 2021 training year, eight ANN hidden neurons, a 3 × 3 CA neighbourhood, neighbourhood strength 1.0, acceleration factor 0.1 and 1,000 iterations. Its frozen transition matrix protected water and wetland but did not prohibit built-to-non-built transitions. The algorithmic base is traceable to the GeoSOS team’s public FLUS source release (Liu et al., 2017; geosimulation.cn); the accompanying source repository</w:t>
@@ -1515,7 +1515,7 @@
         <w:rPr>
           <w:rStyle w:val="VerbatimChar"/>
         </w:rPr>
-        <w:t xml:space="preserve">deb0a54</w:t>
+        <w:t xml:space="preserve">47e65b3</w:t>
       </w:r>
       <w:r>
         <w:t xml:space="preserve"> </w:t>
@@ -1560,7 +1560,7 @@
         <w:t xml:space="preserve"> </w:t>
       </w:r>
       <w:r>
-        <w:t xml:space="preserve">deterministic seeding for both ANN sampling and CA roulette draws, so the build is not the unmodified upstream executable. A 25-feature Kernel-matched input was then executed with absolute paths for seeds 31, 47 and 73 and is reported only as a platform-sensitive diagnostic. It shares the Kernel feature family, but not the learning target or projection semantics: the FLUS ANN estimates same-year label suitability</w:t>
+        <w:t xml:space="preserve">deterministic seeding for both ANN sampling and CA roulette draws, so the build is not the unmodified upstream executable. Version v1.1 changes only failure handling for invalid input reads; valid-input algorithmic paths and benchmark rasters are unchanged from v1. A 25-feature Kernel-matched input was then executed with absolute paths for seeds 31, 47 and 73 and is reported only as a platform-sensitive diagnostic. It shares the Kernel feature family, but not the learning target or projection semantics: the FLUS ANN estimates same-year label suitability</w:t>
       </w:r>
       <w:r>
         <w:t xml:space="preserve"> </w:t>
@@ -1783,7 +1783,7 @@
         </m:sSup>
       </m:oMath>
       <w:r>
-        <w:t xml:space="preserve">; the loss is the weighted sum of cosine embedding loss, 0.5 semantic cross-entropy, 0.1 demand-consistency loss and 0.2 hard-constraint consistency loss. The released checkpoints correspond to seeds 31, 47 and 73 and were trained in August 2026. The default reproduction loads these fixed checkpoints rather than retraining; the runner exposes retraining separately. During allocation, GeoFM-LDN directly calls the Geospatial Kernel</w:t>
+        <w:t xml:space="preserve">; the loss is the weighted sum of cosine embedding loss, 0.5 semantic cross-entropy, 0.1 demand-consistency loss and 0.2 hard-constraint consistency loss. The released checkpoints correspond to seeds 31, 47 and 73 and were trained in August 2026. The default reproduction loads these fixed checkpoints rather than retraining; the runner exposes retraining separately. Fixed checkpoints do not remove the decoding runtime boundary: categorical output still depends on the locked Torch and scikit-learn stack. Same-stack reproduction is the declared reference; no independent cross-stack GeoFM-LDN raster comparison is claimed, and changes between pre-lock and locked-environment outputs are not attributed to CPU architecture or to one library. During allocation, GeoFM-LDN directly calls the Geospatial Kernel</w:t>
       </w:r>
       <w:r>
         <w:t xml:space="preserve"> </w:t>
@@ -2792,55 +2792,97 @@
         <w:pStyle w:val="BodyText"/>
       </w:pPr>
       <w:r>
-        <w:t xml:space="preserve">The reliability sensitivity is substantially less favourable. Requiring both</w:t>
-      </w:r>
-      <w:r>
-        <w:t xml:space="preserve"> </w:t>
-      </w:r>
-      <w:r>
-        <w:t xml:space="preserve">the origin and target Dynamic World mean top probability to exceed 0.5 leaves</w:t>
-      </w:r>
-      <w:r>
-        <w:t xml:space="preserve"> </w:t>
-      </w:r>
-      <w:r>
-        <w:t xml:space="preserve">strict FoM at 0.000 for all three models in 2023; in 2024 the means are 0.004</w:t>
-      </w:r>
-      <w:r>
-        <w:t xml:space="preserve"> </w:t>
-      </w:r>
-      <w:r>
-        <w:t xml:space="preserve">for the FLUS-style console, 0.005 for Geospatial Kernel and 0.019 for GeoFM-LDN. This is</w:t>
-      </w:r>
-      <w:r>
-        <w:t xml:space="preserve"> </w:t>
-      </w:r>
-      <w:r>
-        <w:t xml:space="preserve">a label-quality diagnostic, not an independent validation set. Dynamic World</w:t>
-      </w:r>
-      <w:r>
-        <w:t xml:space="preserve"> </w:t>
-      </w:r>
-      <w:r>
-        <w:t xml:space="preserve">also reports built pixels increasing from 9,359 in 2022 to 15,598 in 2024</w:t>
-      </w:r>
-      <w:r>
-        <w:t xml:space="preserve"> </w:t>
-      </w:r>
-      <w:r>
-        <w:t xml:space="preserve">(67%), while the median one-year reversion fraction is 0.3611 and the mean</w:t>
-      </w:r>
-      <w:r>
-        <w:t xml:space="preserve"> </w:t>
-      </w:r>
-      <w:r>
-        <w:t xml:space="preserve">fraction of cells below confidence 0.5 is 0.5497. Test-year change counts are</w:t>
-      </w:r>
-      <w:r>
-        <w:t xml:space="preserve"> </w:t>
-      </w:r>
-      <w:r>
-        <w:t xml:space="preserve">approximately twice the training-transition counts. Because the same grid</w:t>
+        <w:t xml:space="preserve">The confidence sensitivity is a label-quality and selection-effect diagnostic,</w:t>
+      </w:r>
+      <w:r>
+        <w:t xml:space="preserve"> </w:t>
+      </w:r>
+      <w:r>
+        <w:t xml:space="preserve">not an independent validation set or a model-skill test. Requiring both the</w:t>
+      </w:r>
+      <w:r>
+        <w:t xml:space="preserve"> </w:t>
+      </w:r>
+      <w:r>
+        <w:t xml:space="preserve">origin and target Dynamic World mean top probability to exceed 0.5 retains only</w:t>
+      </w:r>
+      <w:r>
+        <w:t xml:space="preserve"> </w:t>
+      </w:r>
+      <w:r>
+        <w:t xml:space="preserve">25 of 4,500 observed changes (0.56%) in 2023 and 56 of 8,464 (0.66%) in 2024.</w:t>
+      </w:r>
+      <w:r>
+        <w:t xml:space="preserve"> </w:t>
+      </w:r>
+      <w:r>
+        <w:t xml:space="preserve">Strict FoM is 0.000 for all three models in 2023; in 2024 the means are 0.0040</w:t>
+      </w:r>
+      <w:r>
+        <w:t xml:space="preserve"> </w:t>
+      </w:r>
+      <w:r>
+        <w:t xml:space="preserve">for the FLUS-style console, 0.0055 for Geospatial Kernel and 0.0188 for</w:t>
+      </w:r>
+      <w:r>
+        <w:t xml:space="preserve"> </w:t>
+      </w:r>
+      <w:r>
+        <w:t xml:space="preserve">GeoFM-LDN. Screening only the confidence of the year immediately preceding the</w:t>
+      </w:r>
+      <w:r>
+        <w:t xml:space="preserve"> </w:t>
+      </w:r>
+      <w:r>
+        <w:t xml:space="preserve">target avoids filtering on target-year confidence, but still retains only 129</w:t>
+      </w:r>
+      <w:r>
+        <w:t xml:space="preserve"> </w:t>
+      </w:r>
+      <w:r>
+        <w:t xml:space="preserve">(2.87%) and 93 (1.10%) observed changes in 2023 and 2024, respectively. Its</w:t>
+      </w:r>
+      <w:r>
+        <w:t xml:space="preserve"> </w:t>
+      </w:r>
+      <w:r>
+        <w:t xml:space="preserve">2023 FoM values remain 0.000; its 2024 means are 0.0040, 0.0041 and 0.0120 for</w:t>
+      </w:r>
+      <w:r>
+        <w:t xml:space="preserve"> </w:t>
+      </w:r>
+      <w:r>
+        <w:t xml:space="preserve">the FLUS-style console, Kernel and GeoFM-LDN. The two filters therefore</w:t>
+      </w:r>
+      <w:r>
+        <w:t xml:space="preserve"> </w:t>
+      </w:r>
+      <w:r>
+        <w:t xml:space="preserve">describe label selection rather than establishing or rescuing model skill.</w:t>
+      </w:r>
+      <w:r>
+        <w:t xml:space="preserve"> </w:t>
+      </w:r>
+      <w:r>
+        <w:t xml:space="preserve">Dynamic World also reports built pixels increasing from 9,359 in 2022 to 15,598</w:t>
+      </w:r>
+      <w:r>
+        <w:t xml:space="preserve"> </w:t>
+      </w:r>
+      <w:r>
+        <w:t xml:space="preserve">in 2024 (67%), while the median one-year reversion fraction is 0.3611 and the</w:t>
+      </w:r>
+      <w:r>
+        <w:t xml:space="preserve"> </w:t>
+      </w:r>
+      <w:r>
+        <w:t xml:space="preserve">mean fraction of cells below confidence 0.5 is 0.5497. Test-year change counts</w:t>
+      </w:r>
+      <w:r>
+        <w:t xml:space="preserve"> </w:t>
+      </w:r>
+      <w:r>
+        <w:t xml:space="preserve">are approximately twice the training-transition counts. Because the same grid</w:t>
       </w:r>
       <w:r>
         <w:t xml:space="preserve"> </w:t>
@@ -4181,7 +4223,7 @@
         <w:pStyle w:val="FirstParagraph"/>
       </w:pPr>
       <w:r>
-        <w:t xml:space="preserve">This study positions Geospatial Kernel as a candidate execution layer for constrained spatial reasoning and, more broadly, proposes an audit protocol for noisy annual labels. The defensible contribution is that a transition proposal and a planning admission rule can be represented and inspected separately. Under the unmatched public-data pipeline, Geospatial Kernel has the largest strict transition FoM at the one-step horizon, while GeoFM-LDN has the largest value after recursive two-step rollout. The high-confidence subset shows near-zero skill for all models in 2023 and at most 0.0188 FoM in 2024, so full-grid rankings should not be interpreted as validated urban-change skill. We therefore treat the planning frontier as conditional on public proxy objectives and synthetic actions.</w:t>
+        <w:t xml:space="preserve">This study positions Geospatial Kernel as a candidate execution layer for constrained spatial reasoning and, more broadly, proposes an audit protocol for noisy annual labels. The defensible contribution is that a transition proposal and a planning admission rule can be represented and inspected separately. Under the unmatched public-data pipeline, Geospatial Kernel has the largest strict transition FoM at the one-step horizon, while GeoFM-LDN has the largest value after recursive two-step rollout. The dual-year confidence filter retains only 0.56% and 0.66% of observed changes in 2023 and 2024, respectively; the preceding-year-only variant retains 2.87% and 1.10%. These subsets are not skill tests, but their event-dependent selection shows why full-grid rankings cannot be interpreted as validated urban-change skill. We therefore treat the planning frontier as conditional on public proxy objectives and synthetic actions.</w:t>
       </w:r>
     </w:p>
     <w:p>
@@ -4743,6 +4785,48 @@
         <w:t xml:space="preserve"> </w:t>
       </w:r>
       <w:r>
+        <w:t xml:space="preserve">Earlier internal reference outputs, produced before the dependency lock was</w:t>
+      </w:r>
+      <w:r>
+        <w:t xml:space="preserve"> </w:t>
+      </w:r>
+      <w:r>
+        <w:t xml:space="preserve">completed, could not be regenerated under the resolved environment and were</w:t>
+      </w:r>
+      <w:r>
+        <w:t xml:space="preserve"> </w:t>
+      </w:r>
+      <w:r>
+        <w:t xml:space="preserve">superseded by the locked-environment rerun reported here. Historical strict-FoM</w:t>
+      </w:r>
+      <w:r>
+        <w:t xml:space="preserve"> </w:t>
+      </w:r>
+      <w:r>
+        <w:t xml:space="preserve">differences were at approximately the 0.001 level; discrete multi-year planning</w:t>
+      </w:r>
+      <w:r>
+        <w:t xml:space="preserve"> </w:t>
+      </w:r>
+      <w:r>
+        <w:t xml:space="preserve">ensemble demand errors changed more substantially and are reported here only</w:t>
+      </w:r>
+      <w:r>
+        <w:t xml:space="preserve"> </w:t>
+      </w:r>
+      <w:r>
+        <w:t xml:space="preserve">from the locked-environment rerun. The prior outputs remain Git-history lineage,</w:t>
+      </w:r>
+      <w:r>
+        <w:t xml:space="preserve"> </w:t>
+      </w:r>
+      <w:r>
+        <w:t xml:space="preserve">not current evidence.</w:t>
+      </w:r>
+      <w:r>
+        <w:t xml:space="preserve"> </w:t>
+      </w:r>
+      <w:r>
         <w:t xml:space="preserve">The vendored FLUS executable is a macOS arm64 binary rebuilt from the GeoSOS</w:t>
       </w:r>
       <w:r>
@@ -4797,7 +4881,7 @@
         <w:rPr>
           <w:rStyle w:val="VerbatimChar"/>
         </w:rPr>
-        <w:t xml:space="preserve">paper-benchmark-flus-v1</w:t>
+        <w:t xml:space="preserve">paper-benchmark-flus-v1.1</w:t>
       </w:r>
       <w:r>
         <w:t xml:space="preserve"> </w:t>
@@ -4812,19 +4896,28 @@
         <w:rPr>
           <w:rStyle w:val="VerbatimChar"/>
         </w:rPr>
+        <w:t xml:space="preserve">47e65b3</w:t>
+      </w:r>
+      <w:r>
+        <w:t xml:space="preserve"> </w:t>
+      </w:r>
+      <w:r>
+        <w:t xml:space="preserve">(the GeoSOS source release and Liu et al. (2017) are cited above). Rebuilding</w:t>
+      </w:r>
+      <w:r>
+        <w:t xml:space="preserve"> </w:t>
+      </w:r>
+      <w:r>
+        <w:t xml:space="preserve">the preceding v1 commit (</w:t>
+      </w:r>
+      <w:r>
+        <w:rPr>
+          <w:rStyle w:val="VerbatimChar"/>
+        </w:rPr>
         <w:t xml:space="preserve">deb0a54</w:t>
       </w:r>
       <w:r>
-        <w:t xml:space="preserve"> </w:t>
-      </w:r>
-      <w:r>
-        <w:t xml:space="preserve">(the GeoSOS source release and Liu et al. (2017) are cited above). Rebuilding</w:t>
-      </w:r>
-      <w:r>
-        <w:t xml:space="preserve"> </w:t>
-      </w:r>
-      <w:r>
-        <w:t xml:space="preserve">that commit on macOS arm64 produced SHA-256</w:t>
+        <w:t xml:space="preserve">) on macOS arm64 produced SHA-256</w:t>
       </w:r>
       <w:r>
         <w:t xml:space="preserve"> </w:t>
@@ -4842,7 +4935,19 @@
         <w:t xml:space="preserve"> </w:t>
       </w:r>
       <w:r>
-        <w:t xml:space="preserve">identical to the vendored executable.</w:t>
+        <w:t xml:space="preserve">identical to the vendored executable. Version v1.1 changes only invalid-input</w:t>
+      </w:r>
+      <w:r>
+        <w:t xml:space="preserve"> </w:t>
+      </w:r>
+      <w:r>
+        <w:t xml:space="preserve">failure handling and leaves valid-input algorithmic paths unchanged; the</w:t>
+      </w:r>
+      <w:r>
+        <w:t xml:space="preserve"> </w:t>
+      </w:r>
+      <w:r>
+        <w:t xml:space="preserve">normal-output equivalence check is archived with the source release.</w:t>
       </w:r>
       <w:r>
         <w:t xml:space="preserve"> </w:t>

</xml_diff>

<commit_message>
Archive author-run x86_64 Kernel verification
</commit_message>
<xml_diff>
--- a/manuscript/manuscript.docx
+++ b/manuscript/manuscript.docx
@@ -2938,19 +2938,43 @@
         <w:t xml:space="preserve"> </w:t>
       </w:r>
       <w:r>
-        <w:t xml:space="preserve">cells), with strict-FoM deltas from -0.0023 to 0.0010. The reviewer-provided</w:t>
-      </w:r>
-      <w:r>
-        <w:t xml:space="preserve"> </w:t>
-      </w:r>
-      <w:r>
-        <w:t xml:space="preserve">Windows FLUS rerun additionally showed 2–4% differing cells from the macOS</w:t>
-      </w:r>
-      <w:r>
-        <w:t xml:space="preserve"> </w:t>
-      </w:r>
-      <w:r>
-        <w:t xml:space="preserve">seven-driver outputs, consistent with the platform-dependent C</w:t>
+        <w:t xml:space="preserve">cells), with strict-FoM deltas from -0.0023 to 0.0010. An author-controlled</w:t>
+      </w:r>
+      <w:r>
+        <w:t xml:space="preserve"> </w:t>
+      </w:r>
+      <w:r>
+        <w:t xml:space="preserve">GitHub Actions Ubuntu x86_64 rerun under Python 3.11.16 and scikit-learn 1.9.0</w:t>
+      </w:r>
+      <w:r>
+        <w:t xml:space="preserve"> </w:t>
+      </w:r>
+      <w:r>
+        <w:t xml:space="preserve">matched all six released categorical reference rasters exactly; its archived</w:t>
+      </w:r>
+      <w:r>
+        <w:t xml:space="preserve"> </w:t>
+      </w:r>
+      <w:r>
+        <w:t xml:space="preserve">audit is linked in Code availability. This is a scoped locked-stack regression</w:t>
+      </w:r>
+      <w:r>
+        <w:t xml:space="preserve"> </w:t>
+      </w:r>
+      <w:r>
+        <w:t xml:space="preserve">result, not universal bitwise identity. The reviewer-provided Windows FLUS</w:t>
+      </w:r>
+      <w:r>
+        <w:t xml:space="preserve"> </w:t>
+      </w:r>
+      <w:r>
+        <w:t xml:space="preserve">rerun additionally showed 2–4% differing cells from the macOS seven-driver</w:t>
+      </w:r>
+      <w:r>
+        <w:t xml:space="preserve"> </w:t>
+      </w:r>
+      <w:r>
+        <w:t xml:space="preserve">outputs, consistent with the platform-dependent C</w:t>
       </w:r>
       <w:r>
         <w:t xml:space="preserve"> </w:t>
@@ -2974,31 +2998,25 @@
         <w:t xml:space="preserve"> </w:t>
       </w:r>
       <w:r>
-        <w:t xml:space="preserve">stream. The repository does not contain the reviewer’s</w:t>
-      </w:r>
-      <w:r>
-        <w:t xml:space="preserve"> </w:t>
-      </w:r>
-      <w:r>
-        <w:t xml:space="preserve">Windows raster files, so those values are explicitly external verification</w:t>
-      </w:r>
-      <w:r>
-        <w:t xml:space="preserve"> </w:t>
-      </w:r>
-      <w:r>
-        <w:t xml:space="preserve">rather than a local replay. The archived comparison report records the exact</w:t>
-      </w:r>
-      <w:r>
-        <w:t xml:space="preserve"> </w:t>
-      </w:r>
-      <w:r>
-        <w:t xml:space="preserve">paths and environment fields for the arm64 pair. This documents measured</w:t>
-      </w:r>
-      <w:r>
-        <w:t xml:space="preserve"> </w:t>
-      </w:r>
-      <w:r>
-        <w:t xml:space="preserve">cross-stack sensitivity, not universal bitwise identity.</w:t>
+        <w:t xml:space="preserve">stream.</w:t>
+      </w:r>
+      <w:r>
+        <w:t xml:space="preserve"> </w:t>
+      </w:r>
+      <w:r>
+        <w:t xml:space="preserve">The repository does not contain the reviewer’s Windows FLUS raster files, so</w:t>
+      </w:r>
+      <w:r>
+        <w:t xml:space="preserve"> </w:t>
+      </w:r>
+      <w:r>
+        <w:t xml:space="preserve">those values remain explicitly external verification. The archived comparison</w:t>
+      </w:r>
+      <w:r>
+        <w:t xml:space="preserve"> </w:t>
+      </w:r>
+      <w:r>
+        <w:t xml:space="preserve">report records the exact paths and environment fields for the arm64 pair.</w:t>
       </w:r>
     </w:p>
     <w:p>
@@ -4606,7 +4624,34 @@
         <w:t xml:space="preserve"> </w:t>
       </w:r>
       <w:r>
-        <w:t xml:space="preserve">can pass the manifest gate. The locked macOS arm64 execution environment remains the reference for model outputs. An archived arm64 Linux rerun of the six historical Kernel rasters differed from the macOS reference by 498–1,147 valid cells (0.62%–1.44%), with strict-FoM deltas from -0.0023 to +0.0010; these cross-stack differences are quantified rather than treated as categorical identity. Reviewer-provided Windows x86_64 values are separately labelled as external verification because the corresponding rasters are not archived locally. No private database address, credential or client-only service is included. Authoritative Abu Dhabi land-use and independent change-validation data remain outside this study.</w:t>
+        <w:t xml:space="preserve">can pass the manifest gate. The locked macOS arm64 execution environment remains the reference for model outputs. An archived arm64 Linux rerun of the six historical Kernel rasters differed from the macOS reference by 498–1,147 valid cells (0.62%–1.44%), with strict-FoM deltas from -0.0023 to +0.0010; these cross-stack differences are quantified rather than treated as categorical identity. An author-controlled GitHub Actions Ubuntu x86_64 rerun of all six rasters under the resolved lock had zero categorical differences; the audit is archived as</w:t>
+      </w:r>
+      <w:r>
+        <w:t xml:space="preserve"> </w:t>
+      </w:r>
+      <w:r>
+        <w:rPr>
+          <w:rStyle w:val="VerbatimChar"/>
+        </w:rPr>
+        <w:t xml:space="preserve">artifacts/cross_platform/github_actions_ubuntu_x86_64_kernel_reference_e06a997.json</w:t>
+      </w:r>
+      <w:r>
+        <w:t xml:space="preserve"> </w:t>
+      </w:r>
+      <w:r>
+        <w:t xml:space="preserve">and the workflow is versioned under</w:t>
+      </w:r>
+      <w:r>
+        <w:t xml:space="preserve"> </w:t>
+      </w:r>
+      <w:r>
+        <w:rPr>
+          <w:rStyle w:val="VerbatimChar"/>
+        </w:rPr>
+        <w:t xml:space="preserve">.github/workflows/</w:t>
+      </w:r>
+      <w:r>
+        <w:t xml:space="preserve">. Reviewer-provided Windows values remain separately labelled as external verification only for FLUS because the corresponding Windows rasters are not archived locally. No private database address, credential or client-only service is included. Authoritative Abu Dhabi land-use and independent change-validation data remain outside this study.</w:t>
       </w:r>
     </w:p>
     <w:bookmarkEnd w:id="28"/>

</xml_diff>

<commit_message>
Apply tenth-round editorial revisions
</commit_message>
<xml_diff>
--- a/manuscript/manuscript.docx
+++ b/manuscript/manuscript.docx
@@ -1696,7 +1696,7 @@
         <w:t xml:space="preserve"> </w:t>
       </w:r>
       <w:r>
-        <w:t xml:space="preserve">before constrained projection. Matching features therefore does not match the training task. Two intermediate configurations were retained as mechanism diagnostics: 13 features (seven drivers plus current-class indicators) and 19 features (seven drivers plus neighbourhood fractions). The 25-feature run collapsed to zero change for macOS seeds 47 and 73 and for all three reviewer-provided Windows x86_64 seeds; the remaining macOS seed-31 run is not used as a valid estimator. The 19-feature mode produced changes for all three macOS seeds but underfilled the observed 4,500 and 8,464 changed cells in 2023 and 2024. Both modes are therefore diagnostic-only.</w:t>
+        <w:t xml:space="preserve">before constrained projection. Matching features therefore does not match the training task. Two intermediate configurations were retained as mechanism diagnostics: 13 features (seven drivers plus current-class indicators) and 19 features (seven drivers plus neighbourhood fractions). The 25-feature run collapsed to zero change for macOS seeds 47 and 73 and for all three independent external Windows x86_64 verification runs; the remaining macOS seed-31 run is not used as a valid estimator. The external evidence is identified in Supplementary Table S3; its source rasters are not locally archived. The 19-feature mode produced changes for all three macOS seeds but underfilled the observed 4,500 and 8,464 changed cells in 2023 and 2024. Both modes are therefore diagnostic-only.</w:t>
       </w:r>
     </w:p>
     <w:p>
@@ -2653,7 +2653,7 @@
         <w:pStyle w:val="BodyText"/>
       </w:pPr>
       <w:r>
-        <w:t xml:space="preserve">The reviewer-requested FLUS input-dimension analysis was also completed. The</w:t>
+        <w:t xml:space="preserve">An additional FLUS input-dimension analysis was also completed. The</w:t>
       </w:r>
       <w:r>
         <w:t xml:space="preserve"> </w:t>
@@ -2665,7 +2665,7 @@
         <w:t xml:space="preserve"> </w:t>
       </w:r>
       <w:r>
-        <w:t xml:space="preserve">three reviewer-provided Windows x86_64 seeds produced zero-change outputs,</w:t>
+        <w:t xml:space="preserve">three independent external Windows x86_64 verification runs produced zero-change outputs,</w:t>
       </w:r>
       <w:r>
         <w:t xml:space="preserve"> </w:t>
@@ -2962,55 +2962,19 @@
         <w:t xml:space="preserve"> </w:t>
       </w:r>
       <w:r>
-        <w:t xml:space="preserve">result, not universal bitwise identity. The reviewer-provided Windows FLUS</w:t>
-      </w:r>
-      <w:r>
-        <w:t xml:space="preserve"> </w:t>
-      </w:r>
-      <w:r>
-        <w:t xml:space="preserve">rerun additionally showed 2–4% differing cells from the macOS seven-driver</w:t>
-      </w:r>
-      <w:r>
-        <w:t xml:space="preserve"> </w:t>
-      </w:r>
-      <w:r>
-        <w:t xml:space="preserve">outputs, consistent with the platform-dependent C</w:t>
-      </w:r>
-      <w:r>
-        <w:t xml:space="preserve"> </w:t>
-      </w:r>
-      <w:r>
-        <w:rPr>
-          <w:rStyle w:val="VerbatimChar"/>
-        </w:rPr>
-        <w:t xml:space="preserve">rand()</w:t>
-      </w:r>
-      <w:r>
-        <w:t xml:space="preserve">/</w:t>
-      </w:r>
-      <w:r>
-        <w:rPr>
-          <w:rStyle w:val="VerbatimChar"/>
-        </w:rPr>
-        <w:t xml:space="preserve">srand()</w:t>
-      </w:r>
-      <w:r>
-        <w:t xml:space="preserve"> </w:t>
-      </w:r>
-      <w:r>
-        <w:t xml:space="preserve">stream.</w:t>
-      </w:r>
-      <w:r>
-        <w:t xml:space="preserve"> </w:t>
-      </w:r>
-      <w:r>
-        <w:t xml:space="preserve">The repository does not contain the reviewer’s Windows FLUS raster files, so</w:t>
-      </w:r>
-      <w:r>
-        <w:t xml:space="preserve"> </w:t>
-      </w:r>
-      <w:r>
-        <w:t xml:space="preserve">those values remain explicitly external verification. The archived comparison</w:t>
+        <w:t xml:space="preserve">result, not universal bitwise identity. Independent external Windows FLUS</w:t>
+      </w:r>
+      <w:r>
+        <w:t xml:space="preserve"> </w:t>
+      </w:r>
+      <w:r>
+        <w:t xml:space="preserve">verification is documented with its provenance limitation in Supplementary</w:t>
+      </w:r>
+      <w:r>
+        <w:t xml:space="preserve"> </w:t>
+      </w:r>
+      <w:r>
+        <w:t xml:space="preserve">Table S3; its source rasters are not locally archived. The archived comparison</w:t>
       </w:r>
       <w:r>
         <w:t xml:space="preserve"> </w:t>
@@ -4241,7 +4205,7 @@
         <w:pStyle w:val="FirstParagraph"/>
       </w:pPr>
       <w:r>
-        <w:t xml:space="preserve">This study positions Geospatial Kernel as a candidate execution layer for constrained spatial reasoning and, more broadly, proposes an audit protocol for noisy annual labels. The defensible contribution is that a transition proposal and a planning admission rule can be represented and inspected separately. Under the unmatched public-data pipeline, Geospatial Kernel has the largest strict transition FoM at the one-step horizon, while GeoFM-LDN has the largest value after recursive two-step rollout. The dual-year confidence filter retains only 0.56% and 0.66% of observed changes in 2023 and 2024, respectively; the preceding-year-only variant retains 2.87% and 1.10%. These subsets are not skill tests, but their event-dependent selection shows why full-grid rankings cannot be interpreted as validated urban-change skill. We therefore treat the planning frontier as conditional on public proxy objectives and synthetic actions.</w:t>
+        <w:t xml:space="preserve">This study positions Geospatial Kernel as a candidate execution layer for constrained spatial reasoning and, more broadly, proposes an audit protocol for noisy annual labels. The defensible contribution is that a transition proposal and a planning admission rule can be represented and inspected separately. Under the unmatched public-data pipeline, Geospatial Kernel has the largest strict transition FoM at the one-step horizon, while GeoFM-LDN has the largest value after recursive two-step rollout. The dual-year confidence filter retains only 0.56% and 0.66% of observed changes in 2023 and 2024, respectively; the preceding-year-only variant retains 2.87% and 1.10%. These subsets are not skill tests; full-grid rankings remain unvalidated because no independent change product is yet available. We therefore treat the planning frontier as conditional on public proxy objectives and synthetic actions.</w:t>
       </w:r>
     </w:p>
     <w:p>
@@ -4624,7 +4588,7 @@
         <w:t xml:space="preserve"> </w:t>
       </w:r>
       <w:r>
-        <w:t xml:space="preserve">can pass the manifest gate. The locked macOS arm64 execution environment remains the reference for model outputs. An archived arm64 Linux rerun of the six historical Kernel rasters differed from the macOS reference by 498–1,147 valid cells (0.62%–1.44%), with strict-FoM deltas from -0.0023 to +0.0010; these cross-stack differences are quantified rather than treated as categorical identity. An author-controlled GitHub Actions Ubuntu x86_64 rerun of all six rasters under the resolved lock had zero categorical differences; the audit is archived as</w:t>
+        <w:t xml:space="preserve">can pass the manifest gate. The locked macOS arm64 execution environment remains the reference for model outputs. An archived arm64 Linux rerun of the six historical Kernel rasters differed from the macOS reference by 498–1,147 cells (0.62%–1.44%), with strict-FoM deltas from -0.0023 to +0.0010; these cross-stack differences are quantified rather than treated as categorical identity. An author-controlled GitHub Actions Ubuntu x86_64 rerun of all six rasters under the resolved lock had zero categorical differences; the repository-stored CI audit is in</w:t>
       </w:r>
       <w:r>
         <w:t xml:space="preserve"> </w:t>
@@ -4633,13 +4597,13 @@
         <w:rPr>
           <w:rStyle w:val="VerbatimChar"/>
         </w:rPr>
-        <w:t xml:space="preserve">artifacts/cross_platform/github_actions_ubuntu_x86_64_kernel_reference_e06a997.json</w:t>
-      </w:r>
-      <w:r>
-        <w:t xml:space="preserve"> </w:t>
-      </w:r>
-      <w:r>
-        <w:t xml:space="preserve">and the workflow is versioned under</w:t>
+        <w:t xml:space="preserve">artifacts/cross_platform</w:t>
+      </w:r>
+      <w:r>
+        <w:t xml:space="preserve"> </w:t>
+      </w:r>
+      <w:r>
+        <w:t xml:space="preserve">at commit</w:t>
       </w:r>
       <w:r>
         <w:t xml:space="preserve"> </w:t>
@@ -4648,10 +4612,22 @@
         <w:rPr>
           <w:rStyle w:val="VerbatimChar"/>
         </w:rPr>
+        <w:t xml:space="preserve">e06a997</w:t>
+      </w:r>
+      <w:r>
+        <w:t xml:space="preserve">, and the workflow is versioned under</w:t>
+      </w:r>
+      <w:r>
+        <w:t xml:space="preserve"> </w:t>
+      </w:r>
+      <w:r>
+        <w:rPr>
+          <w:rStyle w:val="VerbatimChar"/>
+        </w:rPr>
         <w:t xml:space="preserve">.github/workflows/</w:t>
       </w:r>
       <w:r>
-        <w:t xml:space="preserve">. Reviewer-provided Windows values remain separately labelled as external verification only for FLUS because the corresponding Windows rasters are not archived locally. No private database address, credential or client-only service is included. Authoritative Abu Dhabi land-use and independent change-validation data remain outside this study.</w:t>
+        <w:t xml:space="preserve">. Independent external Windows evidence remains separately labelled for FLUS because the corresponding rasters are not archived locally. No private database address, credential or client-only service is included. Authoritative Abu Dhabi land-use and independent change-validation data remain outside this study.</w:t>
       </w:r>
     </w:p>
     <w:bookmarkEnd w:id="28"/>
@@ -5055,37 +5031,37 @@
         <w:t xml:space="preserve"> </w:t>
       </w:r>
       <w:r>
-        <w:t xml:space="preserve">streams. The reviewer-provided</w:t>
-      </w:r>
-      <w:r>
-        <w:t xml:space="preserve"> </w:t>
-      </w:r>
-      <w:r>
-        <w:t xml:space="preserve">Windows rerun differed from macOS by approximately 2–4% of valid categorical</w:t>
-      </w:r>
-      <w:r>
-        <w:t xml:space="preserve"> </w:t>
-      </w:r>
-      <w:r>
-        <w:t xml:space="preserve">cells for the seven-driver control, and all three Windows 25-feature runs</w:t>
-      </w:r>
-      <w:r>
-        <w:t xml:space="preserve"> </w:t>
-      </w:r>
-      <w:r>
-        <w:t xml:space="preserve">collapsed to zero change. Windows execution requires the benchmark and working</w:t>
-      </w:r>
-      <w:r>
-        <w:t xml:space="preserve"> </w:t>
-      </w:r>
-      <w:r>
-        <w:t xml:space="preserve">directories to use pure ASCII paths; saving configuration files as UTF-8 alone</w:t>
-      </w:r>
-      <w:r>
-        <w:t xml:space="preserve"> </w:t>
-      </w:r>
-      <w:r>
-        <w:t xml:space="preserve">does not repair GDAL path decoding. A compatible local build is required to</w:t>
+        <w:t xml:space="preserve">streams. Independent external</w:t>
+      </w:r>
+      <w:r>
+        <w:t xml:space="preserve"> </w:t>
+      </w:r>
+      <w:r>
+        <w:t xml:space="preserve">Windows FLUS verification, including the seven-driver cross-platform difference</w:t>
+      </w:r>
+      <w:r>
+        <w:t xml:space="preserve"> </w:t>
+      </w:r>
+      <w:r>
+        <w:t xml:space="preserve">and the 25-feature zero-change outcome, is documented with its provenance</w:t>
+      </w:r>
+      <w:r>
+        <w:t xml:space="preserve"> </w:t>
+      </w:r>
+      <w:r>
+        <w:t xml:space="preserve">limitation in Supplementary Table S3. Windows execution requires the benchmark</w:t>
+      </w:r>
+      <w:r>
+        <w:t xml:space="preserve"> </w:t>
+      </w:r>
+      <w:r>
+        <w:t xml:space="preserve">and working directories to use pure ASCII paths; saving configuration files as</w:t>
+      </w:r>
+      <w:r>
+        <w:t xml:space="preserve"> </w:t>
+      </w:r>
+      <w:r>
+        <w:t xml:space="preserve">UTF-8 alone does not repair GDAL path decoding. A compatible local build is required to</w:t>
       </w:r>
       <w:r>
         <w:t xml:space="preserve"> </w:t>
@@ -5227,7 +5203,7 @@
         <w:t xml:space="preserve"> </w:t>
       </w:r>
       <w:r>
-        <w:t xml:space="preserve">None.</w:t>
+        <w:t xml:space="preserve">The author thanks the anonymous reviewers for independent technical verification and constructive methodological comments.</w:t>
       </w:r>
     </w:p>
     <w:p>

</xml_diff>

<commit_message>
Add document metadata to editable manuscript
</commit_message>
<xml_diff>
--- a/manuscript/manuscript.docx
+++ b/manuscript/manuscript.docx
@@ -2,6 +2,22 @@
 <file path=word/document.xml><?xml version="1.0" encoding="utf-8"?>
 <w:document xmlns:w="http://schemas.openxmlformats.org/wordprocessingml/2006/main" xmlns:m="http://schemas.openxmlformats.org/officeDocument/2006/math" xmlns:r="http://schemas.openxmlformats.org/officeDocument/2006/relationships" xmlns:o="urn:schemas-microsoft-com:office:office" xmlns:v="urn:schemas-microsoft-com:vml" xmlns:w10="urn:schemas-microsoft-com:office:word" xmlns:a="http://schemas.openxmlformats.org/drawingml/2006/main" xmlns:pic="http://schemas.openxmlformats.org/drawingml/2006/picture" xmlns:wp="http://schemas.openxmlformats.org/drawingml/2006/wordprocessingDrawing">
   <w:body>
+    <w:p>
+      <w:pPr>
+        <w:pStyle w:val="Title"/>
+      </w:pPr>
+      <w:r>
+        <w:t xml:space="preserve">Auditing constrained geospatial allocation under noisy annual land-cover labels</w:t>
+      </w:r>
+    </w:p>
+    <w:p>
+      <w:pPr>
+        <w:pStyle w:val="Author"/>
+      </w:pPr>
+      <w:r>
+        <w:t xml:space="preserve">Ning Zhou</w:t>
+      </w:r>
+    </w:p>
     <w:bookmarkStart w:id="9" w:name="abstract"/>
     <w:p>
       <w:pPr>

</xml_diff>

<commit_message>
Address eleventh-round LUP review
</commit_message>
<xml_diff>
--- a/manuscript/manuscript.docx
+++ b/manuscript/manuscript.docx
@@ -16,6 +16,14 @@
       </w:pPr>
       <w:r>
         <w:t xml:space="preserve">Ning Zhou</w:t>
+      </w:r>
+    </w:p>
+    <w:p>
+      <w:pPr>
+        <w:pStyle w:val="Date"/>
+      </w:pPr>
+      <w:r>
+        <w:t xml:space="preserve">2026-09-07</w:t>
       </w:r>
     </w:p>
     <w:bookmarkStart w:id="9" w:name="abstract"/>
@@ -2551,7 +2559,7 @@
       <w:r>
         <w:drawing>
           <wp:inline>
-            <wp:extent cx="5334000" cy="2382816"/>
+            <wp:extent cx="5334000" cy="2501067"/>
             <wp:effectExtent b="0" l="0" r="0" t="0"/>
             <wp:docPr descr="Historical allocation skill. Strict destination-change FoM is the primary metric; change F1 is shown as a secondary diagnostic. Bars show mean plus or minus population standard deviation across the three frozen seeds. Persistence and random allocation are explicit zero-model controls." title="" id="27" name="Picture"/>
             <a:graphic>
@@ -2572,7 +2580,7 @@
                   <pic:spPr bwMode="auto">
                     <a:xfrm>
                       <a:off x="0" y="0"/>
-                      <a:ext cx="5334000" cy="2382816"/>
+                      <a:ext cx="5334000" cy="2501067"/>
                     </a:xfrm>
                     <a:prstGeom prst="rect">
                       <a:avLst/>
@@ -4077,7 +4085,7 @@
         <w:pStyle w:val="FirstParagraph"/>
       </w:pPr>
       <w:r>
-        <w:t xml:space="preserve">The base Kernel allocation score adds a 7 × 7 target-class neighbourhood fraction with weight 0.35. The existing sensitivity and mechanism artefacts are retained as diagnostic controls; they do not identify a causal effect because the proposal features and allocator both contain spatial context. The neighbourhood term is therefore interpreted as evidence about the execution mechanism, not as an independently estimated planning preference. Figure 4A shows focused proposal controls, and Fig. 4B reports the matched runtime controls.</w:t>
+        <w:t xml:space="preserve">The base Kernel allocation score adds a 7 × 7 target-class neighbourhood fraction with weight 0.35. The existing sensitivity and mechanism artefacts are retained as diagnostic controls; they do not identify a causal effect because the proposal features and allocator both contain spatial context. The neighbourhood term is therefore interpreted as evidence about the execution mechanism, not as an independently estimated planning preference. Fig. 4A shows focused proposal controls, and Fig. 4B reports the matched runtime controls.</w:t>
       </w:r>
     </w:p>
     <w:p>
@@ -4215,9 +4223,9 @@
       <w:r>
         <w:drawing>
           <wp:inline>
-            <wp:extent cx="5334000" cy="2451478"/>
+            <wp:extent cx="5334000" cy="2478180"/>
             <wp:effectExtent b="0" l="0" r="0" t="0"/>
-            <wp:docPr descr="Mechanism controls. Panel A compares the full transition proposal with selected proposal controls. Panel B gives the strict destination-change FoM difference between matched runtime controls and the full Kernel. Bars show mean plus or minus population standard deviation across the three frozen seeds. These are execution diagnostics, not causal policy experiments." title="" id="35" name="Picture"/>
+            <wp:docPr descr="Mechanism controls. Panel A compares the full transition proposal with selected proposal controls. Panel B gives the strict destination-change FoM difference between matched runtime controls and the full Kernel. Bars show mean plus or minus population standard deviation across the three frozen seeds. The no-state-writeback control is undefined for the 2023 one-step target and is therefore shown only for 2024. These are execution diagnostics, not causal policy experiments." title="" id="35" name="Picture"/>
             <a:graphic>
               <a:graphicData uri="http://schemas.openxmlformats.org/drawingml/2006/picture">
                 <pic:pic>
@@ -4236,7 +4244,7 @@
                   <pic:spPr bwMode="auto">
                     <a:xfrm>
                       <a:off x="0" y="0"/>
-                      <a:ext cx="5334000" cy="2451478"/>
+                      <a:ext cx="5334000" cy="2478180"/>
                     </a:xfrm>
                     <a:prstGeom prst="rect">
                       <a:avLst/>
@@ -4260,7 +4268,7 @@
         <w:pStyle w:val="ImageCaption"/>
       </w:pPr>
       <w:r>
-        <w:t xml:space="preserve">Mechanism controls. Panel A compares the full transition proposal with selected proposal controls. Panel B gives the strict destination-change FoM difference between matched runtime controls and the full Kernel. Bars show mean plus or minus population standard deviation across the three frozen seeds. These are execution diagnostics, not causal policy experiments.</w:t>
+        <w:t xml:space="preserve">Mechanism controls. Panel A compares the full transition proposal with selected proposal controls. Panel B gives the strict destination-change FoM difference between matched runtime controls and the full Kernel. Bars show mean plus or minus population standard deviation across the three frozen seeds. The no-state-writeback control is undefined for the 2023 one-step target and is therefore shown only for 2024. These are execution diagnostics, not causal policy experiments.</w:t>
       </w:r>
     </w:p>
     <w:bookmarkEnd w:id="37"/>
@@ -4314,7 +4322,7 @@
         <w:t xml:space="preserve"> </w:t>
       </w:r>
       <w:r>
-        <w:t xml:space="preserve">prediction records passed the raster audit. Figure 5 uses the high-outward</w:t>
+        <w:t xml:space="preserve">prediction records passed the raster audit. Fig. 5 uses the high-outward</w:t>
       </w:r>
       <w:r>
         <w:t xml:space="preserve"> </w:t>
@@ -4326,7 +4334,7 @@
         <w:t xml:space="preserve"> </w:t>
       </w:r>
       <w:r>
-        <w:t xml:space="preserve">provided as Supplementary Fig. S1. These are raster-cell change footprints, not</w:t>
+        <w:t xml:space="preserve">provided as Fig. S1. These are raster-cell change footprints, not</w:t>
       </w:r>
       <w:r>
         <w:t xml:space="preserve"> </w:t>
@@ -5850,7 +5858,7 @@
           <w:b/>
           <w:bCs/>
         </w:rPr>
-        <w:t xml:space="preserve">Supplementary Figure S1:</w:t>
+        <w:t xml:space="preserve">Fig. S1:</w:t>
       </w:r>
       <w:r>
         <w:t xml:space="preserve"> </w:t>
@@ -5881,13 +5889,22 @@
           <w:b/>
           <w:bCs/>
         </w:rPr>
-        <w:t xml:space="preserve">Supplementary Figure S2:</w:t>
-      </w:r>
-      <w:r>
-        <w:t xml:space="preserve"> </w:t>
-      </w:r>
-      <w:r>
-        <w:t xml:space="preserve">Dynamic World confidence and high-confidence change sensitivity.</w:t>
+        <w:t xml:space="preserve">Fig. S2:</w:t>
+      </w:r>
+      <w:r>
+        <w:t xml:space="preserve"> </w:t>
+      </w:r>
+      <w:r>
+        <w:t xml:space="preserve">Dynamic World confidence and high-confidence change sensitivity (</w:t>
+      </w:r>
+      <w:r>
+        <w:rPr>
+          <w:rStyle w:val="VerbatimChar"/>
+        </w:rPr>
+        <w:t xml:space="preserve">figures/figS02_input_label_quality.*</w:t>
+      </w:r>
+      <w:r>
+        <w:t xml:space="preserve">).</w:t>
       </w:r>
     </w:p>
     <w:p>
@@ -5903,13 +5920,22 @@
           <w:b/>
           <w:bCs/>
         </w:rPr>
-        <w:t xml:space="preserve">Supplementary Figure S3:</w:t>
-      </w:r>
-      <w:r>
-        <w:t xml:space="preserve"> </w:t>
-      </w:r>
-      <w:r>
-        <w:t xml:space="preserve">Historical maps and change-error maps for 2024.</w:t>
+        <w:t xml:space="preserve">Fig. S3:</w:t>
+      </w:r>
+      <w:r>
+        <w:t xml:space="preserve"> </w:t>
+      </w:r>
+      <w:r>
+        <w:t xml:space="preserve">Historical maps and change-error maps for 2024 (</w:t>
+      </w:r>
+      <w:r>
+        <w:rPr>
+          <w:rStyle w:val="VerbatimChar"/>
+        </w:rPr>
+        <w:t xml:space="preserve">figures/figS03_historical_2024_maps_and_errors.*</w:t>
+      </w:r>
+      <w:r>
+        <w:t xml:space="preserve">).</w:t>
       </w:r>
     </w:p>
     <w:p>
@@ -5925,13 +5951,22 @@
           <w:b/>
           <w:bCs/>
         </w:rPr>
-        <w:t xml:space="preserve">Supplementary Figure S4:</w:t>
-      </w:r>
-      <w:r>
-        <w:t xml:space="preserve"> </w:t>
-      </w:r>
-      <w:r>
-        <w:t xml:space="preserve">Driver layers and experiment design in English.</w:t>
+        <w:t xml:space="preserve">Fig. S4:</w:t>
+      </w:r>
+      <w:r>
+        <w:t xml:space="preserve"> </w:t>
+      </w:r>
+      <w:r>
+        <w:t xml:space="preserve">Driver layers and experiment design in English (</w:t>
+      </w:r>
+      <w:r>
+        <w:rPr>
+          <w:rStyle w:val="VerbatimChar"/>
+        </w:rPr>
+        <w:t xml:space="preserve">figures/figS04_driver_layers_and_experiment_design.*</w:t>
+      </w:r>
+      <w:r>
+        <w:t xml:space="preserve">).</w:t>
       </w:r>
     </w:p>
     <w:p>

</xml_diff>

<commit_message>
Address fourteenth-round WorldCover review
</commit_message>
<xml_diff>
--- a/manuscript/manuscript.docx
+++ b/manuscript/manuscript.docx
@@ -16,7 +16,7 @@
         <w:pStyle w:val="FirstParagraph"/>
       </w:pPr>
       <w:r>
-        <w:t xml:space="preserve">Urban land-change models are often evaluated against annual labels whose reliability is not spatially uniform. We present an auditable protocol for testing constrained spatial allocation under that uncertainty, using Geospatial Kernel, the algorithmic core of a Geospatial World Model, as the focal execution layer. The Abu Dhabi public-data benchmark uses annual 100-m land-cover products from 2017–2024, three computational seeds, destination-correct multi-class change Figure of Merit (FoM), spatial-block bootstrap contrasts and explicit state–action–constraint traces. In the primary unmatched-pipeline test, strict FoM was 0.1961 for Geospatial Kernel, 0.1256 for a GeoSOS-derived FLUS-style ANN–CA console and 0.1619 for GeoFM-LDN in 2023; GeoFM-LDN led after recursive two-step rollout in 2024. A separate leakage-controlled expanding-window analysis, excluding the later road snapshot, gave Kernel FoM values of 0.2595, 0.0724, 0.2116 and 0.1816 for the four one-step targets from 2021 to 2024, exceeding a random minimum-change allocator in every window. However, an external-product diagnostic using ESA WorldCover 2020/2021 did not validate change location: Kernel built-gain F1 was 0 across four built-fraction thresholds, while Dynamic World-to-WorldCover built-gain F1 was only 0.0111–0.0192. The planning track is therefore reported as scenario stress testing, not official forecasting. The protocol’s principal contribution is an inspectable proposal–projection–writeback boundary; the experiments support conditional allocation auditability, not verified prediction of Abu Dhabi’s actual future.</w:t>
+        <w:t xml:space="preserve">Urban land-change models are often evaluated against annual labels whose reliability is not spatially uniform. We present an auditable protocol for testing constrained spatial allocation under that uncertainty, using Geospatial Kernel, the algorithmic core of a Geospatial World Model, as the focal execution layer. The Abu Dhabi public-data benchmark uses annual 100-m land-cover products from 2017–2024, three computational seeds, destination-correct multi-class change Figure of Merit (FoM), spatial-block bootstrap contrasts and explicit state–action–constraint traces. In the primary unmatched-pipeline test, strict FoM was 0.1961 for Geospatial Kernel, 0.1256 for a GeoSOS-derived FLUS-style ANN–CA console and 0.1619 for GeoFM-LDN in 2023; GeoFM-LDN led after recursive two-step rollout in 2024. A separate leakage-controlled expanding-window analysis, excluding the later road snapshot, gave Kernel FoM values of 0.2595, 0.0724, 0.2116 and 0.1816 for the four one-step targets from 2021 to 2024, exceeding a random minimum-change allocator in every window. In the only available WorldCover 2020–2021 window, Dynamic World built pixels decreased, so the oracle-demand built-gain test had zero power for every allocator. Dynamic World-to-WorldCover built-gain F1 was 0.0111–0.0192; a count-controlled allocation variant gave Kernel F1 values of 0.0157–0.0397 versus 0.0251–0.0277 for random allocation, with Kernel higher at the two larger thresholds. The planning track is therefore reported as scenario stress testing, not official forecasting. The protocol’s principal contribution is an inspectable proposal–projection–writeback boundary; the experiments support conditional allocation auditability, not verified prediction of Abu Dhabi’s actual future.</w:t>
       </w:r>
     </w:p>
     <w:bookmarkEnd w:id="9"/>
@@ -74,7 +74,7 @@
         </w:numPr>
       </w:pPr>
       <w:r>
-        <w:t xml:space="preserve">WorldCover disagreement bounds claims of real built-change prediction.</w:t>
+        <w:t xml:space="preserve">External-product diagnostics separate label disagreement from allocation skill.</w:t>
       </w:r>
     </w:p>
     <w:p>
@@ -409,7 +409,7 @@
         <w:t xml:space="preserve"> </w:t>
       </w:r>
       <w:r>
-        <w:t xml:space="preserve">label was prohibited from feature construction and fitting. The held-out target supplied its observed class counts to the oracle-demand allocator and was then used for evaluation. This design isolates spatial allocation conditional on known demand and is not an end-to-end demand forecast. Early folds locked only origin-year water and wetland cells and omitted the two road-distance features, because applying the 2021 WorldCover proxy or the later OpenStreetMap snapshot to earlier folds would introduce future information. The resulting rolling proposal has 23 features. A machine-tested temporal firewall records the last training target, prediction target and permitted target-year uses for every run.</w:t>
+        <w:t xml:space="preserve">label was prohibited from feature construction and fitting. The held-out target supplied its observed class counts to the oracle-demand allocator and was then used for evaluation. This design isolates spatial allocation conditional on known demand and is not an end-to-end demand forecast. Early folds locked only origin-year water and wetland cells and omitted the two road-distance features, because applying the 2021 WorldCover proxy or the later OpenStreetMap snapshot to earlier folds would introduce future information. The resulting rolling proposal has 23 features. A machine-tested temporal firewall records the last training target, prediction target and permitted target-year uses for every run. The headline 2023–2024 analysis is less strict: it uses the OSM road snapshot accessed on 31 July 2026, which may include roads built after the corresponding prediction years (including after 2022). This snapshot is supplied symmetrically to all three pipelines, so it does not change their ordering, but it can affect absolute scores; the rolling-origin results are the strict no-road-snapshot boundary.</w:t>
       </w:r>
     </w:p>
     <w:bookmarkEnd w:id="14"/>
@@ -443,7 +443,7 @@
         <w:pStyle w:val="BodyText"/>
       </w:pPr>
       <w:r>
-        <w:t xml:space="preserve">For an external public-product diagnostic, the ESA WorldCover 2020 v1.0 and 2021 v2.0 built-up class (value 50) was converted to built fraction on each 100-m benchmark cell. Built presence was tested at fractions of 0.05, 0.10, 0.20 and 0.30. Built gain required a cell to cross from below to at or above the threshold; built loss used the reverse definition. Binary precision, recall, F1 and intersection over union were calculated for the Dynamic World transition and for the 2020-origin predictions. This is a product-agreement diagnostic, not ground-truth validation: the two WorldCover years use different product versions, WorldCover and Dynamic World both derive from Sentinel observations, and neither represents statutory Abu Dhabi land use.</w:t>
+        <w:t xml:space="preserve">For an external public-product diagnostic, the ESA WorldCover 2020 v1.0 and 2021 v2.0 built-up class (value 50) was converted to built fraction on each 100-m benchmark cell. Built presence was tested at fractions of 0.05, 0.10, 0.20 and 0.30. Built gain required a cell to cross from below to at or above the threshold; built loss used the reverse definition. Binary precision, recall, F1 and intersection over union were calculated for the Dynamic World transition and for the 2020-origin predictions. The original oracle-demand comparison uses Dynamic World 2021 built counts; because the built count decreases in this window, it cannot allocate any built gains and is a structural-zero, zero-power test of gain location. We therefore also supplied the WorldCover built-gain count as the action, ranked candidate cells with the 2020-origin Kernel proposal, and compared it with random allocation from the same candidate population. This count-controlled variant is the informative allocation diagnostic, but it remains product agreement rather than ground-truth validation: the two WorldCover years use different product versions, WorldCover and Dynamic World both derive from Sentinel observations, and neither represents statutory Abu Dhabi land use.</w:t>
       </w:r>
     </w:p>
     <w:bookmarkEnd w:id="15"/>
@@ -1875,7 +1875,7 @@
         <w:t xml:space="preserve"> </w:t>
       </w:r>
       <w:r>
-        <w:t xml:space="preserve">when source rasters, reports or vectors are absent; with the released public bundle, the input audit passed all alignment gates (with a Dynamic World label-noise warning) and the output audit passed 276 historical and planning predictions with zero failures. The vector layers preserve raster-cell geometry and should not be interpreted as cadastral parcels.</w:t>
+        <w:t xml:space="preserve">when source rasters, reports or vectors are absent; with the released public bundle, the input audit passed all alignment gates (with a Dynamic World label-noise warning) and the output audit passed 312 historical, rolling-origin and planning predictions plus two frozen WorldCover evidence rasters, with zero failures. The vector layers preserve raster-cell geometry and should not be interpreted as cadastral parcels.</w:t>
       </w:r>
     </w:p>
     <w:bookmarkEnd w:id="20"/>
@@ -2950,31 +2950,43 @@
         <w:t xml:space="preserve"> </w:t>
       </w:r>
       <w:r>
-        <w:t xml:space="preserve">of the three seeds. This result supports conditional spatial allocation under</w:t>
-      </w:r>
-      <w:r>
-        <w:t xml:space="preserve"> </w:t>
-      </w:r>
-      <w:r>
-        <w:t xml:space="preserve">Dynamic World labels, but the weak 2022 score shows substantial temporal</w:t>
-      </w:r>
-      <w:r>
-        <w:t xml:space="preserve"> </w:t>
-      </w:r>
-      <w:r>
-        <w:t xml:space="preserve">variation. Persistence also retained higher overall accuracy than Kernel in</w:t>
-      </w:r>
-      <w:r>
-        <w:t xml:space="preserve"> </w:t>
-      </w:r>
-      <w:r>
-        <w:t xml:space="preserve">2022–2024, whereas Kernel had higher overall accuracy only in 2021. The</w:t>
-      </w:r>
-      <w:r>
-        <w:t xml:space="preserve"> </w:t>
-      </w:r>
-      <w:r>
-        <w:t xml:space="preserve">change-specific and all-cell metrics therefore answer different questions.</w:t>
+        <w:t xml:space="preserve">of the three seeds. The shared low 2022 values (Kernel 0.0724; random 0.0048)</w:t>
+      </w:r>
+      <w:r>
+        <w:t xml:space="preserve"> </w:t>
+      </w:r>
+      <w:r>
+        <w:t xml:space="preserve">indicate a difficult 2021→2022 transition for all allocators, consistent with</w:t>
+      </w:r>
+      <w:r>
+        <w:t xml:space="preserve"> </w:t>
+      </w:r>
+      <w:r>
+        <w:t xml:space="preserve">the elevated label-reversion rate in Fig. S2 and the contemporaneous fluctuation</w:t>
+      </w:r>
+      <w:r>
+        <w:t xml:space="preserve"> </w:t>
+      </w:r>
+      <w:r>
+        <w:t xml:space="preserve">in Dynamic World built counts, rather than a Kernel-specific failure. Persistence</w:t>
+      </w:r>
+      <w:r>
+        <w:t xml:space="preserve"> </w:t>
+      </w:r>
+      <w:r>
+        <w:t xml:space="preserve">also retained higher overall accuracy than Kernel in 2022–2024, whereas Kernel</w:t>
+      </w:r>
+      <w:r>
+        <w:t xml:space="preserve"> </w:t>
+      </w:r>
+      <w:r>
+        <w:t xml:space="preserve">had higher overall accuracy only in 2021. The change-specific and all-cell</w:t>
+      </w:r>
+      <w:r>
+        <w:t xml:space="preserve"> </w:t>
+      </w:r>
+      <w:r>
+        <w:t xml:space="preserve">metrics therefore answer different questions.</w:t>
       </w:r>
     </w:p>
     <w:p>
@@ -2982,7 +2994,7 @@
         <w:pStyle w:val="BodyText"/>
       </w:pPr>
       <w:r>
-        <w:t xml:space="preserve">The WorldCover comparison did not corroborate change location. Across built</w:t>
+        <w:t xml:space="preserve">The WorldCover comparison has two distinct interpretations. Across built</w:t>
       </w:r>
       <w:r>
         <w:t xml:space="preserve"> </w:t>
@@ -3000,55 +3012,91 @@
         <w:t xml:space="preserve"> </w:t>
       </w:r>
       <w:r>
-        <w:t xml:space="preserve">only 0.0111–0.0192. Under the 2020→2021 Dynamic World oracle-demand action,</w:t>
-      </w:r>
-      <w:r>
-        <w:t xml:space="preserve"> </w:t>
-      </w:r>
-      <w:r>
-        <w:t xml:space="preserve">Kernel and the random allocator produced no built-gain cells, so their</w:t>
-      </w:r>
-      <w:r>
-        <w:t xml:space="preserve"> </w:t>
-      </w:r>
-      <w:r>
-        <w:t xml:space="preserve">WorldCover built-gain F1 was 0 at all thresholds and precision was undefined.</w:t>
-      </w:r>
-      <w:r>
-        <w:t xml:space="preserve"> </w:t>
-      </w:r>
-      <w:r>
-        <w:t xml:space="preserve">For 2021 built stock, Kernel F1 increased from 0.3518 to 0.3971 as the threshold</w:t>
-      </w:r>
-      <w:r>
-        <w:t xml:space="preserve"> </w:t>
-      </w:r>
-      <w:r>
-        <w:t xml:space="preserve">rose, but persistence was higher at every threshold (0.3886–0.4387). These</w:t>
-      </w:r>
-      <w:r>
-        <w:t xml:space="preserve"> </w:t>
-      </w:r>
-      <w:r>
-        <w:t xml:space="preserve">negative results indicate product-definition and temporal-label disagreement;</w:t>
-      </w:r>
-      <w:r>
-        <w:t xml:space="preserve"> </w:t>
-      </w:r>
-      <w:r>
-        <w:t xml:space="preserve">they do not identify which public product is correct. Fig. 3 reports the</w:t>
-      </w:r>
-      <w:r>
-        <w:t xml:space="preserve"> </w:t>
-      </w:r>
-      <w:r>
-        <w:t xml:space="preserve">rolling and external-product evidence together so that the zero-model advantage</w:t>
-      </w:r>
-      <w:r>
-        <w:t xml:space="preserve"> </w:t>
-      </w:r>
-      <w:r>
-        <w:t xml:space="preserve">and the absence of external change agreement cannot be separated in the claim.</w:t>
+        <w:t xml:space="preserve">only 0.0111–0.0192. Dynamic World built pixels decreased from 9,642 in 2020 to</w:t>
+      </w:r>
+      <w:r>
+        <w:t xml:space="preserve"> </w:t>
+      </w:r>
+      <w:r>
+        <w:t xml:space="preserve">8,553 in 2021, so under the 2020→2021 Dynamic World oracle-demand action the</w:t>
+      </w:r>
+      <w:r>
+        <w:t xml:space="preserve"> </w:t>
+      </w:r>
+      <w:r>
+        <w:t xml:space="preserve">Kernel, random and persistence allocators necessarily produced no built-gain</w:t>
+      </w:r>
+      <w:r>
+        <w:t xml:space="preserve"> </w:t>
+      </w:r>
+      <w:r>
+        <w:t xml:space="preserve">cells. Their F1 of 0 is therefore a structural-zero, zero-power result and</w:t>
+      </w:r>
+      <w:r>
+        <w:t xml:space="preserve"> </w:t>
+      </w:r>
+      <w:r>
+        <w:t xml:space="preserve">cannot evaluate gain-location skill. The informative count-controlled variant</w:t>
+      </w:r>
+      <w:r>
+        <w:t xml:space="preserve"> </w:t>
+      </w:r>
+      <w:r>
+        <w:t xml:space="preserve">used the WorldCover gain count as the action and ranked 2020-origin Kernel</w:t>
+      </w:r>
+      <w:r>
+        <w:t xml:space="preserve"> </w:t>
+      </w:r>
+      <w:r>
+        <w:t xml:space="preserve">proposals against a random allocation from the same candidate population. Kernel</w:t>
+      </w:r>
+      <w:r>
+        <w:t xml:space="preserve"> </w:t>
+      </w:r>
+      <w:r>
+        <w:t xml:space="preserve">F1 was 0.0157–0.0397 versus 0.0251–0.0277 for random allocation; Kernel was</w:t>
+      </w:r>
+      <w:r>
+        <w:t xml:space="preserve"> </w:t>
+      </w:r>
+      <w:r>
+        <w:t xml:space="preserve">higher at thresholds 0.20 and 0.30, but lower at 0.05 and 0.10. For 2021 built</w:t>
+      </w:r>
+      <w:r>
+        <w:t xml:space="preserve"> </w:t>
+      </w:r>
+      <w:r>
+        <w:t xml:space="preserve">stock, Kernel F1 was 0.3518–0.3971, while persistence was 0.3886–0.4387. The</w:t>
+      </w:r>
+      <w:r>
+        <w:t xml:space="preserve"> </w:t>
+      </w:r>
+      <w:r>
+        <w:t xml:space="preserve">corresponding Dynamic World 2020 and 2021 observed-stock baselines were</w:t>
+      </w:r>
+      <w:r>
+        <w:t xml:space="preserve"> </w:t>
+      </w:r>
+      <w:r>
+        <w:t xml:space="preserve">0.3908–0.4334 and 0.3501–0.3924, respectively, showing that the apparent</w:t>
+      </w:r>
+      <w:r>
+        <w:t xml:space="preserve"> </w:t>
+      </w:r>
+      <w:r>
+        <w:t xml:space="preserve">persistence advantage mirrors greater agreement of the 2020 label with</w:t>
+      </w:r>
+      <w:r>
+        <w:t xml:space="preserve"> </w:t>
+      </w:r>
+      <w:r>
+        <w:t xml:space="preserve">WorldCover rather than a model advantage. Fig. 3 separates these stock and</w:t>
+      </w:r>
+      <w:r>
+        <w:t xml:space="preserve"> </w:t>
+      </w:r>
+      <w:r>
+        <w:t xml:space="preserve">count-controlled gain comparisons; none is authoritative validation.</w:t>
       </w:r>
     </w:p>
     <w:p>
@@ -3060,7 +3108,7 @@
           <wp:inline>
             <wp:extent cx="5334000" cy="3532492"/>
             <wp:effectExtent b="0" l="0" r="0" t="0"/>
-            <wp:docPr descr="Rolling-origin robustness and external-product diagnostics. Panel a reports strict destination-change FoM for four leakage-controlled one-step targets; points show means and sample standard deviations across three computational seeds. Panel b reports Kernel-minus-baseline paired spatial-block contrasts; points are mean seed medians and whiskers span the minimum to maximum of seed-specific 95% intervals from 1,000 resamples of 8 × 8-cell blocks. Panels c and d compare 2021 built stock and 2020–2021 built gain with ESA WorldCover at four 100-m built-fraction thresholds. The WorldCover comparison is an external public-product diagnostic, not authoritative ground truth. Source data are provided in source_data_fig03_rolling_external_diagnostics.csv." title="" id="31" name="Picture"/>
+            <wp:docPr descr="Rolling-origin robustness and external-product diagnostics. Panel a reports strict destination-change FoM for four leakage-controlled one-step targets; points show means and sample standard deviations across three computational seeds. Panel b reports Kernel-minus-baseline paired spatial-block contrasts; points are mean seed medians and whiskers span the minimum to maximum of seed-specific 95% intervals from 1,000 resamples of 8 × 8-cell blocks. Panel c compares same-year Dynamic World 2020 and 2021 built stocks, plus 2021 Kernel and persistence predictions, with the corresponding WorldCover products at four 100-m built-fraction thresholds. Panel d compares Dynamic World built gain with the count-controlled Kernel and random allocations, where WorldCover gain count is supplied as the action. The original oracle-demand gain test is structural-zero and is not plotted as model evidence. The WorldCover comparison is an external public-product diagnostic, not authoritative ground truth. Source data are provided in source_data_fig03_rolling_external_diagnostics.csv." title="" id="31" name="Picture"/>
             <a:graphic>
               <a:graphicData uri="http://schemas.openxmlformats.org/drawingml/2006/picture">
                 <pic:pic>
@@ -3103,7 +3151,7 @@
         <w:pStyle w:val="ImageCaption"/>
       </w:pPr>
       <w:r>
-        <w:t xml:space="preserve">Rolling-origin robustness and external-product diagnostics. Panel a reports strict destination-change FoM for four leakage-controlled one-step targets; points show means and sample standard deviations across three computational seeds. Panel b reports Kernel-minus-baseline paired spatial-block contrasts; points are mean seed medians and whiskers span the minimum to maximum of seed-specific 95% intervals from 1,000 resamples of 8 × 8-cell blocks. Panels c and d compare 2021 built stock and 2020–2021 built gain with ESA WorldCover at four 100-m built-fraction thresholds. The WorldCover comparison is an external public-product diagnostic, not authoritative ground truth. Source data are provided in source_data_fig03_rolling_external_diagnostics.csv.</w:t>
+        <w:t xml:space="preserve">Rolling-origin robustness and external-product diagnostics. Panel a reports strict destination-change FoM for four leakage-controlled one-step targets; points show means and sample standard deviations across three computational seeds. Panel b reports Kernel-minus-baseline paired spatial-block contrasts; points are mean seed medians and whiskers span the minimum to maximum of seed-specific 95% intervals from 1,000 resamples of 8 × 8-cell blocks. Panel c compares same-year Dynamic World 2020 and 2021 built stocks, plus 2021 Kernel and persistence predictions, with the corresponding WorldCover products at four 100-m built-fraction thresholds. Panel d compares Dynamic World built gain with the count-controlled Kernel and random allocations, where WorldCover gain count is supplied as the action. The original oracle-demand gain test is structural-zero and is not plotted as model evidence. The WorldCover comparison is an external public-product diagnostic, not authoritative ground truth. Source data are provided in source_data_fig03_rolling_external_diagnostics.csv.</w:t>
       </w:r>
     </w:p>
     <w:p>
@@ -4560,13 +4608,19 @@
         <w:t xml:space="preserve"> </w:t>
       </w:r>
       <w:r>
-        <w:t xml:space="preserve">raster and therefore a non-zero ensemble error. All 276 historical and planning</w:t>
-      </w:r>
-      <w:r>
-        <w:t xml:space="preserve"> </w:t>
-      </w:r>
-      <w:r>
-        <w:t xml:space="preserve">prediction records passed the raster audit. Fig. 6 uses the high-outward</w:t>
+        <w:t xml:space="preserve">raster and therefore a non-zero ensemble error. All 312 historical,</w:t>
+      </w:r>
+      <w:r>
+        <w:t xml:space="preserve"> </w:t>
+      </w:r>
+      <w:r>
+        <w:t xml:space="preserve">rolling-origin and planning prediction records passed the raster audit, and the</w:t>
+      </w:r>
+      <w:r>
+        <w:t xml:space="preserve"> </w:t>
+      </w:r>
+      <w:r>
+        <w:t xml:space="preserve">two frozen WorldCover evidence rasters passed the evidence audit. Fig. 6 uses the high-outward</w:t>
       </w:r>
       <w:r>
         <w:t xml:space="preserve"> </w:t>
@@ -4658,7 +4712,7 @@
         <w:pStyle w:val="FirstParagraph"/>
       </w:pPr>
       <w:r>
-        <w:t xml:space="preserve">This study positions Geospatial Kernel as a candidate execution layer for constrained spatial reasoning and, more broadly, proposes an audit protocol for noisy annual labels. The defensible contribution is that a transition proposal and a planning admission rule can be represented and inspected separately. Under the unmatched public-data pipeline, Geospatial Kernel has the largest strict transition FoM at the one-step horizon, while GeoFM-LDN has the largest value after recursive two-step rollout. In the separate rolling analysis, Kernel exceeds both zero models in all four one-step windows, but its score varies from 0.0724 to 0.2595 after excluding the later road snapshot. The WorldCover diagnostic then shows that superiority relative to Dynamic World-based zero models does not transfer to externally defined built-gain locations. Confidence filtering, rolling-window stability and external-product agreement are different tests, and none substitutes for authoritative local validation. We therefore treat the planning frontier as conditional on public proxy objectives and synthetic actions.</w:t>
+        <w:t xml:space="preserve">This study positions Geospatial Kernel as a candidate execution layer for constrained spatial reasoning and, more broadly, proposes an audit protocol for noisy annual labels. The defensible contribution is that a transition proposal and a planning admission rule can be represented and inspected separately. Under the unmatched public-data pipeline, Geospatial Kernel has the largest strict transition FoM at the one-step horizon, while GeoFM-LDN has the largest value after recursive two-step rollout. In the separate rolling analysis, Kernel exceeds both zero models in all four one-step windows, but its score varies from 0.0724 to 0.2595 after excluding the later road snapshot. The WorldCover diagnostic does not provide a blanket external validation: the original Dynamic World-count gain comparison is structurally zero-powered because the observed built count declines. The count-controlled variant supplies an informative but mixed allocation comparison, with Kernel exceeding random allocation only at the two larger thresholds. Confidence filtering, rolling-window stability and external-product agreement are different tests, and none substitutes for authoritative local validation. We therefore treat the planning frontier as conditional on public proxy objectives and synthetic actions.</w:t>
       </w:r>
     </w:p>
     <w:p>
@@ -4684,31 +4738,79 @@
         <w:t xml:space="preserve"> </w:t>
       </w:r>
       <w:r>
-        <w:t xml:space="preserve">2020–2021 WorldCover diagnostic conflicts with Dynamic World and is neither</w:t>
-      </w:r>
-      <w:r>
-        <w:t xml:space="preserve"> </w:t>
-      </w:r>
-      <w:r>
-        <w:t xml:space="preserve">fully independent nor authoritative, while no external 2023–2024 change</w:t>
-      </w:r>
-      <w:r>
-        <w:t xml:space="preserve"> </w:t>
-      </w:r>
-      <w:r>
-        <w:t xml:space="preserve">product or observed 2025–2031 labels was available. Public</w:t>
-      </w:r>
-      <w:r>
-        <w:t xml:space="preserve"> </w:t>
-      </w:r>
-      <w:r>
-        <w:t xml:space="preserve">roads, wetland and protected-area layers are proxies, future drivers are held at</w:t>
-      </w:r>
-      <w:r>
-        <w:t xml:space="preserve"> </w:t>
-      </w:r>
-      <w:r>
-        <w:t xml:space="preserve">2024, and the green-priority action has no water-budget constraint. The FLUS-style</w:t>
+        <w:t xml:space="preserve">2020–2021 WorldCover diagnostic is neither fully independent nor authoritative,</w:t>
+      </w:r>
+      <w:r>
+        <w:t xml:space="preserve"> </w:t>
+      </w:r>
+      <w:r>
+        <w:t xml:space="preserve">and no external 2023–2024 change product or observed 2025–2031 labels was</w:t>
+      </w:r>
+      <w:r>
+        <w:t xml:space="preserve"> </w:t>
+      </w:r>
+      <w:r>
+        <w:t xml:space="preserve">available. The headline analysis also uses a 31 July 2026 OSM road snapshot,</w:t>
+      </w:r>
+      <w:r>
+        <w:t xml:space="preserve"> </w:t>
+      </w:r>
+      <w:r>
+        <w:t xml:space="preserve">which may contain roads constructed after 2022. This information is shared by</w:t>
+      </w:r>
+      <w:r>
+        <w:t xml:space="preserve"> </w:t>
+      </w:r>
+      <w:r>
+        <w:t xml:space="preserve">all three pipelines and therefore does not change their ordering, but it can</w:t>
+      </w:r>
+      <w:r>
+        <w:t xml:space="preserve"> </w:t>
+      </w:r>
+      <w:r>
+        <w:t xml:space="preserve">affect absolute scores; the strict rolling-origin analysis removes those road</w:t>
+      </w:r>
+      <w:r>
+        <w:t xml:space="preserve"> </w:t>
+      </w:r>
+      <w:r>
+        <w:t xml:space="preserve">features and should define the no-leakage boundary. As a descriptive bound,</w:t>
+      </w:r>
+      <w:r>
+        <w:t xml:space="preserve"> </w:t>
+      </w:r>
+      <w:r>
+        <w:t xml:space="preserve">the road-free rolling 2023 one-step FoM is 0.2116, of the same order as the</w:t>
+      </w:r>
+      <w:r>
+        <w:t xml:space="preserve"> </w:t>
+      </w:r>
+      <w:r>
+        <w:t xml:space="preserve">headline 2023 value of 0.1961; these values are not directly comparable because</w:t>
+      </w:r>
+      <w:r>
+        <w:t xml:space="preserve"> </w:t>
+      </w:r>
+      <w:r>
+        <w:t xml:space="preserve">the rolling fit uses 23 features and training through 2022, whereas the headline</w:t>
+      </w:r>
+      <w:r>
+        <w:t xml:space="preserve"> </w:t>
+      </w:r>
+      <w:r>
+        <w:t xml:space="preserve">fit uses 25 features and training through 2021. Public wetland and</w:t>
+      </w:r>
+      <w:r>
+        <w:t xml:space="preserve"> </w:t>
+      </w:r>
+      <w:r>
+        <w:t xml:space="preserve">protected-area layers are proxies, future drivers are held at 2024, and the</w:t>
+      </w:r>
+      <w:r>
+        <w:t xml:space="preserve"> </w:t>
+      </w:r>
+      <w:r>
+        <w:t xml:space="preserve">green-priority action has no water-budget constraint. The FLUS-style</w:t>
       </w:r>
       <w:r>
         <w:t xml:space="preserve"> </w:t>

</xml_diff>

<commit_message>
Add Zenodo archival DOI and release metadata
</commit_message>
<xml_diff>
--- a/manuscript/manuscript.docx
+++ b/manuscript/manuscript.docx
@@ -4933,7 +4933,34 @@
         <w:t xml:space="preserve"> </w:t>
       </w:r>
       <w:r>
-        <w:t xml:space="preserve">in the accompanying repository. The main evidence files are:</w:t>
+        <w:t xml:space="preserve">in the accompanying repository. The versioned reproducibility release is archived at Zenodo v1.0.0 (https://doi.org/10.5281/zenodo.22663476), corresponding to GitHub tag</w:t>
+      </w:r>
+      <w:r>
+        <w:t xml:space="preserve"> </w:t>
+      </w:r>
+      <w:r>
+        <w:rPr>
+          <w:rStyle w:val="VerbatimChar"/>
+        </w:rPr>
+        <w:t xml:space="preserve">v1.0.0</w:t>
+      </w:r>
+      <w:r>
+        <w:t xml:space="preserve"> </w:t>
+      </w:r>
+      <w:r>
+        <w:t xml:space="preserve">at commit</w:t>
+      </w:r>
+      <w:r>
+        <w:t xml:space="preserve"> </w:t>
+      </w:r>
+      <w:r>
+        <w:rPr>
+          <w:rStyle w:val="VerbatimChar"/>
+        </w:rPr>
+        <w:t xml:space="preserve">2cbd2d3</w:t>
+      </w:r>
+      <w:r>
+        <w:t xml:space="preserve">. This archive DOI identifies the public-data benchmark and software/data package, not the eventual journal article DOI. Large rasters, GeoPackages and model checkpoints remain Git LFS objects in the GitHub repository; a full numerical rerun requires fetching those objects, whereas the automatically generated Zenodo GitHub ZIP may contain their pointer files. The main evidence files are:</w:t>
       </w:r>
     </w:p>
     <w:p>
@@ -5805,13 +5832,52 @@
         <w:t xml:space="preserve">zhouning@freedotech.com</w:t>
       </w:r>
       <w:r>
-        <w:t xml:space="preserve">; an archival DOI should be added after a persistent</w:t>
-      </w:r>
-      <w:r>
-        <w:t xml:space="preserve"> </w:t>
-      </w:r>
-      <w:r>
-        <w:t xml:space="preserve">public release is created.</w:t>
+        <w:t xml:space="preserve">. The versioned public reproducibility release is</w:t>
+      </w:r>
+      <w:r>
+        <w:t xml:space="preserve"> </w:t>
+      </w:r>
+      <w:r>
+        <w:t xml:space="preserve">archived at Zenodo v1.0.0: https://doi.org/10.5281/zenodo.22663476. It</w:t>
+      </w:r>
+      <w:r>
+        <w:t xml:space="preserve"> </w:t>
+      </w:r>
+      <w:r>
+        <w:t xml:space="preserve">corresponds to GitHub tag</w:t>
+      </w:r>
+      <w:r>
+        <w:t xml:space="preserve"> </w:t>
+      </w:r>
+      <w:r>
+        <w:rPr>
+          <w:rStyle w:val="VerbatimChar"/>
+        </w:rPr>
+        <w:t xml:space="preserve">v1.0.0</w:t>
+      </w:r>
+      <w:r>
+        <w:t xml:space="preserve"> </w:t>
+      </w:r>
+      <w:r>
+        <w:t xml:space="preserve">at commit</w:t>
+      </w:r>
+      <w:r>
+        <w:t xml:space="preserve"> </w:t>
+      </w:r>
+      <w:r>
+        <w:rPr>
+          <w:rStyle w:val="VerbatimChar"/>
+        </w:rPr>
+        <w:t xml:space="preserve">2cbd2d3</w:t>
+      </w:r>
+      <w:r>
+        <w:t xml:space="preserve">; the DOI identifies the</w:t>
+      </w:r>
+      <w:r>
+        <w:t xml:space="preserve"> </w:t>
+      </w:r>
+      <w:r>
+        <w:t xml:space="preserve">benchmark and software/data archive, not the eventual journal article DOI.</w:t>
       </w:r>
     </w:p>
     <w:bookmarkEnd w:id="49"/>

</xml_diff>

<commit_message>
Address fifteenth-round WorldCover dispersion review
</commit_message>
<xml_diff>
--- a/manuscript/manuscript.docx
+++ b/manuscript/manuscript.docx
@@ -16,7 +16,7 @@
         <w:pStyle w:val="FirstParagraph"/>
       </w:pPr>
       <w:r>
-        <w:t xml:space="preserve">Urban land-change models are often evaluated against annual labels whose reliability is not spatially uniform. We present an auditable protocol for testing constrained spatial allocation under that uncertainty, using Geospatial Kernel, the algorithmic core of a Geospatial World Model, as the focal execution layer. The Abu Dhabi public-data benchmark uses annual 100-m land-cover products from 2017–2024, three computational seeds, destination-correct multi-class change Figure of Merit (FoM), spatial-block bootstrap contrasts and explicit state–action–constraint traces. In the primary unmatched-pipeline test, strict FoM was 0.1961 for Geospatial Kernel, 0.1256 for a GeoSOS-derived FLUS-style ANN–CA console and 0.1619 for GeoFM-LDN in 2023; GeoFM-LDN led after recursive two-step rollout in 2024. A separate leakage-controlled expanding-window analysis, excluding the later road snapshot, gave Kernel FoM values of 0.2595, 0.0724, 0.2116 and 0.1816 for the four one-step targets from 2021 to 2024, exceeding a random minimum-change allocator in every window. In the only available WorldCover 2020–2021 window, Dynamic World built pixels decreased, so the oracle-demand built-gain test had zero power for every allocator. Dynamic World-to-WorldCover built-gain F1 was 0.0111–0.0192; a count-controlled allocation variant gave Kernel F1 values of 0.0157–0.0397 versus 0.0251–0.0277 for random allocation, with Kernel higher at the two larger thresholds. The planning track is therefore reported as scenario stress testing, not official forecasting. The protocol’s principal contribution is an inspectable proposal–projection–writeback boundary; the experiments support conditional allocation auditability, not verified prediction of Abu Dhabi’s actual future.</w:t>
+        <w:t xml:space="preserve">Urban land-change models are often evaluated against annual labels whose reliability is not spatially uniform. We present an auditable protocol for testing constrained spatial allocation under that uncertainty, using Geospatial Kernel, the algorithmic core of a Geospatial World Model, as the focal execution layer. The Abu Dhabi public-data benchmark uses annual 100-m land-cover products from 2017–2024, three computational seeds, destination-correct multi-class change Figure of Merit (FoM), spatial-block bootstrap contrasts and explicit state–action–constraint traces. In the primary unmatched-pipeline test, strict FoM was 0.1961 for Geospatial Kernel, 0.1256 for a GeoSOS-derived FLUS-style ANN–CA console and 0.1619 for GeoFM-LDN in 2023; GeoFM-LDN led after recursive two-step rollout in 2024. A separate leakage-controlled expanding-window analysis, excluding the later road snapshot, gave Kernel FoM values of 0.2595, 0.0724, 0.2116 and 0.1816 for the four one-step targets from 2021 to 2024, exceeding a random minimum-change allocator in every window. In the only available WorldCover 2020–2021 window, Dynamic World built pixels decreased, so the oracle-demand built-gain test had zero power for every allocator. Dynamic World-to-WorldCover built-gain F1 was 0.0111–0.0192. The count-controlled allocation variant was near opportunity-level overall: Kernel was below random at 0.05, indistinguishable from random at 0.10–0.20 given three-seed variation, and above random only at 0.30. The planning track is therefore reported as scenario stress testing, not official forecasting. The protocol’s principal contribution is an inspectable proposal–projection–writeback boundary; the experiments support conditional allocation auditability, not verified prediction of Abu Dhabi’s actual future.</w:t>
       </w:r>
     </w:p>
     <w:bookmarkEnd w:id="9"/>
@@ -3054,19 +3054,67 @@
         <w:t xml:space="preserve"> </w:t>
       </w:r>
       <w:r>
-        <w:t xml:space="preserve">F1 was 0.0157–0.0397 versus 0.0251–0.0277 for random allocation; Kernel was</w:t>
-      </w:r>
-      <w:r>
-        <w:t xml:space="preserve"> </w:t>
-      </w:r>
-      <w:r>
-        <w:t xml:space="preserve">higher at thresholds 0.20 and 0.30, but lower at 0.05 and 0.10. For 2021 built</w:t>
-      </w:r>
-      <w:r>
-        <w:t xml:space="preserve"> </w:t>
-      </w:r>
-      <w:r>
-        <w:t xml:space="preserve">stock, Kernel F1 was 0.3518–0.3971, while persistence was 0.3886–0.4387. The</w:t>
+        <w:t xml:space="preserve">F1 was 0.0157–0.0397 versus 0.0251–0.0277 for random allocation. The mean ±</w:t>
+      </w:r>
+      <w:r>
+        <w:t xml:space="preserve"> </w:t>
+      </w:r>
+      <w:r>
+        <w:t xml:space="preserve">sample-SD pairs (Kernel versus random) were 0.0157 ± 0.0008 versus 0.0268 ±</w:t>
+      </w:r>
+      <w:r>
+        <w:t xml:space="preserve"> </w:t>
+      </w:r>
+      <w:r>
+        <w:t xml:space="preserve">0.0058 at 0.05, 0.0228 ± 0.0007 versus 0.0277 ± 0.0036 at 0.10, 0.0268 ±</w:t>
+      </w:r>
+      <w:r>
+        <w:t xml:space="preserve"> </w:t>
+      </w:r>
+      <w:r>
+        <w:t xml:space="preserve">0.0011 versus 0.0251 ± 0.0011 at 0.20, and 0.0397 ± 0.0007 versus 0.0251 ±</w:t>
+      </w:r>
+      <w:r>
+        <w:t xml:space="preserve"> </w:t>
+      </w:r>
+      <w:r>
+        <w:t xml:space="preserve">0.0075 at 0.30. Thus Kernel was below random at 0.05, the 0.10–0.20</w:t>
+      </w:r>
+      <w:r>
+        <w:t xml:space="preserve"> </w:t>
+      </w:r>
+      <w:r>
+        <w:t xml:space="preserve">differences were not distinguishable from three-seed variation, and only the</w:t>
+      </w:r>
+      <w:r>
+        <w:t xml:space="preserve"> </w:t>
+      </w:r>
+      <w:r>
+        <w:t xml:space="preserve">0.30 result was clearly above random. The low-threshold deficit is consistent</w:t>
+      </w:r>
+      <w:r>
+        <w:t xml:space="preserve"> </w:t>
+      </w:r>
+      <w:r>
+        <w:t xml:space="preserve">with WorldCover cells that barely exceed 5% built fraction, including sparse or</w:t>
+      </w:r>
+      <w:r>
+        <w:t xml:space="preserve"> </w:t>
+      </w:r>
+      <w:r>
+        <w:t xml:space="preserve">road-edge structure that Dynamic World does not consistently label as built;</w:t>
+      </w:r>
+      <w:r>
+        <w:t xml:space="preserve"> </w:t>
+      </w:r>
+      <w:r>
+        <w:t xml:space="preserve">the Kernel proposal learned from Dynamic World therefore ranks these product-</w:t>
+      </w:r>
+      <w:r>
+        <w:t xml:space="preserve"> </w:t>
+      </w:r>
+      <w:r>
+        <w:t xml:space="preserve">specific gains later than random candidates. For 2021 built stock, Kernel F1 was 0.3518–0.3971, while persistence was 0.3886–0.4387. The</w:t>
       </w:r>
       <w:r>
         <w:t xml:space="preserve"> </w:t>
@@ -4712,7 +4760,7 @@
         <w:pStyle w:val="FirstParagraph"/>
       </w:pPr>
       <w:r>
-        <w:t xml:space="preserve">This study positions Geospatial Kernel as a candidate execution layer for constrained spatial reasoning and, more broadly, proposes an audit protocol for noisy annual labels. The defensible contribution is that a transition proposal and a planning admission rule can be represented and inspected separately. Under the unmatched public-data pipeline, Geospatial Kernel has the largest strict transition FoM at the one-step horizon, while GeoFM-LDN has the largest value after recursive two-step rollout. In the separate rolling analysis, Kernel exceeds both zero models in all four one-step windows, but its score varies from 0.0724 to 0.2595 after excluding the later road snapshot. The WorldCover diagnostic does not provide a blanket external validation: the original Dynamic World-count gain comparison is structurally zero-powered because the observed built count declines. The count-controlled variant supplies an informative but mixed allocation comparison, with Kernel exceeding random allocation only at the two larger thresholds. Confidence filtering, rolling-window stability and external-product agreement are different tests, and none substitutes for authoritative local validation. We therefore treat the planning frontier as conditional on public proxy objectives and synthetic actions.</w:t>
+        <w:t xml:space="preserve">This study positions Geospatial Kernel as a candidate execution layer for constrained spatial reasoning and, more broadly, proposes an audit protocol for noisy annual labels. The defensible contribution is that a transition proposal and a planning admission rule can be represented and inspected separately. Under the unmatched public-data pipeline, Geospatial Kernel has the largest strict transition FoM at the one-step horizon, while GeoFM-LDN has the largest value after recursive two-step rollout. In the separate rolling analysis, Kernel exceeds both zero models in all four one-step windows, but its score varies from 0.0724 to 0.2595 after excluding the later road snapshot. The WorldCover diagnostic does not provide a blanket external validation: the original Dynamic World-count gain comparison is structurally zero-powered because the observed built count declines. The count-controlled variant remains near opportunity-level agreement overall: Kernel is below random at 0.05, indistinguishable from random at 0.10–0.20 given three-seed variation, and above random only at 0.30. The low-threshold deficit is consistent with WorldCover’s sparse or road-edge cells just above the 5% built-fraction threshold being inconsistently represented by Dynamic World. Confidence filtering, rolling-window stability and external-product agreement are different tests, and none substitutes for authoritative local validation. We therefore treat the planning frontier as conditional on public proxy objectives and synthetic actions.</w:t>
       </w:r>
     </w:p>
     <w:p>

</xml_diff>

<commit_message>
Release v2 ArcGIS land-cover robustness study
</commit_message>
<xml_diff>
--- a/manuscript/manuscript.docx
+++ b/manuscript/manuscript.docx
@@ -16,7 +16,7 @@
         <w:pStyle w:val="FirstParagraph"/>
       </w:pPr>
       <w:r>
-        <w:t xml:space="preserve">Urban land-change models are often evaluated against annual labels whose reliability is not spatially uniform. We present an auditable protocol for testing constrained spatial allocation under that uncertainty, using Geospatial Kernel, the algorithmic core of a Geospatial World Model, as the focal execution layer. The Abu Dhabi public-data benchmark uses annual 100-m land-cover products from 2017–2024, three computational seeds, destination-correct multi-class change Figure of Merit (FoM), spatial-block bootstrap contrasts and explicit state–action–constraint traces. In the primary unmatched-pipeline test, strict FoM was 0.1961 for Geospatial Kernel, 0.1256 for a GeoSOS-derived FLUS-style ANN–CA console and 0.1619 for GeoFM-LDN in 2023; GeoFM-LDN led after recursive two-step rollout in 2024. A separate leakage-controlled expanding-window analysis, excluding the later road snapshot, gave Kernel FoM values of 0.2595, 0.0724, 0.2116 and 0.1816 for the four one-step targets from 2021 to 2024, exceeding a random minimum-change allocator in every window. In the only available WorldCover 2020–2021 window, Dynamic World built pixels decreased, so the oracle-demand built-gain test had zero power for every allocator. Dynamic World-to-WorldCover built-gain F1 was 0.0111–0.0192. The count-controlled allocation variant was near opportunity-level overall: Kernel was below random at 0.05, indistinguishable from random at 0.10–0.20 given three-seed variation, and above random only at 0.30. The planning track is therefore reported as scenario stress testing, not official forecasting. The protocol’s principal contribution is an inspectable proposal–projection–writeback boundary; the experiments support conditional allocation auditability, not verified prediction of Abu Dhabi’s actual future.</w:t>
+        <w:t xml:space="preserve">Public land-cover products are increasingly used where authoritative local time series are unavailable, but product choice can alter both apparent urban change and model rankings. We present an auditable protocol for constrained spatial allocation using Geospatial Kernel, the algorithmic core of a Geospatial World Model, as the focal execution layer. Two annual 10-m products for Abu Dhabi city, Google Dynamic World (2017–2024) and an ArcGIS-served Impact Observatory/Microsoft/Esri series (2017–2025), were harmonized to the same 100-m, six-class modelling contract. Leakage-controlled expanding-window tests compared a FLUS-style ANN–CA, Geospatial Kernel, GeoFM-LDN, persistence and random minimum-change allocation using three seeds and 1,000 spatial-block bootstrap resamples. The target year supplied oracle class totals and evaluation labels only. In 2024, the ArcGIS-served series mapped 335.57 km² as built versus 155.98 km² in Dynamic World; built-class intersection over union was 0.449. Kernel ranked first in all four Dynamic World targets from 2021 to 2024, but in only two of four matched ArcGIS-served targets; FLUS-style led in 2021 and GeoFM-LDN in 2022. Kernel’s ArcGIS-minus-Dynamic World strict change Figure of Merit ranged from -0.244 to +0.205. Yet the product-specific 2031 planning frontiers retained FLUS-style and Kernel candidates in all three scenarios. The results support an inspectable proposal–projection–writeback boundary while showing that comparative skill is label-product dependent. Neither product is authoritative local land-use truth, model outputs remain 100 m, and the 2026–2031 maps are conditional stress tests rather than official forecasts.</w:t>
       </w:r>
     </w:p>
     <w:bookmarkEnd w:id="9"/>
@@ -38,7 +38,7 @@
         </w:numPr>
       </w:pPr>
       <w:r>
-        <w:t xml:space="preserve">Geospatial Kernel separates transition proposals from constrained admission.</w:t>
+        <w:t xml:space="preserve">Cross-product backtests expose label dependence in model rankings.</w:t>
       </w:r>
     </w:p>
     <w:p>
@@ -50,7 +50,7 @@
         </w:numPr>
       </w:pPr>
       <w:r>
-        <w:t xml:space="preserve">Typed state–action–constraint traces make recursive updates auditable.</w:t>
+        <w:t xml:space="preserve">Kernel leads four Dynamic World and two of four matched ArcGIS folds.</w:t>
       </w:r>
     </w:p>
     <w:p>
@@ -62,7 +62,7 @@
         </w:numPr>
       </w:pPr>
       <w:r>
-        <w:t xml:space="preserve">Rolling-origin and spatial-block tests expose temporal variability.</w:t>
+        <w:t xml:space="preserve">Proposal–projection–writeback traces preserve allocation auditability.</w:t>
       </w:r>
     </w:p>
     <w:p>
@@ -74,7 +74,7 @@
         </w:numPr>
       </w:pPr>
       <w:r>
-        <w:t xml:space="preserve">External-product diagnostics separate label disagreement from allocation skill.</w:t>
+        <w:t xml:space="preserve">ArcGIS-served labels extend the scenario origin state to 2025.</w:t>
       </w:r>
     </w:p>
     <w:p>
@@ -86,7 +86,7 @@
         </w:numPr>
       </w:pPr>
       <w:r>
-        <w:t xml:space="preserve">Planning outputs are scenario stress tests, not statutory Abu Dhabi forecasts.</w:t>
+        <w:t xml:space="preserve">The 2026–2031 maps remain 100-m stress tests, not statutory forecasts.</w:t>
       </w:r>
     </w:p>
     <w:bookmarkEnd w:id="10"/>
@@ -154,7 +154,7 @@
         <w:pStyle w:val="BodyText"/>
       </w:pPr>
       <w:r>
-        <w:t xml:space="preserve">We evaluate this design in a controlled public-data benchmark rather than treating the benchmark as an official data release. All candidates consume the same 100-m grid, common valid mask, annual class-count actions, hard exclusions and evaluator. The historical track uses observed target counts to isolate spatial allocation skill from demand error. The planning track starts from the observed 2024 state and applies three planner-supplied actions: moderate growth, green-priority growth and high outward growth. Abu Dhabi Plan 2030 provides an institutional planning context for discussing urban structure, but the numerical actions in this benchmark are not calibrated to that plan or to an official population forecast (Abu Dhabi Urban Planning Council, 2007). We ask four questions: whether the Kernel execution contract is auditable, whether its allocation skill is competitive, whether it produces feasible and spatially distinct allocations and which conclusions survive label and parameter sensitivity.</w:t>
+        <w:t xml:space="preserve">We evaluate this design in a controlled public-data benchmark rather than treating the benchmark as an official data release. All candidates consume the same 100-m grid, annual class-count actions, hard exclusions and evaluator. The historical track uses observed target counts to isolate spatial allocation skill from demand error. A matched protocol is run separately on Dynamic World and on an ArcGIS-served annual product so that dependence on the complete label-product pipeline is visible. The original planning track starts from the 2024 Dynamic World state; the refreshed track starts from the 2025 ArcGIS-served state. Both apply three planner-supplied actions: moderate growth, green-priority growth and high outward growth. Abu Dhabi Plan 2030 provides an institutional planning context for discussing urban structure, but the numerical actions are not calibrated to that plan or to an official population forecast (Abu Dhabi Urban Planning Council, 2007). We ask four questions: whether the Kernel execution contract is auditable, whether its allocation skill is competitive, whether comparative conclusions survive a change of land-cover product and whether the candidates produce feasible, spatially distinct scenario allocations.</w:t>
       </w:r>
     </w:p>
     <w:p>
@@ -162,7 +162,7 @@
         <w:pStyle w:val="BodyText"/>
       </w:pPr>
       <w:r>
-        <w:t xml:space="preserve">The paper makes three bounded contributions. First, it gives a concrete state–action–constraint formulation for using a geospatial kernel as an algorithmic core rather than as an opaque end-to-end predictor. Second, it defines an evaluation protocol that combines confidence-filter retention, expanding-window temporal tests, zero-model controls and external-product disagreement rather than relying on one favourable split. Third, it turns future maps into explicit stress-test artefacts, including cumulative rasters and vectorized transition footprints, while preserving the distinction between public-data land cover and authoritative legal land use.</w:t>
+        <w:t xml:space="preserve">The paper makes three bounded contributions. First, it gives a concrete state–action–constraint formulation for using a geospatial kernel as an algorithmic core rather than as an opaque end-to-end predictor. Second, it defines an evaluation protocol that combines expanding-window temporal tests, zero-model controls, spatial bootstrap contrasts and a whole-product-pipeline replication rather than relying on one favourable split. Third, it turns future maps into explicit stress-test artefacts, including cumulative rasters and vectorized transition footprints, while preserving the distinction between public-data land cover and authoritative legal land use.</w:t>
       </w:r>
     </w:p>
     <w:bookmarkEnd w:id="12"/>
@@ -348,7 +348,7 @@
         <w:pStyle w:val="FirstParagraph"/>
       </w:pPr>
       <w:r>
-        <w:t xml:space="preserve">The study boundary is the polygon returned for OpenStreetMap relation R4479763, representing Abu Dhabi city. All rasters were aligned to a canonical 100-m grid in EPSG:32640 with 475 columns and 360 rows. A cell was included when its centre fell within the city polygon and when the common public-data mask indicated valid coverage. The benchmark profile records the source geometry, raster transform, dimensions and SHA-256 hashes. The effective evaluation mask contains 79,726 cells.</w:t>
+        <w:t xml:space="preserve">The study boundary is the polygon returned for OpenStreetMap relation R4479763, representing Abu Dhabi city (OpenStreetMap contributors, 2026). All rasters were aligned to a canonical 100-m grid in EPSG:32640 with 475 columns and 360 rows. A cell was included when its centre fell within the city polygon and when the common public-data mask indicated valid coverage. The benchmark profile records the source geometry, raster transform, dimensions and SHA-256 hashes. The effective evaluation mask contains 79,726 cells.</w:t>
       </w:r>
     </w:p>
     <w:p>
@@ -356,7 +356,7 @@
         <w:pStyle w:val="BodyText"/>
       </w:pPr>
       <w:r>
-        <w:t xml:space="preserve">The observed sequence contains annual states for 2017–2024. Models were fit using the four transitions 2017→2018, 2018→2019, 2019→2020 and 2020→2021. A 2021→2022 transition was used for validation during model development. The historical test starts from 2022 and evaluates 2023 and 2024 in an open-loop rollout without observed-state writeback. The planning test starts from the observed 2024 state and recursively generates 2025–2031 under each scenario action.</w:t>
+        <w:t xml:space="preserve">The original Dynamic World sequence contains annual states for 2017–2024. Models were fit using the four transitions 2017→2018, 2018→2019, 2019→2020 and 2020→2021. A 2021→2022 transition was used for validation during model development. The original historical test starts from 2022 and evaluates 2023 and 2024 in an open-loop rollout without observed-state writeback. Its planning test starts from the observed 2024 state and recursively generates 2025–2031. The refreshed product track adds a separate annual sequence for 2017–2025, starts planning from its observed 2025 state and generates 2026–2031.</w:t>
       </w:r>
     </w:p>
     <w:p>
@@ -364,7 +364,7 @@
         <w:pStyle w:val="BodyText"/>
       </w:pPr>
       <w:r>
-        <w:t xml:space="preserve">An additional Geospatial Kernel analysis used four expanding one-step windows with origins in 2020–2023. For origin year</w:t>
+        <w:t xml:space="preserve">The leakage-controlled analysis used expanding one-step windows with origins in 2020–2023 for both products and an additional 2024 origin for the ArcGIS-served series. For origin year</w:t>
       </w:r>
       <w:r>
         <w:t xml:space="preserve"> </w:t>
@@ -375,7 +375,7 @@
         </m:r>
       </m:oMath>
       <w:r>
-        <w:t xml:space="preserve">, training included only transitions whose target year was at or before</w:t>
+        <w:t xml:space="preserve">, training included only observations available at or before</w:t>
       </w:r>
       <w:r>
         <w:t xml:space="preserve"> </w:t>
@@ -409,7 +409,7 @@
         <w:t xml:space="preserve"> </w:t>
       </w:r>
       <w:r>
-        <w:t xml:space="preserve">label was prohibited from feature construction and fitting. The held-out target supplied its observed class counts to the oracle-demand allocator and was then used for evaluation. This design isolates spatial allocation conditional on known demand and is not an end-to-end demand forecast. Early folds locked only origin-year water and wetland cells and omitted the two road-distance features, because applying the 2021 WorldCover proxy or the later OpenStreetMap snapshot to earlier folds would introduce future information. The resulting rolling proposal has 23 features. A machine-tested temporal firewall records the last training target, prediction target and permitted target-year uses for every run. The headline 2023–2024 analysis is less strict: it uses the OSM road snapshot accessed on 31 July 2026, which may include roads built after the corresponding prediction years (including after 2022). This snapshot is supplied symmetrically to all three pipelines, so it does not change their ordering, but it can affect absolute scores; the rolling-origin results are the strict no-road-snapshot boundary.</w:t>
+        <w:t xml:space="preserve">label was prohibited from feature construction, model fitting and GeoFM-LDN epoch selection. The target supplied only observed class totals for oracle allocation, evaluation labels and the common-coverage mask. This design isolates spatial allocation conditional on known demand and is not an end-to-end demand forecast. Each fold locked origin-year water and wetland cells and omitted the two road-distance features, because the available OpenStreetMap snapshot was accessed in 2026. Kernel consequently used 23 features and the FLUS-style track used the remaining five continuous drivers. A machine-tested temporal firewall records permitted target-year uses for every model, seed and fold. The two product tracks match the boundary, 100-m grid, model implementations, seeds, target-year protocol, oracle-action rule, evaluator and 1,000-resample 8 × 8-cell spatial bootstrap. Annual labels, origin states, oracle totals, origin water/wetland masks and quality semantics remain product specific; the experiment therefore tests the complete public-product pipelines rather than an isolated label substitution. The original 2023–2024 headline comparison is less strict because it uses the later road snapshot and remains a secondary unmatched-pipeline result.</w:t>
       </w:r>
     </w:p>
     <w:bookmarkEnd w:id="14"/>
@@ -427,7 +427,7 @@
         <w:pStyle w:val="FirstParagraph"/>
       </w:pPr>
       <w:r>
-        <w:t xml:space="preserve">Dynamic World V1 provides annual scene-argmax labels and mean top-class probabilities (Brown et al., 2022). The nine Dynamic World labels were crosswalked to six canonical classes: water (source 0), woody vegetation (1), low vegetation (2, 4 and 5), wetland (3), built (6) and bare (7). Source class 8 was excluded. The resulting label is explicitly treated as land cover. No residential, commercial or industrial category is inferred from the raster labels.</w:t>
+        <w:t xml:space="preserve">Dynamic World V1 provides annual scene-argmax labels and mean top-class probabilities (Brown et al., 2022). The nine Dynamic World labels were crosswalked to six canonical classes: water (source 0), woody vegetation (1), low vegetation (2, 4 and 5), wetland (3), built (6) and bare (7). Source class 8 was excluded.</w:t>
       </w:r>
     </w:p>
     <w:p>
@@ -435,7 +435,19 @@
         <w:pStyle w:val="BodyText"/>
       </w:pPr>
       <w:r>
-        <w:t xml:space="preserve">Annual 64-dimensional AlphaEarth embeddings were spatially averaged to the canonical grid and locally L2-normalized. Monthly VIIRS night-time-light radiance was averaged by year. Copernicus DEM supplied elevation and a finite-difference slope derivative. OpenStreetMap road geometries were rasterized into distance-to-road and distance-to-major-road surfaces. ESA WorldCover 2021 supplied public water and wetland/mangrove constraint proxies (Zanaga et al., 2022). All dynamic and static layers were checked for exact CRS, transform, width and height agreement.</w:t>
+        <w:t xml:space="preserve">The second sequence was materialized from the public ArcGIS ImageServer</w:t>
+      </w:r>
+      <w:r>
+        <w:t xml:space="preserve"> </w:t>
+      </w:r>
+      <w:r>
+        <w:rPr>
+          <w:rStyle w:val="VerbatimChar"/>
+        </w:rPr>
+        <w:t xml:space="preserve">Sentinel2_10m_LandCover</w:t>
+      </w:r>
+      <w:r>
+        <w:t xml:space="preserve">, whose metadata attributes the global annual series to Impact Observatory, Microsoft and Esri (Impact Observatory et al., 2026). Its Sentinel-2 classification lineage follows the deep-learning mapping approach described by Karra et al. (2021). Source values were mapped to water (1), woody vegetation (2), wetland (4), low vegetation (5 and 11), built (7) and bare (8); snow/ice (9) and cloud (10) were excluded. Native 10-m labels were retained for audit, then aggregated after crosswalking by majority among usable cells in each 10 × 10 block. The resulting majority fraction served as the ArcGIS-track aggregation-quality term; it is not equivalent to Dynamic World’s top-class probability. Both sequences are explicitly treated as public land cover. Neither provides residential, commercial or industrial land use, zoning, cadastral status or development approvals.</w:t>
       </w:r>
     </w:p>
     <w:p>
@@ -443,7 +455,45 @@
         <w:pStyle w:val="BodyText"/>
       </w:pPr>
       <w:r>
-        <w:t xml:space="preserve">For an external public-product diagnostic, the ESA WorldCover 2020 v1.0 and 2021 v2.0 built-up class (value 50) was converted to built fraction on each 100-m benchmark cell. Built presence was tested at fractions of 0.05, 0.10, 0.20 and 0.30. Built gain required a cell to cross from below to at or above the threshold; built loss used the reverse definition. Binary precision, recall, F1 and intersection over union were calculated for the Dynamic World transition and for the 2020-origin predictions. The original oracle-demand comparison uses Dynamic World 2021 built counts; because the built count decreases in this window, it cannot allocate any built gains and is a structural-zero, zero-power test of gain location. We therefore also supplied the WorldCover built-gain count as the action, ranked candidate cells with the 2020-origin Kernel proposal, and compared it with random allocation from the same candidate population. This count-controlled variant is the informative allocation diagnostic, but it remains product agreement rather than ground-truth validation: the two WorldCover years use different product versions, WorldCover and Dynamic World both derive from Sentinel observations, and neither represents statutory Abu Dhabi land use.</w:t>
+        <w:t xml:space="preserve">Annual 64-dimensional AlphaEarth embeddings were spatially averaged to the canonical grid and locally L2-normalized (Brown et al., 2025). Monthly</w:t>
+      </w:r>
+      <w:r>
+        <w:t xml:space="preserve"> </w:t>
+      </w:r>
+      <w:r>
+        <w:rPr>
+          <w:rStyle w:val="VerbatimChar"/>
+        </w:rPr>
+        <w:t xml:space="preserve">NOAA/VIIRS/DNB/MONTHLY_V1/VCMSLCFG</w:t>
+      </w:r>
+      <w:r>
+        <w:t xml:space="preserve"> </w:t>
+      </w:r>
+      <w:r>
+        <w:t xml:space="preserve">night-time-light radiance was averaged by year (Elvidge et al., 2021). The Copernicus DEM GLO-30</w:t>
+      </w:r>
+      <w:r>
+        <w:t xml:space="preserve"> </w:t>
+      </w:r>
+      <w:r>
+        <w:rPr>
+          <w:rStyle w:val="VerbatimChar"/>
+        </w:rPr>
+        <w:t xml:space="preserve">COPERNICUS/DEM/GLO30_2024_1</w:t>
+      </w:r>
+      <w:r>
+        <w:t xml:space="preserve"> </w:t>
+      </w:r>
+      <w:r>
+        <w:t xml:space="preserve">collection supplied elevation and a finite-difference slope derivative (European Space Agency, 2024). OpenStreetMap road geometries were rasterized into distance-to-road and distance-to-major-road surfaces. ESA WorldCover 2021 supplied public water and wetland/mangrove constraint proxies (Zanaga et al., 2022). All dynamic and static layers were checked for exact CRS, transform, width and height agreement.</w:t>
+      </w:r>
+    </w:p>
+    <w:p>
+      <w:pPr>
+        <w:pStyle w:val="BodyText"/>
+      </w:pPr>
+      <w:r>
+        <w:t xml:space="preserve">For an external public-product diagnostic, the ESA WorldCover 2020 v1.0 and 2021 v2.0 built-up class (value 50) was converted to built fraction on each 100-m benchmark cell (Zanaga et al., 2021, 2022). Built presence was tested at fractions of 0.05, 0.10, 0.20 and 0.30. Built gain required a cell to cross from below to at or above the threshold; built loss used the reverse definition. Binary precision, recall, F1 and intersection over union were calculated for the Dynamic World transition and for the 2020-origin predictions. The original oracle-demand comparison uses Dynamic World 2021 built counts; because the built count decreases in this window, it cannot allocate any built gains and is a structural-zero, zero-power test of gain location. We therefore also supplied the WorldCover built-gain count as the action, ranked candidate cells with the 2020-origin Kernel proposal, and compared it with random allocation from the same candidate population. This count-controlled variant is the informative allocation diagnostic, but it remains product agreement rather than ground-truth validation: the two WorldCover years use different product versions, WorldCover and Dynamic World both derive from Sentinel observations, and neither represents statutory Abu Dhabi land use.</w:t>
       </w:r>
     </w:p>
     <w:bookmarkEnd w:id="15"/>
@@ -876,7 +926,7 @@
         <w:t xml:space="preserve"> </w:t>
       </w:r>
       <w:r>
-        <w:t xml:space="preserve">contains 25 values: six one-hot current-class indicators; twelve neighbourhood proportions, comprising 3 × 3 and 7 × 7 windows for each of the six classes; and seven continuous variables, namely normalized row and column coordinates, clipped elevation, clipped slope, log-transformed VIIRS radiance, log distance to roads and log distance to major roads. A histogram gradient-boosting classifier estimates the six-class probability vector. It uses learning rate 0.08, 120 iterations, at most 31 leaf nodes, minimum leaf size 40 and L2 regularization 1.0.</w:t>
+        <w:t xml:space="preserve">contains 25 values: six one-hot current-class indicators; twelve neighbourhood proportions, comprising 3 × 3 and 7 × 7 windows for each of the six classes; and seven continuous variables, namely normalized row and column coordinates, clipped elevation, clipped slope, log-transformed VIIRS radiance, log distance to roads and log distance to major roads. A scikit-learn histogram gradient-boosting classifier estimates the six-class probability vector (Pedregosa et al., 2011). It uses learning rate 0.08, 120 iterations, at most 31 leaf nodes, minimum leaf size 40 and L2 regularization 1.0.</w:t>
       </w:r>
     </w:p>
     <w:p>
@@ -961,7 +1011,7 @@
         </m:r>
       </m:oMath>
       <w:r>
-        <w:t xml:space="preserve">, and a confidence factor,</w:t>
+        <w:t xml:space="preserve">, and a quality factor,</w:t>
       </w:r>
       <w:r>
         <w:t xml:space="preserve"> </w:t>
@@ -1035,7 +1085,7 @@
         </m:r>
       </m:oMath>
       <w:r>
-        <w:t xml:space="preserve">, where</w:t>
+        <w:t xml:space="preserve">. Here</w:t>
       </w:r>
       <w:r>
         <w:t xml:space="preserve"> </w:t>
@@ -1049,7 +1099,7 @@
         <w:t xml:space="preserve"> </w:t>
       </w:r>
       <w:r>
-        <w:t xml:space="preserve">is the Dynamic World mean top probability. The target years 2023 and 2024 are not used during fitting or model selection. Across the three seeds, each fitted model used 71,892–72,202 pixel rows and all six classes.</w:t>
+        <w:t xml:space="preserve">is Dynamic World mean top probability in the original track and the within-block majority fraction in the ArcGIS-served track. These terms have different semantics and are retained as parts of their respective product pipelines. A held-out target is never used during fitting or model selection.</w:t>
       </w:r>
     </w:p>
     <w:bookmarkEnd w:id="16"/>
@@ -1464,7 +1514,7 @@
         <w:t xml:space="preserve">paper-benchmark-flus-v1.1</w:t>
       </w:r>
       <w:r>
-        <w:t xml:space="preserve">) using seven continuous drivers: normalized row and column coordinates, elevation, slope, VIIRS radiance, distance to roads and distance to major roads. Its ANN suitability surface was passed to a cellular-automata allocation stage with the common class totals and public hard mask. The archived run used one 2021 training year, eight ANN hidden neurons, a 3 × 3 CA neighbourhood, neighbourhood strength 1.0, acceleration factor 0.1 and 1,000 iterations. Its frozen transition matrix protected water and wetland but did not prohibit built-to-non-built transitions. The algorithmic base is traceable to the GeoSOS team’s public FLUS source release (Liu et al., 2017; geosimulation.cn); the accompanying source repository</w:t>
+        <w:t xml:space="preserve">) using seven continuous drivers: normalized row and column coordinates, elevation, slope, VIIRS radiance, distance to roads and distance to major roads. Its ANN suitability surface was passed to a cellular-automata allocation stage with the common class totals and public hard mask. The archived run used one 2021 training year, eight ANN hidden neurons, a 3 × 3 CA neighbourhood, neighbourhood strength 1.0, acceleration factor 0.1 and 1,000 iterations. Its frozen transition matrix protected water and wetland but did not prohibit built-to-non-built transitions. The algorithmic base is traceable to the GeoSOS team’s public FLUS source release (Liu et al., 2017; GeoSOS team, n.d.); the accompanying source repository</w:t>
       </w:r>
       <w:r>
         <w:t xml:space="preserve"> </w:t>
@@ -1779,6 +1829,14 @@
         <w:pStyle w:val="BodyText"/>
       </w:pPr>
       <w:r>
+        <w:t xml:space="preserve">For the cross-product backtest, the FLUS-style suitability fit expanded from 2017 through the origin year, the Kernel transition fit ended at the origin, and GeoFM-LDN used only pre-origin label years for its decoder, pre-selection transitions for network fitting and the transition ending at the origin for epoch selection. All GeoFM-LDN folds were retrained for eight epochs at each seed rather than loading the original fixed checkpoints. The three learned candidates were evaluated alongside persistence and an exact-count random minimum-change allocator. Kernel, GeoFM-LDN and random allocation met feasible oracle class totals exactly; the finite-iteration FLUS-style CA retained any unmet demand as normalized demand total variation rather than receiving a post-hoc raster correction.</w:t>
+      </w:r>
+    </w:p>
+    <w:p>
+      <w:pPr>
+        <w:pStyle w:val="BodyText"/>
+      </w:pPr>
+      <w:r>
         <w:t xml:space="preserve">The common evaluator computes actual class counts, normalized demand total variation, hard-mask violations, strict multi-class change FoM, binary change FoM, change F1, overall accuracy and macro-F1 for historical runs. The strict FoM counts a hit only when the predicted destination class equals the observed destination class; wrong destination changes are retained in the denominator. It also generates persistence and minimum-change zero controls, spatial-block bootstrap intervals and paired model-difference intervals for strict FoM, overall accuracy and macro-F1. For planning runs it additionally computes ecological conversion, new-built neighbourhood fraction, new-built component counts, the union of 2024 built and newly built components, all-final-built component counts, a 500-m leapfrog rate, distances to roads and prior built cells, infrastructure proxy distance and built retirement. Pareto membership is calculated within each scenario over three release objectives: major-road distance, prior-built distance and union-built component density. Ecological conversion is retained as a descriptive public-data pressure proxy because it is structurally zero for the two exact-count allocators and therefore has no discriminating power in their comparison. Vegetation gain is a scenario input and remains descriptive, not an objective.</w:t>
       </w:r>
     </w:p>
@@ -1797,7 +1855,7 @@
         <w:pStyle w:val="FirstParagraph"/>
       </w:pPr>
       <w:r>
-        <w:t xml:space="preserve">The moderate-growth, green-priority-growth and high-outward-growth actions are stored in the tracked</w:t>
+        <w:t xml:space="preserve">The moderate-growth, green-priority-growth and high-outward-growth actions are stored in the tracked product-specific scenario manifests; the legacy</w:t>
       </w:r>
       <w:r>
         <w:t xml:space="preserve"> </w:t>
@@ -1806,28 +1864,13 @@
         <w:rPr>
           <w:rStyle w:val="VerbatimChar"/>
         </w:rPr>
-        <w:t xml:space="preserve">planning_scenarios_public_2025_2031.json</w:t>
-      </w:r>
-      <w:r>
-        <w:t xml:space="preserve"> </w:t>
-      </w:r>
-      <w:r>
-        <w:t xml:space="preserve">manifest; the legacy</w:t>
-      </w:r>
-      <w:r>
-        <w:t xml:space="preserve"> </w:t>
-      </w:r>
-      <w:r>
-        <w:rPr>
-          <w:rStyle w:val="VerbatimChar"/>
-        </w:rPr>
         <w:t xml:space="preserve">compact</w:t>
       </w:r>
       <w:r>
         <w:t xml:space="preserve"> </w:t>
       </w:r>
       <w:r>
-        <w:t xml:space="preserve">path identifier is retained only for artifact compatibility. Each action supplies feasible class totals for 2025–2031. The 2031 totals are an explicit extension of the previous annual difference and are not derived from an official population, housing or infrastructure forecast. Future exogenous rasters are held at their 2024 values. The green-priority action is not a water-budget model. Each candidate is run at seeds 31, 47 and 73, and planning tables report arithmetic means and population standard deviations. No p-values are reported because the three seeds describe computational variability, not independent field samples. The primary Pareto comparison is within each scenario, contrasting the three models under the same action; a global nine-candidate frontier is retained only as lineage. Sensitivity variants remove or add objective dimensions on the same released rasters. The objective set evolved through four review-driven revisions and was not preregistered: v1 mixed feasibility, action and outcome terms; v2 was not released; v3 used structurally problematic outcomes; and v4 still included scenario-supplied vegetation gain and all-built fragmentation. The current release is v6: road access, prior-built distance and union-built component density. Ecological conversion is reported as a diagnostic rather than a Pareto objective because it is structurally zero for the exact-count Kernel and GeoFM-LDN allocations. We treat v6 as a release objective set rather than a prespecified planning preference, and treat its sensitivity results as robustness diagnostics.</w:t>
+        <w:t xml:space="preserve">path identifier is retained only for artifact compatibility. It is not an endorsement of compact-city outcomes, which can have distributional trade-offs (Burton, 2000). Dynamic World-origin actions cover 2025–2031 and ArcGIS-origin actions cover 2026–2031. Their totals are explicit extensions of the preceding annual difference and are not derived from an official population, housing or infrastructure forecast. Future exogenous rasters are held at their respective final observed-year values. The green-priority action is not a water-budget model. Each candidate is run at seeds 31, 47 and 73, and planning tables report arithmetic means and population standard deviations. No p-values are reported because the three seeds describe computational variability, not independent field samples. The primary Pareto comparison is within each scenario, contrasting the three models under the same product-specific action; cross-product frontier membership is a sensitivity test, not a forecast-accuracy comparison. The current release objective set is road access, prior-built distance and union-built component density. Ecological conversion is reported as a diagnostic rather than a Pareto objective because it is structurally zero for the exact-count Kernel and GeoFM-LDN allocations. We treat this as a release objective set rather than a prespecified planning preference, and treat its variants as robustness diagnostics.</w:t>
       </w:r>
     </w:p>
     <w:bookmarkEnd w:id="19"/>
@@ -1845,42 +1888,12 @@
         <w:pStyle w:val="FirstParagraph"/>
       </w:pPr>
       <w:r>
-        <w:t xml:space="preserve">For each model–scenario pair, annual and cumulative differences from the 2024 raster are extracted as changed 100-m cells and dissolved into GeoPackage layers. The public delivery manifest covers 45 ensemble rasters for 2027–2031 and nine vector packages. The audit script reports</w:t>
-      </w:r>
-      <w:r>
-        <w:t xml:space="preserve"> </w:t>
-      </w:r>
-      <w:r>
-        <w:rPr>
-          <w:rStyle w:val="VerbatimChar"/>
-        </w:rPr>
-        <w:t xml:space="preserve">INCOMPLETE_INPUTS</w:t>
-      </w:r>
-      <w:r>
-        <w:t xml:space="preserve"> </w:t>
-      </w:r>
-      <w:r>
-        <w:t xml:space="preserve">or</w:t>
-      </w:r>
-      <w:r>
-        <w:t xml:space="preserve"> </w:t>
-      </w:r>
-      <w:r>
-        <w:rPr>
-          <w:rStyle w:val="VerbatimChar"/>
-        </w:rPr>
-        <w:t xml:space="preserve">FAIL</w:t>
-      </w:r>
-      <w:r>
-        <w:t xml:space="preserve"> </w:t>
-      </w:r>
-      <w:r>
-        <w:t xml:space="preserve">when source rasters, reports or vectors are absent; with the released public bundle, the input audit passed all alignment gates (with a Dynamic World label-noise warning) and the output audit passed 312 historical, rolling-origin and planning predictions plus two frozen WorldCover evidence rasters, with zero failures. The vector layers preserve raster-cell geometry and should not be interpreted as cadastral parcels.</w:t>
+        <w:t xml:space="preserve">For each model–scenario pair, annual and cumulative differences from the origin raster are extracted as changed 100-m cells and dissolved into GeoPackage layers. The Dynamic World-origin delivery manifest covers 45 ensemble rasters for 2027–2031 and nine vector packages. The ArcGIS-origin delivery contains 54 ensemble rasters for 2026–2031, nine multilayer GeoPackages and matching Shapefiles; a separate native-10-m GeoPackage records observed 2024→2025 product change. The audit scripts fail on missing source rasters, reports or vectors. Historical predictions and bootstrap reports for both product tracks retain per-file hashes and temporal-firewall declarations. The vector layers preserve raster-cell geometry and should not be interpreted as cadastral parcels.</w:t>
       </w:r>
     </w:p>
     <w:bookmarkEnd w:id="20"/>
     <w:bookmarkEnd w:id="21"/>
-    <w:bookmarkStart w:id="46" w:name="results"/>
+    <w:bookmarkStart w:id="50" w:name="results"/>
     <w:p>
       <w:pPr>
         <w:pStyle w:val="Heading2"/>
@@ -1903,7 +1916,7 @@
         <w:pStyle w:val="FirstParagraph"/>
       </w:pPr>
       <w:r>
-        <w:t xml:space="preserve">The benchmark covers the Abu Dhabi city polygon represented by OpenStreetMap relation R4479763. The canonical grid is a 475 × 360 lattice in EPSG:32640 at 100-m resolution. After the common coverage and alignment checks, 79,726 cells were used for scoring. Each cell represents 1 ha. Annual Dynamic World observations from 2017 to 2024 were harmonized to six land-cover classes: water, woody vegetation, low vegetation, wetland, built and bare. AlphaEarth annual embeddings, VIIRS night-time lights, Copernicus DEM derivatives and OpenStreetMap road distances supplied transition drivers. ESA WorldCover and public OpenStreetMap geometries supplied water, wetland and infrastructure exclusion proxies.</w:t>
+        <w:t xml:space="preserve">The benchmark covers the Abu Dhabi city polygon represented by OpenStreetMap relation R4479763. The canonical grid is a 475 × 360 lattice in EPSG:32640 at 100-m resolution. The original Dynamic World evaluation mask contains 79,726 cells and the ArcGIS-served track contains 79,775 cells before target-specific common-coverage checks. Each cell represents 1 ha. Both annual sequences were harmonized to six land-cover classes: water, woody vegetation, low vegetation, wetland, built and bare. AlphaEarth annual embeddings, VIIRS night-time lights, Copernicus DEM derivatives and OpenStreetMap road distances supplied transition drivers. ESA WorldCover and public OpenStreetMap geometries supplied water, wetland and infrastructure exclusion proxies.</w:t>
       </w:r>
     </w:p>
     <w:p>
@@ -2114,7 +2127,7 @@
         <w:pStyle w:val="BodyText"/>
       </w:pPr>
       <w:r>
-        <w:t xml:space="preserve">The planning track starts from the observed 2024 state and applies three</w:t>
+        <w:t xml:space="preserve">The original planning track starts from the observed 2024 state and applies three</w:t>
       </w:r>
       <w:r>
         <w:t xml:space="preserve"> </w:t>
@@ -2900,7 +2913,7 @@
       </w:r>
     </w:p>
     <w:bookmarkEnd w:id="29"/>
-    <w:bookmarkStart w:id="36" w:name="Xf35d2cefa3408bab7531e6b3ab4202296c65812"/>
+    <w:bookmarkStart w:id="33" w:name="Xf35d2cefa3408bab7531e6b3ab4202296c65812"/>
     <w:p>
       <w:pPr>
         <w:pStyle w:val="Heading3"/>
@@ -3282,108 +3295,212 @@
         <w:t xml:space="preserve">report records the exact paths and environment fields for the arm64 pair.</w:t>
       </w:r>
     </w:p>
+    <w:bookmarkEnd w:id="33"/>
+    <w:bookmarkStart w:id="40" w:name="Xca9386d477ada4c627d8a39106e79373e217705"/>
+    <w:p>
+      <w:pPr>
+        <w:pStyle w:val="Heading3"/>
+      </w:pPr>
+      <w:r>
+        <w:t xml:space="preserve">Cross-product replication changes measured model skill</w:t>
+      </w:r>
+    </w:p>
+    <w:p>
+      <w:pPr>
+        <w:pStyle w:val="FirstParagraph"/>
+      </w:pPr>
+      <w:r>
+        <w:t xml:space="preserve">The harmonized products disagree materially even before a model is fitted.</w:t>
+      </w:r>
+      <w:r>
+        <w:t xml:space="preserve"> </w:t>
+      </w:r>
+      <w:r>
+        <w:t xml:space="preserve">Across 2017–2024, same-year all-class agreement ranged from 0.651 to 0.745 and</w:t>
+      </w:r>
+      <w:r>
+        <w:t xml:space="preserve"> </w:t>
+      </w:r>
+      <w:r>
+        <w:t xml:space="preserve">built-class intersection over union from 0.320 to 0.449. In 2024, Dynamic World</w:t>
+      </w:r>
+      <w:r>
+        <w:t xml:space="preserve"> </w:t>
+      </w:r>
+      <w:r>
+        <w:t xml:space="preserve">mapped 155.98 km² of built land on the common grid, whereas the ArcGIS-served</w:t>
+      </w:r>
+      <w:r>
+        <w:t xml:space="preserve"> </w:t>
+      </w:r>
+      <w:r>
+        <w:t xml:space="preserve">Impact Observatory/Microsoft/Esri series mapped 335.57 km². The latter declined</w:t>
+      </w:r>
+      <w:r>
+        <w:t xml:space="preserve"> </w:t>
+      </w:r>
+      <w:r>
+        <w:t xml:space="preserve">to 327.31 km² in 2025. The added year improves the currency of the public origin</w:t>
+      </w:r>
+      <w:r>
+        <w:t xml:space="preserve"> </w:t>
+      </w:r>
+      <w:r>
+        <w:t xml:space="preserve">state, but neither the larger built stock nor the native 10-m pixel size</w:t>
+      </w:r>
+      <w:r>
+        <w:t xml:space="preserve"> </w:t>
+      </w:r>
+      <w:r>
+        <w:t xml:space="preserve">establishes greater local accuracy.</w:t>
+      </w:r>
+    </w:p>
     <w:p>
       <w:pPr>
         <w:pStyle w:val="BodyText"/>
       </w:pPr>
       <w:r>
-        <w:t xml:space="preserve">The planning compiler compares the three models within each of the three</w:t>
-      </w:r>
-      <w:r>
-        <w:t xml:space="preserve"> </w:t>
-      </w:r>
-      <w:r>
-        <w:t xml:space="preserve">scenarios. At 2031, the FLUS-style control has union-built component densities of</w:t>
-      </w:r>
-      <w:r>
-        <w:t xml:space="preserve"> </w:t>
-      </w:r>
-      <w:r>
-        <w:t xml:space="preserve">2.48–3.27 per 1,000 valid cells, the Kernel 2.92–4.28 and GeoFM-LDN 3.21–4.35.</w:t>
-      </w:r>
-      <w:r>
-        <w:t xml:space="preserve"> </w:t>
-      </w:r>
-      <w:r>
-        <w:t xml:space="preserve">The Kernel is closer to major roads and prior built cells, whereas the union</w:t>
-      </w:r>
-      <w:r>
-        <w:t xml:space="preserve"> </w:t>
-      </w:r>
-      <w:r>
-        <w:t xml:space="preserve">metric shows that this edge-filling pattern does not automatically imply lower</w:t>
-      </w:r>
-      <w:r>
-        <w:t xml:space="preserve"> </w:t>
-      </w:r>
-      <w:r>
-        <w:t xml:space="preserve">overall fragmentation than the FLUS-style allocations. Under the release</w:t>
-      </w:r>
-      <w:r>
-        <w:t xml:space="preserve"> </w:t>
-      </w:r>
-      <w:r>
-        <w:t xml:space="preserve">objective set, the within-scenario frontiers contain FLUS-style and Kernel</w:t>
-      </w:r>
-      <w:r>
-        <w:t xml:space="preserve"> </w:t>
-      </w:r>
-      <w:r>
-        <w:t xml:space="preserve">candidates in all three scenarios; GeoFM-LDN is dominated in each scenario.</w:t>
-      </w:r>
-      <w:r>
-        <w:t xml:space="preserve"> </w:t>
-      </w:r>
-      <w:r>
-        <w:t xml:space="preserve">In the preceding v5 formulation, GeoFM-LDN could appear non-dominated only</w:t>
-      </w:r>
-      <w:r>
-        <w:t xml:space="preserve"> </w:t>
-      </w:r>
-      <w:r>
-        <w:t xml:space="preserve">because its ecological-conversion value was the same structural zero as the</w:t>
-      </w:r>
-      <w:r>
-        <w:t xml:space="preserve"> </w:t>
-      </w:r>
-      <w:r>
-        <w:t xml:space="preserve">exact-count Kernel; that zero is not a model advantage. Ecological conversion</w:t>
-      </w:r>
-      <w:r>
-        <w:t xml:space="preserve"> </w:t>
-      </w:r>
-      <w:r>
-        <w:t xml:space="preserve">is therefore retained only as a diagnostic in v6. All sensitivity variants</w:t>
-      </w:r>
-      <w:r>
-        <w:t xml:space="preserve"> </w:t>
-      </w:r>
-      <w:r>
-        <w:t xml:space="preserve">retain the same FLUS-style/Kernel two-model frontier. These statements are</w:t>
-      </w:r>
-      <w:r>
-        <w:t xml:space="preserve"> </w:t>
-      </w:r>
-      <w:r>
-        <w:t xml:space="preserve">conditional on public proxy layers and synthetic actions, not model superiority</w:t>
-      </w:r>
-      <w:r>
-        <w:t xml:space="preserve"> </w:t>
-      </w:r>
-      <w:r>
-        <w:t xml:space="preserve">claims.</w:t>
-      </w:r>
-      <w:r>
-        <w:t xml:space="preserve"> </w:t>
-      </w:r>
-      <w:r>
-        <w:t xml:space="preserve">The corresponding objective profiles and diagnostic trade-offs are shown in</w:t>
-      </w:r>
-      <w:r>
-        <w:t xml:space="preserve"> </w:t>
-      </w:r>
-      <w:r>
-        <w:t xml:space="preserve">Fig. 4.</w:t>
+        <w:t xml:space="preserve">Under the leakage-controlled matched protocol, Geospatial Kernel had the</w:t>
+      </w:r>
+      <w:r>
+        <w:t xml:space="preserve"> </w:t>
+      </w:r>
+      <w:r>
+        <w:t xml:space="preserve">largest mean strict FoM in all four Dynamic World targets (0.2595, 0.0724,</w:t>
+      </w:r>
+      <w:r>
+        <w:t xml:space="preserve"> </w:t>
+      </w:r>
+      <w:r>
+        <w:t xml:space="preserve">0.2116 and 0.1816 for 2021–2024), but in only two of the four matched</w:t>
+      </w:r>
+      <w:r>
+        <w:t xml:space="preserve"> </w:t>
+      </w:r>
+      <w:r>
+        <w:t xml:space="preserve">ArcGIS-served targets. FLUS-style ANN–CA led the ArcGIS-served 2021 target</w:t>
+      </w:r>
+      <w:r>
+        <w:t xml:space="preserve"> </w:t>
+      </w:r>
+      <w:r>
+        <w:t xml:space="preserve">(0.0625 versus Kernel 0.0154 and GeoFM-LDN 0.0314), GeoFM-LDN led in 2022</w:t>
+      </w:r>
+      <w:r>
+        <w:t xml:space="preserve"> </w:t>
+      </w:r>
+      <w:r>
+        <w:t xml:space="preserve">(0.4488 versus 0.2775 and 0.2227), and Kernel numerically led in 2023 and 2024</w:t>
+      </w:r>
+      <w:r>
+        <w:t xml:space="preserve"> </w:t>
+      </w:r>
+      <w:r>
+        <w:t xml:space="preserve">(0.1619 and 0.1674). The Kernel-minus-random paired spatial-block interval</w:t>
+      </w:r>
+      <w:r>
+        <w:t xml:space="preserve"> </w:t>
+      </w:r>
+      <w:r>
+        <w:t xml:space="preserve">excluded zero in every ArcGIS-served year and seed, including the additional</w:t>
+      </w:r>
+      <w:r>
+        <w:t xml:space="preserve"> </w:t>
+      </w:r>
+      <w:r>
+        <w:t xml:space="preserve">2025 target, but its ArcGIS-minus-Dynamic World mean FoM difference was -0.244,</w:t>
+      </w:r>
+      <w:r>
+        <w:t xml:space="preserve"> </w:t>
+      </w:r>
+      <w:r>
+        <w:t xml:space="preserve">+0.205, -0.050 and -0.014 across the four matched years. Thus the learned</w:t>
+      </w:r>
+      <w:r>
+        <w:t xml:space="preserve"> </w:t>
+      </w:r>
+      <w:r>
+        <w:t xml:space="preserve">allocator contains repeatable spatial signal relative to its zero model, while</w:t>
+      </w:r>
+      <w:r>
+        <w:t xml:space="preserve"> </w:t>
+      </w:r>
+      <w:r>
+        <w:t xml:space="preserve">its absolute score and rank remain dependent on the product pipeline. The</w:t>
+      </w:r>
+      <w:r>
+        <w:t xml:space="preserve"> </w:t>
+      </w:r>
+      <w:r>
+        <w:t xml:space="preserve">finite-iteration FLUS-style CA retained demand total variation up to 0.00153 in</w:t>
+      </w:r>
+      <w:r>
+        <w:t xml:space="preserve"> </w:t>
+      </w:r>
+      <w:r>
+        <w:t xml:space="preserve">the ArcGIS-served track and 0.00415 in Dynamic World; the exact-count Kernel,</w:t>
+      </w:r>
+      <w:r>
+        <w:t xml:space="preserve"> </w:t>
+      </w:r>
+      <w:r>
+        <w:t xml:space="preserve">GeoFM-LDN and random allocators had zero demand error by construction.</w:t>
+      </w:r>
+      <w:r>
+        <w:t xml:space="preserve"> </w:t>
+      </w:r>
+      <w:r>
+        <w:t xml:space="preserve">Supplementary Table S6 reports all target years and product-agreement values.</w:t>
+      </w:r>
+    </w:p>
+    <w:p>
+      <w:pPr>
+        <w:pStyle w:val="BodyText"/>
+      </w:pPr>
+      <w:r>
+        <w:t xml:space="preserve">The planning conclusion was more stable than the historical ranking. Recomputing</w:t>
+      </w:r>
+      <w:r>
+        <w:t xml:space="preserve"> </w:t>
+      </w:r>
+      <w:r>
+        <w:t xml:space="preserve">the same three-objective Pareto rule on each product-specific 2031 scenario</w:t>
+      </w:r>
+      <w:r>
+        <w:t xml:space="preserve"> </w:t>
+      </w:r>
+      <w:r>
+        <w:t xml:space="preserve">bundle retained FLUS-style and Kernel candidates, and excluded GeoFM-LDN, in</w:t>
+      </w:r>
+      <w:r>
+        <w:t xml:space="preserve"> </w:t>
+      </w:r>
+      <w:r>
+        <w:t xml:space="preserve">all three scenarios. This does not validate either future bundle; it shows only</w:t>
+      </w:r>
+      <w:r>
+        <w:t xml:space="preserve"> </w:t>
+      </w:r>
+      <w:r>
+        <w:t xml:space="preserve">that frontier membership was insensitive to this particular public-product</w:t>
+      </w:r>
+      <w:r>
+        <w:t xml:space="preserve"> </w:t>
+      </w:r>
+      <w:r>
+        <w:t xml:space="preserve">replacement under the released proxy objectives. Fig. 4 separates changes in</w:t>
+      </w:r>
+      <w:r>
+        <w:t xml:space="preserve"> </w:t>
+      </w:r>
+      <w:r>
+        <w:t xml:space="preserve">mapped stock, same-year product agreement, ArcGIS-served historical skill and</w:t>
+      </w:r>
+      <w:r>
+        <w:t xml:space="preserve"> </w:t>
+      </w:r>
+      <w:r>
+        <w:t xml:space="preserve">the matched product difference.</w:t>
       </w:r>
     </w:p>
     <w:p>
@@ -3393,20 +3510,179 @@
       <w:r>
         <w:drawing>
           <wp:inline>
-            <wp:extent cx="5334000" cy="2431159"/>
+            <wp:extent cx="5334000" cy="4641981"/>
             <wp:effectExtent b="0" l="0" r="0" t="0"/>
-            <wp:docPr descr="Conditional planning objectives. The 2031 outcomes compare the three models under moderate-growth, green-priority-growth and high-outward-growth actions. Panels show the three release objectives: distance to major roads, distance to pre-existing built cells, and connected components in the combined 2024-built and newly built footprint. Black outlines indicate membership of the within-scenario Pareto frontier." title="" id="34" name="Picture"/>
+            <wp:docPr descr="Land-cover product robustness. Panel a compares annual mapped built area; only the ArcGIS-served Impact Observatory/Microsoft/Esri series extends to 2025. Panel b reports same-year all-class agreement and built-class intersection over union after six-class harmonization at 100 m. Panel c reports strict destination-change FoM for the ArcGIS-served expanding-window backtest; points are three-seed means and whiskers are population standard deviations. Panel d gives the ArcGIS-served-minus-Dynamic World mean FoM for the four matched one-step targets. All models omit the later road snapshot. Product-specific labels, origin states, oracle totals, origin water/wetland masks and quality semantics are retained, so this is a whole-product-pipeline test rather than authoritative validation. Source data are provided in source_data_fig04_product_robustness.csv." title="" id="35" name="Picture"/>
             <a:graphic>
               <a:graphicData uri="http://schemas.openxmlformats.org/drawingml/2006/picture">
                 <pic:pic>
                   <pic:nvPicPr>
-                    <pic:cNvPr descr="figures/fig04_planning_objectives.png" id="35" name="Picture"/>
+                    <pic:cNvPr descr="figures/fig04_product_robustness.png" id="36" name="Picture"/>
                     <pic:cNvPicPr>
                       <a:picLocks noChangeArrowheads="1" noChangeAspect="1"/>
                     </pic:cNvPicPr>
                   </pic:nvPicPr>
                   <pic:blipFill>
-                    <a:blip r:embed="rId33"/>
+                    <a:blip r:embed="rId34"/>
+                    <a:stretch>
+                      <a:fillRect/>
+                    </a:stretch>
+                  </pic:blipFill>
+                  <pic:spPr bwMode="auto">
+                    <a:xfrm>
+                      <a:off x="0" y="0"/>
+                      <a:ext cx="5334000" cy="4641981"/>
+                    </a:xfrm>
+                    <a:prstGeom prst="rect">
+                      <a:avLst/>
+                    </a:prstGeom>
+                    <a:noFill/>
+                    <a:ln w="9525">
+                      <a:noFill/>
+                      <a:headEnd/>
+                      <a:tailEnd/>
+                    </a:ln>
+                  </pic:spPr>
+                </pic:pic>
+              </a:graphicData>
+            </a:graphic>
+          </wp:inline>
+        </w:drawing>
+      </w:r>
+    </w:p>
+    <w:p>
+      <w:pPr>
+        <w:pStyle w:val="ImageCaption"/>
+      </w:pPr>
+      <w:r>
+        <w:t xml:space="preserve">Land-cover product robustness. Panel a compares annual mapped built area; only the ArcGIS-served Impact Observatory/Microsoft/Esri series extends to 2025. Panel b reports same-year all-class agreement and built-class intersection over union after six-class harmonization at 100 m. Panel c reports strict destination-change FoM for the ArcGIS-served expanding-window backtest; points are three-seed means and whiskers are population standard deviations. Panel d gives the ArcGIS-served-minus-Dynamic World mean FoM for the four matched one-step targets. All models omit the later road snapshot. Product-specific labels, origin states, oracle totals, origin water/wetland masks and quality semantics are retained, so this is a whole-product-pipeline test rather than authoritative validation. Source data are provided in source_data_fig04_product_robustness.csv.</w:t>
+      </w:r>
+    </w:p>
+    <w:p>
+      <w:pPr>
+        <w:pStyle w:val="BodyText"/>
+      </w:pPr>
+      <w:r>
+        <w:t xml:space="preserve">The planning compiler compares the three models within each of the three</w:t>
+      </w:r>
+      <w:r>
+        <w:t xml:space="preserve"> </w:t>
+      </w:r>
+      <w:r>
+        <w:t xml:space="preserve">scenarios. At 2031, the FLUS-style control has union-built component densities of</w:t>
+      </w:r>
+      <w:r>
+        <w:t xml:space="preserve"> </w:t>
+      </w:r>
+      <w:r>
+        <w:t xml:space="preserve">2.48–3.27 per 1,000 valid cells, the Kernel 2.92–4.28 and GeoFM-LDN 3.21–4.35.</w:t>
+      </w:r>
+      <w:r>
+        <w:t xml:space="preserve"> </w:t>
+      </w:r>
+      <w:r>
+        <w:t xml:space="preserve">The Kernel is closer to major roads and prior built cells, whereas the union</w:t>
+      </w:r>
+      <w:r>
+        <w:t xml:space="preserve"> </w:t>
+      </w:r>
+      <w:r>
+        <w:t xml:space="preserve">metric shows that this edge-filling pattern does not automatically imply lower</w:t>
+      </w:r>
+      <w:r>
+        <w:t xml:space="preserve"> </w:t>
+      </w:r>
+      <w:r>
+        <w:t xml:space="preserve">overall fragmentation than the FLUS-style allocations. Under the release</w:t>
+      </w:r>
+      <w:r>
+        <w:t xml:space="preserve"> </w:t>
+      </w:r>
+      <w:r>
+        <w:t xml:space="preserve">objective set, the within-scenario frontiers contain FLUS-style and Kernel</w:t>
+      </w:r>
+      <w:r>
+        <w:t xml:space="preserve"> </w:t>
+      </w:r>
+      <w:r>
+        <w:t xml:space="preserve">candidates in all three scenarios; GeoFM-LDN is dominated in each scenario.</w:t>
+      </w:r>
+      <w:r>
+        <w:t xml:space="preserve"> </w:t>
+      </w:r>
+      <w:r>
+        <w:t xml:space="preserve">In the preceding v5 formulation, GeoFM-LDN could appear non-dominated only</w:t>
+      </w:r>
+      <w:r>
+        <w:t xml:space="preserve"> </w:t>
+      </w:r>
+      <w:r>
+        <w:t xml:space="preserve">because its ecological-conversion value was the same structural zero as the</w:t>
+      </w:r>
+      <w:r>
+        <w:t xml:space="preserve"> </w:t>
+      </w:r>
+      <w:r>
+        <w:t xml:space="preserve">exact-count Kernel; that zero is not a model advantage. Ecological conversion</w:t>
+      </w:r>
+      <w:r>
+        <w:t xml:space="preserve"> </w:t>
+      </w:r>
+      <w:r>
+        <w:t xml:space="preserve">is therefore retained only as a diagnostic in v6. All sensitivity variants</w:t>
+      </w:r>
+      <w:r>
+        <w:t xml:space="preserve"> </w:t>
+      </w:r>
+      <w:r>
+        <w:t xml:space="preserve">retain the same FLUS-style/Kernel two-model frontier. These statements are</w:t>
+      </w:r>
+      <w:r>
+        <w:t xml:space="preserve"> </w:t>
+      </w:r>
+      <w:r>
+        <w:t xml:space="preserve">conditional on public proxy layers and synthetic actions, not model superiority</w:t>
+      </w:r>
+      <w:r>
+        <w:t xml:space="preserve"> </w:t>
+      </w:r>
+      <w:r>
+        <w:t xml:space="preserve">claims.</w:t>
+      </w:r>
+      <w:r>
+        <w:t xml:space="preserve"> </w:t>
+      </w:r>
+      <w:r>
+        <w:t xml:space="preserve">The corresponding objective profiles and diagnostic trade-offs are shown in</w:t>
+      </w:r>
+      <w:r>
+        <w:t xml:space="preserve"> </w:t>
+      </w:r>
+      <w:r>
+        <w:t xml:space="preserve">Fig. 5.</w:t>
+      </w:r>
+    </w:p>
+    <w:p>
+      <w:pPr>
+        <w:pStyle w:val="CaptionedFigure"/>
+      </w:pPr>
+      <w:r>
+        <w:drawing>
+          <wp:inline>
+            <wp:extent cx="5334000" cy="2431159"/>
+            <wp:effectExtent b="0" l="0" r="0" t="0"/>
+            <wp:docPr descr="Conditional planning objectives. The 2031 outcomes compare the three models under moderate-growth, green-priority-growth and high-outward-growth actions. Panels show the three release objectives: distance to major roads, distance to pre-existing built cells, and connected components in the combined 2024-built and newly built footprint. Black outlines indicate membership of the within-scenario Pareto frontier." title="" id="38" name="Picture"/>
+            <a:graphic>
+              <a:graphicData uri="http://schemas.openxmlformats.org/drawingml/2006/picture">
+                <pic:pic>
+                  <pic:nvPicPr>
+                    <pic:cNvPr descr="figures/fig04_planning_objectives.png" id="39" name="Picture"/>
+                    <pic:cNvPicPr>
+                      <a:picLocks noChangeArrowheads="1" noChangeAspect="1"/>
+                    </pic:cNvPicPr>
+                  </pic:nvPicPr>
+                  <pic:blipFill>
+                    <a:blip r:embed="rId37"/>
                     <a:stretch>
                       <a:fillRect/>
                     </a:stretch>
@@ -4410,8 +4686,8 @@
         </w:tc>
       </w:tr>
     </w:tbl>
-    <w:bookmarkEnd w:id="36"/>
-    <w:bookmarkStart w:id="37" w:name="Xcd70f225f45b9532756a485fa8bec6f5eb5ebdb"/>
+    <w:bookmarkEnd w:id="40"/>
+    <w:bookmarkStart w:id="41" w:name="Xcd70f225f45b9532756a485fa8bec6f5eb5ebdb"/>
     <w:p>
       <w:pPr>
         <w:pStyle w:val="Heading3"/>
@@ -4425,7 +4701,7 @@
         <w:pStyle w:val="FirstParagraph"/>
       </w:pPr>
       <w:r>
-        <w:t xml:space="preserve">The base Kernel allocation score adds a 7 × 7 target-class neighbourhood fraction with weight 0.35. The existing sensitivity and mechanism artefacts are retained as diagnostic controls; they do not identify a causal effect because the proposal features and allocator both contain spatial context. The neighbourhood term is therefore interpreted as evidence about the execution mechanism, not as an independently estimated planning preference. Fig. 5A shows focused proposal controls, and Fig. 5B reports the matched runtime controls.</w:t>
+        <w:t xml:space="preserve">The base Kernel allocation score adds a 7 × 7 target-class neighbourhood fraction with weight 0.35. The existing sensitivity and mechanism artefacts are retained as diagnostic controls; they do not identify a causal effect because the proposal features and allocator both contain spatial context. The neighbourhood term is therefore interpreted as evidence about the execution mechanism, not as an independently estimated planning preference. Fig. 6A shows focused proposal controls, and Fig. 6B reports the matched runtime controls.</w:t>
       </w:r>
     </w:p>
     <w:p>
@@ -4478,8 +4754,8 @@
         <w:t xml:space="preserve">release objectives.</w:t>
       </w:r>
     </w:p>
-    <w:bookmarkEnd w:id="37"/>
-    <w:bookmarkStart w:id="41" w:name="Xb4da06261b5a2056ba43f7c28dc24c9379bfe9e"/>
+    <w:bookmarkEnd w:id="41"/>
+    <w:bookmarkStart w:id="45" w:name="Xb4da06261b5a2056ba43f7c28dc24c9379bfe9e"/>
     <w:p>
       <w:pPr>
         <w:pStyle w:val="Heading3"/>
@@ -4565,18 +4841,18 @@
           <wp:inline>
             <wp:extent cx="5334000" cy="2478180"/>
             <wp:effectExtent b="0" l="0" r="0" t="0"/>
-            <wp:docPr descr="Mechanism controls. Panel A compares the full transition proposal with selected proposal controls. Panel B gives the strict destination-change FoM difference between matched runtime controls and the full Kernel. Bars show mean plus or minus population standard deviation across the three frozen seeds. The no-state-writeback control is undefined for the 2023 one-step target and is therefore shown only for 2024. These are execution diagnostics, not causal policy experiments." title="" id="39" name="Picture"/>
+            <wp:docPr descr="Mechanism controls. Panel A compares the full transition proposal with selected proposal controls. Panel B gives the strict destination-change FoM difference between matched runtime controls and the full Kernel. Bars show mean plus or minus population standard deviation across the three frozen seeds. The no-state-writeback control is undefined for the 2023 one-step target and is therefore shown only for 2024. These are execution diagnostics, not causal policy experiments." title="" id="43" name="Picture"/>
             <a:graphic>
               <a:graphicData uri="http://schemas.openxmlformats.org/drawingml/2006/picture">
                 <pic:pic>
                   <pic:nvPicPr>
-                    <pic:cNvPr descr="figures/fig05_mechanism_ablation.png" id="40" name="Picture"/>
+                    <pic:cNvPr descr="figures/fig05_mechanism_ablation.png" id="44" name="Picture"/>
                     <pic:cNvPicPr>
                       <a:picLocks noChangeArrowheads="1" noChangeAspect="1"/>
                     </pic:cNvPicPr>
                   </pic:nvPicPr>
                   <pic:blipFill>
-                    <a:blip r:embed="rId38"/>
+                    <a:blip r:embed="rId42"/>
                     <a:stretch>
                       <a:fillRect/>
                     </a:stretch>
@@ -4611,8 +4887,8 @@
         <w:t xml:space="preserve">Mechanism controls. Panel A compares the full transition proposal with selected proposal controls. Panel B gives the strict destination-change FoM difference between matched runtime controls and the full Kernel. Bars show mean plus or minus population standard deviation across the three frozen seeds. The no-state-writeback control is undefined for the 2023 one-step target and is therefore shown only for 2024. These are execution diagnostics, not causal policy experiments.</w:t>
       </w:r>
     </w:p>
-    <w:bookmarkEnd w:id="41"/>
-    <w:bookmarkStart w:id="45" w:name="Xda759c8571f7c32c55e24e08b791bff6f7b5747"/>
+    <w:bookmarkEnd w:id="45"/>
+    <w:bookmarkStart w:id="49" w:name="Xda759c8571f7c32c55e24e08b791bff6f7b5747"/>
     <w:p>
       <w:pPr>
         <w:pStyle w:val="Heading3"/>
@@ -4668,7 +4944,7 @@
         <w:t xml:space="preserve"> </w:t>
       </w:r>
       <w:r>
-        <w:t xml:space="preserve">two frozen WorldCover evidence rasters passed the evidence audit. Fig. 6 uses the high-outward</w:t>
+        <w:t xml:space="preserve">two frozen WorldCover evidence rasters passed the evidence audit. Fig. 7 uses the high-outward</w:t>
       </w:r>
       <w:r>
         <w:t xml:space="preserve"> </w:t>
@@ -4698,18 +4974,18 @@
           <wp:inline>
             <wp:extent cx="5334000" cy="4712835"/>
             <wp:effectExtent b="0" l="0" r="0" t="0"/>
-            <wp:docPr descr="High-outward-growth spatial footprints. The observed 2024 state is compared with each model’s 2031 majority-vote ensemble. Orange denotes cells newly built between 2024 and 2031; grey denotes cells already built in 2024. The map is a 100-m scenario stress-test product, not a cadastral or statutory land-use map." title="" id="43" name="Picture"/>
+            <wp:docPr descr="High-outward-growth spatial footprints. The observed 2024 state is compared with each model’s 2031 majority-vote ensemble. Orange denotes cells newly built between 2024 and 2031; grey denotes cells already built in 2024. The map is a 100-m scenario stress-test product, not a cadastral or statutory land-use map." title="" id="47" name="Picture"/>
             <a:graphic>
               <a:graphicData uri="http://schemas.openxmlformats.org/drawingml/2006/picture">
                 <pic:pic>
                   <pic:nvPicPr>
-                    <pic:cNvPr descr="figures/fig06_planning_maps_2031.png" id="44" name="Picture"/>
+                    <pic:cNvPr descr="figures/fig06_planning_maps_2031.png" id="48" name="Picture"/>
                     <pic:cNvPicPr>
                       <a:picLocks noChangeArrowheads="1" noChangeAspect="1"/>
                     </pic:cNvPicPr>
                   </pic:nvPicPr>
                   <pic:blipFill>
-                    <a:blip r:embed="rId42"/>
+                    <a:blip r:embed="rId46"/>
                     <a:stretch>
                       <a:fillRect/>
                     </a:stretch>
@@ -4744,9 +5020,9 @@
         <w:t xml:space="preserve">High-outward-growth spatial footprints. The observed 2024 state is compared with each model’s 2031 majority-vote ensemble. Orange denotes cells newly built between 2024 and 2031; grey denotes cells already built in 2024. The map is a 100-m scenario stress-test product, not a cadastral or statutory land-use map.</w:t>
       </w:r>
     </w:p>
-    <w:bookmarkEnd w:id="45"/>
-    <w:bookmarkEnd w:id="46"/>
-    <w:bookmarkStart w:id="47" w:name="discussion"/>
+    <w:bookmarkEnd w:id="49"/>
+    <w:bookmarkEnd w:id="50"/>
+    <w:bookmarkStart w:id="51" w:name="discussion"/>
     <w:p>
       <w:pPr>
         <w:pStyle w:val="Heading2"/>
@@ -4760,7 +5036,7 @@
         <w:pStyle w:val="FirstParagraph"/>
       </w:pPr>
       <w:r>
-        <w:t xml:space="preserve">This study positions Geospatial Kernel as a candidate execution layer for constrained spatial reasoning and, more broadly, proposes an audit protocol for noisy annual labels. The defensible contribution is that a transition proposal and a planning admission rule can be represented and inspected separately. Under the unmatched public-data pipeline, Geospatial Kernel has the largest strict transition FoM at the one-step horizon, while GeoFM-LDN has the largest value after recursive two-step rollout. In the separate rolling analysis, Kernel exceeds both zero models in all four one-step windows, but its score varies from 0.0724 to 0.2595 after excluding the later road snapshot. The WorldCover diagnostic does not provide a blanket external validation: the original Dynamic World-count gain comparison is structurally zero-powered because the observed built count declines. The count-controlled variant remains near opportunity-level agreement overall: Kernel is below random at 0.05, indistinguishable from random at 0.10–0.20 given three-seed variation, and above random only at 0.30. The low-threshold deficit is consistent with WorldCover’s sparse or road-edge cells just above the 5% built-fraction threshold being inconsistently represented by Dynamic World. Confidence filtering, rolling-window stability and external-product agreement are different tests, and none substitutes for authoritative local validation. We therefore treat the planning frontier as conditional on public proxy objectives and synthetic actions.</w:t>
+        <w:t xml:space="preserve">This study positions Geospatial Kernel as a candidate execution layer for constrained spatial reasoning and, more broadly, proposes an audit protocol for annual label-product uncertainty. The defensible contribution is that a transition proposal and a planning admission rule can be represented and inspected separately even when the observational product changes. Kernel exceeded the random minimum-change control in every Dynamic World and ArcGIS-served expanding-window fold, but product replacement changed its absolute FoM by as much as 0.244 downward and 0.205 upward and changed which learned model ranked first. The original unmatched 2023–2024 result is therefore supporting evidence, not a universal ordering. By contrast, the released three-objective planning frontiers retained FLUS-style and Kernel candidates across both product-specific scenario bundles. Historical allocation skill and conditional planning-objective membership are different robustness questions; neither is a test of statutory forecast accuracy.</w:t>
       </w:r>
     </w:p>
     <w:p>
@@ -4768,37 +5044,63 @@
         <w:pStyle w:val="BodyText"/>
       </w:pPr>
       <w:r>
+        <w:t xml:space="preserve">The WorldCover diagnostic also does not provide blanket external validation: the original Dynamic World-count gain comparison is structurally zero-powered because the observed built count declines. Its count-controlled variant remains near opportunity-level agreement overall: Kernel is below random at 0.05, indistinguishable from random at 0.10–0.20 given three-seed variation, and above random only at 0.30. The low-threshold deficit is consistent with WorldCover’s sparse or road-edge cells just above the 5% built-fraction threshold being inconsistently represented by Dynamic World. Confidence filtering, rolling-window stability, WorldCover agreement and the new complete-product replication test different failure modes. None substitutes for authoritative local validation.</w:t>
+      </w:r>
+    </w:p>
+    <w:p>
+      <w:pPr>
+        <w:pStyle w:val="BodyText"/>
+      </w:pPr>
+      <w:r>
         <w:t xml:space="preserve">The evidence remains bounded. The six classes are remote-sensing land cover, not</w:t>
       </w:r>
       <w:r>
         <w:t xml:space="preserve"> </w:t>
       </w:r>
       <w:r>
-        <w:t xml:space="preserve">statutory residential, commercial or industrial land use. Dynamic World labels</w:t>
-      </w:r>
-      <w:r>
-        <w:t xml:space="preserve"> </w:t>
-      </w:r>
-      <w:r>
-        <w:t xml:space="preserve">show substantial annual uncertainty and apparent turnover; the available</w:t>
-      </w:r>
-      <w:r>
-        <w:t xml:space="preserve"> </w:t>
-      </w:r>
-      <w:r>
-        <w:t xml:space="preserve">2020–2021 WorldCover diagnostic is neither fully independent nor authoritative,</w:t>
-      </w:r>
-      <w:r>
-        <w:t xml:space="preserve"> </w:t>
-      </w:r>
-      <w:r>
-        <w:t xml:space="preserve">and no external 2023–2024 change product or observed 2025–2031 labels was</w:t>
-      </w:r>
-      <w:r>
-        <w:t xml:space="preserve"> </w:t>
-      </w:r>
-      <w:r>
-        <w:t xml:space="preserve">available. The headline analysis also uses a 31 July 2026 OSM road snapshot,</w:t>
+        <w:t xml:space="preserve">statutory residential, commercial or industrial land use. Dynamic World and the</w:t>
+      </w:r>
+      <w:r>
+        <w:t xml:space="preserve"> </w:t>
+      </w:r>
+      <w:r>
+        <w:t xml:space="preserve">ArcGIS-served series are both global products derived from Sentinel observations;</w:t>
+      </w:r>
+      <w:r>
+        <w:t xml:space="preserve"> </w:t>
+      </w:r>
+      <w:r>
+        <w:t xml:space="preserve">their disagreement does not identify which label is correct. Product-native</w:t>
+      </w:r>
+      <w:r>
+        <w:t xml:space="preserve"> </w:t>
+      </w:r>
+      <w:r>
+        <w:t xml:space="preserve">quality terms and origin-year water/wetland masks also differ, so the replication</w:t>
+      </w:r>
+      <w:r>
+        <w:t xml:space="preserve"> </w:t>
+      </w:r>
+      <w:r>
+        <w:t xml:space="preserve">measures complete pipeline dependence rather than a causal effect of replacing</w:t>
+      </w:r>
+      <w:r>
+        <w:t xml:space="preserve"> </w:t>
+      </w:r>
+      <w:r>
+        <w:t xml:space="preserve">labels alone. The available 2020–2021 WorldCover diagnostic is neither fully</w:t>
+      </w:r>
+      <w:r>
+        <w:t xml:space="preserve"> </w:t>
+      </w:r>
+      <w:r>
+        <w:t xml:space="preserve">independent nor authoritative, and no local reference change sample or observed</w:t>
+      </w:r>
+      <w:r>
+        <w:t xml:space="preserve"> </w:t>
+      </w:r>
+      <w:r>
+        <w:t xml:space="preserve">2026–2031 label exists. The original headline analysis also uses a 31 July 2026 OSM road snapshot,</w:t>
       </w:r>
       <w:r>
         <w:t xml:space="preserve"> </w:t>
@@ -4951,13 +5253,99 @@
         <w:t xml:space="preserve">while retaining the same execution contract.</w:t>
       </w:r>
     </w:p>
-    <w:bookmarkEnd w:id="47"/>
-    <w:bookmarkStart w:id="48" w:name="data-availability"/>
+    <w:bookmarkEnd w:id="51"/>
+    <w:bookmarkStart w:id="52" w:name="conclusions"/>
     <w:p>
       <w:pPr>
         <w:pStyle w:val="Heading2"/>
       </w:pPr>
       <w:r>
+        <w:t xml:space="preserve">Conclusions</w:t>
+      </w:r>
+    </w:p>
+    <w:p>
+      <w:pPr>
+        <w:pStyle w:val="FirstParagraph"/>
+      </w:pPr>
+      <w:r>
+        <w:t xml:space="preserve">Replacing Dynamic World with a newer ArcGIS-served 10-m annual product did not</w:t>
+      </w:r>
+      <w:r>
+        <w:t xml:space="preserve"> </w:t>
+      </w:r>
+      <w:r>
+        <w:t xml:space="preserve">simply raise or lower every score. It changed mapped built stock, transition</w:t>
+      </w:r>
+      <w:r>
+        <w:t xml:space="preserve"> </w:t>
+      </w:r>
+      <w:r>
+        <w:t xml:space="preserve">prevalence and the leading model by year. Geospatial Kernel remained consistently</w:t>
+      </w:r>
+      <w:r>
+        <w:t xml:space="preserve"> </w:t>
+      </w:r>
+      <w:r>
+        <w:t xml:space="preserve">better than random minimum-change allocation, but it was not universally the</w:t>
+      </w:r>
+      <w:r>
+        <w:t xml:space="preserve"> </w:t>
+      </w:r>
+      <w:r>
+        <w:t xml:space="preserve">best learned model. Its strongest transferable property in this experiment is</w:t>
+      </w:r>
+      <w:r>
+        <w:t xml:space="preserve"> </w:t>
+      </w:r>
+      <w:r>
+        <w:t xml:space="preserve">therefore the auditable separation of learned proposal, constrained projection</w:t>
+      </w:r>
+      <w:r>
+        <w:t xml:space="preserve"> </w:t>
+      </w:r>
+      <w:r>
+        <w:t xml:space="preserve">and state writeback, not a product-independent accuracy claim.</w:t>
+      </w:r>
+    </w:p>
+    <w:p>
+      <w:pPr>
+        <w:pStyle w:val="BodyText"/>
+      </w:pPr>
+      <w:r>
+        <w:t xml:space="preserve">The refreshed series adds a 2025 public origin state, native-10-m audit rasters</w:t>
+      </w:r>
+      <w:r>
+        <w:t xml:space="preserve"> </w:t>
+      </w:r>
+      <w:r>
+        <w:t xml:space="preserve">and complete 2026–2031 raster and vector scenario deliveries. Model execution</w:t>
+      </w:r>
+      <w:r>
+        <w:t xml:space="preserve"> </w:t>
+      </w:r>
+      <w:r>
+        <w:t xml:space="preserve">remains at 100 m, and both future bundles are conditional stress tests. A valid</w:t>
+      </w:r>
+      <w:r>
+        <w:t xml:space="preserve"> </w:t>
+      </w:r>
+      <w:r>
+        <w:t xml:space="preserve">operational forecast still requires locally approved land-use history, planning</w:t>
+      </w:r>
+      <w:r>
+        <w:t xml:space="preserve"> </w:t>
+      </w:r>
+      <w:r>
+        <w:t xml:space="preserve">constraints, demand assumptions and an independent change-validation design.</w:t>
+      </w:r>
+    </w:p>
+    <w:bookmarkEnd w:id="52"/>
+    <w:bookmarkStart w:id="53" w:name="data-availability"/>
+    <w:p>
+      <w:pPr>
+        <w:pStyle w:val="Heading2"/>
+      </w:pPr>
+      <w:r>
         <w:t xml:space="preserve">Data availability</w:t>
       </w:r>
     </w:p>
@@ -4981,7 +5369,7 @@
         <w:t xml:space="preserve"> </w:t>
       </w:r>
       <w:r>
-        <w:t xml:space="preserve">in the accompanying repository. The versioned reproducibility release is archived at Zenodo v1.0.0 (https://doi.org/10.5281/zenodo.22663476), corresponding to GitHub tag</w:t>
+        <w:t xml:space="preserve">and</w:t>
       </w:r>
       <w:r>
         <w:t xml:space="preserve"> </w:t>
@@ -4990,6 +5378,21 @@
         <w:rPr>
           <w:rStyle w:val="VerbatimChar"/>
         </w:rPr>
+        <w:t xml:space="preserve">benchmarks/abu_dhabi_land_use_v2/</w:t>
+      </w:r>
+      <w:r>
+        <w:t xml:space="preserve"> </w:t>
+      </w:r>
+      <w:r>
+        <w:t xml:space="preserve">in the accompanying repository. The versioned v1 reproducibility release is archived at Zenodo v1.0.0 (https://doi.org/10.5281/zenodo.22663476), corresponding to GitHub tag</w:t>
+      </w:r>
+      <w:r>
+        <w:t xml:space="preserve"> </w:t>
+      </w:r>
+      <w:r>
+        <w:rPr>
+          <w:rStyle w:val="VerbatimChar"/>
+        </w:rPr>
         <w:t xml:space="preserve">v1.0.0</w:t>
       </w:r>
       <w:r>
@@ -5008,7 +5411,52 @@
         <w:t xml:space="preserve">2cbd2d3</w:t>
       </w:r>
       <w:r>
-        <w:t xml:space="preserve">. This archive DOI identifies the public-data benchmark and software/data package, not the eventual journal article DOI. Large rasters, GeoPackages and model checkpoints remain Git LFS objects in the GitHub repository; a full numerical rerun requires fetching those objects, whereas the automatically generated Zenodo GitHub ZIP may contain their pointer files. The main evidence files are:</w:t>
+        <w:t xml:space="preserve">. The new cross-product evidence must receive a superseding versioned archive before submission; the existing DOI does not yet identify the unsubmitted v2 refresh. The v2 archive is defined by</w:t>
+      </w:r>
+      <w:r>
+        <w:t xml:space="preserve"> </w:t>
+      </w:r>
+      <w:r>
+        <w:rPr>
+          <w:rStyle w:val="VerbatimChar"/>
+        </w:rPr>
+        <w:t xml:space="preserve">reproducibility/MANIFEST.json</w:t>
+      </w:r>
+      <w:r>
+        <w:t xml:space="preserve"> </w:t>
+      </w:r>
+      <w:r>
+        <w:t xml:space="preserve">(immutable inputs, assets and code) and</w:t>
+      </w:r>
+      <w:r>
+        <w:t xml:space="preserve"> </w:t>
+      </w:r>
+      <w:r>
+        <w:rPr>
+          <w:rStyle w:val="VerbatimChar"/>
+        </w:rPr>
+        <w:t xml:space="preserve">reproducibility/PUBLICATION_OUTPUTS.json</w:t>
+      </w:r>
+      <w:r>
+        <w:t xml:space="preserve"> </w:t>
+      </w:r>
+      <w:r>
+        <w:t xml:space="preserve">(reports, source data, figures and delivered rasters/vectors);</w:t>
+      </w:r>
+      <w:r>
+        <w:t xml:space="preserve"> </w:t>
+      </w:r>
+      <w:r>
+        <w:rPr>
+          <w:rStyle w:val="VerbatimChar"/>
+        </w:rPr>
+        <w:t xml:space="preserve">reproducibility_check.py</w:t>
+      </w:r>
+      <w:r>
+        <w:t xml:space="preserve"> </w:t>
+      </w:r>
+      <w:r>
+        <w:t xml:space="preserve">verifies both sets. Large rasters, GeoPackages and model checkpoints remain Git LFS objects in the GitHub repository; a full numerical rerun requires fetching those objects, whereas an automatically generated GitHub source ZIP may contain only LFS pointer files. The main evidence files are:</w:t>
       </w:r>
     </w:p>
     <w:p>
@@ -5233,7 +5681,22 @@
         </w:numPr>
       </w:pPr>
       <w:r>
-        <w:t xml:space="preserve">the data-audit, protocol and source-input manifests for data provenance;</w:t>
+        <w:t xml:space="preserve">the v2 source manifest under</w:t>
+      </w:r>
+      <w:r>
+        <w:t xml:space="preserve"> </w:t>
+      </w:r>
+      <w:r>
+        <w:rPr>
+          <w:rStyle w:val="VerbatimChar"/>
+        </w:rPr>
+        <w:t xml:space="preserve">artifacts/arcgis_sentinel2_landcover/</w:t>
+      </w:r>
+      <w:r>
+        <w:t xml:space="preserve"> </w:t>
+      </w:r>
+      <w:r>
+        <w:t xml:space="preserve">for service metadata, catalog records and downloaded-raster hashes;</w:t>
       </w:r>
     </w:p>
     <w:p>
@@ -5245,6 +5708,129 @@
         </w:numPr>
       </w:pPr>
       <w:r>
+        <w:t xml:space="preserve">the v2 paired reports under</w:t>
+      </w:r>
+      <w:r>
+        <w:t xml:space="preserve"> </w:t>
+      </w:r>
+      <w:r>
+        <w:rPr>
+          <w:rStyle w:val="VerbatimChar"/>
+        </w:rPr>
+        <w:t xml:space="preserve">artifacts/arcgis_v2_historical_backtest/</w:t>
+      </w:r>
+      <w:r>
+        <w:t xml:space="preserve"> </w:t>
+      </w:r>
+      <w:r>
+        <w:t xml:space="preserve">and</w:t>
+      </w:r>
+      <w:r>
+        <w:t xml:space="preserve"> </w:t>
+      </w:r>
+      <w:r>
+        <w:rPr>
+          <w:rStyle w:val="VerbatimChar"/>
+        </w:rPr>
+        <w:t xml:space="preserve">artifacts/dynamic_world_matched_backtest/</w:t>
+      </w:r>
+      <w:r>
+        <w:t xml:space="preserve"> </w:t>
+      </w:r>
+      <w:r>
+        <w:t xml:space="preserve">for the two complete three-model expanding-window tracks;</w:t>
+      </w:r>
+    </w:p>
+    <w:p>
+      <w:pPr>
+        <w:pStyle w:val="Compact"/>
+        <w:numPr>
+          <w:ilvl w:val="0"/>
+          <w:numId w:val="1002"/>
+        </w:numPr>
+      </w:pPr>
+      <w:r>
+        <w:t xml:space="preserve">the v2 cross-product summary under</w:t>
+      </w:r>
+      <w:r>
+        <w:t xml:space="preserve"> </w:t>
+      </w:r>
+      <w:r>
+        <w:rPr>
+          <w:rStyle w:val="VerbatimChar"/>
+        </w:rPr>
+        <w:t xml:space="preserve">results_arcgis_v2/paper_refresh/</w:t>
+      </w:r>
+      <w:r>
+        <w:t xml:space="preserve"> </w:t>
+      </w:r>
+      <w:r>
+        <w:t xml:space="preserve">and Supplementary Table S6 for the synchronized result;</w:t>
+      </w:r>
+    </w:p>
+    <w:p>
+      <w:pPr>
+        <w:pStyle w:val="Compact"/>
+        <w:numPr>
+          <w:ilvl w:val="0"/>
+          <w:numId w:val="1002"/>
+        </w:numPr>
+      </w:pPr>
+      <w:r>
+        <w:t xml:space="preserve">the v2</w:t>
+      </w:r>
+      <w:r>
+        <w:t xml:space="preserve"> </w:t>
+      </w:r>
+      <w:r>
+        <w:rPr>
+          <w:rStyle w:val="VerbatimChar"/>
+        </w:rPr>
+        <w:t xml:space="preserve">results_arcgis_v2/ensembles/</w:t>
+      </w:r>
+      <w:r>
+        <w:t xml:space="preserve"> </w:t>
+      </w:r>
+      <w:r>
+        <w:t xml:space="preserve">and</w:t>
+      </w:r>
+      <w:r>
+        <w:t xml:space="preserve"> </w:t>
+      </w:r>
+      <w:r>
+        <w:rPr>
+          <w:rStyle w:val="VerbatimChar"/>
+        </w:rPr>
+        <w:t xml:space="preserve">vectors/</w:t>
+      </w:r>
+      <w:r>
+        <w:t xml:space="preserve"> </w:t>
+      </w:r>
+      <w:r>
+        <w:t xml:space="preserve">directories for the 2026–2031 raster and change-footprint deliveries;</w:t>
+      </w:r>
+    </w:p>
+    <w:p>
+      <w:pPr>
+        <w:pStyle w:val="Compact"/>
+        <w:numPr>
+          <w:ilvl w:val="0"/>
+          <w:numId w:val="1002"/>
+        </w:numPr>
+      </w:pPr>
+      <w:r>
+        <w:t xml:space="preserve">the data-audit, protocol and source-input manifests for data provenance;</w:t>
+      </w:r>
+    </w:p>
+    <w:p>
+      <w:pPr>
+        <w:pStyle w:val="Compact"/>
+        <w:numPr>
+          <w:ilvl w:val="0"/>
+          <w:numId w:val="1002"/>
+        </w:numPr>
+      </w:pPr>
+      <w:r>
         <w:t xml:space="preserve">The released bundle includes the aligned 2017–2024 public rasters, historical and rolling-origin prediction rasters, frozen WorldCover built-fraction rasters, 2025–2031 planning rasters, nine GeoPackages of dissolved change footprints, model checkpoints and the SHA-256 manifest. Text hashes use canonical LF line endings, and the byte-length check applies the same normalization on text records, so a Windows checkout with</w:t>
       </w:r>
       <w:r>
@@ -5302,8 +5888,8 @@
         <w:t xml:space="preserve">. Independent external Windows evidence remains separately labelled for FLUS because the corresponding rasters are not archived locally. No private database address, credential or client-only service is included. Authoritative Abu Dhabi land-use and independent reference data remain outside this study.</w:t>
       </w:r>
     </w:p>
-    <w:bookmarkEnd w:id="48"/>
-    <w:bookmarkStart w:id="49" w:name="code-availability"/>
+    <w:bookmarkEnd w:id="53"/>
+    <w:bookmarkStart w:id="54" w:name="code-availability"/>
     <w:p>
       <w:pPr>
         <w:pStyle w:val="Heading2"/>
@@ -5515,13 +6101,13 @@
         <w:rPr>
           <w:rStyle w:val="VerbatimChar"/>
         </w:rPr>
-        <w:t xml:space="preserve">reproducibility/reproduce.py</w:t>
-      </w:r>
-      <w:r>
-        <w:t xml:space="preserve"> </w:t>
-      </w:r>
-      <w:r>
-        <w:t xml:space="preserve">for the end-to-end rerun;</w:t>
+        <w:t xml:space="preserve">run_arcgis_historical_backtest.py</w:t>
+      </w:r>
+      <w:r>
+        <w:t xml:space="preserve"> </w:t>
+      </w:r>
+      <w:r>
+        <w:t xml:space="preserve">for both leakage-controlled product tracks;</w:t>
       </w:r>
     </w:p>
     <w:p>
@@ -5536,6 +6122,75 @@
         <w:rPr>
           <w:rStyle w:val="VerbatimChar"/>
         </w:rPr>
+        <w:t xml:space="preserve">analyze_product_robustness.py</w:t>
+      </w:r>
+      <w:r>
+        <w:t xml:space="preserve">,</w:t>
+      </w:r>
+      <w:r>
+        <w:t xml:space="preserve"> </w:t>
+      </w:r>
+      <w:r>
+        <w:rPr>
+          <w:rStyle w:val="VerbatimChar"/>
+        </w:rPr>
+        <w:t xml:space="preserve">source_data_fig04_product_robustness.csv</w:t>
+      </w:r>
+      <w:r>
+        <w:t xml:space="preserve"> </w:t>
+      </w:r>
+      <w:r>
+        <w:t xml:space="preserve">and</w:t>
+      </w:r>
+      <w:r>
+        <w:t xml:space="preserve"> </w:t>
+      </w:r>
+      <w:r>
+        <w:rPr>
+          <w:rStyle w:val="VerbatimChar"/>
+        </w:rPr>
+        <w:t xml:space="preserve">supplementary_table_S6_product_robustness.md</w:t>
+      </w:r>
+      <w:r>
+        <w:t xml:space="preserve"> </w:t>
+      </w:r>
+      <w:r>
+        <w:t xml:space="preserve">for the cross-product analysis;</w:t>
+      </w:r>
+    </w:p>
+    <w:p>
+      <w:pPr>
+        <w:pStyle w:val="Compact"/>
+        <w:numPr>
+          <w:ilvl w:val="0"/>
+          <w:numId w:val="1003"/>
+        </w:numPr>
+      </w:pPr>
+      <w:r>
+        <w:rPr>
+          <w:rStyle w:val="VerbatimChar"/>
+        </w:rPr>
+        <w:t xml:space="preserve">reproducibility/reproduce.py</w:t>
+      </w:r>
+      <w:r>
+        <w:t xml:space="preserve"> </w:t>
+      </w:r>
+      <w:r>
+        <w:t xml:space="preserve">for the end-to-end rerun;</w:t>
+      </w:r>
+    </w:p>
+    <w:p>
+      <w:pPr>
+        <w:pStyle w:val="Compact"/>
+        <w:numPr>
+          <w:ilvl w:val="0"/>
+          <w:numId w:val="1003"/>
+        </w:numPr>
+      </w:pPr>
+      <w:r>
+        <w:rPr>
+          <w:rStyle w:val="VerbatimChar"/>
+        </w:rPr>
         <w:t xml:space="preserve">reproducibility_check.py</w:t>
       </w:r>
       <w:r>
@@ -5928,8 +6583,8 @@
         <w:t xml:space="preserve">benchmark and software/data archive, not the eventual journal article DOI.</w:t>
       </w:r>
     </w:p>
-    <w:bookmarkEnd w:id="49"/>
-    <w:bookmarkStart w:id="50" w:name="declarations"/>
+    <w:bookmarkEnd w:id="54"/>
+    <w:bookmarkStart w:id="55" w:name="declarations"/>
     <w:p>
       <w:pPr>
         <w:pStyle w:val="Heading2"/>
@@ -6028,8 +6683,8 @@
         <w:t xml:space="preserve">Not applicable; the study used geospatial raster, vector and derived public-data products and did not involve human or animal participants.</w:t>
       </w:r>
     </w:p>
-    <w:bookmarkEnd w:id="50"/>
-    <w:bookmarkStart w:id="51" w:name="references"/>
+    <w:bookmarkEnd w:id="55"/>
+    <w:bookmarkStart w:id="56" w:name="references"/>
     <w:p>
       <w:pPr>
         <w:pStyle w:val="Heading2"/>
@@ -6051,7 +6706,7 @@
         <w:pStyle w:val="BodyText"/>
       </w:pPr>
       <w:r>
-        <w:t xml:space="preserve">Brown, C. F., et al. (2022). Dynamic World, near real-time global 10 m land use land cover mapping.</w:t>
+        <w:t xml:space="preserve">Brown, C. F., Brumby, S. P., Guzder-Williams, B., Birch, T., Hyde, S. B., Mazzariello, J., Czerwinski, W., Pasquarella, V. J., Haertel, R., Ilyushchenko, S., Schwehr, K., Weisse, M., Stolle, F., Hanson, C., Guinan, O., Moore, R., &amp; Tait, A. M. (2022). Dynamic World, near real-time global 10 m land use land cover mapping.</w:t>
       </w:r>
       <w:r>
         <w:t xml:space="preserve"> </w:t>
@@ -6072,7 +6727,7 @@
         <w:pStyle w:val="BodyText"/>
       </w:pPr>
       <w:r>
-        <w:t xml:space="preserve">Burton, E. (2000). The compact city: just or just compact? A preliminary analysis.</w:t>
+        <w:t xml:space="preserve">Brown, C. F., Kazmierski, M. R., Pasquarella, V. J., Rucklidge, W. J., Samsikova, M., Zhang, C., Shelhamer, E., Lahera, E., Wiles, O., Ilyushchenko, S., Gorelick, N., Zhang, L. L., Alj, S., Schechter, E., Askay, S., Guinan, O., Moore, R., Boukouvalas, A., &amp; Kohli, P. (2025). AlphaEarth Foundations: An embedding field model for accurate and efficient global mapping from sparse label data.</w:t>
       </w:r>
       <w:r>
         <w:t xml:space="preserve"> </w:t>
@@ -6082,10 +6737,10 @@
           <w:i/>
           <w:iCs/>
         </w:rPr>
-        <w:t xml:space="preserve">Urban Studies</w:t>
-      </w:r>
-      <w:r>
-        <w:t xml:space="preserve">, 37, 1969–2006. https://doi.org/10.1080/00420980050162184</w:t>
+        <w:t xml:space="preserve">arXiv</w:t>
+      </w:r>
+      <w:r>
+        <w:t xml:space="preserve">. https://doi.org/10.48550/arXiv.2507.22291</w:t>
       </w:r>
     </w:p>
     <w:p>
@@ -6093,7 +6748,7 @@
         <w:pStyle w:val="BodyText"/>
       </w:pPr>
       <w:r>
-        <w:t xml:space="preserve">Gorelick, N., et al. (2017). Google Earth Engine: planetary-scale geospatial analysis for everyone.</w:t>
+        <w:t xml:space="preserve">Burton, E. (2000). The compact city: just or just compact? A preliminary analysis.</w:t>
       </w:r>
       <w:r>
         <w:t xml:space="preserve"> </w:t>
@@ -6103,10 +6758,10 @@
           <w:i/>
           <w:iCs/>
         </w:rPr>
-        <w:t xml:space="preserve">Remote Sensing of Environment</w:t>
-      </w:r>
-      <w:r>
-        <w:t xml:space="preserve">, 202, 18–27. https://doi.org/10.1016/j.rse.2017.06.031</w:t>
+        <w:t xml:space="preserve">Urban Studies</w:t>
+      </w:r>
+      <w:r>
+        <w:t xml:space="preserve">, 37, 1969–2006. https://doi.org/10.1080/00420980050162184</w:t>
       </w:r>
     </w:p>
     <w:p>
@@ -6114,7 +6769,7 @@
         <w:pStyle w:val="BodyText"/>
       </w:pPr>
       <w:r>
-        <w:t xml:space="preserve">Lau, K. H., &amp; Kam, B. H. (2005). A cellular automata model for urban land-use simulation.</w:t>
+        <w:t xml:space="preserve">Elvidge, C. D., Zhizhin, M., Ghosh, T., Hsu, F.-C., &amp; Taneja, J. (2021). Annual time series of global VIIRS nighttime lights derived from monthly averages: 2012 to 2019.</w:t>
       </w:r>
       <w:r>
         <w:t xml:space="preserve"> </w:t>
@@ -6124,10 +6779,10 @@
           <w:i/>
           <w:iCs/>
         </w:rPr>
-        <w:t xml:space="preserve">Environment and Planning B: Planning and Design</w:t>
-      </w:r>
-      <w:r>
-        <w:t xml:space="preserve">, 32, 247–263. https://doi.org/10.1068/b31110</w:t>
+        <w:t xml:space="preserve">Remote Sensing</w:t>
+      </w:r>
+      <w:r>
+        <w:t xml:space="preserve">, 13, 922. https://doi.org/10.3390/rs13050922</w:t>
       </w:r>
     </w:p>
     <w:p>
@@ -6135,7 +6790,23 @@
         <w:pStyle w:val="BodyText"/>
       </w:pPr>
       <w:r>
-        <w:t xml:space="preserve">Liang, X., et al. (2021). A patch-generating land use simulation model integrating multisource data for urban growth simulation.</w:t>
+        <w:t xml:space="preserve">European Space Agency. (2024). Copernicus DEM GLO-30: global 30 m digital elevation model [Data set]. Google Earth Engine Data Catalog. https://developers.google.com/earth-engine/datasets/catalog/COPERNICUS_DEM_GLO30_2024_1</w:t>
+      </w:r>
+    </w:p>
+    <w:p>
+      <w:pPr>
+        <w:pStyle w:val="BodyText"/>
+      </w:pPr>
+      <w:r>
+        <w:t xml:space="preserve">GeoSOS team, Sun Yat-sen University. (n.d.). FLUS source code for non-commercial academic research. http://www.geosimulation.cn/FLUS-source-code.html (accessed 6 September 2026).</w:t>
+      </w:r>
+    </w:p>
+    <w:p>
+      <w:pPr>
+        <w:pStyle w:val="BodyText"/>
+      </w:pPr>
+      <w:r>
+        <w:t xml:space="preserve">Gorelick, N., Hancher, M., Dixon, M., Ilyushchenko, S., Thau, D., &amp; Moore, R. (2017). Google Earth Engine: planetary-scale geospatial analysis for everyone.</w:t>
       </w:r>
       <w:r>
         <w:t xml:space="preserve"> </w:t>
@@ -6145,10 +6816,10 @@
           <w:i/>
           <w:iCs/>
         </w:rPr>
-        <w:t xml:space="preserve">Landscape and Urban Planning</w:t>
-      </w:r>
-      <w:r>
-        <w:t xml:space="preserve">, 214, 104157. https://doi.org/10.1016/j.landurbplan.2021.104157</w:t>
+        <w:t xml:space="preserve">Remote Sensing of Environment</w:t>
+      </w:r>
+      <w:r>
+        <w:t xml:space="preserve">, 202, 18–27. https://doi.org/10.1016/j.rse.2017.06.031</w:t>
       </w:r>
     </w:p>
     <w:p>
@@ -6156,7 +6827,15 @@
         <w:pStyle w:val="BodyText"/>
       </w:pPr>
       <w:r>
-        <w:t xml:space="preserve">Liu, X., et al. (2017). A future land use simulation model (FLUS) for simulating multiple land use scenarios by coupling human and natural effects.</w:t>
+        <w:t xml:space="preserve">Impact Observatory, Microsoft, &amp; Esri. (2026). Sentinel-2 10m land cover time series of the world [Data set]. ArcGIS ImageServer. https://ic.imagery1.arcgis.com/arcgis/rest/services/Sentinel2_10m_LandCover/ImageServer (accessed 8 September 2026).</w:t>
+      </w:r>
+    </w:p>
+    <w:p>
+      <w:pPr>
+        <w:pStyle w:val="BodyText"/>
+      </w:pPr>
+      <w:r>
+        <w:t xml:space="preserve">Karra, K., Kontgis, C., Statman-Weil, Z., Mazzariello, J. C., Mathis, M., &amp; Brumby, S. P. (2021). Global land use/land cover with Sentinel 2 and deep learning.</w:t>
       </w:r>
       <w:r>
         <w:t xml:space="preserve"> </w:t>
@@ -6166,10 +6845,10 @@
           <w:i/>
           <w:iCs/>
         </w:rPr>
-        <w:t xml:space="preserve">Landscape and Urban Planning</w:t>
-      </w:r>
-      <w:r>
-        <w:t xml:space="preserve">, 168, 94–116. https://doi.org/10.1016/j.landurbplan.2017.09.019</w:t>
+        <w:t xml:space="preserve">2021 IEEE International Geoscience and Remote Sensing Symposium IGARSS</w:t>
+      </w:r>
+      <w:r>
+        <w:t xml:space="preserve">, 4704–4707. https://doi.org/10.1109/IGARSS47720.2021.9553499</w:t>
       </w:r>
     </w:p>
     <w:p>
@@ -6177,23 +6856,7 @@
         <w:pStyle w:val="BodyText"/>
       </w:pPr>
       <w:r>
-        <w:t xml:space="preserve">GeoSOS team, Sun Yat-sen University. (n.d.). FLUS source code for non-commercial academic research. http://www.geosimulation.cn/FLUS-source-code.html (accessed 6 September 2026).</w:t>
-      </w:r>
-    </w:p>
-    <w:p>
-      <w:pPr>
-        <w:pStyle w:val="BodyText"/>
-      </w:pPr>
-      <w:r>
-        <w:t xml:space="preserve">OpenStreetMap contributors. (2026). OpenStreetMap data, Abu Dhabi relation R4479763 and Geofabrik GCC extract, accessed 31 July 2026. https://www.openstreetmap.org</w:t>
-      </w:r>
-    </w:p>
-    <w:p>
-      <w:pPr>
-        <w:pStyle w:val="BodyText"/>
-      </w:pPr>
-      <w:r>
-        <w:t xml:space="preserve">Pontius, R. G., Jr., Boersma, W., Castella, J.-C., et al. (2008). Comparing the input, output, and validation maps for several models of land change.</w:t>
+        <w:t xml:space="preserve">Lau, K. H., &amp; Kam, B. H. (2005). A cellular automata model for urban land-use simulation.</w:t>
       </w:r>
       <w:r>
         <w:t xml:space="preserve"> </w:t>
@@ -6203,10 +6866,10 @@
           <w:i/>
           <w:iCs/>
         </w:rPr>
-        <w:t xml:space="preserve">The Annals of Regional Science</w:t>
-      </w:r>
-      <w:r>
-        <w:t xml:space="preserve">, 42, 11–37. DOI: 10.1007/s00168-007-0138-2</w:t>
+        <w:t xml:space="preserve">Environment and Planning B: Planning and Design</w:t>
+      </w:r>
+      <w:r>
+        <w:t xml:space="preserve">, 32, 247–263. https://doi.org/10.1068/b31110</w:t>
       </w:r>
     </w:p>
     <w:p>
@@ -6214,7 +6877,7 @@
         <w:pStyle w:val="BodyText"/>
       </w:pPr>
       <w:r>
-        <w:t xml:space="preserve">Pontius, R. G., Jr., &amp; Millones, M. (2011). Death to Kappa: birth of quantity disagreement and allocation disagreement for accuracy assessment.</w:t>
+        <w:t xml:space="preserve">Liang, X., Guan, Q., Clarke, K. C., Liu, S., Wang, B., &amp; Yao, Y. (2021). Understanding the drivers of sustainable land expansion using a patch-generating land use simulation (PLUS) model: A case study in Wuhan, China.</w:t>
       </w:r>
       <w:r>
         <w:t xml:space="preserve"> </w:t>
@@ -6224,10 +6887,10 @@
           <w:i/>
           <w:iCs/>
         </w:rPr>
-        <w:t xml:space="preserve">International Journal of Remote Sensing</w:t>
-      </w:r>
-      <w:r>
-        <w:t xml:space="preserve">, 32, 4407–4429. DOI: 10.1080/01431161.2011.552923</w:t>
+        <w:t xml:space="preserve">Computers, Environment and Urban Systems</w:t>
+      </w:r>
+      <w:r>
+        <w:t xml:space="preserve">, 85, 101569. https://doi.org/10.1016/j.compenvurbsys.2020.101569</w:t>
       </w:r>
     </w:p>
     <w:p>
@@ -6235,7 +6898,7 @@
         <w:pStyle w:val="BodyText"/>
       </w:pPr>
       <w:r>
-        <w:t xml:space="preserve">Silva, E. A., &amp; Clarke, K. C. (2002). Calibration of the SLEUTH urban growth model for Lisbon and Porto, Portugal.</w:t>
+        <w:t xml:space="preserve">Liu, X., Liang, X., Li, X., Xu, X., Ou, J., Chen, Y., Li, S., Wang, S., &amp; Pei, F. (2017). A future land use simulation model (FLUS) for simulating multiple land use scenarios by coupling human and natural effects.</w:t>
       </w:r>
       <w:r>
         <w:t xml:space="preserve"> </w:t>
@@ -6245,10 +6908,10 @@
           <w:i/>
           <w:iCs/>
         </w:rPr>
-        <w:t xml:space="preserve">Computers, Environment and Urban Systems</w:t>
-      </w:r>
-      <w:r>
-        <w:t xml:space="preserve">, 26, 525–552. https://doi.org/10.1016/S0198-9715(01)00017-8</w:t>
+        <w:t xml:space="preserve">Landscape and Urban Planning</w:t>
+      </w:r>
+      <w:r>
+        <w:t xml:space="preserve">, 168, 94–116. https://doi.org/10.1016/j.landurbplan.2017.09.019</w:t>
       </w:r>
     </w:p>
     <w:p>
@@ -6256,7 +6919,15 @@
         <w:pStyle w:val="BodyText"/>
       </w:pPr>
       <w:r>
-        <w:t xml:space="preserve">Soares-Filho, B. S., Cerqueira, G. C., &amp; Pennachin, C. L. (2002). DINAMICA—a stochastic cellular automata model designed to simulate the landscape dynamics in an Amazonian colonization frontier.</w:t>
+        <w:t xml:space="preserve">OpenStreetMap contributors. (2026). OpenStreetMap data, Abu Dhabi relation R4479763 and Geofabrik GCC extract, accessed 31 July 2026. https://www.openstreetmap.org</w:t>
+      </w:r>
+    </w:p>
+    <w:p>
+      <w:pPr>
+        <w:pStyle w:val="BodyText"/>
+      </w:pPr>
+      <w:r>
+        <w:t xml:space="preserve">Pedregosa, F., Varoquaux, G., Gramfort, A., Michel, V., Thirion, B., Grisel, O., Blondel, M., Prettenhofer, P., Weiss, R., Dubourg, V., Vanderplas, J., Passos, A., Cournapeau, D., Brucher, M., Perrot, M., &amp; Duchesnay, E. (2011). Scikit-learn: Machine learning in Python.</w:t>
       </w:r>
       <w:r>
         <w:t xml:space="preserve"> </w:t>
@@ -6266,10 +6937,10 @@
           <w:i/>
           <w:iCs/>
         </w:rPr>
-        <w:t xml:space="preserve">Ecological Modelling</w:t>
-      </w:r>
-      <w:r>
-        <w:t xml:space="preserve">, 154, 217–235. https://doi.org/10.1016/S0304-3800(02)00059-5</w:t>
+        <w:t xml:space="preserve">Journal of Machine Learning Research</w:t>
+      </w:r>
+      <w:r>
+        <w:t xml:space="preserve">, 12, 2825–2830. https://jmlr.org/papers/v12/pedregosa11a.html</w:t>
       </w:r>
     </w:p>
     <w:p>
@@ -6277,7 +6948,7 @@
         <w:pStyle w:val="BodyText"/>
       </w:pPr>
       <w:r>
-        <w:t xml:space="preserve">van Vliet, J., Bregt, A. K., Rietveld, P., &amp; Verburg, P. H. (2011). Modeling land-use change with cellular automata: Issues and recommendations.</w:t>
+        <w:t xml:space="preserve">Pontius, R. G., Jr., Boersma, W., Castella, J.-C., Clarke, K., de Nijs, T., Dietzel, C., Duan, Z., Fotsing, E., Goldstein, N., Kok, K., Koomen, E., Lippitt, C. D., McConnell, W., Mohd Sood, A., Pijanowski, B., Pithadia, S., Sweeney, S., Trung, T. N., Veldkamp, A. T., &amp; Verburg, P. H. (2008). Comparing the input, output, and validation maps for several models of land change.</w:t>
       </w:r>
       <w:r>
         <w:t xml:space="preserve"> </w:t>
@@ -6287,10 +6958,10 @@
           <w:i/>
           <w:iCs/>
         </w:rPr>
-        <w:t xml:space="preserve">Journal of Land Use Science</w:t>
-      </w:r>
-      <w:r>
-        <w:t xml:space="preserve">, 6, 247–265. https://doi.org/10.1080/1747423X.2011.562018</w:t>
+        <w:t xml:space="preserve">The Annals of Regional Science</w:t>
+      </w:r>
+      <w:r>
+        <w:t xml:space="preserve">, 42, 11–37. https://doi.org/10.1007/s00168-007-0138-2</w:t>
       </w:r>
     </w:p>
     <w:p>
@@ -6298,7 +6969,7 @@
         <w:pStyle w:val="BodyText"/>
       </w:pPr>
       <w:r>
-        <w:t xml:space="preserve">van Vliet, J., Bregt, A. K., Brown, D. G., van Delden, H., Heckbert, S., &amp; Verburg, P. H. (2016). A review of current calibration and validation practices in land-change modeling.</w:t>
+        <w:t xml:space="preserve">Pontius, R. G., Jr., &amp; Millones, M. (2011). Death to Kappa: birth of quantity disagreement and allocation disagreement for accuracy assessment.</w:t>
       </w:r>
       <w:r>
         <w:t xml:space="preserve"> </w:t>
@@ -6308,10 +6979,10 @@
           <w:i/>
           <w:iCs/>
         </w:rPr>
-        <w:t xml:space="preserve">Environmental Modelling &amp; Software</w:t>
-      </w:r>
-      <w:r>
-        <w:t xml:space="preserve">, 82, 174–182. https://doi.org/10.1016/j.envsoft.2016.04.017</w:t>
+        <w:t xml:space="preserve">International Journal of Remote Sensing</w:t>
+      </w:r>
+      <w:r>
+        <w:t xml:space="preserve">, 32, 4407–4429. https://doi.org/10.1080/01431161.2011.552923</w:t>
       </w:r>
     </w:p>
     <w:p>
@@ -6319,7 +6990,7 @@
         <w:pStyle w:val="BodyText"/>
       </w:pPr>
       <w:r>
-        <w:t xml:space="preserve">Verburg, P. H., et al. (2002). Modeling the spatial dynamics of regional land use: the CLUE-S model.</w:t>
+        <w:t xml:space="preserve">Silva, E. A., &amp; Clarke, K. C. (2002). Calibration of the SLEUTH urban growth model for Lisbon and Porto, Portugal.</w:t>
       </w:r>
       <w:r>
         <w:t xml:space="preserve"> </w:t>
@@ -6329,10 +7000,94 @@
           <w:i/>
           <w:iCs/>
         </w:rPr>
+        <w:t xml:space="preserve">Computers, Environment and Urban Systems</w:t>
+      </w:r>
+      <w:r>
+        <w:t xml:space="preserve">, 26, 525–552. https://doi.org/10.1016/S0198-9715(01)00014-X</w:t>
+      </w:r>
+    </w:p>
+    <w:p>
+      <w:pPr>
+        <w:pStyle w:val="BodyText"/>
+      </w:pPr>
+      <w:r>
+        <w:t xml:space="preserve">Soares-Filho, B. S., Cerqueira, G. C., &amp; Pennachin, C. L. (2002). DINAMICA—a stochastic cellular automata model designed to simulate the landscape dynamics in an Amazonian colonization frontier.</w:t>
+      </w:r>
+      <w:r>
+        <w:t xml:space="preserve"> </w:t>
+      </w:r>
+      <w:r>
+        <w:rPr>
+          <w:i/>
+          <w:iCs/>
+        </w:rPr>
+        <w:t xml:space="preserve">Ecological Modelling</w:t>
+      </w:r>
+      <w:r>
+        <w:t xml:space="preserve">, 154, 217–235. https://doi.org/10.1016/S0304-3800(02)00059-5</w:t>
+      </w:r>
+    </w:p>
+    <w:p>
+      <w:pPr>
+        <w:pStyle w:val="BodyText"/>
+      </w:pPr>
+      <w:r>
+        <w:t xml:space="preserve">van Vliet, J., Bregt, A. K., &amp; Hagen-Zanker, A. (2011). Revisiting Kappa to account for change in the accuracy assessment of land-use change models.</w:t>
+      </w:r>
+      <w:r>
+        <w:t xml:space="preserve"> </w:t>
+      </w:r>
+      <w:r>
+        <w:rPr>
+          <w:i/>
+          <w:iCs/>
+        </w:rPr>
+        <w:t xml:space="preserve">Ecological Modelling</w:t>
+      </w:r>
+      <w:r>
+        <w:t xml:space="preserve">, 222, 1367–1375. https://doi.org/10.1016/j.ecolmodel.2011.01.017</w:t>
+      </w:r>
+    </w:p>
+    <w:p>
+      <w:pPr>
+        <w:pStyle w:val="BodyText"/>
+      </w:pPr>
+      <w:r>
+        <w:t xml:space="preserve">van Vliet, J., Bregt, A. K., Brown, D. G., van Delden, H., Heckbert, S., &amp; Verburg, P. H. (2016). A review of current calibration and validation practices in land-change modeling.</w:t>
+      </w:r>
+      <w:r>
+        <w:t xml:space="preserve"> </w:t>
+      </w:r>
+      <w:r>
+        <w:rPr>
+          <w:i/>
+          <w:iCs/>
+        </w:rPr>
+        <w:t xml:space="preserve">Environmental Modelling &amp; Software</w:t>
+      </w:r>
+      <w:r>
+        <w:t xml:space="preserve">, 82, 174–182. https://doi.org/10.1016/j.envsoft.2016.04.017</w:t>
+      </w:r>
+    </w:p>
+    <w:p>
+      <w:pPr>
+        <w:pStyle w:val="BodyText"/>
+      </w:pPr>
+      <w:r>
+        <w:t xml:space="preserve">Verburg, P. H., Soepboer, W., Veldkamp, A., Limpiada, R., Espaldon, V., &amp; Mastura, S. S. A. (2002). Modeling the spatial dynamics of regional land use: the CLUE-S model.</w:t>
+      </w:r>
+      <w:r>
+        <w:t xml:space="preserve"> </w:t>
+      </w:r>
+      <w:r>
+        <w:rPr>
+          <w:i/>
+          <w:iCs/>
+        </w:rPr>
         <w:t xml:space="preserve">Environmental Management</w:t>
       </w:r>
       <w:r>
-        <w:t xml:space="preserve">, 30, 391–405. https://doi.org/10.1007/s00267-002-2631-x</w:t>
+        <w:t xml:space="preserve">, 30, 391–405. https://doi.org/10.1007/s00267-002-2630-x</w:t>
       </w:r>
     </w:p>
     <w:p>
@@ -6340,11 +7095,19 @@
         <w:pStyle w:val="BodyText"/>
       </w:pPr>
       <w:r>
-        <w:t xml:space="preserve">Zanaga, D., et al. (2022). ESA WorldCover 10 m 2021 v200. Zenodo. https://doi.org/10.5281/zenodo.7254221</w:t>
-      </w:r>
-    </w:p>
-    <w:bookmarkEnd w:id="51"/>
-    <w:bookmarkStart w:id="52" w:name="supplementary-information-outline"/>
+        <w:t xml:space="preserve">Zanaga, D., Van De Kerchove, R., De Keersmaecker, W., Souverijns, N., Brockmann, C., Quast, R., Wevers, J., Grosu, A., Paccini, A., Vergnaud, S., Cartus, O., Santoro, M., Fritz, S., Georgieva, I., Lesiv, M., Carter, S., Herold, M., Li, L., Tsendbazar, N.-E., Ramoino, F., &amp; Arino, O. (2021). ESA WorldCover 10 m 2020 v100 [Data set]. Zenodo. https://doi.org/10.5281/zenodo.5571936</w:t>
+      </w:r>
+    </w:p>
+    <w:p>
+      <w:pPr>
+        <w:pStyle w:val="BodyText"/>
+      </w:pPr>
+      <w:r>
+        <w:t xml:space="preserve">Zanaga, D., Van De Kerchove, R., Daems, D., De Keersmaecker, W., Brockmann, C., Kirches, G., Wevers, J., Cartus, O., Santoro, M., Fritz, S., Lesiv, M., Herold, M., Tsendbazar, N.-E., Xu, P., Ramoino, F., &amp; Arino, O. (2022). ESA WorldCover 10 m 2021 v200 [Data set]. Zenodo. https://doi.org/10.5281/zenodo.7254221</w:t>
+      </w:r>
+    </w:p>
+    <w:bookmarkEnd w:id="56"/>
+    <w:bookmarkStart w:id="57" w:name="supplementary-information-outline"/>
     <w:p>
       <w:pPr>
         <w:pStyle w:val="Heading2"/>
@@ -6556,19 +7319,22 @@
           <w:b/>
           <w:bCs/>
         </w:rPr>
-        <w:t xml:space="preserve">Fig. S1:</w:t>
-      </w:r>
-      <w:r>
-        <w:t xml:space="preserve"> </w:t>
-      </w:r>
-      <w:r>
-        <w:t xml:space="preserve">Full 3-scenarios × 3-model 2031 new-built footprint atlas (</w:t>
+        <w:t xml:space="preserve">Supplementary Table S6:</w:t>
+      </w:r>
+      <w:r>
+        <w:t xml:space="preserve"> </w:t>
+      </w:r>
+      <w:r>
+        <w:t xml:space="preserve">Matched Dynamic World and ArcGIS-served whole-product-pipeline backtests (see</w:t>
+      </w:r>
+      <w:r>
+        <w:t xml:space="preserve"> </w:t>
       </w:r>
       <w:r>
         <w:rPr>
           <w:rStyle w:val="VerbatimChar"/>
         </w:rPr>
-        <w:t xml:space="preserve">figures/figS01_planning_atlas_2031.*</w:t>
+        <w:t xml:space="preserve">supplementary_table_S6_product_robustness.md</w:t>
       </w:r>
       <w:r>
         <w:t xml:space="preserve">).</w:t>
@@ -6587,19 +7353,19 @@
           <w:b/>
           <w:bCs/>
         </w:rPr>
-        <w:t xml:space="preserve">Fig. S2:</w:t>
-      </w:r>
-      <w:r>
-        <w:t xml:space="preserve"> </w:t>
-      </w:r>
-      <w:r>
-        <w:t xml:space="preserve">Dynamic World confidence and high-confidence change sensitivity (</w:t>
+        <w:t xml:space="preserve">Fig. S1:</w:t>
+      </w:r>
+      <w:r>
+        <w:t xml:space="preserve"> </w:t>
+      </w:r>
+      <w:r>
+        <w:t xml:space="preserve">Full 3-scenarios × 3-model 2031 new-built footprint atlas (</w:t>
       </w:r>
       <w:r>
         <w:rPr>
           <w:rStyle w:val="VerbatimChar"/>
         </w:rPr>
-        <w:t xml:space="preserve">figures/figS02_input_label_quality.*</w:t>
+        <w:t xml:space="preserve">figures/figS01_planning_atlas_2031.*</w:t>
       </w:r>
       <w:r>
         <w:t xml:space="preserve">).</w:t>
@@ -6618,19 +7384,19 @@
           <w:b/>
           <w:bCs/>
         </w:rPr>
-        <w:t xml:space="preserve">Fig. S3:</w:t>
-      </w:r>
-      <w:r>
-        <w:t xml:space="preserve"> </w:t>
-      </w:r>
-      <w:r>
-        <w:t xml:space="preserve">Historical maps and change-error maps for 2024 (</w:t>
+        <w:t xml:space="preserve">Fig. S2:</w:t>
+      </w:r>
+      <w:r>
+        <w:t xml:space="preserve"> </w:t>
+      </w:r>
+      <w:r>
+        <w:t xml:space="preserve">Dynamic World confidence and high-confidence change sensitivity (</w:t>
       </w:r>
       <w:r>
         <w:rPr>
           <w:rStyle w:val="VerbatimChar"/>
         </w:rPr>
-        <w:t xml:space="preserve">figures/figS03_historical_2024_maps_and_errors.*</w:t>
+        <w:t xml:space="preserve">figures/figS02_input_label_quality.*</w:t>
       </w:r>
       <w:r>
         <w:t xml:space="preserve">).</w:t>
@@ -6649,6 +7415,37 @@
           <w:b/>
           <w:bCs/>
         </w:rPr>
+        <w:t xml:space="preserve">Fig. S3:</w:t>
+      </w:r>
+      <w:r>
+        <w:t xml:space="preserve"> </w:t>
+      </w:r>
+      <w:r>
+        <w:t xml:space="preserve">Historical maps and change-error maps for 2024 (</w:t>
+      </w:r>
+      <w:r>
+        <w:rPr>
+          <w:rStyle w:val="VerbatimChar"/>
+        </w:rPr>
+        <w:t xml:space="preserve">figures/figS03_historical_2024_maps_and_errors.*</w:t>
+      </w:r>
+      <w:r>
+        <w:t xml:space="preserve">).</w:t>
+      </w:r>
+    </w:p>
+    <w:p>
+      <w:pPr>
+        <w:pStyle w:val="Compact"/>
+        <w:numPr>
+          <w:ilvl w:val="0"/>
+          <w:numId w:val="1004"/>
+        </w:numPr>
+      </w:pPr>
+      <w:r>
+        <w:rPr>
+          <w:b/>
+          <w:bCs/>
+        </w:rPr>
         <w:t xml:space="preserve">Fig. S4:</w:t>
       </w:r>
       <w:r>
@@ -6674,7 +7471,7 @@
         </w:pict>
       </w:r>
     </w:p>
-    <w:bookmarkEnd w:id="52"/>
+    <w:bookmarkEnd w:id="57"/>
     <w:sectPr>
       <w:footnotePr>
         <w:numRestart w:val="eachSect"/>

</xml_diff>

<commit_message>
Record published v2 Zenodo DOI
</commit_message>
<xml_diff>
--- a/manuscript/manuscript.docx
+++ b/manuscript/manuscript.docx
@@ -5384,7 +5384,7 @@
         <w:t xml:space="preserve"> </w:t>
       </w:r>
       <w:r>
-        <w:t xml:space="preserve">in the accompanying repository. The versioned v1 reproducibility release is archived at Zenodo v1.0.0 (https://doi.org/10.5281/zenodo.22663476), corresponding to GitHub tag</w:t>
+        <w:t xml:space="preserve">in the accompanying repository. The ArcGIS-served cross-product source release is archived at Zenodo v2.0.0 (https://doi.org/10.5281/zenodo.22689057), corresponding to GitHub tag</w:t>
       </w:r>
       <w:r>
         <w:t xml:space="preserve"> </w:t>
@@ -5393,7 +5393,7 @@
         <w:rPr>
           <w:rStyle w:val="VerbatimChar"/>
         </w:rPr>
-        <w:t xml:space="preserve">v1.0.0</w:t>
+        <w:t xml:space="preserve">v2.0.0</w:t>
       </w:r>
       <w:r>
         <w:t xml:space="preserve"> </w:t>
@@ -5408,10 +5408,10 @@
         <w:rPr>
           <w:rStyle w:val="VerbatimChar"/>
         </w:rPr>
-        <w:t xml:space="preserve">2cbd2d3</w:t>
-      </w:r>
-      <w:r>
-        <w:t xml:space="preserve">. The new cross-product evidence must receive a superseding versioned archive before submission; the existing DOI does not yet identify the unsubmitted v2 refresh. The v2 archive is defined by</w:t>
+        <w:t xml:space="preserve">77e2c59</w:t>
+      </w:r>
+      <w:r>
+        <w:t xml:space="preserve">; the version-independent concept DOI is https://doi.org/10.5281/zenodo.22663475. The v2 release is defined by</w:t>
       </w:r>
       <w:r>
         <w:t xml:space="preserve"> </w:t>
@@ -5456,7 +5456,7 @@
         <w:t xml:space="preserve"> </w:t>
       </w:r>
       <w:r>
-        <w:t xml:space="preserve">verifies both sets. Large rasters, GeoPackages and model checkpoints remain Git LFS objects in the GitHub repository; a full numerical rerun requires fetching those objects, whereas an automatically generated GitHub source ZIP may contain only LFS pointer files. The main evidence files are:</w:t>
+        <w:t xml:space="preserve">verifies both sets. The Zenodo record contains GitHub’s automatically generated source ZIP, which was inspected after publication and contains Git LFS pointers rather than hydrated large rasters, GeoPackages and model checkpoints. A full numerical rerun therefore requires checking out the tagged GitHub repository, retrieving its LFS objects and passing both v2 manifest checks; the DOI record alone is not a self-contained binary-data archive. The main evidence files are:</w:t>
       </w:r>
     </w:p>
     <w:p>
@@ -6535,19 +6535,13 @@
         <w:t xml:space="preserve">zhouning@freedotech.com</w:t>
       </w:r>
       <w:r>
-        <w:t xml:space="preserve">. The versioned public reproducibility release is</w:t>
-      </w:r>
-      <w:r>
-        <w:t xml:space="preserve"> </w:t>
-      </w:r>
-      <w:r>
-        <w:t xml:space="preserve">archived at Zenodo v1.0.0: https://doi.org/10.5281/zenodo.22663476. It</w:t>
-      </w:r>
-      <w:r>
-        <w:t xml:space="preserve"> </w:t>
-      </w:r>
-      <w:r>
-        <w:t xml:space="preserve">corresponds to GitHub tag</w:t>
+        <w:t xml:space="preserve">. The versioned v2 source release is archived at</w:t>
+      </w:r>
+      <w:r>
+        <w:t xml:space="preserve"> </w:t>
+      </w:r>
+      <w:r>
+        <w:t xml:space="preserve">https://doi.org/10.5281/zenodo.22689057 and corresponds to GitHub tag</w:t>
       </w:r>
       <w:r>
         <w:t xml:space="preserve"> </w:t>
@@ -6556,7 +6550,7 @@
         <w:rPr>
           <w:rStyle w:val="VerbatimChar"/>
         </w:rPr>
-        <w:t xml:space="preserve">v1.0.0</w:t>
+        <w:t xml:space="preserve">v2.0.0</w:t>
       </w:r>
       <w:r>
         <w:t xml:space="preserve"> </w:t>
@@ -6571,16 +6565,22 @@
         <w:rPr>
           <w:rStyle w:val="VerbatimChar"/>
         </w:rPr>
-        <w:t xml:space="preserve">2cbd2d3</w:t>
-      </w:r>
-      <w:r>
-        <w:t xml:space="preserve">; the DOI identifies the</w:t>
-      </w:r>
-      <w:r>
-        <w:t xml:space="preserve"> </w:t>
-      </w:r>
-      <w:r>
-        <w:t xml:space="preserve">benchmark and software/data archive, not the eventual journal article DOI.</w:t>
+        <w:t xml:space="preserve">77e2c59</w:t>
+      </w:r>
+      <w:r>
+        <w:t xml:space="preserve">; the DOI identifies the public benchmark source release,</w:t>
+      </w:r>
+      <w:r>
+        <w:t xml:space="preserve"> </w:t>
+      </w:r>
+      <w:r>
+        <w:t xml:space="preserve">not the eventual journal article DOI. Hydrated Git LFS objects must be fetched</w:t>
+      </w:r>
+      <w:r>
+        <w:t xml:space="preserve"> </w:t>
+      </w:r>
+      <w:r>
+        <w:t xml:space="preserve">from the tagged repository for a full numerical rerun.</w:t>
       </w:r>
     </w:p>
     <w:bookmarkEnd w:id="54"/>

</xml_diff>

<commit_message>
Strengthen allocation-limit evidence and revise LUP submission
</commit_message>
<xml_diff>
--- a/manuscript/manuscript.docx
+++ b/manuscript/manuscript.docx
@@ -5,6 +5,26 @@
     <w:bookmarkStart w:id="9" w:name="abstract"/>
     <w:p>
       <w:pPr>
+        <w:pStyle w:val="Title"/>
+      </w:pPr>
+      <w:r>
+        <w:t>Auditing constrained geospatial allocation under annual land-cover product uncertainty</w:t>
+      </w:r>
+    </w:p>
+    <w:p>
+      <w:pPr>
+        <w:pStyle w:val="Subtitle"/>
+      </w:pPr>
+      <w:r>
+        <w:t>Ning Zhou</w:t>
+        <w:br/>
+        <w:t>Beijing Freedo Technology Co., Ltd.</w:t>
+        <w:br/>
+        <w:t>Corresponding author: zhouning@freedotech.com</w:t>
+      </w:r>
+    </w:p>
+    <w:p>
+      <w:pPr>
         <w:pStyle w:val="Heading2"/>
       </w:pPr>
       <w:r>
@@ -16,7 +36,7 @@
         <w:pStyle w:val="FirstParagraph"/>
       </w:pPr>
       <w:r>
-        <w:t xml:space="preserve">Public land-cover products are increasingly used where authoritative local time series are unavailable, but product choice can alter both apparent urban change and model rankings. We present an auditable protocol for constrained spatial allocation using Geospatial Kernel, the algorithmic core of a Geospatial World Model, as the focal execution layer. Two annual 10-m products for Abu Dhabi city, Google Dynamic World (2017–2024) and an ArcGIS-served Impact Observatory/Microsoft/Esri series (2017–2025), were harmonized to the same 100-m, six-class modelling contract. Leakage-controlled expanding-window tests compared a FLUS-style ANN–CA, Geospatial Kernel, GeoFM-LDN, persistence and random minimum-change allocation using three seeds and 1,000 spatial-block bootstrap resamples. The target year supplied oracle class totals and evaluation labels only. In 2024, the ArcGIS-served series mapped 335.57 km² as built versus 155.98 km² in Dynamic World; built-class intersection over union was 0.449. Kernel ranked first in all four Dynamic World targets from 2021 to 2024, but in only two of four matched ArcGIS-served targets; FLUS-style led in 2021 and GeoFM-LDN in 2022. Kernel’s ArcGIS-minus-Dynamic World strict change Figure of Merit ranged from -0.244 to +0.205. Yet the product-specific 2031 planning frontiers retained FLUS-style and Kernel candidates in all three scenarios. The results support an inspectable proposal–projection–writeback boundary while showing that comparative skill is label-product dependent. Neither product is authoritative local land-use truth, model outputs remain 100 m, and the 2026–2031 maps are conditional stress tests rather than official forecasts.</w:t>
+        <w:t xml:space="preserve">Public land-cover products are increasingly used where authoritative local time series are unavailable, but product choice can alter both apparent urban change and model rankings. We present an auditable protocol for constrained spatial allocation using Geospatial Kernel, the algorithmic core of a Geospatial World Model, as the focal execution layer. Two annual 10-m products for Abu Dhabi city, Google Dynamic World (2017–2024) and an ArcGIS-served Impact Observatory/Microsoft/Esri series (2017–2025), were harmonized to the same 100-m, six-class modelling contract. Leakage-controlled expanding-window tests compared a FLUS-style ANN–CA, Geospatial Kernel, GeoFM-LDN, persistence and random minimum-change allocation using three seeds and 1,000 spatial-block bootstrap resamples. The target year supplied oracle class totals and evaluation labels only. In 2024, the ArcGIS-served series mapped 335.57 km² as built versus 155.98 km² in Dynamic World; built-class intersection over union was 0.449. Kernel had the highest mean FoM in four Dynamic World targets and two matched ArcGIS-served targets; these numerical ranks did not uniformly imply paired-interval separation. Net-change allocation imposed product-specific count-only FoM upper bounds of 0.086–0.813 in the ArcGIS folds. Kernel’s ArcGIS-minus-Dynamic World strict change Figure of Merit ranged from -0.244 to +0.205. Yet the product-specific 2031 planning frontiers retained FLUS-style and Kernel candidates in all three scenarios. The results support an inspectable proposal–projection–writeback boundary while showing that comparative skill is label-product dependent. Neither product is authoritative local land-use truth, model outputs remain 100 m, and the 2026–2031 maps are conditional stress tests rather than official forecasts.</w:t>
       </w:r>
     </w:p>
     <w:bookmarkEnd w:id="9"/>
@@ -50,7 +70,7 @@
         </w:numPr>
       </w:pPr>
       <w:r>
-        <w:t xml:space="preserve">Kernel leads four Dynamic World and two of four matched ArcGIS folds.</w:t>
+        <w:t xml:space="preserve">Numerical rankings depend on product and conditional paired uncertainty.</w:t>
       </w:r>
     </w:p>
     <w:p>
@@ -74,7 +94,7 @@
         </w:numPr>
       </w:pPr>
       <w:r>
-        <w:t xml:space="preserve">ArcGIS-served labels extend the scenario origin state to 2025.</w:t>
+        <w:t xml:space="preserve">Net-change allocation restricts the attainable change-detection score.</w:t>
       </w:r>
     </w:p>
     <w:p>
@@ -1472,6 +1492,245 @@
         <w:pStyle w:val="BodyText"/>
       </w:pPr>
       <w:r>
+        <w:t xml:space="preserve">This projection is a minimum-change allocator. Let</w:t>
+      </w:r>
+      <w:r>
+        <w:t xml:space="preserve"> </w:t>
+      </w:r>
+      <m:oMath>
+        <m:sSub>
+          <m:e>
+            <m:r>
+              <m:t>n</m:t>
+            </m:r>
+          </m:e>
+          <m:sub>
+            <m:r>
+              <m:t>c</m:t>
+            </m:r>
+          </m:sub>
+        </m:sSub>
+      </m:oMath>
+      <w:r>
+        <w:t xml:space="preserve"> </w:t>
+      </w:r>
+      <w:r>
+        <w:t xml:space="preserve">and</w:t>
+      </w:r>
+      <w:r>
+        <w:t xml:space="preserve"> </w:t>
+      </w:r>
+      <m:oMath>
+        <m:sSub>
+          <m:e>
+            <m:r>
+              <m:t>a</m:t>
+            </m:r>
+          </m:e>
+          <m:sub>
+            <m:r>
+              <m:t>c</m:t>
+            </m:r>
+          </m:sub>
+        </m:sSub>
+      </m:oMath>
+      <w:r>
+        <w:t xml:space="preserve"> </w:t>
+      </w:r>
+      <w:r>
+        <w:t xml:space="preserve">be origin and feasible target counts. The number of changed cells is exactly</w:t>
+      </w:r>
+      <w:r>
+        <w:t xml:space="preserve"> </w:t>
+      </w:r>
+      <m:oMath>
+        <m:r>
+          <m:t>M</m:t>
+        </m:r>
+        <m:r>
+          <m:rPr>
+            <m:sty m:val="p"/>
+          </m:rPr>
+          <m:t>=</m:t>
+        </m:r>
+        <m:f>
+          <m:fPr>
+            <m:type m:val="bar"/>
+          </m:fPr>
+          <m:num>
+            <m:r>
+              <m:t>1</m:t>
+            </m:r>
+          </m:num>
+          <m:den>
+            <m:r>
+              <m:t>2</m:t>
+            </m:r>
+          </m:den>
+        </m:f>
+        <m:nary>
+          <m:naryPr>
+            <m:chr m:val="∑"/>
+            <m:limLoc m:val="undOvr"/>
+            <m:subHide m:val="off"/>
+            <m:supHide m:val="on"/>
+          </m:naryPr>
+          <m:sub>
+            <m:r>
+              <m:t>c</m:t>
+            </m:r>
+          </m:sub>
+          <m:sup>
+            <m:r>
+              <m:t>​</m:t>
+            </m:r>
+          </m:sup>
+          <m:e>
+            <m:r>
+              <m:rPr>
+                <m:sty m:val="p"/>
+              </m:rPr>
+              <m:t>|</m:t>
+            </m:r>
+          </m:e>
+        </m:nary>
+        <m:sSub>
+          <m:e>
+            <m:r>
+              <m:t>a</m:t>
+            </m:r>
+          </m:e>
+          <m:sub>
+            <m:r>
+              <m:t>c</m:t>
+            </m:r>
+          </m:sub>
+        </m:sSub>
+        <m:r>
+          <m:rPr>
+            <m:sty m:val="p"/>
+          </m:rPr>
+          <m:t>−</m:t>
+        </m:r>
+        <m:sSub>
+          <m:e>
+            <m:r>
+              <m:t>n</m:t>
+            </m:r>
+          </m:e>
+          <m:sub>
+            <m:r>
+              <m:t>c</m:t>
+            </m:r>
+          </m:sub>
+        </m:sSub>
+        <m:r>
+          <m:rPr>
+            <m:sty m:val="p"/>
+          </m:rPr>
+          <m:t>|</m:t>
+        </m:r>
+      </m:oMath>
+      <w:r>
+        <w:t xml:space="preserve">. A class can supply cells or receive cells in one step, but cannot do both; unchanged class totals therefore suppress within-class gross gain/loss exchanges. This is a substantive restriction on land-cover dynamics, shared by GeoFM-LDN through its use of the same allocator, rather than a consequence of exact-count constraints in general. With</w:t>
+      </w:r>
+      <w:r>
+        <w:t xml:space="preserve"> </w:t>
+      </w:r>
+      <m:oMath>
+        <m:r>
+          <m:t>O</m:t>
+        </m:r>
+      </m:oMath>
+      <w:r>
+        <w:t xml:space="preserve"> </w:t>
+      </w:r>
+      <w:r>
+        <w:t xml:space="preserve">observed changed cells, strict FoM is bounded above by</w:t>
+      </w:r>
+      <w:r>
+        <w:t xml:space="preserve"> </w:t>
+      </w:r>
+      <m:oMath>
+        <m:r>
+          <m:rPr>
+            <m:sty m:val="p"/>
+          </m:rPr>
+          <m:t>min</m:t>
+        </m:r>
+        <m:r>
+          <m:rPr>
+            <m:sty m:val="p"/>
+          </m:rPr>
+          <m:t>(</m:t>
+        </m:r>
+        <m:r>
+          <m:t>M</m:t>
+        </m:r>
+        <m:r>
+          <m:rPr>
+            <m:sty m:val="p"/>
+          </m:rPr>
+          <m:t>,</m:t>
+        </m:r>
+        <m:r>
+          <m:t>O</m:t>
+        </m:r>
+        <m:r>
+          <m:rPr>
+            <m:sty m:val="p"/>
+          </m:rPr>
+          <m:t>)</m:t>
+        </m:r>
+        <m:r>
+          <m:rPr>
+            <m:sty m:val="p"/>
+          </m:rPr>
+          <m:t>/</m:t>
+        </m:r>
+        <m:r>
+          <m:rPr>
+            <m:sty m:val="p"/>
+          </m:rPr>
+          <m:t>max</m:t>
+        </m:r>
+        <m:r>
+          <m:rPr>
+            <m:sty m:val="p"/>
+          </m:rPr>
+          <m:t>(</m:t>
+        </m:r>
+        <m:r>
+          <m:t>M</m:t>
+        </m:r>
+        <m:r>
+          <m:rPr>
+            <m:sty m:val="p"/>
+          </m:rPr>
+          <m:t>,</m:t>
+        </m:r>
+        <m:r>
+          <m:t>O</m:t>
+        </m:r>
+        <m:r>
+          <m:rPr>
+            <m:sty m:val="p"/>
+          </m:rPr>
+          <m:t>)</m:t>
+        </m:r>
+      </m:oMath>
+      <w:r>
+        <w:t xml:space="preserve"> </w:t>
+      </w:r>
+      <w:r>
+        <w:t xml:space="preserve">when the denominator is nonzero. This is a loose count-only bound, not an attainable optimum: destination classes, hard masks and spatial restrictions can further reduce attainable hits. Supplementary Table S7 derives the bound from the frozen fold reports and checks predicted moves against origin and feasible target counts. We do not divide observed FoM by this bound or interpret such a ratio as independently validated skill.</w:t>
+      </w:r>
+    </w:p>
+    <w:p>
+      <w:pPr>
+        <w:pStyle w:val="BodyText"/>
+      </w:pPr>
+      <w:r>
         <w:t xml:space="preserve">The projected raster is written as the next</w:t>
       </w:r>
       <w:r>
@@ -1870,7 +2129,7 @@
         <w:t xml:space="preserve"> </w:t>
       </w:r>
       <w:r>
-        <w:t xml:space="preserve">path identifier is retained only for artifact compatibility. It is not an endorsement of compact-city outcomes, which can have distributional trade-offs (Burton, 2000). Dynamic World-origin actions cover 2025–2031 and ArcGIS-origin actions cover 2026–2031. Their totals are explicit extensions of the preceding annual difference and are not derived from an official population, housing or infrastructure forecast. Future exogenous rasters are held at their respective final observed-year values. The green-priority action is not a water-budget model. Each candidate is run at seeds 31, 47 and 73, and planning tables report arithmetic means and population standard deviations. No p-values are reported because the three seeds describe computational variability, not independent field samples. The primary Pareto comparison is within each scenario, contrasting the three models under the same product-specific action; cross-product frontier membership is a sensitivity test, not a forecast-accuracy comparison. The current release objective set is road access, prior-built distance and union-built component density. Ecological conversion is reported as a diagnostic rather than a Pareto objective because it is structurally zero for the exact-count Kernel and GeoFM-LDN allocations. We treat this as a release objective set rather than a prespecified planning preference, and treat its variants as robustness diagnostics.</w:t>
+        <w:t xml:space="preserve">path identifier is retained only for artifact compatibility. It is not an endorsement of compact-city outcomes, which can have distributional trade-offs (Burton, 2000). Dynamic World-origin actions cover 2025–2031 and ArcGIS-origin actions cover 2026–2031. Their totals are explicit extensions of the preceding annual difference and are not derived from an official population, housing or infrastructure forecast. Future exogenous rasters are held at their respective final observed-year values. The green-priority action is not a water-budget model. Each candidate is run at seeds 31, 47 and 73, and planning tables report arithmetic means and population standard deviations. No p-values are reported because the three seeds describe computational variability, not independent field samples. The green-priority label denotes a vegetation-quantity sensitivity action, not demonstrated ecological sustainability. The primary Pareto comparison is within each scenario, contrasting the three models under the same product-specific action; cross-product frontier membership is a sensitivity test, not a forecast-accuracy comparison. The current release objective set is road access, prior-built distance and union-built component density. Ecological conversion is reported as a diagnostic rather than a Pareto objective because it is structurally zero for the exact-count Kernel and GeoFM-LDN allocations. We treat this as a release objective set rather than a prespecified planning preference, and treat its variants as robustness diagnostics.</w:t>
       </w:r>
     </w:p>
     <w:bookmarkEnd w:id="19"/>
@@ -2004,6 +2263,7 @@
     <w:p>
       <w:pPr>
         <w:pStyle w:val="CaptionedFigure"/>
+        <w:keepNext/>
       </w:pPr>
       <w:r>
         <w:drawing>
@@ -2051,19 +2311,20 @@
     <w:p>
       <w:pPr>
         <w:pStyle w:val="ImageCaption"/>
-      </w:pPr>
-      <w:r>
-        <w:t xml:space="preserve">Benchmark and Geospatial Kernel execution contract. Public annual land-cover, embedding, night-light, terrain and road layers are aligned to a common 100-m Abu Dhabi grid. The Kernel exposes a learned proposal, a constraint projection and a state writeback. The schematic describes a public-data benchmark and does not imply statutory planning boundaries.</w:t>
+        <w:keepLines/>
+      </w:pPr>
+      <w:r>
+        <w:t>Figure 1. Benchmark and Geospatial Kernel execution contract. Public annual land-cover, embedding, night-light, terrain and road layers are aligned to a common 100-m Abu Dhabi grid. The Kernel exposes a learned proposal, a constraint projection and a state writeback. The schematic describes a public-data benchmark and does not imply statutory planning boundaries.</w:t>
       </w:r>
     </w:p>
     <w:bookmarkEnd w:id="25"/>
-    <w:bookmarkStart w:id="29" w:name="historical-and-planning-results"/>
+    <w:bookmarkStart w:id="29" w:name="X3f5e228b10c7eb77c564f813ab2c4e4911c7a74"/>
     <w:p>
       <w:pPr>
         <w:pStyle w:val="Heading3"/>
       </w:pPr>
       <w:r>
-        <w:t xml:space="preserve">Historical and planning results</w:t>
+        <w:t xml:space="preserve">Secondary historical benchmark and planning objective definitions</w:t>
       </w:r>
     </w:p>
     <w:p>
@@ -2605,6 +2866,7 @@
     <w:p>
       <w:pPr>
         <w:pStyle w:val="CaptionedFigure"/>
+        <w:keepNext/>
       </w:pPr>
       <w:r>
         <w:drawing>
@@ -2652,9 +2914,10 @@
     <w:p>
       <w:pPr>
         <w:pStyle w:val="ImageCaption"/>
-      </w:pPr>
-      <w:r>
-        <w:t xml:space="preserve">Historical allocation skill. Strict destination-change FoM is the primary metric; change F1 is shown as a secondary diagnostic. Bars show mean plus or minus population standard deviation across the three frozen seeds. Persistence and random allocation are explicit zero-model controls.</w:t>
+        <w:keepLines/>
+      </w:pPr>
+      <w:r>
+        <w:t>Figure 2. Historical allocation skill. Strict destination-change FoM is the primary metric; change F1 is shown as a secondary diagnostic. Bars show mean plus or minus population standard deviation across the three frozen seeds. Persistence and random allocation are explicit zero-model controls.</w:t>
       </w:r>
     </w:p>
     <w:p>
@@ -3163,6 +3426,7 @@
     <w:p>
       <w:pPr>
         <w:pStyle w:val="CaptionedFigure"/>
+        <w:keepNext/>
       </w:pPr>
       <w:r>
         <w:drawing>
@@ -3210,9 +3474,10 @@
     <w:p>
       <w:pPr>
         <w:pStyle w:val="ImageCaption"/>
-      </w:pPr>
-      <w:r>
-        <w:t xml:space="preserve">Rolling-origin robustness and external-product diagnostics. Panel a reports strict destination-change FoM for four leakage-controlled one-step targets; points show means and sample standard deviations across three computational seeds. Panel b reports Kernel-minus-baseline paired spatial-block contrasts; points are mean seed medians and whiskers span the minimum to maximum of seed-specific 95% intervals from 1,000 resamples of 8 × 8-cell blocks. Panel c compares same-year Dynamic World 2020 and 2021 built stocks, plus 2021 Kernel and persistence predictions, with the corresponding WorldCover products at four 100-m built-fraction thresholds. Panel d compares Dynamic World built gain with the count-controlled Kernel and random allocations, where WorldCover gain count is supplied as the action. The original oracle-demand gain test is structural-zero and is not plotted as model evidence. The WorldCover comparison is an external public-product diagnostic, not authoritative ground truth. Source data are provided in source_data_fig03_rolling_external_diagnostics.csv.</w:t>
+        <w:keepLines/>
+      </w:pPr>
+      <w:r>
+        <w:t>Figure 3. Rolling-origin robustness and external-product diagnostics. Panel a reports strict destination-change FoM for four leakage-controlled one-step targets; points show means and sample standard deviations across three computational seeds. Panel b reports Kernel-minus-baseline paired spatial-block contrasts; points are mean seed medians and whiskers span the minimum to maximum of seed-specific 95% intervals from 1,000 resamples of 8 × 8-cell blocks. Panel c compares same-year Dynamic World 2020 and 2021 built stocks, plus 2021 Kernel and persistence predictions, with the corresponding WorldCover products at four 100-m built-fraction thresholds. Panel d compares Dynamic World built gain with the count-controlled Kernel and random allocations, where WorldCover gain count is supplied as the action. The original oracle-demand gain test is structural-zero and is not plotted as model evidence. The WorldCover comparison is an external public-product diagnostic, not authoritative ground truth. Source data are provided in source_data_fig03_rolling_external_diagnostics.csv.</w:t>
       </w:r>
     </w:p>
     <w:p>
@@ -3426,7 +3691,61 @@
         <w:t xml:space="preserve"> </w:t>
       </w:r>
       <w:r>
-        <w:t xml:space="preserve">its absolute score and rank remain dependent on the product pipeline. The</w:t>
+        <w:t xml:space="preserve">its absolute score and rank remain dependent on the product pipeline. Supplementary</w:t>
+      </w:r>
+      <w:r>
+        <w:t xml:space="preserve"> </w:t>
+      </w:r>
+      <w:r>
+        <w:t xml:space="preserve">Table S7 reports all seed-specific paired intervals for Kernel versus FLUS-style</w:t>
+      </w:r>
+      <w:r>
+        <w:t xml:space="preserve"> </w:t>
+      </w:r>
+      <w:r>
+        <w:t xml:space="preserve">and GeoFM-LDN versus Kernel. In the ArcGIS 2023 target, all three GeoFM-LDN-minus-</w:t>
+      </w:r>
+      <w:r>
+        <w:t xml:space="preserve"> </w:t>
+      </w:r>
+      <w:r>
+        <w:t xml:space="preserve">Kernel intervals include zero despite Kernel’s higher mean; in 2024, two exclude</w:t>
+      </w:r>
+      <w:r>
+        <w:t xml:space="preserve"> </w:t>
+      </w:r>
+      <w:r>
+        <w:t xml:space="preserve">zero in Kernel’s favour and one includes zero. These are conditional intervals,</w:t>
+      </w:r>
+      <w:r>
+        <w:t xml:space="preserve"> </w:t>
+      </w:r>
+      <w:r>
+        <w:t xml:space="preserve">not a pooled ranking test. The additional ArcGIS 2025 target gives mean FoM of</w:t>
+      </w:r>
+      <w:r>
+        <w:t xml:space="preserve"> </w:t>
+      </w:r>
+      <w:r>
+        <w:t xml:space="preserve">0.0731 for FLUS-style, 0.0654 for GeoFM-LDN and 0.0579 for Kernel; Kernel is</w:t>
+      </w:r>
+      <w:r>
+        <w:t xml:space="preserve"> </w:t>
+      </w:r>
+      <w:r>
+        <w:t xml:space="preserve">therefore not the numerical leader in the latest year. Block-size sensitivity</w:t>
+      </w:r>
+      <w:r>
+        <w:t xml:space="preserve"> </w:t>
+      </w:r>
+      <w:r>
+        <w:t xml:space="preserve">has not been established, and repeated seeds do not constitute independent</w:t>
+      </w:r>
+      <w:r>
+        <w:t xml:space="preserve"> </w:t>
+      </w:r>
+      <w:r>
+        <w:t xml:space="preserve">spatial or temporal replication. The</w:t>
       </w:r>
       <w:r>
         <w:t xml:space="preserve"> </w:t>
@@ -3458,7 +3777,75 @@
         <w:pStyle w:val="BodyText"/>
       </w:pPr>
       <w:r>
-        <w:t xml:space="preserve">The planning conclusion was more stable than the historical ranking. Recomputing</w:t>
+        <w:t xml:space="preserve">The count-only analysis exposes an additional source of score dependence. In</w:t>
+      </w:r>
+      <w:r>
+        <w:t xml:space="preserve"> </w:t>
+      </w:r>
+      <w:r>
+        <w:t xml:space="preserve">the ArcGIS 2021 fold, the minimum-change action permits 278 moves against 3,241</w:t>
+      </w:r>
+      <w:r>
+        <w:t xml:space="preserve"> </w:t>
+      </w:r>
+      <w:r>
+        <w:t xml:space="preserve">observed changes, bounding strict FoM at 0.0858 even before destination or</w:t>
+      </w:r>
+      <w:r>
+        <w:t xml:space="preserve"> </w:t>
+      </w:r>
+      <w:r>
+        <w:t xml:space="preserve">hard-mask restrictions. In 2022, 6,864 permitted moves against 8,446 observed</w:t>
+      </w:r>
+      <w:r>
+        <w:t xml:space="preserve"> </w:t>
+      </w:r>
+      <w:r>
+        <w:t xml:space="preserve">changes give a much higher bound of 0.8127. The corresponding Dynamic World</w:t>
+      </w:r>
+      <w:r>
+        <w:t xml:space="preserve"> </w:t>
+      </w:r>
+      <w:r>
+        <w:t xml:space="preserve">bounds are 0.4590 and 0.2885. All nine fold bounds and observed scores are</w:t>
+      </w:r>
+      <w:r>
+        <w:t xml:space="preserve"> </w:t>
+      </w:r>
+      <w:r>
+        <w:t xml:space="preserve">reported in Supplementary Table S7. The reversal in these bounds means that</w:t>
+      </w:r>
+      <w:r>
+        <w:t xml:space="preserve"> </w:t>
+      </w:r>
+      <w:r>
+        <w:t xml:space="preserve">cross-product FoM differences combine allocation skill with the relationship</w:t>
+      </w:r>
+      <w:r>
+        <w:t xml:space="preserve"> </w:t>
+      </w:r>
+      <w:r>
+        <w:t xml:space="preserve">between net and gross product change. It does not identify which product is</w:t>
+      </w:r>
+      <w:r>
+        <w:t xml:space="preserve"> </w:t>
+      </w:r>
+      <w:r>
+        <w:t xml:space="preserve">more accurate or establish the performance of an allocator allowing simultaneous</w:t>
+      </w:r>
+      <w:r>
+        <w:t xml:space="preserve"> </w:t>
+      </w:r>
+      <w:r>
+        <w:t xml:space="preserve">gain and loss of each class.</w:t>
+      </w:r>
+    </w:p>
+    <w:p>
+      <w:pPr>
+        <w:pStyle w:val="BodyText"/>
+      </w:pPr>
+      <w:r>
+        <w:t xml:space="preserve">Frontier membership was more stable than the historical numerical ranking. Recomputing</w:t>
       </w:r>
       <w:r>
         <w:t xml:space="preserve"> </w:t>
@@ -3488,7 +3875,31 @@
         <w:t xml:space="preserve"> </w:t>
       </w:r>
       <w:r>
-        <w:t xml:space="preserve">replacement under the released proxy objectives. Fig. 4 separates changes in</w:t>
+        <w:t xml:space="preserve">replacement under the released proxy objectives. Identical membership among</w:t>
+      </w:r>
+      <w:r>
+        <w:t xml:space="preserve"> </w:t>
+      </w:r>
+      <w:r>
+        <w:t xml:space="preserve">three candidates does not establish spatial agreement of their allocations or</w:t>
+      </w:r>
+      <w:r>
+        <w:t xml:space="preserve"> </w:t>
+      </w:r>
+      <w:r>
+        <w:t xml:space="preserve">stability of planning benefits. Product-specific origins, horizons and actions</w:t>
+      </w:r>
+      <w:r>
+        <w:t xml:space="preserve"> </w:t>
+      </w:r>
+      <w:r>
+        <w:t xml:space="preserve">also differ; this is not a controlled experiment holding demand and initial</w:t>
+      </w:r>
+      <w:r>
+        <w:t xml:space="preserve"> </w:t>
+      </w:r>
+      <w:r>
+        <w:t xml:space="preserve">conditions fixed. Fig. 4 separates changes in</w:t>
       </w:r>
       <w:r>
         <w:t xml:space="preserve"> </w:t>
@@ -3506,6 +3917,7 @@
     <w:p>
       <w:pPr>
         <w:pStyle w:val="CaptionedFigure"/>
+        <w:keepNext/>
       </w:pPr>
       <w:r>
         <w:drawing>
@@ -3553,9 +3965,10 @@
     <w:p>
       <w:pPr>
         <w:pStyle w:val="ImageCaption"/>
-      </w:pPr>
-      <w:r>
-        <w:t xml:space="preserve">Land-cover product robustness. Panel a compares annual mapped built area; only the ArcGIS-served Impact Observatory/Microsoft/Esri series extends to 2025. Panel b reports same-year all-class agreement and built-class intersection over union after six-class harmonization at 100 m. Panel c reports strict destination-change FoM for the ArcGIS-served expanding-window backtest; points are three-seed means and whiskers are population standard deviations. Panel d gives the ArcGIS-served-minus-Dynamic World mean FoM for the four matched one-step targets. All models omit the later road snapshot. Product-specific labels, origin states, oracle totals, origin water/wetland masks and quality semantics are retained, so this is a whole-product-pipeline test rather than authoritative validation. Source data are provided in source_data_fig04_product_robustness.csv.</w:t>
+        <w:keepLines/>
+      </w:pPr>
+      <w:r>
+        <w:t>Figure 4. Land-cover product robustness. Panel a compares annual mapped built area; only the ArcGIS-served Impact Observatory/Microsoft/Esri series extends to 2025. Panel b reports same-year all-class agreement and built-class intersection over union after six-class harmonization at 100 m. Panel c reports strict destination-change FoM for the ArcGIS-served expanding-window backtest; points are three-seed means and whiskers are population standard deviations. Panel d gives the ArcGIS-served-minus-Dynamic World mean FoM for the four matched one-step targets. All models omit the later road snapshot. Product-specific labels, origin states, oracle totals, origin water/wetland masks and quality semantics are retained, so this is a whole-product-pipeline test rather than authoritative validation. Source data are provided in source_data_fig04_product_robustness.csv.</w:t>
       </w:r>
     </w:p>
     <w:p>
@@ -3665,6 +4078,7 @@
     <w:p>
       <w:pPr>
         <w:pStyle w:val="CaptionedFigure"/>
+        <w:keepNext/>
       </w:pPr>
       <w:r>
         <w:drawing>
@@ -3712,9 +4126,10 @@
     <w:p>
       <w:pPr>
         <w:pStyle w:val="ImageCaption"/>
-      </w:pPr>
-      <w:r>
-        <w:t xml:space="preserve">Conditional planning objectives. The 2031 outcomes compare the three models under moderate-growth, green-priority-growth and high-outward-growth actions. Panels show the three release objectives: distance to major roads, distance to pre-existing built cells, and connected components in the combined 2024-built and newly built footprint. Black outlines indicate membership of the within-scenario Pareto frontier.</w:t>
+        <w:keepLines/>
+      </w:pPr>
+      <w:r>
+        <w:t>Figure 5. Conditional planning objectives. The 2031 outcomes compare the three models under moderate-growth, green-priority-growth and high-outward-growth actions. Panels show the three release objectives: distance to major roads, distance to pre-existing built cells, and connected components in the combined 2024-built and newly built footprint. Black outlines indicate membership of the within-scenario Pareto frontier.</w:t>
       </w:r>
     </w:p>
     <w:p>
@@ -4835,6 +5250,7 @@
     <w:p>
       <w:pPr>
         <w:pStyle w:val="CaptionedFigure"/>
+        <w:keepNext/>
       </w:pPr>
       <w:r>
         <w:drawing>
@@ -4882,9 +5298,10 @@
     <w:p>
       <w:pPr>
         <w:pStyle w:val="ImageCaption"/>
-      </w:pPr>
-      <w:r>
-        <w:t xml:space="preserve">Mechanism controls. Panel A compares the full transition proposal with selected proposal controls. Panel B gives the strict destination-change FoM difference between matched runtime controls and the full Kernel. Bars show mean plus or minus population standard deviation across the three frozen seeds. The no-state-writeback control is undefined for the 2023 one-step target and is therefore shown only for 2024. These are execution diagnostics, not causal policy experiments.</w:t>
+        <w:keepLines/>
+      </w:pPr>
+      <w:r>
+        <w:t>Figure 6. Mechanism controls. Panel A compares the full transition proposal with selected proposal controls. Panel B gives the strict destination-change FoM difference between matched runtime controls and the full Kernel. Bars show mean plus or minus population standard deviation across the three frozen seeds. The no-state-writeback control is undefined for the 2023 one-step target and is therefore shown only for 2024. These are execution diagnostics, not causal policy experiments.</w:t>
       </w:r>
     </w:p>
     <w:bookmarkEnd w:id="45"/>
@@ -4920,19 +5337,55 @@
         <w:t xml:space="preserve"> </w:t>
       </w:r>
       <w:r>
-        <w:t xml:space="preserve">FLUS-style errors were 2,504, 2,888 and 2,568 pixels. Seed-level projections</w:t>
-      </w:r>
-      <w:r>
-        <w:t xml:space="preserve"> </w:t>
-      </w:r>
-      <w:r>
-        <w:t xml:space="preserve">meet their feasible class totals, but majority voting can produce a different</w:t>
-      </w:r>
-      <w:r>
-        <w:t xml:space="preserve"> </w:t>
-      </w:r>
-      <w:r>
-        <w:t xml:space="preserve">raster and therefore a non-zero ensemble error. All 312 historical,</w:t>
+        <w:t xml:space="preserve">FLUS-style errors were 2,504, 2,888 and 2,568 pixels. Kernel and GeoFM-LDN seed-level projections</w:t>
+      </w:r>
+      <w:r>
+        <w:t xml:space="preserve"> </w:t>
+      </w:r>
+      <w:r>
+        <w:t xml:space="preserve">meet their feasible class totals, whereas the finite-iteration FLUS control can</w:t>
+      </w:r>
+      <w:r>
+        <w:t xml:space="preserve"> </w:t>
+      </w:r>
+      <w:r>
+        <w:t xml:space="preserve">retain demand error. Majority voting can produce a different raster and therefore</w:t>
+      </w:r>
+      <w:r>
+        <w:t xml:space="preserve"> </w:t>
+      </w:r>
+      <w:r>
+        <w:t xml:space="preserve">a non-zero ensemble error even for an exact-count allocator. The constraint-</w:t>
+      </w:r>
+      <w:r>
+        <w:t xml:space="preserve"> </w:t>
+      </w:r>
+      <w:r>
+        <w:t xml:space="preserve">preserving claim applies to individual projected members, not to count preservation</w:t>
+      </w:r>
+      <w:r>
+        <w:t xml:space="preserve"> </w:t>
+      </w:r>
+      <w:r>
+        <w:t xml:space="preserve">in the majority-vote delivery. Those ensembles are descriptive consensus maps.</w:t>
+      </w:r>
+      <w:r>
+        <w:t xml:space="preserve"> </w:t>
+      </w:r>
+      <w:r>
+        <w:t xml:space="preserve">Any use requiring exact totals must select and audit a feasible seed-level member</w:t>
+      </w:r>
+      <w:r>
+        <w:t xml:space="preserve"> </w:t>
+      </w:r>
+      <w:r>
+        <w:t xml:space="preserve">or reproject the consensus, with objective values recomputed on that final map.</w:t>
+      </w:r>
+      <w:r>
+        <w:t xml:space="preserve"> </w:t>
+      </w:r>
+      <w:r>
+        <w:t xml:space="preserve">No such reprojected ensemble is evaluated here. All 312 historical,</w:t>
       </w:r>
       <w:r>
         <w:t xml:space="preserve"> </w:t>
@@ -4968,6 +5421,7 @@
     <w:p>
       <w:pPr>
         <w:pStyle w:val="CaptionedFigure"/>
+        <w:keepNext/>
       </w:pPr>
       <w:r>
         <w:drawing>
@@ -5015,14 +5469,15 @@
     <w:p>
       <w:pPr>
         <w:pStyle w:val="ImageCaption"/>
-      </w:pPr>
-      <w:r>
-        <w:t xml:space="preserve">High-outward-growth spatial footprints. The observed 2024 state is compared with each model’s 2031 majority-vote ensemble. Orange denotes cells newly built between 2024 and 2031; grey denotes cells already built in 2024. The map is a 100-m scenario stress-test product, not a cadastral or statutory land-use map.</w:t>
+        <w:keepLines/>
+      </w:pPr>
+      <w:r>
+        <w:t>Figure 7. High-outward-growth spatial footprints. The observed 2024 state is compared with each model’s 2031 majority-vote ensemble. Orange denotes cells newly built between 2024 and 2031; grey denotes cells already built in 2024. The map is a 100-m scenario stress-test product, not a cadastral or statutory land-use map.</w:t>
       </w:r>
     </w:p>
     <w:bookmarkEnd w:id="49"/>
     <w:bookmarkEnd w:id="50"/>
-    <w:bookmarkStart w:id="51" w:name="discussion"/>
+    <w:bookmarkStart w:id="52" w:name="discussion"/>
     <w:p>
       <w:pPr>
         <w:pStyle w:val="Heading2"/>
@@ -5106,19 +5561,13 @@
         <w:t xml:space="preserve"> </w:t>
       </w:r>
       <w:r>
-        <w:t xml:space="preserve">which may contain roads constructed after 2022. This information is shared by</w:t>
-      </w:r>
-      <w:r>
-        <w:t xml:space="preserve"> </w:t>
-      </w:r>
-      <w:r>
-        <w:t xml:space="preserve">all three pipelines and therefore does not change their ordering, but it can</w:t>
-      </w:r>
-      <w:r>
-        <w:t xml:space="preserve"> </w:t>
-      </w:r>
-      <w:r>
-        <w:t xml:space="preserve">affect absolute scores; the strict rolling-origin analysis removes those road</w:t>
+        <w:t xml:space="preserve">which may contain roads constructed after 2022. Sharing this information does not guarantee an unchanged model ordering,</w:t>
+      </w:r>
+      <w:r>
+        <w:t xml:space="preserve"> </w:t>
+      </w:r>
+      <w:r>
+        <w:t xml:space="preserve">because learners can exploit it differently; the strict rolling-origin analysis removes those road</w:t>
       </w:r>
       <w:r>
         <w:t xml:space="preserve"> </w:t>
@@ -5154,7 +5603,13 @@
         <w:t xml:space="preserve"> </w:t>
       </w:r>
       <w:r>
-        <w:t xml:space="preserve">protected-area layers are proxies, future drivers are held at 2024, and the</w:t>
+        <w:t xml:space="preserve">protected-area layers are proxies, future drivers are held at the respective</w:t>
+      </w:r>
+      <w:r>
+        <w:t xml:space="preserve"> </w:t>
+      </w:r>
+      <w:r>
+        <w:t xml:space="preserve">2024 or 2025 origin-year values, and the</w:t>
       </w:r>
       <w:r>
         <w:t xml:space="preserve"> </w:t>
@@ -5253,8 +5708,136 @@
         <w:t xml:space="preserve">while retaining the same execution contract.</w:t>
       </w:r>
     </w:p>
+    <w:bookmarkStart w:id="51" w:name="Xc747f5f68438c4d1b672214b96bce9a17077e90"/>
+    <w:p>
+      <w:pPr>
+        <w:pStyle w:val="Heading3"/>
+      </w:pPr>
+      <w:r>
+        <w:t xml:space="preserve">Implications for planning use and validation</w:t>
+      </w:r>
+    </w:p>
+    <w:p>
+      <w:pPr>
+        <w:pStyle w:val="FirstParagraph"/>
+      </w:pPr>
+      <w:r>
+        <w:t xml:space="preserve">The practical role of this protocol is to expose where a public-data scenario</w:t>
+      </w:r>
+      <w:r>
+        <w:t xml:space="preserve"> </w:t>
+      </w:r>
+      <w:r>
+        <w:t xml:space="preserve">depends on observational definitions and allocation restrictions before a</w:t>
+      </w:r>
+      <w:r>
+        <w:t xml:space="preserve"> </w:t>
+      </w:r>
+      <w:r>
+        <w:t xml:space="preserve">planner treats its map as evidence. Stable frontier membership is insufficient</w:t>
+      </w:r>
+      <w:r>
+        <w:t xml:space="preserve"> </w:t>
+      </w:r>
+      <w:r>
+        <w:t xml:space="preserve">for selecting a site or infrastructure corridor: a decision also requires the</w:t>
+      </w:r>
+      <w:r>
+        <w:t xml:space="preserve"> </w:t>
+      </w:r>
+      <w:r>
+        <w:t xml:space="preserve">spatial overlap and disagreement of new-built locations, feasible water and</w:t>
+      </w:r>
+      <w:r>
+        <w:t xml:space="preserve"> </w:t>
+      </w:r>
+      <w:r>
+        <w:t xml:space="preserve">infrastructure demands, and the magnitude of the objective differences. These</w:t>
+      </w:r>
+      <w:r>
+        <w:t xml:space="preserve"> </w:t>
+      </w:r>
+      <w:r>
+        <w:t xml:space="preserve">decision-level tests have not been completed here. The existing frontier is a</w:t>
+      </w:r>
+      <w:r>
+        <w:t xml:space="preserve"> </w:t>
+      </w:r>
+      <w:r>
+        <w:t xml:space="preserve">conditional comparison of three implementations, not a search over all feasible</w:t>
+      </w:r>
+      <w:r>
+        <w:t xml:space="preserve"> </w:t>
+      </w:r>
+      <w:r>
+        <w:t xml:space="preserve">plans or a recommendation that either retained model should determine land use.</w:t>
+      </w:r>
+    </w:p>
+    <w:p>
+      <w:pPr>
+        <w:pStyle w:val="BodyText"/>
+      </w:pPr>
+      <w:r>
+        <w:t xml:space="preserve">The next validation step should use a spatially stratified reference sample of</w:t>
+      </w:r>
+      <w:r>
+        <w:t xml:space="preserve"> </w:t>
+      </w:r>
+      <w:r>
+        <w:t xml:space="preserve">product-agreement changes, product-disagreement changes and stable cells, assessed</w:t>
+      </w:r>
+      <w:r>
+        <w:t xml:space="preserve"> </w:t>
+      </w:r>
+      <w:r>
+        <w:t xml:space="preserve">from contemporaneous independent imagery or locally approved records. Reference</w:t>
+      </w:r>
+      <w:r>
+        <w:t xml:space="preserve"> </w:t>
+      </w:r>
+      <w:r>
+        <w:t xml:space="preserve">interpretation should be blinded to model identity, record ambiguous cases and</w:t>
+      </w:r>
+      <w:r>
+        <w:t xml:space="preserve"> </w:t>
+      </w:r>
+      <w:r>
+        <w:t xml:space="preserve">report sampling weights and class-specific gain/loss accuracy. In parallel, a</w:t>
+      </w:r>
+      <w:r>
+        <w:t xml:space="preserve"> </w:t>
+      </w:r>
+      <w:r>
+        <w:t xml:space="preserve">transition-budget allocator permitting simultaneous gain and loss should be</w:t>
+      </w:r>
+      <w:r>
+        <w:t xml:space="preserve"> </w:t>
+      </w:r>
+      <w:r>
+        <w:t xml:space="preserve">compared with the minimum-change projection under the same proposal and masks.</w:t>
+      </w:r>
+      <w:r>
+        <w:t xml:space="preserve"> </w:t>
+      </w:r>
+      <w:r>
+        <w:t xml:space="preserve">Neither independent reference validation nor this gross-transition experiment</w:t>
+      </w:r>
+      <w:r>
+        <w:t xml:space="preserve"> </w:t>
+      </w:r>
+      <w:r>
+        <w:t xml:space="preserve">has been performed. They are requirements for extending the present conditional</w:t>
+      </w:r>
+      <w:r>
+        <w:t xml:space="preserve"> </w:t>
+      </w:r>
+      <w:r>
+        <w:t xml:space="preserve">allocation findings to operational planning claims.</w:t>
+      </w:r>
+    </w:p>
     <w:bookmarkEnd w:id="51"/>
-    <w:bookmarkStart w:id="52" w:name="conclusions"/>
+    <w:bookmarkEnd w:id="52"/>
+    <w:bookmarkStart w:id="53" w:name="conclusions"/>
     <w:p>
       <w:pPr>
         <w:pStyle w:val="Heading2"/>
@@ -5304,7 +5887,19 @@
         <w:t xml:space="preserve"> </w:t>
       </w:r>
       <w:r>
-        <w:t xml:space="preserve">and state writeback, not a product-independent accuracy claim.</w:t>
+        <w:t xml:space="preserve">and state writeback, not a product-independent accuracy claim. The count-only bounds further show</w:t>
+      </w:r>
+      <w:r>
+        <w:t xml:space="preserve"> </w:t>
+      </w:r>
+      <w:r>
+        <w:t xml:space="preserve">that net-change allocation can suppress much of the gross change represented by</w:t>
+      </w:r>
+      <w:r>
+        <w:t xml:space="preserve"> </w:t>
+      </w:r>
+      <w:r>
+        <w:t xml:space="preserve">a product; future work must separate that restriction from proposal-model skill.</w:t>
       </w:r>
     </w:p>
     <w:p>
@@ -5339,8 +5934,8 @@
         <w:t xml:space="preserve">constraints, demand assumptions and an independent change-validation design.</w:t>
       </w:r>
     </w:p>
-    <w:bookmarkEnd w:id="52"/>
-    <w:bookmarkStart w:id="53" w:name="data-availability"/>
+    <w:bookmarkEnd w:id="53"/>
+    <w:bookmarkStart w:id="54" w:name="data-availability"/>
     <w:p>
       <w:pPr>
         <w:pStyle w:val="Heading2"/>
@@ -5888,8 +6483,64 @@
         <w:t xml:space="preserve">. Independent external Windows evidence remains separately labelled for FLUS because the corresponding rasters are not archived locally. No private database address, credential or client-only service is included. Authoritative Abu Dhabi land-use and independent reference data remain outside this study.</w:t>
       </w:r>
     </w:p>
-    <w:bookmarkEnd w:id="53"/>
-    <w:bookmarkStart w:id="54" w:name="code-availability"/>
+    <w:p>
+      <w:pPr>
+        <w:pStyle w:val="FirstParagraph"/>
+      </w:pPr>
+      <w:r>
+        <w:t xml:space="preserve">The current working revision and the published v2.0.0 archive are distinct</w:t>
+      </w:r>
+      <w:r>
+        <w:t xml:space="preserve"> </w:t>
+      </w:r>
+      <w:r>
+        <w:t xml:space="preserve">versions. The published DOI continues to identify its original tagged inputs,</w:t>
+      </w:r>
+      <w:r>
+        <w:t xml:space="preserve"> </w:t>
+      </w:r>
+      <w:r>
+        <w:t xml:space="preserve">outputs and manuscript. The working revision adds a report-derived allocation-</w:t>
+      </w:r>
+      <w:r>
+        <w:t xml:space="preserve"> </w:t>
+      </w:r>
+      <w:r>
+        <w:t xml:space="preserve">limit analysis and revised interpretation without retraining models or replacing</w:t>
+      </w:r>
+      <w:r>
+        <w:t xml:space="preserve"> </w:t>
+      </w:r>
+      <w:r>
+        <w:t xml:space="preserve">the archived prediction rasters. Its separate working manifests and source hashes</w:t>
+      </w:r>
+      <w:r>
+        <w:t xml:space="preserve"> </w:t>
+      </w:r>
+      <w:r>
+        <w:t xml:space="preserve">are described in</w:t>
+      </w:r>
+      <w:r>
+        <w:t xml:space="preserve"> </w:t>
+      </w:r>
+      <w:r>
+        <w:rPr>
+          <w:rStyle w:val="VerbatimChar"/>
+        </w:rPr>
+        <w:t xml:space="preserve">benchmarks/abu_dhabi_land_use_v2/reproducibility/WORKING_REVISION.md</w:t>
+      </w:r>
+      <w:r>
+        <w:t xml:space="preserve">;</w:t>
+      </w:r>
+      <w:r>
+        <w:t xml:space="preserve"> </w:t>
+      </w:r>
+      <w:r>
+        <w:t xml:space="preserve">passing them verifies the declared revision, not a new DOI release.</w:t>
+      </w:r>
+    </w:p>
+    <w:bookmarkEnd w:id="54"/>
+    <w:bookmarkStart w:id="55" w:name="code-availability"/>
     <w:p>
       <w:pPr>
         <w:pStyle w:val="Heading2"/>
@@ -6583,8 +7234,8 @@
         <w:t xml:space="preserve">from the tagged repository for a full numerical rerun.</w:t>
       </w:r>
     </w:p>
-    <w:bookmarkEnd w:id="54"/>
-    <w:bookmarkStart w:id="55" w:name="declarations"/>
+    <w:bookmarkEnd w:id="55"/>
+    <w:bookmarkStart w:id="56" w:name="declarations"/>
     <w:p>
       <w:pPr>
         <w:pStyle w:val="Heading2"/>
@@ -6683,8 +7334,8 @@
         <w:t xml:space="preserve">Not applicable; the study used geospatial raster, vector and derived public-data products and did not involve human or animal participants.</w:t>
       </w:r>
     </w:p>
-    <w:bookmarkEnd w:id="55"/>
-    <w:bookmarkStart w:id="56" w:name="references"/>
+    <w:bookmarkEnd w:id="56"/>
+    <w:bookmarkStart w:id="57" w:name="references"/>
     <w:p>
       <w:pPr>
         <w:pStyle w:val="Heading2"/>
@@ -7106,8 +7757,8 @@
         <w:t xml:space="preserve">Zanaga, D., Van De Kerchove, R., Daems, D., De Keersmaecker, W., Brockmann, C., Kirches, G., Wevers, J., Cartus, O., Santoro, M., Fritz, S., Lesiv, M., Herold, M., Tsendbazar, N.-E., Xu, P., Ramoino, F., &amp; Arino, O. (2022). ESA WorldCover 10 m 2021 v200 [Data set]. Zenodo. https://doi.org/10.5281/zenodo.7254221</w:t>
       </w:r>
     </w:p>
-    <w:bookmarkEnd w:id="56"/>
-    <w:bookmarkStart w:id="57" w:name="supplementary-information-outline"/>
+    <w:bookmarkEnd w:id="57"/>
+    <w:bookmarkStart w:id="58" w:name="supplementary-information-outline"/>
     <w:p>
       <w:pPr>
         <w:pStyle w:val="Heading2"/>
@@ -7353,19 +8004,22 @@
           <w:b/>
           <w:bCs/>
         </w:rPr>
-        <w:t xml:space="preserve">Fig. S1:</w:t>
-      </w:r>
-      <w:r>
-        <w:t xml:space="preserve"> </w:t>
-      </w:r>
-      <w:r>
-        <w:t xml:space="preserve">Full 3-scenarios × 3-model 2031 new-built footprint atlas (</w:t>
+        <w:t xml:space="preserve">Supplementary Table S7:</w:t>
+      </w:r>
+      <w:r>
+        <w:t xml:space="preserve"> </w:t>
+      </w:r>
+      <w:r>
+        <w:t xml:space="preserve">Net-change FoM upper bounds and 54 seed-specific paired model intervals (see</w:t>
+      </w:r>
+      <w:r>
+        <w:t xml:space="preserve"> </w:t>
       </w:r>
       <w:r>
         <w:rPr>
           <w:rStyle w:val="VerbatimChar"/>
         </w:rPr>
-        <w:t xml:space="preserve">figures/figS01_planning_atlas_2031.*</w:t>
+        <w:t xml:space="preserve">supplementary_table_S7_allocation_limits.md</w:t>
       </w:r>
       <w:r>
         <w:t xml:space="preserve">).</w:t>
@@ -7384,19 +8038,19 @@
           <w:b/>
           <w:bCs/>
         </w:rPr>
-        <w:t xml:space="preserve">Fig. S2:</w:t>
-      </w:r>
-      <w:r>
-        <w:t xml:space="preserve"> </w:t>
-      </w:r>
-      <w:r>
-        <w:t xml:space="preserve">Dynamic World confidence and high-confidence change sensitivity (</w:t>
+        <w:t xml:space="preserve">Fig. S1:</w:t>
+      </w:r>
+      <w:r>
+        <w:t xml:space="preserve"> </w:t>
+      </w:r>
+      <w:r>
+        <w:t xml:space="preserve">Full 3-scenarios × 3-model 2031 new-built footprint atlas (</w:t>
       </w:r>
       <w:r>
         <w:rPr>
           <w:rStyle w:val="VerbatimChar"/>
         </w:rPr>
-        <w:t xml:space="preserve">figures/figS02_input_label_quality.*</w:t>
+        <w:t xml:space="preserve">figures/figS01_planning_atlas_2031.*</w:t>
       </w:r>
       <w:r>
         <w:t xml:space="preserve">).</w:t>
@@ -7415,19 +8069,19 @@
           <w:b/>
           <w:bCs/>
         </w:rPr>
-        <w:t xml:space="preserve">Fig. S3:</w:t>
-      </w:r>
-      <w:r>
-        <w:t xml:space="preserve"> </w:t>
-      </w:r>
-      <w:r>
-        <w:t xml:space="preserve">Historical maps and change-error maps for 2024 (</w:t>
+        <w:t xml:space="preserve">Fig. S2:</w:t>
+      </w:r>
+      <w:r>
+        <w:t xml:space="preserve"> </w:t>
+      </w:r>
+      <w:r>
+        <w:t xml:space="preserve">Dynamic World confidence and high-confidence change sensitivity (</w:t>
       </w:r>
       <w:r>
         <w:rPr>
           <w:rStyle w:val="VerbatimChar"/>
         </w:rPr>
-        <w:t xml:space="preserve">figures/figS03_historical_2024_maps_and_errors.*</w:t>
+        <w:t xml:space="preserve">figures/figS02_input_label_quality.*</w:t>
       </w:r>
       <w:r>
         <w:t xml:space="preserve">).</w:t>
@@ -7446,6 +8100,37 @@
           <w:b/>
           <w:bCs/>
         </w:rPr>
+        <w:t xml:space="preserve">Fig. S3:</w:t>
+      </w:r>
+      <w:r>
+        <w:t xml:space="preserve"> </w:t>
+      </w:r>
+      <w:r>
+        <w:t xml:space="preserve">Historical maps and change-error maps for 2024 (</w:t>
+      </w:r>
+      <w:r>
+        <w:rPr>
+          <w:rStyle w:val="VerbatimChar"/>
+        </w:rPr>
+        <w:t xml:space="preserve">figures/figS03_historical_2024_maps_and_errors.*</w:t>
+      </w:r>
+      <w:r>
+        <w:t xml:space="preserve">).</w:t>
+      </w:r>
+    </w:p>
+    <w:p>
+      <w:pPr>
+        <w:pStyle w:val="Compact"/>
+        <w:numPr>
+          <w:ilvl w:val="0"/>
+          <w:numId w:val="1004"/>
+        </w:numPr>
+      </w:pPr>
+      <w:r>
+        <w:rPr>
+          <w:b/>
+          <w:bCs/>
+        </w:rPr>
         <w:t xml:space="preserve">Fig. S4:</w:t>
       </w:r>
       <w:r>
@@ -7471,11 +8156,13 @@
         </w:pict>
       </w:r>
     </w:p>
-    <w:bookmarkEnd w:id="57"/>
+    <w:bookmarkEnd w:id="58"/>
     <w:sectPr>
       <w:footnotePr>
         <w:numRestart w:val="eachSect"/>
       </w:footnotePr>
+      <w:pgSz w:w="11906" w:h="16838"/>
+      <w:pgMar w:left="1417" w:right="1417" w:top="1417" w:bottom="1417"/>
     </w:sectPr>
   </w:body>
 </w:document>
@@ -7724,6 +8411,11 @@
   <w:style w:default="1" w:styleId="Normal" w:type="paragraph">
     <w:name w:val="Normal"/>
     <w:qFormat/>
+    <w:rPr>
+      <w:rFonts w:ascii="Times New Roman" w:hAnsi="Times New Roman"/>
+      <w:color w:val="000000"/>
+      <w:sz w:val="22"/>
+    </w:rPr>
   </w:style>
   <w:style w:styleId="BodyText" w:type="paragraph">
     <w:name w:val="Body Text"/>
@@ -7733,6 +8425,10 @@
     <w:pPr>
       <w:spacing w:after="180" w:before="180"/>
     </w:pPr>
+    <w:rPr>
+      <w:rFonts w:ascii="Times New Roman" w:hAnsi="Times New Roman"/>
+      <w:color w:val="000000"/>
+    </w:rPr>
   </w:style>
   <w:style w:customStyle="1" w:styleId="FirstParagraph" w:type="paragraph">
     <w:name w:val="First Paragraph"/>
@@ -7762,7 +8458,8 @@
       <w:jc w:val="center"/>
     </w:pPr>
     <w:rPr>
-      <w:rFonts w:asciiTheme="majorHAnsi" w:cstheme="majorBidi" w:eastAsiaTheme="majorEastAsia" w:hAnsiTheme="majorHAnsi"/>
+      <w:rFonts w:asciiTheme="majorHAnsi" w:cstheme="majorBidi" w:eastAsiaTheme="majorEastAsia" w:hAnsiTheme="majorHAnsi" w:ascii="Times New Roman" w:hAnsi="Times New Roman"/>
+      <w:color w:val="000000"/>
       <w:sz w:val="56"/>
       <w:szCs w:val="56"/>
     </w:rPr>
@@ -7793,7 +8490,8 @@
       </w:numPr>
     </w:pPr>
     <w:rPr>
-      <w:rFonts w:cstheme="majorBidi" w:eastAsiaTheme="majorEastAsia"/>
+      <w:rFonts w:cstheme="majorBidi" w:eastAsiaTheme="majorEastAsia" w:ascii="Times New Roman" w:hAnsi="Times New Roman"/>
+      <w:color w:val="000000"/>
       <w:spacing w:val="15"/>
       <w:sz w:val="28"/>
       <w:szCs w:val="28"/>
@@ -7896,8 +8594,8 @@
       <w:outlineLvl w:val="0"/>
     </w:pPr>
     <w:rPr>
-      <w:rFonts w:asciiTheme="majorHAnsi" w:cstheme="majorBidi" w:eastAsiaTheme="majorEastAsia" w:hAnsiTheme="majorHAnsi"/>
-      <w:color w:themeColor="accent1" w:themeShade="BF" w:val="0F4761"/>
+      <w:rFonts w:asciiTheme="majorHAnsi" w:cstheme="majorBidi" w:eastAsiaTheme="majorEastAsia" w:hAnsiTheme="majorHAnsi" w:ascii="Times New Roman" w:hAnsi="Times New Roman"/>
+      <w:color w:val="000000"/>
       <w:sz w:val="40"/>
       <w:szCs w:val="40"/>
     </w:rPr>
@@ -7919,8 +8617,8 @@
       <w:outlineLvl w:val="1"/>
     </w:pPr>
     <w:rPr>
-      <w:rFonts w:asciiTheme="majorHAnsi" w:cstheme="majorBidi" w:eastAsiaTheme="majorEastAsia" w:hAnsiTheme="majorHAnsi"/>
-      <w:color w:themeColor="accent1" w:themeShade="BF" w:val="0F4761"/>
+      <w:rFonts w:asciiTheme="majorHAnsi" w:cstheme="majorBidi" w:eastAsiaTheme="majorEastAsia" w:hAnsiTheme="majorHAnsi" w:ascii="Times New Roman" w:hAnsi="Times New Roman"/>
+      <w:color w:val="000000"/>
       <w:sz w:val="32"/>
       <w:szCs w:val="32"/>
     </w:rPr>
@@ -7942,8 +8640,8 @@
       <w:outlineLvl w:val="2"/>
     </w:pPr>
     <w:rPr>
-      <w:rFonts w:cstheme="majorBidi" w:eastAsiaTheme="majorEastAsia"/>
-      <w:color w:themeColor="accent1" w:themeShade="BF" w:val="0F4761"/>
+      <w:rFonts w:cstheme="majorBidi" w:eastAsiaTheme="majorEastAsia" w:ascii="Times New Roman" w:hAnsi="Times New Roman"/>
+      <w:color w:val="000000"/>
       <w:sz w:val="28"/>
       <w:szCs w:val="28"/>
     </w:rPr>

</xml_diff>

<commit_message>
Clarify data provenance and references in LUP submission
</commit_message>
<xml_diff>
--- a/manuscript/manuscript.docx
+++ b/manuscript/manuscript.docx
@@ -447,7 +447,224 @@
         <w:pStyle w:val="FirstParagraph"/>
       </w:pPr>
       <w:r>
-        <w:t xml:space="preserve">Dynamic World V1 provides annual scene-argmax labels and mean top-class probabilities (Brown et al., 2022). The nine Dynamic World labels were crosswalked to six canonical classes: water (source 0), woody vegetation (1), low vegetation (2, 4 and 5), wetland (3), built (6) and bare (7). Source class 8 was excluded.</w:t>
+        <w:t xml:space="preserve">Dynamic World V1 supplies scene-level class probabilities and maximum-probability labels (Brown et al., 2022). We constructed annual labels by taking the temporal mode of the available scene labels before class crosswalking and export to the modelling grid. Annual composition is a processing choice of this study, not an official annual Dynamic World product. At each source pixel, the quality statistic is</w:t>
+      </w:r>
+      <w:r>
+        <w:t xml:space="preserve"> </w:t>
+      </w:r>
+      <m:oMath>
+        <m:sSub>
+          <m:e>
+            <m:r>
+              <m:t>r</m:t>
+            </m:r>
+          </m:e>
+          <m:sub>
+            <m:r>
+              <m:t>y</m:t>
+            </m:r>
+          </m:sub>
+        </m:sSub>
+        <m:r>
+          <m:rPr>
+            <m:sty m:val="p"/>
+          </m:rPr>
+          <m:t>=</m:t>
+        </m:r>
+        <m:sSub>
+          <m:e>
+            <m:r>
+              <m:rPr>
+                <m:sty m:val="p"/>
+              </m:rPr>
+              <m:t>max</m:t>
+            </m:r>
+          </m:e>
+          <m:sub>
+            <m:r>
+              <m:t>c</m:t>
+            </m:r>
+          </m:sub>
+        </m:sSub>
+        <m:r>
+          <m:rPr>
+            <m:sty m:val="p"/>
+          </m:rPr>
+          <m:t>[</m:t>
+        </m:r>
+        <m:r>
+          <m:rPr>
+            <m:sty m:val="p"/>
+          </m:rPr>
+          <m:t>|</m:t>
+        </m:r>
+        <m:sSub>
+          <m:e>
+            <m:r>
+              <m:t>T</m:t>
+            </m:r>
+          </m:e>
+          <m:sub>
+            <m:r>
+              <m:t>y</m:t>
+            </m:r>
+          </m:sub>
+        </m:sSub>
+        <m:sSup>
+          <m:e>
+            <m:r>
+              <m:rPr>
+                <m:sty m:val="p"/>
+              </m:rPr>
+              <m:t>|</m:t>
+            </m:r>
+          </m:e>
+          <m:sup>
+            <m:r>
+              <m:rPr>
+                <m:sty m:val="p"/>
+              </m:rPr>
+              <m:t>−</m:t>
+            </m:r>
+            <m:r>
+              <m:t>1</m:t>
+            </m:r>
+          </m:sup>
+        </m:sSup>
+        <m:nary>
+          <m:naryPr>
+            <m:chr m:val="∑"/>
+            <m:limLoc m:val="undOvr"/>
+            <m:subHide m:val="off"/>
+            <m:supHide m:val="on"/>
+          </m:naryPr>
+          <m:sub>
+            <m:r>
+              <m:t>j</m:t>
+            </m:r>
+            <m:r>
+              <m:rPr>
+                <m:sty m:val="p"/>
+              </m:rPr>
+              <m:t>∈</m:t>
+            </m:r>
+            <m:sSub>
+              <m:e>
+                <m:r>
+                  <m:t>T</m:t>
+                </m:r>
+              </m:e>
+              <m:sub>
+                <m:r>
+                  <m:t>y</m:t>
+                </m:r>
+              </m:sub>
+            </m:sSub>
+          </m:sub>
+          <m:sup>
+            <m:r>
+              <m:t>​</m:t>
+            </m:r>
+          </m:sup>
+          <m:e>
+            <m:sSub>
+              <m:e>
+                <m:r>
+                  <m:t>p</m:t>
+                </m:r>
+              </m:e>
+              <m:sub>
+                <m:r>
+                  <m:t>j</m:t>
+                </m:r>
+                <m:r>
+                  <m:rPr>
+                    <m:sty m:val="p"/>
+                  </m:rPr>
+                  <m:t>,</m:t>
+                </m:r>
+                <m:r>
+                  <m:t>c</m:t>
+                </m:r>
+              </m:sub>
+            </m:sSub>
+          </m:e>
+        </m:nary>
+        <m:r>
+          <m:rPr>
+            <m:sty m:val="p"/>
+          </m:rPr>
+          <m:t>]</m:t>
+        </m:r>
+      </m:oMath>
+      <w:r>
+        <w:t xml:space="preserve">, where</w:t>
+      </w:r>
+      <w:r>
+        <w:t xml:space="preserve"> </w:t>
+      </w:r>
+      <m:oMath>
+        <m:sSub>
+          <m:e>
+            <m:r>
+              <m:t>T</m:t>
+            </m:r>
+          </m:e>
+          <m:sub>
+            <m:r>
+              <m:t>y</m:t>
+            </m:r>
+          </m:sub>
+        </m:sSub>
+      </m:oMath>
+      <w:r>
+        <w:t xml:space="preserve"> </w:t>
+      </w:r>
+      <w:r>
+        <w:t xml:space="preserve">denotes valid scenes in year</w:t>
+      </w:r>
+      <w:r>
+        <w:t xml:space="preserve"> </w:t>
+      </w:r>
+      <m:oMath>
+        <m:r>
+          <m:t>y</m:t>
+        </m:r>
+      </m:oMath>
+      <w:r>
+        <w:t xml:space="preserve"> </w:t>
+      </w:r>
+      <w:r>
+        <w:t xml:space="preserve">and</w:t>
+      </w:r>
+      <w:r>
+        <w:t xml:space="preserve"> </w:t>
+      </w:r>
+      <m:oMath>
+        <m:r>
+          <m:t>c</m:t>
+        </m:r>
+      </m:oMath>
+      <w:r>
+        <w:t xml:space="preserve"> </w:t>
+      </w:r>
+      <w:r>
+        <w:t xml:space="preserve">indexes the nine source classes. Thus the operation is maximum of temporal mean probabilities, not temporal mean of scene-wise maxima; its maximizing class need not equal the annual modal label. The archived band name</w:t>
+      </w:r>
+      <w:r>
+        <w:t xml:space="preserve"> </w:t>
+      </w:r>
+      <w:r>
+        <w:rPr>
+          <w:rStyle w:val="VerbatimChar"/>
+        </w:rPr>
+        <w:t xml:space="preserve">mean_top_probability</w:t>
+      </w:r>
+      <w:r>
+        <w:t xml:space="preserve"> </w:t>
+      </w:r>
+      <w:r>
+        <w:t xml:space="preserve">is retained for compatibility. This statistic is a weighting proxy, not a calibrated probability that the annual label is correct. The nine Dynamic World labels were crosswalked to six canonical classes: water (source 0), woody vegetation (1), low vegetation (2, 4 and 5), wetland (3), built (6) and bare (7). Source class 8 was excluded.</w:t>
       </w:r>
     </w:p>
     <w:p>
@@ -467,7 +684,7 @@
         <w:t xml:space="preserve">Sentinel2_10m_LandCover</w:t>
       </w:r>
       <w:r>
-        <w:t xml:space="preserve">, whose metadata attributes the global annual series to Impact Observatory, Microsoft and Esri (Impact Observatory et al., 2026). Its Sentinel-2 classification lineage follows the deep-learning mapping approach described by Karra et al. (2021). Source values were mapped to water (1), woody vegetation (2), wetland (4), low vegetation (5 and 11), built (7) and bare (8); snow/ice (9) and cloud (10) were excluded. Native 10-m labels were retained for audit, then aggregated after crosswalking by majority among usable cells in each 10 × 10 block. The resulting majority fraction served as the ArcGIS-track aggregation-quality term; it is not equivalent to Dynamic World’s top-class probability. Both sequences are explicitly treated as public land cover. Neither provides residential, commercial or industrial land use, zoning, cadastral status or development approvals.</w:t>
+        <w:t xml:space="preserve">, whose metadata attributes the global annual series to Impact Observatory, Microsoft and Esri (Impact Observatory et al., n.d.). The study by Karra et al. (2021) describes the classification lineage; it does not independently validate every annual layer or subsequent service revision. The materialization manifest, created on 9 September 2026, records the service URL, temporal extent, class mapping and SHA-256 hashes of the downloaded and aggregated rasters. No immutable upstream release identifier is recorded, so the reproducibility target is this archived snapshot rather than the changing live service. Source values were mapped to water (1), woody vegetation (2), wetland (4), low vegetation (5 and 11), built (7) and bare (8); snow/ice (9) and cloud (10) were excluded. Native 10-m labels were retained for audit, then aggregated after crosswalking by majority among usable cells in each 10 × 10 block. The resulting majority fraction served as the ArcGIS-track aggregation-quality term; it is not equivalent to Dynamic World’s maximum temporal-mean probability. Both sequences are explicitly treated as public land cover. Neither provides residential, commercial or industrial land use, zoning, cadastral status or development approvals.</w:t>
       </w:r>
     </w:p>
     <w:p>
@@ -475,7 +692,15 @@
         <w:pStyle w:val="BodyText"/>
       </w:pPr>
       <w:r>
-        <w:t xml:space="preserve">Annual 64-dimensional AlphaEarth embeddings were spatially averaged to the canonical grid and locally L2-normalized (Brown et al., 2025). Monthly</w:t>
+        <w:t xml:space="preserve">Annual 64-dimensional AlphaEarth embeddings were spatially averaged to the canonical grid and locally L2-normalized (Brown et al., 2025). The collection is GOOGLE/SATELLITE_EMBEDDING/V1/ANNUAL, with raster hashes recorded in the GEE input manifest; Brown et al. (2025) is cited as a preprint describing the embedding model.</w:t>
+      </w:r>
+    </w:p>
+    <w:p>
+      <w:pPr>
+        <w:pStyle w:val="BodyText"/>
+      </w:pPr>
+      <w:r>
+        <w:t xml:space="preserve">We formed the night-time-light driver from monthly</w:t>
       </w:r>
       <w:r>
         <w:t xml:space="preserve"> </w:t>
@@ -490,7 +715,7 @@
         <w:t xml:space="preserve"> </w:t>
       </w:r>
       <w:r>
-        <w:t xml:space="preserve">night-time-light radiance was averaged by year (Elvidge et al., 2021). The Copernicus DEM GLO-30</w:t>
+        <w:t xml:space="preserve">composites (Earth Observation Group, n.d.). The implementation takes an unweighted mean of available, unmasked</w:t>
       </w:r>
       <w:r>
         <w:t xml:space="preserve"> </w:t>
@@ -499,13 +724,90 @@
         <w:rPr>
           <w:rStyle w:val="VerbatimChar"/>
         </w:rPr>
-        <w:t xml:space="preserve">COPERNICUS/DEM/GLO30_2024_1</w:t>
-      </w:r>
-      <w:r>
-        <w:t xml:space="preserve"> </w:t>
-      </w:r>
-      <w:r>
-        <w:t xml:space="preserve">collection supplied elevation and a finite-difference slope derivative (European Space Agency, 2024). OpenStreetMap road geometries were rasterized into distance-to-road and distance-to-major-road surfaces. ESA WorldCover 2021 supplied public water and wetland/mangrove constraint proxies (Zanaga et al., 2022). All dynamic and static layers were checked for exact CRS, transform, width and height agreement.</w:t>
+        <w:t xml:space="preserve">avg_rad</w:t>
+      </w:r>
+      <w:r>
+        <w:t xml:space="preserve"> </w:t>
+      </w:r>
+      <w:r>
+        <w:t xml:space="preserve">values within each calendar year; absent months are not imputed, and the collection is required to be nonempty rather than to contain twelve months. It does not apply an additional</w:t>
+      </w:r>
+      <w:r>
+        <w:t xml:space="preserve"> </w:t>
+      </w:r>
+      <w:r>
+        <w:rPr>
+          <w:rStyle w:val="VerbatimChar"/>
+        </w:rPr>
+        <w:t xml:space="preserve">cf_cvg</w:t>
+      </w:r>
+      <w:r>
+        <w:t xml:space="preserve"> </w:t>
+      </w:r>
+      <w:r>
+        <w:t xml:space="preserve">mask or observation-count weighting. This author-generated annual feature is distinct from the annual product described by Elvidge et al. (2021), which is cited for background. The monthly product documentation recommends using cloud-free observation counts to assess coverage and notes that temporary lights and background values are not separated. Uneven coverage and transient illumination can therefore affect this driver.</w:t>
+      </w:r>
+    </w:p>
+    <w:p>
+      <w:pPr>
+        <w:pStyle w:val="BodyText"/>
+      </w:pPr>
+      <w:r>
+        <w:t xml:space="preserve">Copernicus DEM GLO-30 release</w:t>
+      </w:r>
+      <w:r>
+        <w:t xml:space="preserve"> </w:t>
+      </w:r>
+      <w:r>
+        <w:rPr>
+          <w:rStyle w:val="VerbatimChar"/>
+        </w:rPr>
+        <w:t xml:space="preserve">2024_1</w:t>
+      </w:r>
+      <w:r>
+        <w:t xml:space="preserve"> </w:t>
+      </w:r>
+      <w:r>
+        <w:t xml:space="preserve">supplied surface elevation and a finite-difference slope derivative (Copernicus, 2024). This is a digital surface model (DSM) containing buildings, infrastructure and vegetation, not a bare-earth terrain model. Its release identifier is not an acquisition year; the catalogue lists a 2010–2020 observation range. We have not established tile-specific acquisition dates or quantified urban surface-object effects on slope, so it is treated as a static retrospective covariate. OpenStreetMap road geometries from the Geofabrik GCC snapshot</w:t>
+      </w:r>
+      <w:r>
+        <w:t xml:space="preserve"> </w:t>
+      </w:r>
+      <w:r>
+        <w:rPr>
+          <w:rStyle w:val="VerbatimChar"/>
+        </w:rPr>
+        <w:t xml:space="preserve">gcc-states-260731.osm.pbf</w:t>
+      </w:r>
+      <w:r>
+        <w:t xml:space="preserve"> </w:t>
+      </w:r>
+      <w:r>
+        <w:t xml:space="preserve">were rasterized into distance-to-road and distance-to-major-road surfaces (Geofabrik, 2026). The source URL, snapshot date and SHA-256 are preserved in</w:t>
+      </w:r>
+      <w:r>
+        <w:t xml:space="preserve"> </w:t>
+      </w:r>
+      <w:r>
+        <w:rPr>
+          <w:rStyle w:val="VerbatimChar"/>
+        </w:rPr>
+        <w:t xml:space="preserve">osm_input_manifest.json</w:t>
+      </w:r>
+      <w:r>
+        <w:t xml:space="preserve">; the city geometry is separately recorded in</w:t>
+      </w:r>
+      <w:r>
+        <w:t xml:space="preserve"> </w:t>
+      </w:r>
+      <w:r>
+        <w:rPr>
+          <w:rStyle w:val="VerbatimChar"/>
+        </w:rPr>
+        <w:t xml:space="preserve">boundary_manifest.json</w:t>
+      </w:r>
+      <w:r>
+        <w:t xml:space="preserve">. ESA WorldCover 2021 supplied public water and wetland/mangrove constraint proxies (Zanaga et al., 2022). All dynamic and static layers were checked for exact CRS, transform, width and height agreement.</w:t>
       </w:r>
     </w:p>
     <w:p>
@@ -946,7 +1248,7 @@
         <w:t xml:space="preserve"> </w:t>
       </w:r>
       <w:r>
-        <w:t xml:space="preserve">contains 25 values: six one-hot current-class indicators; twelve neighbourhood proportions, comprising 3 × 3 and 7 × 7 windows for each of the six classes; and seven continuous variables, namely normalized row and column coordinates, clipped elevation, clipped slope, log-transformed VIIRS radiance, log distance to roads and log distance to major roads. A scikit-learn histogram gradient-boosting classifier estimates the six-class probability vector (Pedregosa et al., 2011). It uses learning rate 0.08, 120 iterations, at most 31 leaf nodes, minimum leaf size 40 and L2 regularization 1.0.</w:t>
+        <w:t xml:space="preserve">contains 25 values: six one-hot current-class indicators; twelve neighbourhood proportions, comprising 3 × 3 and 7 × 7 windows for each of the six classes; and seven continuous variables, namely normalized row and column coordinates, clipped elevation, clipped slope, log-transformed VIIRS radiance, log distance to roads and log distance to major roads. The HistGradientBoostingClassifier implementation in scikit-learn 1.9.0, as specified in the archived environment lock, estimates the six-class probability vector (Pedregosa et al., 2011). It uses learning rate 0.08, 120 iterations, at most 31 leaf nodes, minimum leaf size 40 and L2 regularization 1.0.</w:t>
       </w:r>
     </w:p>
     <w:p>
@@ -1119,7 +1421,7 @@
         <w:t xml:space="preserve"> </w:t>
       </w:r>
       <w:r>
-        <w:t xml:space="preserve">is Dynamic World mean top probability in the original track and the within-block majority fraction in the ArcGIS-served track. These terms have different semantics and are retained as parts of their respective product pipelines. A held-out target is never used during fitting or model selection.</w:t>
+        <w:t xml:space="preserve">is Dynamic World maximum temporal-mean probability in the original track and the within-block majority fraction in the ArcGIS-served track. These terms have different semantics and are retained as parts of their respective product pipelines. A held-out target is never used during fitting or model selection.</w:t>
       </w:r>
     </w:p>
     <w:bookmarkEnd w:id="16"/>
@@ -3076,7 +3378,7 @@
         <w:t xml:space="preserve"> </w:t>
       </w:r>
       <w:r>
-        <w:t xml:space="preserve">origin and target Dynamic World mean top probability to exceed 0.5 retains only</w:t>
+        <w:t xml:space="preserve">origin and target Dynamic World maximum temporal-mean probability to exceed 0.5 retains only</w:t>
       </w:r>
       <w:r>
         <w:t xml:space="preserve"> </w:t>
@@ -5573,7 +5875,7 @@
         <w:t xml:space="preserve"> </w:t>
       </w:r>
       <w:r>
-        <w:t xml:space="preserve">features and should define the no-leakage boundary. As a descriptive bound,</w:t>
+        <w:t xml:space="preserve">features. This firewall controls downstream target-label use and the late road snapshot; it does not establish that retrospective global products, pretrained embeddings or the static DSM were available to a forecaster at each historical origin. As a descriptive bound,</w:t>
       </w:r>
       <w:r>
         <w:t xml:space="preserve"> </w:t>
@@ -7420,6 +7722,22 @@
         <w:pStyle w:val="BodyText"/>
       </w:pPr>
       <w:r>
+        <w:t xml:space="preserve">Copernicus. (2024). Copernicus DEM GLO-30 (2024_1): Global 30m Digital Elevation Model [Data set; digital surface model]. Google Earth Engine Data Catalog. https://developers.google.com/earth-engine/datasets/catalog/COPERNICUS_DEM_GLO30_2024_1 (accessed 10 September 2026).</w:t>
+      </w:r>
+    </w:p>
+    <w:p>
+      <w:pPr>
+        <w:pStyle w:val="BodyText"/>
+      </w:pPr>
+      <w:r>
+        <w:t xml:space="preserve">Earth Observation Group, Payne Institute for Public Policy, Colorado School of Mines. (n.d.). VIIRS Stray Light Corrected Nighttime Day/Night Band Composites Version 1 [Monthly data set; VCMSLCFG]. Google Earth Engine Data Catalog. https://developers.google.com/earth-engine/datasets/catalog/NOAA_VIIRS_DNB_MONTHLY_V1_VCMSLCFG (accessed 10 September 2026).</w:t>
+      </w:r>
+    </w:p>
+    <w:p>
+      <w:pPr>
+        <w:pStyle w:val="BodyText"/>
+      </w:pPr>
+      <w:r>
         <w:t xml:space="preserve">Elvidge, C. D., Zhizhin, M., Ghosh, T., Hsu, F.-C., &amp; Taneja, J. (2021). Annual time series of global VIIRS nighttime lights derived from monthly averages: 2012 to 2019.</w:t>
       </w:r>
       <w:r>
@@ -7441,7 +7759,7 @@
         <w:pStyle w:val="BodyText"/>
       </w:pPr>
       <w:r>
-        <w:t xml:space="preserve">European Space Agency. (2024). Copernicus DEM GLO-30: global 30 m digital elevation model [Data set]. Google Earth Engine Data Catalog. https://developers.google.com/earth-engine/datasets/catalog/COPERNICUS_DEM_GLO30_2024_1</w:t>
+        <w:t xml:space="preserve">Geofabrik. (2026). GCC States OpenStreetMap extract, 31 July 2026 [Data set; gcc-states-260731.osm.pbf]. https://download.geofabrik.de/asia/gcc-states-260731.osm.pbf</w:t>
       </w:r>
     </w:p>
     <w:p>
@@ -7478,7 +7796,7 @@
         <w:pStyle w:val="BodyText"/>
       </w:pPr>
       <w:r>
-        <w:t xml:space="preserve">Impact Observatory, Microsoft, &amp; Esri. (2026). Sentinel-2 10m land cover time series of the world [Data set]. ArcGIS ImageServer. https://ic.imagery1.arcgis.com/arcgis/rest/services/Sentinel2_10m_LandCover/ImageServer (accessed 8 September 2026).</w:t>
+        <w:t xml:space="preserve">Impact Observatory, Microsoft, &amp; Esri. (n.d.). Sentinel-2 10m land cover time series of the world [Data set]. ArcGIS ImageServer. https://ic.imagery1.arcgis.com/arcgis/rest/services/Sentinel2_10m_LandCover/ImageServer (archived materialization manifest dated 9 September 2026; upstream release version not recorded).</w:t>
       </w:r>
     </w:p>
     <w:p>
@@ -7570,7 +7888,7 @@
         <w:pStyle w:val="BodyText"/>
       </w:pPr>
       <w:r>
-        <w:t xml:space="preserve">OpenStreetMap contributors. (2026). OpenStreetMap data, Abu Dhabi relation R4479763 and Geofabrik GCC extract, accessed 31 July 2026. https://www.openstreetmap.org</w:t>
+        <w:t xml:space="preserve">OpenStreetMap contributors. (2026). Abu Dhabi city boundary, relation 4479763 [Data set; retrieved 1 August 2026; geometry documented in boundary_manifest.json]. https://www.openstreetmap.org/relation/4479763</w:t>
       </w:r>
     </w:p>
     <w:p>

</xml_diff>

<commit_message>
Clarify Dynamic World quality proxy semantics
</commit_message>
<xml_diff>
--- a/manuscript/manuscript.docx
+++ b/manuscript/manuscript.docx
@@ -3366,7 +3366,7 @@
         <w:pStyle w:val="BodyText"/>
       </w:pPr>
       <w:r>
-        <w:t xml:space="preserve">The confidence sensitivity is a label-quality and selection-effect diagnostic,</w:t>
+        <w:t xml:space="preserve">The Dynamic World quality-proxy sensitivity is a label-quality and selection-effect diagnostic,</w:t>
       </w:r>
       <w:r>
         <w:t xml:space="preserve"> </w:t>
@@ -3402,13 +3402,13 @@
         <w:t xml:space="preserve"> </w:t>
       </w:r>
       <w:r>
-        <w:t xml:space="preserve">GeoFM-LDN. Screening only the confidence of the year immediately preceding the</w:t>
-      </w:r>
-      <w:r>
-        <w:t xml:space="preserve"> </w:t>
-      </w:r>
-      <w:r>
-        <w:t xml:space="preserve">target avoids filtering on target-year confidence, but still retains only 129</w:t>
+        <w:t xml:space="preserve">GeoFM-LDN. Screening only the quality-proxy value of the year immediately preceding the</w:t>
+      </w:r>
+      <w:r>
+        <w:t xml:space="preserve"> </w:t>
+      </w:r>
+      <w:r>
+        <w:t xml:space="preserve">target avoids filtering on the target-year quality proxy, but still retains only 129</w:t>
       </w:r>
       <w:r>
         <w:t xml:space="preserve"> </w:t>
@@ -8393,7 +8393,7 @@
         <w:t xml:space="preserve"> </w:t>
       </w:r>
       <w:r>
-        <w:t xml:space="preserve">Dynamic World confidence and high-confidence change sensitivity (</w:t>
+        <w:t xml:space="preserve">Dynamic World quality proxy and quality-filtered change sensitivity (</w:t>
       </w:r>
       <w:r>
         <w:rPr>

</xml_diff>

<commit_message>
Address seventeenth LUP review
</commit_message>
<xml_diff>
--- a/manuscript/manuscript.docx
+++ b/manuscript/manuscript.docx
@@ -36,7 +36,7 @@
         <w:pStyle w:val="FirstParagraph"/>
       </w:pPr>
       <w:r>
-        <w:t xml:space="preserve">Public land-cover products are increasingly used where authoritative local time series are unavailable, but product choice can alter both apparent urban change and model rankings. We present an auditable protocol for constrained spatial allocation using Geospatial Kernel, the algorithmic core of a Geospatial World Model, as the focal execution layer. Two annual 10-m products for Abu Dhabi city, Google Dynamic World (2017–2024) and an ArcGIS-served Impact Observatory/Microsoft/Esri series (2017–2025), were harmonized to the same 100-m, six-class modelling contract. Leakage-controlled expanding-window tests compared a FLUS-style ANN–CA, Geospatial Kernel, GeoFM-LDN, persistence and random minimum-change allocation using three seeds and 1,000 spatial-block bootstrap resamples. The target year supplied oracle class totals and evaluation labels only. In 2024, the ArcGIS-served series mapped 335.57 km² as built versus 155.98 km² in Dynamic World; built-class intersection over union was 0.449. Kernel had the highest mean FoM in four Dynamic World targets and two matched ArcGIS-served targets; these numerical ranks did not uniformly imply paired-interval separation. Net-change allocation imposed product-specific count-only FoM upper bounds of 0.086–0.813 in the ArcGIS folds. Kernel’s ArcGIS-minus-Dynamic World strict change Figure of Merit ranged from -0.244 to +0.205. Yet the product-specific 2031 planning frontiers retained FLUS-style and Kernel candidates in all three scenarios. The results support an inspectable proposal–projection–writeback boundary while showing that comparative skill is label-product dependent. Neither product is authoritative local land-use truth, model outputs remain 100 m, and the 2026–2031 maps are conditional stress tests rather than official forecasts.</w:t>
+        <w:t xml:space="preserve">Public land-cover products are increasingly used where authoritative local time series are unavailable, but product choice and within-product discontinuities can alter apparent urban change and model rankings. We present an auditable protocol for constrained spatial allocation using Geospatial Kernel, the algorithmic core of a Geospatial World Model, as the focal execution layer. Two annual 10-m products for Abu Dhabi city, Google Dynamic World (2017–2024) and an ArcGIS-served Impact Observatory/Microsoft/Esri series (2017–2025), were harmonized to the same 100-m, six-class modelling contract. Leakage-controlled expanding-window tests compared a FLUS-style ANN–CA, Geospatial Kernel, GeoFM-LDN, persistence and random minimum-change allocation using three seeds and 1,000 spatial-block bootstrap resamples. The target year supplied oracle class totals and evaluation labels only. In 2024, the ArcGIS-served series mapped 335.57 km² as built versus 155.98 km² in Dynamic World; built-class intersection over union was 0.449. Its built class also rose by 30.6% between 2021 and 2022 while wetland and woody classes later nearly disappeared, an unreconciled series break. Kernel had the highest mean FoM in four Dynamic World targets and two matched ArcGIS-served targets; these numerical ranks did not uniformly imply paired-interval separation. Net-change allocation imposed product-specific count-only FoM upper bounds of 0.086–0.813 only for exact minimum-change allocators. Kernel’s ArcGIS-minus-Dynamic World strict change Figure of Merit ranged from -0.244 to +0.205. The product-specific 2031 frontiers retained FLUS-style and Kernel candidates in all scenarios, but their objective trade-offs changed. The results support an inspectable proposal–projection–writeback boundary while showing that comparative skill is label-product dependent. Neither product is authoritative local land-use truth, model outputs remain 100 m, and the 2026–2031 maps are conditional stress tests rather than official forecasts.</w:t>
       </w:r>
     </w:p>
     <w:bookmarkEnd w:id="9"/>
@@ -58,7 +58,7 @@
         </w:numPr>
       </w:pPr>
       <w:r>
-        <w:t xml:space="preserve">Cross-product backtests expose label dependence in model rankings.</w:t>
+        <w:t xml:space="preserve">Cross-product backtests expose product dependence and a series discontinuity.</w:t>
       </w:r>
     </w:p>
     <w:p>
@@ -94,7 +94,7 @@
         </w:numPr>
       </w:pPr>
       <w:r>
-        <w:t xml:space="preserve">Net-change allocation restricts the attainable change-detection score.</w:t>
+        <w:t xml:space="preserve">Net-change allocation restricts exact minimum-change scores, not CA scores.</w:t>
       </w:r>
     </w:p>
     <w:p>
@@ -430,6 +430,44 @@
       </w:r>
       <w:r>
         <w:t xml:space="preserve">label was prohibited from feature construction, model fitting and GeoFM-LDN epoch selection. The target supplied only observed class totals for oracle allocation, evaluation labels and the common-coverage mask. This design isolates spatial allocation conditional on known demand and is not an end-to-end demand forecast. Each fold locked origin-year water and wetland cells and omitted the two road-distance features, because the available OpenStreetMap snapshot was accessed in 2026. Kernel consequently used 23 features and the FLUS-style track used the remaining five continuous drivers. A machine-tested temporal firewall records permitted target-year uses for every model, seed and fold. The two product tracks match the boundary, 100-m grid, model implementations, seeds, target-year protocol, oracle-action rule, evaluator and 1,000-resample 8 × 8-cell spatial bootstrap. Annual labels, origin states, oracle totals, origin water/wetland masks and quality semantics remain product specific; the experiment therefore tests the complete public-product pipelines rather than an isolated label substitution. The original 2023–2024 headline comparison is less strict because it uses the later road snapshot and remains a secondary unmatched-pipeline result.</w:t>
+      </w:r>
+    </w:p>
+    <w:p>
+      <w:pPr>
+        <w:pStyle w:val="BodyText"/>
+      </w:pPr>
+      <w:r>
+        <w:t xml:space="preserve">The random minimum-change controls are deterministic within each analysis but</w:t>
+      </w:r>
+      <w:r>
+        <w:t xml:space="preserve"> </w:t>
+      </w:r>
+      <w:r>
+        <w:t xml:space="preserve">not a shared cross-table estimator: the rolling-origin diagnostic derives its</w:t>
+      </w:r>
+      <w:r>
+        <w:t xml:space="preserve"> </w:t>
+      </w:r>
+      <w:r>
+        <w:t xml:space="preserve">stream from the declared seed plus origin year × 1,000, whereas the matched</w:t>
+      </w:r>
+      <w:r>
+        <w:t xml:space="preserve"> </w:t>
+      </w:r>
+      <w:r>
+        <w:t xml:space="preserve">product analysis uses the declared seed plus target year × 1,000. Their values</w:t>
+      </w:r>
+      <w:r>
+        <w:t xml:space="preserve"> </w:t>
+      </w:r>
+      <w:r>
+        <w:t xml:space="preserve">therefore serve as local zero controls in Supplementary Tables S5 and S6,</w:t>
+      </w:r>
+      <w:r>
+        <w:t xml:space="preserve"> </w:t>
+      </w:r>
+      <w:r>
+        <w:t xml:space="preserve">respectively, and are not compared numerically across those tables.</w:t>
       </w:r>
     </w:p>
     <w:bookmarkEnd w:id="14"/>
@@ -684,7 +722,15 @@
         <w:t xml:space="preserve">Sentinel2_10m_LandCover</w:t>
       </w:r>
       <w:r>
-        <w:t xml:space="preserve">, whose metadata attributes the global annual series to Impact Observatory, Microsoft and Esri (Impact Observatory et al., n.d.). The study by Karra et al. (2021) describes the classification lineage; it does not independently validate every annual layer or subsequent service revision. The materialization manifest, created on 9 September 2026, records the service URL, temporal extent, class mapping and SHA-256 hashes of the downloaded and aggregated rasters. No immutable upstream release identifier is recorded, so the reproducibility target is this archived snapshot rather than the changing live service. Source values were mapped to water (1), woody vegetation (2), wetland (4), low vegetation (5 and 11), built (7) and bare (8); snow/ice (9) and cloud (10) were excluded. Native 10-m labels were retained for audit, then aggregated after crosswalking by majority among usable cells in each 10 × 10 block. The resulting majority fraction served as the ArcGIS-track aggregation-quality term; it is not equivalent to Dynamic World’s maximum temporal-mean probability. Both sequences are explicitly treated as public land cover. Neither provides residential, commercial or industrial land use, zoning, cadastral status or development approvals.</w:t>
+        <w:t xml:space="preserve">, whose metadata attributes the global annual series to Impact Observatory, Microsoft and Esri (Impact Observatory et al., n.d.). The study by Karra et al. (2021) describes the classification lineage; it does not independently validate every annual layer or subsequent service revision. The associated Living Atlas item states that its 2018–2025 layers use a more complete image collection and cautions that 2017 may be less accurate (Esri, 2026). It does not disclose annual model-version identifiers. The materialization manifest, created on 9 September 2026, records the service URL, temporal extent, class mapping and SHA-256 hashes of the downloaded and aggregated rasters. No immutable upstream release identifier is recorded, so the reproducibility target is this archived snapshot rather than the changing live service.</w:t>
+      </w:r>
+    </w:p>
+    <w:p>
+      <w:pPr>
+        <w:pStyle w:val="BodyText"/>
+      </w:pPr>
+      <w:r>
+        <w:t xml:space="preserve">The service labels are Water (1), Trees (2), Flooded vegetation (4), Crops (5), Built (7), Bare (8), Snow/Ice (9), Clouds (10) and Rangeland (11). We mapped them to water (1), woody vegetation (2), wetland (4), low vegetation (5 and 11), built (7) and bare (8), excluding snow/ice and clouds. Mapping Rangeland to low vegetation is a study crosswalk decision, not an official land-use statement. A descriptive counterfactual mapping it to bare before the same 10 × 10 majority aggregation changes 2,265–2,792 100-m labels per year (Supplementary Table S6); no model was refit, so this does not establish rank sensitivity. Native 10-m labels were retained for audit, then aggregated after crosswalking by majority among usable cells in each 10 × 10 block. The resulting majority fraction served as the ArcGIS-track aggregation-quality term; it is not equivalent to Dynamic World’s maximum temporal-mean probability. Both sequences are explicitly treated as public land cover. Neither provides residential, commercial or industrial land use, zoning, cadastral status or development approvals.</w:t>
       </w:r>
     </w:p>
     <w:p>
@@ -2063,7 +2109,7 @@
         <w:pStyle w:val="FirstParagraph"/>
       </w:pPr>
       <w:r>
-        <w:t xml:space="preserve">The baseline was run through a GeoSOS-derived FLUS-style ANN–CA console (author-modified build;</w:t>
+        <w:t xml:space="preserve">The baseline was run through a GeoSOS-derived FLUS-style ANN–CA console (study-specific build;</w:t>
       </w:r>
       <w:r>
         <w:t xml:space="preserve"> </w:t>
@@ -2075,7 +2121,7 @@
         <w:t xml:space="preserve">paper-benchmark-flus-v1.1</w:t>
       </w:r>
       <w:r>
-        <w:t xml:space="preserve">) using seven continuous drivers: normalized row and column coordinates, elevation, slope, VIIRS radiance, distance to roads and distance to major roads. Its ANN suitability surface was passed to a cellular-automata allocation stage with the common class totals and public hard mask. The archived run used one 2021 training year, eight ANN hidden neurons, a 3 × 3 CA neighbourhood, neighbourhood strength 1.0, acceleration factor 0.1 and 1,000 iterations. Its frozen transition matrix protected water and wetland but did not prohibit built-to-non-built transitions. The algorithmic base is traceable to the GeoSOS team’s public FLUS source release (Liu et al., 2017; GeoSOS team, n.d.); the accompanying source repository</w:t>
+        <w:t xml:space="preserve">) using seven continuous drivers: normalized row and column coordinates, elevation, slope, VIIRS radiance, distance to roads and distance to major roads. Its ANN suitability surface was passed to a cellular-automata allocation stage with the common class totals and public hard mask. The archived run used one 2021 training year, eight ANN hidden neurons, a 3 × 3 CA neighbourhood, neighbourhood strength 1.0, acceleration factor 0.1 and 1,000 iterations. Its frozen transition matrix protected water and wetland but did not prohibit built-to-non-built transitions. The algorithmic base is traceable to the GeoSOS team’s public FLUS source release (Liu et al., 2017; GeoSOS team, n.d.). The binary was rebuilt from the preceding source revision</w:t>
       </w:r>
       <w:r>
         <w:t xml:space="preserve"> </w:t>
@@ -2084,13 +2130,10 @@
         <w:rPr>
           <w:rStyle w:val="VerbatimChar"/>
         </w:rPr>
-        <w:t xml:space="preserve">FLUS_console_crossplatform</w:t>
-      </w:r>
-      <w:r>
-        <w:t xml:space="preserve"> </w:t>
-      </w:r>
-      <w:r>
-        <w:t xml:space="preserve">at commit</w:t>
+        <w:t xml:space="preserve">deb0a54</w:t>
+      </w:r>
+      <w:r>
+        <w:t xml:space="preserve">; the retained</w:t>
       </w:r>
       <w:r>
         <w:t xml:space="preserve"> </w:t>
@@ -2099,13 +2142,28 @@
         <w:rPr>
           <w:rStyle w:val="VerbatimChar"/>
         </w:rPr>
+        <w:t xml:space="preserve">paper-benchmark-flus-v1.1</w:t>
+      </w:r>
+      <w:r>
+        <w:t xml:space="preserve"> </w:t>
+      </w:r>
+      <w:r>
+        <w:t xml:space="preserve">source tag at</w:t>
+      </w:r>
+      <w:r>
+        <w:t xml:space="preserve"> </w:t>
+      </w:r>
+      <w:r>
+        <w:rPr>
+          <w:rStyle w:val="VerbatimChar"/>
+        </w:rPr>
         <w:t xml:space="preserve">47e65b3</w:t>
       </w:r>
       <w:r>
         <w:t xml:space="preserve"> </w:t>
       </w:r>
       <w:r>
-        <w:t xml:space="preserve">contains the author modifications used for this paper. Those modifications add</w:t>
+        <w:t xml:space="preserve">adds invalid-input failure handling only. Both revisions contain the study-specific</w:t>
       </w:r>
       <w:r>
         <w:t xml:space="preserve"> </w:t>
@@ -2144,7 +2202,7 @@
         <w:t xml:space="preserve"> </w:t>
       </w:r>
       <w:r>
-        <w:t xml:space="preserve">deterministic seeding for both ANN sampling and CA roulette draws, so the build is not the unmodified upstream executable. Version v1.1 changes only failure handling for invalid input reads; valid-input algorithmic paths and benchmark rasters are unchanged from v1. A 25-feature Kernel-matched input was then executed with absolute paths for seeds 31, 47 and 73 and is reported only as a platform-sensitive diagnostic. It shares the Kernel feature family, but not the learning target or projection semantics: the FLUS ANN estimates same-year label suitability</w:t>
+        <w:t xml:space="preserve">seeding for ANN sampling and CA roulette draws, so the build is not the unmodified upstream executable. A 25-feature Kernel-matched input was then executed with absolute paths for seeds 31, 47 and 73 and is reported only as a platform-sensitive diagnostic. It shares the Kernel feature family, but not the learning target or projection semantics: the FLUS ANN estimates same-year label suitability</w:t>
       </w:r>
       <w:r>
         <w:t xml:space="preserve"> </w:t>
@@ -3927,6 +3985,160 @@
         <w:pStyle w:val="BodyText"/>
       </w:pPr>
       <w:r>
+        <w:t xml:space="preserve">The complete 6 × 6 annual cross-product matrices are supplied with the source</w:t>
+      </w:r>
+      <w:r>
+        <w:t xml:space="preserve"> </w:t>
+      </w:r>
+      <w:r>
+        <w:t xml:space="preserve">data. In 2021, 2022 and 2024, 61–68% of discordant cells were Dynamic World</w:t>
+      </w:r>
+      <w:r>
+        <w:t xml:space="preserve"> </w:t>
+      </w:r>
+      <w:r>
+        <w:t xml:space="preserve">bare mapped as ArcGIS-served built (13,078, 18,787 and 17,987 cells,</w:t>
+      </w:r>
+      <w:r>
+        <w:t xml:space="preserve"> </w:t>
+      </w:r>
+      <w:r>
+        <w:t xml:space="preserve">respectively); a further 3,723–4,496 cells per year were Dynamic World bare</w:t>
+      </w:r>
+      <w:r>
+        <w:t xml:space="preserve"> </w:t>
+      </w:r>
+      <w:r>
+        <w:t xml:space="preserve">mapped as ArcGIS-served water. The ArcGIS-served product also mapped 4,501,</w:t>
+      </w:r>
+      <w:r>
+        <w:t xml:space="preserve"> </w:t>
+      </w:r>
+      <w:r>
+        <w:t xml:space="preserve">4,985 and 5,131 more water cells than Dynamic World in those three years.</w:t>
+      </w:r>
+      <w:r>
+        <w:t xml:space="preserve"> </w:t>
+      </w:r>
+      <w:r>
+        <w:t xml:space="preserve">Because origin-year water and wetland are hard masks, this product difference</w:t>
+      </w:r>
+      <w:r>
+        <w:t xml:space="preserve"> </w:t>
+      </w:r>
+      <w:r>
+        <w:t xml:space="preserve">reduces the feasible allocation domain in the ArcGIS track. It is therefore a</w:t>
+      </w:r>
+      <w:r>
+        <w:t xml:space="preserve"> </w:t>
+      </w:r>
+      <w:r>
+        <w:t xml:space="preserve">pipeline difference, not an isolated replacement of target labels.</w:t>
+      </w:r>
+    </w:p>
+    <w:p>
+      <w:pPr>
+        <w:pStyle w:val="BodyText"/>
+      </w:pPr>
+      <w:r>
+        <w:t xml:space="preserve">The ArcGIS-served sequence is also not temporally homogeneous under this</w:t>
+      </w:r>
+      <w:r>
+        <w:t xml:space="preserve"> </w:t>
+      </w:r>
+      <w:r>
+        <w:t xml:space="preserve">crosswalk. Its mapped built cells rise from 21,608 in 2021 to 28,214 in 2022</w:t>
+      </w:r>
+      <w:r>
+        <w:t xml:space="preserve"> </w:t>
+      </w:r>
+      <w:r>
+        <w:t xml:space="preserve">(+30.6%), while bare cells fall from 34,521 to 27,821. Woody vegetation declines</w:t>
+      </w:r>
+      <w:r>
+        <w:t xml:space="preserve"> </w:t>
+      </w:r>
+      <w:r>
+        <w:t xml:space="preserve">from 293 cells in 2021 to 22 in 2023 and 2 in 2025; wetland similarly declines</w:t>
+      </w:r>
+      <w:r>
+        <w:t xml:space="preserve"> </w:t>
+      </w:r>
+      <w:r>
+        <w:t xml:space="preserve">from 792 to 24 and 17. Supplementary Table S6 reports all annual class stocks,</w:t>
+      </w:r>
+      <w:r>
+        <w:t xml:space="preserve"> </w:t>
+      </w:r>
+      <w:r>
+        <w:t xml:space="preserve">the crosswalk sensitivity and product-agreement data. Dynamic World, in contrast,</w:t>
+      </w:r>
+      <w:r>
+        <w:t xml:space="preserve"> </w:t>
+      </w:r>
+      <w:r>
+        <w:t xml:space="preserve">retains roughly 900–1,100 wetland cells and 311–917 woody cells. The Living Atlas</w:t>
+      </w:r>
+      <w:r>
+        <w:t xml:space="preserve"> </w:t>
+      </w:r>
+      <w:r>
+        <w:t xml:space="preserve">documentation flags a different 2017 imagery basis but provides no annual</w:t>
+      </w:r>
+      <w:r>
+        <w:t xml:space="preserve"> </w:t>
+      </w:r>
+      <w:r>
+        <w:t xml:space="preserve">model-version history, so we cannot attribute the 2021–2023 break to a specific</w:t>
+      </w:r>
+      <w:r>
+        <w:t xml:space="preserve"> </w:t>
+      </w:r>
+      <w:r>
+        <w:t xml:space="preserve">service change. It must not be read as observed city conversion. In particular,</w:t>
+      </w:r>
+      <w:r>
+        <w:t xml:space="preserve"> </w:t>
+      </w:r>
+      <w:r>
+        <w:t xml:space="preserve">the high 2022 ArcGIS score evaluates allocation against a target whose class</w:t>
+      </w:r>
+      <w:r>
+        <w:t xml:space="preserve"> </w:t>
+      </w:r>
+      <w:r>
+        <w:t xml:space="preserve">totals partly encode this discontinuity; it is not evidence that the model</w:t>
+      </w:r>
+      <w:r>
+        <w:t xml:space="preserve"> </w:t>
+      </w:r>
+      <w:r>
+        <w:t xml:space="preserve">recovered a verified one-year construction event. The ArcGIS 2025 planning origin</w:t>
+      </w:r>
+      <w:r>
+        <w:t xml:space="preserve"> </w:t>
+      </w:r>
+      <w:r>
+        <w:t xml:space="preserve">likewise contains only two woody and 17 wetland cells. Water and wetland masks</w:t>
+      </w:r>
+      <w:r>
+        <w:t xml:space="preserve"> </w:t>
+      </w:r>
+      <w:r>
+        <w:t xml:space="preserve">remain hard exclusions, but ecological semantics attached to the latter class are</w:t>
+      </w:r>
+      <w:r>
+        <w:t xml:space="preserve"> </w:t>
+      </w:r>
+      <w:r>
+        <w:t xml:space="preserve">structurally sparse in that product track.</w:t>
+      </w:r>
+    </w:p>
+    <w:p>
+      <w:pPr>
+        <w:pStyle w:val="BodyText"/>
+      </w:pPr>
+      <w:r>
         <w:t xml:space="preserve">Under the leakage-controlled matched protocol, Geospatial Kernel had the</w:t>
       </w:r>
       <w:r>
@@ -3945,13 +4157,31 @@
         <w:t xml:space="preserve"> </w:t>
       </w:r>
       <w:r>
-        <w:t xml:space="preserve">ArcGIS-served targets. FLUS-style ANN–CA led the ArcGIS-served 2021 target</w:t>
-      </w:r>
-      <w:r>
-        <w:t xml:space="preserve"> </w:t>
-      </w:r>
-      <w:r>
-        <w:t xml:space="preserve">(0.0625 versus Kernel 0.0154 and GeoFM-LDN 0.0314), GeoFM-LDN led in 2022</w:t>
+        <w:t xml:space="preserve">ArcGIS-served targets. FLUS-style ANN–CA had the highest mean in the</w:t>
+      </w:r>
+      <w:r>
+        <w:t xml:space="preserve"> </w:t>
+      </w:r>
+      <w:r>
+        <w:t xml:space="preserve">ArcGIS-served 2021 target (0.0625 versus Kernel 0.0154 and GeoFM-LDN 0.0314),</w:t>
+      </w:r>
+      <w:r>
+        <w:t xml:space="preserve"> </w:t>
+      </w:r>
+      <w:r>
+        <w:t xml:space="preserve">but this is not a like-for-like minimum-change comparison: FLUS changed</w:t>
+      </w:r>
+      <w:r>
+        <w:t xml:space="preserve"> </w:t>
+      </w:r>
+      <w:r>
+        <w:t xml:space="preserve">779–6,860 cells across seeds whereas the other three allocators changed exactly</w:t>
+      </w:r>
+      <w:r>
+        <w:t xml:space="preserve"> </w:t>
+      </w:r>
+      <w:r>
+        <w:t xml:space="preserve">278. GeoFM-LDN led in 2022</w:t>
       </w:r>
       <w:r>
         <w:t xml:space="preserve"> </w:t>
@@ -4029,25 +4259,43 @@
         <w:t xml:space="preserve"> </w:t>
       </w:r>
       <w:r>
-        <w:t xml:space="preserve">0.0731 for FLUS-style, 0.0654 for GeoFM-LDN and 0.0579 for Kernel; Kernel is</w:t>
-      </w:r>
-      <w:r>
-        <w:t xml:space="preserve"> </w:t>
-      </w:r>
-      <w:r>
-        <w:t xml:space="preserve">therefore not the numerical leader in the latest year. Block-size sensitivity</w:t>
-      </w:r>
-      <w:r>
-        <w:t xml:space="preserve"> </w:t>
-      </w:r>
-      <w:r>
-        <w:t xml:space="preserve">has not been established, and repeated seeds do not constitute independent</w:t>
-      </w:r>
-      <w:r>
-        <w:t xml:space="preserve"> </w:t>
-      </w:r>
-      <w:r>
-        <w:t xml:space="preserve">spatial or temporal replication. The</w:t>
+        <w:t xml:space="preserve">0.0731 for FLUS-style, 0.0654 for GeoFM-LDN and 0.0579 for Kernel. The FLUS mean</w:t>
+      </w:r>
+      <w:r>
+        <w:t xml:space="preserve"> </w:t>
+      </w:r>
+      <w:r>
+        <w:t xml:space="preserve">is driven upward by its seed-73 result (6,693 changed cells; FoM 0.1052), while</w:t>
+      </w:r>
+      <w:r>
+        <w:t xml:space="preserve"> </w:t>
+      </w:r>
+      <w:r>
+        <w:t xml:space="preserve">its other two seeds (1,651 and 957 changed cells; FoM 0.0632 and 0.0510) overlap</w:t>
+      </w:r>
+      <w:r>
+        <w:t xml:space="preserve"> </w:t>
+      </w:r>
+      <w:r>
+        <w:t xml:space="preserve">the Kernel seed range. Kernel is therefore not the numerical leader in that fold,</w:t>
+      </w:r>
+      <w:r>
+        <w:t xml:space="preserve"> </w:t>
+      </w:r>
+      <w:r>
+        <w:t xml:space="preserve">but neither is a seed-pooled claim of FLUS superiority supported. Block-size</w:t>
+      </w:r>
+      <w:r>
+        <w:t xml:space="preserve"> </w:t>
+      </w:r>
+      <w:r>
+        <w:t xml:space="preserve">sensitivity has not been established, and repeated seeds do not constitute</w:t>
+      </w:r>
+      <w:r>
+        <w:t xml:space="preserve"> </w:t>
+      </w:r>
+      <w:r>
+        <w:t xml:space="preserve">independent spatial or temporal replication. The</w:t>
       </w:r>
       <w:r>
         <w:t xml:space="preserve"> </w:t>
@@ -4079,7 +4327,13 @@
         <w:pStyle w:val="BodyText"/>
       </w:pPr>
       <w:r>
-        <w:t xml:space="preserve">The count-only analysis exposes an additional source of score dependence. In</w:t>
+        <w:t xml:space="preserve">The count-only analysis exposes an additional source of score dependence for</w:t>
+      </w:r>
+      <w:r>
+        <w:t xml:space="preserve"> </w:t>
+      </w:r>
+      <w:r>
+        <w:t xml:space="preserve">the exact minimum-change projections only. In</w:t>
       </w:r>
       <w:r>
         <w:t xml:space="preserve"> </w:t>
@@ -4133,13 +4387,25 @@
         <w:t xml:space="preserve"> </w:t>
       </w:r>
       <w:r>
-        <w:t xml:space="preserve">more accurate or establish the performance of an allocator allowing simultaneous</w:t>
-      </w:r>
-      <w:r>
-        <w:t xml:space="preserve"> </w:t>
-      </w:r>
-      <w:r>
-        <w:t xml:space="preserve">gain and loss of each class.</w:t>
+        <w:t xml:space="preserve">more accurate. Supplementary Table S7 also shows that FLUS already permits</w:t>
+      </w:r>
+      <w:r>
+        <w:t xml:space="preserve"> </w:t>
+      </w:r>
+      <w:r>
+        <w:t xml:space="preserve">simultaneous class inflows and outflows: its altered-cell totals span 1.1–24.7</w:t>
+      </w:r>
+      <w:r>
+        <w:t xml:space="preserve"> </w:t>
+      </w:r>
+      <w:r>
+        <w:t xml:space="preserve">times M across the ArcGIS folds. The bounds therefore do not explain its 2021</w:t>
+      </w:r>
+      <w:r>
+        <w:t xml:space="preserve"> </w:t>
+      </w:r>
+      <w:r>
+        <w:t xml:space="preserve">mean or constrain its FoM.</w:t>
       </w:r>
     </w:p>
     <w:p>
@@ -4177,31 +4443,49 @@
         <w:t xml:space="preserve"> </w:t>
       </w:r>
       <w:r>
-        <w:t xml:space="preserve">replacement under the released proxy objectives. Identical membership among</w:t>
-      </w:r>
-      <w:r>
-        <w:t xml:space="preserve"> </w:t>
-      </w:r>
-      <w:r>
-        <w:t xml:space="preserve">three candidates does not establish spatial agreement of their allocations or</w:t>
-      </w:r>
-      <w:r>
-        <w:t xml:space="preserve"> </w:t>
-      </w:r>
-      <w:r>
-        <w:t xml:space="preserve">stability of planning benefits. Product-specific origins, horizons and actions</w:t>
-      </w:r>
-      <w:r>
-        <w:t xml:space="preserve"> </w:t>
-      </w:r>
-      <w:r>
-        <w:t xml:space="preserve">also differ; this is not a controlled experiment holding demand and initial</w:t>
-      </w:r>
-      <w:r>
-        <w:t xml:space="preserve"> </w:t>
-      </w:r>
-      <w:r>
-        <w:t xml:space="preserve">conditions fixed. Fig. 4 separates changes in</w:t>
+        <w:t xml:space="preserve">replacement under the released proxy objectives. The retained candidates trade</w:t>
+      </w:r>
+      <w:r>
+        <w:t xml:space="preserve"> </w:t>
+      </w:r>
+      <w:r>
+        <w:t xml:space="preserve">off different objectives after product replacement: in every ArcGIS scenario,</w:t>
+      </w:r>
+      <w:r>
+        <w:t xml:space="preserve"> </w:t>
+      </w:r>
+      <w:r>
+        <w:t xml:space="preserve">FLUS has lower mean major-road distance and lower union-built component density,</w:t>
+      </w:r>
+      <w:r>
+        <w:t xml:space="preserve"> </w:t>
+      </w:r>
+      <w:r>
+        <w:t xml:space="preserve">whereas Kernel has lower mean distance to pre-existing built cells (Supplementary</w:t>
+      </w:r>
+      <w:r>
+        <w:t xml:space="preserve"> </w:t>
+      </w:r>
+      <w:r>
+        <w:t xml:space="preserve">Table S1). Identical membership among three candidates therefore does not</w:t>
+      </w:r>
+      <w:r>
+        <w:t xml:space="preserve"> </w:t>
+      </w:r>
+      <w:r>
+        <w:t xml:space="preserve">establish spatial agreement, stable objective profiles or planning benefits.</w:t>
+      </w:r>
+      <w:r>
+        <w:t xml:space="preserve"> </w:t>
+      </w:r>
+      <w:r>
+        <w:t xml:space="preserve">Product-specific origins, horizons and actions also differ; this is not a</w:t>
+      </w:r>
+      <w:r>
+        <w:t xml:space="preserve"> </w:t>
+      </w:r>
+      <w:r>
+        <w:t xml:space="preserve">controlled experiment holding demand and initial conditions fixed. Fig. 4 separates changes in</w:t>
       </w:r>
       <w:r>
         <w:t xml:space="preserve"> </w:t>
@@ -4224,9 +4508,9 @@
       <w:r>
         <w:drawing>
           <wp:inline>
-            <wp:extent cx="5334000" cy="4641981"/>
+            <wp:extent cx="5334000" cy="4480708"/>
             <wp:effectExtent b="0" l="0" r="0" t="0"/>
-            <wp:docPr descr="Land-cover product robustness. Panel a compares annual mapped built area; only the ArcGIS-served Impact Observatory/Microsoft/Esri series extends to 2025. Panel b reports same-year all-class agreement and built-class intersection over union after six-class harmonization at 100 m. Panel c reports strict destination-change FoM for the ArcGIS-served expanding-window backtest; points are three-seed means and whiskers are population standard deviations. Panel d gives the ArcGIS-served-minus-Dynamic World mean FoM for the four matched one-step targets. All models omit the later road snapshot. Product-specific labels, origin states, oracle totals, origin water/wetland masks and quality semantics are retained, so this is a whole-product-pipeline test rather than authoritative validation. Source data are provided in source_data_fig04_product_robustness.csv." title="" id="35" name="Picture"/>
+            <wp:docPr descr="Land-cover product robustness. Panel a compares annual mapped built area; the dashed line marks the apparent 2021–2022 ArcGIS class-composition break, not a verified city-change event. Only the ArcGIS-served Impact Observatory/Microsoft/Esri series extends to 2025. Panel b reports same-year all-class agreement and built-class intersection over union after six-class harmonization at 100 m. Panel c reports strict destination-change FoM for the ArcGIS-served expanding-window backtest; points are three-seed means and whiskers are population standard deviations. Panel d gives the ArcGIS-served-minus-Dynamic World mean FoM for the four matched one-step targets. All models omit the later road snapshot. Product-specific labels, origin states, oracle totals, origin water/wetland masks and quality semantics are retained, so this is a whole-product-pipeline test rather than authoritative validation. Source data are provided in source_data_fig04_product_robustness.csv." title="" id="35" name="Picture"/>
             <a:graphic>
               <a:graphicData uri="http://schemas.openxmlformats.org/drawingml/2006/picture">
                 <pic:pic>
@@ -4245,7 +4529,7 @@
                   <pic:spPr bwMode="auto">
                     <a:xfrm>
                       <a:off x="0" y="0"/>
-                      <a:ext cx="5334000" cy="4641981"/>
+                      <a:ext cx="5334000" cy="4480708"/>
                     </a:xfrm>
                     <a:prstGeom prst="rect">
                       <a:avLst/>
@@ -4270,7 +4554,7 @@
         <w:keepLines/>
       </w:pPr>
       <w:r>
-        <w:t>Figure 4. Land-cover product robustness. Panel a compares annual mapped built area; only the ArcGIS-served Impact Observatory/Microsoft/Esri series extends to 2025. Panel b reports same-year all-class agreement and built-class intersection over union after six-class harmonization at 100 m. Panel c reports strict destination-change FoM for the ArcGIS-served expanding-window backtest; points are three-seed means and whiskers are population standard deviations. Panel d gives the ArcGIS-served-minus-Dynamic World mean FoM for the four matched one-step targets. All models omit the later road snapshot. Product-specific labels, origin states, oracle totals, origin water/wetland masks and quality semantics are retained, so this is a whole-product-pipeline test rather than authoritative validation. Source data are provided in source_data_fig04_product_robustness.csv.</w:t>
+        <w:t>Figure 4. Land-cover product robustness. Panel a compares annual mapped built area; the dashed line marks the apparent 2021–2022 ArcGIS class-composition break, not a verified city-change event. Only the ArcGIS-served Impact Observatory/Microsoft/Esri series extends to 2025. Panel b reports same-year all-class agreement and built-class intersection over union after six-class harmonization at 100 m. Panel c reports strict destination-change FoM for the ArcGIS-served expanding-window backtest; points are three-seed means and whiskers are population standard deviations. Panel d gives the ArcGIS-served-minus-Dynamic World mean FoM for the four matched one-step targets. All models omit the later road snapshot. Product-specific labels, origin states, oracle totals, origin water/wetland masks and quality semantics are retained, so this is a whole-product-pipeline test rather than authoritative validation. Source data are provided in source_data_fig04_product_robustness.csv.</w:t>
       </w:r>
     </w:p>
     <w:p>
@@ -4363,6 +4647,48 @@
       </w:r>
       <w:r>
         <w:t xml:space="preserve">claims.</w:t>
+      </w:r>
+      <w:r>
+        <w:t xml:space="preserve"> </w:t>
+      </w:r>
+      <w:r>
+        <w:t xml:space="preserve">The ArcGIS-origin bundle does not preserve the same objective ordering. In its</w:t>
+      </w:r>
+      <w:r>
+        <w:t xml:space="preserve"> </w:t>
+      </w:r>
+      <w:r>
+        <w:t xml:space="preserve">three scenarios, FLUS-style ANN–CA has lower mean distance to major roads</w:t>
+      </w:r>
+      <w:r>
+        <w:t xml:space="preserve"> </w:t>
+      </w:r>
+      <w:r>
+        <w:t xml:space="preserve">(368/366/389 m) and lower union-built component density (0.731/0.798/0.631 per</w:t>
+      </w:r>
+      <w:r>
+        <w:t xml:space="preserve"> </w:t>
+      </w:r>
+      <w:r>
+        <w:t xml:space="preserve">1,000 cells), whereas Kernel has lower mean distance to pre-existing built</w:t>
+      </w:r>
+      <w:r>
+        <w:t xml:space="preserve"> </w:t>
+      </w:r>
+      <w:r>
+        <w:t xml:space="preserve">cells (119/113/155 m; Supplementary Table S1). Thus the two retained frontier</w:t>
+      </w:r>
+      <w:r>
+        <w:t xml:space="preserve"> </w:t>
+      </w:r>
+      <w:r>
+        <w:t xml:space="preserve">members are stable as a set, but the dimension supporting each member changes</w:t>
+      </w:r>
+      <w:r>
+        <w:t xml:space="preserve"> </w:t>
+      </w:r>
+      <w:r>
+        <w:t xml:space="preserve">when the product-specific origin and actions change.</w:t>
       </w:r>
       <w:r>
         <w:t xml:space="preserve"> </w:t>
@@ -4392,7 +4718,7 @@
               <a:graphicData uri="http://schemas.openxmlformats.org/drawingml/2006/picture">
                 <pic:pic>
                   <pic:nvPicPr>
-                    <pic:cNvPr descr="figures/fig04_planning_objectives.png" id="39" name="Picture"/>
+                    <pic:cNvPr descr="figures/fig05_planning_objectives.png" id="39" name="Picture"/>
                     <pic:cNvPicPr>
                       <a:picLocks noChangeArrowheads="1" noChangeAspect="1"/>
                     </pic:cNvPicPr>
@@ -5564,7 +5890,7 @@
               <a:graphicData uri="http://schemas.openxmlformats.org/drawingml/2006/picture">
                 <pic:pic>
                   <pic:nvPicPr>
-                    <pic:cNvPr descr="figures/fig05_mechanism_ablation.png" id="44" name="Picture"/>
+                    <pic:cNvPr descr="figures/fig06_mechanism_ablation.png" id="44" name="Picture"/>
                     <pic:cNvPicPr>
                       <a:picLocks noChangeArrowheads="1" noChangeAspect="1"/>
                     </pic:cNvPicPr>
@@ -5735,7 +6061,7 @@
               <a:graphicData uri="http://schemas.openxmlformats.org/drawingml/2006/picture">
                 <pic:pic>
                   <pic:nvPicPr>
-                    <pic:cNvPr descr="figures/fig06_planning_maps_2031.png" id="48" name="Picture"/>
+                    <pic:cNvPr descr="figures/fig07_planning_maps_2031.png" id="48" name="Picture"/>
                     <pic:cNvPicPr>
                       <a:picLocks noChangeArrowheads="1" noChangeAspect="1"/>
                     </pic:cNvPicPr>
@@ -5845,7 +6171,37 @@
         <w:t xml:space="preserve"> </w:t>
       </w:r>
       <w:r>
-        <w:t xml:space="preserve">labels alone. The available 2020–2021 WorldCover diagnostic is neither fully</w:t>
+        <w:t xml:space="preserve">labels alone. The ArcGIS series additionally has a pronounced internal</w:t>
+      </w:r>
+      <w:r>
+        <w:t xml:space="preserve"> </w:t>
+      </w:r>
+      <w:r>
+        <w:t xml:space="preserve">class-composition break between 2021 and 2023, with no published annual</w:t>
+      </w:r>
+      <w:r>
+        <w:t xml:space="preserve"> </w:t>
+      </w:r>
+      <w:r>
+        <w:t xml:space="preserve">model-version history. Its 2022 change prevalence and high GeoFM-LDN FoM may</w:t>
+      </w:r>
+      <w:r>
+        <w:t xml:space="preserve"> </w:t>
+      </w:r>
+      <w:r>
+        <w:t xml:space="preserve">therefore partly score a product reclassification rather than land-cover change;</w:t>
+      </w:r>
+      <w:r>
+        <w:t xml:space="preserve"> </w:t>
+      </w:r>
+      <w:r>
+        <w:t xml:space="preserve">the sparse ArcGIS wetland/woody states also weaken ecological interpretation of</w:t>
+      </w:r>
+      <w:r>
+        <w:t xml:space="preserve"> </w:t>
+      </w:r>
+      <w:r>
+        <w:t xml:space="preserve">the 2025-origin scenario track. The available 2020–2021 WorldCover diagnostic is neither fully</w:t>
       </w:r>
       <w:r>
         <w:t xml:space="preserve"> </w:t>
@@ -5929,7 +6285,7 @@
         <w:t xml:space="preserve"> </w:t>
       </w:r>
       <w:r>
-        <w:t xml:space="preserve">with the author’s</w:t>
+        <w:t xml:space="preserve">with study-specific</w:t>
       </w:r>
       <w:r>
         <w:t xml:space="preserve"> </w:t>
@@ -5953,13 +6309,61 @@
         <w:t xml:space="preserve"> </w:t>
       </w:r>
       <w:r>
-        <w:t xml:space="preserve">and deterministic-seeding patches; its</w:t>
-      </w:r>
-      <w:r>
-        <w:t xml:space="preserve"> </w:t>
-      </w:r>
-      <w:r>
-        <w:t xml:space="preserve">headline comparison uses seven drivers. The 25-feature run is a</w:t>
+        <w:t xml:space="preserve">and deterministic-seeding patches;</w:t>
+      </w:r>
+      <w:r>
+        <w:t xml:space="preserve"> </w:t>
+      </w:r>
+      <w:r>
+        <w:t xml:space="preserve">its headline comparison uses seven drivers. It is already a gross-transition</w:t>
+      </w:r>
+      <w:r>
+        <w:t xml:space="preserve"> </w:t>
+      </w:r>
+      <w:r>
+        <w:t xml:space="preserve">allocator: across ArcGIS folds it changes 1.1–24.7 times the exact minimum-change</w:t>
+      </w:r>
+      <w:r>
+        <w:t xml:space="preserve"> </w:t>
+      </w:r>
+      <w:r>
+        <w:t xml:space="preserve">budget while retaining near-zero demand error. This extra transition budget does</w:t>
+      </w:r>
+      <w:r>
+        <w:t xml:space="preserve"> </w:t>
+      </w:r>
+      <w:r>
+        <w:t xml:space="preserve">not itself deliver higher FoM: FLUS is below Kernel on Dynamic World 2021 despite</w:t>
+      </w:r>
+      <w:r>
+        <w:t xml:space="preserve"> </w:t>
+      </w:r>
+      <w:r>
+        <w:t xml:space="preserve">changing 4.4–5.2 times as many cells, and its apparent ArcGIS 2021/2025 mean</w:t>
+      </w:r>
+      <w:r>
+        <w:t xml:space="preserve"> </w:t>
+      </w:r>
+      <w:r>
+        <w:t xml:space="preserve">advantages occur where its seed-specific altered-cell totals are highly variable.</w:t>
+      </w:r>
+      <w:r>
+        <w:t xml:space="preserve"> </w:t>
+      </w:r>
+      <w:r>
+        <w:t xml:space="preserve">The next gross-transition experiment should therefore hold the proposal model,</w:t>
+      </w:r>
+      <w:r>
+        <w:t xml:space="preserve"> </w:t>
+      </w:r>
+      <w:r>
+        <w:t xml:space="preserve">candidate pool and constraints fixed rather than treating the existing FLUS</w:t>
+      </w:r>
+      <w:r>
+        <w:t xml:space="preserve"> </w:t>
+      </w:r>
+      <w:r>
+        <w:t xml:space="preserve">baseline as a direct test of Kernel’s projection. The 25-feature run is a</w:t>
       </w:r>
       <w:r>
         <w:t xml:space="preserve"> </w:t>
@@ -6116,25 +6520,37 @@
         <w:t xml:space="preserve"> </w:t>
       </w:r>
       <w:r>
-        <w:t xml:space="preserve">compared with the minimum-change projection under the same proposal and masks.</w:t>
-      </w:r>
-      <w:r>
-        <w:t xml:space="preserve"> </w:t>
-      </w:r>
-      <w:r>
-        <w:t xml:space="preserve">Neither independent reference validation nor this gross-transition experiment</w:t>
-      </w:r>
-      <w:r>
-        <w:t xml:space="preserve"> </w:t>
-      </w:r>
-      <w:r>
-        <w:t xml:space="preserve">has been performed. They are requirements for extending the present conditional</w:t>
-      </w:r>
-      <w:r>
-        <w:t xml:space="preserve"> </w:t>
-      </w:r>
-      <w:r>
-        <w:t xml:space="preserve">allocation findings to operational planning claims.</w:t>
+        <w:t xml:space="preserve">compared with the minimum-change projection under the same proposal, candidate</w:t>
+      </w:r>
+      <w:r>
+        <w:t xml:space="preserve"> </w:t>
+      </w:r>
+      <w:r>
+        <w:t xml:space="preserve">pool and masks. The FLUS baseline provides only partial evidence because its</w:t>
+      </w:r>
+      <w:r>
+        <w:t xml:space="preserve"> </w:t>
+      </w:r>
+      <w:r>
+        <w:t xml:space="preserve">suitability learner, finite CA iterations and candidate mechanism also differ.</w:t>
+      </w:r>
+      <w:r>
+        <w:t xml:space="preserve"> </w:t>
+      </w:r>
+      <w:r>
+        <w:t xml:space="preserve">Neither independent reference validation nor this controlled gross-transition</w:t>
+      </w:r>
+      <w:r>
+        <w:t xml:space="preserve"> </w:t>
+      </w:r>
+      <w:r>
+        <w:t xml:space="preserve">experiment has been performed. They are requirements for extending the present</w:t>
+      </w:r>
+      <w:r>
+        <w:t xml:space="preserve"> </w:t>
+      </w:r>
+      <w:r>
+        <w:t xml:space="preserve">conditional allocation findings to operational planning claims.</w:t>
       </w:r>
     </w:p>
     <w:bookmarkEnd w:id="51"/>
@@ -6165,43 +6581,61 @@
         <w:t xml:space="preserve"> </w:t>
       </w:r>
       <w:r>
-        <w:t xml:space="preserve">prevalence and the leading model by year. Geospatial Kernel remained consistently</w:t>
-      </w:r>
-      <w:r>
-        <w:t xml:space="preserve"> </w:t>
-      </w:r>
-      <w:r>
-        <w:t xml:space="preserve">better than random minimum-change allocation, but it was not universally the</w:t>
-      </w:r>
-      <w:r>
-        <w:t xml:space="preserve"> </w:t>
-      </w:r>
-      <w:r>
-        <w:t xml:space="preserve">best learned model. Its strongest transferable property in this experiment is</w:t>
-      </w:r>
-      <w:r>
-        <w:t xml:space="preserve"> </w:t>
-      </w:r>
-      <w:r>
-        <w:t xml:space="preserve">therefore the auditable separation of learned proposal, constrained projection</w:t>
-      </w:r>
-      <w:r>
-        <w:t xml:space="preserve"> </w:t>
-      </w:r>
-      <w:r>
-        <w:t xml:space="preserve">and state writeback, not a product-independent accuracy claim. The count-only bounds further show</w:t>
-      </w:r>
-      <w:r>
-        <w:t xml:space="preserve"> </w:t>
-      </w:r>
-      <w:r>
-        <w:t xml:space="preserve">that net-change allocation can suppress much of the gross change represented by</w:t>
-      </w:r>
-      <w:r>
-        <w:t xml:space="preserve"> </w:t>
-      </w:r>
-      <w:r>
-        <w:t xml:space="preserve">a product; future work must separate that restriction from proposal-model skill.</w:t>
+        <w:t xml:space="preserve">prevalence and the leading model by year, while its 2021–2023 class-composition</w:t>
+      </w:r>
+      <w:r>
+        <w:t xml:space="preserve"> </w:t>
+      </w:r>
+      <w:r>
+        <w:t xml:space="preserve">break made part of the apparent change unsuitable as evidence of city change.</w:t>
+      </w:r>
+      <w:r>
+        <w:t xml:space="preserve"> </w:t>
+      </w:r>
+      <w:r>
+        <w:t xml:space="preserve">Geospatial Kernel remained consistently better than random minimum-change</w:t>
+      </w:r>
+      <w:r>
+        <w:t xml:space="preserve"> </w:t>
+      </w:r>
+      <w:r>
+        <w:t xml:space="preserve">allocation, but it was not universally the best learned model. Its strongest</w:t>
+      </w:r>
+      <w:r>
+        <w:t xml:space="preserve"> </w:t>
+      </w:r>
+      <w:r>
+        <w:t xml:space="preserve">transferable property in this experiment is therefore the auditable separation</w:t>
+      </w:r>
+      <w:r>
+        <w:t xml:space="preserve"> </w:t>
+      </w:r>
+      <w:r>
+        <w:t xml:space="preserve">of learned proposal, constrained projection and state writeback, not a</w:t>
+      </w:r>
+      <w:r>
+        <w:t xml:space="preserve"> </w:t>
+      </w:r>
+      <w:r>
+        <w:t xml:space="preserve">product-independent accuracy claim. The count-only bounds constrain only the</w:t>
+      </w:r>
+      <w:r>
+        <w:t xml:space="preserve"> </w:t>
+      </w:r>
+      <w:r>
+        <w:t xml:space="preserve">exact minimum-change projections; the FLUS baseline already shows that allowing</w:t>
+      </w:r>
+      <w:r>
+        <w:t xml:space="preserve"> </w:t>
+      </w:r>
+      <w:r>
+        <w:t xml:space="preserve">more gross change alone does not determine FoM. A controlled gross-transition</w:t>
+      </w:r>
+      <w:r>
+        <w:t xml:space="preserve"> </w:t>
+      </w:r>
+      <w:r>
+        <w:t xml:space="preserve">comparison must separate that budget from proposal-model skill.</w:t>
       </w:r>
     </w:p>
     <w:p>
@@ -6308,7 +6742,7 @@
         <w:t xml:space="preserve">77e2c59</w:t>
       </w:r>
       <w:r>
-        <w:t xml:space="preserve">; the version-independent concept DOI is https://doi.org/10.5281/zenodo.22663475. The v2 release is defined by</w:t>
+        <w:t xml:space="preserve">; the version-independent concept DOI is https://doi.org/10.5281/zenodo.22663475. The published v2 release is defined by</w:t>
       </w:r>
       <w:r>
         <w:t xml:space="preserve"> </w:t>
@@ -6338,22 +6772,7 @@
         <w:t xml:space="preserve"> </w:t>
       </w:r>
       <w:r>
-        <w:t xml:space="preserve">(reports, source data, figures and delivered rasters/vectors);</w:t>
-      </w:r>
-      <w:r>
-        <w:t xml:space="preserve"> </w:t>
-      </w:r>
-      <w:r>
-        <w:rPr>
-          <w:rStyle w:val="VerbatimChar"/>
-        </w:rPr>
-        <w:t xml:space="preserve">reproducibility_check.py</w:t>
-      </w:r>
-      <w:r>
-        <w:t xml:space="preserve"> </w:t>
-      </w:r>
-      <w:r>
-        <w:t xml:space="preserve">verifies both sets. The Zenodo record contains GitHub’s automatically generated source ZIP, which was inspected after publication and contains Git LFS pointers rather than hydrated large rasters, GeoPackages and model checkpoints. A full numerical rerun therefore requires checking out the tagged GitHub repository, retrieving its LFS objects and passing both v2 manifest checks; the DOI record alone is not a self-contained binary-data archive. The main evidence files are:</w:t>
+        <w:t xml:space="preserve">(reports, source data, figures and delivered rasters/vectors). This manuscript’s separate working-revision manifest additionally freezes the 27 per-seed 2031 ArcGIS planning rasters required to regenerate Fig. 4 and Supplementary Tables S1/S6 from frozen inputs. The Zenodo record contains GitHub’s automatically generated source ZIP, which was inspected after publication and contains Git LFS pointers rather than hydrated large rasters, GeoPackages and model checkpoints. A full numerical rerun therefore requires checking out the tagged GitHub repository and retrieving its LFS objects; the DOI record alone is not a self-contained binary-data archive. The main evidence files are:</w:t>
       </w:r>
     </w:p>
     <w:p>
@@ -6659,10 +7078,7 @@
         <w:t xml:space="preserve">results_arcgis_v2/paper_refresh/</w:t>
       </w:r>
       <w:r>
-        <w:t xml:space="preserve"> </w:t>
-      </w:r>
-      <w:r>
-        <w:t xml:space="preserve">and Supplementary Table S6 for the synchronized result;</w:t>
+        <w:t xml:space="preserve">, Supplementary Tables S1/S6, and the 27 frozen per-seed 2031 ArcGIS planning states, whose locations and hashes are recorded in the working-revision publication-output manifest;</w:t>
       </w:r>
     </w:p>
     <w:p>
@@ -6728,7 +7144,7 @@
         </w:numPr>
       </w:pPr>
       <w:r>
-        <w:t xml:space="preserve">The released bundle includes the aligned 2017–2024 public rasters, historical and rolling-origin prediction rasters, frozen WorldCover built-fraction rasters, 2025–2031 planning rasters, nine GeoPackages of dissolved change footprints, model checkpoints and the SHA-256 manifest. Text hashes use canonical LF line endings, and the byte-length check applies the same normalization on text records, so a Windows checkout with</w:t>
+        <w:t xml:space="preserve">The released bundle includes the aligned 2017–2024 public rasters, historical and rolling-origin prediction rasters, frozen WorldCover built-fraction rasters, 2025–2031 planning rasters, nine GeoPackages of dissolved change footprints, model checkpoints and SHA-256 manifests. Working-revision text records use canonical LF hashes and pass with</w:t>
       </w:r>
       <w:r>
         <w:t xml:space="preserve"> </w:t>
@@ -6740,25 +7156,28 @@
         <w:t xml:space="preserve">core.autocrlf=true</w:t>
       </w:r>
       <w:r>
-        <w:t xml:space="preserve"> </w:t>
-      </w:r>
-      <w:r>
-        <w:t xml:space="preserve">can pass the manifest gate. The locked macOS arm64 execution environment remains the reference for model outputs. An archived arm64 Linux rerun of the six historical Kernel rasters differed from the macOS reference by 498–1,147 cells (0.62%–1.44%), with strict-FoM deltas from -0.0023 to +0.0010; these cross-stack differences are quantified rather than treated as categorical identity. An author-controlled GitHub Actions Ubuntu x86_64 rerun of all six rasters under the resolved lock had zero categorical differences; the repository-stored CI audit is in</w:t>
-      </w:r>
-      <w:r>
-        <w:t xml:space="preserve"> </w:t>
+        <w:t xml:space="preserve">; exact verification of the published v2.0.0 manifests requires a separate LF checkout (</w:t>
       </w:r>
       <w:r>
         <w:rPr>
           <w:rStyle w:val="VerbatimChar"/>
         </w:rPr>
+        <w:t xml:space="preserve">git -c core.autocrlf=false checkout v2.0.0</w:t>
+      </w:r>
+      <w:r>
+        <w:t xml:space="preserve">) because six historic text records use raw-byte hashes. The locked macOS arm64 execution environment remains the reference for model outputs. An archived arm64 Linux rerun of the six historical Kernel rasters differed from the macOS reference by 498–1,147 cells (0.62%–1.44%), with strict-FoM deltas from -0.0023 to +0.0010; these cross-stack differences are quantified rather than treated as categorical identity. A maintained GitHub Actions Ubuntu x86_64 rerun of all six rasters under the resolved lock had zero categorical differences; the repository-stored CI audit is in</w:t>
+      </w:r>
+      <w:r>
+        <w:t xml:space="preserve"> </w:t>
+      </w:r>
+      <w:r>
+        <w:rPr>
+          <w:rStyle w:val="VerbatimChar"/>
+        </w:rPr>
         <w:t xml:space="preserve">artifacts/cross_platform</w:t>
       </w:r>
       <w:r>
-        <w:t xml:space="preserve"> </w:t>
-      </w:r>
-      <w:r>
-        <w:t xml:space="preserve">at commit</w:t>
+        <w:t xml:space="preserve">, and the workflow is versioned under</w:t>
       </w:r>
       <w:r>
         <w:t xml:space="preserve"> </w:t>
@@ -6767,18 +7186,6 @@
         <w:rPr>
           <w:rStyle w:val="VerbatimChar"/>
         </w:rPr>
-        <w:t xml:space="preserve">e06a997</w:t>
-      </w:r>
-      <w:r>
-        <w:t xml:space="preserve">, and the workflow is versioned under</w:t>
-      </w:r>
-      <w:r>
-        <w:t xml:space="preserve"> </w:t>
-      </w:r>
-      <w:r>
-        <w:rPr>
-          <w:rStyle w:val="VerbatimChar"/>
-        </w:rPr>
         <w:t xml:space="preserve">.github/workflows/</w:t>
       </w:r>
       <w:r>
@@ -6802,19 +7209,19 @@
         <w:t xml:space="preserve"> </w:t>
       </w:r>
       <w:r>
-        <w:t xml:space="preserve">outputs and manuscript. The working revision adds a report-derived allocation-</w:t>
-      </w:r>
-      <w:r>
-        <w:t xml:space="preserve"> </w:t>
-      </w:r>
-      <w:r>
-        <w:t xml:space="preserve">limit analysis and revised interpretation without retraining models or replacing</w:t>
-      </w:r>
-      <w:r>
-        <w:t xml:space="preserve"> </w:t>
-      </w:r>
-      <w:r>
-        <w:t xml:space="preserve">the archived prediction rasters. Its separate working manifests and source hashes</w:t>
+        <w:t xml:space="preserve">outputs and manuscript. The working revision adds report-derived allocation and</w:t>
+      </w:r>
+      <w:r>
+        <w:t xml:space="preserve"> </w:t>
+      </w:r>
+      <w:r>
+        <w:t xml:space="preserve">crosswalk analyses, working-revision 2031 seed rasters, and revised interpretation</w:t>
+      </w:r>
+      <w:r>
+        <w:t xml:space="preserve"> </w:t>
+      </w:r>
+      <w:r>
+        <w:t xml:space="preserve">without retraining models or replacing historical prediction rasters. Its separate working manifests and source hashes</w:t>
       </w:r>
       <w:r>
         <w:t xml:space="preserve"> </w:t>
@@ -7090,6 +7497,18 @@
         <w:t xml:space="preserve">source_data_fig04_product_robustness.csv</w:t>
       </w:r>
       <w:r>
+        <w:t xml:space="preserve">,</w:t>
+      </w:r>
+      <w:r>
+        <w:t xml:space="preserve"> </w:t>
+      </w:r>
+      <w:r>
+        <w:rPr>
+          <w:rStyle w:val="VerbatimChar"/>
+        </w:rPr>
+        <w:t xml:space="preserve">supplementary_table_S1_arcgis_planning_objectives.md</w:t>
+      </w:r>
+      <w:r>
         <w:t xml:space="preserve"> </w:t>
       </w:r>
       <w:r>
@@ -7108,7 +7527,7 @@
         <w:t xml:space="preserve"> </w:t>
       </w:r>
       <w:r>
-        <w:t xml:space="preserve">for the cross-product analysis;</w:t>
+        <w:t xml:space="preserve">for the cross-product analysis; its frozen 2031 seed states allow this analysis to rerun without a new simulation;</w:t>
       </w:r>
     </w:p>
     <w:p>
@@ -7636,6 +8055,24 @@
         <w:t xml:space="preserve">Not applicable; the study used geospatial raster, vector and derived public-data products and did not involve human or animal participants.</w:t>
       </w:r>
     </w:p>
+    <w:p>
+      <w:pPr>
+        <w:pStyle w:val="BodyText"/>
+      </w:pPr>
+      <w:r>
+        <w:rPr>
+          <w:b/>
+          <w:bCs/>
+        </w:rPr>
+        <w:t xml:space="preserve">Declaration of generative AI and AI-assisted technologies in the writing process.</w:t>
+      </w:r>
+      <w:r>
+        <w:t xml:space="preserve"> </w:t>
+      </w:r>
+      <w:r>
+        <w:t xml:space="preserve">During preparation of this work, the author used OpenAI Codex for language editing, code review and document-formatting assistance. The author reviewed and revised all outputs and takes full responsibility for the content of the publication.</w:t>
+      </w:r>
+    </w:p>
     <w:bookmarkEnd w:id="56"/>
     <w:bookmarkStart w:id="57" w:name="references"/>
     <w:p>
@@ -7752,6 +8189,14 @@
       </w:r>
       <w:r>
         <w:t xml:space="preserve">, 13, 922. https://doi.org/10.3390/rs13050922</w:t>
+      </w:r>
+    </w:p>
+    <w:p>
+      <w:pPr>
+        <w:pStyle w:val="BodyText"/>
+      </w:pPr>
+      <w:r>
+        <w:t xml:space="preserve">Esri. (2026). Sentinel-2 10 m land cover time series of the world [Data set]. ArcGIS Living Atlas of the World. https://www.arcgis.com/home/item.html?id=cfcb7609de5f478eb7666240902d4d3d (accessed 11 September 2026).</w:t>
       </w:r>
     </w:p>
     <w:p>
@@ -8098,13 +8543,25 @@
           <w:b/>
           <w:bCs/>
         </w:rPr>
-        <w:t xml:space="preserve">Supplementary Note 1:</w:t>
-      </w:r>
-      <w:r>
-        <w:t xml:space="preserve"> </w:t>
-      </w:r>
-      <w:r>
-        <w:t xml:space="preserve">Complete data crosswalk, quality metrics and public/proxy status.</w:t>
+        <w:t xml:space="preserve">Supplementary Table S1:</w:t>
+      </w:r>
+      <w:r>
+        <w:t xml:space="preserve"> </w:t>
+      </w:r>
+      <w:r>
+        <w:t xml:space="preserve">ArcGIS-served 2031 model–scenario objective profiles with per-seed dispersion (see</w:t>
+      </w:r>
+      <w:r>
+        <w:t xml:space="preserve"> </w:t>
+      </w:r>
+      <w:r>
+        <w:rPr>
+          <w:rStyle w:val="VerbatimChar"/>
+        </w:rPr>
+        <w:t xml:space="preserve">supplementary_table_S1_arcgis_planning_objectives.md</w:t>
+      </w:r>
+      <w:r>
+        <w:t xml:space="preserve">).</w:t>
       </w:r>
     </w:p>
     <w:p>
@@ -8120,13 +8577,25 @@
           <w:b/>
           <w:bCs/>
         </w:rPr>
-        <w:t xml:space="preserve">Supplementary Note 2:</w:t>
-      </w:r>
-      <w:r>
-        <w:t xml:space="preserve"> </w:t>
-      </w:r>
-      <w:r>
-        <w:t xml:space="preserve">Kernel runtime schemas, audit fields and adapter boundary.</w:t>
+        <w:t xml:space="preserve">Supplementary Table S2:</w:t>
+      </w:r>
+      <w:r>
+        <w:t xml:space="preserve"> </w:t>
+      </w:r>
+      <w:r>
+        <w:t xml:space="preserve">Neighbourhood-weight sensitivity at 0, 0.175, 0.35 and 0.7 (see</w:t>
+      </w:r>
+      <w:r>
+        <w:t xml:space="preserve"> </w:t>
+      </w:r>
+      <w:r>
+        <w:rPr>
+          <w:rStyle w:val="VerbatimChar"/>
+        </w:rPr>
+        <w:t xml:space="preserve">supplementary_table_S2_neighbourhood_weight_sensitivity.md</w:t>
+      </w:r>
+      <w:r>
+        <w:t xml:space="preserve">).</w:t>
       </w:r>
     </w:p>
     <w:p>
@@ -8142,35 +8611,13 @@
           <w:b/>
           <w:bCs/>
         </w:rPr>
-        <w:t xml:space="preserve">Supplementary Table S1:</w:t>
-      </w:r>
-      <w:r>
-        <w:t xml:space="preserve"> </w:t>
-      </w:r>
-      <w:r>
-        <w:t xml:space="preserve">Full 2025–2031 model–scenario objective matrix with per-seed values.</w:t>
-      </w:r>
-    </w:p>
-    <w:p>
-      <w:pPr>
-        <w:pStyle w:val="Compact"/>
-        <w:numPr>
-          <w:ilvl w:val="0"/>
-          <w:numId w:val="1004"/>
-        </w:numPr>
-      </w:pPr>
-      <w:r>
-        <w:rPr>
-          <w:b/>
-          <w:bCs/>
-        </w:rPr>
-        <w:t xml:space="preserve">Supplementary Table S2:</w:t>
-      </w:r>
-      <w:r>
-        <w:t xml:space="preserve"> </w:t>
-      </w:r>
-      <w:r>
-        <w:t xml:space="preserve">Neighbourhood-weight sensitivity at 0, 0.175, 0.35 and 0.7 (see</w:t>
+        <w:t xml:space="preserve">Supplementary Table S3:</w:t>
+      </w:r>
+      <w:r>
+        <w:t xml:space="preserve"> </w:t>
+      </w:r>
+      <w:r>
+        <w:t xml:space="preserve">FLUS 13-, 19- and 25-feature diagnostics, platform boundary and demand-underfill evidence (see</w:t>
       </w:r>
       <w:r>
         <w:t xml:space="preserve"> </w:t>
@@ -8179,66 +8626,10 @@
         <w:rPr>
           <w:rStyle w:val="VerbatimChar"/>
         </w:rPr>
-        <w:t xml:space="preserve">supplementary_table_S2_neighbourhood_weight_sensitivity.md</w:t>
+        <w:t xml:space="preserve">supplementary_table_S3_flus_feature_diagnostics.md</w:t>
       </w:r>
       <w:r>
         <w:t xml:space="preserve">).</w:t>
-      </w:r>
-    </w:p>
-    <w:p>
-      <w:pPr>
-        <w:pStyle w:val="Compact"/>
-        <w:numPr>
-          <w:ilvl w:val="0"/>
-          <w:numId w:val="1004"/>
-        </w:numPr>
-      </w:pPr>
-      <w:r>
-        <w:rPr>
-          <w:b/>
-          <w:bCs/>
-        </w:rPr>
-        <w:t xml:space="preserve">Supplementary Table S3:</w:t>
-      </w:r>
-      <w:r>
-        <w:t xml:space="preserve"> </w:t>
-      </w:r>
-      <w:r>
-        <w:t xml:space="preserve">FLUS 13-, 19- and 25-feature diagnostics, platform boundary and demand-underfill evidence (see</w:t>
-      </w:r>
-      <w:r>
-        <w:t xml:space="preserve"> </w:t>
-      </w:r>
-      <w:r>
-        <w:rPr>
-          <w:rStyle w:val="VerbatimChar"/>
-        </w:rPr>
-        <w:t xml:space="preserve">supplementary_table_S3_flus_feature_diagnostics.md</w:t>
-      </w:r>
-      <w:r>
-        <w:t xml:space="preserve">).</w:t>
-      </w:r>
-    </w:p>
-    <w:p>
-      <w:pPr>
-        <w:pStyle w:val="Compact"/>
-        <w:numPr>
-          <w:ilvl w:val="0"/>
-          <w:numId w:val="1004"/>
-        </w:numPr>
-      </w:pPr>
-      <w:r>
-        <w:rPr>
-          <w:b/>
-          <w:bCs/>
-        </w:rPr>
-        <w:t xml:space="preserve">Supplementary Table S4:</w:t>
-      </w:r>
-      <w:r>
-        <w:t xml:space="preserve"> </w:t>
-      </w:r>
-      <w:r>
-        <w:t xml:space="preserve">Raster and vector delivery audit, hashes and layer counts.</w:t>
       </w:r>
     </w:p>
     <w:p>

</xml_diff>

<commit_message>
Address eighteenth LUP review
</commit_message>
<xml_diff>
--- a/manuscript/manuscript.docx
+++ b/manuscript/manuscript.docx
@@ -36,7 +36,7 @@
         <w:pStyle w:val="FirstParagraph"/>
       </w:pPr>
       <w:r>
-        <w:t xml:space="preserve">Public land-cover products are increasingly used where authoritative local time series are unavailable, but product choice and within-product discontinuities can alter apparent urban change and model rankings. We present an auditable protocol for constrained spatial allocation using Geospatial Kernel, the algorithmic core of a Geospatial World Model, as the focal execution layer. Two annual 10-m products for Abu Dhabi city, Google Dynamic World (2017–2024) and an ArcGIS-served Impact Observatory/Microsoft/Esri series (2017–2025), were harmonized to the same 100-m, six-class modelling contract. Leakage-controlled expanding-window tests compared a FLUS-style ANN–CA, Geospatial Kernel, GeoFM-LDN, persistence and random minimum-change allocation using three seeds and 1,000 spatial-block bootstrap resamples. The target year supplied oracle class totals and evaluation labels only. In 2024, the ArcGIS-served series mapped 335.57 km² as built versus 155.98 km² in Dynamic World; built-class intersection over union was 0.449. Its built class also rose by 30.6% between 2021 and 2022 while wetland and woody classes later nearly disappeared, an unreconciled series break. Kernel had the highest mean FoM in four Dynamic World targets and two matched ArcGIS-served targets; these numerical ranks did not uniformly imply paired-interval separation. Net-change allocation imposed product-specific count-only FoM upper bounds of 0.086–0.813 only for exact minimum-change allocators. Kernel’s ArcGIS-minus-Dynamic World strict change Figure of Merit ranged from -0.244 to +0.205. The product-specific 2031 frontiers retained FLUS-style and Kernel candidates in all scenarios, but their objective trade-offs changed. The results support an inspectable proposal–projection–writeback boundary while showing that comparative skill is label-product dependent. Neither product is authoritative local land-use truth, model outputs remain 100 m, and the 2026–2031 maps are conditional stress tests rather than official forecasts.</w:t>
+        <w:t xml:space="preserve">Public land-cover products are often used where authoritative local time series are unavailable, but product choice and temporal discontinuities can alter apparent urban change and model rankings. We present an auditable protocol for constrained spatial allocation using Geospatial Kernel, the execution layer of a Geospatial World Model. Annual 10-m Google Dynamic World (2017–2024) and ArcGIS-served Impact Observatory/Microsoft/Esri (2017–2025) products for Abu Dhabi city were harmonized to a 100-m, six-class contract. Leakage-controlled expanding-window tests compared a FLUS-style ANN–CA, Geospatial Kernel, GeoFM-LDN, persistence and random minimum-change allocation, using three seeds and 1,000 spatial-block resamples. Target-year labels supplied oracle class totals and evaluation only. In 2024, ArcGIS mapped 335.57 km² built versus 155.98 km² in Dynamic World (built IoU 0.449). Its built stock rose 30.6% from 2021 to 2022 while wetland and woody classes subsequently collapsed, indicating an unreconciled product-series break rather than verified city change. Kernel had the highest mean FoM in all four Dynamic World targets and two matched ArcGIS targets, without universal paired-interval separation. Excluding the discontinuity target, ArcGIS-minus-Dynamic World FoM was negative for Kernel (-0.244 to -0.014) and GeoFM-LDN (-0.215 to -0.010), whereas FLUS ranged from -0.100 to +0.023. Exact minimum-change allocators faced product-specific FoM upper bounds of 0.086–0.813 (0.086–0.665 excluding 2022). Product-specific 2031 frontiers retained FLUS-style and Kernel candidates but changed objective trade-offs. The results support an inspectable proposal–projection–writeback boundary while showing comparative skill is label-product dependent. Neither product is authoritative local land-use truth, and 2026–2031 maps are 100-m conditional stress tests.</w:t>
       </w:r>
     </w:p>
     <w:bookmarkEnd w:id="9"/>
@@ -687,7 +687,7 @@
         <w:t xml:space="preserve"> </w:t>
       </w:r>
       <w:r>
-        <w:t xml:space="preserve">indexes the nine source classes. Thus the operation is maximum of temporal mean probabilities, not temporal mean of scene-wise maxima; its maximizing class need not equal the annual modal label. The archived band name</w:t>
+        <w:t xml:space="preserve">indexes the nine source classes. Thus the operation is maximum of temporal mean probabilities, not temporal mean of scene-wise maxima; its maximizing class need not equal the annual modal label. The annual label and the two quality bands were exported directly to the canonical 100-m transform with Earth Engine’s default nearest-neighbour resampling; no post-export 10 × 10 arithmetic or modal aggregation was applied. The archived band name</w:t>
       </w:r>
       <w:r>
         <w:t xml:space="preserve"> </w:t>
@@ -829,19 +829,7 @@
         <w:t xml:space="preserve"> </w:t>
       </w:r>
       <w:r>
-        <w:t xml:space="preserve">were rasterized into distance-to-road and distance-to-major-road surfaces (Geofabrik, 2026). The source URL, snapshot date and SHA-256 are preserved in</w:t>
-      </w:r>
-      <w:r>
-        <w:t xml:space="preserve"> </w:t>
-      </w:r>
-      <w:r>
-        <w:rPr>
-          <w:rStyle w:val="VerbatimChar"/>
-        </w:rPr>
-        <w:t xml:space="preserve">osm_input_manifest.json</w:t>
-      </w:r>
-      <w:r>
-        <w:t xml:space="preserve">; the city geometry is separately recorded in</w:t>
+        <w:t xml:space="preserve">were rasterized into distance-to-road and distance-to-major-road surfaces (Geofabrik, 2026). The dated upstream PBF URL is no longer live and that snapshot is not distributed in this revision; the archived derived road-distance rasters, their checksums and the materialization manifest are the reproducible model inputs. The city geometry is separately recorded in</w:t>
       </w:r>
       <w:r>
         <w:t xml:space="preserve"> </w:t>
@@ -3793,7 +3781,7 @@
           <wp:inline>
             <wp:extent cx="5334000" cy="3532492"/>
             <wp:effectExtent b="0" l="0" r="0" t="0"/>
-            <wp:docPr descr="Rolling-origin robustness and external-product diagnostics. Panel a reports strict destination-change FoM for four leakage-controlled one-step targets; points show means and sample standard deviations across three computational seeds. Panel b reports Kernel-minus-baseline paired spatial-block contrasts; points are mean seed medians and whiskers span the minimum to maximum of seed-specific 95% intervals from 1,000 resamples of 8 × 8-cell blocks. Panel c compares same-year Dynamic World 2020 and 2021 built stocks, plus 2021 Kernel and persistence predictions, with the corresponding WorldCover products at four 100-m built-fraction thresholds. Panel d compares Dynamic World built gain with the count-controlled Kernel and random allocations, where WorldCover gain count is supplied as the action. The original oracle-demand gain test is structural-zero and is not plotted as model evidence. The WorldCover comparison is an external public-product diagnostic, not authoritative ground truth. Source data are provided in source_data_fig03_rolling_external_diagnostics.csv." title="" id="31" name="Picture"/>
+            <wp:docPr descr="Rolling-origin robustness and external-product diagnostics. Panel A reports strict destination-change FoM for four leakage-controlled one-step targets; points show means and sample standard deviations across three computational seeds. Panel B reports Kernel-minus-baseline paired spatial-block contrasts; points are mean seed medians and whiskers span the minimum to maximum of seed-specific 95% intervals from 1,000 resamples of 8 × 8-cell blocks. Panel C compares same-year Dynamic World 2020 and 2021 built stocks, plus 2021 Kernel and persistence predictions, with the corresponding WorldCover products at four 100-m built-fraction thresholds. Panel D compares Dynamic World built gain with the count-controlled Kernel and random allocations, where WorldCover gain count is supplied as the action. The original oracle-demand gain test is structural-zero and is not plotted as model evidence. The WorldCover comparison is an external public-product diagnostic, not authoritative ground truth. Source data are provided in source_data_fig03_rolling_external_diagnostics.csv." title="" id="31" name="Picture"/>
             <a:graphic>
               <a:graphicData uri="http://schemas.openxmlformats.org/drawingml/2006/picture">
                 <pic:pic>
@@ -3837,7 +3825,7 @@
         <w:keepLines/>
       </w:pPr>
       <w:r>
-        <w:t>Figure 3. Rolling-origin robustness and external-product diagnostics. Panel a reports strict destination-change FoM for four leakage-controlled one-step targets; points show means and sample standard deviations across three computational seeds. Panel b reports Kernel-minus-baseline paired spatial-block contrasts; points are mean seed medians and whiskers span the minimum to maximum of seed-specific 95% intervals from 1,000 resamples of 8 × 8-cell blocks. Panel c compares same-year Dynamic World 2020 and 2021 built stocks, plus 2021 Kernel and persistence predictions, with the corresponding WorldCover products at four 100-m built-fraction thresholds. Panel d compares Dynamic World built gain with the count-controlled Kernel and random allocations, where WorldCover gain count is supplied as the action. The original oracle-demand gain test is structural-zero and is not plotted as model evidence. The WorldCover comparison is an external public-product diagnostic, not authoritative ground truth. Source data are provided in source_data_fig03_rolling_external_diagnostics.csv.</w:t>
+        <w:t>Figure 3. Rolling-origin robustness and external-product diagnostics. Panel A reports strict destination-change FoM for four leakage-controlled one-step targets; points show means and sample standard deviations across three computational seeds. Panel B reports Kernel-minus-baseline paired spatial-block contrasts; points are mean seed medians and whiskers span the minimum to maximum of seed-specific 95% intervals from 1,000 resamples of 8 × 8-cell blocks. Panel C compares same-year Dynamic World 2020 and 2021 built stocks, plus 2021 Kernel and persistence predictions, with the corresponding WorldCover products at four 100-m built-fraction thresholds. Panel D compares Dynamic World built gain with the count-controlled Kernel and random allocations, where WorldCover gain count is supplied as the action. The original oracle-demand gain test is structural-zero and is not plotted as model evidence. The WorldCover comparison is an external public-product diagnostic, not authoritative ground truth. Source data are provided in source_data_fig03_rolling_external_diagnostics.csv.</w:t>
       </w:r>
     </w:p>
     <w:p>
@@ -3991,49 +3979,67 @@
         <w:t xml:space="preserve"> </w:t>
       </w:r>
       <w:r>
-        <w:t xml:space="preserve">data. In 2021, 2022 and 2024, 61–68% of discordant cells were Dynamic World</w:t>
-      </w:r>
-      <w:r>
-        <w:t xml:space="preserve"> </w:t>
-      </w:r>
-      <w:r>
-        <w:t xml:space="preserve">bare mapped as ArcGIS-served built (13,078, 18,787 and 17,987 cells,</w:t>
-      </w:r>
-      <w:r>
-        <w:t xml:space="preserve"> </w:t>
-      </w:r>
-      <w:r>
-        <w:t xml:space="preserve">respectively); a further 3,723–4,496 cells per year were Dynamic World bare</w:t>
-      </w:r>
-      <w:r>
-        <w:t xml:space="preserve"> </w:t>
-      </w:r>
-      <w:r>
-        <w:t xml:space="preserve">mapped as ArcGIS-served water. The ArcGIS-served product also mapped 4,501,</w:t>
-      </w:r>
-      <w:r>
-        <w:t xml:space="preserve"> </w:t>
-      </w:r>
-      <w:r>
-        <w:t xml:space="preserve">4,985 and 5,131 more water cells than Dynamic World in those three years.</w:t>
-      </w:r>
-      <w:r>
-        <w:t xml:space="preserve"> </w:t>
-      </w:r>
-      <w:r>
-        <w:t xml:space="preserve">Because origin-year water and wetland are hard masks, this product difference</w:t>
-      </w:r>
-      <w:r>
-        <w:t xml:space="preserve"> </w:t>
-      </w:r>
-      <w:r>
-        <w:t xml:space="preserve">reduces the feasible allocation domain in the ArcGIS track. It is therefore a</w:t>
-      </w:r>
-      <w:r>
-        <w:t xml:space="preserve"> </w:t>
-      </w:r>
-      <w:r>
-        <w:t xml:space="preserve">pipeline difference, not an isolated replacement of target labels.</w:t>
+        <w:t xml:space="preserve">data and in Supplementary Table S4. In 2021, 2022 and 2024, 61.3–68.3% of</w:t>
+      </w:r>
+      <w:r>
+        <w:t xml:space="preserve"> </w:t>
+      </w:r>
+      <w:r>
+        <w:t xml:space="preserve">discordant cells were Dynamic World bare mapped as ArcGIS-served built (13,078,</w:t>
+      </w:r>
+      <w:r>
+        <w:t xml:space="preserve"> </w:t>
+      </w:r>
+      <w:r>
+        <w:t xml:space="preserve">18,787 and 17,987 cells, respectively); a further 3,723–4,496 cells per year</w:t>
+      </w:r>
+      <w:r>
+        <w:t xml:space="preserve"> </w:t>
+      </w:r>
+      <w:r>
+        <w:t xml:space="preserve">were Dynamic World bare mapped as ArcGIS-served water. Those transition counts</w:t>
+      </w:r>
+      <w:r>
+        <w:t xml:space="preserve"> </w:t>
+      </w:r>
+      <w:r>
+        <w:t xml:space="preserve">use the pairwise common-coverage grid. The ArcGIS-served product also mapped</w:t>
+      </w:r>
+      <w:r>
+        <w:t xml:space="preserve"> </w:t>
+      </w:r>
+      <w:r>
+        <w:t xml:space="preserve">4,501, 4,985 and 5,131 more water cells than Dynamic World in those three</w:t>
+      </w:r>
+      <w:r>
+        <w:t xml:space="preserve"> </w:t>
+      </w:r>
+      <w:r>
+        <w:t xml:space="preserve">years, using each product’s own valid-cell total (whose denominator differs by</w:t>
+      </w:r>
+      <w:r>
+        <w:t xml:space="preserve"> </w:t>
+      </w:r>
+      <w:r>
+        <w:t xml:space="preserve">18–23 cells from the paired grid). Because origin-year water and wetland are</w:t>
+      </w:r>
+      <w:r>
+        <w:t xml:space="preserve"> </w:t>
+      </w:r>
+      <w:r>
+        <w:t xml:space="preserve">hard masks, this product difference reduces the feasible allocation domain in</w:t>
+      </w:r>
+      <w:r>
+        <w:t xml:space="preserve"> </w:t>
+      </w:r>
+      <w:r>
+        <w:t xml:space="preserve">the ArcGIS track. It is therefore a pipeline difference, not an isolated</w:t>
+      </w:r>
+      <w:r>
+        <w:t xml:space="preserve"> </w:t>
+      </w:r>
+      <w:r>
+        <w:t xml:space="preserve">replacement of target labels.</w:t>
       </w:r>
     </w:p>
     <w:p>
@@ -4211,43 +4217,85 @@
         <w:t xml:space="preserve"> </w:t>
       </w:r>
       <w:r>
-        <w:t xml:space="preserve">+0.205, -0.050 and -0.014 across the four matched years. Thus the learned</w:t>
-      </w:r>
-      <w:r>
-        <w:t xml:space="preserve"> </w:t>
-      </w:r>
-      <w:r>
-        <w:t xml:space="preserve">allocator contains repeatable spatial signal relative to its zero model, while</w:t>
-      </w:r>
-      <w:r>
-        <w:t xml:space="preserve"> </w:t>
-      </w:r>
-      <w:r>
-        <w:t xml:space="preserve">its absolute score and rank remain dependent on the product pipeline. Supplementary</w:t>
-      </w:r>
-      <w:r>
-        <w:t xml:space="preserve"> </w:t>
-      </w:r>
-      <w:r>
-        <w:t xml:space="preserve">Table S7 reports all seed-specific paired intervals for Kernel versus FLUS-style</w:t>
-      </w:r>
-      <w:r>
-        <w:t xml:space="preserve"> </w:t>
-      </w:r>
-      <w:r>
-        <w:t xml:space="preserve">and GeoFM-LDN versus Kernel. In the ArcGIS 2023 target, all three GeoFM-LDN-minus-</w:t>
-      </w:r>
-      <w:r>
-        <w:t xml:space="preserve"> </w:t>
-      </w:r>
-      <w:r>
-        <w:t xml:space="preserve">Kernel intervals include zero despite Kernel’s higher mean; in 2024, two exclude</w:t>
-      </w:r>
-      <w:r>
-        <w:t xml:space="preserve"> </w:t>
-      </w:r>
-      <w:r>
-        <w:t xml:space="preserve">zero in Kernel’s favour and one includes zero. These are conditional intervals,</w:t>
+        <w:t xml:space="preserve">+0.205, -0.050 and -0.014 across the four matched years. The positive 2022</w:t>
+      </w:r>
+      <w:r>
+        <w:t xml:space="preserve"> </w:t>
+      </w:r>
+      <w:r>
+        <w:t xml:space="preserve">difference is the target that follows the documented ArcGIS series break. With</w:t>
+      </w:r>
+      <w:r>
+        <w:t xml:space="preserve"> </w:t>
+      </w:r>
+      <w:r>
+        <w:t xml:space="preserve">that target excluded, ArcGIS-minus-Dynamic World differences remain negative</w:t>
+      </w:r>
+      <w:r>
+        <w:t xml:space="preserve"> </w:t>
+      </w:r>
+      <w:r>
+        <w:t xml:space="preserve">in every retained fold for Kernel (-0.244 to -0.014) and GeoFM-LDN (-0.215 to</w:t>
+      </w:r>
+      <w:r>
+        <w:t xml:space="preserve"> </w:t>
+      </w:r>
+      <w:r>
+        <w:t xml:space="preserve">-0.010); FLUS-style ANN–CA remains mixed (-0.100 to +0.023). This is a</w:t>
+      </w:r>
+      <w:r>
+        <w:t xml:space="preserve"> </w:t>
+      </w:r>
+      <w:r>
+        <w:t xml:space="preserve">directional sensitivity of agreement with product-specific labels, not a claim</w:t>
+      </w:r>
+      <w:r>
+        <w:t xml:space="preserve"> </w:t>
+      </w:r>
+      <w:r>
+        <w:t xml:space="preserve">that either product is more accurate. Thus the learned allocator contains</w:t>
+      </w:r>
+      <w:r>
+        <w:t xml:space="preserve"> </w:t>
+      </w:r>
+      <w:r>
+        <w:t xml:space="preserve">repeatable spatial signal relative to its zero model, while its absolute score</w:t>
+      </w:r>
+      <w:r>
+        <w:t xml:space="preserve"> </w:t>
+      </w:r>
+      <w:r>
+        <w:t xml:space="preserve">and rank remain dependent on the product pipeline. Supplementary Table S6 gives</w:t>
+      </w:r>
+      <w:r>
+        <w:t xml:space="preserve"> </w:t>
+      </w:r>
+      <w:r>
+        <w:t xml:space="preserve">both interval definitions, and Supplementary Table S7 reports all seed-specific</w:t>
+      </w:r>
+      <w:r>
+        <w:t xml:space="preserve"> </w:t>
+      </w:r>
+      <w:r>
+        <w:t xml:space="preserve">paired intervals for Kernel versus FLUS-style and GeoFM-LDN versus Kernel. In</w:t>
+      </w:r>
+      <w:r>
+        <w:t xml:space="preserve"> </w:t>
+      </w:r>
+      <w:r>
+        <w:t xml:space="preserve">the ArcGIS 2023 target, all three GeoFM-LDN-minus-Kernel intervals include zero</w:t>
+      </w:r>
+      <w:r>
+        <w:t xml:space="preserve"> </w:t>
+      </w:r>
+      <w:r>
+        <w:t xml:space="preserve">despite Kernel’s higher mean; in 2024, two exclude zero in Kernel’s favour and</w:t>
+      </w:r>
+      <w:r>
+        <w:t xml:space="preserve"> </w:t>
+      </w:r>
+      <w:r>
+        <w:t xml:space="preserve">one includes zero. These are conditional intervals,</w:t>
       </w:r>
       <w:r>
         <w:t xml:space="preserve"> </w:t>
@@ -4369,7 +4417,19 @@
         <w:t xml:space="preserve"> </w:t>
       </w:r>
       <w:r>
-        <w:t xml:space="preserve">reported in Supplementary Table S7. The reversal in these bounds means that</w:t>
+        <w:t xml:space="preserve">reported in Supplementary Table S7. Across all ArcGIS folds the bound spans</w:t>
+      </w:r>
+      <w:r>
+        <w:t xml:space="preserve"> </w:t>
+      </w:r>
+      <w:r>
+        <w:t xml:space="preserve">0.0858–0.8127, but excluding the 2022 series-break target it spans only</w:t>
+      </w:r>
+      <w:r>
+        <w:t xml:space="preserve"> </w:t>
+      </w:r>
+      <w:r>
+        <w:t xml:space="preserve">0.0858–0.6651. The reversal in these bounds means that</w:t>
       </w:r>
       <w:r>
         <w:t xml:space="preserve"> </w:t>
@@ -4510,7 +4570,7 @@
           <wp:inline>
             <wp:extent cx="5334000" cy="4480708"/>
             <wp:effectExtent b="0" l="0" r="0" t="0"/>
-            <wp:docPr descr="Land-cover product robustness. Panel a compares annual mapped built area; the dashed line marks the apparent 2021–2022 ArcGIS class-composition break, not a verified city-change event. Only the ArcGIS-served Impact Observatory/Microsoft/Esri series extends to 2025. Panel b reports same-year all-class agreement and built-class intersection over union after six-class harmonization at 100 m. Panel c reports strict destination-change FoM for the ArcGIS-served expanding-window backtest; points are three-seed means and whiskers are population standard deviations. Panel d gives the ArcGIS-served-minus-Dynamic World mean FoM for the four matched one-step targets. All models omit the later road snapshot. Product-specific labels, origin states, oracle totals, origin water/wetland masks and quality semantics are retained, so this is a whole-product-pipeline test rather than authoritative validation. Source data are provided in source_data_fig04_product_robustness.csv." title="" id="35" name="Picture"/>
+            <wp:docPr descr="Land-cover product robustness. Panel A compares annual mapped built area; the dashed line marks the apparent 2021–2022 ArcGIS class-composition break, not a verified city-change event. Only the ArcGIS-served Impact Observatory/Microsoft/Esri series extends to 2025. Panel B reports same-year all-class agreement and built-class intersection over union after six-class harmonization at 100 m. Panel C reports strict destination-change FoM for the ArcGIS-served expanding-window backtest; points are three-seed means and whiskers are population standard deviations. Panel D gives the ArcGIS-served-minus-Dynamic World mean FoM for the four matched one-step targets. All models omit the later road snapshot. Product-specific labels, origin states, oracle totals, origin water/wetland masks and quality semantics are retained, so this is a whole-product-pipeline test rather than authoritative validation. Source data are provided in source_data_fig04_product_robustness.csv." title="" id="35" name="Picture"/>
             <a:graphic>
               <a:graphicData uri="http://schemas.openxmlformats.org/drawingml/2006/picture">
                 <pic:pic>
@@ -4554,7 +4614,7 @@
         <w:keepLines/>
       </w:pPr>
       <w:r>
-        <w:t>Figure 4. Land-cover product robustness. Panel a compares annual mapped built area; the dashed line marks the apparent 2021–2022 ArcGIS class-composition break, not a verified city-change event. Only the ArcGIS-served Impact Observatory/Microsoft/Esri series extends to 2025. Panel b reports same-year all-class agreement and built-class intersection over union after six-class harmonization at 100 m. Panel c reports strict destination-change FoM for the ArcGIS-served expanding-window backtest; points are three-seed means and whiskers are population standard deviations. Panel d gives the ArcGIS-served-minus-Dynamic World mean FoM for the four matched one-step targets. All models omit the later road snapshot. Product-specific labels, origin states, oracle totals, origin water/wetland masks and quality semantics are retained, so this is a whole-product-pipeline test rather than authoritative validation. Source data are provided in source_data_fig04_product_robustness.csv.</w:t>
+        <w:t>Figure 4. Land-cover product robustness. Panel A compares annual mapped built area; the dashed line marks the apparent 2021–2022 ArcGIS class-composition break, not a verified city-change event. Only the ArcGIS-served Impact Observatory/Microsoft/Esri series extends to 2025. Panel B reports same-year all-class agreement and built-class intersection over union after six-class harmonization at 100 m. Panel C reports strict destination-change FoM for the ArcGIS-served expanding-window backtest; points are three-seed means and whiskers are population standard deviations. Panel D gives the ArcGIS-served-minus-Dynamic World mean FoM for the four matched one-step targets. All models omit the later road snapshot. Product-specific labels, origin states, oracle totals, origin water/wetland masks and quality semantics are retained, so this is a whole-product-pipeline test rather than authoritative validation. Source data are provided in source_data_fig04_product_robustness.csv.</w:t>
       </w:r>
     </w:p>
     <w:p>
@@ -6569,73 +6629,91 @@
         <w:pStyle w:val="FirstParagraph"/>
       </w:pPr>
       <w:r>
-        <w:t xml:space="preserve">Replacing Dynamic World with a newer ArcGIS-served 10-m annual product did not</w:t>
-      </w:r>
-      <w:r>
-        <w:t xml:space="preserve"> </w:t>
-      </w:r>
-      <w:r>
-        <w:t xml:space="preserve">simply raise or lower every score. It changed mapped built stock, transition</w:t>
-      </w:r>
-      <w:r>
-        <w:t xml:space="preserve"> </w:t>
-      </w:r>
-      <w:r>
-        <w:t xml:space="preserve">prevalence and the leading model by year, while its 2021–2023 class-composition</w:t>
-      </w:r>
-      <w:r>
-        <w:t xml:space="preserve"> </w:t>
-      </w:r>
-      <w:r>
-        <w:t xml:space="preserve">break made part of the apparent change unsuitable as evidence of city change.</w:t>
-      </w:r>
-      <w:r>
-        <w:t xml:space="preserve"> </w:t>
-      </w:r>
-      <w:r>
-        <w:t xml:space="preserve">Geospatial Kernel remained consistently better than random minimum-change</w:t>
-      </w:r>
-      <w:r>
-        <w:t xml:space="preserve"> </w:t>
-      </w:r>
-      <w:r>
-        <w:t xml:space="preserve">allocation, but it was not universally the best learned model. Its strongest</w:t>
-      </w:r>
-      <w:r>
-        <w:t xml:space="preserve"> </w:t>
-      </w:r>
-      <w:r>
-        <w:t xml:space="preserve">transferable property in this experiment is therefore the auditable separation</w:t>
-      </w:r>
-      <w:r>
-        <w:t xml:space="preserve"> </w:t>
-      </w:r>
-      <w:r>
-        <w:t xml:space="preserve">of learned proposal, constrained projection and state writeback, not a</w:t>
-      </w:r>
-      <w:r>
-        <w:t xml:space="preserve"> </w:t>
-      </w:r>
-      <w:r>
-        <w:t xml:space="preserve">product-independent accuracy claim. The count-only bounds constrain only the</w:t>
-      </w:r>
-      <w:r>
-        <w:t xml:space="preserve"> </w:t>
-      </w:r>
-      <w:r>
-        <w:t xml:space="preserve">exact minimum-change projections; the FLUS baseline already shows that allowing</w:t>
-      </w:r>
-      <w:r>
-        <w:t xml:space="preserve"> </w:t>
-      </w:r>
-      <w:r>
-        <w:t xml:space="preserve">more gross change alone does not determine FoM. A controlled gross-transition</w:t>
-      </w:r>
-      <w:r>
-        <w:t xml:space="preserve"> </w:t>
-      </w:r>
-      <w:r>
-        <w:t xml:space="preserve">comparison must separate that budget from proposal-model skill.</w:t>
+        <w:t xml:space="preserve">Replacing Dynamic World with a newer ArcGIS-served 10-m annual product changed</w:t>
+      </w:r>
+      <w:r>
+        <w:t xml:space="preserve"> </w:t>
+      </w:r>
+      <w:r>
+        <w:t xml:space="preserve">mapped built stock, transition prevalence and the leading model by year. The</w:t>
+      </w:r>
+      <w:r>
+        <w:t xml:space="preserve"> </w:t>
+      </w:r>
+      <w:r>
+        <w:t xml:space="preserve">only positive matched-product differences for the two exact-count learned</w:t>
+      </w:r>
+      <w:r>
+        <w:t xml:space="preserve"> </w:t>
+      </w:r>
+      <w:r>
+        <w:t xml:space="preserve">models occur in the 2022 target following the ArcGIS class-composition break;</w:t>
+      </w:r>
+      <w:r>
+        <w:t xml:space="preserve"> </w:t>
+      </w:r>
+      <w:r>
+        <w:t xml:space="preserve">outside that target, both Kernel and GeoFM-LDN have lower product-specific FoM</w:t>
+      </w:r>
+      <w:r>
+        <w:t xml:space="preserve"> </w:t>
+      </w:r>
+      <w:r>
+        <w:t xml:space="preserve">on every remaining paired fold. This is evidence of label-product dependence,</w:t>
+      </w:r>
+      <w:r>
+        <w:t xml:space="preserve"> </w:t>
+      </w:r>
+      <w:r>
+        <w:t xml:space="preserve">not evidence that either product is more accurate. Geospatial Kernel remained</w:t>
+      </w:r>
+      <w:r>
+        <w:t xml:space="preserve"> </w:t>
+      </w:r>
+      <w:r>
+        <w:t xml:space="preserve">consistently better than random minimum-change allocation, but it was not</w:t>
+      </w:r>
+      <w:r>
+        <w:t xml:space="preserve"> </w:t>
+      </w:r>
+      <w:r>
+        <w:t xml:space="preserve">universally the best learned model. Its strongest transferable property in this</w:t>
+      </w:r>
+      <w:r>
+        <w:t xml:space="preserve"> </w:t>
+      </w:r>
+      <w:r>
+        <w:t xml:space="preserve">experiment is therefore the auditable separation of learned proposal,</w:t>
+      </w:r>
+      <w:r>
+        <w:t xml:space="preserve"> </w:t>
+      </w:r>
+      <w:r>
+        <w:t xml:space="preserve">constrained projection and state writeback, not a product-independent accuracy</w:t>
+      </w:r>
+      <w:r>
+        <w:t xml:space="preserve"> </w:t>
+      </w:r>
+      <w:r>
+        <w:t xml:space="preserve">claim. The count-only bounds constrain only the exact minimum-change</w:t>
+      </w:r>
+      <w:r>
+        <w:t xml:space="preserve"> </w:t>
+      </w:r>
+      <w:r>
+        <w:t xml:space="preserve">projections; the FLUS baseline already shows that allowing more gross change</w:t>
+      </w:r>
+      <w:r>
+        <w:t xml:space="preserve"> </w:t>
+      </w:r>
+      <w:r>
+        <w:t xml:space="preserve">alone does not determine FoM. A controlled gross-transition comparison must</w:t>
+      </w:r>
+      <w:r>
+        <w:t xml:space="preserve"> </w:t>
+      </w:r>
+      <w:r>
+        <w:t xml:space="preserve">separate that budget from proposal-model skill.</w:t>
       </w:r>
     </w:p>
     <w:p>
@@ -7263,7 +7341,1004 @@
         <w:pStyle w:val="FirstParagraph"/>
       </w:pPr>
       <w:r>
-        <w:t xml:space="preserve">The analysis scripts, a vendored Geospatial Kernel runtime snapshot, benchmark protocol, model runners and figure-generation code are maintained in the accompanying repository. Principal entry points are listed separately to keep the manuscript readable:</w:t>
+        <w:t xml:space="preserve">The analysis scripts, vendored Geospatial Kernel runtime snapshot, benchmark protocol, model runners, figure-generation code and source-data tables are maintained in the accompanying repository. The benchmark READMEs provide the complete entry-point list;</w:t>
+      </w:r>
+      <w:r>
+        <w:t xml:space="preserve"> </w:t>
+      </w:r>
+      <w:r>
+        <w:rPr>
+          <w:rStyle w:val="VerbatimChar"/>
+        </w:rPr>
+        <w:t xml:space="preserve">reproducibility/reproduce.py</w:t>
+      </w:r>
+      <w:r>
+        <w:t xml:space="preserve">,</w:t>
+      </w:r>
+      <w:r>
+        <w:t xml:space="preserve"> </w:t>
+      </w:r>
+      <w:r>
+        <w:rPr>
+          <w:rStyle w:val="VerbatimChar"/>
+        </w:rPr>
+        <w:t xml:space="preserve">reproducibility/reproducibility_check.py</w:t>
+      </w:r>
+      <w:r>
+        <w:t xml:space="preserve"> </w:t>
+      </w:r>
+      <w:r>
+        <w:t xml:space="preserve">and</w:t>
+      </w:r>
+      <w:r>
+        <w:t xml:space="preserve"> </w:t>
+      </w:r>
+      <w:r>
+        <w:rPr>
+          <w:rStyle w:val="VerbatimChar"/>
+        </w:rPr>
+        <w:t xml:space="preserve">audit_outputs.py</w:t>
+      </w:r>
+      <w:r>
+        <w:t xml:space="preserve"> </w:t>
+      </w:r>
+      <w:r>
+        <w:t xml:space="preserve">are the end-to-end and fail-closed verification entry points. The cross-product workflow is documented beside</w:t>
+      </w:r>
+      <w:r>
+        <w:t xml:space="preserve"> </w:t>
+      </w:r>
+      <w:r>
+        <w:rPr>
+          <w:rStyle w:val="VerbatimChar"/>
+        </w:rPr>
+        <w:t xml:space="preserve">analyze_product_robustness.py</w:t>
+      </w:r>
+      <w:r>
+        <w:t xml:space="preserve">, with its frozen 2031 seed states and source data. This concise statement avoids duplicating the machine-readable inventory in the data manifests and supplementary files.</w:t>
+      </w:r>
+    </w:p>
+    <w:p>
+      <w:pPr>
+        <w:pStyle w:val="BodyText"/>
+      </w:pPr>
+      <w:r>
+        <w:t xml:space="preserve">GeoFM-LDN source and the three fixed checkpoints are included in the benchmark</w:t>
+      </w:r>
+      <w:r>
+        <w:t xml:space="preserve"> </w:t>
+      </w:r>
+      <w:r>
+        <w:t xml:space="preserve">external and prediction-artifact directories.</w:t>
+      </w:r>
+      <w:r>
+        <w:t xml:space="preserve"> </w:t>
+      </w:r>
+      <w:r>
+        <w:t xml:space="preserve">Earlier internal reference outputs, produced before the dependency lock was</w:t>
+      </w:r>
+      <w:r>
+        <w:t xml:space="preserve"> </w:t>
+      </w:r>
+      <w:r>
+        <w:t xml:space="preserve">completed, could not be regenerated under the resolved environment and were</w:t>
+      </w:r>
+      <w:r>
+        <w:t xml:space="preserve"> </w:t>
+      </w:r>
+      <w:r>
+        <w:t xml:space="preserve">superseded by the locked-environment rerun reported here. Historical strict-FoM</w:t>
+      </w:r>
+      <w:r>
+        <w:t xml:space="preserve"> </w:t>
+      </w:r>
+      <w:r>
+        <w:t xml:space="preserve">differences were at approximately the 0.001 level; discrete multi-year planning</w:t>
+      </w:r>
+      <w:r>
+        <w:t xml:space="preserve"> </w:t>
+      </w:r>
+      <w:r>
+        <w:t xml:space="preserve">ensemble demand errors changed more substantially and are reported here only</w:t>
+      </w:r>
+      <w:r>
+        <w:t xml:space="preserve"> </w:t>
+      </w:r>
+      <w:r>
+        <w:t xml:space="preserve">from the locked-environment rerun. The prior outputs remain Git-history lineage,</w:t>
+      </w:r>
+      <w:r>
+        <w:t xml:space="preserve"> </w:t>
+      </w:r>
+      <w:r>
+        <w:t xml:space="preserve">not current evidence.</w:t>
+      </w:r>
+      <w:r>
+        <w:t xml:space="preserve"> </w:t>
+      </w:r>
+      <w:r>
+        <w:t xml:space="preserve">The vendored FLUS executable is a macOS arm64 binary rebuilt from the GeoSOS</w:t>
+      </w:r>
+      <w:r>
+        <w:t xml:space="preserve"> </w:t>
+      </w:r>
+      <w:r>
+        <w:t xml:space="preserve">public FLUS source base. The author-modified source, including</w:t>
+      </w:r>
+      <w:r>
+        <w:t xml:space="preserve"> </w:t>
+      </w:r>
+      <w:r>
+        <w:rPr>
+          <w:rStyle w:val="VerbatimChar"/>
+        </w:rPr>
+        <w:t xml:space="preserve">train-update</w:t>
+      </w:r>
+      <w:r>
+        <w:t xml:space="preserve"> </w:t>
+      </w:r>
+      <w:r>
+        <w:t xml:space="preserve">and</w:t>
+      </w:r>
+      <w:r>
+        <w:t xml:space="preserve"> </w:t>
+      </w:r>
+      <w:r>
+        <w:rPr>
+          <w:rStyle w:val="VerbatimChar"/>
+        </w:rPr>
+        <w:t xml:space="preserve">FLUS_RANDOM_SEED</w:t>
+      </w:r>
+      <w:r>
+        <w:t xml:space="preserve">, is archived at</w:t>
+      </w:r>
+      <w:r>
+        <w:t xml:space="preserve"> </w:t>
+      </w:r>
+      <w:r>
+        <w:t xml:space="preserve">the public FLUS source repository, tag</w:t>
+      </w:r>
+      <w:r>
+        <w:t xml:space="preserve"> </w:t>
+      </w:r>
+      <w:r>
+        <w:rPr>
+          <w:rStyle w:val="VerbatimChar"/>
+        </w:rPr>
+        <w:t xml:space="preserve">paper-benchmark-flus-v1.1</w:t>
+      </w:r>
+      <w:r>
+        <w:t xml:space="preserve"> </w:t>
+      </w:r>
+      <w:r>
+        <w:t xml:space="preserve">at commit</w:t>
+      </w:r>
+      <w:r>
+        <w:t xml:space="preserve"> </w:t>
+      </w:r>
+      <w:r>
+        <w:rPr>
+          <w:rStyle w:val="VerbatimChar"/>
+        </w:rPr>
+        <w:t xml:space="preserve">47e65b3</w:t>
+      </w:r>
+      <w:r>
+        <w:t xml:space="preserve"> </w:t>
+      </w:r>
+      <w:r>
+        <w:t xml:space="preserve">(the GeoSOS source release and Liu et al. (2017) are cited above). Rebuilding</w:t>
+      </w:r>
+      <w:r>
+        <w:t xml:space="preserve"> </w:t>
+      </w:r>
+      <w:r>
+        <w:t xml:space="preserve">the preceding v1 commit (</w:t>
+      </w:r>
+      <w:r>
+        <w:rPr>
+          <w:rStyle w:val="VerbatimChar"/>
+        </w:rPr>
+        <w:t xml:space="preserve">deb0a54</w:t>
+      </w:r>
+      <w:r>
+        <w:t xml:space="preserve">) on macOS arm64 produced SHA-256</w:t>
+      </w:r>
+      <w:r>
+        <w:t xml:space="preserve"> </w:t>
+      </w:r>
+      <w:r>
+        <w:rPr>
+          <w:rStyle w:val="VerbatimChar"/>
+        </w:rPr>
+        <w:t xml:space="preserve">9839ce50950442d4ef49e4d2129a1ba27735e1955c2d4975ae51067c1c3c9964</w:t>
+      </w:r>
+      <w:r>
+        <w:t xml:space="preserve">,</w:t>
+      </w:r>
+      <w:r>
+        <w:t xml:space="preserve"> </w:t>
+      </w:r>
+      <w:r>
+        <w:t xml:space="preserve">identical to the vendored executable. Version v1.1 changes only invalid-input</w:t>
+      </w:r>
+      <w:r>
+        <w:t xml:space="preserve"> </w:t>
+      </w:r>
+      <w:r>
+        <w:t xml:space="preserve">failure handling and leaves valid-input algorithmic paths unchanged; the</w:t>
+      </w:r>
+      <w:r>
+        <w:t xml:space="preserve"> </w:t>
+      </w:r>
+      <w:r>
+        <w:t xml:space="preserve">normal-output equivalence check is archived with the source release.</w:t>
+      </w:r>
+      <w:r>
+        <w:t xml:space="preserve"> </w:t>
+      </w:r>
+      <w:r>
+        <w:t xml:space="preserve">The tagged author-modified source can also be built on Linux and Windows using</w:t>
+      </w:r>
+      <w:r>
+        <w:t xml:space="preserve"> </w:t>
+      </w:r>
+      <w:r>
+        <w:t xml:space="preserve">the repository instructions.</w:t>
+      </w:r>
+      <w:r>
+        <w:t xml:space="preserve"> </w:t>
+      </w:r>
+      <w:r>
+        <w:rPr>
+          <w:rStyle w:val="VerbatimChar"/>
+        </w:rPr>
+        <w:t xml:space="preserve">FLUS_RANDOM_SEED</w:t>
+      </w:r>
+      <w:r>
+        <w:t xml:space="preserve"> </w:t>
+      </w:r>
+      <w:r>
+        <w:t xml:space="preserve">guarantees determinism only</w:t>
+      </w:r>
+      <w:r>
+        <w:t xml:space="preserve"> </w:t>
+      </w:r>
+      <w:r>
+        <w:t xml:space="preserve">within a platform and build environment because ANN sampling and CA roulette</w:t>
+      </w:r>
+      <w:r>
+        <w:t xml:space="preserve"> </w:t>
+      </w:r>
+      <w:r>
+        <w:t xml:space="preserve">draws use platform-defined C</w:t>
+      </w:r>
+      <w:r>
+        <w:t xml:space="preserve"> </w:t>
+      </w:r>
+      <w:r>
+        <w:rPr>
+          <w:rStyle w:val="VerbatimChar"/>
+        </w:rPr>
+        <w:t xml:space="preserve">rand()</w:t>
+      </w:r>
+      <w:r>
+        <w:t xml:space="preserve">/</w:t>
+      </w:r>
+      <w:r>
+        <w:rPr>
+          <w:rStyle w:val="VerbatimChar"/>
+        </w:rPr>
+        <w:t xml:space="preserve">srand()</w:t>
+      </w:r>
+      <w:r>
+        <w:t xml:space="preserve"> </w:t>
+      </w:r>
+      <w:r>
+        <w:t xml:space="preserve">streams. Independent external</w:t>
+      </w:r>
+      <w:r>
+        <w:t xml:space="preserve"> </w:t>
+      </w:r>
+      <w:r>
+        <w:t xml:space="preserve">Windows FLUS verification, including the seven-driver cross-platform difference</w:t>
+      </w:r>
+      <w:r>
+        <w:t xml:space="preserve"> </w:t>
+      </w:r>
+      <w:r>
+        <w:t xml:space="preserve">and the 25-feature zero-change outcome, is documented with its provenance</w:t>
+      </w:r>
+      <w:r>
+        <w:t xml:space="preserve"> </w:t>
+      </w:r>
+      <w:r>
+        <w:t xml:space="preserve">limitation in Supplementary Table S3. Windows execution requires the benchmark</w:t>
+      </w:r>
+      <w:r>
+        <w:t xml:space="preserve"> </w:t>
+      </w:r>
+      <w:r>
+        <w:t xml:space="preserve">and working directories to use pure ASCII paths; saving configuration files as</w:t>
+      </w:r>
+      <w:r>
+        <w:t xml:space="preserve"> </w:t>
+      </w:r>
+      <w:r>
+        <w:t xml:space="preserve">UTF-8 alone does not repair GDAL path decoding. A compatible local build is required to</w:t>
+      </w:r>
+      <w:r>
+        <w:t xml:space="preserve"> </w:t>
+      </w:r>
+      <w:r>
+        <w:t xml:space="preserve">execute the FLUS track outside macOS arm64 and will produce a different random</w:t>
+      </w:r>
+      <w:r>
+        <w:t xml:space="preserve"> </w:t>
+      </w:r>
+      <w:r>
+        <w:t xml:space="preserve">stream. The macOS binary SHA statement is an author self-check. As an</w:t>
+      </w:r>
+      <w:r>
+        <w:t xml:space="preserve"> </w:t>
+      </w:r>
+      <w:r>
+        <w:t xml:space="preserve">upstream-only fallback, the public FLUS CA source can be paired with an open</w:t>
+      </w:r>
+      <w:r>
+        <w:t xml:space="preserve"> </w:t>
+      </w:r>
+      <w:r>
+        <w:t xml:space="preserve">Python ANN implementation, but the unmodified upstream CA uses time seeding</w:t>
+      </w:r>
+      <w:r>
+        <w:t xml:space="preserve"> </w:t>
+      </w:r>
+      <w:r>
+        <w:t xml:space="preserve">rather than</w:t>
+      </w:r>
+      <w:r>
+        <w:t xml:space="preserve"> </w:t>
+      </w:r>
+      <w:r>
+        <w:rPr>
+          <w:rStyle w:val="VerbatimChar"/>
+        </w:rPr>
+        <w:t xml:space="preserve">FLUS_RANDOM_SEED</w:t>
+      </w:r>
+      <w:r>
+        <w:t xml:space="preserve">. The corresponding-author e-mail is</w:t>
+      </w:r>
+      <w:r>
+        <w:t xml:space="preserve"> </w:t>
+      </w:r>
+      <w:r>
+        <w:rPr>
+          <w:rStyle w:val="VerbatimChar"/>
+        </w:rPr>
+        <w:t xml:space="preserve">zhouning@freedotech.com</w:t>
+      </w:r>
+      <w:r>
+        <w:t xml:space="preserve">. The versioned v2 source release is archived at</w:t>
+      </w:r>
+      <w:r>
+        <w:t xml:space="preserve"> </w:t>
+      </w:r>
+      <w:r>
+        <w:t xml:space="preserve">https://doi.org/10.5281/zenodo.22689057 and corresponds to GitHub tag</w:t>
+      </w:r>
+      <w:r>
+        <w:t xml:space="preserve"> </w:t>
+      </w:r>
+      <w:r>
+        <w:rPr>
+          <w:rStyle w:val="VerbatimChar"/>
+        </w:rPr>
+        <w:t xml:space="preserve">v2.0.0</w:t>
+      </w:r>
+      <w:r>
+        <w:t xml:space="preserve"> </w:t>
+      </w:r>
+      <w:r>
+        <w:t xml:space="preserve">at commit</w:t>
+      </w:r>
+      <w:r>
+        <w:t xml:space="preserve"> </w:t>
+      </w:r>
+      <w:r>
+        <w:rPr>
+          <w:rStyle w:val="VerbatimChar"/>
+        </w:rPr>
+        <w:t xml:space="preserve">77e2c59</w:t>
+      </w:r>
+      <w:r>
+        <w:t xml:space="preserve">; the DOI identifies the public benchmark source release,</w:t>
+      </w:r>
+      <w:r>
+        <w:t xml:space="preserve"> </w:t>
+      </w:r>
+      <w:r>
+        <w:t xml:space="preserve">not the eventual journal article DOI. Hydrated Git LFS objects must be fetched</w:t>
+      </w:r>
+      <w:r>
+        <w:t xml:space="preserve"> </w:t>
+      </w:r>
+      <w:r>
+        <w:t xml:space="preserve">from the tagged repository for a full numerical rerun.</w:t>
+      </w:r>
+    </w:p>
+    <w:bookmarkEnd w:id="55"/>
+    <w:bookmarkStart w:id="56" w:name="declarations"/>
+    <w:p>
+      <w:pPr>
+        <w:pStyle w:val="Heading2"/>
+      </w:pPr>
+      <w:r>
+        <w:t xml:space="preserve">Declarations</w:t>
+      </w:r>
+    </w:p>
+    <w:p>
+      <w:pPr>
+        <w:pStyle w:val="FirstParagraph"/>
+      </w:pPr>
+      <w:r>
+        <w:rPr>
+          <w:b/>
+          <w:bCs/>
+        </w:rPr>
+        <w:t xml:space="preserve">Funding.</w:t>
+      </w:r>
+      <w:r>
+        <w:t xml:space="preserve"> </w:t>
+      </w:r>
+      <w:r>
+        <w:t xml:space="preserve">No external funding was received for this study.</w:t>
+      </w:r>
+    </w:p>
+    <w:p>
+      <w:pPr>
+        <w:pStyle w:val="BodyText"/>
+      </w:pPr>
+      <w:r>
+        <w:rPr>
+          <w:b/>
+          <w:bCs/>
+        </w:rPr>
+        <w:t xml:space="preserve">Competing interests.</w:t>
+      </w:r>
+      <w:r>
+        <w:t xml:space="preserve"> </w:t>
+      </w:r>
+      <w:r>
+        <w:t xml:space="preserve">Ning Zhou is employed by Beijing Freedo Technology Co., Ltd., which develops geospatial-world-model software. The author declares no other competing financial or personal interests.</w:t>
+      </w:r>
+    </w:p>
+    <w:p>
+      <w:pPr>
+        <w:pStyle w:val="BodyText"/>
+      </w:pPr>
+      <w:r>
+        <w:rPr>
+          <w:b/>
+          <w:bCs/>
+        </w:rPr>
+        <w:t xml:space="preserve">CRediT author statement.</w:t>
+      </w:r>
+      <w:r>
+        <w:t xml:space="preserve"> </w:t>
+      </w:r>
+      <w:r>
+        <w:t xml:space="preserve">Ning Zhou: Conceptualization, methodology, software, data curation, formal analysis, visualization, writing—original draft, writing—review and editing.</w:t>
+      </w:r>
+    </w:p>
+    <w:p>
+      <w:pPr>
+        <w:pStyle w:val="BodyText"/>
+      </w:pPr>
+      <w:r>
+        <w:rPr>
+          <w:b/>
+          <w:bCs/>
+        </w:rPr>
+        <w:t xml:space="preserve">Acknowledgements.</w:t>
+      </w:r>
+      <w:r>
+        <w:t xml:space="preserve"> </w:t>
+      </w:r>
+      <w:r>
+        <w:t xml:space="preserve">The author thanks the anonymous reviewers for independent technical verification and constructive methodological comments.</w:t>
+      </w:r>
+    </w:p>
+    <w:p>
+      <w:pPr>
+        <w:pStyle w:val="BodyText"/>
+      </w:pPr>
+      <w:r>
+        <w:rPr>
+          <w:b/>
+          <w:bCs/>
+        </w:rPr>
+        <w:t xml:space="preserve">Ethics statement.</w:t>
+      </w:r>
+      <w:r>
+        <w:t xml:space="preserve"> </w:t>
+      </w:r>
+      <w:r>
+        <w:t xml:space="preserve">Not applicable; the study used geospatial raster, vector and derived public-data products and did not involve human or animal participants.</w:t>
+      </w:r>
+    </w:p>
+    <w:p>
+      <w:pPr>
+        <w:pStyle w:val="BodyText"/>
+      </w:pPr>
+      <w:r>
+        <w:rPr>
+          <w:b/>
+          <w:bCs/>
+        </w:rPr>
+        <w:t xml:space="preserve">Declaration of generative AI and AI-assisted technologies in the writing process.</w:t>
+      </w:r>
+      <w:r>
+        <w:t xml:space="preserve"> </w:t>
+      </w:r>
+      <w:r>
+        <w:t xml:space="preserve">During preparation of this work, the author used OpenAI Codex for language editing, code review and document-formatting assistance. The author reviewed and revised all outputs and takes full responsibility for the content of the publication.</w:t>
+      </w:r>
+    </w:p>
+    <w:bookmarkEnd w:id="56"/>
+    <w:bookmarkStart w:id="57" w:name="references"/>
+    <w:p>
+      <w:pPr>
+        <w:pStyle w:val="Heading2"/>
+      </w:pPr>
+      <w:r>
+        <w:t xml:space="preserve">References</w:t>
+      </w:r>
+    </w:p>
+    <w:p>
+      <w:pPr>
+        <w:pStyle w:val="FirstParagraph"/>
+      </w:pPr>
+      <w:r>
+        <w:t xml:space="preserve">Abu Dhabi Urban Planning Council. (2007). Plan Abu Dhabi 2030: urban structure framework plan. Abu Dhabi, United Arab Emirates.</w:t>
+      </w:r>
+    </w:p>
+    <w:p>
+      <w:pPr>
+        <w:pStyle w:val="BodyText"/>
+      </w:pPr>
+      <w:r>
+        <w:t xml:space="preserve">Brown, C. F., Brumby, S. P., Guzder-Williams, B., Birch, T., Hyde, S. B., Mazzariello, J., Czerwinski, W., Pasquarella, V. J., Haertel, R., Ilyushchenko, S., Schwehr, K., Weisse, M., Stolle, F., Hanson, C., Guinan, O., Moore, R., &amp; Tait, A. M. (2022). Dynamic World, near real-time global 10 m land use land cover mapping.</w:t>
+      </w:r>
+      <w:r>
+        <w:t xml:space="preserve"> </w:t>
+      </w:r>
+      <w:r>
+        <w:rPr>
+          <w:i/>
+          <w:iCs/>
+        </w:rPr>
+        <w:t xml:space="preserve">Scientific Data</w:t>
+      </w:r>
+      <w:r>
+        <w:t xml:space="preserve">, 9, 251. https://doi.org/10.1038/s41597-022-01307-4</w:t>
+      </w:r>
+    </w:p>
+    <w:p>
+      <w:pPr>
+        <w:pStyle w:val="BodyText"/>
+      </w:pPr>
+      <w:r>
+        <w:t xml:space="preserve">Brown, C. F., Kazmierski, M. R., Pasquarella, V. J., Rucklidge, W. J., Samsikova, M., Zhang, C., Shelhamer, E., Lahera, E., Wiles, O., Ilyushchenko, S., Gorelick, N., Zhang, L. L., Alj, S., Schechter, E., Askay, S., Guinan, O., Moore, R., Boukouvalas, A., &amp; Kohli, P. (2025). AlphaEarth Foundations: An embedding field model for accurate and efficient global mapping from sparse label data.</w:t>
+      </w:r>
+      <w:r>
+        <w:t xml:space="preserve"> </w:t>
+      </w:r>
+      <w:r>
+        <w:rPr>
+          <w:i/>
+          <w:iCs/>
+        </w:rPr>
+        <w:t xml:space="preserve">arXiv</w:t>
+      </w:r>
+      <w:r>
+        <w:t xml:space="preserve">. https://doi.org/10.48550/arXiv.2507.22291</w:t>
+      </w:r>
+    </w:p>
+    <w:p>
+      <w:pPr>
+        <w:pStyle w:val="BodyText"/>
+      </w:pPr>
+      <w:r>
+        <w:t xml:space="preserve">Burton, E. (2000). The compact city: just or just compact? A preliminary analysis.</w:t>
+      </w:r>
+      <w:r>
+        <w:t xml:space="preserve"> </w:t>
+      </w:r>
+      <w:r>
+        <w:rPr>
+          <w:i/>
+          <w:iCs/>
+        </w:rPr>
+        <w:t xml:space="preserve">Urban Studies</w:t>
+      </w:r>
+      <w:r>
+        <w:t xml:space="preserve">, 37, 1969–2006. https://doi.org/10.1080/00420980050162184</w:t>
+      </w:r>
+    </w:p>
+    <w:p>
+      <w:pPr>
+        <w:pStyle w:val="BodyText"/>
+      </w:pPr>
+      <w:r>
+        <w:t xml:space="preserve">Copernicus. (2024). Copernicus DEM GLO-30 (2024_1): Global 30m Digital Elevation Model [Data set; digital surface model]. Google Earth Engine Data Catalog. https://developers.google.com/earth-engine/datasets/catalog/COPERNICUS_DEM_GLO30_2024_1 (accessed 10 September 2026).</w:t>
+      </w:r>
+    </w:p>
+    <w:p>
+      <w:pPr>
+        <w:pStyle w:val="BodyText"/>
+      </w:pPr>
+      <w:r>
+        <w:t xml:space="preserve">Earth Observation Group, Payne Institute for Public Policy, Colorado School of Mines. (n.d.). VIIRS Stray Light Corrected Nighttime Day/Night Band Composites Version 1 [Monthly data set; VCMSLCFG]. Google Earth Engine Data Catalog. https://developers.google.com/earth-engine/datasets/catalog/NOAA_VIIRS_DNB_MONTHLY_V1_VCMSLCFG (accessed 10 September 2026).</w:t>
+      </w:r>
+    </w:p>
+    <w:p>
+      <w:pPr>
+        <w:pStyle w:val="BodyText"/>
+      </w:pPr>
+      <w:r>
+        <w:t xml:space="preserve">Elvidge, C. D., Zhizhin, M., Ghosh, T., Hsu, F.-C., &amp; Taneja, J. (2021). Annual time series of global VIIRS nighttime lights derived from monthly averages: 2012 to 2019.</w:t>
+      </w:r>
+      <w:r>
+        <w:t xml:space="preserve"> </w:t>
+      </w:r>
+      <w:r>
+        <w:rPr>
+          <w:i/>
+          <w:iCs/>
+        </w:rPr>
+        <w:t xml:space="preserve">Remote Sensing</w:t>
+      </w:r>
+      <w:r>
+        <w:t xml:space="preserve">, 13, 922. https://doi.org/10.3390/rs13050922</w:t>
+      </w:r>
+    </w:p>
+    <w:p>
+      <w:pPr>
+        <w:pStyle w:val="BodyText"/>
+      </w:pPr>
+      <w:r>
+        <w:t xml:space="preserve">Esri. (2026). Sentinel-2 10 m land cover time series of the world [Data set]. ArcGIS Living Atlas of the World. https://www.arcgis.com/home/item.html?id=cfcb7609de5f478eb7666240902d4d3d (accessed 11 September 2026).</w:t>
+      </w:r>
+    </w:p>
+    <w:p>
+      <w:pPr>
+        <w:pStyle w:val="BodyText"/>
+      </w:pPr>
+      <w:r>
+        <w:t xml:space="preserve">Geofabrik. (2026). GCC States OpenStreetMap extract, 31 July 2026 [Data set; gcc-states-260731.osm.pbf]. https://download.geofabrik.de/asia/gcc-states-260731.osm.pbf</w:t>
+      </w:r>
+    </w:p>
+    <w:p>
+      <w:pPr>
+        <w:pStyle w:val="BodyText"/>
+      </w:pPr>
+      <w:r>
+        <w:t xml:space="preserve">GeoSOS team, Sun Yat-sen University. (n.d.). FLUS source code for non-commercial academic research. http://www.geosimulation.cn/FLUS-source-code.html (accessed 6 September 2026).</w:t>
+      </w:r>
+    </w:p>
+    <w:p>
+      <w:pPr>
+        <w:pStyle w:val="BodyText"/>
+      </w:pPr>
+      <w:r>
+        <w:t xml:space="preserve">Gorelick, N., Hancher, M., Dixon, M., Ilyushchenko, S., Thau, D., &amp; Moore, R. (2017). Google Earth Engine: planetary-scale geospatial analysis for everyone.</w:t>
+      </w:r>
+      <w:r>
+        <w:t xml:space="preserve"> </w:t>
+      </w:r>
+      <w:r>
+        <w:rPr>
+          <w:i/>
+          <w:iCs/>
+        </w:rPr>
+        <w:t xml:space="preserve">Remote Sensing of Environment</w:t>
+      </w:r>
+      <w:r>
+        <w:t xml:space="preserve">, 202, 18–27. https://doi.org/10.1016/j.rse.2017.06.031</w:t>
+      </w:r>
+    </w:p>
+    <w:p>
+      <w:pPr>
+        <w:pStyle w:val="BodyText"/>
+      </w:pPr>
+      <w:r>
+        <w:t xml:space="preserve">Impact Observatory, Microsoft, &amp; Esri. (n.d.). Sentinel-2 10m land cover time series of the world [Data set]. ArcGIS ImageServer. https://ic.imagery1.arcgis.com/arcgis/rest/services/Sentinel2_10m_LandCover/ImageServer (archived materialization manifest dated 9 September 2026; upstream release version not recorded).</w:t>
+      </w:r>
+    </w:p>
+    <w:p>
+      <w:pPr>
+        <w:pStyle w:val="BodyText"/>
+      </w:pPr>
+      <w:r>
+        <w:t xml:space="preserve">Karra, K., Kontgis, C., Statman-Weil, Z., Mazzariello, J. C., Mathis, M., &amp; Brumby, S. P. (2021). Global land use/land cover with Sentinel 2 and deep learning.</w:t>
+      </w:r>
+      <w:r>
+        <w:t xml:space="preserve"> </w:t>
+      </w:r>
+      <w:r>
+        <w:rPr>
+          <w:i/>
+          <w:iCs/>
+        </w:rPr>
+        <w:t xml:space="preserve">2021 IEEE International Geoscience and Remote Sensing Symposium IGARSS</w:t>
+      </w:r>
+      <w:r>
+        <w:t xml:space="preserve">, 4704–4707. https://doi.org/10.1109/IGARSS47720.2021.9553499</w:t>
+      </w:r>
+    </w:p>
+    <w:p>
+      <w:pPr>
+        <w:pStyle w:val="BodyText"/>
+      </w:pPr>
+      <w:r>
+        <w:t xml:space="preserve">Lau, K. H., &amp; Kam, B. H. (2005). A cellular automata model for urban land-use simulation.</w:t>
+      </w:r>
+      <w:r>
+        <w:t xml:space="preserve"> </w:t>
+      </w:r>
+      <w:r>
+        <w:rPr>
+          <w:i/>
+          <w:iCs/>
+        </w:rPr>
+        <w:t xml:space="preserve">Environment and Planning B: Planning and Design</w:t>
+      </w:r>
+      <w:r>
+        <w:t xml:space="preserve">, 32, 247–263. https://doi.org/10.1068/b31110</w:t>
+      </w:r>
+    </w:p>
+    <w:p>
+      <w:pPr>
+        <w:pStyle w:val="BodyText"/>
+      </w:pPr>
+      <w:r>
+        <w:t xml:space="preserve">Liang, X., Guan, Q., Clarke, K. C., Liu, S., Wang, B., &amp; Yao, Y. (2021). Understanding the drivers of sustainable land expansion using a patch-generating land use simulation (PLUS) model: A case study in Wuhan, China.</w:t>
+      </w:r>
+      <w:r>
+        <w:t xml:space="preserve"> </w:t>
+      </w:r>
+      <w:r>
+        <w:rPr>
+          <w:i/>
+          <w:iCs/>
+        </w:rPr>
+        <w:t xml:space="preserve">Computers, Environment and Urban Systems</w:t>
+      </w:r>
+      <w:r>
+        <w:t xml:space="preserve">, 85, 101569. https://doi.org/10.1016/j.compenvurbsys.2020.101569</w:t>
+      </w:r>
+    </w:p>
+    <w:p>
+      <w:pPr>
+        <w:pStyle w:val="BodyText"/>
+      </w:pPr>
+      <w:r>
+        <w:t xml:space="preserve">Liu, X., Liang, X., Li, X., Xu, X., Ou, J., Chen, Y., Li, S., Wang, S., &amp; Pei, F. (2017). A future land use simulation model (FLUS) for simulating multiple land use scenarios by coupling human and natural effects.</w:t>
+      </w:r>
+      <w:r>
+        <w:t xml:space="preserve"> </w:t>
+      </w:r>
+      <w:r>
+        <w:rPr>
+          <w:i/>
+          <w:iCs/>
+        </w:rPr>
+        <w:t xml:space="preserve">Landscape and Urban Planning</w:t>
+      </w:r>
+      <w:r>
+        <w:t xml:space="preserve">, 168, 94–116. https://doi.org/10.1016/j.landurbplan.2017.09.019</w:t>
+      </w:r>
+    </w:p>
+    <w:p>
+      <w:pPr>
+        <w:pStyle w:val="BodyText"/>
+      </w:pPr>
+      <w:r>
+        <w:t xml:space="preserve">OpenStreetMap contributors. (2026). Abu Dhabi city boundary, relation 4479763 [Data set; retrieved 1 August 2026; geometry documented in boundary_manifest.json]. https://www.openstreetmap.org/relation/4479763</w:t>
+      </w:r>
+    </w:p>
+    <w:p>
+      <w:pPr>
+        <w:pStyle w:val="BodyText"/>
+      </w:pPr>
+      <w:r>
+        <w:t xml:space="preserve">Pedregosa, F., Varoquaux, G., Gramfort, A., Michel, V., Thirion, B., Grisel, O., Blondel, M., Prettenhofer, P., Weiss, R., Dubourg, V., Vanderplas, J., Passos, A., Cournapeau, D., Brucher, M., Perrot, M., &amp; Duchesnay, E. (2011). Scikit-learn: Machine learning in Python.</w:t>
+      </w:r>
+      <w:r>
+        <w:t xml:space="preserve"> </w:t>
+      </w:r>
+      <w:r>
+        <w:rPr>
+          <w:i/>
+          <w:iCs/>
+        </w:rPr>
+        <w:t xml:space="preserve">Journal of Machine Learning Research</w:t>
+      </w:r>
+      <w:r>
+        <w:t xml:space="preserve">, 12, 2825–2830. https://jmlr.org/papers/v12/pedregosa11a.html</w:t>
+      </w:r>
+    </w:p>
+    <w:p>
+      <w:pPr>
+        <w:pStyle w:val="BodyText"/>
+      </w:pPr>
+      <w:r>
+        <w:t xml:space="preserve">Pontius, R. G., Jr., Boersma, W., Castella, J.-C., Clarke, K., de Nijs, T., Dietzel, C., Duan, Z., Fotsing, E., Goldstein, N., Kok, K., Koomen, E., Lippitt, C. D., McConnell, W., Mohd Sood, A., Pijanowski, B., Pithadia, S., Sweeney, S., Trung, T. N., Veldkamp, A. T., &amp; Verburg, P. H. (2008). Comparing the input, output, and validation maps for several models of land change.</w:t>
+      </w:r>
+      <w:r>
+        <w:t xml:space="preserve"> </w:t>
+      </w:r>
+      <w:r>
+        <w:rPr>
+          <w:i/>
+          <w:iCs/>
+        </w:rPr>
+        <w:t xml:space="preserve">The Annals of Regional Science</w:t>
+      </w:r>
+      <w:r>
+        <w:t xml:space="preserve">, 42, 11–37. https://doi.org/10.1007/s00168-007-0138-2</w:t>
+      </w:r>
+    </w:p>
+    <w:p>
+      <w:pPr>
+        <w:pStyle w:val="BodyText"/>
+      </w:pPr>
+      <w:r>
+        <w:t xml:space="preserve">Pontius, R. G., Jr., &amp; Millones, M. (2011). Death to Kappa: birth of quantity disagreement and allocation disagreement for accuracy assessment.</w:t>
+      </w:r>
+      <w:r>
+        <w:t xml:space="preserve"> </w:t>
+      </w:r>
+      <w:r>
+        <w:rPr>
+          <w:i/>
+          <w:iCs/>
+        </w:rPr>
+        <w:t xml:space="preserve">International Journal of Remote Sensing</w:t>
+      </w:r>
+      <w:r>
+        <w:t xml:space="preserve">, 32, 4407–4429. https://doi.org/10.1080/01431161.2011.552923</w:t>
+      </w:r>
+    </w:p>
+    <w:p>
+      <w:pPr>
+        <w:pStyle w:val="BodyText"/>
+      </w:pPr>
+      <w:r>
+        <w:t xml:space="preserve">Silva, E. A., &amp; Clarke, K. C. (2002). Calibration of the SLEUTH urban growth model for Lisbon and Porto, Portugal.</w:t>
+      </w:r>
+      <w:r>
+        <w:t xml:space="preserve"> </w:t>
+      </w:r>
+      <w:r>
+        <w:rPr>
+          <w:i/>
+          <w:iCs/>
+        </w:rPr>
+        <w:t xml:space="preserve">Computers, Environment and Urban Systems</w:t>
+      </w:r>
+      <w:r>
+        <w:t xml:space="preserve">, 26, 525–552. https://doi.org/10.1016/S0198-9715(01)00014-X</w:t>
+      </w:r>
+    </w:p>
+    <w:p>
+      <w:pPr>
+        <w:pStyle w:val="BodyText"/>
+      </w:pPr>
+      <w:r>
+        <w:t xml:space="preserve">Soares-Filho, B. S., Cerqueira, G. C., &amp; Pennachin, C. L. (2002). DINAMICA—a stochastic cellular automata model designed to simulate the landscape dynamics in an Amazonian colonization frontier.</w:t>
+      </w:r>
+      <w:r>
+        <w:t xml:space="preserve"> </w:t>
+      </w:r>
+      <w:r>
+        <w:rPr>
+          <w:i/>
+          <w:iCs/>
+        </w:rPr>
+        <w:t xml:space="preserve">Ecological Modelling</w:t>
+      </w:r>
+      <w:r>
+        <w:t xml:space="preserve">, 154, 217–235. https://doi.org/10.1016/S0304-3800(02)00059-5</w:t>
+      </w:r>
+    </w:p>
+    <w:p>
+      <w:pPr>
+        <w:pStyle w:val="BodyText"/>
+      </w:pPr>
+      <w:r>
+        <w:t xml:space="preserve">van Vliet, J., Bregt, A. K., &amp; Hagen-Zanker, A. (2011). Revisiting Kappa to account for change in the accuracy assessment of land-use change models.</w:t>
+      </w:r>
+      <w:r>
+        <w:t xml:space="preserve"> </w:t>
+      </w:r>
+      <w:r>
+        <w:rPr>
+          <w:i/>
+          <w:iCs/>
+        </w:rPr>
+        <w:t xml:space="preserve">Ecological Modelling</w:t>
+      </w:r>
+      <w:r>
+        <w:t xml:space="preserve">, 222, 1367–1375. https://doi.org/10.1016/j.ecolmodel.2011.01.017</w:t>
+      </w:r>
+    </w:p>
+    <w:p>
+      <w:pPr>
+        <w:pStyle w:val="BodyText"/>
+      </w:pPr>
+      <w:r>
+        <w:t xml:space="preserve">van Vliet, J., Bregt, A. K., Brown, D. G., van Delden, H., Heckbert, S., &amp; Verburg, P. H. (2016). A review of current calibration and validation practices in land-change modeling.</w:t>
+      </w:r>
+      <w:r>
+        <w:t xml:space="preserve"> </w:t>
+      </w:r>
+      <w:r>
+        <w:rPr>
+          <w:i/>
+          <w:iCs/>
+        </w:rPr>
+        <w:t xml:space="preserve">Environmental Modelling &amp; Software</w:t>
+      </w:r>
+      <w:r>
+        <w:t xml:space="preserve">, 82, 174–182. https://doi.org/10.1016/j.envsoft.2016.04.017</w:t>
+      </w:r>
+    </w:p>
+    <w:p>
+      <w:pPr>
+        <w:pStyle w:val="BodyText"/>
+      </w:pPr>
+      <w:r>
+        <w:t xml:space="preserve">Verburg, P. H., Soepboer, W., Veldkamp, A., Limpiada, R., Espaldon, V., &amp; Mastura, S. S. A. (2002). Modeling the spatial dynamics of regional land use: the CLUE-S model.</w:t>
+      </w:r>
+      <w:r>
+        <w:t xml:space="preserve"> </w:t>
+      </w:r>
+      <w:r>
+        <w:rPr>
+          <w:i/>
+          <w:iCs/>
+        </w:rPr>
+        <w:t xml:space="preserve">Environmental Management</w:t>
+      </w:r>
+      <w:r>
+        <w:t xml:space="preserve">, 30, 391–405. https://doi.org/10.1007/s00267-002-2630-x</w:t>
+      </w:r>
+    </w:p>
+    <w:p>
+      <w:pPr>
+        <w:pStyle w:val="BodyText"/>
+      </w:pPr>
+      <w:r>
+        <w:t xml:space="preserve">Zanaga, D., Van De Kerchove, R., De Keersmaecker, W., Souverijns, N., Brockmann, C., Quast, R., Wevers, J., Grosu, A., Paccini, A., Vergnaud, S., Cartus, O., Santoro, M., Fritz, S., Georgieva, I., Lesiv, M., Carter, S., Herold, M., Li, L., Tsendbazar, N.-E., Ramoino, F., &amp; Arino, O. (2021). ESA WorldCover 10 m 2020 v100 [Data set]. Zenodo. https://doi.org/10.5281/zenodo.5571936</w:t>
+      </w:r>
+    </w:p>
+    <w:p>
+      <w:pPr>
+        <w:pStyle w:val="BodyText"/>
+      </w:pPr>
+      <w:r>
+        <w:t xml:space="preserve">Zanaga, D., Van De Kerchove, R., Daems, D., De Keersmaecker, W., Brockmann, C., Kirches, G., Wevers, J., Cartus, O., Santoro, M., Fritz, S., Lesiv, M., Herold, M., Tsendbazar, N.-E., Xu, P., Ramoino, F., &amp; Arino, O. (2022). ESA WorldCover 10 m 2021 v200 [Data set]. Zenodo. https://doi.org/10.5281/zenodo.7254221</w:t>
+      </w:r>
+    </w:p>
+    <w:bookmarkEnd w:id="57"/>
+    <w:bookmarkStart w:id="58" w:name="supplementary-information-outline"/>
+    <w:p>
+      <w:pPr>
+        <w:pStyle w:val="Heading2"/>
+      </w:pPr>
+      <w:r>
+        <w:t xml:space="preserve">Supplementary information outline</w:t>
       </w:r>
     </w:p>
     <w:p>
@@ -7276,15 +8351,28 @@
       </w:pPr>
       <w:r>
         <w:rPr>
+          <w:b/>
+          <w:bCs/>
+        </w:rPr>
+        <w:t xml:space="preserve">Supplementary Table S1:</w:t>
+      </w:r>
+      <w:r>
+        <w:t xml:space="preserve"> </w:t>
+      </w:r>
+      <w:r>
+        <w:t xml:space="preserve">ArcGIS-served 2031 model–scenario objective profiles with per-seed dispersion (see</w:t>
+      </w:r>
+      <w:r>
+        <w:t xml:space="preserve"> </w:t>
+      </w:r>
+      <w:r>
+        <w:rPr>
           <w:rStyle w:val="VerbatimChar"/>
         </w:rPr>
-        <w:t xml:space="preserve">run_geospatial_kernel.py</w:t>
-      </w:r>
-      <w:r>
-        <w:t xml:space="preserve"> </w:t>
-      </w:r>
-      <w:r>
-        <w:t xml:space="preserve">for the Kernel historical run;</w:t>
+        <w:t xml:space="preserve">supplementary_table_S1_arcgis_planning_objectives.md</w:t>
+      </w:r>
+      <w:r>
+        <w:t xml:space="preserve">).</w:t>
       </w:r>
     </w:p>
     <w:p>
@@ -7297,30 +8385,28 @@
       </w:pPr>
       <w:r>
         <w:rPr>
+          <w:b/>
+          <w:bCs/>
+        </w:rPr>
+        <w:t xml:space="preserve">Supplementary Table S2:</w:t>
+      </w:r>
+      <w:r>
+        <w:t xml:space="preserve"> </w:t>
+      </w:r>
+      <w:r>
+        <w:t xml:space="preserve">Neighbourhood-weight sensitivity at 0, 0.175, 0.35 and 0.7 (see</w:t>
+      </w:r>
+      <w:r>
+        <w:t xml:space="preserve"> </w:t>
+      </w:r>
+      <w:r>
+        <w:rPr>
           <w:rStyle w:val="VerbatimChar"/>
         </w:rPr>
-        <w:t xml:space="preserve">run_rolling_backtest.py</w:t>
-      </w:r>
-      <w:r>
-        <w:t xml:space="preserve"> </w:t>
-      </w:r>
-      <w:r>
-        <w:t xml:space="preserve">and</w:t>
-      </w:r>
-      <w:r>
-        <w:t xml:space="preserve"> </w:t>
-      </w:r>
-      <w:r>
-        <w:rPr>
-          <w:rStyle w:val="VerbatimChar"/>
-        </w:rPr>
-        <w:t xml:space="preserve">run_rolling_uncertainty.py</w:t>
-      </w:r>
-      <w:r>
-        <w:t xml:space="preserve"> </w:t>
-      </w:r>
-      <w:r>
-        <w:t xml:space="preserve">for the expanding-window experiment and paired spatial-block intervals;</w:t>
+        <w:t xml:space="preserve">supplementary_table_S2_neighbourhood_weight_sensitivity.md</w:t>
+      </w:r>
+      <w:r>
+        <w:t xml:space="preserve">).</w:t>
       </w:r>
     </w:p>
     <w:p>
@@ -7333,15 +8419,28 @@
       </w:pPr>
       <w:r>
         <w:rPr>
+          <w:b/>
+          <w:bCs/>
+        </w:rPr>
+        <w:t xml:space="preserve">Supplementary Table S3:</w:t>
+      </w:r>
+      <w:r>
+        <w:t xml:space="preserve"> </w:t>
+      </w:r>
+      <w:r>
+        <w:t xml:space="preserve">FLUS 13-, 19- and 25-feature diagnostics, platform boundary and demand-underfill evidence (see</w:t>
+      </w:r>
+      <w:r>
+        <w:t xml:space="preserve"> </w:t>
+      </w:r>
+      <w:r>
+        <w:rPr>
           <w:rStyle w:val="VerbatimChar"/>
         </w:rPr>
-        <w:t xml:space="preserve">materialize_worldcover_validation.py</w:t>
-      </w:r>
-      <w:r>
-        <w:t xml:space="preserve"> </w:t>
-      </w:r>
-      <w:r>
-        <w:t xml:space="preserve">for frozen WorldCover inputs;</w:t>
+        <w:t xml:space="preserve">supplementary_table_S3_flus_feature_diagnostics.md</w:t>
+      </w:r>
+      <w:r>
+        <w:t xml:space="preserve">).</w:t>
       </w:r>
     </w:p>
     <w:p>
@@ -7354,15 +8453,28 @@
       </w:pPr>
       <w:r>
         <w:rPr>
+          <w:b/>
+          <w:bCs/>
+        </w:rPr>
+        <w:t xml:space="preserve">Supplementary Table S4:</w:t>
+      </w:r>
+      <w:r>
+        <w:t xml:space="preserve"> </w:t>
+      </w:r>
+      <w:r>
+        <w:t xml:space="preserve">Annual six-class Dynamic World-to-ArcGIS product matrices on the paired grid (see</w:t>
+      </w:r>
+      <w:r>
+        <w:t xml:space="preserve"> </w:t>
+      </w:r>
+      <w:r>
+        <w:rPr>
           <w:rStyle w:val="VerbatimChar"/>
         </w:rPr>
-        <w:t xml:space="preserve">run_worldcover_external_diagnostic.py</w:t>
-      </w:r>
-      <w:r>
-        <w:t xml:space="preserve"> </w:t>
-      </w:r>
-      <w:r>
-        <w:t xml:space="preserve">for the agreement diagnostic;</w:t>
+        <w:t xml:space="preserve">supplementary_table_S4_cross_product_class_matrices.md</w:t>
+      </w:r>
+      <w:r>
+        <w:t xml:space="preserve">).</w:t>
       </w:r>
     </w:p>
     <w:p>
@@ -7374,7 +8486,17 @@
         </w:numPr>
       </w:pPr>
       <w:r>
-        <w:t xml:space="preserve">the vendored</w:t>
+        <w:rPr>
+          <w:b/>
+          <w:bCs/>
+        </w:rPr>
+        <w:t xml:space="preserve">Supplementary Table S5:</w:t>
+      </w:r>
+      <w:r>
+        <w:t xml:space="preserve"> </w:t>
+      </w:r>
+      <w:r>
+        <w:t xml:space="preserve">Rolling-origin and WorldCover external-product diagnostics (see</w:t>
       </w:r>
       <w:r>
         <w:t xml:space="preserve"> </w:t>
@@ -7383,13 +8505,10 @@
         <w:rPr>
           <w:rStyle w:val="VerbatimChar"/>
         </w:rPr>
-        <w:t xml:space="preserve">geospatial_kernel/runtime.py</w:t>
-      </w:r>
-      <w:r>
-        <w:t xml:space="preserve"> </w:t>
-      </w:r>
-      <w:r>
-        <w:t xml:space="preserve">snapshot;</w:t>
+        <w:t xml:space="preserve">supplementary_table_S5_rolling_external_diagnostics.md</w:t>
+      </w:r>
+      <w:r>
+        <w:t xml:space="preserve">).</w:t>
       </w:r>
     </w:p>
     <w:p>
@@ -7402,30 +8521,28 @@
       </w:pPr>
       <w:r>
         <w:rPr>
+          <w:b/>
+          <w:bCs/>
+        </w:rPr>
+        <w:t xml:space="preserve">Supplementary Table S6:</w:t>
+      </w:r>
+      <w:r>
+        <w:t xml:space="preserve"> </w:t>
+      </w:r>
+      <w:r>
+        <w:t xml:space="preserve">Matched Dynamic World and ArcGIS-served whole-product-pipeline backtests (see</w:t>
+      </w:r>
+      <w:r>
+        <w:t xml:space="preserve"> </w:t>
+      </w:r>
+      <w:r>
+        <w:rPr>
           <w:rStyle w:val="VerbatimChar"/>
         </w:rPr>
-        <w:t xml:space="preserve">render_nature_figures.py</w:t>
-      </w:r>
-      <w:r>
-        <w:t xml:space="preserve"> </w:t>
-      </w:r>
-      <w:r>
-        <w:t xml:space="preserve">and</w:t>
-      </w:r>
-      <w:r>
-        <w:t xml:space="preserve"> </w:t>
-      </w:r>
-      <w:r>
-        <w:rPr>
-          <w:rStyle w:val="VerbatimChar"/>
-        </w:rPr>
-        <w:t xml:space="preserve">render_rolling_validation_figure.py</w:t>
-      </w:r>
-      <w:r>
-        <w:t xml:space="preserve"> </w:t>
-      </w:r>
-      <w:r>
-        <w:t xml:space="preserve">for publication artwork;</w:t>
+        <w:t xml:space="preserve">supplementary_table_S6_product_robustness.md</w:t>
+      </w:r>
+      <w:r>
+        <w:t xml:space="preserve">).</w:t>
       </w:r>
     </w:p>
     <w:p>
@@ -7438,15 +8555,28 @@
       </w:pPr>
       <w:r>
         <w:rPr>
+          <w:b/>
+          <w:bCs/>
+        </w:rPr>
+        <w:t xml:space="preserve">Supplementary Table S7:</w:t>
+      </w:r>
+      <w:r>
+        <w:t xml:space="preserve"> </w:t>
+      </w:r>
+      <w:r>
+        <w:t xml:space="preserve">Net-change FoM upper bounds and 54 seed-specific paired model intervals (see</w:t>
+      </w:r>
+      <w:r>
+        <w:t xml:space="preserve"> </w:t>
+      </w:r>
+      <w:r>
+        <w:rPr>
           <w:rStyle w:val="VerbatimChar"/>
         </w:rPr>
-        <w:t xml:space="preserve">source_data_fig03_rolling_external_diagnostics.csv</w:t>
-      </w:r>
-      <w:r>
-        <w:t xml:space="preserve"> </w:t>
-      </w:r>
-      <w:r>
-        <w:t xml:space="preserve">for the quantitative source data behind Fig. 3.</w:t>
+        <w:t xml:space="preserve">supplementary_table_S7_allocation_limits.md</w:t>
+      </w:r>
+      <w:r>
+        <w:t xml:space="preserve">).</w:t>
       </w:r>
     </w:p>
     <w:p>
@@ -7459,15 +8589,25 @@
       </w:pPr>
       <w:r>
         <w:rPr>
+          <w:b/>
+          <w:bCs/>
+        </w:rPr>
+        <w:t xml:space="preserve">Fig. S1:</w:t>
+      </w:r>
+      <w:r>
+        <w:t xml:space="preserve"> </w:t>
+      </w:r>
+      <w:r>
+        <w:t xml:space="preserve">Full 3-scenarios × 3-model 2031 new-built footprint atlas (</w:t>
+      </w:r>
+      <w:r>
+        <w:rPr>
           <w:rStyle w:val="VerbatimChar"/>
         </w:rPr>
-        <w:t xml:space="preserve">run_arcgis_historical_backtest.py</w:t>
-      </w:r>
-      <w:r>
-        <w:t xml:space="preserve"> </w:t>
-      </w:r>
-      <w:r>
-        <w:t xml:space="preserve">for both leakage-controlled product tracks;</w:t>
+        <w:t xml:space="preserve">figures/figS01_planning_atlas_2031.*</w:t>
+      </w:r>
+      <w:r>
+        <w:t xml:space="preserve">).</w:t>
       </w:r>
     </w:p>
     <w:p>
@@ -7480,54 +8620,25 @@
       </w:pPr>
       <w:r>
         <w:rPr>
+          <w:b/>
+          <w:bCs/>
+        </w:rPr>
+        <w:t xml:space="preserve">Fig. S2:</w:t>
+      </w:r>
+      <w:r>
+        <w:t xml:space="preserve"> </w:t>
+      </w:r>
+      <w:r>
+        <w:t xml:space="preserve">Dynamic World quality proxy and quality-filtered change sensitivity (</w:t>
+      </w:r>
+      <w:r>
+        <w:rPr>
           <w:rStyle w:val="VerbatimChar"/>
         </w:rPr>
-        <w:t xml:space="preserve">analyze_product_robustness.py</w:t>
-      </w:r>
-      <w:r>
-        <w:t xml:space="preserve">,</w:t>
-      </w:r>
-      <w:r>
-        <w:t xml:space="preserve"> </w:t>
-      </w:r>
-      <w:r>
-        <w:rPr>
-          <w:rStyle w:val="VerbatimChar"/>
-        </w:rPr>
-        <w:t xml:space="preserve">source_data_fig04_product_robustness.csv</w:t>
-      </w:r>
-      <w:r>
-        <w:t xml:space="preserve">,</w:t>
-      </w:r>
-      <w:r>
-        <w:t xml:space="preserve"> </w:t>
-      </w:r>
-      <w:r>
-        <w:rPr>
-          <w:rStyle w:val="VerbatimChar"/>
-        </w:rPr>
-        <w:t xml:space="preserve">supplementary_table_S1_arcgis_planning_objectives.md</w:t>
-      </w:r>
-      <w:r>
-        <w:t xml:space="preserve"> </w:t>
-      </w:r>
-      <w:r>
-        <w:t xml:space="preserve">and</w:t>
-      </w:r>
-      <w:r>
-        <w:t xml:space="preserve"> </w:t>
-      </w:r>
-      <w:r>
-        <w:rPr>
-          <w:rStyle w:val="VerbatimChar"/>
-        </w:rPr>
-        <w:t xml:space="preserve">supplementary_table_S6_product_robustness.md</w:t>
-      </w:r>
-      <w:r>
-        <w:t xml:space="preserve"> </w:t>
-      </w:r>
-      <w:r>
-        <w:t xml:space="preserve">for the cross-product analysis; its frozen 2031 seed states allow this analysis to rerun without a new simulation;</w:t>
+        <w:t xml:space="preserve">figures/figS02_input_label_quality.*</w:t>
+      </w:r>
+      <w:r>
+        <w:t xml:space="preserve">).</w:t>
       </w:r>
     </w:p>
     <w:p>
@@ -7540,15 +8651,25 @@
       </w:pPr>
       <w:r>
         <w:rPr>
+          <w:b/>
+          <w:bCs/>
+        </w:rPr>
+        <w:t xml:space="preserve">Fig. S3:</w:t>
+      </w:r>
+      <w:r>
+        <w:t xml:space="preserve"> </w:t>
+      </w:r>
+      <w:r>
+        <w:t xml:space="preserve">Historical maps and change-error maps for 2024 (</w:t>
+      </w:r>
+      <w:r>
+        <w:rPr>
           <w:rStyle w:val="VerbatimChar"/>
         </w:rPr>
-        <w:t xml:space="preserve">reproducibility/reproduce.py</w:t>
-      </w:r>
-      <w:r>
-        <w:t xml:space="preserve"> </w:t>
-      </w:r>
-      <w:r>
-        <w:t xml:space="preserve">for the end-to-end rerun;</w:t>
+        <w:t xml:space="preserve">figures/figS03_historical_2024_maps_and_errors.*</w:t>
+      </w:r>
+      <w:r>
+        <w:t xml:space="preserve">).</w:t>
       </w:r>
     </w:p>
     <w:p>
@@ -7561,1292 +8682,16 @@
       </w:pPr>
       <w:r>
         <w:rPr>
-          <w:rStyle w:val="VerbatimChar"/>
-        </w:rPr>
-        <w:t xml:space="preserve">reproducibility_check.py</w:t>
-      </w:r>
-      <w:r>
-        <w:t xml:space="preserve"> </w:t>
-      </w:r>
-      <w:r>
-        <w:t xml:space="preserve">and</w:t>
-      </w:r>
-      <w:r>
-        <w:t xml:space="preserve"> </w:t>
-      </w:r>
-      <w:r>
-        <w:rPr>
-          <w:rStyle w:val="VerbatimChar"/>
-        </w:rPr>
-        <w:t xml:space="preserve">audit_outputs.py</w:t>
-      </w:r>
-      <w:r>
-        <w:t xml:space="preserve"> </w:t>
-      </w:r>
-      <w:r>
-        <w:t xml:space="preserve">for fail-closed integrity checks.</w:t>
-      </w:r>
-    </w:p>
-    <w:p>
-      <w:pPr>
-        <w:pStyle w:val="FirstParagraph"/>
-      </w:pPr>
-      <w:r>
-        <w:t xml:space="preserve">GeoFM-LDN source and the three fixed checkpoints are included in the benchmark</w:t>
-      </w:r>
-      <w:r>
-        <w:t xml:space="preserve"> </w:t>
-      </w:r>
-      <w:r>
-        <w:t xml:space="preserve">external and prediction-artifact directories.</w:t>
-      </w:r>
-      <w:r>
-        <w:t xml:space="preserve"> </w:t>
-      </w:r>
-      <w:r>
-        <w:t xml:space="preserve">Earlier internal reference outputs, produced before the dependency lock was</w:t>
-      </w:r>
-      <w:r>
-        <w:t xml:space="preserve"> </w:t>
-      </w:r>
-      <w:r>
-        <w:t xml:space="preserve">completed, could not be regenerated under the resolved environment and were</w:t>
-      </w:r>
-      <w:r>
-        <w:t xml:space="preserve"> </w:t>
-      </w:r>
-      <w:r>
-        <w:t xml:space="preserve">superseded by the locked-environment rerun reported here. Historical strict-FoM</w:t>
-      </w:r>
-      <w:r>
-        <w:t xml:space="preserve"> </w:t>
-      </w:r>
-      <w:r>
-        <w:t xml:space="preserve">differences were at approximately the 0.001 level; discrete multi-year planning</w:t>
-      </w:r>
-      <w:r>
-        <w:t xml:space="preserve"> </w:t>
-      </w:r>
-      <w:r>
-        <w:t xml:space="preserve">ensemble demand errors changed more substantially and are reported here only</w:t>
-      </w:r>
-      <w:r>
-        <w:t xml:space="preserve"> </w:t>
-      </w:r>
-      <w:r>
-        <w:t xml:space="preserve">from the locked-environment rerun. The prior outputs remain Git-history lineage,</w:t>
-      </w:r>
-      <w:r>
-        <w:t xml:space="preserve"> </w:t>
-      </w:r>
-      <w:r>
-        <w:t xml:space="preserve">not current evidence.</w:t>
-      </w:r>
-      <w:r>
-        <w:t xml:space="preserve"> </w:t>
-      </w:r>
-      <w:r>
-        <w:t xml:space="preserve">The vendored FLUS executable is a macOS arm64 binary rebuilt from the GeoSOS</w:t>
-      </w:r>
-      <w:r>
-        <w:t xml:space="preserve"> </w:t>
-      </w:r>
-      <w:r>
-        <w:t xml:space="preserve">public FLUS source base. The author-modified source, including</w:t>
-      </w:r>
-      <w:r>
-        <w:t xml:space="preserve"> </w:t>
-      </w:r>
-      <w:r>
-        <w:rPr>
-          <w:rStyle w:val="VerbatimChar"/>
-        </w:rPr>
-        <w:t xml:space="preserve">train-update</w:t>
-      </w:r>
-      <w:r>
-        <w:t xml:space="preserve"> </w:t>
-      </w:r>
-      <w:r>
-        <w:t xml:space="preserve">and</w:t>
-      </w:r>
-      <w:r>
-        <w:t xml:space="preserve"> </w:t>
-      </w:r>
-      <w:r>
-        <w:rPr>
-          <w:rStyle w:val="VerbatimChar"/>
-        </w:rPr>
-        <w:t xml:space="preserve">FLUS_RANDOM_SEED</w:t>
-      </w:r>
-      <w:r>
-        <w:t xml:space="preserve">, is archived at</w:t>
-      </w:r>
-      <w:r>
-        <w:t xml:space="preserve"> </w:t>
-      </w:r>
-      <w:r>
-        <w:t xml:space="preserve">the public FLUS source repository, tag</w:t>
-      </w:r>
-      <w:r>
-        <w:t xml:space="preserve"> </w:t>
-      </w:r>
-      <w:r>
-        <w:rPr>
-          <w:rStyle w:val="VerbatimChar"/>
-        </w:rPr>
-        <w:t xml:space="preserve">paper-benchmark-flus-v1.1</w:t>
-      </w:r>
-      <w:r>
-        <w:t xml:space="preserve"> </w:t>
-      </w:r>
-      <w:r>
-        <w:t xml:space="preserve">at commit</w:t>
-      </w:r>
-      <w:r>
-        <w:t xml:space="preserve"> </w:t>
-      </w:r>
-      <w:r>
-        <w:rPr>
-          <w:rStyle w:val="VerbatimChar"/>
-        </w:rPr>
-        <w:t xml:space="preserve">47e65b3</w:t>
-      </w:r>
-      <w:r>
-        <w:t xml:space="preserve"> </w:t>
-      </w:r>
-      <w:r>
-        <w:t xml:space="preserve">(the GeoSOS source release and Liu et al. (2017) are cited above). Rebuilding</w:t>
-      </w:r>
-      <w:r>
-        <w:t xml:space="preserve"> </w:t>
-      </w:r>
-      <w:r>
-        <w:t xml:space="preserve">the preceding v1 commit (</w:t>
-      </w:r>
-      <w:r>
-        <w:rPr>
-          <w:rStyle w:val="VerbatimChar"/>
-        </w:rPr>
-        <w:t xml:space="preserve">deb0a54</w:t>
-      </w:r>
-      <w:r>
-        <w:t xml:space="preserve">) on macOS arm64 produced SHA-256</w:t>
-      </w:r>
-      <w:r>
-        <w:t xml:space="preserve"> </w:t>
-      </w:r>
-      <w:r>
-        <w:rPr>
-          <w:rStyle w:val="VerbatimChar"/>
-        </w:rPr>
-        <w:t xml:space="preserve">9839ce50950442d4ef49e4d2129a1ba27735e1955c2d4975ae51067c1c3c9964</w:t>
-      </w:r>
-      <w:r>
-        <w:t xml:space="preserve">,</w:t>
-      </w:r>
-      <w:r>
-        <w:t xml:space="preserve"> </w:t>
-      </w:r>
-      <w:r>
-        <w:t xml:space="preserve">identical to the vendored executable. Version v1.1 changes only invalid-input</w:t>
-      </w:r>
-      <w:r>
-        <w:t xml:space="preserve"> </w:t>
-      </w:r>
-      <w:r>
-        <w:t xml:space="preserve">failure handling and leaves valid-input algorithmic paths unchanged; the</w:t>
-      </w:r>
-      <w:r>
-        <w:t xml:space="preserve"> </w:t>
-      </w:r>
-      <w:r>
-        <w:t xml:space="preserve">normal-output equivalence check is archived with the source release.</w:t>
-      </w:r>
-      <w:r>
-        <w:t xml:space="preserve"> </w:t>
-      </w:r>
-      <w:r>
-        <w:t xml:space="preserve">The tagged author-modified source can also be built on Linux and Windows using</w:t>
-      </w:r>
-      <w:r>
-        <w:t xml:space="preserve"> </w:t>
-      </w:r>
-      <w:r>
-        <w:t xml:space="preserve">the repository instructions.</w:t>
-      </w:r>
-      <w:r>
-        <w:t xml:space="preserve"> </w:t>
-      </w:r>
-      <w:r>
-        <w:rPr>
-          <w:rStyle w:val="VerbatimChar"/>
-        </w:rPr>
-        <w:t xml:space="preserve">FLUS_RANDOM_SEED</w:t>
-      </w:r>
-      <w:r>
-        <w:t xml:space="preserve"> </w:t>
-      </w:r>
-      <w:r>
-        <w:t xml:space="preserve">guarantees determinism only</w:t>
-      </w:r>
-      <w:r>
-        <w:t xml:space="preserve"> </w:t>
-      </w:r>
-      <w:r>
-        <w:t xml:space="preserve">within a platform and build environment because ANN sampling and CA roulette</w:t>
-      </w:r>
-      <w:r>
-        <w:t xml:space="preserve"> </w:t>
-      </w:r>
-      <w:r>
-        <w:t xml:space="preserve">draws use platform-defined C</w:t>
-      </w:r>
-      <w:r>
-        <w:t xml:space="preserve"> </w:t>
-      </w:r>
-      <w:r>
-        <w:rPr>
-          <w:rStyle w:val="VerbatimChar"/>
-        </w:rPr>
-        <w:t xml:space="preserve">rand()</w:t>
-      </w:r>
-      <w:r>
-        <w:t xml:space="preserve">/</w:t>
-      </w:r>
-      <w:r>
-        <w:rPr>
-          <w:rStyle w:val="VerbatimChar"/>
-        </w:rPr>
-        <w:t xml:space="preserve">srand()</w:t>
-      </w:r>
-      <w:r>
-        <w:t xml:space="preserve"> </w:t>
-      </w:r>
-      <w:r>
-        <w:t xml:space="preserve">streams. Independent external</w:t>
-      </w:r>
-      <w:r>
-        <w:t xml:space="preserve"> </w:t>
-      </w:r>
-      <w:r>
-        <w:t xml:space="preserve">Windows FLUS verification, including the seven-driver cross-platform difference</w:t>
-      </w:r>
-      <w:r>
-        <w:t xml:space="preserve"> </w:t>
-      </w:r>
-      <w:r>
-        <w:t xml:space="preserve">and the 25-feature zero-change outcome, is documented with its provenance</w:t>
-      </w:r>
-      <w:r>
-        <w:t xml:space="preserve"> </w:t>
-      </w:r>
-      <w:r>
-        <w:t xml:space="preserve">limitation in Supplementary Table S3. Windows execution requires the benchmark</w:t>
-      </w:r>
-      <w:r>
-        <w:t xml:space="preserve"> </w:t>
-      </w:r>
-      <w:r>
-        <w:t xml:space="preserve">and working directories to use pure ASCII paths; saving configuration files as</w:t>
-      </w:r>
-      <w:r>
-        <w:t xml:space="preserve"> </w:t>
-      </w:r>
-      <w:r>
-        <w:t xml:space="preserve">UTF-8 alone does not repair GDAL path decoding. A compatible local build is required to</w:t>
-      </w:r>
-      <w:r>
-        <w:t xml:space="preserve"> </w:t>
-      </w:r>
-      <w:r>
-        <w:t xml:space="preserve">execute the FLUS track outside macOS arm64 and will produce a different random</w:t>
-      </w:r>
-      <w:r>
-        <w:t xml:space="preserve"> </w:t>
-      </w:r>
-      <w:r>
-        <w:t xml:space="preserve">stream. The macOS binary SHA statement is an author self-check. As an</w:t>
-      </w:r>
-      <w:r>
-        <w:t xml:space="preserve"> </w:t>
-      </w:r>
-      <w:r>
-        <w:t xml:space="preserve">upstream-only fallback, the public FLUS CA source can be paired with an open</w:t>
-      </w:r>
-      <w:r>
-        <w:t xml:space="preserve"> </w:t>
-      </w:r>
-      <w:r>
-        <w:t xml:space="preserve">Python ANN implementation, but the unmodified upstream CA uses time seeding</w:t>
-      </w:r>
-      <w:r>
-        <w:t xml:space="preserve"> </w:t>
-      </w:r>
-      <w:r>
-        <w:t xml:space="preserve">rather than</w:t>
-      </w:r>
-      <w:r>
-        <w:t xml:space="preserve"> </w:t>
-      </w:r>
-      <w:r>
-        <w:rPr>
-          <w:rStyle w:val="VerbatimChar"/>
-        </w:rPr>
-        <w:t xml:space="preserve">FLUS_RANDOM_SEED</w:t>
-      </w:r>
-      <w:r>
-        <w:t xml:space="preserve">. The corresponding-author e-mail is</w:t>
-      </w:r>
-      <w:r>
-        <w:t xml:space="preserve"> </w:t>
-      </w:r>
-      <w:r>
-        <w:rPr>
-          <w:rStyle w:val="VerbatimChar"/>
-        </w:rPr>
-        <w:t xml:space="preserve">zhouning@freedotech.com</w:t>
-      </w:r>
-      <w:r>
-        <w:t xml:space="preserve">. The versioned v2 source release is archived at</w:t>
-      </w:r>
-      <w:r>
-        <w:t xml:space="preserve"> </w:t>
-      </w:r>
-      <w:r>
-        <w:t xml:space="preserve">https://doi.org/10.5281/zenodo.22689057 and corresponds to GitHub tag</w:t>
-      </w:r>
-      <w:r>
-        <w:t xml:space="preserve"> </w:t>
-      </w:r>
-      <w:r>
-        <w:rPr>
-          <w:rStyle w:val="VerbatimChar"/>
-        </w:rPr>
-        <w:t xml:space="preserve">v2.0.0</w:t>
-      </w:r>
-      <w:r>
-        <w:t xml:space="preserve"> </w:t>
-      </w:r>
-      <w:r>
-        <w:t xml:space="preserve">at commit</w:t>
-      </w:r>
-      <w:r>
-        <w:t xml:space="preserve"> </w:t>
-      </w:r>
-      <w:r>
-        <w:rPr>
-          <w:rStyle w:val="VerbatimChar"/>
-        </w:rPr>
-        <w:t xml:space="preserve">77e2c59</w:t>
-      </w:r>
-      <w:r>
-        <w:t xml:space="preserve">; the DOI identifies the public benchmark source release,</w:t>
-      </w:r>
-      <w:r>
-        <w:t xml:space="preserve"> </w:t>
-      </w:r>
-      <w:r>
-        <w:t xml:space="preserve">not the eventual journal article DOI. Hydrated Git LFS objects must be fetched</w:t>
-      </w:r>
-      <w:r>
-        <w:t xml:space="preserve"> </w:t>
-      </w:r>
-      <w:r>
-        <w:t xml:space="preserve">from the tagged repository for a full numerical rerun.</w:t>
-      </w:r>
-    </w:p>
-    <w:bookmarkEnd w:id="55"/>
-    <w:bookmarkStart w:id="56" w:name="declarations"/>
-    <w:p>
-      <w:pPr>
-        <w:pStyle w:val="Heading2"/>
-      </w:pPr>
-      <w:r>
-        <w:t xml:space="preserve">Declarations</w:t>
-      </w:r>
-    </w:p>
-    <w:p>
-      <w:pPr>
-        <w:pStyle w:val="FirstParagraph"/>
-      </w:pPr>
-      <w:r>
-        <w:rPr>
           <w:b/>
           <w:bCs/>
         </w:rPr>
-        <w:t xml:space="preserve">Funding.</w:t>
-      </w:r>
-      <w:r>
-        <w:t xml:space="preserve"> </w:t>
-      </w:r>
-      <w:r>
-        <w:t xml:space="preserve">No external funding was received for this study.</w:t>
-      </w:r>
-    </w:p>
-    <w:p>
-      <w:pPr>
-        <w:pStyle w:val="BodyText"/>
-      </w:pPr>
-      <w:r>
-        <w:rPr>
-          <w:b/>
-          <w:bCs/>
-        </w:rPr>
-        <w:t xml:space="preserve">Competing interests.</w:t>
-      </w:r>
-      <w:r>
-        <w:t xml:space="preserve"> </w:t>
-      </w:r>
-      <w:r>
-        <w:t xml:space="preserve">Ning Zhou is employed by Beijing Freedo Technology Co., Ltd., which develops geospatial-world-model software. The author declares no other competing financial or personal interests.</w:t>
-      </w:r>
-    </w:p>
-    <w:p>
-      <w:pPr>
-        <w:pStyle w:val="BodyText"/>
-      </w:pPr>
-      <w:r>
-        <w:rPr>
-          <w:b/>
-          <w:bCs/>
-        </w:rPr>
-        <w:t xml:space="preserve">CRediT author statement.</w:t>
-      </w:r>
-      <w:r>
-        <w:t xml:space="preserve"> </w:t>
-      </w:r>
-      <w:r>
-        <w:t xml:space="preserve">Ning Zhou: Conceptualization, methodology, software, data curation, formal analysis, visualization, writing—original draft, writing—review and editing.</w:t>
-      </w:r>
-    </w:p>
-    <w:p>
-      <w:pPr>
-        <w:pStyle w:val="BodyText"/>
-      </w:pPr>
-      <w:r>
-        <w:rPr>
-          <w:b/>
-          <w:bCs/>
-        </w:rPr>
-        <w:t xml:space="preserve">Acknowledgements.</w:t>
-      </w:r>
-      <w:r>
-        <w:t xml:space="preserve"> </w:t>
-      </w:r>
-      <w:r>
-        <w:t xml:space="preserve">The author thanks the anonymous reviewers for independent technical verification and constructive methodological comments.</w:t>
-      </w:r>
-    </w:p>
-    <w:p>
-      <w:pPr>
-        <w:pStyle w:val="BodyText"/>
-      </w:pPr>
-      <w:r>
-        <w:rPr>
-          <w:b/>
-          <w:bCs/>
-        </w:rPr>
-        <w:t xml:space="preserve">Ethics statement.</w:t>
-      </w:r>
-      <w:r>
-        <w:t xml:space="preserve"> </w:t>
-      </w:r>
-      <w:r>
-        <w:t xml:space="preserve">Not applicable; the study used geospatial raster, vector and derived public-data products and did not involve human or animal participants.</w:t>
-      </w:r>
-    </w:p>
-    <w:p>
-      <w:pPr>
-        <w:pStyle w:val="BodyText"/>
-      </w:pPr>
-      <w:r>
-        <w:rPr>
-          <w:b/>
-          <w:bCs/>
-        </w:rPr>
-        <w:t xml:space="preserve">Declaration of generative AI and AI-assisted technologies in the writing process.</w:t>
-      </w:r>
-      <w:r>
-        <w:t xml:space="preserve"> </w:t>
-      </w:r>
-      <w:r>
-        <w:t xml:space="preserve">During preparation of this work, the author used OpenAI Codex for language editing, code review and document-formatting assistance. The author reviewed and revised all outputs and takes full responsibility for the content of the publication.</w:t>
-      </w:r>
-    </w:p>
-    <w:bookmarkEnd w:id="56"/>
-    <w:bookmarkStart w:id="57" w:name="references"/>
-    <w:p>
-      <w:pPr>
-        <w:pStyle w:val="Heading2"/>
-      </w:pPr>
-      <w:r>
-        <w:t xml:space="preserve">References</w:t>
-      </w:r>
-    </w:p>
-    <w:p>
-      <w:pPr>
-        <w:pStyle w:val="FirstParagraph"/>
-      </w:pPr>
-      <w:r>
-        <w:t xml:space="preserve">Abu Dhabi Urban Planning Council. (2007). Plan Abu Dhabi 2030: urban structure framework plan. Abu Dhabi, United Arab Emirates.</w:t>
-      </w:r>
-    </w:p>
-    <w:p>
-      <w:pPr>
-        <w:pStyle w:val="BodyText"/>
-      </w:pPr>
-      <w:r>
-        <w:t xml:space="preserve">Brown, C. F., Brumby, S. P., Guzder-Williams, B., Birch, T., Hyde, S. B., Mazzariello, J., Czerwinski, W., Pasquarella, V. J., Haertel, R., Ilyushchenko, S., Schwehr, K., Weisse, M., Stolle, F., Hanson, C., Guinan, O., Moore, R., &amp; Tait, A. M. (2022). Dynamic World, near real-time global 10 m land use land cover mapping.</w:t>
-      </w:r>
-      <w:r>
-        <w:t xml:space="preserve"> </w:t>
-      </w:r>
-      <w:r>
-        <w:rPr>
-          <w:i/>
-          <w:iCs/>
-        </w:rPr>
-        <w:t xml:space="preserve">Scientific Data</w:t>
-      </w:r>
-      <w:r>
-        <w:t xml:space="preserve">, 9, 251. https://doi.org/10.1038/s41597-022-01307-4</w:t>
-      </w:r>
-    </w:p>
-    <w:p>
-      <w:pPr>
-        <w:pStyle w:val="BodyText"/>
-      </w:pPr>
-      <w:r>
-        <w:t xml:space="preserve">Brown, C. F., Kazmierski, M. R., Pasquarella, V. J., Rucklidge, W. J., Samsikova, M., Zhang, C., Shelhamer, E., Lahera, E., Wiles, O., Ilyushchenko, S., Gorelick, N., Zhang, L. L., Alj, S., Schechter, E., Askay, S., Guinan, O., Moore, R., Boukouvalas, A., &amp; Kohli, P. (2025). AlphaEarth Foundations: An embedding field model for accurate and efficient global mapping from sparse label data.</w:t>
-      </w:r>
-      <w:r>
-        <w:t xml:space="preserve"> </w:t>
-      </w:r>
-      <w:r>
-        <w:rPr>
-          <w:i/>
-          <w:iCs/>
-        </w:rPr>
-        <w:t xml:space="preserve">arXiv</w:t>
-      </w:r>
-      <w:r>
-        <w:t xml:space="preserve">. https://doi.org/10.48550/arXiv.2507.22291</w:t>
-      </w:r>
-    </w:p>
-    <w:p>
-      <w:pPr>
-        <w:pStyle w:val="BodyText"/>
-      </w:pPr>
-      <w:r>
-        <w:t xml:space="preserve">Burton, E. (2000). The compact city: just or just compact? A preliminary analysis.</w:t>
-      </w:r>
-      <w:r>
-        <w:t xml:space="preserve"> </w:t>
-      </w:r>
-      <w:r>
-        <w:rPr>
-          <w:i/>
-          <w:iCs/>
-        </w:rPr>
-        <w:t xml:space="preserve">Urban Studies</w:t>
-      </w:r>
-      <w:r>
-        <w:t xml:space="preserve">, 37, 1969–2006. https://doi.org/10.1080/00420980050162184</w:t>
-      </w:r>
-    </w:p>
-    <w:p>
-      <w:pPr>
-        <w:pStyle w:val="BodyText"/>
-      </w:pPr>
-      <w:r>
-        <w:t xml:space="preserve">Copernicus. (2024). Copernicus DEM GLO-30 (2024_1): Global 30m Digital Elevation Model [Data set; digital surface model]. Google Earth Engine Data Catalog. https://developers.google.com/earth-engine/datasets/catalog/COPERNICUS_DEM_GLO30_2024_1 (accessed 10 September 2026).</w:t>
-      </w:r>
-    </w:p>
-    <w:p>
-      <w:pPr>
-        <w:pStyle w:val="BodyText"/>
-      </w:pPr>
-      <w:r>
-        <w:t xml:space="preserve">Earth Observation Group, Payne Institute for Public Policy, Colorado School of Mines. (n.d.). VIIRS Stray Light Corrected Nighttime Day/Night Band Composites Version 1 [Monthly data set; VCMSLCFG]. Google Earth Engine Data Catalog. https://developers.google.com/earth-engine/datasets/catalog/NOAA_VIIRS_DNB_MONTHLY_V1_VCMSLCFG (accessed 10 September 2026).</w:t>
-      </w:r>
-    </w:p>
-    <w:p>
-      <w:pPr>
-        <w:pStyle w:val="BodyText"/>
-      </w:pPr>
-      <w:r>
-        <w:t xml:space="preserve">Elvidge, C. D., Zhizhin, M., Ghosh, T., Hsu, F.-C., &amp; Taneja, J. (2021). Annual time series of global VIIRS nighttime lights derived from monthly averages: 2012 to 2019.</w:t>
-      </w:r>
-      <w:r>
-        <w:t xml:space="preserve"> </w:t>
-      </w:r>
-      <w:r>
-        <w:rPr>
-          <w:i/>
-          <w:iCs/>
-        </w:rPr>
-        <w:t xml:space="preserve">Remote Sensing</w:t>
-      </w:r>
-      <w:r>
-        <w:t xml:space="preserve">, 13, 922. https://doi.org/10.3390/rs13050922</w:t>
-      </w:r>
-    </w:p>
-    <w:p>
-      <w:pPr>
-        <w:pStyle w:val="BodyText"/>
-      </w:pPr>
-      <w:r>
-        <w:t xml:space="preserve">Esri. (2026). Sentinel-2 10 m land cover time series of the world [Data set]. ArcGIS Living Atlas of the World. https://www.arcgis.com/home/item.html?id=cfcb7609de5f478eb7666240902d4d3d (accessed 11 September 2026).</w:t>
-      </w:r>
-    </w:p>
-    <w:p>
-      <w:pPr>
-        <w:pStyle w:val="BodyText"/>
-      </w:pPr>
-      <w:r>
-        <w:t xml:space="preserve">Geofabrik. (2026). GCC States OpenStreetMap extract, 31 July 2026 [Data set; gcc-states-260731.osm.pbf]. https://download.geofabrik.de/asia/gcc-states-260731.osm.pbf</w:t>
-      </w:r>
-    </w:p>
-    <w:p>
-      <w:pPr>
-        <w:pStyle w:val="BodyText"/>
-      </w:pPr>
-      <w:r>
-        <w:t xml:space="preserve">GeoSOS team, Sun Yat-sen University. (n.d.). FLUS source code for non-commercial academic research. http://www.geosimulation.cn/FLUS-source-code.html (accessed 6 September 2026).</w:t>
-      </w:r>
-    </w:p>
-    <w:p>
-      <w:pPr>
-        <w:pStyle w:val="BodyText"/>
-      </w:pPr>
-      <w:r>
-        <w:t xml:space="preserve">Gorelick, N., Hancher, M., Dixon, M., Ilyushchenko, S., Thau, D., &amp; Moore, R. (2017). Google Earth Engine: planetary-scale geospatial analysis for everyone.</w:t>
-      </w:r>
-      <w:r>
-        <w:t xml:space="preserve"> </w:t>
-      </w:r>
-      <w:r>
-        <w:rPr>
-          <w:i/>
-          <w:iCs/>
-        </w:rPr>
-        <w:t xml:space="preserve">Remote Sensing of Environment</w:t>
-      </w:r>
-      <w:r>
-        <w:t xml:space="preserve">, 202, 18–27. https://doi.org/10.1016/j.rse.2017.06.031</w:t>
-      </w:r>
-    </w:p>
-    <w:p>
-      <w:pPr>
-        <w:pStyle w:val="BodyText"/>
-      </w:pPr>
-      <w:r>
-        <w:t xml:space="preserve">Impact Observatory, Microsoft, &amp; Esri. (n.d.). Sentinel-2 10m land cover time series of the world [Data set]. ArcGIS ImageServer. https://ic.imagery1.arcgis.com/arcgis/rest/services/Sentinel2_10m_LandCover/ImageServer (archived materialization manifest dated 9 September 2026; upstream release version not recorded).</w:t>
-      </w:r>
-    </w:p>
-    <w:p>
-      <w:pPr>
-        <w:pStyle w:val="BodyText"/>
-      </w:pPr>
-      <w:r>
-        <w:t xml:space="preserve">Karra, K., Kontgis, C., Statman-Weil, Z., Mazzariello, J. C., Mathis, M., &amp; Brumby, S. P. (2021). Global land use/land cover with Sentinel 2 and deep learning.</w:t>
-      </w:r>
-      <w:r>
-        <w:t xml:space="preserve"> </w:t>
-      </w:r>
-      <w:r>
-        <w:rPr>
-          <w:i/>
-          <w:iCs/>
-        </w:rPr>
-        <w:t xml:space="preserve">2021 IEEE International Geoscience and Remote Sensing Symposium IGARSS</w:t>
-      </w:r>
-      <w:r>
-        <w:t xml:space="preserve">, 4704–4707. https://doi.org/10.1109/IGARSS47720.2021.9553499</w:t>
-      </w:r>
-    </w:p>
-    <w:p>
-      <w:pPr>
-        <w:pStyle w:val="BodyText"/>
-      </w:pPr>
-      <w:r>
-        <w:t xml:space="preserve">Lau, K. H., &amp; Kam, B. H. (2005). A cellular automata model for urban land-use simulation.</w:t>
-      </w:r>
-      <w:r>
-        <w:t xml:space="preserve"> </w:t>
-      </w:r>
-      <w:r>
-        <w:rPr>
-          <w:i/>
-          <w:iCs/>
-        </w:rPr>
-        <w:t xml:space="preserve">Environment and Planning B: Planning and Design</w:t>
-      </w:r>
-      <w:r>
-        <w:t xml:space="preserve">, 32, 247–263. https://doi.org/10.1068/b31110</w:t>
-      </w:r>
-    </w:p>
-    <w:p>
-      <w:pPr>
-        <w:pStyle w:val="BodyText"/>
-      </w:pPr>
-      <w:r>
-        <w:t xml:space="preserve">Liang, X., Guan, Q., Clarke, K. C., Liu, S., Wang, B., &amp; Yao, Y. (2021). Understanding the drivers of sustainable land expansion using a patch-generating land use simulation (PLUS) model: A case study in Wuhan, China.</w:t>
-      </w:r>
-      <w:r>
-        <w:t xml:space="preserve"> </w:t>
-      </w:r>
-      <w:r>
-        <w:rPr>
-          <w:i/>
-          <w:iCs/>
-        </w:rPr>
-        <w:t xml:space="preserve">Computers, Environment and Urban Systems</w:t>
-      </w:r>
-      <w:r>
-        <w:t xml:space="preserve">, 85, 101569. https://doi.org/10.1016/j.compenvurbsys.2020.101569</w:t>
-      </w:r>
-    </w:p>
-    <w:p>
-      <w:pPr>
-        <w:pStyle w:val="BodyText"/>
-      </w:pPr>
-      <w:r>
-        <w:t xml:space="preserve">Liu, X., Liang, X., Li, X., Xu, X., Ou, J., Chen, Y., Li, S., Wang, S., &amp; Pei, F. (2017). A future land use simulation model (FLUS) for simulating multiple land use scenarios by coupling human and natural effects.</w:t>
-      </w:r>
-      <w:r>
-        <w:t xml:space="preserve"> </w:t>
-      </w:r>
-      <w:r>
-        <w:rPr>
-          <w:i/>
-          <w:iCs/>
-        </w:rPr>
-        <w:t xml:space="preserve">Landscape and Urban Planning</w:t>
-      </w:r>
-      <w:r>
-        <w:t xml:space="preserve">, 168, 94–116. https://doi.org/10.1016/j.landurbplan.2017.09.019</w:t>
-      </w:r>
-    </w:p>
-    <w:p>
-      <w:pPr>
-        <w:pStyle w:val="BodyText"/>
-      </w:pPr>
-      <w:r>
-        <w:t xml:space="preserve">OpenStreetMap contributors. (2026). Abu Dhabi city boundary, relation 4479763 [Data set; retrieved 1 August 2026; geometry documented in boundary_manifest.json]. https://www.openstreetmap.org/relation/4479763</w:t>
-      </w:r>
-    </w:p>
-    <w:p>
-      <w:pPr>
-        <w:pStyle w:val="BodyText"/>
-      </w:pPr>
-      <w:r>
-        <w:t xml:space="preserve">Pedregosa, F., Varoquaux, G., Gramfort, A., Michel, V., Thirion, B., Grisel, O., Blondel, M., Prettenhofer, P., Weiss, R., Dubourg, V., Vanderplas, J., Passos, A., Cournapeau, D., Brucher, M., Perrot, M., &amp; Duchesnay, E. (2011). Scikit-learn: Machine learning in Python.</w:t>
-      </w:r>
-      <w:r>
-        <w:t xml:space="preserve"> </w:t>
-      </w:r>
-      <w:r>
-        <w:rPr>
-          <w:i/>
-          <w:iCs/>
-        </w:rPr>
-        <w:t xml:space="preserve">Journal of Machine Learning Research</w:t>
-      </w:r>
-      <w:r>
-        <w:t xml:space="preserve">, 12, 2825–2830. https://jmlr.org/papers/v12/pedregosa11a.html</w:t>
-      </w:r>
-    </w:p>
-    <w:p>
-      <w:pPr>
-        <w:pStyle w:val="BodyText"/>
-      </w:pPr>
-      <w:r>
-        <w:t xml:space="preserve">Pontius, R. G., Jr., Boersma, W., Castella, J.-C., Clarke, K., de Nijs, T., Dietzel, C., Duan, Z., Fotsing, E., Goldstein, N., Kok, K., Koomen, E., Lippitt, C. D., McConnell, W., Mohd Sood, A., Pijanowski, B., Pithadia, S., Sweeney, S., Trung, T. N., Veldkamp, A. T., &amp; Verburg, P. H. (2008). Comparing the input, output, and validation maps for several models of land change.</w:t>
-      </w:r>
-      <w:r>
-        <w:t xml:space="preserve"> </w:t>
-      </w:r>
-      <w:r>
-        <w:rPr>
-          <w:i/>
-          <w:iCs/>
-        </w:rPr>
-        <w:t xml:space="preserve">The Annals of Regional Science</w:t>
-      </w:r>
-      <w:r>
-        <w:t xml:space="preserve">, 42, 11–37. https://doi.org/10.1007/s00168-007-0138-2</w:t>
-      </w:r>
-    </w:p>
-    <w:p>
-      <w:pPr>
-        <w:pStyle w:val="BodyText"/>
-      </w:pPr>
-      <w:r>
-        <w:t xml:space="preserve">Pontius, R. G., Jr., &amp; Millones, M. (2011). Death to Kappa: birth of quantity disagreement and allocation disagreement for accuracy assessment.</w:t>
-      </w:r>
-      <w:r>
-        <w:t xml:space="preserve"> </w:t>
-      </w:r>
-      <w:r>
-        <w:rPr>
-          <w:i/>
-          <w:iCs/>
-        </w:rPr>
-        <w:t xml:space="preserve">International Journal of Remote Sensing</w:t>
-      </w:r>
-      <w:r>
-        <w:t xml:space="preserve">, 32, 4407–4429. https://doi.org/10.1080/01431161.2011.552923</w:t>
-      </w:r>
-    </w:p>
-    <w:p>
-      <w:pPr>
-        <w:pStyle w:val="BodyText"/>
-      </w:pPr>
-      <w:r>
-        <w:t xml:space="preserve">Silva, E. A., &amp; Clarke, K. C. (2002). Calibration of the SLEUTH urban growth model for Lisbon and Porto, Portugal.</w:t>
-      </w:r>
-      <w:r>
-        <w:t xml:space="preserve"> </w:t>
-      </w:r>
-      <w:r>
-        <w:rPr>
-          <w:i/>
-          <w:iCs/>
-        </w:rPr>
-        <w:t xml:space="preserve">Computers, Environment and Urban Systems</w:t>
-      </w:r>
-      <w:r>
-        <w:t xml:space="preserve">, 26, 525–552. https://doi.org/10.1016/S0198-9715(01)00014-X</w:t>
-      </w:r>
-    </w:p>
-    <w:p>
-      <w:pPr>
-        <w:pStyle w:val="BodyText"/>
-      </w:pPr>
-      <w:r>
-        <w:t xml:space="preserve">Soares-Filho, B. S., Cerqueira, G. C., &amp; Pennachin, C. L. (2002). DINAMICA—a stochastic cellular automata model designed to simulate the landscape dynamics in an Amazonian colonization frontier.</w:t>
-      </w:r>
-      <w:r>
-        <w:t xml:space="preserve"> </w:t>
-      </w:r>
-      <w:r>
-        <w:rPr>
-          <w:i/>
-          <w:iCs/>
-        </w:rPr>
-        <w:t xml:space="preserve">Ecological Modelling</w:t>
-      </w:r>
-      <w:r>
-        <w:t xml:space="preserve">, 154, 217–235. https://doi.org/10.1016/S0304-3800(02)00059-5</w:t>
-      </w:r>
-    </w:p>
-    <w:p>
-      <w:pPr>
-        <w:pStyle w:val="BodyText"/>
-      </w:pPr>
-      <w:r>
-        <w:t xml:space="preserve">van Vliet, J., Bregt, A. K., &amp; Hagen-Zanker, A. (2011). Revisiting Kappa to account for change in the accuracy assessment of land-use change models.</w:t>
-      </w:r>
-      <w:r>
-        <w:t xml:space="preserve"> </w:t>
-      </w:r>
-      <w:r>
-        <w:rPr>
-          <w:i/>
-          <w:iCs/>
-        </w:rPr>
-        <w:t xml:space="preserve">Ecological Modelling</w:t>
-      </w:r>
-      <w:r>
-        <w:t xml:space="preserve">, 222, 1367–1375. https://doi.org/10.1016/j.ecolmodel.2011.01.017</w:t>
-      </w:r>
-    </w:p>
-    <w:p>
-      <w:pPr>
-        <w:pStyle w:val="BodyText"/>
-      </w:pPr>
-      <w:r>
-        <w:t xml:space="preserve">van Vliet, J., Bregt, A. K., Brown, D. G., van Delden, H., Heckbert, S., &amp; Verburg, P. H. (2016). A review of current calibration and validation practices in land-change modeling.</w:t>
-      </w:r>
-      <w:r>
-        <w:t xml:space="preserve"> </w:t>
-      </w:r>
-      <w:r>
-        <w:rPr>
-          <w:i/>
-          <w:iCs/>
-        </w:rPr>
-        <w:t xml:space="preserve">Environmental Modelling &amp; Software</w:t>
-      </w:r>
-      <w:r>
-        <w:t xml:space="preserve">, 82, 174–182. https://doi.org/10.1016/j.envsoft.2016.04.017</w:t>
-      </w:r>
-    </w:p>
-    <w:p>
-      <w:pPr>
-        <w:pStyle w:val="BodyText"/>
-      </w:pPr>
-      <w:r>
-        <w:t xml:space="preserve">Verburg, P. H., Soepboer, W., Veldkamp, A., Limpiada, R., Espaldon, V., &amp; Mastura, S. S. A. (2002). Modeling the spatial dynamics of regional land use: the CLUE-S model.</w:t>
-      </w:r>
-      <w:r>
-        <w:t xml:space="preserve"> </w:t>
-      </w:r>
-      <w:r>
-        <w:rPr>
-          <w:i/>
-          <w:iCs/>
-        </w:rPr>
-        <w:t xml:space="preserve">Environmental Management</w:t>
-      </w:r>
-      <w:r>
-        <w:t xml:space="preserve">, 30, 391–405. https://doi.org/10.1007/s00267-002-2630-x</w:t>
-      </w:r>
-    </w:p>
-    <w:p>
-      <w:pPr>
-        <w:pStyle w:val="BodyText"/>
-      </w:pPr>
-      <w:r>
-        <w:t xml:space="preserve">Zanaga, D., Van De Kerchove, R., De Keersmaecker, W., Souverijns, N., Brockmann, C., Quast, R., Wevers, J., Grosu, A., Paccini, A., Vergnaud, S., Cartus, O., Santoro, M., Fritz, S., Georgieva, I., Lesiv, M., Carter, S., Herold, M., Li, L., Tsendbazar, N.-E., Ramoino, F., &amp; Arino, O. (2021). ESA WorldCover 10 m 2020 v100 [Data set]. Zenodo. https://doi.org/10.5281/zenodo.5571936</w:t>
-      </w:r>
-    </w:p>
-    <w:p>
-      <w:pPr>
-        <w:pStyle w:val="BodyText"/>
-      </w:pPr>
-      <w:r>
-        <w:t xml:space="preserve">Zanaga, D., Van De Kerchove, R., Daems, D., De Keersmaecker, W., Brockmann, C., Kirches, G., Wevers, J., Cartus, O., Santoro, M., Fritz, S., Lesiv, M., Herold, M., Tsendbazar, N.-E., Xu, P., Ramoino, F., &amp; Arino, O. (2022). ESA WorldCover 10 m 2021 v200 [Data set]. Zenodo. https://doi.org/10.5281/zenodo.7254221</w:t>
-      </w:r>
-    </w:p>
-    <w:bookmarkEnd w:id="57"/>
-    <w:bookmarkStart w:id="58" w:name="supplementary-information-outline"/>
-    <w:p>
-      <w:pPr>
-        <w:pStyle w:val="Heading2"/>
-      </w:pPr>
-      <w:r>
-        <w:t xml:space="preserve">Supplementary information outline</w:t>
-      </w:r>
-    </w:p>
-    <w:p>
-      <w:pPr>
-        <w:pStyle w:val="Compact"/>
-        <w:numPr>
-          <w:ilvl w:val="0"/>
-          <w:numId w:val="1004"/>
-        </w:numPr>
-      </w:pPr>
-      <w:r>
-        <w:rPr>
-          <w:b/>
-          <w:bCs/>
-        </w:rPr>
-        <w:t xml:space="preserve">Supplementary Table S1:</w:t>
-      </w:r>
-      <w:r>
-        <w:t xml:space="preserve"> </w:t>
-      </w:r>
-      <w:r>
-        <w:t xml:space="preserve">ArcGIS-served 2031 model–scenario objective profiles with per-seed dispersion (see</w:t>
-      </w:r>
-      <w:r>
-        <w:t xml:space="preserve"> </w:t>
-      </w:r>
-      <w:r>
-        <w:rPr>
-          <w:rStyle w:val="VerbatimChar"/>
-        </w:rPr>
-        <w:t xml:space="preserve">supplementary_table_S1_arcgis_planning_objectives.md</w:t>
-      </w:r>
-      <w:r>
-        <w:t xml:space="preserve">).</w:t>
-      </w:r>
-    </w:p>
-    <w:p>
-      <w:pPr>
-        <w:pStyle w:val="Compact"/>
-        <w:numPr>
-          <w:ilvl w:val="0"/>
-          <w:numId w:val="1004"/>
-        </w:numPr>
-      </w:pPr>
-      <w:r>
-        <w:rPr>
-          <w:b/>
-          <w:bCs/>
-        </w:rPr>
-        <w:t xml:space="preserve">Supplementary Table S2:</w:t>
-      </w:r>
-      <w:r>
-        <w:t xml:space="preserve"> </w:t>
-      </w:r>
-      <w:r>
-        <w:t xml:space="preserve">Neighbourhood-weight sensitivity at 0, 0.175, 0.35 and 0.7 (see</w:t>
-      </w:r>
-      <w:r>
-        <w:t xml:space="preserve"> </w:t>
-      </w:r>
-      <w:r>
-        <w:rPr>
-          <w:rStyle w:val="VerbatimChar"/>
-        </w:rPr>
-        <w:t xml:space="preserve">supplementary_table_S2_neighbourhood_weight_sensitivity.md</w:t>
-      </w:r>
-      <w:r>
-        <w:t xml:space="preserve">).</w:t>
-      </w:r>
-    </w:p>
-    <w:p>
-      <w:pPr>
-        <w:pStyle w:val="Compact"/>
-        <w:numPr>
-          <w:ilvl w:val="0"/>
-          <w:numId w:val="1004"/>
-        </w:numPr>
-      </w:pPr>
-      <w:r>
-        <w:rPr>
-          <w:b/>
-          <w:bCs/>
-        </w:rPr>
-        <w:t xml:space="preserve">Supplementary Table S3:</w:t>
-      </w:r>
-      <w:r>
-        <w:t xml:space="preserve"> </w:t>
-      </w:r>
-      <w:r>
-        <w:t xml:space="preserve">FLUS 13-, 19- and 25-feature diagnostics, platform boundary and demand-underfill evidence (see</w:t>
-      </w:r>
-      <w:r>
-        <w:t xml:space="preserve"> </w:t>
-      </w:r>
-      <w:r>
-        <w:rPr>
-          <w:rStyle w:val="VerbatimChar"/>
-        </w:rPr>
-        <w:t xml:space="preserve">supplementary_table_S3_flus_feature_diagnostics.md</w:t>
-      </w:r>
-      <w:r>
-        <w:t xml:space="preserve">).</w:t>
-      </w:r>
-    </w:p>
-    <w:p>
-      <w:pPr>
-        <w:pStyle w:val="Compact"/>
-        <w:numPr>
-          <w:ilvl w:val="0"/>
-          <w:numId w:val="1004"/>
-        </w:numPr>
-      </w:pPr>
-      <w:r>
-        <w:rPr>
-          <w:b/>
-          <w:bCs/>
-        </w:rPr>
-        <w:t xml:space="preserve">Supplementary Table S5:</w:t>
-      </w:r>
-      <w:r>
-        <w:t xml:space="preserve"> </w:t>
-      </w:r>
-      <w:r>
-        <w:t xml:space="preserve">Rolling-origin and WorldCover external-product diagnostics (see</w:t>
-      </w:r>
-      <w:r>
-        <w:t xml:space="preserve"> </w:t>
-      </w:r>
-      <w:r>
-        <w:rPr>
-          <w:rStyle w:val="VerbatimChar"/>
-        </w:rPr>
-        <w:t xml:space="preserve">supplementary_table_S5_rolling_external_diagnostics.md</w:t>
-      </w:r>
-      <w:r>
-        <w:t xml:space="preserve">).</w:t>
-      </w:r>
-    </w:p>
-    <w:p>
-      <w:pPr>
-        <w:pStyle w:val="Compact"/>
-        <w:numPr>
-          <w:ilvl w:val="0"/>
-          <w:numId w:val="1004"/>
-        </w:numPr>
-      </w:pPr>
-      <w:r>
-        <w:rPr>
-          <w:b/>
-          <w:bCs/>
-        </w:rPr>
-        <w:t xml:space="preserve">Supplementary Table S6:</w:t>
-      </w:r>
-      <w:r>
-        <w:t xml:space="preserve"> </w:t>
-      </w:r>
-      <w:r>
-        <w:t xml:space="preserve">Matched Dynamic World and ArcGIS-served whole-product-pipeline backtests (see</w:t>
-      </w:r>
-      <w:r>
-        <w:t xml:space="preserve"> </w:t>
-      </w:r>
-      <w:r>
-        <w:rPr>
-          <w:rStyle w:val="VerbatimChar"/>
-        </w:rPr>
-        <w:t xml:space="preserve">supplementary_table_S6_product_robustness.md</w:t>
-      </w:r>
-      <w:r>
-        <w:t xml:space="preserve">).</w:t>
-      </w:r>
-    </w:p>
-    <w:p>
-      <w:pPr>
-        <w:pStyle w:val="Compact"/>
-        <w:numPr>
-          <w:ilvl w:val="0"/>
-          <w:numId w:val="1004"/>
-        </w:numPr>
-      </w:pPr>
-      <w:r>
-        <w:rPr>
-          <w:b/>
-          <w:bCs/>
-        </w:rPr>
-        <w:t xml:space="preserve">Supplementary Table S7:</w:t>
-      </w:r>
-      <w:r>
-        <w:t xml:space="preserve"> </w:t>
-      </w:r>
-      <w:r>
-        <w:t xml:space="preserve">Net-change FoM upper bounds and 54 seed-specific paired model intervals (see</w:t>
-      </w:r>
-      <w:r>
-        <w:t xml:space="preserve"> </w:t>
-      </w:r>
-      <w:r>
-        <w:rPr>
-          <w:rStyle w:val="VerbatimChar"/>
-        </w:rPr>
-        <w:t xml:space="preserve">supplementary_table_S7_allocation_limits.md</w:t>
-      </w:r>
-      <w:r>
-        <w:t xml:space="preserve">).</w:t>
-      </w:r>
-    </w:p>
-    <w:p>
-      <w:pPr>
-        <w:pStyle w:val="Compact"/>
-        <w:numPr>
-          <w:ilvl w:val="0"/>
-          <w:numId w:val="1004"/>
-        </w:numPr>
-      </w:pPr>
-      <w:r>
-        <w:rPr>
-          <w:b/>
-          <w:bCs/>
-        </w:rPr>
-        <w:t xml:space="preserve">Fig. S1:</w:t>
-      </w:r>
-      <w:r>
-        <w:t xml:space="preserve"> </w:t>
-      </w:r>
-      <w:r>
-        <w:t xml:space="preserve">Full 3-scenarios × 3-model 2031 new-built footprint atlas (</w:t>
-      </w:r>
-      <w:r>
-        <w:rPr>
-          <w:rStyle w:val="VerbatimChar"/>
-        </w:rPr>
-        <w:t xml:space="preserve">figures/figS01_planning_atlas_2031.*</w:t>
-      </w:r>
-      <w:r>
-        <w:t xml:space="preserve">).</w:t>
-      </w:r>
-    </w:p>
-    <w:p>
-      <w:pPr>
-        <w:pStyle w:val="Compact"/>
-        <w:numPr>
-          <w:ilvl w:val="0"/>
-          <w:numId w:val="1004"/>
-        </w:numPr>
-      </w:pPr>
-      <w:r>
-        <w:rPr>
-          <w:b/>
-          <w:bCs/>
-        </w:rPr>
-        <w:t xml:space="preserve">Fig. S2:</w:t>
-      </w:r>
-      <w:r>
-        <w:t xml:space="preserve"> </w:t>
-      </w:r>
-      <w:r>
-        <w:t xml:space="preserve">Dynamic World quality proxy and quality-filtered change sensitivity (</w:t>
-      </w:r>
-      <w:r>
-        <w:rPr>
-          <w:rStyle w:val="VerbatimChar"/>
-        </w:rPr>
-        <w:t xml:space="preserve">figures/figS02_input_label_quality.*</w:t>
-      </w:r>
-      <w:r>
-        <w:t xml:space="preserve">).</w:t>
-      </w:r>
-    </w:p>
-    <w:p>
-      <w:pPr>
-        <w:pStyle w:val="Compact"/>
-        <w:numPr>
-          <w:ilvl w:val="0"/>
-          <w:numId w:val="1004"/>
-        </w:numPr>
-      </w:pPr>
-      <w:r>
-        <w:rPr>
-          <w:b/>
-          <w:bCs/>
-        </w:rPr>
-        <w:t xml:space="preserve">Fig. S3:</w:t>
-      </w:r>
-      <w:r>
-        <w:t xml:space="preserve"> </w:t>
-      </w:r>
-      <w:r>
-        <w:t xml:space="preserve">Historical maps and change-error maps for 2024 (</w:t>
-      </w:r>
-      <w:r>
-        <w:rPr>
-          <w:rStyle w:val="VerbatimChar"/>
-        </w:rPr>
-        <w:t xml:space="preserve">figures/figS03_historical_2024_maps_and_errors.*</w:t>
-      </w:r>
-      <w:r>
-        <w:t xml:space="preserve">).</w:t>
-      </w:r>
-    </w:p>
-    <w:p>
-      <w:pPr>
-        <w:pStyle w:val="Compact"/>
-        <w:numPr>
-          <w:ilvl w:val="0"/>
-          <w:numId w:val="1004"/>
-        </w:numPr>
-      </w:pPr>
-      <w:r>
-        <w:rPr>
-          <w:b/>
-          <w:bCs/>
-        </w:rPr>
         <w:t xml:space="preserve">Fig. S4:</w:t>
       </w:r>
       <w:r>
         <w:t xml:space="preserve"> </w:t>
       </w:r>
       <w:r>
-        <w:t xml:space="preserve">Driver layers and experiment design in English (</w:t>
+        <w:t xml:space="preserve">Driver layers and unified experiment design. Continuous maps are clipped to the 2nd–98th valid-pixel percentiles unless stated otherwise. The schematic uses one coordinate system to keep arrows aligned and shows that the models change spatial allocation while the grid, actions, constraints and evaluator remain fixed (</w:t>
       </w:r>
       <w:r>
         <w:rPr>
@@ -9091,9 +8936,6 @@
     <w:abstractNumId w:val="991"/>
   </w:num>
   <w:num w:numId="1003">
-    <w:abstractNumId w:val="991"/>
-  </w:num>
-  <w:num w:numId="1004">
     <w:abstractNumId w:val="991"/>
   </w:num>
 </w:numbering>

</xml_diff>